<commit_message>
Completado informe 1er etapa
</commit_message>
<xml_diff>
--- a/Informe Trabajo Integrador MyS.docx
+++ b/Informe Trabajo Integrador MyS.docx
@@ -6,6 +6,7 @@
       <w:sdtPr>
         <w:rPr>
           <w:color w:val="1CADE4" w:themeColor="accent1"/>
+          <w:sz w:val="26"/>
         </w:rPr>
         <w:id w:val="64771078"/>
         <w:docPartObj>
@@ -16,7 +17,6 @@
       <w:sdtEndPr>
         <w:rPr>
           <w:color w:val="auto"/>
-          <w:sz w:val="26"/>
         </w:rPr>
       </w:sdtEndPr>
       <w:sdtContent>
@@ -50,7 +50,7 @@
                         <pic:cNvPicPr/>
                       </pic:nvPicPr>
                       <pic:blipFill>
-                        <a:blip r:embed="rId6" cstate="print">
+                        <a:blip r:embed="rId7" cstate="print">
                           <a:duotone>
                             <a:schemeClr val="accent1">
                               <a:shade val="45000"/>
@@ -103,7 +103,6 @@
             <w:placeholder>
               <w:docPart w:val="ED0E5CC2B7E94C06B704B8BEC75012FF"/>
             </w:placeholder>
-            <w:showingPlcHdr/>
             <w:dataBinding w:prefixMappings="xmlns:ns0='http://purl.org/dc/elements/1.1/' xmlns:ns1='http://schemas.openxmlformats.org/package/2006/metadata/core-properties' " w:xpath="/ns1:coreProperties[1]/ns0:title[1]" w:storeItemID="{6C3C8BC8-F283-45AE-878A-BAB7291924A1}"/>
             <w:text/>
           </w:sdtPr>
@@ -136,10 +135,10 @@
                   <w:rFonts w:asciiTheme="majorHAnsi" w:eastAsiaTheme="majorEastAsia" w:hAnsiTheme="majorHAnsi" w:cstheme="majorBidi"/>
                   <w:caps/>
                   <w:color w:val="1CADE4" w:themeColor="accent1"/>
-                  <w:sz w:val="80"/>
-                  <w:szCs w:val="80"/>
+                  <w:sz w:val="72"/>
+                  <w:szCs w:val="72"/>
                 </w:rPr>
-                <w:t>[Document title]</w:t>
+                <w:t>proyecto laboratorio modelos y simulación</w:t>
               </w:r>
             </w:p>
           </w:sdtContent>
@@ -157,7 +156,6 @@
             <w:placeholder>
               <w:docPart w:val="6A929018BB794A809BB230B4F3414579"/>
             </w:placeholder>
-            <w:showingPlcHdr/>
             <w:dataBinding w:prefixMappings="xmlns:ns0='http://purl.org/dc/elements/1.1/' xmlns:ns1='http://schemas.openxmlformats.org/package/2006/metadata/core-properties' " w:xpath="/ns1:coreProperties[1]/ns0:subject[1]" w:storeItemID="{6C3C8BC8-F283-45AE-878A-BAB7291924A1}"/>
             <w:text/>
           </w:sdtPr>
@@ -172,14 +170,70 @@
                   <w:szCs w:val="28"/>
                 </w:rPr>
               </w:pPr>
+              <w:proofErr w:type="spellStart"/>
               <w:r>
                 <w:rPr>
                   <w:color w:val="1CADE4" w:themeColor="accent1"/>
                   <w:sz w:val="28"/>
                   <w:szCs w:val="28"/>
                 </w:rPr>
-                <w:t>[Document subtitle]</w:t>
+                <w:t>Profs</w:t>
               </w:r>
+              <w:proofErr w:type="spellEnd"/>
+              <w:r>
+                <w:rPr>
+                  <w:color w:val="1CADE4" w:themeColor="accent1"/>
+                  <w:sz w:val="28"/>
+                  <w:szCs w:val="28"/>
+                </w:rPr>
+                <w:t xml:space="preserve">. Marcela </w:t>
+              </w:r>
+              <w:proofErr w:type="spellStart"/>
+              <w:r>
+                <w:rPr>
+                  <w:color w:val="1CADE4" w:themeColor="accent1"/>
+                  <w:sz w:val="28"/>
+                  <w:szCs w:val="28"/>
+                </w:rPr>
+                <w:t>Printista</w:t>
+              </w:r>
+              <w:proofErr w:type="spellEnd"/>
+              <w:r>
+                <w:rPr>
+                  <w:color w:val="1CADE4" w:themeColor="accent1"/>
+                  <w:sz w:val="28"/>
+                  <w:szCs w:val="28"/>
+                </w:rPr>
+                <w:t xml:space="preserve">, Cristian </w:t>
+              </w:r>
+              <w:proofErr w:type="spellStart"/>
+              <w:r>
+                <w:rPr>
+                  <w:color w:val="1CADE4" w:themeColor="accent1"/>
+                  <w:sz w:val="28"/>
+                  <w:szCs w:val="28"/>
+                </w:rPr>
+                <w:t>Tissera</w:t>
+              </w:r>
+              <w:proofErr w:type="spellEnd"/>
+              <w:r>
+                <w:rPr>
+                  <w:color w:val="1CADE4" w:themeColor="accent1"/>
+                  <w:sz w:val="28"/>
+                  <w:szCs w:val="28"/>
+                </w:rPr>
+                <w:t xml:space="preserve">, Danilo </w:t>
+              </w:r>
+              <w:proofErr w:type="spellStart"/>
+              <w:r>
+                <w:rPr>
+                  <w:color w:val="1CADE4" w:themeColor="accent1"/>
+                  <w:sz w:val="28"/>
+                  <w:szCs w:val="28"/>
+                </w:rPr>
+                <w:t>Labella</w:t>
+              </w:r>
+              <w:proofErr w:type="spellEnd"/>
             </w:p>
           </w:sdtContent>
         </w:sdt>
@@ -256,51 +310,6 @@
                           </wps:style>
                           <wps:txbx>
                             <w:txbxContent>
-                              <w:sdt>
-                                <w:sdtPr>
-                                  <w:rPr>
-                                    <w:caps/>
-                                    <w:color w:val="1CADE4" w:themeColor="accent1"/>
-                                    <w:sz w:val="28"/>
-                                    <w:szCs w:val="28"/>
-                                  </w:rPr>
-                                  <w:alias w:val="Date"/>
-                                  <w:tag w:val=""/>
-                                  <w:id w:val="197127006"/>
-                                  <w:showingPlcHdr/>
-                                  <w:dataBinding w:prefixMappings="xmlns:ns0='http://schemas.microsoft.com/office/2006/coverPageProps' " w:xpath="/ns0:CoverPageProperties[1]/ns0:PublishDate[1]" w:storeItemID="{55AF091B-3C7A-41E3-B477-F2FDAA23CFDA}"/>
-                                  <w:date>
-                                    <w:dateFormat w:val="MMMM d, yyyy"/>
-                                    <w:lid w:val="en-US"/>
-                                    <w:storeMappedDataAs w:val="dateTime"/>
-                                    <w:calendar w:val="gregorian"/>
-                                  </w:date>
-                                </w:sdtPr>
-                                <w:sdtContent>
-                                  <w:p>
-                                    <w:pPr>
-                                      <w:pStyle w:val="NoSpacing"/>
-                                      <w:spacing w:after="40"/>
-                                      <w:jc w:val="center"/>
-                                      <w:rPr>
-                                        <w:caps/>
-                                        <w:color w:val="1CADE4" w:themeColor="accent1"/>
-                                        <w:sz w:val="28"/>
-                                        <w:szCs w:val="28"/>
-                                      </w:rPr>
-                                    </w:pPr>
-                                    <w:r>
-                                      <w:rPr>
-                                        <w:caps/>
-                                        <w:color w:val="1CADE4" w:themeColor="accent1"/>
-                                        <w:sz w:val="28"/>
-                                        <w:szCs w:val="28"/>
-                                      </w:rPr>
-                                      <w:t>[Date]</w:t>
-                                    </w:r>
-                                  </w:p>
-                                </w:sdtContent>
-                              </w:sdt>
                               <w:p>
                                 <w:pPr>
                                   <w:pStyle w:val="NoSpacing"/>
@@ -309,29 +318,36 @@
                                     <w:color w:val="1CADE4" w:themeColor="accent1"/>
                                   </w:rPr>
                                 </w:pPr>
-                                <w:sdt>
-                                  <w:sdtPr>
-                                    <w:rPr>
-                                      <w:caps/>
-                                      <w:color w:val="1CADE4" w:themeColor="accent1"/>
-                                    </w:rPr>
-                                    <w:alias w:val="Company"/>
-                                    <w:tag w:val=""/>
-                                    <w:id w:val="1390145197"/>
-                                    <w:showingPlcHdr/>
-                                    <w:dataBinding w:prefixMappings="xmlns:ns0='http://schemas.openxmlformats.org/officeDocument/2006/extended-properties' " w:xpath="/ns0:Properties[1]/ns0:Company[1]" w:storeItemID="{6668398D-A668-4E3E-A5EB-62B293D839F1}"/>
-                                    <w:text/>
-                                  </w:sdtPr>
-                                  <w:sdtContent>
-                                    <w:r>
-                                      <w:rPr>
-                                        <w:caps/>
-                                        <w:color w:val="1CADE4" w:themeColor="accent1"/>
-                                      </w:rPr>
-                                      <w:t>[Company name]</w:t>
-                                    </w:r>
-                                  </w:sdtContent>
-                                </w:sdt>
+                                <w:r>
+                                  <w:rPr>
+                                    <w:color w:val="1CADE4" w:themeColor="accent1"/>
+                                  </w:rPr>
+                                  <w:t xml:space="preserve">Por </w:t>
+                                </w:r>
+                                <w:r>
+                                  <w:rPr>
+                                    <w:color w:val="1CADE4" w:themeColor="accent1"/>
+                                  </w:rPr>
+                                  <w:t>Juan Cruz Paez, Facundo Nicol</w:t>
+                                </w:r>
+                                <w:r>
+                                  <w:rPr>
+                                    <w:color w:val="1CADE4" w:themeColor="accent1"/>
+                                  </w:rPr>
+                                  <w:t>á</w:t>
+                                </w:r>
+                                <w:r>
+                                  <w:rPr>
+                                    <w:color w:val="1CADE4" w:themeColor="accent1"/>
+                                  </w:rPr>
+                                  <w:t>s F</w:t>
+                                </w:r>
+                                <w:r>
+                                  <w:rPr>
+                                    <w:color w:val="1CADE4" w:themeColor="accent1"/>
+                                  </w:rPr>
+                                  <w:t>arías Lozano</w:t>
+                                </w:r>
                               </w:p>
                               <w:p>
                                 <w:pPr>
@@ -341,27 +357,57 @@
                                     <w:color w:val="1CADE4" w:themeColor="accent1"/>
                                   </w:rPr>
                                 </w:pPr>
-                                <w:sdt>
-                                  <w:sdtPr>
-                                    <w:rPr>
-                                      <w:color w:val="1CADE4" w:themeColor="accent1"/>
-                                    </w:rPr>
-                                    <w:alias w:val="Address"/>
-                                    <w:tag w:val=""/>
-                                    <w:id w:val="-726379553"/>
-                                    <w:showingPlcHdr/>
-                                    <w:dataBinding w:prefixMappings="xmlns:ns0='http://schemas.microsoft.com/office/2006/coverPageProps' " w:xpath="/ns0:CoverPageProperties[1]/ns0:CompanyAddress[1]" w:storeItemID="{55AF091B-3C7A-41E3-B477-F2FDAA23CFDA}"/>
-                                    <w:text/>
-                                  </w:sdtPr>
-                                  <w:sdtContent>
-                                    <w:r>
-                                      <w:rPr>
-                                        <w:color w:val="1CADE4" w:themeColor="accent1"/>
-                                      </w:rPr>
-                                      <w:t>[Company address]</w:t>
-                                    </w:r>
-                                  </w:sdtContent>
-                                </w:sdt>
+                                <w:r>
+                                  <w:rPr>
+                                    <w:color w:val="1CADE4" w:themeColor="accent1"/>
+                                  </w:rPr>
+                                  <w:t>UNSL</w:t>
+                                </w:r>
+                              </w:p>
+                              <w:p>
+                                <w:pPr>
+                                  <w:pStyle w:val="NoSpacing"/>
+                                  <w:jc w:val="center"/>
+                                  <w:rPr>
+                                    <w:color w:val="1CADE4" w:themeColor="accent1"/>
+                                  </w:rPr>
+                                </w:pPr>
+                                <w:r>
+                                  <w:rPr>
+                                    <w:color w:val="1CADE4" w:themeColor="accent1"/>
+                                  </w:rPr>
+                                  <w:t>Facultad de Cs. Físico Matemática y Naturales</w:t>
+                                </w:r>
+                              </w:p>
+                              <w:p>
+                                <w:pPr>
+                                  <w:pStyle w:val="NoSpacing"/>
+                                  <w:jc w:val="center"/>
+                                  <w:rPr>
+                                    <w:color w:val="1CADE4" w:themeColor="accent1"/>
+                                  </w:rPr>
+                                </w:pPr>
+                                <w:r>
+                                  <w:rPr>
+                                    <w:color w:val="1CADE4" w:themeColor="accent1"/>
+                                  </w:rPr>
+                                  <w:t>Departamento de Informática</w:t>
+                                </w:r>
+                              </w:p>
+                              <w:p>
+                                <w:pPr>
+                                  <w:pStyle w:val="NoSpacing"/>
+                                  <w:jc w:val="center"/>
+                                  <w:rPr>
+                                    <w:color w:val="1CADE4" w:themeColor="accent1"/>
+                                  </w:rPr>
+                                </w:pPr>
+                                <w:r>
+                                  <w:rPr>
+                                    <w:color w:val="1CADE4" w:themeColor="accent1"/>
+                                  </w:rPr>
+                                  <w:t>2025</w:t>
+                                </w:r>
                               </w:p>
                             </w:txbxContent>
                           </wps:txbx>
@@ -392,51 +438,6 @@
                   <v:shape id="Text Box 146" o:spid="_x0000_s1026" type="#_x0000_t202" style="position:absolute;left:0;text-align:left;margin-left:0;margin-top:0;width:516pt;height:43.9pt;z-index:251659264;visibility:visible;mso-wrap-style:square;mso-width-percent:1000;mso-height-percent:0;mso-top-percent:850;mso-wrap-distance-left:9pt;mso-wrap-distance-top:0;mso-wrap-distance-right:9pt;mso-wrap-distance-bottom:0;mso-position-horizontal:center;mso-position-horizontal-relative:margin;mso-position-vertical-relative:page;mso-width-percent:1000;mso-height-percent:0;mso-top-percent:850;mso-width-relative:margin;mso-height-relative:margin;v-text-anchor:bottom" o:gfxdata="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" filled="f" stroked="f" strokeweight=".5pt">
                     <v:textbox style="mso-fit-shape-to-text:t" inset="0,0,0,0">
                       <w:txbxContent>
-                        <w:sdt>
-                          <w:sdtPr>
-                            <w:rPr>
-                              <w:caps/>
-                              <w:color w:val="1CADE4" w:themeColor="accent1"/>
-                              <w:sz w:val="28"/>
-                              <w:szCs w:val="28"/>
-                            </w:rPr>
-                            <w:alias w:val="Date"/>
-                            <w:tag w:val=""/>
-                            <w:id w:val="197127006"/>
-                            <w:showingPlcHdr/>
-                            <w:dataBinding w:prefixMappings="xmlns:ns0='http://schemas.microsoft.com/office/2006/coverPageProps' " w:xpath="/ns0:CoverPageProperties[1]/ns0:PublishDate[1]" w:storeItemID="{55AF091B-3C7A-41E3-B477-F2FDAA23CFDA}"/>
-                            <w:date>
-                              <w:dateFormat w:val="MMMM d, yyyy"/>
-                              <w:lid w:val="en-US"/>
-                              <w:storeMappedDataAs w:val="dateTime"/>
-                              <w:calendar w:val="gregorian"/>
-                            </w:date>
-                          </w:sdtPr>
-                          <w:sdtContent>
-                            <w:p>
-                              <w:pPr>
-                                <w:pStyle w:val="NoSpacing"/>
-                                <w:spacing w:after="40"/>
-                                <w:jc w:val="center"/>
-                                <w:rPr>
-                                  <w:caps/>
-                                  <w:color w:val="1CADE4" w:themeColor="accent1"/>
-                                  <w:sz w:val="28"/>
-                                  <w:szCs w:val="28"/>
-                                </w:rPr>
-                              </w:pPr>
-                              <w:r>
-                                <w:rPr>
-                                  <w:caps/>
-                                  <w:color w:val="1CADE4" w:themeColor="accent1"/>
-                                  <w:sz w:val="28"/>
-                                  <w:szCs w:val="28"/>
-                                </w:rPr>
-                                <w:t>[Date]</w:t>
-                              </w:r>
-                            </w:p>
-                          </w:sdtContent>
-                        </w:sdt>
                         <w:p>
                           <w:pPr>
                             <w:pStyle w:val="NoSpacing"/>
@@ -445,29 +446,36 @@
                               <w:color w:val="1CADE4" w:themeColor="accent1"/>
                             </w:rPr>
                           </w:pPr>
-                          <w:sdt>
-                            <w:sdtPr>
-                              <w:rPr>
-                                <w:caps/>
-                                <w:color w:val="1CADE4" w:themeColor="accent1"/>
-                              </w:rPr>
-                              <w:alias w:val="Company"/>
-                              <w:tag w:val=""/>
-                              <w:id w:val="1390145197"/>
-                              <w:showingPlcHdr/>
-                              <w:dataBinding w:prefixMappings="xmlns:ns0='http://schemas.openxmlformats.org/officeDocument/2006/extended-properties' " w:xpath="/ns0:Properties[1]/ns0:Company[1]" w:storeItemID="{6668398D-A668-4E3E-A5EB-62B293D839F1}"/>
-                              <w:text/>
-                            </w:sdtPr>
-                            <w:sdtContent>
-                              <w:r>
-                                <w:rPr>
-                                  <w:caps/>
-                                  <w:color w:val="1CADE4" w:themeColor="accent1"/>
-                                </w:rPr>
-                                <w:t>[Company name]</w:t>
-                              </w:r>
-                            </w:sdtContent>
-                          </w:sdt>
+                          <w:r>
+                            <w:rPr>
+                              <w:color w:val="1CADE4" w:themeColor="accent1"/>
+                            </w:rPr>
+                            <w:t xml:space="preserve">Por </w:t>
+                          </w:r>
+                          <w:r>
+                            <w:rPr>
+                              <w:color w:val="1CADE4" w:themeColor="accent1"/>
+                            </w:rPr>
+                            <w:t>Juan Cruz Paez, Facundo Nicol</w:t>
+                          </w:r>
+                          <w:r>
+                            <w:rPr>
+                              <w:color w:val="1CADE4" w:themeColor="accent1"/>
+                            </w:rPr>
+                            <w:t>á</w:t>
+                          </w:r>
+                          <w:r>
+                            <w:rPr>
+                              <w:color w:val="1CADE4" w:themeColor="accent1"/>
+                            </w:rPr>
+                            <w:t>s F</w:t>
+                          </w:r>
+                          <w:r>
+                            <w:rPr>
+                              <w:color w:val="1CADE4" w:themeColor="accent1"/>
+                            </w:rPr>
+                            <w:t>arías Lozano</w:t>
+                          </w:r>
                         </w:p>
                         <w:p>
                           <w:pPr>
@@ -477,27 +485,57 @@
                               <w:color w:val="1CADE4" w:themeColor="accent1"/>
                             </w:rPr>
                           </w:pPr>
-                          <w:sdt>
-                            <w:sdtPr>
-                              <w:rPr>
-                                <w:color w:val="1CADE4" w:themeColor="accent1"/>
-                              </w:rPr>
-                              <w:alias w:val="Address"/>
-                              <w:tag w:val=""/>
-                              <w:id w:val="-726379553"/>
-                              <w:showingPlcHdr/>
-                              <w:dataBinding w:prefixMappings="xmlns:ns0='http://schemas.microsoft.com/office/2006/coverPageProps' " w:xpath="/ns0:CoverPageProperties[1]/ns0:CompanyAddress[1]" w:storeItemID="{55AF091B-3C7A-41E3-B477-F2FDAA23CFDA}"/>
-                              <w:text/>
-                            </w:sdtPr>
-                            <w:sdtContent>
-                              <w:r>
-                                <w:rPr>
-                                  <w:color w:val="1CADE4" w:themeColor="accent1"/>
-                                </w:rPr>
-                                <w:t>[Company address]</w:t>
-                              </w:r>
-                            </w:sdtContent>
-                          </w:sdt>
+                          <w:r>
+                            <w:rPr>
+                              <w:color w:val="1CADE4" w:themeColor="accent1"/>
+                            </w:rPr>
+                            <w:t>UNSL</w:t>
+                          </w:r>
+                        </w:p>
+                        <w:p>
+                          <w:pPr>
+                            <w:pStyle w:val="NoSpacing"/>
+                            <w:jc w:val="center"/>
+                            <w:rPr>
+                              <w:color w:val="1CADE4" w:themeColor="accent1"/>
+                            </w:rPr>
+                          </w:pPr>
+                          <w:r>
+                            <w:rPr>
+                              <w:color w:val="1CADE4" w:themeColor="accent1"/>
+                            </w:rPr>
+                            <w:t>Facultad de Cs. Físico Matemática y Naturales</w:t>
+                          </w:r>
+                        </w:p>
+                        <w:p>
+                          <w:pPr>
+                            <w:pStyle w:val="NoSpacing"/>
+                            <w:jc w:val="center"/>
+                            <w:rPr>
+                              <w:color w:val="1CADE4" w:themeColor="accent1"/>
+                            </w:rPr>
+                          </w:pPr>
+                          <w:r>
+                            <w:rPr>
+                              <w:color w:val="1CADE4" w:themeColor="accent1"/>
+                            </w:rPr>
+                            <w:t>Departamento de Informática</w:t>
+                          </w:r>
+                        </w:p>
+                        <w:p>
+                          <w:pPr>
+                            <w:pStyle w:val="NoSpacing"/>
+                            <w:jc w:val="center"/>
+                            <w:rPr>
+                              <w:color w:val="1CADE4" w:themeColor="accent1"/>
+                            </w:rPr>
+                          </w:pPr>
+                          <w:r>
+                            <w:rPr>
+                              <w:color w:val="1CADE4" w:themeColor="accent1"/>
+                            </w:rPr>
+                            <w:t>2025</w:t>
+                          </w:r>
                         </w:p>
                       </w:txbxContent>
                     </v:textbox>
@@ -528,7 +566,7 @@
                         <pic:cNvPicPr/>
                       </pic:nvPicPr>
                       <pic:blipFill>
-                        <a:blip r:embed="rId7" cstate="print">
+                        <a:blip r:embed="rId8" cstate="print">
                           <a:duotone>
                             <a:schemeClr val="accent1">
                               <a:shade val="45000"/>
@@ -622,28 +660,350 @@
     <w:p>
       <w:pPr>
         <w:pStyle w:val="Heading1"/>
-      </w:pPr>
-      <w:r>
-        <w:t>Modelo</w:t>
+        <w:tabs>
+          <w:tab w:val="left" w:pos="3840"/>
+        </w:tabs>
+      </w:pPr>
+      <w:r>
+        <w:t>Objetivos</w:t>
       </w:r>
     </w:p>
     <w:p>
       <w:r>
-        <w:t xml:space="preserve">Para la primera etapa seguimos la metodología S.O.L.I.D., por lo que las clases </w:t>
-      </w:r>
-      <w:r>
-        <w:t>fueron creadas en base a la escalabilidad, y puede que aún no se vea el sentido de su existencia.</w:t>
+        <w:t>En esta primera etapa, perseguimos los siguientes objetivos, definidos a partir del enunciado del práctico:</w:t>
       </w:r>
     </w:p>
     <w:p>
       <w:pPr>
-        <w:pStyle w:val="Heading1"/>
-      </w:pPr>
-      <w:r>
-        <w:t>Objetivos</w:t>
+        <w:numPr>
+          <w:ilvl w:val="0"/>
+          <w:numId w:val="5"/>
+        </w:numPr>
+      </w:pPr>
+      <w:r>
+        <w:t xml:space="preserve">Implementar un simulador orientado a eventos discretos que permita instanciar múltiples realidades y representar el estado y la evolución del sistema físico en un aeropuerto de vuelos de cabotaje </w:t>
+      </w:r>
+      <w:r>
+        <w:rPr>
+          <w:rFonts w:ascii="Arial" w:hAnsi="Arial" w:cs="Arial"/>
+        </w:rPr>
+        <w:t>​</w:t>
+      </w:r>
+      <w:r>
+        <w:t>.</w:t>
       </w:r>
     </w:p>
     <w:p>
+      <w:pPr>
+        <w:numPr>
+          <w:ilvl w:val="0"/>
+          <w:numId w:val="5"/>
+        </w:numPr>
+      </w:pPr>
+      <w:r>
+        <w:t xml:space="preserve">Emplear la técnica de bootstrapping, en la que cada evento programa el siguiente, optimizando la automatización de la simulación y la gestión de la FEL (Future </w:t>
+      </w:r>
+      <w:proofErr w:type="spellStart"/>
+      <w:r>
+        <w:t>Event</w:t>
+      </w:r>
+      <w:proofErr w:type="spellEnd"/>
+      <w:r>
+        <w:t xml:space="preserve"> List) </w:t>
+      </w:r>
+      <w:r>
+        <w:rPr>
+          <w:rFonts w:ascii="Arial" w:hAnsi="Arial" w:cs="Arial"/>
+        </w:rPr>
+        <w:t>​</w:t>
+      </w:r>
+      <w:r>
+        <w:t>.</w:t>
+      </w:r>
+    </w:p>
+    <w:p>
+      <w:pPr>
+        <w:numPr>
+          <w:ilvl w:val="0"/>
+          <w:numId w:val="5"/>
+        </w:numPr>
+      </w:pPr>
+      <w:r>
+        <w:t>Recopilar datos de simulación para calcular:</w:t>
+      </w:r>
+    </w:p>
+    <w:p>
+      <w:pPr>
+        <w:numPr>
+          <w:ilvl w:val="1"/>
+          <w:numId w:val="5"/>
+        </w:numPr>
+      </w:pPr>
+      <w:r>
+        <w:t>Cantidad total de aeronaves que han arribado y que han aterrizado.</w:t>
+      </w:r>
+    </w:p>
+    <w:p>
+      <w:pPr>
+        <w:numPr>
+          <w:ilvl w:val="1"/>
+          <w:numId w:val="5"/>
+        </w:numPr>
+      </w:pPr>
+      <w:r>
+        <w:t>Tiempos de tránsito (media, máximo y mínimo distinto de cero).</w:t>
+      </w:r>
+    </w:p>
+    <w:p>
+      <w:pPr>
+        <w:numPr>
+          <w:ilvl w:val="1"/>
+          <w:numId w:val="5"/>
+        </w:numPr>
+      </w:pPr>
+      <w:r>
+        <w:t>Tiempos de espera (media, máximo y mínimo distinto de cero).</w:t>
+      </w:r>
+    </w:p>
+    <w:p>
+      <w:pPr>
+        <w:numPr>
+          <w:ilvl w:val="1"/>
+          <w:numId w:val="5"/>
+        </w:numPr>
+      </w:pPr>
+      <w:r>
+        <w:t>Tiempo de ocio de la pista (total, máximo, mínimo y proporción del tiempo de simulación).</w:t>
+      </w:r>
+    </w:p>
+    <w:p>
+      <w:pPr>
+        <w:numPr>
+          <w:ilvl w:val="1"/>
+          <w:numId w:val="5"/>
+        </w:numPr>
+      </w:pPr>
+      <w:r>
+        <w:t>Tamaño de la cola de espera (máximo y mínimo distinto de cero).</w:t>
+      </w:r>
+    </w:p>
+    <w:p>
+      <w:pPr>
+        <w:numPr>
+          <w:ilvl w:val="0"/>
+          <w:numId w:val="5"/>
+        </w:numPr>
+      </w:pPr>
+      <w:r>
+        <w:t>Validar el correcto funcionamiento de la simulación en un horizonte de 4 semanas de tiempo de simulación.</w:t>
+      </w:r>
+      <w:r>
+        <w:tab/>
+      </w:r>
+    </w:p>
+    <w:p>
+      <w:r>
+        <w:pict w14:anchorId="2B81E80E">
+          <v:rect id="_x0000_i1034" style="width:0;height:1.5pt" o:hralign="center" o:hrstd="t" o:hr="t" fillcolor="#a0a0a0" stroked="f"/>
+        </w:pict>
+      </w:r>
+    </w:p>
+    <w:p>
+      <w:pPr>
+        <w:pStyle w:val="Heading1"/>
+      </w:pPr>
+      <w:r>
+        <w:t>Experiencia de Desarrollo</w:t>
+      </w:r>
+    </w:p>
+    <w:p>
+      <w:pPr>
+        <w:numPr>
+          <w:ilvl w:val="0"/>
+          <w:numId w:val="4"/>
+        </w:numPr>
+      </w:pPr>
+      <w:r>
+        <w:t>Al ser nuestra primera simulación, no disponíamos del conocimiento ni de la experiencia para abordar el desarrollo de manera directa, lo que incrementó la complejidad de la etapa inicial.</w:t>
+      </w:r>
+    </w:p>
+    <w:p>
+      <w:pPr>
+        <w:numPr>
+          <w:ilvl w:val="0"/>
+          <w:numId w:val="4"/>
+        </w:numPr>
+      </w:pPr>
+      <w:r>
+        <w:t xml:space="preserve">Debido a nuestra falta de </w:t>
+      </w:r>
+      <w:r>
+        <w:t>experiencia</w:t>
+      </w:r>
+      <w:r>
+        <w:t xml:space="preserve">, debimos </w:t>
+      </w:r>
+      <w:r>
+        <w:rPr>
+          <w:b/>
+          <w:bCs/>
+        </w:rPr>
+        <w:t>readaptar partes del código en múltiples ocasiones</w:t>
+      </w:r>
+      <w:r>
+        <w:t>, refinando la estructura y corregir errores en la gestión de la FEL.</w:t>
+      </w:r>
+    </w:p>
+    <w:p>
+      <w:pPr>
+        <w:numPr>
+          <w:ilvl w:val="0"/>
+          <w:numId w:val="4"/>
+        </w:numPr>
+      </w:pPr>
+      <w:r>
+        <w:lastRenderedPageBreak/>
+        <w:t xml:space="preserve">Incorporamos por primera vez en nuestra forma de codificar los </w:t>
+      </w:r>
+      <w:r>
+        <w:rPr>
+          <w:b/>
+          <w:bCs/>
+        </w:rPr>
+        <w:t>principios S.O.L.I.D.</w:t>
+      </w:r>
+      <w:r>
+        <w:t xml:space="preserve">, y pudimos apreciar sus beneficios en la mantenibilidad, </w:t>
+      </w:r>
+      <w:r>
+        <w:t>cohesión</w:t>
+      </w:r>
+      <w:r>
+        <w:t xml:space="preserve"> y extensibilidad del simulador.</w:t>
+      </w:r>
+    </w:p>
+    <w:p>
+      <w:pPr>
+        <w:numPr>
+          <w:ilvl w:val="0"/>
+          <w:numId w:val="4"/>
+        </w:numPr>
+      </w:pPr>
+      <w:r>
+        <w:t xml:space="preserve">Una de nuestras principales dificultades fue </w:t>
+      </w:r>
+      <w:r>
+        <w:rPr>
+          <w:b/>
+          <w:bCs/>
+        </w:rPr>
+        <w:t>determinar la forma óptima de implementar el cómputo de estadísticas</w:t>
+      </w:r>
+      <w:r>
+        <w:t xml:space="preserve"> (tiempos de espera, tránsito y ocio), lo que nos obligó a diseñar estructuras de datos auxiliares y métodos de agregación flexibles.</w:t>
+      </w:r>
+    </w:p>
+    <w:p>
+      <w:pPr>
+        <w:numPr>
+          <w:ilvl w:val="0"/>
+          <w:numId w:val="4"/>
+        </w:numPr>
+      </w:pPr>
+      <w:r>
+        <w:t xml:space="preserve">Al aplicar SOLID y considerando los requisitos de las siguientes dos etapas del práctico, realizamos el diseño pensando en </w:t>
+      </w:r>
+      <w:r>
+        <w:rPr>
+          <w:b/>
+          <w:bCs/>
+        </w:rPr>
+        <w:t>posibles cambios futuros</w:t>
+      </w:r>
+      <w:r>
+        <w:t>, lo que facilitará la integración de múltiples servidores y nuevos generadores de variables aleatorias en etapas posteriores.</w:t>
+      </w:r>
+    </w:p>
+    <w:p>
+      <w:pPr>
+        <w:numPr>
+          <w:ilvl w:val="0"/>
+          <w:numId w:val="4"/>
+        </w:numPr>
+      </w:pPr>
+      <w:r>
+        <w:t xml:space="preserve">En conjunto, consideramos que esta primera etapa nos proporcionó una </w:t>
+      </w:r>
+      <w:r>
+        <w:rPr>
+          <w:b/>
+          <w:bCs/>
+        </w:rPr>
+        <w:t>experiencia valiosa</w:t>
+      </w:r>
+      <w:r>
+        <w:t xml:space="preserve"> que sin duda enriquecerá nuestro desarrollo profesional en simulación y diseño de software.</w:t>
+      </w:r>
+    </w:p>
+    <w:p>
+      <w:r>
+        <w:pict w14:anchorId="40E16636">
+          <v:rect id="_x0000_i1035" style="width:0;height:1.5pt" o:hralign="center" o:hrstd="t" o:hr="t" fillcolor="#a0a0a0" stroked="f"/>
+        </w:pict>
+      </w:r>
+    </w:p>
+    <w:p>
+      <w:pPr>
+        <w:pStyle w:val="Heading1"/>
+      </w:pPr>
+      <w:r>
+        <w:t>Modelo de Dominio</w:t>
+      </w:r>
+    </w:p>
+    <w:p>
+      <w:r>
+        <w:t>Para la primera etapa seguimos la metodología S.O.L.I.D., por lo que las clases fueron creadas en base a la escalabilidad, y puede que aún no se vea el sentido de su existencia.</w:t>
+      </w:r>
+    </w:p>
+    <w:p>
+      <w:r>
+        <w:lastRenderedPageBreak/>
+        <w:drawing>
+          <wp:inline distT="0" distB="0" distL="0" distR="0" wp14:anchorId="3821C066" wp14:editId="1FE5C8E3">
+            <wp:extent cx="5731510" cy="3442335"/>
+            <wp:effectExtent l="0" t="0" r="2540" b="5715"/>
+            <wp:docPr id="1127189294" name="Picture 1"/>
+            <wp:cNvGraphicFramePr>
+              <a:graphicFrameLocks xmlns:a="http://schemas.openxmlformats.org/drawingml/2006/main" noChangeAspect="1"/>
+            </wp:cNvGraphicFramePr>
+            <a:graphic xmlns:a="http://schemas.openxmlformats.org/drawingml/2006/main">
+              <a:graphicData uri="http://schemas.openxmlformats.org/drawingml/2006/picture">
+                <pic:pic xmlns:pic="http://schemas.openxmlformats.org/drawingml/2006/picture">
+                  <pic:nvPicPr>
+                    <pic:cNvPr id="1127189294" name=""/>
+                    <pic:cNvPicPr/>
+                  </pic:nvPicPr>
+                  <pic:blipFill>
+                    <a:blip r:embed="rId9"/>
+                    <a:stretch>
+                      <a:fillRect/>
+                    </a:stretch>
+                  </pic:blipFill>
+                  <pic:spPr>
+                    <a:xfrm>
+                      <a:off x="0" y="0"/>
+                      <a:ext cx="5731510" cy="3442335"/>
+                    </a:xfrm>
+                    <a:prstGeom prst="rect">
+                      <a:avLst/>
+                    </a:prstGeom>
+                  </pic:spPr>
+                </pic:pic>
+              </a:graphicData>
+            </a:graphic>
+          </wp:inline>
+        </w:drawing>
+      </w:r>
       <w:r>
         <w:br w:type="page"/>
       </w:r>
@@ -708,7 +1068,7 @@
     </w:p>
     <w:p/>
     <w:sectPr>
-      <w:footerReference w:type="default" r:id="rId8"/>
+      <w:footerReference w:type="default" r:id="rId10"/>
       <w:pgSz w:w="11906" w:h="16838"/>
       <w:pgMar w:top="1440" w:right="1440" w:bottom="1440" w:left="1440" w:header="708" w:footer="708" w:gutter="0"/>
       <w:pgNumType w:start="0"/>
@@ -900,6 +1260,716 @@
     </w:p>
   </w:footnote>
 </w:footnotes>
+</file>
+
+<file path=word/numbering.xml><?xml version="1.0" encoding="utf-8"?>
+<w:numbering xmlns:wpc="http://schemas.microsoft.com/office/word/2010/wordprocessingCanvas" xmlns:cx="http://schemas.microsoft.com/office/drawing/2014/chartex" xmlns:cx1="http://schemas.microsoft.com/office/drawing/2015/9/8/chartex" xmlns:cx2="http://schemas.microsoft.com/office/drawing/2015/10/21/chartex" xmlns:cx3="http://schemas.microsoft.com/office/drawing/2016/5/9/chartex" xmlns:cx4="http://schemas.microsoft.com/office/drawing/2016/5/10/chartex" xmlns:cx5="http://schemas.microsoft.com/office/drawing/2016/5/11/chartex" xmlns:cx6="http://schemas.microsoft.com/office/drawing/2016/5/12/chartex" xmlns:cx7="http://schemas.microsoft.com/office/drawing/2016/5/13/chartex" xmlns:cx8="http://schemas.microsoft.com/office/drawing/2016/5/14/chartex" xmlns:mc="http://schemas.openxmlformats.org/markup-compatibility/2006" xmlns:aink="http://schemas.microsoft.com/office/drawing/2016/ink" xmlns:am3d="http://schemas.microsoft.com/office/drawing/2017/model3d" xmlns:o="urn:schemas-microsoft-com:office:office" xmlns:oel="http://schemas.microsoft.com/office/2019/extlst" xmlns:r="http://schemas.openxmlformats.org/officeDocument/2006/relationships" xmlns:m="http://schemas.openxmlformats.org/officeDocument/2006/math" xmlns:v="urn:schemas-microsoft-com:vml" xmlns:wp14="http://schemas.microsoft.com/office/word/2010/wordprocessingDrawing" xmlns:wp="http://schemas.openxmlformats.org/drawingml/2006/wordprocessingDrawing" xmlns:w10="urn:schemas-microsoft-com:office:word" xmlns:w="http://schemas.openxmlformats.org/wordprocessingml/2006/main" xmlns:w14="http://schemas.microsoft.com/office/word/2010/wordml" xmlns:w15="http://schemas.microsoft.com/office/word/2012/wordml" xmlns:w16cex="http://schemas.microsoft.com/office/word/2018/wordml/cex" xmlns:w16cid="http://schemas.microsoft.com/office/word/2016/wordml/cid" xmlns:w16="http://schemas.microsoft.com/office/word/2018/wordml" xmlns:w16du="http://schemas.microsoft.com/office/word/2023/wordml/word16du" xmlns:w16sdtdh="http://schemas.microsoft.com/office/word/2020/wordml/sdtdatahash" xmlns:w16sdtfl="http://schemas.microsoft.com/office/word/2024/wordml/sdtformatlock" xmlns:w16se="http://schemas.microsoft.com/office/word/2015/wordml/symex" xmlns:wpg="http://schemas.microsoft.com/office/word/2010/wordprocessingGroup" xmlns:wpi="http://schemas.microsoft.com/office/word/2010/wordprocessingInk" xmlns:wne="http://schemas.microsoft.com/office/word/2006/wordml" xmlns:wps="http://schemas.microsoft.com/office/word/2010/wordprocessingShape" mc:Ignorable="w14 w15 w16se w16cid w16 w16cex w16sdtdh w16sdtfl w16du wp14">
+  <w:abstractNum w:abstractNumId="0" w15:restartNumberingAfterBreak="0">
+    <w:nsid w:val="0AE9387F"/>
+    <w:multiLevelType w:val="multilevel"/>
+    <w:tmpl w:val="544C56CC"/>
+    <w:lvl w:ilvl="0">
+      <w:start w:val="1"/>
+      <w:numFmt w:val="decimal"/>
+      <w:lvlText w:val="%1."/>
+      <w:lvlJc w:val="left"/>
+      <w:pPr>
+        <w:tabs>
+          <w:tab w:val="num" w:pos="720"/>
+        </w:tabs>
+        <w:ind w:left="720" w:hanging="360"/>
+      </w:pPr>
+    </w:lvl>
+    <w:lvl w:ilvl="1">
+      <w:start w:val="1"/>
+      <w:numFmt w:val="bullet"/>
+      <w:lvlText w:val="o"/>
+      <w:lvlJc w:val="left"/>
+      <w:pPr>
+        <w:tabs>
+          <w:tab w:val="num" w:pos="1440"/>
+        </w:tabs>
+        <w:ind w:left="1440" w:hanging="360"/>
+      </w:pPr>
+      <w:rPr>
+        <w:rFonts w:ascii="Courier New" w:hAnsi="Courier New" w:hint="default"/>
+        <w:sz w:val="20"/>
+      </w:rPr>
+    </w:lvl>
+    <w:lvl w:ilvl="2">
+      <w:start w:val="1"/>
+      <w:numFmt w:val="bullet"/>
+      <w:lvlText w:val=""/>
+      <w:lvlJc w:val="left"/>
+      <w:pPr>
+        <w:tabs>
+          <w:tab w:val="num" w:pos="2160"/>
+        </w:tabs>
+        <w:ind w:left="2160" w:hanging="360"/>
+      </w:pPr>
+      <w:rPr>
+        <w:rFonts w:ascii="Wingdings" w:hAnsi="Wingdings" w:hint="default"/>
+        <w:sz w:val="20"/>
+      </w:rPr>
+    </w:lvl>
+    <w:lvl w:ilvl="3" w:tentative="1">
+      <w:start w:val="1"/>
+      <w:numFmt w:val="decimal"/>
+      <w:lvlText w:val="%4."/>
+      <w:lvlJc w:val="left"/>
+      <w:pPr>
+        <w:tabs>
+          <w:tab w:val="num" w:pos="2880"/>
+        </w:tabs>
+        <w:ind w:left="2880" w:hanging="360"/>
+      </w:pPr>
+    </w:lvl>
+    <w:lvl w:ilvl="4" w:tentative="1">
+      <w:start w:val="1"/>
+      <w:numFmt w:val="decimal"/>
+      <w:lvlText w:val="%5."/>
+      <w:lvlJc w:val="left"/>
+      <w:pPr>
+        <w:tabs>
+          <w:tab w:val="num" w:pos="3600"/>
+        </w:tabs>
+        <w:ind w:left="3600" w:hanging="360"/>
+      </w:pPr>
+    </w:lvl>
+    <w:lvl w:ilvl="5" w:tentative="1">
+      <w:start w:val="1"/>
+      <w:numFmt w:val="decimal"/>
+      <w:lvlText w:val="%6."/>
+      <w:lvlJc w:val="left"/>
+      <w:pPr>
+        <w:tabs>
+          <w:tab w:val="num" w:pos="4320"/>
+        </w:tabs>
+        <w:ind w:left="4320" w:hanging="360"/>
+      </w:pPr>
+    </w:lvl>
+    <w:lvl w:ilvl="6" w:tentative="1">
+      <w:start w:val="1"/>
+      <w:numFmt w:val="decimal"/>
+      <w:lvlText w:val="%7."/>
+      <w:lvlJc w:val="left"/>
+      <w:pPr>
+        <w:tabs>
+          <w:tab w:val="num" w:pos="5040"/>
+        </w:tabs>
+        <w:ind w:left="5040" w:hanging="360"/>
+      </w:pPr>
+    </w:lvl>
+    <w:lvl w:ilvl="7" w:tentative="1">
+      <w:start w:val="1"/>
+      <w:numFmt w:val="decimal"/>
+      <w:lvlText w:val="%8."/>
+      <w:lvlJc w:val="left"/>
+      <w:pPr>
+        <w:tabs>
+          <w:tab w:val="num" w:pos="5760"/>
+        </w:tabs>
+        <w:ind w:left="5760" w:hanging="360"/>
+      </w:pPr>
+    </w:lvl>
+    <w:lvl w:ilvl="8" w:tentative="1">
+      <w:start w:val="1"/>
+      <w:numFmt w:val="decimal"/>
+      <w:lvlText w:val="%9."/>
+      <w:lvlJc w:val="left"/>
+      <w:pPr>
+        <w:tabs>
+          <w:tab w:val="num" w:pos="6480"/>
+        </w:tabs>
+        <w:ind w:left="6480" w:hanging="360"/>
+      </w:pPr>
+    </w:lvl>
+  </w:abstractNum>
+  <w:abstractNum w:abstractNumId="1" w15:restartNumberingAfterBreak="0">
+    <w:nsid w:val="2DED2162"/>
+    <w:multiLevelType w:val="multilevel"/>
+    <w:tmpl w:val="A8AEB5D6"/>
+    <w:lvl w:ilvl="0">
+      <w:start w:val="1"/>
+      <w:numFmt w:val="decimal"/>
+      <w:lvlText w:val="%1."/>
+      <w:lvlJc w:val="left"/>
+      <w:pPr>
+        <w:tabs>
+          <w:tab w:val="num" w:pos="720"/>
+        </w:tabs>
+        <w:ind w:left="720" w:hanging="360"/>
+      </w:pPr>
+    </w:lvl>
+    <w:lvl w:ilvl="1">
+      <w:start w:val="1"/>
+      <w:numFmt w:val="bullet"/>
+      <w:lvlText w:val="o"/>
+      <w:lvlJc w:val="left"/>
+      <w:pPr>
+        <w:tabs>
+          <w:tab w:val="num" w:pos="1440"/>
+        </w:tabs>
+        <w:ind w:left="1440" w:hanging="360"/>
+      </w:pPr>
+      <w:rPr>
+        <w:rFonts w:ascii="Courier New" w:hAnsi="Courier New" w:hint="default"/>
+        <w:sz w:val="20"/>
+      </w:rPr>
+    </w:lvl>
+    <w:lvl w:ilvl="2">
+      <w:start w:val="1"/>
+      <w:numFmt w:val="bullet"/>
+      <w:lvlText w:val=""/>
+      <w:lvlJc w:val="left"/>
+      <w:pPr>
+        <w:tabs>
+          <w:tab w:val="num" w:pos="2160"/>
+        </w:tabs>
+        <w:ind w:left="2160" w:hanging="360"/>
+      </w:pPr>
+      <w:rPr>
+        <w:rFonts w:ascii="Wingdings" w:hAnsi="Wingdings" w:hint="default"/>
+        <w:sz w:val="20"/>
+      </w:rPr>
+    </w:lvl>
+    <w:lvl w:ilvl="3" w:tentative="1">
+      <w:start w:val="1"/>
+      <w:numFmt w:val="decimal"/>
+      <w:lvlText w:val="%4."/>
+      <w:lvlJc w:val="left"/>
+      <w:pPr>
+        <w:tabs>
+          <w:tab w:val="num" w:pos="2880"/>
+        </w:tabs>
+        <w:ind w:left="2880" w:hanging="360"/>
+      </w:pPr>
+    </w:lvl>
+    <w:lvl w:ilvl="4" w:tentative="1">
+      <w:start w:val="1"/>
+      <w:numFmt w:val="decimal"/>
+      <w:lvlText w:val="%5."/>
+      <w:lvlJc w:val="left"/>
+      <w:pPr>
+        <w:tabs>
+          <w:tab w:val="num" w:pos="3600"/>
+        </w:tabs>
+        <w:ind w:left="3600" w:hanging="360"/>
+      </w:pPr>
+    </w:lvl>
+    <w:lvl w:ilvl="5" w:tentative="1">
+      <w:start w:val="1"/>
+      <w:numFmt w:val="decimal"/>
+      <w:lvlText w:val="%6."/>
+      <w:lvlJc w:val="left"/>
+      <w:pPr>
+        <w:tabs>
+          <w:tab w:val="num" w:pos="4320"/>
+        </w:tabs>
+        <w:ind w:left="4320" w:hanging="360"/>
+      </w:pPr>
+    </w:lvl>
+    <w:lvl w:ilvl="6" w:tentative="1">
+      <w:start w:val="1"/>
+      <w:numFmt w:val="decimal"/>
+      <w:lvlText w:val="%7."/>
+      <w:lvlJc w:val="left"/>
+      <w:pPr>
+        <w:tabs>
+          <w:tab w:val="num" w:pos="5040"/>
+        </w:tabs>
+        <w:ind w:left="5040" w:hanging="360"/>
+      </w:pPr>
+    </w:lvl>
+    <w:lvl w:ilvl="7" w:tentative="1">
+      <w:start w:val="1"/>
+      <w:numFmt w:val="decimal"/>
+      <w:lvlText w:val="%8."/>
+      <w:lvlJc w:val="left"/>
+      <w:pPr>
+        <w:tabs>
+          <w:tab w:val="num" w:pos="5760"/>
+        </w:tabs>
+        <w:ind w:left="5760" w:hanging="360"/>
+      </w:pPr>
+    </w:lvl>
+    <w:lvl w:ilvl="8" w:tentative="1">
+      <w:start w:val="1"/>
+      <w:numFmt w:val="decimal"/>
+      <w:lvlText w:val="%9."/>
+      <w:lvlJc w:val="left"/>
+      <w:pPr>
+        <w:tabs>
+          <w:tab w:val="num" w:pos="6480"/>
+        </w:tabs>
+        <w:ind w:left="6480" w:hanging="360"/>
+      </w:pPr>
+    </w:lvl>
+  </w:abstractNum>
+  <w:abstractNum w:abstractNumId="2" w15:restartNumberingAfterBreak="0">
+    <w:nsid w:val="2E0662F3"/>
+    <w:multiLevelType w:val="multilevel"/>
+    <w:tmpl w:val="C532CB42"/>
+    <w:lvl w:ilvl="0">
+      <w:start w:val="1"/>
+      <w:numFmt w:val="bullet"/>
+      <w:lvlText w:val=""/>
+      <w:lvlJc w:val="left"/>
+      <w:pPr>
+        <w:tabs>
+          <w:tab w:val="num" w:pos="720"/>
+        </w:tabs>
+        <w:ind w:left="720" w:hanging="360"/>
+      </w:pPr>
+      <w:rPr>
+        <w:rFonts w:ascii="Symbol" w:hAnsi="Symbol" w:hint="default"/>
+        <w:sz w:val="20"/>
+      </w:rPr>
+    </w:lvl>
+    <w:lvl w:ilvl="1">
+      <w:start w:val="1"/>
+      <w:numFmt w:val="bullet"/>
+      <w:lvlText w:val="o"/>
+      <w:lvlJc w:val="left"/>
+      <w:pPr>
+        <w:tabs>
+          <w:tab w:val="num" w:pos="1440"/>
+        </w:tabs>
+        <w:ind w:left="1440" w:hanging="360"/>
+      </w:pPr>
+      <w:rPr>
+        <w:rFonts w:ascii="Courier New" w:hAnsi="Courier New" w:hint="default"/>
+        <w:sz w:val="20"/>
+      </w:rPr>
+    </w:lvl>
+    <w:lvl w:ilvl="2" w:tentative="1">
+      <w:start w:val="1"/>
+      <w:numFmt w:val="bullet"/>
+      <w:lvlText w:val=""/>
+      <w:lvlJc w:val="left"/>
+      <w:pPr>
+        <w:tabs>
+          <w:tab w:val="num" w:pos="2160"/>
+        </w:tabs>
+        <w:ind w:left="2160" w:hanging="360"/>
+      </w:pPr>
+      <w:rPr>
+        <w:rFonts w:ascii="Wingdings" w:hAnsi="Wingdings" w:hint="default"/>
+        <w:sz w:val="20"/>
+      </w:rPr>
+    </w:lvl>
+    <w:lvl w:ilvl="3" w:tentative="1">
+      <w:start w:val="1"/>
+      <w:numFmt w:val="bullet"/>
+      <w:lvlText w:val=""/>
+      <w:lvlJc w:val="left"/>
+      <w:pPr>
+        <w:tabs>
+          <w:tab w:val="num" w:pos="2880"/>
+        </w:tabs>
+        <w:ind w:left="2880" w:hanging="360"/>
+      </w:pPr>
+      <w:rPr>
+        <w:rFonts w:ascii="Wingdings" w:hAnsi="Wingdings" w:hint="default"/>
+        <w:sz w:val="20"/>
+      </w:rPr>
+    </w:lvl>
+    <w:lvl w:ilvl="4" w:tentative="1">
+      <w:start w:val="1"/>
+      <w:numFmt w:val="bullet"/>
+      <w:lvlText w:val=""/>
+      <w:lvlJc w:val="left"/>
+      <w:pPr>
+        <w:tabs>
+          <w:tab w:val="num" w:pos="3600"/>
+        </w:tabs>
+        <w:ind w:left="3600" w:hanging="360"/>
+      </w:pPr>
+      <w:rPr>
+        <w:rFonts w:ascii="Wingdings" w:hAnsi="Wingdings" w:hint="default"/>
+        <w:sz w:val="20"/>
+      </w:rPr>
+    </w:lvl>
+    <w:lvl w:ilvl="5" w:tentative="1">
+      <w:start w:val="1"/>
+      <w:numFmt w:val="bullet"/>
+      <w:lvlText w:val=""/>
+      <w:lvlJc w:val="left"/>
+      <w:pPr>
+        <w:tabs>
+          <w:tab w:val="num" w:pos="4320"/>
+        </w:tabs>
+        <w:ind w:left="4320" w:hanging="360"/>
+      </w:pPr>
+      <w:rPr>
+        <w:rFonts w:ascii="Wingdings" w:hAnsi="Wingdings" w:hint="default"/>
+        <w:sz w:val="20"/>
+      </w:rPr>
+    </w:lvl>
+    <w:lvl w:ilvl="6" w:tentative="1">
+      <w:start w:val="1"/>
+      <w:numFmt w:val="bullet"/>
+      <w:lvlText w:val=""/>
+      <w:lvlJc w:val="left"/>
+      <w:pPr>
+        <w:tabs>
+          <w:tab w:val="num" w:pos="5040"/>
+        </w:tabs>
+        <w:ind w:left="5040" w:hanging="360"/>
+      </w:pPr>
+      <w:rPr>
+        <w:rFonts w:ascii="Wingdings" w:hAnsi="Wingdings" w:hint="default"/>
+        <w:sz w:val="20"/>
+      </w:rPr>
+    </w:lvl>
+    <w:lvl w:ilvl="7" w:tentative="1">
+      <w:start w:val="1"/>
+      <w:numFmt w:val="bullet"/>
+      <w:lvlText w:val=""/>
+      <w:lvlJc w:val="left"/>
+      <w:pPr>
+        <w:tabs>
+          <w:tab w:val="num" w:pos="5760"/>
+        </w:tabs>
+        <w:ind w:left="5760" w:hanging="360"/>
+      </w:pPr>
+      <w:rPr>
+        <w:rFonts w:ascii="Wingdings" w:hAnsi="Wingdings" w:hint="default"/>
+        <w:sz w:val="20"/>
+      </w:rPr>
+    </w:lvl>
+    <w:lvl w:ilvl="8" w:tentative="1">
+      <w:start w:val="1"/>
+      <w:numFmt w:val="bullet"/>
+      <w:lvlText w:val=""/>
+      <w:lvlJc w:val="left"/>
+      <w:pPr>
+        <w:tabs>
+          <w:tab w:val="num" w:pos="6480"/>
+        </w:tabs>
+        <w:ind w:left="6480" w:hanging="360"/>
+      </w:pPr>
+      <w:rPr>
+        <w:rFonts w:ascii="Wingdings" w:hAnsi="Wingdings" w:hint="default"/>
+        <w:sz w:val="20"/>
+      </w:rPr>
+    </w:lvl>
+  </w:abstractNum>
+  <w:abstractNum w:abstractNumId="3" w15:restartNumberingAfterBreak="0">
+    <w:nsid w:val="4B096D18"/>
+    <w:multiLevelType w:val="multilevel"/>
+    <w:tmpl w:val="2EF02C52"/>
+    <w:lvl w:ilvl="0">
+      <w:start w:val="1"/>
+      <w:numFmt w:val="bullet"/>
+      <w:lvlText w:val=""/>
+      <w:lvlJc w:val="left"/>
+      <w:pPr>
+        <w:tabs>
+          <w:tab w:val="num" w:pos="720"/>
+        </w:tabs>
+        <w:ind w:left="720" w:hanging="360"/>
+      </w:pPr>
+      <w:rPr>
+        <w:rFonts w:ascii="Symbol" w:hAnsi="Symbol" w:hint="default"/>
+        <w:sz w:val="26"/>
+        <w:szCs w:val="26"/>
+      </w:rPr>
+    </w:lvl>
+    <w:lvl w:ilvl="1" w:tentative="1">
+      <w:start w:val="1"/>
+      <w:numFmt w:val="bullet"/>
+      <w:lvlText w:val="o"/>
+      <w:lvlJc w:val="left"/>
+      <w:pPr>
+        <w:tabs>
+          <w:tab w:val="num" w:pos="1440"/>
+        </w:tabs>
+        <w:ind w:left="1440" w:hanging="360"/>
+      </w:pPr>
+      <w:rPr>
+        <w:rFonts w:ascii="Courier New" w:hAnsi="Courier New" w:hint="default"/>
+        <w:sz w:val="20"/>
+      </w:rPr>
+    </w:lvl>
+    <w:lvl w:ilvl="2" w:tentative="1">
+      <w:start w:val="1"/>
+      <w:numFmt w:val="bullet"/>
+      <w:lvlText w:val=""/>
+      <w:lvlJc w:val="left"/>
+      <w:pPr>
+        <w:tabs>
+          <w:tab w:val="num" w:pos="2160"/>
+        </w:tabs>
+        <w:ind w:left="2160" w:hanging="360"/>
+      </w:pPr>
+      <w:rPr>
+        <w:rFonts w:ascii="Wingdings" w:hAnsi="Wingdings" w:hint="default"/>
+        <w:sz w:val="20"/>
+      </w:rPr>
+    </w:lvl>
+    <w:lvl w:ilvl="3" w:tentative="1">
+      <w:start w:val="1"/>
+      <w:numFmt w:val="bullet"/>
+      <w:lvlText w:val=""/>
+      <w:lvlJc w:val="left"/>
+      <w:pPr>
+        <w:tabs>
+          <w:tab w:val="num" w:pos="2880"/>
+        </w:tabs>
+        <w:ind w:left="2880" w:hanging="360"/>
+      </w:pPr>
+      <w:rPr>
+        <w:rFonts w:ascii="Wingdings" w:hAnsi="Wingdings" w:hint="default"/>
+        <w:sz w:val="20"/>
+      </w:rPr>
+    </w:lvl>
+    <w:lvl w:ilvl="4" w:tentative="1">
+      <w:start w:val="1"/>
+      <w:numFmt w:val="bullet"/>
+      <w:lvlText w:val=""/>
+      <w:lvlJc w:val="left"/>
+      <w:pPr>
+        <w:tabs>
+          <w:tab w:val="num" w:pos="3600"/>
+        </w:tabs>
+        <w:ind w:left="3600" w:hanging="360"/>
+      </w:pPr>
+      <w:rPr>
+        <w:rFonts w:ascii="Wingdings" w:hAnsi="Wingdings" w:hint="default"/>
+        <w:sz w:val="20"/>
+      </w:rPr>
+    </w:lvl>
+    <w:lvl w:ilvl="5" w:tentative="1">
+      <w:start w:val="1"/>
+      <w:numFmt w:val="bullet"/>
+      <w:lvlText w:val=""/>
+      <w:lvlJc w:val="left"/>
+      <w:pPr>
+        <w:tabs>
+          <w:tab w:val="num" w:pos="4320"/>
+        </w:tabs>
+        <w:ind w:left="4320" w:hanging="360"/>
+      </w:pPr>
+      <w:rPr>
+        <w:rFonts w:ascii="Wingdings" w:hAnsi="Wingdings" w:hint="default"/>
+        <w:sz w:val="20"/>
+      </w:rPr>
+    </w:lvl>
+    <w:lvl w:ilvl="6" w:tentative="1">
+      <w:start w:val="1"/>
+      <w:numFmt w:val="bullet"/>
+      <w:lvlText w:val=""/>
+      <w:lvlJc w:val="left"/>
+      <w:pPr>
+        <w:tabs>
+          <w:tab w:val="num" w:pos="5040"/>
+        </w:tabs>
+        <w:ind w:left="5040" w:hanging="360"/>
+      </w:pPr>
+      <w:rPr>
+        <w:rFonts w:ascii="Wingdings" w:hAnsi="Wingdings" w:hint="default"/>
+        <w:sz w:val="20"/>
+      </w:rPr>
+    </w:lvl>
+    <w:lvl w:ilvl="7" w:tentative="1">
+      <w:start w:val="1"/>
+      <w:numFmt w:val="bullet"/>
+      <w:lvlText w:val=""/>
+      <w:lvlJc w:val="left"/>
+      <w:pPr>
+        <w:tabs>
+          <w:tab w:val="num" w:pos="5760"/>
+        </w:tabs>
+        <w:ind w:left="5760" w:hanging="360"/>
+      </w:pPr>
+      <w:rPr>
+        <w:rFonts w:ascii="Wingdings" w:hAnsi="Wingdings" w:hint="default"/>
+        <w:sz w:val="20"/>
+      </w:rPr>
+    </w:lvl>
+    <w:lvl w:ilvl="8" w:tentative="1">
+      <w:start w:val="1"/>
+      <w:numFmt w:val="bullet"/>
+      <w:lvlText w:val=""/>
+      <w:lvlJc w:val="left"/>
+      <w:pPr>
+        <w:tabs>
+          <w:tab w:val="num" w:pos="6480"/>
+        </w:tabs>
+        <w:ind w:left="6480" w:hanging="360"/>
+      </w:pPr>
+      <w:rPr>
+        <w:rFonts w:ascii="Wingdings" w:hAnsi="Wingdings" w:hint="default"/>
+        <w:sz w:val="20"/>
+      </w:rPr>
+    </w:lvl>
+  </w:abstractNum>
+  <w:abstractNum w:abstractNumId="4" w15:restartNumberingAfterBreak="0">
+    <w:nsid w:val="63132EC2"/>
+    <w:multiLevelType w:val="multilevel"/>
+    <w:tmpl w:val="09183478"/>
+    <w:lvl w:ilvl="0">
+      <w:start w:val="1"/>
+      <w:numFmt w:val="bullet"/>
+      <w:lvlText w:val=""/>
+      <w:lvlJc w:val="left"/>
+      <w:pPr>
+        <w:tabs>
+          <w:tab w:val="num" w:pos="720"/>
+        </w:tabs>
+        <w:ind w:left="720" w:hanging="360"/>
+      </w:pPr>
+      <w:rPr>
+        <w:rFonts w:ascii="Symbol" w:hAnsi="Symbol" w:hint="default"/>
+        <w:sz w:val="20"/>
+      </w:rPr>
+    </w:lvl>
+    <w:lvl w:ilvl="1" w:tentative="1">
+      <w:start w:val="1"/>
+      <w:numFmt w:val="bullet"/>
+      <w:lvlText w:val="o"/>
+      <w:lvlJc w:val="left"/>
+      <w:pPr>
+        <w:tabs>
+          <w:tab w:val="num" w:pos="1440"/>
+        </w:tabs>
+        <w:ind w:left="1440" w:hanging="360"/>
+      </w:pPr>
+      <w:rPr>
+        <w:rFonts w:ascii="Courier New" w:hAnsi="Courier New" w:hint="default"/>
+        <w:sz w:val="20"/>
+      </w:rPr>
+    </w:lvl>
+    <w:lvl w:ilvl="2" w:tentative="1">
+      <w:start w:val="1"/>
+      <w:numFmt w:val="bullet"/>
+      <w:lvlText w:val=""/>
+      <w:lvlJc w:val="left"/>
+      <w:pPr>
+        <w:tabs>
+          <w:tab w:val="num" w:pos="2160"/>
+        </w:tabs>
+        <w:ind w:left="2160" w:hanging="360"/>
+      </w:pPr>
+      <w:rPr>
+        <w:rFonts w:ascii="Wingdings" w:hAnsi="Wingdings" w:hint="default"/>
+        <w:sz w:val="20"/>
+      </w:rPr>
+    </w:lvl>
+    <w:lvl w:ilvl="3" w:tentative="1">
+      <w:start w:val="1"/>
+      <w:numFmt w:val="bullet"/>
+      <w:lvlText w:val=""/>
+      <w:lvlJc w:val="left"/>
+      <w:pPr>
+        <w:tabs>
+          <w:tab w:val="num" w:pos="2880"/>
+        </w:tabs>
+        <w:ind w:left="2880" w:hanging="360"/>
+      </w:pPr>
+      <w:rPr>
+        <w:rFonts w:ascii="Wingdings" w:hAnsi="Wingdings" w:hint="default"/>
+        <w:sz w:val="20"/>
+      </w:rPr>
+    </w:lvl>
+    <w:lvl w:ilvl="4" w:tentative="1">
+      <w:start w:val="1"/>
+      <w:numFmt w:val="bullet"/>
+      <w:lvlText w:val=""/>
+      <w:lvlJc w:val="left"/>
+      <w:pPr>
+        <w:tabs>
+          <w:tab w:val="num" w:pos="3600"/>
+        </w:tabs>
+        <w:ind w:left="3600" w:hanging="360"/>
+      </w:pPr>
+      <w:rPr>
+        <w:rFonts w:ascii="Wingdings" w:hAnsi="Wingdings" w:hint="default"/>
+        <w:sz w:val="20"/>
+      </w:rPr>
+    </w:lvl>
+    <w:lvl w:ilvl="5" w:tentative="1">
+      <w:start w:val="1"/>
+      <w:numFmt w:val="bullet"/>
+      <w:lvlText w:val=""/>
+      <w:lvlJc w:val="left"/>
+      <w:pPr>
+        <w:tabs>
+          <w:tab w:val="num" w:pos="4320"/>
+        </w:tabs>
+        <w:ind w:left="4320" w:hanging="360"/>
+      </w:pPr>
+      <w:rPr>
+        <w:rFonts w:ascii="Wingdings" w:hAnsi="Wingdings" w:hint="default"/>
+        <w:sz w:val="20"/>
+      </w:rPr>
+    </w:lvl>
+    <w:lvl w:ilvl="6" w:tentative="1">
+      <w:start w:val="1"/>
+      <w:numFmt w:val="bullet"/>
+      <w:lvlText w:val=""/>
+      <w:lvlJc w:val="left"/>
+      <w:pPr>
+        <w:tabs>
+          <w:tab w:val="num" w:pos="5040"/>
+        </w:tabs>
+        <w:ind w:left="5040" w:hanging="360"/>
+      </w:pPr>
+      <w:rPr>
+        <w:rFonts w:ascii="Wingdings" w:hAnsi="Wingdings" w:hint="default"/>
+        <w:sz w:val="20"/>
+      </w:rPr>
+    </w:lvl>
+    <w:lvl w:ilvl="7" w:tentative="1">
+      <w:start w:val="1"/>
+      <w:numFmt w:val="bullet"/>
+      <w:lvlText w:val=""/>
+      <w:lvlJc w:val="left"/>
+      <w:pPr>
+        <w:tabs>
+          <w:tab w:val="num" w:pos="5760"/>
+        </w:tabs>
+        <w:ind w:left="5760" w:hanging="360"/>
+      </w:pPr>
+      <w:rPr>
+        <w:rFonts w:ascii="Wingdings" w:hAnsi="Wingdings" w:hint="default"/>
+        <w:sz w:val="20"/>
+      </w:rPr>
+    </w:lvl>
+    <w:lvl w:ilvl="8" w:tentative="1">
+      <w:start w:val="1"/>
+      <w:numFmt w:val="bullet"/>
+      <w:lvlText w:val=""/>
+      <w:lvlJc w:val="left"/>
+      <w:pPr>
+        <w:tabs>
+          <w:tab w:val="num" w:pos="6480"/>
+        </w:tabs>
+        <w:ind w:left="6480" w:hanging="360"/>
+      </w:pPr>
+      <w:rPr>
+        <w:rFonts w:ascii="Wingdings" w:hAnsi="Wingdings" w:hint="default"/>
+        <w:sz w:val="20"/>
+      </w:rPr>
+    </w:lvl>
+  </w:abstractNum>
+  <w:num w:numId="1" w16cid:durableId="922833580">
+    <w:abstractNumId w:val="1"/>
+  </w:num>
+  <w:num w:numId="2" w16cid:durableId="368578185">
+    <w:abstractNumId w:val="4"/>
+  </w:num>
+  <w:num w:numId="3" w16cid:durableId="559173962">
+    <w:abstractNumId w:val="0"/>
+  </w:num>
+  <w:num w:numId="4" w16cid:durableId="1027564377">
+    <w:abstractNumId w:val="3"/>
+  </w:num>
+  <w:num w:numId="5" w16cid:durableId="547573144">
+    <w:abstractNumId w:val="2"/>
+  </w:num>
+</w:numbering>
 </file>
 
 <file path=word/styles.xml><?xml version="1.0" encoding="utf-8"?>
@@ -1513,7 +2583,6 @@
   <w:style w:type="character" w:default="1" w:styleId="DefaultParagraphFont">
     <w:name w:val="Default Paragraph Font"/>
     <w:uiPriority w:val="1"/>
-    <w:semiHidden/>
     <w:unhideWhenUsed/>
   </w:style>
   <w:style w:type="table" w:default="1" w:styleId="TableNormal">
@@ -2086,6 +3155,34 @@
 
 <file path=word/glossary/fontTable.xml><?xml version="1.0" encoding="utf-8"?>
 <w:fonts xmlns:mc="http://schemas.openxmlformats.org/markup-compatibility/2006" xmlns:r="http://schemas.openxmlformats.org/officeDocument/2006/relationships" xmlns:w="http://schemas.openxmlformats.org/wordprocessingml/2006/main" xmlns:w14="http://schemas.microsoft.com/office/word/2010/wordml" xmlns:w15="http://schemas.microsoft.com/office/word/2012/wordml" xmlns:w16cex="http://schemas.microsoft.com/office/word/2018/wordml/cex" xmlns:w16cid="http://schemas.microsoft.com/office/word/2016/wordml/cid" xmlns:w16="http://schemas.microsoft.com/office/word/2018/wordml" xmlns:w16du="http://schemas.microsoft.com/office/word/2023/wordml/word16du" xmlns:w16sdtdh="http://schemas.microsoft.com/office/word/2020/wordml/sdtdatahash" xmlns:w16sdtfl="http://schemas.microsoft.com/office/word/2024/wordml/sdtformatlock" xmlns:w16se="http://schemas.microsoft.com/office/word/2015/wordml/symex" mc:Ignorable="w14 w15 w16se w16cid w16 w16cex w16sdtdh w16sdtfl w16du">
+  <w:font w:name="Courier New">
+    <w:panose1 w:val="02070309020205020404"/>
+    <w:charset w:val="00"/>
+    <w:family w:val="modern"/>
+    <w:pitch w:val="fixed"/>
+    <w:sig w:usb0="E0002EFF" w:usb1="C0007843" w:usb2="00000009" w:usb3="00000000" w:csb0="000001FF" w:csb1="00000000"/>
+  </w:font>
+  <w:font w:name="Times New Roman">
+    <w:panose1 w:val="02020603050405020304"/>
+    <w:charset w:val="00"/>
+    <w:family w:val="roman"/>
+    <w:pitch w:val="variable"/>
+    <w:sig w:usb0="E0002EFF" w:usb1="C000785B" w:usb2="00000009" w:usb3="00000000" w:csb0="000001FF" w:csb1="00000000"/>
+  </w:font>
+  <w:font w:name="Wingdings">
+    <w:panose1 w:val="05000000000000000000"/>
+    <w:charset w:val="02"/>
+    <w:family w:val="auto"/>
+    <w:pitch w:val="variable"/>
+    <w:sig w:usb0="00000000" w:usb1="10000000" w:usb2="00000000" w:usb3="00000000" w:csb0="80000000" w:csb1="00000000"/>
+  </w:font>
+  <w:font w:name="Symbol">
+    <w:panose1 w:val="05050102010706020507"/>
+    <w:charset w:val="02"/>
+    <w:family w:val="roman"/>
+    <w:pitch w:val="variable"/>
+    <w:sig w:usb0="00000000" w:usb1="10000000" w:usb2="00000000" w:usb3="00000000" w:csb0="80000000" w:csb1="00000000"/>
+  </w:font>
   <w:font w:name="Aptos">
     <w:charset w:val="00"/>
     <w:family w:val="swiss"/>
@@ -2104,13 +3201,6 @@
     <w:family w:val="swiss"/>
     <w:pitch w:val="variable"/>
     <w:sig w:usb0="20000287" w:usb1="00000003" w:usb2="00000000" w:usb3="00000000" w:csb0="0000019F" w:csb1="00000000"/>
-  </w:font>
-  <w:font w:name="Times New Roman">
-    <w:panose1 w:val="02020603050405020304"/>
-    <w:charset w:val="00"/>
-    <w:family w:val="roman"/>
-    <w:pitch w:val="variable"/>
-    <w:sig w:usb0="E0002EFF" w:usb1="C000785B" w:usb2="00000009" w:usb3="00000000" w:csb0="000001FF" w:csb1="00000000"/>
   </w:font>
 </w:fonts>
 </file>
@@ -2134,8 +3224,11 @@
   <w:rsids>
     <w:rsidRoot w:val="00F01BA3"/>
     <w:rsid w:val="00914371"/>
+    <w:rsid w:val="00AC622D"/>
+    <w:rsid w:val="00C800D4"/>
     <w:rsid w:val="00E962CC"/>
     <w:rsid w:val="00F01BA3"/>
+    <w:rsid w:val="00F61C67"/>
   </w:rsids>
   <m:mathPr>
     <m:mathFont m:val="Cambria Math"/>

</xml_diff>

<commit_message>
Agregada etapa 2 al informe
</commit_message>
<xml_diff>
--- a/Informe Trabajo Integrador MyS.docx
+++ b/Informe Trabajo Integrador MyS.docx
@@ -170,70 +170,14 @@
                   <w:szCs w:val="28"/>
                 </w:rPr>
               </w:pPr>
-              <w:proofErr w:type="spellStart"/>
               <w:r>
                 <w:rPr>
                   <w:color w:val="1CADE4" w:themeColor="accent1"/>
                   <w:sz w:val="28"/>
                   <w:szCs w:val="28"/>
                 </w:rPr>
-                <w:t>Profs</w:t>
+                <w:t>Profs. Marcela Printista, Cristian Tissera, Danilo Labella</w:t>
               </w:r>
-              <w:proofErr w:type="spellEnd"/>
-              <w:r>
-                <w:rPr>
-                  <w:color w:val="1CADE4" w:themeColor="accent1"/>
-                  <w:sz w:val="28"/>
-                  <w:szCs w:val="28"/>
-                </w:rPr>
-                <w:t xml:space="preserve">. Marcela </w:t>
-              </w:r>
-              <w:proofErr w:type="spellStart"/>
-              <w:r>
-                <w:rPr>
-                  <w:color w:val="1CADE4" w:themeColor="accent1"/>
-                  <w:sz w:val="28"/>
-                  <w:szCs w:val="28"/>
-                </w:rPr>
-                <w:t>Printista</w:t>
-              </w:r>
-              <w:proofErr w:type="spellEnd"/>
-              <w:r>
-                <w:rPr>
-                  <w:color w:val="1CADE4" w:themeColor="accent1"/>
-                  <w:sz w:val="28"/>
-                  <w:szCs w:val="28"/>
-                </w:rPr>
-                <w:t xml:space="preserve">, Cristian </w:t>
-              </w:r>
-              <w:proofErr w:type="spellStart"/>
-              <w:r>
-                <w:rPr>
-                  <w:color w:val="1CADE4" w:themeColor="accent1"/>
-                  <w:sz w:val="28"/>
-                  <w:szCs w:val="28"/>
-                </w:rPr>
-                <w:t>Tissera</w:t>
-              </w:r>
-              <w:proofErr w:type="spellEnd"/>
-              <w:r>
-                <w:rPr>
-                  <w:color w:val="1CADE4" w:themeColor="accent1"/>
-                  <w:sz w:val="28"/>
-                  <w:szCs w:val="28"/>
-                </w:rPr>
-                <w:t xml:space="preserve">, Danilo </w:t>
-              </w:r>
-              <w:proofErr w:type="spellStart"/>
-              <w:r>
-                <w:rPr>
-                  <w:color w:val="1CADE4" w:themeColor="accent1"/>
-                  <w:sz w:val="28"/>
-                  <w:szCs w:val="28"/>
-                </w:rPr>
-                <w:t>Labella</w:t>
-              </w:r>
-              <w:proofErr w:type="spellEnd"/>
             </w:p>
           </w:sdtContent>
         </w:sdt>
@@ -701,15 +645,7 @@
         </w:numPr>
       </w:pPr>
       <w:r>
-        <w:t xml:space="preserve">Emplear la técnica de bootstrapping, en la que cada evento programa el siguiente, optimizando la automatización de la simulación y la gestión de la FEL (Future </w:t>
-      </w:r>
-      <w:proofErr w:type="spellStart"/>
-      <w:r>
-        <w:t>Event</w:t>
-      </w:r>
-      <w:proofErr w:type="spellEnd"/>
-      <w:r>
-        <w:t xml:space="preserve"> List) </w:t>
+        <w:t xml:space="preserve">Emplear la técnica de bootstrapping, en la que cada evento programa el siguiente, optimizando la automatización de la simulación y la gestión de la FEL (Future Event List) </w:t>
       </w:r>
       <w:r>
         <w:rPr>
@@ -804,7 +740,7 @@
     <w:p>
       <w:r>
         <w:pict w14:anchorId="2B81E80E">
-          <v:rect id="_x0000_i1034" style="width:0;height:1.5pt" o:hralign="center" o:hrstd="t" o:hr="t" fillcolor="#a0a0a0" stroked="f"/>
+          <v:rect id="_x0000_i1025" style="width:0;height:1.5pt" o:hralign="center" o:hrstd="t" o:hr="t" fillcolor="#a0a0a0" stroked="f"/>
         </w:pict>
       </w:r>
     </w:p>
@@ -873,13 +809,7 @@
         <w:t>principios S.O.L.I.D.</w:t>
       </w:r>
       <w:r>
-        <w:t xml:space="preserve">, y pudimos apreciar sus beneficios en la mantenibilidad, </w:t>
-      </w:r>
-      <w:r>
-        <w:t>cohesión</w:t>
-      </w:r>
-      <w:r>
-        <w:t xml:space="preserve"> y extensibilidad del simulador.</w:t>
+        <w:t>, y pudimos apreciar sus beneficios en la mantenibilidad, cohesión y extensibilidad del simulador.</w:t>
       </w:r>
     </w:p>
     <w:p>
@@ -948,7 +878,7 @@
     <w:p>
       <w:r>
         <w:pict w14:anchorId="40E16636">
-          <v:rect id="_x0000_i1035" style="width:0;height:1.5pt" o:hralign="center" o:hrstd="t" o:hr="t" fillcolor="#a0a0a0" stroked="f"/>
+          <v:rect id="_x0000_i1026" style="width:0;height:1.5pt" o:hralign="center" o:hrstd="t" o:hr="t" fillcolor="#a0a0a0" stroked="f"/>
         </w:pict>
       </w:r>
     </w:p>
@@ -967,6 +897,9 @@
     </w:p>
     <w:p>
       <w:r>
+        <w:rPr>
+          <w:noProof/>
+        </w:rPr>
         <w:lastRenderedPageBreak/>
         <w:drawing>
           <wp:inline distT="0" distB="0" distL="0" distR="0" wp14:anchorId="3821C066" wp14:editId="1FE5C8E3">
@@ -1022,19 +955,299 @@
         <w:pStyle w:val="Heading1"/>
       </w:pPr>
       <w:r>
-        <w:t>Modelo</w:t>
-      </w:r>
-    </w:p>
-    <w:p/>
+        <w:t xml:space="preserve">Objetivos </w:t>
+      </w:r>
+    </w:p>
+    <w:p>
+      <w:r>
+        <w:t>En esta segunda fase, nos propusimos extender y robustecer el simulador inicial con los siguientes objetivos, alineados al enunciado del práctico:</w:t>
+      </w:r>
+    </w:p>
+    <w:p>
+      <w:pPr>
+        <w:numPr>
+          <w:ilvl w:val="0"/>
+          <w:numId w:val="6"/>
+        </w:numPr>
+      </w:pPr>
+      <w:r>
+        <w:t>Incorporar generadores de variables aleatorias para las distribuciones especificadas: empírica discreta, uniforme, exponencial</w:t>
+      </w:r>
+      <w:r>
+        <w:t xml:space="preserve"> y</w:t>
+      </w:r>
+      <w:r>
+        <w:t xml:space="preserve"> normal</w:t>
+      </w:r>
+      <w:r>
+        <w:t>.</w:t>
+      </w:r>
+    </w:p>
+    <w:p>
+      <w:pPr>
+        <w:numPr>
+          <w:ilvl w:val="0"/>
+          <w:numId w:val="6"/>
+        </w:numPr>
+      </w:pPr>
+      <w:r>
+        <w:t>Adaptar el modelo de servidor único con una única cola a una configuración de múltiples servidores: cinco servidores independientes, cada uno con su propia cola de espera.</w:t>
+      </w:r>
+    </w:p>
+    <w:p>
+      <w:pPr>
+        <w:numPr>
+          <w:ilvl w:val="0"/>
+          <w:numId w:val="6"/>
+        </w:numPr>
+      </w:pPr>
+      <w:r>
+        <w:t xml:space="preserve">Implementar llegadas de aeronaves con distribución exponencial de media </w:t>
+      </w:r>
+      <m:oMath>
+        <m:r>
+          <w:rPr>
+            <w:rFonts w:ascii="Cambria Math" w:hAnsi="Cambria Math"/>
+          </w:rPr>
+          <m:t>μ = 15</m:t>
+        </m:r>
+      </m:oMath>
+      <w:r>
+        <w:t xml:space="preserve"> minutos fuera de horas pico, y </w:t>
+      </w:r>
+      <m:oMath>
+        <m:r>
+          <w:rPr>
+            <w:rFonts w:ascii="Cambria Math" w:hAnsi="Cambria Math"/>
+          </w:rPr>
+          <m:t>μ = 9</m:t>
+        </m:r>
+      </m:oMath>
+      <w:r>
+        <w:t xml:space="preserve"> minutos durante los intervalos de fuerte tráfico (9–13 hs y 20–23 hs).</w:t>
+      </w:r>
+    </w:p>
+    <w:p>
+      <w:pPr>
+        <w:numPr>
+          <w:ilvl w:val="0"/>
+          <w:numId w:val="6"/>
+        </w:numPr>
+      </w:pPr>
+      <w:r>
+        <w:t>Modelar el tiempo de descenso de pasajeros mediante una distribución uniforme entre 10 y 25 minutos.</w:t>
+      </w:r>
+    </w:p>
+    <w:p>
+      <w:pPr>
+        <w:numPr>
+          <w:ilvl w:val="0"/>
+          <w:numId w:val="6"/>
+        </w:numPr>
+      </w:pPr>
+      <w:r>
+        <w:t>Diseñar la lógica de asignación de pista de aterrizaje: a cada avión se le asigna la pista con la cola más corta (o la primera en caso de empate).</w:t>
+      </w:r>
+    </w:p>
+    <w:p>
+      <w:pPr>
+        <w:numPr>
+          <w:ilvl w:val="0"/>
+          <w:numId w:val="6"/>
+        </w:numPr>
+      </w:pPr>
+      <w:r>
+        <w:t>Incorporar el desgaste de las pistas: cada pista inicia con 3000 unidades de durabilidad, y cada aterrizaje consume un desgaste generado según una distribución normal (</w:t>
+      </w:r>
+      <m:oMath>
+        <m:r>
+          <w:rPr>
+            <w:rFonts w:ascii="Cambria Math" w:hAnsi="Cambria Math"/>
+          </w:rPr>
+          <m:t>μ = 5</m:t>
+        </m:r>
+      </m:oMath>
+      <w:r>
+        <w:t xml:space="preserve">, </w:t>
+      </w:r>
+      <m:oMath>
+        <m:r>
+          <w:rPr>
+            <w:rFonts w:ascii="Cambria Math" w:hAnsi="Cambria Math"/>
+          </w:rPr>
+          <m:t>σ = 1</m:t>
+        </m:r>
+      </m:oMath>
+      <w:r>
+        <w:t>).</w:t>
+      </w:r>
+    </w:p>
+    <w:p>
+      <w:pPr>
+        <w:numPr>
+          <w:ilvl w:val="0"/>
+          <w:numId w:val="6"/>
+        </w:numPr>
+      </w:pPr>
+      <w:r>
+        <w:t xml:space="preserve">Calcular y reportar, a lo largo de 4 semanas de simulación, los mismos indicadores de la etapa anterior (cantidad de arribos y aterrizajes, tiempos de tránsito y espera —media, máximo y mínimo—, ocio de pista y tamaños de cola) más la durabilidad final de cada pista. </w:t>
+      </w:r>
+    </w:p>
+    <w:p>
+      <w:r>
+        <w:pict w14:anchorId="219E9160">
+          <v:rect id="_x0000_i1027" style="width:0;height:1.5pt" o:hralign="center" o:hrstd="t" o:hr="t" fillcolor="#a0a0a0" stroked="f"/>
+        </w:pict>
+      </w:r>
+    </w:p>
     <w:p>
       <w:pPr>
         <w:pStyle w:val="Heading1"/>
       </w:pPr>
       <w:r>
-        <w:t>Objetivos</w:t>
-      </w:r>
-    </w:p>
-    <w:p/>
+        <w:t>Experiencia de Desarrollo</w:t>
+      </w:r>
+    </w:p>
+    <w:p>
+      <w:pPr>
+        <w:numPr>
+          <w:ilvl w:val="0"/>
+          <w:numId w:val="7"/>
+        </w:numPr>
+      </w:pPr>
+      <w:r>
+        <w:t xml:space="preserve">Tuvimos que refactorizar y readaptar nuestro modelo de dominio: </w:t>
+      </w:r>
+      <w:r>
+        <w:t>modificamos</w:t>
+      </w:r>
+      <w:r>
+        <w:t xml:space="preserve"> </w:t>
+      </w:r>
+      <w:r>
+        <w:t>nuestra</w:t>
+      </w:r>
+      <w:r>
+        <w:t xml:space="preserve"> clase</w:t>
+      </w:r>
+      <w:r>
+        <w:t xml:space="preserve"> </w:t>
+      </w:r>
+      <m:oMath>
+        <m:r>
+          <w:rPr>
+            <w:rFonts w:ascii="Cambria Math" w:hAnsi="Cambria Math"/>
+          </w:rPr>
+          <m:t>Statistics</m:t>
+        </m:r>
+      </m:oMath>
+      <w:r>
+        <w:t xml:space="preserve"> </w:t>
+      </w:r>
+      <w:r>
+        <w:t xml:space="preserve">para que sea </w:t>
+      </w:r>
+      <w:r>
+        <w:t xml:space="preserve">capaz de manejar múltiples servidores, segregamos responsabilidades moviendo el atributo clock </w:t>
+      </w:r>
+      <w:r>
+        <w:t xml:space="preserve">de la clase </w:t>
+      </w:r>
+      <m:oMath>
+        <m:r>
+          <w:rPr>
+            <w:rFonts w:ascii="Cambria Math" w:hAnsi="Cambria Math"/>
+          </w:rPr>
+          <m:t>Bootstrapping</m:t>
+        </m:r>
+      </m:oMath>
+      <w:r>
+        <w:t xml:space="preserve"> </w:t>
+      </w:r>
+      <w:r>
+        <w:t xml:space="preserve">a una clase independiente, y diseñamos </w:t>
+      </w:r>
+      <w:r>
+        <w:lastRenderedPageBreak/>
+        <w:t>la arquitectura para que el usuario pueda añadir nuevas distribuciones de forma sencilla, cubriendo todas las especificadas en el informe.</w:t>
+      </w:r>
+    </w:p>
+    <w:p>
+      <w:pPr>
+        <w:numPr>
+          <w:ilvl w:val="0"/>
+          <w:numId w:val="7"/>
+        </w:numPr>
+      </w:pPr>
+      <w:r>
+        <w:t>La mayor dificultad que enfrentamos en esta segunda etapa fue encontrar la mejor manera de permitir al usuario seleccionar y parametrizar las distintas distribuciones, especialmente la implementación dinámica de la distribución exponencial con medias variables en función de las horas pico.</w:t>
+      </w:r>
+    </w:p>
+    <w:p>
+      <w:pPr>
+        <w:numPr>
+          <w:ilvl w:val="0"/>
+          <w:numId w:val="7"/>
+        </w:numPr>
+      </w:pPr>
+      <w:r>
+        <w:t>Mejoramos todos los comparators de nuestras clases, asegurando un ordenamiento consistente y eficiente de los eventos en la FEL para cualquier número de servidores.</w:t>
+      </w:r>
+    </w:p>
+    <w:p>
+      <w:r>
+        <w:pict w14:anchorId="1CD6117E">
+          <v:rect id="_x0000_i1028" style="width:0;height:1.5pt" o:hralign="center" o:hrstd="t" o:hr="t" fillcolor="#a0a0a0" stroked="f"/>
+        </w:pict>
+      </w:r>
+    </w:p>
+    <w:p>
+      <w:pPr>
+        <w:pStyle w:val="Heading1"/>
+      </w:pPr>
+      <w:r>
+        <w:t>Modelo de Dominio</w:t>
+      </w:r>
+    </w:p>
+    <w:p>
+      <w:r>
+        <w:drawing>
+          <wp:inline distT="0" distB="0" distL="0" distR="0" wp14:anchorId="36C1D5F9" wp14:editId="625C1F0B">
+            <wp:extent cx="5731510" cy="3761105"/>
+            <wp:effectExtent l="0" t="0" r="2540" b="0"/>
+            <wp:docPr id="2127166571" name="Picture 1" descr="A diagram of a company&#10;&#10;AI-generated content may be incorrect."/>
+            <wp:cNvGraphicFramePr>
+              <a:graphicFrameLocks xmlns:a="http://schemas.openxmlformats.org/drawingml/2006/main" noChangeAspect="1"/>
+            </wp:cNvGraphicFramePr>
+            <a:graphic xmlns:a="http://schemas.openxmlformats.org/drawingml/2006/main">
+              <a:graphicData uri="http://schemas.openxmlformats.org/drawingml/2006/picture">
+                <pic:pic xmlns:pic="http://schemas.openxmlformats.org/drawingml/2006/picture">
+                  <pic:nvPicPr>
+                    <pic:cNvPr id="2127166571" name="Picture 1" descr="A diagram of a company&#10;&#10;AI-generated content may be incorrect."/>
+                    <pic:cNvPicPr/>
+                  </pic:nvPicPr>
+                  <pic:blipFill>
+                    <a:blip r:embed="rId10"/>
+                    <a:stretch>
+                      <a:fillRect/>
+                    </a:stretch>
+                  </pic:blipFill>
+                  <pic:spPr>
+                    <a:xfrm>
+                      <a:off x="0" y="0"/>
+                      <a:ext cx="5731510" cy="3761105"/>
+                    </a:xfrm>
+                    <a:prstGeom prst="rect">
+                      <a:avLst/>
+                    </a:prstGeom>
+                  </pic:spPr>
+                </pic:pic>
+              </a:graphicData>
+            </a:graphic>
+          </wp:inline>
+        </w:drawing>
+      </w:r>
+    </w:p>
     <w:p>
       <w:r>
         <w:br w:type="page"/>
@@ -1068,7 +1281,7 @@
     </w:p>
     <w:p/>
     <w:sectPr>
-      <w:footerReference w:type="default" r:id="rId10"/>
+      <w:footerReference w:type="default" r:id="rId11"/>
       <w:pgSz w:w="11906" w:h="16838"/>
       <w:pgMar w:top="1440" w:right="1440" w:bottom="1440" w:left="1440" w:header="708" w:footer="708" w:gutter="0"/>
       <w:pgNumType w:start="0"/>
@@ -1806,6 +2019,156 @@
     </w:lvl>
   </w:abstractNum>
   <w:abstractNum w:abstractNumId="4" w15:restartNumberingAfterBreak="0">
+    <w:nsid w:val="4EEB619D"/>
+    <w:multiLevelType w:val="multilevel"/>
+    <w:tmpl w:val="CC567FE6"/>
+    <w:lvl w:ilvl="0">
+      <w:start w:val="1"/>
+      <w:numFmt w:val="bullet"/>
+      <w:lvlText w:val=""/>
+      <w:lvlJc w:val="left"/>
+      <w:pPr>
+        <w:tabs>
+          <w:tab w:val="num" w:pos="720"/>
+        </w:tabs>
+        <w:ind w:left="720" w:hanging="360"/>
+      </w:pPr>
+      <w:rPr>
+        <w:rFonts w:ascii="Symbol" w:hAnsi="Symbol" w:hint="default"/>
+        <w:sz w:val="26"/>
+        <w:szCs w:val="26"/>
+      </w:rPr>
+    </w:lvl>
+    <w:lvl w:ilvl="1" w:tentative="1">
+      <w:start w:val="1"/>
+      <w:numFmt w:val="bullet"/>
+      <w:lvlText w:val="o"/>
+      <w:lvlJc w:val="left"/>
+      <w:pPr>
+        <w:tabs>
+          <w:tab w:val="num" w:pos="1440"/>
+        </w:tabs>
+        <w:ind w:left="1440" w:hanging="360"/>
+      </w:pPr>
+      <w:rPr>
+        <w:rFonts w:ascii="Courier New" w:hAnsi="Courier New" w:hint="default"/>
+        <w:sz w:val="20"/>
+      </w:rPr>
+    </w:lvl>
+    <w:lvl w:ilvl="2" w:tentative="1">
+      <w:start w:val="1"/>
+      <w:numFmt w:val="bullet"/>
+      <w:lvlText w:val=""/>
+      <w:lvlJc w:val="left"/>
+      <w:pPr>
+        <w:tabs>
+          <w:tab w:val="num" w:pos="2160"/>
+        </w:tabs>
+        <w:ind w:left="2160" w:hanging="360"/>
+      </w:pPr>
+      <w:rPr>
+        <w:rFonts w:ascii="Wingdings" w:hAnsi="Wingdings" w:hint="default"/>
+        <w:sz w:val="20"/>
+      </w:rPr>
+    </w:lvl>
+    <w:lvl w:ilvl="3" w:tentative="1">
+      <w:start w:val="1"/>
+      <w:numFmt w:val="bullet"/>
+      <w:lvlText w:val=""/>
+      <w:lvlJc w:val="left"/>
+      <w:pPr>
+        <w:tabs>
+          <w:tab w:val="num" w:pos="2880"/>
+        </w:tabs>
+        <w:ind w:left="2880" w:hanging="360"/>
+      </w:pPr>
+      <w:rPr>
+        <w:rFonts w:ascii="Wingdings" w:hAnsi="Wingdings" w:hint="default"/>
+        <w:sz w:val="20"/>
+      </w:rPr>
+    </w:lvl>
+    <w:lvl w:ilvl="4" w:tentative="1">
+      <w:start w:val="1"/>
+      <w:numFmt w:val="bullet"/>
+      <w:lvlText w:val=""/>
+      <w:lvlJc w:val="left"/>
+      <w:pPr>
+        <w:tabs>
+          <w:tab w:val="num" w:pos="3600"/>
+        </w:tabs>
+        <w:ind w:left="3600" w:hanging="360"/>
+      </w:pPr>
+      <w:rPr>
+        <w:rFonts w:ascii="Wingdings" w:hAnsi="Wingdings" w:hint="default"/>
+        <w:sz w:val="20"/>
+      </w:rPr>
+    </w:lvl>
+    <w:lvl w:ilvl="5" w:tentative="1">
+      <w:start w:val="1"/>
+      <w:numFmt w:val="bullet"/>
+      <w:lvlText w:val=""/>
+      <w:lvlJc w:val="left"/>
+      <w:pPr>
+        <w:tabs>
+          <w:tab w:val="num" w:pos="4320"/>
+        </w:tabs>
+        <w:ind w:left="4320" w:hanging="360"/>
+      </w:pPr>
+      <w:rPr>
+        <w:rFonts w:ascii="Wingdings" w:hAnsi="Wingdings" w:hint="default"/>
+        <w:sz w:val="20"/>
+      </w:rPr>
+    </w:lvl>
+    <w:lvl w:ilvl="6" w:tentative="1">
+      <w:start w:val="1"/>
+      <w:numFmt w:val="bullet"/>
+      <w:lvlText w:val=""/>
+      <w:lvlJc w:val="left"/>
+      <w:pPr>
+        <w:tabs>
+          <w:tab w:val="num" w:pos="5040"/>
+        </w:tabs>
+        <w:ind w:left="5040" w:hanging="360"/>
+      </w:pPr>
+      <w:rPr>
+        <w:rFonts w:ascii="Wingdings" w:hAnsi="Wingdings" w:hint="default"/>
+        <w:sz w:val="20"/>
+      </w:rPr>
+    </w:lvl>
+    <w:lvl w:ilvl="7" w:tentative="1">
+      <w:start w:val="1"/>
+      <w:numFmt w:val="bullet"/>
+      <w:lvlText w:val=""/>
+      <w:lvlJc w:val="left"/>
+      <w:pPr>
+        <w:tabs>
+          <w:tab w:val="num" w:pos="5760"/>
+        </w:tabs>
+        <w:ind w:left="5760" w:hanging="360"/>
+      </w:pPr>
+      <w:rPr>
+        <w:rFonts w:ascii="Wingdings" w:hAnsi="Wingdings" w:hint="default"/>
+        <w:sz w:val="20"/>
+      </w:rPr>
+    </w:lvl>
+    <w:lvl w:ilvl="8" w:tentative="1">
+      <w:start w:val="1"/>
+      <w:numFmt w:val="bullet"/>
+      <w:lvlText w:val=""/>
+      <w:lvlJc w:val="left"/>
+      <w:pPr>
+        <w:tabs>
+          <w:tab w:val="num" w:pos="6480"/>
+        </w:tabs>
+        <w:ind w:left="6480" w:hanging="360"/>
+      </w:pPr>
+      <w:rPr>
+        <w:rFonts w:ascii="Wingdings" w:hAnsi="Wingdings" w:hint="default"/>
+        <w:sz w:val="20"/>
+      </w:rPr>
+    </w:lvl>
+  </w:abstractNum>
+  <w:abstractNum w:abstractNumId="5" w15:restartNumberingAfterBreak="0">
     <w:nsid w:val="63132EC2"/>
     <w:multiLevelType w:val="multilevel"/>
     <w:tmpl w:val="09183478"/>
@@ -1823,6 +2186,156 @@
       <w:rPr>
         <w:rFonts w:ascii="Symbol" w:hAnsi="Symbol" w:hint="default"/>
         <w:sz w:val="20"/>
+      </w:rPr>
+    </w:lvl>
+    <w:lvl w:ilvl="1" w:tentative="1">
+      <w:start w:val="1"/>
+      <w:numFmt w:val="bullet"/>
+      <w:lvlText w:val="o"/>
+      <w:lvlJc w:val="left"/>
+      <w:pPr>
+        <w:tabs>
+          <w:tab w:val="num" w:pos="1440"/>
+        </w:tabs>
+        <w:ind w:left="1440" w:hanging="360"/>
+      </w:pPr>
+      <w:rPr>
+        <w:rFonts w:ascii="Courier New" w:hAnsi="Courier New" w:hint="default"/>
+        <w:sz w:val="20"/>
+      </w:rPr>
+    </w:lvl>
+    <w:lvl w:ilvl="2" w:tentative="1">
+      <w:start w:val="1"/>
+      <w:numFmt w:val="bullet"/>
+      <w:lvlText w:val=""/>
+      <w:lvlJc w:val="left"/>
+      <w:pPr>
+        <w:tabs>
+          <w:tab w:val="num" w:pos="2160"/>
+        </w:tabs>
+        <w:ind w:left="2160" w:hanging="360"/>
+      </w:pPr>
+      <w:rPr>
+        <w:rFonts w:ascii="Wingdings" w:hAnsi="Wingdings" w:hint="default"/>
+        <w:sz w:val="20"/>
+      </w:rPr>
+    </w:lvl>
+    <w:lvl w:ilvl="3" w:tentative="1">
+      <w:start w:val="1"/>
+      <w:numFmt w:val="bullet"/>
+      <w:lvlText w:val=""/>
+      <w:lvlJc w:val="left"/>
+      <w:pPr>
+        <w:tabs>
+          <w:tab w:val="num" w:pos="2880"/>
+        </w:tabs>
+        <w:ind w:left="2880" w:hanging="360"/>
+      </w:pPr>
+      <w:rPr>
+        <w:rFonts w:ascii="Wingdings" w:hAnsi="Wingdings" w:hint="default"/>
+        <w:sz w:val="20"/>
+      </w:rPr>
+    </w:lvl>
+    <w:lvl w:ilvl="4" w:tentative="1">
+      <w:start w:val="1"/>
+      <w:numFmt w:val="bullet"/>
+      <w:lvlText w:val=""/>
+      <w:lvlJc w:val="left"/>
+      <w:pPr>
+        <w:tabs>
+          <w:tab w:val="num" w:pos="3600"/>
+        </w:tabs>
+        <w:ind w:left="3600" w:hanging="360"/>
+      </w:pPr>
+      <w:rPr>
+        <w:rFonts w:ascii="Wingdings" w:hAnsi="Wingdings" w:hint="default"/>
+        <w:sz w:val="20"/>
+      </w:rPr>
+    </w:lvl>
+    <w:lvl w:ilvl="5" w:tentative="1">
+      <w:start w:val="1"/>
+      <w:numFmt w:val="bullet"/>
+      <w:lvlText w:val=""/>
+      <w:lvlJc w:val="left"/>
+      <w:pPr>
+        <w:tabs>
+          <w:tab w:val="num" w:pos="4320"/>
+        </w:tabs>
+        <w:ind w:left="4320" w:hanging="360"/>
+      </w:pPr>
+      <w:rPr>
+        <w:rFonts w:ascii="Wingdings" w:hAnsi="Wingdings" w:hint="default"/>
+        <w:sz w:val="20"/>
+      </w:rPr>
+    </w:lvl>
+    <w:lvl w:ilvl="6" w:tentative="1">
+      <w:start w:val="1"/>
+      <w:numFmt w:val="bullet"/>
+      <w:lvlText w:val=""/>
+      <w:lvlJc w:val="left"/>
+      <w:pPr>
+        <w:tabs>
+          <w:tab w:val="num" w:pos="5040"/>
+        </w:tabs>
+        <w:ind w:left="5040" w:hanging="360"/>
+      </w:pPr>
+      <w:rPr>
+        <w:rFonts w:ascii="Wingdings" w:hAnsi="Wingdings" w:hint="default"/>
+        <w:sz w:val="20"/>
+      </w:rPr>
+    </w:lvl>
+    <w:lvl w:ilvl="7" w:tentative="1">
+      <w:start w:val="1"/>
+      <w:numFmt w:val="bullet"/>
+      <w:lvlText w:val=""/>
+      <w:lvlJc w:val="left"/>
+      <w:pPr>
+        <w:tabs>
+          <w:tab w:val="num" w:pos="5760"/>
+        </w:tabs>
+        <w:ind w:left="5760" w:hanging="360"/>
+      </w:pPr>
+      <w:rPr>
+        <w:rFonts w:ascii="Wingdings" w:hAnsi="Wingdings" w:hint="default"/>
+        <w:sz w:val="20"/>
+      </w:rPr>
+    </w:lvl>
+    <w:lvl w:ilvl="8" w:tentative="1">
+      <w:start w:val="1"/>
+      <w:numFmt w:val="bullet"/>
+      <w:lvlText w:val=""/>
+      <w:lvlJc w:val="left"/>
+      <w:pPr>
+        <w:tabs>
+          <w:tab w:val="num" w:pos="6480"/>
+        </w:tabs>
+        <w:ind w:left="6480" w:hanging="360"/>
+      </w:pPr>
+      <w:rPr>
+        <w:rFonts w:ascii="Wingdings" w:hAnsi="Wingdings" w:hint="default"/>
+        <w:sz w:val="20"/>
+      </w:rPr>
+    </w:lvl>
+  </w:abstractNum>
+  <w:abstractNum w:abstractNumId="6" w15:restartNumberingAfterBreak="0">
+    <w:nsid w:val="70316450"/>
+    <w:multiLevelType w:val="multilevel"/>
+    <w:tmpl w:val="4C5E4664"/>
+    <w:lvl w:ilvl="0">
+      <w:start w:val="1"/>
+      <w:numFmt w:val="bullet"/>
+      <w:lvlText w:val=""/>
+      <w:lvlJc w:val="left"/>
+      <w:pPr>
+        <w:tabs>
+          <w:tab w:val="num" w:pos="720"/>
+        </w:tabs>
+        <w:ind w:left="720" w:hanging="360"/>
+      </w:pPr>
+      <w:rPr>
+        <w:rFonts w:ascii="Symbol" w:hAnsi="Symbol" w:hint="default"/>
+        <w:sz w:val="26"/>
+        <w:szCs w:val="26"/>
       </w:rPr>
     </w:lvl>
     <w:lvl w:ilvl="1" w:tentative="1">
@@ -1958,7 +2471,7 @@
     <w:abstractNumId w:val="1"/>
   </w:num>
   <w:num w:numId="2" w16cid:durableId="368578185">
-    <w:abstractNumId w:val="4"/>
+    <w:abstractNumId w:val="5"/>
   </w:num>
   <w:num w:numId="3" w16cid:durableId="559173962">
     <w:abstractNumId w:val="0"/>
@@ -1968,6 +2481,12 @@
   </w:num>
   <w:num w:numId="5" w16cid:durableId="547573144">
     <w:abstractNumId w:val="2"/>
+  </w:num>
+  <w:num w:numId="6" w16cid:durableId="561989786">
+    <w:abstractNumId w:val="4"/>
+  </w:num>
+  <w:num w:numId="7" w16cid:durableId="940576598">
+    <w:abstractNumId w:val="6"/>
   </w:num>
 </w:numbering>
 </file>
@@ -2583,6 +3102,7 @@
   <w:style w:type="character" w:default="1" w:styleId="DefaultParagraphFont">
     <w:name w:val="Default Paragraph Font"/>
     <w:uiPriority w:val="1"/>
+    <w:semiHidden/>
     <w:unhideWhenUsed/>
   </w:style>
   <w:style w:type="table" w:default="1" w:styleId="TableNormal">
@@ -3077,6 +3597,16 @@
     <w:rsid w:val="00235B1A"/>
     <w:rPr>
       <w:sz w:val="26"/>
+    </w:rPr>
+  </w:style>
+  <w:style w:type="character" w:styleId="PlaceholderText">
+    <w:name w:val="Placeholder Text"/>
+    <w:basedOn w:val="DefaultParagraphFont"/>
+    <w:uiPriority w:val="99"/>
+    <w:semiHidden/>
+    <w:rsid w:val="00B512C5"/>
+    <w:rPr>
+      <w:color w:val="666666"/>
     </w:rPr>
   </w:style>
 </w:styles>
@@ -3202,6 +3732,13 @@
     <w:pitch w:val="variable"/>
     <w:sig w:usb0="20000287" w:usb1="00000003" w:usb2="00000000" w:usb3="00000000" w:csb0="0000019F" w:csb1="00000000"/>
   </w:font>
+  <w:font w:name="Cambria Math">
+    <w:panose1 w:val="02040503050406030204"/>
+    <w:charset w:val="00"/>
+    <w:family w:val="roman"/>
+    <w:pitch w:val="variable"/>
+    <w:sig w:usb0="E00006FF" w:usb1="420024FF" w:usb2="02000000" w:usb3="00000000" w:csb0="0000019F" w:csb1="00000000"/>
+  </w:font>
 </w:fonts>
 </file>
 
@@ -3223,9 +3760,14 @@
   </w:compat>
   <w:rsids>
     <w:rsidRoot w:val="00F01BA3"/>
+    <w:rsid w:val="00495A74"/>
+    <w:rsid w:val="0085071F"/>
     <w:rsid w:val="00914371"/>
     <w:rsid w:val="00AC622D"/>
+    <w:rsid w:val="00C0475E"/>
     <w:rsid w:val="00C800D4"/>
+    <w:rsid w:val="00D10A5A"/>
+    <w:rsid w:val="00DC2FA1"/>
     <w:rsid w:val="00E962CC"/>
     <w:rsid w:val="00F01BA3"/>
     <w:rsid w:val="00F61C67"/>
@@ -3687,6 +4229,16 @@
     <w:name w:val="6A929018BB794A809BB230B4F3414579"/>
     <w:rsid w:val="00F01BA3"/>
   </w:style>
+  <w:style w:type="character" w:styleId="PlaceholderText">
+    <w:name w:val="Placeholder Text"/>
+    <w:basedOn w:val="DefaultParagraphFont"/>
+    <w:uiPriority w:val="99"/>
+    <w:semiHidden/>
+    <w:rsid w:val="0085071F"/>
+    <w:rPr>
+      <w:color w:val="666666"/>
+    </w:rPr>
+  </w:style>
 </w:styles>
 </file>
 

</xml_diff>

<commit_message>
Agregada mejora: listo para entrega. Casi terminado informe
</commit_message>
<xml_diff>
--- a/Informe Trabajo Integrador MyS.docx
+++ b/Informe Trabajo Integrador MyS.docx
@@ -17,6 +17,7 @@
       <w:sdtEndPr>
         <w:rPr>
           <w:color w:val="auto"/>
+          <w:sz w:val="24"/>
         </w:rPr>
       </w:sdtEndPr>
       <w:sdtContent>
@@ -50,7 +51,7 @@
                         <pic:cNvPicPr/>
                       </pic:nvPicPr>
                       <pic:blipFill>
-                        <a:blip r:embed="rId7" cstate="print">
+                        <a:blip r:embed="rId8" cstate="print">
                           <a:duotone>
                             <a:schemeClr val="accent1">
                               <a:shade val="45000"/>
@@ -176,7 +177,61 @@
                   <w:sz w:val="28"/>
                   <w:szCs w:val="28"/>
                 </w:rPr>
-                <w:t>Profs. Marcela Printista, Cristian Tissera, Danilo Labella</w:t>
+                <w:t xml:space="preserve">Modelos y Simulación, </w:t>
+              </w:r>
+              <w:proofErr w:type="spellStart"/>
+              <w:r>
+                <w:rPr>
+                  <w:color w:val="1CADE4" w:themeColor="accent1"/>
+                  <w:sz w:val="28"/>
+                  <w:szCs w:val="28"/>
+                </w:rPr>
+                <w:t>Profs</w:t>
+              </w:r>
+              <w:proofErr w:type="spellEnd"/>
+              <w:r>
+                <w:rPr>
+                  <w:color w:val="1CADE4" w:themeColor="accent1"/>
+                  <w:sz w:val="28"/>
+                  <w:szCs w:val="28"/>
+                </w:rPr>
+                <w:t xml:space="preserve">. Cristian </w:t>
+              </w:r>
+              <w:proofErr w:type="spellStart"/>
+              <w:r>
+                <w:rPr>
+                  <w:color w:val="1CADE4" w:themeColor="accent1"/>
+                  <w:sz w:val="28"/>
+                  <w:szCs w:val="28"/>
+                </w:rPr>
+                <w:t>Tissera</w:t>
+              </w:r>
+              <w:proofErr w:type="spellEnd"/>
+              <w:r>
+                <w:rPr>
+                  <w:color w:val="1CADE4" w:themeColor="accent1"/>
+                  <w:sz w:val="28"/>
+                  <w:szCs w:val="28"/>
+                </w:rPr>
+                <w:t xml:space="preserve">, Danilo </w:t>
+              </w:r>
+              <w:proofErr w:type="spellStart"/>
+              <w:r>
+                <w:rPr>
+                  <w:color w:val="1CADE4" w:themeColor="accent1"/>
+                  <w:sz w:val="28"/>
+                  <w:szCs w:val="28"/>
+                </w:rPr>
+                <w:t>Labella</w:t>
+              </w:r>
+              <w:proofErr w:type="spellEnd"/>
+              <w:r>
+                <w:rPr>
+                  <w:color w:val="1CADE4" w:themeColor="accent1"/>
+                  <w:sz w:val="28"/>
+                  <w:szCs w:val="28"/>
+                </w:rPr>
+                <w:t>.</w:t>
               </w:r>
             </w:p>
           </w:sdtContent>
@@ -195,26 +250,73 @@
               <w:noProof/>
               <w:color w:val="1CADE4" w:themeColor="accent1"/>
             </w:rPr>
+            <w:drawing>
+              <wp:inline distT="0" distB="0" distL="0" distR="0" wp14:anchorId="2C23D9B2" wp14:editId="3A3B2119">
+                <wp:extent cx="758952" cy="478932"/>
+                <wp:effectExtent l="0" t="0" r="3175" b="0"/>
+                <wp:docPr id="144" name="Picture 147"/>
+                <wp:cNvGraphicFramePr>
+                  <a:graphicFrameLocks xmlns:a="http://schemas.openxmlformats.org/drawingml/2006/main" noChangeAspect="1"/>
+                </wp:cNvGraphicFramePr>
+                <a:graphic xmlns:a="http://schemas.openxmlformats.org/drawingml/2006/main">
+                  <a:graphicData uri="http://schemas.openxmlformats.org/drawingml/2006/picture">
+                    <pic:pic xmlns:pic="http://schemas.openxmlformats.org/drawingml/2006/picture">
+                      <pic:nvPicPr>
+                        <pic:cNvPr id="9" name="roco bottom.png"/>
+                        <pic:cNvPicPr/>
+                      </pic:nvPicPr>
+                      <pic:blipFill>
+                        <a:blip r:embed="rId9" cstate="print">
+                          <a:duotone>
+                            <a:schemeClr val="accent1">
+                              <a:shade val="45000"/>
+                              <a:satMod val="135000"/>
+                            </a:schemeClr>
+                            <a:prstClr val="white"/>
+                          </a:duotone>
+                          <a:extLst>
+                            <a:ext uri="{28A0092B-C50C-407E-A947-70E740481C1C}">
+                              <a14:useLocalDpi xmlns:a14="http://schemas.microsoft.com/office/drawing/2010/main" val="0"/>
+                            </a:ext>
+                          </a:extLst>
+                        </a:blip>
+                        <a:stretch>
+                          <a:fillRect/>
+                        </a:stretch>
+                      </pic:blipFill>
+                      <pic:spPr>
+                        <a:xfrm>
+                          <a:off x="0" y="0"/>
+                          <a:ext cx="758952" cy="478932"/>
+                        </a:xfrm>
+                        <a:prstGeom prst="rect">
+                          <a:avLst/>
+                        </a:prstGeom>
+                      </pic:spPr>
+                    </pic:pic>
+                  </a:graphicData>
+                </a:graphic>
+              </wp:inline>
+            </w:drawing>
+          </w:r>
+        </w:p>
+        <w:p>
+          <w:r>
+            <w:rPr>
+              <w:noProof/>
+              <w:color w:val="1CADE4" w:themeColor="accent1"/>
+            </w:rPr>
             <mc:AlternateContent>
               <mc:Choice Requires="wps">
                 <w:drawing>
-                  <wp:anchor distT="0" distB="0" distL="114300" distR="114300" simplePos="0" relativeHeight="251659264" behindDoc="0" locked="0" layoutInCell="1" allowOverlap="1" wp14:anchorId="2FAEB675" wp14:editId="5C9A7268">
+                  <wp:anchor distT="0" distB="0" distL="114300" distR="114300" simplePos="0" relativeHeight="251659264" behindDoc="0" locked="0" layoutInCell="1" allowOverlap="1" wp14:anchorId="2FAEB675" wp14:editId="59D1E6CD">
                     <wp:simplePos x="0" y="0"/>
                     <wp:positionH relativeFrom="margin">
-                      <wp:align>center</wp:align>
+                      <wp:posOffset>0</wp:posOffset>
                     </wp:positionH>
-                    <mc:AlternateContent>
-                      <mc:Choice Requires="wp14">
-                        <wp:positionV relativeFrom="page">
-                          <wp14:pctPosVOffset>85000</wp14:pctPosVOffset>
-                        </wp:positionV>
-                      </mc:Choice>
-                      <mc:Fallback>
-                        <wp:positionV relativeFrom="page">
-                          <wp:posOffset>9088120</wp:posOffset>
-                        </wp:positionV>
-                      </mc:Fallback>
-                    </mc:AlternateContent>
+                    <wp:positionV relativeFrom="page">
+                      <wp:posOffset>7711440</wp:posOffset>
+                    </wp:positionV>
                     <wp:extent cx="6553200" cy="557784"/>
                     <wp:effectExtent l="0" t="0" r="0" b="12700"/>
                     <wp:wrapNone/>
@@ -379,7 +481,7 @@
                     <v:stroke joinstyle="miter"/>
                     <v:path gradientshapeok="t" o:connecttype="rect"/>
                   </v:shapetype>
-                  <v:shape id="Text Box 146" o:spid="_x0000_s1026" type="#_x0000_t202" style="position:absolute;left:0;text-align:left;margin-left:0;margin-top:0;width:516pt;height:43.9pt;z-index:251659264;visibility:visible;mso-wrap-style:square;mso-width-percent:1000;mso-height-percent:0;mso-top-percent:850;mso-wrap-distance-left:9pt;mso-wrap-distance-top:0;mso-wrap-distance-right:9pt;mso-wrap-distance-bottom:0;mso-position-horizontal:center;mso-position-horizontal-relative:margin;mso-position-vertical-relative:page;mso-width-percent:1000;mso-height-percent:0;mso-top-percent:850;mso-width-relative:margin;mso-height-relative:margin;v-text-anchor:bottom" o:gfxdata="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" filled="f" stroked="f" strokeweight=".5pt">
+                  <v:shape id="Text Box 146" o:spid="_x0000_s1026" type="#_x0000_t202" style="position:absolute;left:0;text-align:left;margin-left:0;margin-top:607.2pt;width:516pt;height:43.9pt;z-index:251659264;visibility:visible;mso-wrap-style:square;mso-width-percent:1000;mso-height-percent:0;mso-wrap-distance-left:9pt;mso-wrap-distance-top:0;mso-wrap-distance-right:9pt;mso-wrap-distance-bottom:0;mso-position-horizontal:absolute;mso-position-horizontal-relative:margin;mso-position-vertical:absolute;mso-position-vertical-relative:page;mso-width-percent:1000;mso-height-percent:0;mso-width-relative:margin;mso-height-relative:margin;v-text-anchor:bottom" o:gfxdata="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" filled="f" stroked="f" strokeweight=".5pt">
                     <v:textbox style="mso-fit-shape-to-text:t" inset="0,0,0,0">
                       <w:txbxContent>
                         <w:p>
@@ -494,99 +596,2381 @@
               <w:noProof/>
               <w:color w:val="1CADE4" w:themeColor="accent1"/>
             </w:rPr>
-            <w:drawing>
-              <wp:inline distT="0" distB="0" distL="0" distR="0" wp14:anchorId="2C23D9B2" wp14:editId="76635A4D">
-                <wp:extent cx="758952" cy="478932"/>
-                <wp:effectExtent l="0" t="0" r="3175" b="0"/>
-                <wp:docPr id="144" name="Picture 147"/>
-                <wp:cNvGraphicFramePr>
-                  <a:graphicFrameLocks xmlns:a="http://schemas.openxmlformats.org/drawingml/2006/main" noChangeAspect="1"/>
-                </wp:cNvGraphicFramePr>
-                <a:graphic xmlns:a="http://schemas.openxmlformats.org/drawingml/2006/main">
-                  <a:graphicData uri="http://schemas.openxmlformats.org/drawingml/2006/picture">
-                    <pic:pic xmlns:pic="http://schemas.openxmlformats.org/drawingml/2006/picture">
-                      <pic:nvPicPr>
-                        <pic:cNvPr id="9" name="roco bottom.png"/>
-                        <pic:cNvPicPr/>
-                      </pic:nvPicPr>
-                      <pic:blipFill>
-                        <a:blip r:embed="rId8" cstate="print">
-                          <a:duotone>
-                            <a:schemeClr val="accent1">
-                              <a:shade val="45000"/>
-                              <a:satMod val="135000"/>
-                            </a:schemeClr>
-                            <a:prstClr val="white"/>
-                          </a:duotone>
-                          <a:extLst>
-                            <a:ext uri="{28A0092B-C50C-407E-A947-70E740481C1C}">
-                              <a14:useLocalDpi xmlns:a14="http://schemas.microsoft.com/office/drawing/2010/main" val="0"/>
-                            </a:ext>
-                          </a:extLst>
-                        </a:blip>
-                        <a:stretch>
-                          <a:fillRect/>
-                        </a:stretch>
-                      </pic:blipFill>
-                      <pic:spPr>
-                        <a:xfrm>
-                          <a:off x="0" y="0"/>
-                          <a:ext cx="758952" cy="478932"/>
-                        </a:xfrm>
-                        <a:prstGeom prst="rect">
-                          <a:avLst/>
-                        </a:prstGeom>
-                      </pic:spPr>
-                    </pic:pic>
-                  </a:graphicData>
-                </a:graphic>
-              </wp:inline>
-            </w:drawing>
+            <mc:AlternateContent>
+              <mc:Choice Requires="wps">
+                <w:drawing>
+                  <wp:anchor distT="0" distB="0" distL="114300" distR="114300" simplePos="0" relativeHeight="251663360" behindDoc="0" locked="0" layoutInCell="1" allowOverlap="1" wp14:anchorId="38333822" wp14:editId="3FD6D187">
+                    <wp:simplePos x="0" y="0"/>
+                    <wp:positionH relativeFrom="column">
+                      <wp:posOffset>4428490</wp:posOffset>
+                    </wp:positionH>
+                    <wp:positionV relativeFrom="paragraph">
+                      <wp:posOffset>3949700</wp:posOffset>
+                    </wp:positionV>
+                    <wp:extent cx="1735455" cy="1210310"/>
+                    <wp:effectExtent l="0" t="0" r="17145" b="27940"/>
+                    <wp:wrapNone/>
+                    <wp:docPr id="389912850" name="Rectangle 2"/>
+                    <wp:cNvGraphicFramePr/>
+                    <a:graphic xmlns:a="http://schemas.openxmlformats.org/drawingml/2006/main">
+                      <a:graphicData uri="http://schemas.microsoft.com/office/word/2010/wordprocessingShape">
+                        <wps:wsp>
+                          <wps:cNvSpPr/>
+                          <wps:spPr>
+                            <a:xfrm>
+                              <a:off x="0" y="0"/>
+                              <a:ext cx="1735455" cy="1210310"/>
+                            </a:xfrm>
+                            <a:prstGeom prst="rect">
+                              <a:avLst/>
+                            </a:prstGeom>
+                            <a:ln>
+                              <a:solidFill>
+                                <a:schemeClr val="bg1"/>
+                              </a:solidFill>
+                            </a:ln>
+                          </wps:spPr>
+                          <wps:style>
+                            <a:lnRef idx="2">
+                              <a:schemeClr val="accent6"/>
+                            </a:lnRef>
+                            <a:fillRef idx="1">
+                              <a:schemeClr val="lt1"/>
+                            </a:fillRef>
+                            <a:effectRef idx="0">
+                              <a:schemeClr val="accent6"/>
+                            </a:effectRef>
+                            <a:fontRef idx="minor">
+                              <a:schemeClr val="dk1"/>
+                            </a:fontRef>
+                          </wps:style>
+                          <wps:txbx>
+                            <w:txbxContent>
+                              <w:p>
+                                <w:pPr>
+                                  <w:jc w:val="center"/>
+                                  <w:rPr>
+                                    <w:lang w:val="en-US"/>
+                                  </w:rPr>
+                                </w:pPr>
+                                <w:r>
+                                  <w:rPr>
+                                    <w:noProof/>
+                                  </w:rPr>
+                                  <w:drawing>
+                                    <wp:inline distT="0" distB="0" distL="0" distR="0" wp14:anchorId="44EFCDBC" wp14:editId="3EB4898D">
+                                      <wp:extent cx="601345" cy="617855"/>
+                                      <wp:effectExtent l="0" t="0" r="8255" b="0"/>
+                                      <wp:docPr id="293520459" name="Picture 5" descr="A black and white logo&#10;&#10;AI-generated content may be incorrect."/>
+                                      <wp:cNvGraphicFramePr>
+                                        <a:graphicFrameLocks xmlns:a="http://schemas.openxmlformats.org/drawingml/2006/main" noChangeAspect="1"/>
+                                      </wp:cNvGraphicFramePr>
+                                      <a:graphic xmlns:a="http://schemas.openxmlformats.org/drawingml/2006/main">
+                                        <a:graphicData uri="http://schemas.openxmlformats.org/drawingml/2006/picture">
+                                          <pic:pic xmlns:pic="http://schemas.openxmlformats.org/drawingml/2006/picture">
+                                            <pic:nvPicPr>
+                                              <pic:cNvPr id="575876261" name="Picture 5" descr="A black and white logo&#10;&#10;AI-generated content may be incorrect."/>
+                                              <pic:cNvPicPr>
+                                                <a:picLocks noChangeAspect="1" noChangeArrowheads="1"/>
+                                              </pic:cNvPicPr>
+                                            </pic:nvPicPr>
+                                            <pic:blipFill>
+                                              <a:blip r:embed="rId10">
+                                                <a:extLst>
+                                                  <a:ext uri="{28A0092B-C50C-407E-A947-70E740481C1C}">
+                                                    <a14:useLocalDpi xmlns:a14="http://schemas.microsoft.com/office/drawing/2010/main" val="0"/>
+                                                  </a:ext>
+                                                </a:extLst>
+                                              </a:blip>
+                                              <a:srcRect/>
+                                              <a:stretch>
+                                                <a:fillRect/>
+                                              </a:stretch>
+                                            </pic:blipFill>
+                                            <pic:spPr bwMode="auto">
+                                              <a:xfrm>
+                                                <a:off x="0" y="0"/>
+                                                <a:ext cx="601345" cy="617855"/>
+                                              </a:xfrm>
+                                              <a:prstGeom prst="rect">
+                                                <a:avLst/>
+                                              </a:prstGeom>
+                                              <a:noFill/>
+                                              <a:ln>
+                                                <a:noFill/>
+                                              </a:ln>
+                                            </pic:spPr>
+                                          </pic:pic>
+                                        </a:graphicData>
+                                      </a:graphic>
+                                    </wp:inline>
+                                  </w:drawing>
+                                </w:r>
+                              </w:p>
+                              <w:p>
+                                <w:pPr>
+                                  <w:rPr>
+                                    <w:lang w:val="en-US"/>
+                                  </w:rPr>
+                                </w:pPr>
+                                <w:proofErr w:type="spellStart"/>
+                                <w:r>
+                                  <w:rPr>
+                                    <w:lang w:val="en-US"/>
+                                  </w:rPr>
+                                  <w:t>Dpto</w:t>
+                                </w:r>
+                                <w:proofErr w:type="spellEnd"/>
+                                <w:r>
+                                  <w:rPr>
+                                    <w:lang w:val="en-US"/>
+                                  </w:rPr>
+                                  <w:t xml:space="preserve">. de </w:t>
+                                </w:r>
+                                <w:proofErr w:type="spellStart"/>
+                                <w:r>
+                                  <w:rPr>
+                                    <w:lang w:val="en-US"/>
+                                  </w:rPr>
+                                  <w:t>Informática</w:t>
+                                </w:r>
+                                <w:proofErr w:type="spellEnd"/>
+                              </w:p>
+                            </w:txbxContent>
+                          </wps:txbx>
+                          <wps:bodyPr rot="0" spcFirstLastPara="0" vertOverflow="overflow" horzOverflow="overflow" vert="horz" wrap="square" lIns="91440" tIns="45720" rIns="91440" bIns="45720" numCol="1" spcCol="0" rtlCol="0" fromWordArt="0" anchor="ctr" anchorCtr="0" forceAA="0" compatLnSpc="1">
+                            <a:prstTxWarp prst="textNoShape">
+                              <a:avLst/>
+                            </a:prstTxWarp>
+                            <a:noAutofit/>
+                          </wps:bodyPr>
+                        </wps:wsp>
+                      </a:graphicData>
+                    </a:graphic>
+                    <wp14:sizeRelH relativeFrom="margin">
+                      <wp14:pctWidth>0</wp14:pctWidth>
+                    </wp14:sizeRelH>
+                    <wp14:sizeRelV relativeFrom="margin">
+                      <wp14:pctHeight>0</wp14:pctHeight>
+                    </wp14:sizeRelV>
+                  </wp:anchor>
+                </w:drawing>
+              </mc:Choice>
+              <mc:Fallback>
+                <w:pict>
+                  <v:rect w14:anchorId="38333822" id="Rectangle 2" o:spid="_x0000_s1027" style="position:absolute;left:0;text-align:left;margin-left:348.7pt;margin-top:311pt;width:136.65pt;height:95.3pt;z-index:251663360;visibility:visible;mso-wrap-style:square;mso-width-percent:0;mso-height-percent:0;mso-wrap-distance-left:9pt;mso-wrap-distance-top:0;mso-wrap-distance-right:9pt;mso-wrap-distance-bottom:0;mso-position-horizontal:absolute;mso-position-horizontal-relative:text;mso-position-vertical:absolute;mso-position-vertical-relative:text;mso-width-percent:0;mso-height-percent:0;mso-width-relative:margin;mso-height-relative:margin;v-text-anchor:middle" o:gfxdata="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" fillcolor="white [3201]" strokecolor="white [3212]" strokeweight="1.25pt">
+                    <v:textbox>
+                      <w:txbxContent>
+                        <w:p>
+                          <w:pPr>
+                            <w:jc w:val="center"/>
+                            <w:rPr>
+                              <w:lang w:val="en-US"/>
+                            </w:rPr>
+                          </w:pPr>
+                          <w:r>
+                            <w:rPr>
+                              <w:noProof/>
+                            </w:rPr>
+                            <w:drawing>
+                              <wp:inline distT="0" distB="0" distL="0" distR="0" wp14:anchorId="44EFCDBC" wp14:editId="3EB4898D">
+                                <wp:extent cx="601345" cy="617855"/>
+                                <wp:effectExtent l="0" t="0" r="8255" b="0"/>
+                                <wp:docPr id="293520459" name="Picture 5" descr="A black and white logo&#10;&#10;AI-generated content may be incorrect."/>
+                                <wp:cNvGraphicFramePr>
+                                  <a:graphicFrameLocks xmlns:a="http://schemas.openxmlformats.org/drawingml/2006/main" noChangeAspect="1"/>
+                                </wp:cNvGraphicFramePr>
+                                <a:graphic xmlns:a="http://schemas.openxmlformats.org/drawingml/2006/main">
+                                  <a:graphicData uri="http://schemas.openxmlformats.org/drawingml/2006/picture">
+                                    <pic:pic xmlns:pic="http://schemas.openxmlformats.org/drawingml/2006/picture">
+                                      <pic:nvPicPr>
+                                        <pic:cNvPr id="575876261" name="Picture 5" descr="A black and white logo&#10;&#10;AI-generated content may be incorrect."/>
+                                        <pic:cNvPicPr>
+                                          <a:picLocks noChangeAspect="1" noChangeArrowheads="1"/>
+                                        </pic:cNvPicPr>
+                                      </pic:nvPicPr>
+                                      <pic:blipFill>
+                                        <a:blip r:embed="rId10">
+                                          <a:extLst>
+                                            <a:ext uri="{28A0092B-C50C-407E-A947-70E740481C1C}">
+                                              <a14:useLocalDpi xmlns:a14="http://schemas.microsoft.com/office/drawing/2010/main" val="0"/>
+                                            </a:ext>
+                                          </a:extLst>
+                                        </a:blip>
+                                        <a:srcRect/>
+                                        <a:stretch>
+                                          <a:fillRect/>
+                                        </a:stretch>
+                                      </pic:blipFill>
+                                      <pic:spPr bwMode="auto">
+                                        <a:xfrm>
+                                          <a:off x="0" y="0"/>
+                                          <a:ext cx="601345" cy="617855"/>
+                                        </a:xfrm>
+                                        <a:prstGeom prst="rect">
+                                          <a:avLst/>
+                                        </a:prstGeom>
+                                        <a:noFill/>
+                                        <a:ln>
+                                          <a:noFill/>
+                                        </a:ln>
+                                      </pic:spPr>
+                                    </pic:pic>
+                                  </a:graphicData>
+                                </a:graphic>
+                              </wp:inline>
+                            </w:drawing>
+                          </w:r>
+                        </w:p>
+                        <w:p>
+                          <w:pPr>
+                            <w:rPr>
+                              <w:lang w:val="en-US"/>
+                            </w:rPr>
+                          </w:pPr>
+                          <w:proofErr w:type="spellStart"/>
+                          <w:r>
+                            <w:rPr>
+                              <w:lang w:val="en-US"/>
+                            </w:rPr>
+                            <w:t>Dpto</w:t>
+                          </w:r>
+                          <w:proofErr w:type="spellEnd"/>
+                          <w:r>
+                            <w:rPr>
+                              <w:lang w:val="en-US"/>
+                            </w:rPr>
+                            <w:t xml:space="preserve">. de </w:t>
+                          </w:r>
+                          <w:proofErr w:type="spellStart"/>
+                          <w:r>
+                            <w:rPr>
+                              <w:lang w:val="en-US"/>
+                            </w:rPr>
+                            <w:t>Informática</w:t>
+                          </w:r>
+                          <w:proofErr w:type="spellEnd"/>
+                        </w:p>
+                      </w:txbxContent>
+                    </v:textbox>
+                  </v:rect>
+                </w:pict>
+              </mc:Fallback>
+            </mc:AlternateContent>
           </w:r>
-        </w:p>
-        <w:p>
+          <w:r>
+            <w:rPr>
+              <w:noProof/>
+              <w:color w:val="1CADE4" w:themeColor="accent1"/>
+            </w:rPr>
+            <mc:AlternateContent>
+              <mc:Choice Requires="wps">
+                <w:drawing>
+                  <wp:anchor distT="0" distB="0" distL="114300" distR="114300" simplePos="0" relativeHeight="251662336" behindDoc="0" locked="0" layoutInCell="1" allowOverlap="1" wp14:anchorId="480C1F90" wp14:editId="491EDB7B">
+                    <wp:simplePos x="0" y="0"/>
+                    <wp:positionH relativeFrom="column">
+                      <wp:posOffset>2256155</wp:posOffset>
+                    </wp:positionH>
+                    <wp:positionV relativeFrom="paragraph">
+                      <wp:posOffset>3980815</wp:posOffset>
+                    </wp:positionV>
+                    <wp:extent cx="1235710" cy="1125220"/>
+                    <wp:effectExtent l="0" t="0" r="21590" b="17780"/>
+                    <wp:wrapNone/>
+                    <wp:docPr id="1702126311" name="Rectangle 2"/>
+                    <wp:cNvGraphicFramePr/>
+                    <a:graphic xmlns:a="http://schemas.openxmlformats.org/drawingml/2006/main">
+                      <a:graphicData uri="http://schemas.microsoft.com/office/word/2010/wordprocessingShape">
+                        <wps:wsp>
+                          <wps:cNvSpPr/>
+                          <wps:spPr>
+                            <a:xfrm>
+                              <a:off x="0" y="0"/>
+                              <a:ext cx="1235710" cy="1125220"/>
+                            </a:xfrm>
+                            <a:prstGeom prst="rect">
+                              <a:avLst/>
+                            </a:prstGeom>
+                            <a:ln>
+                              <a:solidFill>
+                                <a:schemeClr val="bg1"/>
+                              </a:solidFill>
+                            </a:ln>
+                          </wps:spPr>
+                          <wps:style>
+                            <a:lnRef idx="2">
+                              <a:schemeClr val="accent6"/>
+                            </a:lnRef>
+                            <a:fillRef idx="1">
+                              <a:schemeClr val="lt1"/>
+                            </a:fillRef>
+                            <a:effectRef idx="0">
+                              <a:schemeClr val="accent6"/>
+                            </a:effectRef>
+                            <a:fontRef idx="minor">
+                              <a:schemeClr val="dk1"/>
+                            </a:fontRef>
+                          </wps:style>
+                          <wps:txbx>
+                            <w:txbxContent>
+                              <w:p>
+                                <w:pPr>
+                                  <w:jc w:val="center"/>
+                                  <w:rPr>
+                                    <w:lang w:val="en-US"/>
+                                  </w:rPr>
+                                </w:pPr>
+                                <w:r>
+                                  <w:rPr>
+                                    <w:noProof/>
+                                  </w:rPr>
+                                  <w:drawing>
+                                    <wp:inline distT="0" distB="0" distL="0" distR="0" wp14:anchorId="7512D624" wp14:editId="6EAE1065">
+                                      <wp:extent cx="592455" cy="550545"/>
+                                      <wp:effectExtent l="0" t="0" r="0" b="1905"/>
+                                      <wp:docPr id="722843657" name="Picture 4" descr="A black and white logo&#10;&#10;AI-generated content may be incorrect."/>
+                                      <wp:cNvGraphicFramePr>
+                                        <a:graphicFrameLocks xmlns:a="http://schemas.openxmlformats.org/drawingml/2006/main" noChangeAspect="1"/>
+                                      </wp:cNvGraphicFramePr>
+                                      <a:graphic xmlns:a="http://schemas.openxmlformats.org/drawingml/2006/main">
+                                        <a:graphicData uri="http://schemas.openxmlformats.org/drawingml/2006/picture">
+                                          <pic:pic xmlns:pic="http://schemas.openxmlformats.org/drawingml/2006/picture">
+                                            <pic:nvPicPr>
+                                              <pic:cNvPr id="1015503453" name="Picture 4" descr="A black and white logo&#10;&#10;AI-generated content may be incorrect."/>
+                                              <pic:cNvPicPr>
+                                                <a:picLocks noChangeAspect="1" noChangeArrowheads="1"/>
+                                              </pic:cNvPicPr>
+                                            </pic:nvPicPr>
+                                            <pic:blipFill>
+                                              <a:blip r:embed="rId11">
+                                                <a:extLst>
+                                                  <a:ext uri="{28A0092B-C50C-407E-A947-70E740481C1C}">
+                                                    <a14:useLocalDpi xmlns:a14="http://schemas.microsoft.com/office/drawing/2010/main" val="0"/>
+                                                  </a:ext>
+                                                </a:extLst>
+                                              </a:blip>
+                                              <a:srcRect/>
+                                              <a:stretch>
+                                                <a:fillRect/>
+                                              </a:stretch>
+                                            </pic:blipFill>
+                                            <pic:spPr bwMode="auto">
+                                              <a:xfrm>
+                                                <a:off x="0" y="0"/>
+                                                <a:ext cx="592455" cy="550545"/>
+                                              </a:xfrm>
+                                              <a:prstGeom prst="rect">
+                                                <a:avLst/>
+                                              </a:prstGeom>
+                                              <a:noFill/>
+                                              <a:ln>
+                                                <a:noFill/>
+                                              </a:ln>
+                                            </pic:spPr>
+                                          </pic:pic>
+                                        </a:graphicData>
+                                      </a:graphic>
+                                    </wp:inline>
+                                  </w:drawing>
+                                </w:r>
+                              </w:p>
+                              <w:p>
+                                <w:pPr>
+                                  <w:jc w:val="center"/>
+                                  <w:rPr>
+                                    <w:lang w:val="en-US"/>
+                                  </w:rPr>
+                                </w:pPr>
+                                <w:r>
+                                  <w:rPr>
+                                    <w:lang w:val="en-US"/>
+                                  </w:rPr>
+                                  <w:t>FCFMyN</w:t>
+                                </w:r>
+                              </w:p>
+                            </w:txbxContent>
+                          </wps:txbx>
+                          <wps:bodyPr rot="0" spcFirstLastPara="0" vertOverflow="overflow" horzOverflow="overflow" vert="horz" wrap="square" lIns="91440" tIns="45720" rIns="91440" bIns="45720" numCol="1" spcCol="0" rtlCol="0" fromWordArt="0" anchor="ctr" anchorCtr="0" forceAA="0" compatLnSpc="1">
+                            <a:prstTxWarp prst="textNoShape">
+                              <a:avLst/>
+                            </a:prstTxWarp>
+                            <a:noAutofit/>
+                          </wps:bodyPr>
+                        </wps:wsp>
+                      </a:graphicData>
+                    </a:graphic>
+                    <wp14:sizeRelV relativeFrom="margin">
+                      <wp14:pctHeight>0</wp14:pctHeight>
+                    </wp14:sizeRelV>
+                  </wp:anchor>
+                </w:drawing>
+              </mc:Choice>
+              <mc:Fallback>
+                <w:pict>
+                  <v:rect w14:anchorId="480C1F90" id="_x0000_s1028" style="position:absolute;left:0;text-align:left;margin-left:177.65pt;margin-top:313.45pt;width:97.3pt;height:88.6pt;z-index:251662336;visibility:visible;mso-wrap-style:square;mso-height-percent:0;mso-wrap-distance-left:9pt;mso-wrap-distance-top:0;mso-wrap-distance-right:9pt;mso-wrap-distance-bottom:0;mso-position-horizontal:absolute;mso-position-horizontal-relative:text;mso-position-vertical:absolute;mso-position-vertical-relative:text;mso-height-percent:0;mso-height-relative:margin;v-text-anchor:middle" o:gfxdata="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" fillcolor="white [3201]" strokecolor="white [3212]" strokeweight="1.25pt">
+                    <v:textbox>
+                      <w:txbxContent>
+                        <w:p>
+                          <w:pPr>
+                            <w:jc w:val="center"/>
+                            <w:rPr>
+                              <w:lang w:val="en-US"/>
+                            </w:rPr>
+                          </w:pPr>
+                          <w:r>
+                            <w:rPr>
+                              <w:noProof/>
+                            </w:rPr>
+                            <w:drawing>
+                              <wp:inline distT="0" distB="0" distL="0" distR="0" wp14:anchorId="7512D624" wp14:editId="6EAE1065">
+                                <wp:extent cx="592455" cy="550545"/>
+                                <wp:effectExtent l="0" t="0" r="0" b="1905"/>
+                                <wp:docPr id="722843657" name="Picture 4" descr="A black and white logo&#10;&#10;AI-generated content may be incorrect."/>
+                                <wp:cNvGraphicFramePr>
+                                  <a:graphicFrameLocks xmlns:a="http://schemas.openxmlformats.org/drawingml/2006/main" noChangeAspect="1"/>
+                                </wp:cNvGraphicFramePr>
+                                <a:graphic xmlns:a="http://schemas.openxmlformats.org/drawingml/2006/main">
+                                  <a:graphicData uri="http://schemas.openxmlformats.org/drawingml/2006/picture">
+                                    <pic:pic xmlns:pic="http://schemas.openxmlformats.org/drawingml/2006/picture">
+                                      <pic:nvPicPr>
+                                        <pic:cNvPr id="1015503453" name="Picture 4" descr="A black and white logo&#10;&#10;AI-generated content may be incorrect."/>
+                                        <pic:cNvPicPr>
+                                          <a:picLocks noChangeAspect="1" noChangeArrowheads="1"/>
+                                        </pic:cNvPicPr>
+                                      </pic:nvPicPr>
+                                      <pic:blipFill>
+                                        <a:blip r:embed="rId11">
+                                          <a:extLst>
+                                            <a:ext uri="{28A0092B-C50C-407E-A947-70E740481C1C}">
+                                              <a14:useLocalDpi xmlns:a14="http://schemas.microsoft.com/office/drawing/2010/main" val="0"/>
+                                            </a:ext>
+                                          </a:extLst>
+                                        </a:blip>
+                                        <a:srcRect/>
+                                        <a:stretch>
+                                          <a:fillRect/>
+                                        </a:stretch>
+                                      </pic:blipFill>
+                                      <pic:spPr bwMode="auto">
+                                        <a:xfrm>
+                                          <a:off x="0" y="0"/>
+                                          <a:ext cx="592455" cy="550545"/>
+                                        </a:xfrm>
+                                        <a:prstGeom prst="rect">
+                                          <a:avLst/>
+                                        </a:prstGeom>
+                                        <a:noFill/>
+                                        <a:ln>
+                                          <a:noFill/>
+                                        </a:ln>
+                                      </pic:spPr>
+                                    </pic:pic>
+                                  </a:graphicData>
+                                </a:graphic>
+                              </wp:inline>
+                            </w:drawing>
+                          </w:r>
+                        </w:p>
+                        <w:p>
+                          <w:pPr>
+                            <w:jc w:val="center"/>
+                            <w:rPr>
+                              <w:lang w:val="en-US"/>
+                            </w:rPr>
+                          </w:pPr>
+                          <w:r>
+                            <w:rPr>
+                              <w:lang w:val="en-US"/>
+                            </w:rPr>
+                            <w:t>FCFMyN</w:t>
+                          </w:r>
+                        </w:p>
+                      </w:txbxContent>
+                    </v:textbox>
+                  </v:rect>
+                </w:pict>
+              </mc:Fallback>
+            </mc:AlternateContent>
+          </w:r>
+          <w:r>
+            <w:rPr>
+              <w:noProof/>
+              <w:color w:val="1CADE4" w:themeColor="accent1"/>
+            </w:rPr>
+            <mc:AlternateContent>
+              <mc:Choice Requires="wps">
+                <w:drawing>
+                  <wp:anchor distT="0" distB="0" distL="114300" distR="114300" simplePos="0" relativeHeight="251661312" behindDoc="0" locked="0" layoutInCell="1" allowOverlap="1" wp14:anchorId="3DC1B528" wp14:editId="7BDA124E">
+                    <wp:simplePos x="0" y="0"/>
+                    <wp:positionH relativeFrom="column">
+                      <wp:posOffset>-339670</wp:posOffset>
+                    </wp:positionH>
+                    <wp:positionV relativeFrom="paragraph">
+                      <wp:posOffset>3957320</wp:posOffset>
+                    </wp:positionV>
+                    <wp:extent cx="1235710" cy="1125220"/>
+                    <wp:effectExtent l="0" t="0" r="21590" b="17780"/>
+                    <wp:wrapNone/>
+                    <wp:docPr id="100592600" name="Rectangle 2"/>
+                    <wp:cNvGraphicFramePr/>
+                    <a:graphic xmlns:a="http://schemas.openxmlformats.org/drawingml/2006/main">
+                      <a:graphicData uri="http://schemas.microsoft.com/office/word/2010/wordprocessingShape">
+                        <wps:wsp>
+                          <wps:cNvSpPr/>
+                          <wps:spPr>
+                            <a:xfrm>
+                              <a:off x="0" y="0"/>
+                              <a:ext cx="1235710" cy="1125220"/>
+                            </a:xfrm>
+                            <a:prstGeom prst="rect">
+                              <a:avLst/>
+                            </a:prstGeom>
+                            <a:ln>
+                              <a:solidFill>
+                                <a:schemeClr val="bg1"/>
+                              </a:solidFill>
+                            </a:ln>
+                          </wps:spPr>
+                          <wps:style>
+                            <a:lnRef idx="2">
+                              <a:schemeClr val="accent6"/>
+                            </a:lnRef>
+                            <a:fillRef idx="1">
+                              <a:schemeClr val="lt1"/>
+                            </a:fillRef>
+                            <a:effectRef idx="0">
+                              <a:schemeClr val="accent6"/>
+                            </a:effectRef>
+                            <a:fontRef idx="minor">
+                              <a:schemeClr val="dk1"/>
+                            </a:fontRef>
+                          </wps:style>
+                          <wps:txbx>
+                            <w:txbxContent>
+                              <w:p>
+                                <w:pPr>
+                                  <w:jc w:val="center"/>
+                                  <w:rPr>
+                                    <w:lang w:val="en-US"/>
+                                  </w:rPr>
+                                </w:pPr>
+                                <w:r>
+                                  <w:rPr>
+                                    <w:noProof/>
+                                  </w:rPr>
+                                  <w:drawing>
+                                    <wp:inline distT="0" distB="0" distL="0" distR="0" wp14:anchorId="1CCDF39A" wp14:editId="24070FB2">
+                                      <wp:extent cx="541655" cy="617855"/>
+                                      <wp:effectExtent l="0" t="0" r="0" b="0"/>
+                                      <wp:docPr id="1707239892" name="Picture 3" descr="A logo of a mountain&#10;&#10;AI-generated content may be incorrect."/>
+                                      <wp:cNvGraphicFramePr>
+                                        <a:graphicFrameLocks xmlns:a="http://schemas.openxmlformats.org/drawingml/2006/main" noChangeAspect="1"/>
+                                      </wp:cNvGraphicFramePr>
+                                      <a:graphic xmlns:a="http://schemas.openxmlformats.org/drawingml/2006/main">
+                                        <a:graphicData uri="http://schemas.openxmlformats.org/drawingml/2006/picture">
+                                          <pic:pic xmlns:pic="http://schemas.openxmlformats.org/drawingml/2006/picture">
+                                            <pic:nvPicPr>
+                                              <pic:cNvPr id="376968585" name="Picture 3" descr="A logo of a mountain&#10;&#10;AI-generated content may be incorrect."/>
+                                              <pic:cNvPicPr>
+                                                <a:picLocks noChangeAspect="1" noChangeArrowheads="1"/>
+                                              </pic:cNvPicPr>
+                                            </pic:nvPicPr>
+                                            <pic:blipFill>
+                                              <a:blip r:embed="rId12">
+                                                <a:extLst>
+                                                  <a:ext uri="{28A0092B-C50C-407E-A947-70E740481C1C}">
+                                                    <a14:useLocalDpi xmlns:a14="http://schemas.microsoft.com/office/drawing/2010/main" val="0"/>
+                                                  </a:ext>
+                                                </a:extLst>
+                                              </a:blip>
+                                              <a:srcRect/>
+                                              <a:stretch>
+                                                <a:fillRect/>
+                                              </a:stretch>
+                                            </pic:blipFill>
+                                            <pic:spPr bwMode="auto">
+                                              <a:xfrm>
+                                                <a:off x="0" y="0"/>
+                                                <a:ext cx="541655" cy="617855"/>
+                                              </a:xfrm>
+                                              <a:prstGeom prst="rect">
+                                                <a:avLst/>
+                                              </a:prstGeom>
+                                              <a:noFill/>
+                                              <a:ln>
+                                                <a:noFill/>
+                                              </a:ln>
+                                            </pic:spPr>
+                                          </pic:pic>
+                                        </a:graphicData>
+                                      </a:graphic>
+                                    </wp:inline>
+                                  </w:drawing>
+                                </w:r>
+                              </w:p>
+                              <w:p>
+                                <w:pPr>
+                                  <w:jc w:val="center"/>
+                                  <w:rPr>
+                                    <w:lang w:val="en-US"/>
+                                  </w:rPr>
+                                </w:pPr>
+                                <w:r>
+                                  <w:rPr>
+                                    <w:lang w:val="en-US"/>
+                                  </w:rPr>
+                                  <w:t>UNSL</w:t>
+                                </w:r>
+                              </w:p>
+                            </w:txbxContent>
+                          </wps:txbx>
+                          <wps:bodyPr rot="0" spcFirstLastPara="0" vertOverflow="overflow" horzOverflow="overflow" vert="horz" wrap="square" lIns="91440" tIns="45720" rIns="91440" bIns="45720" numCol="1" spcCol="0" rtlCol="0" fromWordArt="0" anchor="ctr" anchorCtr="0" forceAA="0" compatLnSpc="1">
+                            <a:prstTxWarp prst="textNoShape">
+                              <a:avLst/>
+                            </a:prstTxWarp>
+                            <a:noAutofit/>
+                          </wps:bodyPr>
+                        </wps:wsp>
+                      </a:graphicData>
+                    </a:graphic>
+                    <wp14:sizeRelV relativeFrom="margin">
+                      <wp14:pctHeight>0</wp14:pctHeight>
+                    </wp14:sizeRelV>
+                  </wp:anchor>
+                </w:drawing>
+              </mc:Choice>
+              <mc:Fallback>
+                <w:pict>
+                  <v:rect w14:anchorId="3DC1B528" id="_x0000_s1029" style="position:absolute;left:0;text-align:left;margin-left:-26.75pt;margin-top:311.6pt;width:97.3pt;height:88.6pt;z-index:251661312;visibility:visible;mso-wrap-style:square;mso-height-percent:0;mso-wrap-distance-left:9pt;mso-wrap-distance-top:0;mso-wrap-distance-right:9pt;mso-wrap-distance-bottom:0;mso-position-horizontal:absolute;mso-position-horizontal-relative:text;mso-position-vertical:absolute;mso-position-vertical-relative:text;mso-height-percent:0;mso-height-relative:margin;v-text-anchor:middle" o:gfxdata="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" fillcolor="white [3201]" strokecolor="white [3212]" strokeweight="1.25pt">
+                    <v:textbox>
+                      <w:txbxContent>
+                        <w:p>
+                          <w:pPr>
+                            <w:jc w:val="center"/>
+                            <w:rPr>
+                              <w:lang w:val="en-US"/>
+                            </w:rPr>
+                          </w:pPr>
+                          <w:r>
+                            <w:rPr>
+                              <w:noProof/>
+                            </w:rPr>
+                            <w:drawing>
+                              <wp:inline distT="0" distB="0" distL="0" distR="0" wp14:anchorId="1CCDF39A" wp14:editId="24070FB2">
+                                <wp:extent cx="541655" cy="617855"/>
+                                <wp:effectExtent l="0" t="0" r="0" b="0"/>
+                                <wp:docPr id="1707239892" name="Picture 3" descr="A logo of a mountain&#10;&#10;AI-generated content may be incorrect."/>
+                                <wp:cNvGraphicFramePr>
+                                  <a:graphicFrameLocks xmlns:a="http://schemas.openxmlformats.org/drawingml/2006/main" noChangeAspect="1"/>
+                                </wp:cNvGraphicFramePr>
+                                <a:graphic xmlns:a="http://schemas.openxmlformats.org/drawingml/2006/main">
+                                  <a:graphicData uri="http://schemas.openxmlformats.org/drawingml/2006/picture">
+                                    <pic:pic xmlns:pic="http://schemas.openxmlformats.org/drawingml/2006/picture">
+                                      <pic:nvPicPr>
+                                        <pic:cNvPr id="376968585" name="Picture 3" descr="A logo of a mountain&#10;&#10;AI-generated content may be incorrect."/>
+                                        <pic:cNvPicPr>
+                                          <a:picLocks noChangeAspect="1" noChangeArrowheads="1"/>
+                                        </pic:cNvPicPr>
+                                      </pic:nvPicPr>
+                                      <pic:blipFill>
+                                        <a:blip r:embed="rId12">
+                                          <a:extLst>
+                                            <a:ext uri="{28A0092B-C50C-407E-A947-70E740481C1C}">
+                                              <a14:useLocalDpi xmlns:a14="http://schemas.microsoft.com/office/drawing/2010/main" val="0"/>
+                                            </a:ext>
+                                          </a:extLst>
+                                        </a:blip>
+                                        <a:srcRect/>
+                                        <a:stretch>
+                                          <a:fillRect/>
+                                        </a:stretch>
+                                      </pic:blipFill>
+                                      <pic:spPr bwMode="auto">
+                                        <a:xfrm>
+                                          <a:off x="0" y="0"/>
+                                          <a:ext cx="541655" cy="617855"/>
+                                        </a:xfrm>
+                                        <a:prstGeom prst="rect">
+                                          <a:avLst/>
+                                        </a:prstGeom>
+                                        <a:noFill/>
+                                        <a:ln>
+                                          <a:noFill/>
+                                        </a:ln>
+                                      </pic:spPr>
+                                    </pic:pic>
+                                  </a:graphicData>
+                                </a:graphic>
+                              </wp:inline>
+                            </w:drawing>
+                          </w:r>
+                        </w:p>
+                        <w:p>
+                          <w:pPr>
+                            <w:jc w:val="center"/>
+                            <w:rPr>
+                              <w:lang w:val="en-US"/>
+                            </w:rPr>
+                          </w:pPr>
+                          <w:r>
+                            <w:rPr>
+                              <w:lang w:val="en-US"/>
+                            </w:rPr>
+                            <w:t>UNSL</w:t>
+                          </w:r>
+                        </w:p>
+                      </w:txbxContent>
+                    </v:textbox>
+                  </v:rect>
+                </w:pict>
+              </mc:Fallback>
+            </mc:AlternateContent>
+          </w:r>
           <w:r>
             <w:br w:type="page"/>
           </w:r>
         </w:p>
       </w:sdtContent>
     </w:sdt>
+    <w:bookmarkStart w:id="0" w:name="_Toc201229726" w:displacedByCustomXml="next"/>
+    <w:sdt>
+      <w:sdtPr>
+        <w:id w:val="1807504060"/>
+        <w:docPartObj>
+          <w:docPartGallery w:val="Table of Contents"/>
+          <w:docPartUnique/>
+        </w:docPartObj>
+      </w:sdtPr>
+      <w:sdtEndPr>
+        <w:rPr>
+          <w:rFonts w:asciiTheme="minorHAnsi" w:eastAsiaTheme="minorHAnsi" w:hAnsiTheme="minorHAnsi" w:cstheme="minorBidi"/>
+          <w:bCs/>
+          <w:noProof/>
+          <w:color w:val="auto"/>
+          <w:spacing w:val="0"/>
+          <w:sz w:val="24"/>
+          <w:szCs w:val="22"/>
+        </w:rPr>
+      </w:sdtEndPr>
+      <w:sdtContent>
+        <w:p>
+          <w:pPr>
+            <w:pStyle w:val="Title"/>
+          </w:pPr>
+          <w:r>
+            <w:t>Contenidos</w:t>
+          </w:r>
+          <w:bookmarkEnd w:id="0"/>
+        </w:p>
+        <w:p>
+          <w:pPr>
+            <w:pStyle w:val="TOC1"/>
+            <w:tabs>
+              <w:tab w:val="right" w:leader="dot" w:pos="9016"/>
+            </w:tabs>
+            <w:rPr>
+              <w:rFonts w:eastAsiaTheme="minorEastAsia"/>
+              <w:noProof/>
+              <w:kern w:val="2"/>
+              <w:szCs w:val="24"/>
+              <w:lang w:eastAsia="es-AR"/>
+              <w14:ligatures w14:val="standardContextual"/>
+            </w:rPr>
+          </w:pPr>
+          <w:r>
+            <w:fldChar w:fldCharType="begin"/>
+          </w:r>
+          <w:r>
+            <w:instrText xml:space="preserve"> TOC \h \z \t "Heading 1;2;Heading 2;3;Heading 3;4;Title;1" </w:instrText>
+          </w:r>
+          <w:r>
+            <w:fldChar w:fldCharType="separate"/>
+          </w:r>
+          <w:hyperlink w:anchor="_Toc201229726" w:history="1">
+            <w:r>
+              <w:rPr>
+                <w:rStyle w:val="Hyperlink"/>
+                <w:noProof/>
+              </w:rPr>
+              <w:t>Contenidos</w:t>
+            </w:r>
+            <w:r>
+              <w:rPr>
+                <w:noProof/>
+                <w:webHidden/>
+              </w:rPr>
+              <w:tab/>
+            </w:r>
+            <w:r>
+              <w:rPr>
+                <w:noProof/>
+                <w:webHidden/>
+              </w:rPr>
+              <w:fldChar w:fldCharType="begin"/>
+            </w:r>
+            <w:r>
+              <w:rPr>
+                <w:noProof/>
+                <w:webHidden/>
+              </w:rPr>
+              <w:instrText xml:space="preserve"> PAGEREF _Toc201229726 \h </w:instrText>
+            </w:r>
+            <w:r>
+              <w:rPr>
+                <w:noProof/>
+                <w:webHidden/>
+              </w:rPr>
+            </w:r>
+            <w:r>
+              <w:rPr>
+                <w:noProof/>
+                <w:webHidden/>
+              </w:rPr>
+              <w:fldChar w:fldCharType="separate"/>
+            </w:r>
+            <w:r>
+              <w:rPr>
+                <w:noProof/>
+                <w:webHidden/>
+              </w:rPr>
+              <w:t>1</w:t>
+            </w:r>
+            <w:r>
+              <w:rPr>
+                <w:noProof/>
+                <w:webHidden/>
+              </w:rPr>
+              <w:fldChar w:fldCharType="end"/>
+            </w:r>
+          </w:hyperlink>
+        </w:p>
+        <w:p>
+          <w:pPr>
+            <w:pStyle w:val="TOC1"/>
+            <w:tabs>
+              <w:tab w:val="right" w:leader="dot" w:pos="9016"/>
+            </w:tabs>
+            <w:rPr>
+              <w:rFonts w:eastAsiaTheme="minorEastAsia"/>
+              <w:noProof/>
+              <w:kern w:val="2"/>
+              <w:szCs w:val="24"/>
+              <w:lang w:eastAsia="es-AR"/>
+              <w14:ligatures w14:val="standardContextual"/>
+            </w:rPr>
+          </w:pPr>
+          <w:hyperlink w:anchor="_Toc201229727" w:history="1">
+            <w:r>
+              <w:rPr>
+                <w:rStyle w:val="Hyperlink"/>
+                <w:noProof/>
+              </w:rPr>
+              <w:t>Introducción</w:t>
+            </w:r>
+            <w:r>
+              <w:rPr>
+                <w:noProof/>
+                <w:webHidden/>
+              </w:rPr>
+              <w:tab/>
+            </w:r>
+            <w:r>
+              <w:rPr>
+                <w:noProof/>
+                <w:webHidden/>
+              </w:rPr>
+              <w:fldChar w:fldCharType="begin"/>
+            </w:r>
+            <w:r>
+              <w:rPr>
+                <w:noProof/>
+                <w:webHidden/>
+              </w:rPr>
+              <w:instrText xml:space="preserve"> PAGEREF _Toc201229727 \h </w:instrText>
+            </w:r>
+            <w:r>
+              <w:rPr>
+                <w:noProof/>
+                <w:webHidden/>
+              </w:rPr>
+            </w:r>
+            <w:r>
+              <w:rPr>
+                <w:noProof/>
+                <w:webHidden/>
+              </w:rPr>
+              <w:fldChar w:fldCharType="separate"/>
+            </w:r>
+            <w:r>
+              <w:rPr>
+                <w:noProof/>
+                <w:webHidden/>
+              </w:rPr>
+              <w:t>2</w:t>
+            </w:r>
+            <w:r>
+              <w:rPr>
+                <w:noProof/>
+                <w:webHidden/>
+              </w:rPr>
+              <w:fldChar w:fldCharType="end"/>
+            </w:r>
+          </w:hyperlink>
+        </w:p>
+        <w:p>
+          <w:pPr>
+            <w:pStyle w:val="TOC2"/>
+            <w:tabs>
+              <w:tab w:val="right" w:leader="dot" w:pos="9016"/>
+            </w:tabs>
+            <w:rPr>
+              <w:rFonts w:eastAsiaTheme="minorEastAsia"/>
+              <w:noProof/>
+              <w:kern w:val="2"/>
+              <w:szCs w:val="24"/>
+              <w:lang w:eastAsia="es-AR"/>
+              <w14:ligatures w14:val="standardContextual"/>
+            </w:rPr>
+          </w:pPr>
+          <w:hyperlink w:anchor="_Toc201229728" w:history="1">
+            <w:r>
+              <w:rPr>
+                <w:rStyle w:val="Hyperlink"/>
+                <w:noProof/>
+              </w:rPr>
+              <w:t>Objetivo</w:t>
+            </w:r>
+            <w:r>
+              <w:rPr>
+                <w:noProof/>
+                <w:webHidden/>
+              </w:rPr>
+              <w:tab/>
+            </w:r>
+            <w:r>
+              <w:rPr>
+                <w:noProof/>
+                <w:webHidden/>
+              </w:rPr>
+              <w:fldChar w:fldCharType="begin"/>
+            </w:r>
+            <w:r>
+              <w:rPr>
+                <w:noProof/>
+                <w:webHidden/>
+              </w:rPr>
+              <w:instrText xml:space="preserve"> PAGEREF _Toc201229728 \h </w:instrText>
+            </w:r>
+            <w:r>
+              <w:rPr>
+                <w:noProof/>
+                <w:webHidden/>
+              </w:rPr>
+            </w:r>
+            <w:r>
+              <w:rPr>
+                <w:noProof/>
+                <w:webHidden/>
+              </w:rPr>
+              <w:fldChar w:fldCharType="separate"/>
+            </w:r>
+            <w:r>
+              <w:rPr>
+                <w:noProof/>
+                <w:webHidden/>
+              </w:rPr>
+              <w:t>2</w:t>
+            </w:r>
+            <w:r>
+              <w:rPr>
+                <w:noProof/>
+                <w:webHidden/>
+              </w:rPr>
+              <w:fldChar w:fldCharType="end"/>
+            </w:r>
+          </w:hyperlink>
+        </w:p>
+        <w:p>
+          <w:pPr>
+            <w:pStyle w:val="TOC2"/>
+            <w:tabs>
+              <w:tab w:val="right" w:leader="dot" w:pos="9016"/>
+            </w:tabs>
+            <w:rPr>
+              <w:rFonts w:eastAsiaTheme="minorEastAsia"/>
+              <w:noProof/>
+              <w:kern w:val="2"/>
+              <w:szCs w:val="24"/>
+              <w:lang w:eastAsia="es-AR"/>
+              <w14:ligatures w14:val="standardContextual"/>
+            </w:rPr>
+          </w:pPr>
+          <w:hyperlink w:anchor="_Toc201229729" w:history="1">
+            <w:r>
+              <w:rPr>
+                <w:rStyle w:val="Hyperlink"/>
+                <w:noProof/>
+              </w:rPr>
+              <w:t>Temas tratados</w:t>
+            </w:r>
+            <w:r>
+              <w:rPr>
+                <w:noProof/>
+                <w:webHidden/>
+              </w:rPr>
+              <w:tab/>
+            </w:r>
+            <w:r>
+              <w:rPr>
+                <w:noProof/>
+                <w:webHidden/>
+              </w:rPr>
+              <w:fldChar w:fldCharType="begin"/>
+            </w:r>
+            <w:r>
+              <w:rPr>
+                <w:noProof/>
+                <w:webHidden/>
+              </w:rPr>
+              <w:instrText xml:space="preserve"> PAGEREF _Toc201229729 \h </w:instrText>
+            </w:r>
+            <w:r>
+              <w:rPr>
+                <w:noProof/>
+                <w:webHidden/>
+              </w:rPr>
+            </w:r>
+            <w:r>
+              <w:rPr>
+                <w:noProof/>
+                <w:webHidden/>
+              </w:rPr>
+              <w:fldChar w:fldCharType="separate"/>
+            </w:r>
+            <w:r>
+              <w:rPr>
+                <w:noProof/>
+                <w:webHidden/>
+              </w:rPr>
+              <w:t>2</w:t>
+            </w:r>
+            <w:r>
+              <w:rPr>
+                <w:noProof/>
+                <w:webHidden/>
+              </w:rPr>
+              <w:fldChar w:fldCharType="end"/>
+            </w:r>
+          </w:hyperlink>
+        </w:p>
+        <w:p>
+          <w:pPr>
+            <w:pStyle w:val="TOC2"/>
+            <w:tabs>
+              <w:tab w:val="right" w:leader="dot" w:pos="9016"/>
+            </w:tabs>
+            <w:rPr>
+              <w:rFonts w:eastAsiaTheme="minorEastAsia"/>
+              <w:noProof/>
+              <w:kern w:val="2"/>
+              <w:szCs w:val="24"/>
+              <w:lang w:eastAsia="es-AR"/>
+              <w14:ligatures w14:val="standardContextual"/>
+            </w:rPr>
+          </w:pPr>
+          <w:hyperlink w:anchor="_Toc201229730" w:history="1">
+            <w:r>
+              <w:rPr>
+                <w:rStyle w:val="Hyperlink"/>
+                <w:noProof/>
+              </w:rPr>
+              <w:t>Metodología</w:t>
+            </w:r>
+            <w:r>
+              <w:rPr>
+                <w:noProof/>
+                <w:webHidden/>
+              </w:rPr>
+              <w:tab/>
+            </w:r>
+            <w:r>
+              <w:rPr>
+                <w:noProof/>
+                <w:webHidden/>
+              </w:rPr>
+              <w:fldChar w:fldCharType="begin"/>
+            </w:r>
+            <w:r>
+              <w:rPr>
+                <w:noProof/>
+                <w:webHidden/>
+              </w:rPr>
+              <w:instrText xml:space="preserve"> PAGEREF _Toc201229730 \h </w:instrText>
+            </w:r>
+            <w:r>
+              <w:rPr>
+                <w:noProof/>
+                <w:webHidden/>
+              </w:rPr>
+            </w:r>
+            <w:r>
+              <w:rPr>
+                <w:noProof/>
+                <w:webHidden/>
+              </w:rPr>
+              <w:fldChar w:fldCharType="separate"/>
+            </w:r>
+            <w:r>
+              <w:rPr>
+                <w:noProof/>
+                <w:webHidden/>
+              </w:rPr>
+              <w:t>3</w:t>
+            </w:r>
+            <w:r>
+              <w:rPr>
+                <w:noProof/>
+                <w:webHidden/>
+              </w:rPr>
+              <w:fldChar w:fldCharType="end"/>
+            </w:r>
+          </w:hyperlink>
+        </w:p>
+        <w:p>
+          <w:pPr>
+            <w:pStyle w:val="TOC1"/>
+            <w:tabs>
+              <w:tab w:val="right" w:leader="dot" w:pos="9016"/>
+            </w:tabs>
+            <w:rPr>
+              <w:rFonts w:eastAsiaTheme="minorEastAsia"/>
+              <w:noProof/>
+              <w:kern w:val="2"/>
+              <w:szCs w:val="24"/>
+              <w:lang w:eastAsia="es-AR"/>
+              <w14:ligatures w14:val="standardContextual"/>
+            </w:rPr>
+          </w:pPr>
+          <w:hyperlink w:anchor="_Toc201229731" w:history="1">
+            <w:r>
+              <w:rPr>
+                <w:rStyle w:val="Hyperlink"/>
+                <w:noProof/>
+              </w:rPr>
+              <w:t>Primera Etapa</w:t>
+            </w:r>
+            <w:r>
+              <w:rPr>
+                <w:noProof/>
+                <w:webHidden/>
+              </w:rPr>
+              <w:tab/>
+            </w:r>
+            <w:r>
+              <w:rPr>
+                <w:noProof/>
+                <w:webHidden/>
+              </w:rPr>
+              <w:fldChar w:fldCharType="begin"/>
+            </w:r>
+            <w:r>
+              <w:rPr>
+                <w:noProof/>
+                <w:webHidden/>
+              </w:rPr>
+              <w:instrText xml:space="preserve"> PAGEREF _Toc201229731 \h </w:instrText>
+            </w:r>
+            <w:r>
+              <w:rPr>
+                <w:noProof/>
+                <w:webHidden/>
+              </w:rPr>
+            </w:r>
+            <w:r>
+              <w:rPr>
+                <w:noProof/>
+                <w:webHidden/>
+              </w:rPr>
+              <w:fldChar w:fldCharType="separate"/>
+            </w:r>
+            <w:r>
+              <w:rPr>
+                <w:noProof/>
+                <w:webHidden/>
+              </w:rPr>
+              <w:t>4</w:t>
+            </w:r>
+            <w:r>
+              <w:rPr>
+                <w:noProof/>
+                <w:webHidden/>
+              </w:rPr>
+              <w:fldChar w:fldCharType="end"/>
+            </w:r>
+          </w:hyperlink>
+        </w:p>
+        <w:p>
+          <w:pPr>
+            <w:pStyle w:val="TOC2"/>
+            <w:tabs>
+              <w:tab w:val="right" w:leader="dot" w:pos="9016"/>
+            </w:tabs>
+            <w:rPr>
+              <w:rFonts w:eastAsiaTheme="minorEastAsia"/>
+              <w:noProof/>
+              <w:kern w:val="2"/>
+              <w:szCs w:val="24"/>
+              <w:lang w:eastAsia="es-AR"/>
+              <w14:ligatures w14:val="standardContextual"/>
+            </w:rPr>
+          </w:pPr>
+          <w:hyperlink w:anchor="_Toc201229732" w:history="1">
+            <w:r>
+              <w:rPr>
+                <w:rStyle w:val="Hyperlink"/>
+                <w:noProof/>
+              </w:rPr>
+              <w:t>Objetivos</w:t>
+            </w:r>
+            <w:r>
+              <w:rPr>
+                <w:noProof/>
+                <w:webHidden/>
+              </w:rPr>
+              <w:tab/>
+            </w:r>
+            <w:r>
+              <w:rPr>
+                <w:noProof/>
+                <w:webHidden/>
+              </w:rPr>
+              <w:fldChar w:fldCharType="begin"/>
+            </w:r>
+            <w:r>
+              <w:rPr>
+                <w:noProof/>
+                <w:webHidden/>
+              </w:rPr>
+              <w:instrText xml:space="preserve"> PAGEREF _Toc201229732 \h </w:instrText>
+            </w:r>
+            <w:r>
+              <w:rPr>
+                <w:noProof/>
+                <w:webHidden/>
+              </w:rPr>
+            </w:r>
+            <w:r>
+              <w:rPr>
+                <w:noProof/>
+                <w:webHidden/>
+              </w:rPr>
+              <w:fldChar w:fldCharType="separate"/>
+            </w:r>
+            <w:r>
+              <w:rPr>
+                <w:noProof/>
+                <w:webHidden/>
+              </w:rPr>
+              <w:t>4</w:t>
+            </w:r>
+            <w:r>
+              <w:rPr>
+                <w:noProof/>
+                <w:webHidden/>
+              </w:rPr>
+              <w:fldChar w:fldCharType="end"/>
+            </w:r>
+          </w:hyperlink>
+        </w:p>
+        <w:p>
+          <w:pPr>
+            <w:pStyle w:val="TOC2"/>
+            <w:tabs>
+              <w:tab w:val="right" w:leader="dot" w:pos="9016"/>
+            </w:tabs>
+            <w:rPr>
+              <w:rFonts w:eastAsiaTheme="minorEastAsia"/>
+              <w:noProof/>
+              <w:kern w:val="2"/>
+              <w:szCs w:val="24"/>
+              <w:lang w:eastAsia="es-AR"/>
+              <w14:ligatures w14:val="standardContextual"/>
+            </w:rPr>
+          </w:pPr>
+          <w:hyperlink w:anchor="_Toc201229733" w:history="1">
+            <w:r>
+              <w:rPr>
+                <w:rStyle w:val="Hyperlink"/>
+                <w:noProof/>
+              </w:rPr>
+              <w:t>Experiencia de Desarrollo</w:t>
+            </w:r>
+            <w:r>
+              <w:rPr>
+                <w:noProof/>
+                <w:webHidden/>
+              </w:rPr>
+              <w:tab/>
+            </w:r>
+            <w:r>
+              <w:rPr>
+                <w:noProof/>
+                <w:webHidden/>
+              </w:rPr>
+              <w:fldChar w:fldCharType="begin"/>
+            </w:r>
+            <w:r>
+              <w:rPr>
+                <w:noProof/>
+                <w:webHidden/>
+              </w:rPr>
+              <w:instrText xml:space="preserve"> PAGEREF _Toc201229733 \h </w:instrText>
+            </w:r>
+            <w:r>
+              <w:rPr>
+                <w:noProof/>
+                <w:webHidden/>
+              </w:rPr>
+            </w:r>
+            <w:r>
+              <w:rPr>
+                <w:noProof/>
+                <w:webHidden/>
+              </w:rPr>
+              <w:fldChar w:fldCharType="separate"/>
+            </w:r>
+            <w:r>
+              <w:rPr>
+                <w:noProof/>
+                <w:webHidden/>
+              </w:rPr>
+              <w:t>4</w:t>
+            </w:r>
+            <w:r>
+              <w:rPr>
+                <w:noProof/>
+                <w:webHidden/>
+              </w:rPr>
+              <w:fldChar w:fldCharType="end"/>
+            </w:r>
+          </w:hyperlink>
+        </w:p>
+        <w:p>
+          <w:pPr>
+            <w:pStyle w:val="TOC2"/>
+            <w:tabs>
+              <w:tab w:val="right" w:leader="dot" w:pos="9016"/>
+            </w:tabs>
+            <w:rPr>
+              <w:rFonts w:eastAsiaTheme="minorEastAsia"/>
+              <w:noProof/>
+              <w:kern w:val="2"/>
+              <w:szCs w:val="24"/>
+              <w:lang w:eastAsia="es-AR"/>
+              <w14:ligatures w14:val="standardContextual"/>
+            </w:rPr>
+          </w:pPr>
+          <w:hyperlink w:anchor="_Toc201229734" w:history="1">
+            <w:r>
+              <w:rPr>
+                <w:rStyle w:val="Hyperlink"/>
+                <w:noProof/>
+              </w:rPr>
+              <w:t>Modelo de Dominio</w:t>
+            </w:r>
+            <w:r>
+              <w:rPr>
+                <w:noProof/>
+                <w:webHidden/>
+              </w:rPr>
+              <w:tab/>
+            </w:r>
+            <w:r>
+              <w:rPr>
+                <w:noProof/>
+                <w:webHidden/>
+              </w:rPr>
+              <w:fldChar w:fldCharType="begin"/>
+            </w:r>
+            <w:r>
+              <w:rPr>
+                <w:noProof/>
+                <w:webHidden/>
+              </w:rPr>
+              <w:instrText xml:space="preserve"> PAGEREF _Toc201229734 \h </w:instrText>
+            </w:r>
+            <w:r>
+              <w:rPr>
+                <w:noProof/>
+                <w:webHidden/>
+              </w:rPr>
+            </w:r>
+            <w:r>
+              <w:rPr>
+                <w:noProof/>
+                <w:webHidden/>
+              </w:rPr>
+              <w:fldChar w:fldCharType="separate"/>
+            </w:r>
+            <w:r>
+              <w:rPr>
+                <w:noProof/>
+                <w:webHidden/>
+              </w:rPr>
+              <w:t>5</w:t>
+            </w:r>
+            <w:r>
+              <w:rPr>
+                <w:noProof/>
+                <w:webHidden/>
+              </w:rPr>
+              <w:fldChar w:fldCharType="end"/>
+            </w:r>
+          </w:hyperlink>
+        </w:p>
+        <w:p>
+          <w:pPr>
+            <w:pStyle w:val="TOC1"/>
+            <w:tabs>
+              <w:tab w:val="right" w:leader="dot" w:pos="9016"/>
+            </w:tabs>
+            <w:rPr>
+              <w:rFonts w:eastAsiaTheme="minorEastAsia"/>
+              <w:noProof/>
+              <w:kern w:val="2"/>
+              <w:szCs w:val="24"/>
+              <w:lang w:eastAsia="es-AR"/>
+              <w14:ligatures w14:val="standardContextual"/>
+            </w:rPr>
+          </w:pPr>
+          <w:hyperlink w:anchor="_Toc201229735" w:history="1">
+            <w:r>
+              <w:rPr>
+                <w:rStyle w:val="Hyperlink"/>
+                <w:noProof/>
+              </w:rPr>
+              <w:t>Segunda etapa</w:t>
+            </w:r>
+            <w:r>
+              <w:rPr>
+                <w:noProof/>
+                <w:webHidden/>
+              </w:rPr>
+              <w:tab/>
+            </w:r>
+            <w:r>
+              <w:rPr>
+                <w:noProof/>
+                <w:webHidden/>
+              </w:rPr>
+              <w:fldChar w:fldCharType="begin"/>
+            </w:r>
+            <w:r>
+              <w:rPr>
+                <w:noProof/>
+                <w:webHidden/>
+              </w:rPr>
+              <w:instrText xml:space="preserve"> PAGEREF _Toc201229735 \h </w:instrText>
+            </w:r>
+            <w:r>
+              <w:rPr>
+                <w:noProof/>
+                <w:webHidden/>
+              </w:rPr>
+            </w:r>
+            <w:r>
+              <w:rPr>
+                <w:noProof/>
+                <w:webHidden/>
+              </w:rPr>
+              <w:fldChar w:fldCharType="separate"/>
+            </w:r>
+            <w:r>
+              <w:rPr>
+                <w:noProof/>
+                <w:webHidden/>
+              </w:rPr>
+              <w:t>6</w:t>
+            </w:r>
+            <w:r>
+              <w:rPr>
+                <w:noProof/>
+                <w:webHidden/>
+              </w:rPr>
+              <w:fldChar w:fldCharType="end"/>
+            </w:r>
+          </w:hyperlink>
+        </w:p>
+        <w:p>
+          <w:pPr>
+            <w:pStyle w:val="TOC2"/>
+            <w:tabs>
+              <w:tab w:val="right" w:leader="dot" w:pos="9016"/>
+            </w:tabs>
+            <w:rPr>
+              <w:rFonts w:eastAsiaTheme="minorEastAsia"/>
+              <w:noProof/>
+              <w:kern w:val="2"/>
+              <w:szCs w:val="24"/>
+              <w:lang w:eastAsia="es-AR"/>
+              <w14:ligatures w14:val="standardContextual"/>
+            </w:rPr>
+          </w:pPr>
+          <w:hyperlink w:anchor="_Toc201229736" w:history="1">
+            <w:r>
+              <w:rPr>
+                <w:rStyle w:val="Hyperlink"/>
+                <w:noProof/>
+              </w:rPr>
+              <w:t>Objetivos</w:t>
+            </w:r>
+            <w:r>
+              <w:rPr>
+                <w:noProof/>
+                <w:webHidden/>
+              </w:rPr>
+              <w:tab/>
+            </w:r>
+            <w:r>
+              <w:rPr>
+                <w:noProof/>
+                <w:webHidden/>
+              </w:rPr>
+              <w:fldChar w:fldCharType="begin"/>
+            </w:r>
+            <w:r>
+              <w:rPr>
+                <w:noProof/>
+                <w:webHidden/>
+              </w:rPr>
+              <w:instrText xml:space="preserve"> PAGEREF _Toc201229736 \h </w:instrText>
+            </w:r>
+            <w:r>
+              <w:rPr>
+                <w:noProof/>
+                <w:webHidden/>
+              </w:rPr>
+            </w:r>
+            <w:r>
+              <w:rPr>
+                <w:noProof/>
+                <w:webHidden/>
+              </w:rPr>
+              <w:fldChar w:fldCharType="separate"/>
+            </w:r>
+            <w:r>
+              <w:rPr>
+                <w:noProof/>
+                <w:webHidden/>
+              </w:rPr>
+              <w:t>6</w:t>
+            </w:r>
+            <w:r>
+              <w:rPr>
+                <w:noProof/>
+                <w:webHidden/>
+              </w:rPr>
+              <w:fldChar w:fldCharType="end"/>
+            </w:r>
+          </w:hyperlink>
+        </w:p>
+        <w:p>
+          <w:pPr>
+            <w:pStyle w:val="TOC2"/>
+            <w:tabs>
+              <w:tab w:val="right" w:leader="dot" w:pos="9016"/>
+            </w:tabs>
+            <w:rPr>
+              <w:rFonts w:eastAsiaTheme="minorEastAsia"/>
+              <w:noProof/>
+              <w:kern w:val="2"/>
+              <w:szCs w:val="24"/>
+              <w:lang w:eastAsia="es-AR"/>
+              <w14:ligatures w14:val="standardContextual"/>
+            </w:rPr>
+          </w:pPr>
+          <w:hyperlink w:anchor="_Toc201229737" w:history="1">
+            <w:r>
+              <w:rPr>
+                <w:rStyle w:val="Hyperlink"/>
+                <w:noProof/>
+              </w:rPr>
+              <w:t>Experiencia de Desarrollo</w:t>
+            </w:r>
+            <w:r>
+              <w:rPr>
+                <w:noProof/>
+                <w:webHidden/>
+              </w:rPr>
+              <w:tab/>
+            </w:r>
+            <w:r>
+              <w:rPr>
+                <w:noProof/>
+                <w:webHidden/>
+              </w:rPr>
+              <w:fldChar w:fldCharType="begin"/>
+            </w:r>
+            <w:r>
+              <w:rPr>
+                <w:noProof/>
+                <w:webHidden/>
+              </w:rPr>
+              <w:instrText xml:space="preserve"> PAGEREF _Toc201229737 \h </w:instrText>
+            </w:r>
+            <w:r>
+              <w:rPr>
+                <w:noProof/>
+                <w:webHidden/>
+              </w:rPr>
+            </w:r>
+            <w:r>
+              <w:rPr>
+                <w:noProof/>
+                <w:webHidden/>
+              </w:rPr>
+              <w:fldChar w:fldCharType="separate"/>
+            </w:r>
+            <w:r>
+              <w:rPr>
+                <w:noProof/>
+                <w:webHidden/>
+              </w:rPr>
+              <w:t>6</w:t>
+            </w:r>
+            <w:r>
+              <w:rPr>
+                <w:noProof/>
+                <w:webHidden/>
+              </w:rPr>
+              <w:fldChar w:fldCharType="end"/>
+            </w:r>
+          </w:hyperlink>
+        </w:p>
+        <w:p>
+          <w:pPr>
+            <w:pStyle w:val="TOC2"/>
+            <w:tabs>
+              <w:tab w:val="right" w:leader="dot" w:pos="9016"/>
+            </w:tabs>
+            <w:rPr>
+              <w:rFonts w:eastAsiaTheme="minorEastAsia"/>
+              <w:noProof/>
+              <w:kern w:val="2"/>
+              <w:szCs w:val="24"/>
+              <w:lang w:eastAsia="es-AR"/>
+              <w14:ligatures w14:val="standardContextual"/>
+            </w:rPr>
+          </w:pPr>
+          <w:hyperlink w:anchor="_Toc201229738" w:history="1">
+            <w:r>
+              <w:rPr>
+                <w:rStyle w:val="Hyperlink"/>
+                <w:noProof/>
+              </w:rPr>
+              <w:t>Modelo de Dominio</w:t>
+            </w:r>
+            <w:r>
+              <w:rPr>
+                <w:noProof/>
+                <w:webHidden/>
+              </w:rPr>
+              <w:tab/>
+            </w:r>
+            <w:r>
+              <w:rPr>
+                <w:noProof/>
+                <w:webHidden/>
+              </w:rPr>
+              <w:fldChar w:fldCharType="begin"/>
+            </w:r>
+            <w:r>
+              <w:rPr>
+                <w:noProof/>
+                <w:webHidden/>
+              </w:rPr>
+              <w:instrText xml:space="preserve"> PAGEREF _Toc201229738 \h </w:instrText>
+            </w:r>
+            <w:r>
+              <w:rPr>
+                <w:noProof/>
+                <w:webHidden/>
+              </w:rPr>
+            </w:r>
+            <w:r>
+              <w:rPr>
+                <w:noProof/>
+                <w:webHidden/>
+              </w:rPr>
+              <w:fldChar w:fldCharType="separate"/>
+            </w:r>
+            <w:r>
+              <w:rPr>
+                <w:noProof/>
+                <w:webHidden/>
+              </w:rPr>
+              <w:t>7</w:t>
+            </w:r>
+            <w:r>
+              <w:rPr>
+                <w:noProof/>
+                <w:webHidden/>
+              </w:rPr>
+              <w:fldChar w:fldCharType="end"/>
+            </w:r>
+          </w:hyperlink>
+        </w:p>
+        <w:p>
+          <w:pPr>
+            <w:pStyle w:val="TOC1"/>
+            <w:tabs>
+              <w:tab w:val="right" w:leader="dot" w:pos="9016"/>
+            </w:tabs>
+            <w:rPr>
+              <w:rFonts w:eastAsiaTheme="minorEastAsia"/>
+              <w:noProof/>
+              <w:kern w:val="2"/>
+              <w:szCs w:val="24"/>
+              <w:lang w:eastAsia="es-AR"/>
+              <w14:ligatures w14:val="standardContextual"/>
+            </w:rPr>
+          </w:pPr>
+          <w:hyperlink w:anchor="_Toc201229739" w:history="1">
+            <w:r>
+              <w:rPr>
+                <w:rStyle w:val="Hyperlink"/>
+                <w:noProof/>
+              </w:rPr>
+              <w:t>Tercera etapa</w:t>
+            </w:r>
+            <w:r>
+              <w:rPr>
+                <w:noProof/>
+                <w:webHidden/>
+              </w:rPr>
+              <w:tab/>
+            </w:r>
+            <w:r>
+              <w:rPr>
+                <w:noProof/>
+                <w:webHidden/>
+              </w:rPr>
+              <w:fldChar w:fldCharType="begin"/>
+            </w:r>
+            <w:r>
+              <w:rPr>
+                <w:noProof/>
+                <w:webHidden/>
+              </w:rPr>
+              <w:instrText xml:space="preserve"> PAGEREF _Toc201229739 \h </w:instrText>
+            </w:r>
+            <w:r>
+              <w:rPr>
+                <w:noProof/>
+                <w:webHidden/>
+              </w:rPr>
+            </w:r>
+            <w:r>
+              <w:rPr>
+                <w:noProof/>
+                <w:webHidden/>
+              </w:rPr>
+              <w:fldChar w:fldCharType="separate"/>
+            </w:r>
+            <w:r>
+              <w:rPr>
+                <w:noProof/>
+                <w:webHidden/>
+              </w:rPr>
+              <w:t>8</w:t>
+            </w:r>
+            <w:r>
+              <w:rPr>
+                <w:noProof/>
+                <w:webHidden/>
+              </w:rPr>
+              <w:fldChar w:fldCharType="end"/>
+            </w:r>
+          </w:hyperlink>
+        </w:p>
+        <w:p>
+          <w:pPr>
+            <w:pStyle w:val="TOC2"/>
+            <w:tabs>
+              <w:tab w:val="right" w:leader="dot" w:pos="9016"/>
+            </w:tabs>
+            <w:rPr>
+              <w:rFonts w:eastAsiaTheme="minorEastAsia"/>
+              <w:noProof/>
+              <w:kern w:val="2"/>
+              <w:szCs w:val="24"/>
+              <w:lang w:eastAsia="es-AR"/>
+              <w14:ligatures w14:val="standardContextual"/>
+            </w:rPr>
+          </w:pPr>
+          <w:hyperlink w:anchor="_Toc201229740" w:history="1">
+            <w:r>
+              <w:rPr>
+                <w:rStyle w:val="Hyperlink"/>
+                <w:noProof/>
+              </w:rPr>
+              <w:t>Modelo</w:t>
+            </w:r>
+            <w:r>
+              <w:rPr>
+                <w:noProof/>
+                <w:webHidden/>
+              </w:rPr>
+              <w:tab/>
+            </w:r>
+            <w:r>
+              <w:rPr>
+                <w:noProof/>
+                <w:webHidden/>
+              </w:rPr>
+              <w:fldChar w:fldCharType="begin"/>
+            </w:r>
+            <w:r>
+              <w:rPr>
+                <w:noProof/>
+                <w:webHidden/>
+              </w:rPr>
+              <w:instrText xml:space="preserve"> PAGEREF _Toc201229740 \h </w:instrText>
+            </w:r>
+            <w:r>
+              <w:rPr>
+                <w:noProof/>
+                <w:webHidden/>
+              </w:rPr>
+            </w:r>
+            <w:r>
+              <w:rPr>
+                <w:noProof/>
+                <w:webHidden/>
+              </w:rPr>
+              <w:fldChar w:fldCharType="separate"/>
+            </w:r>
+            <w:r>
+              <w:rPr>
+                <w:noProof/>
+                <w:webHidden/>
+              </w:rPr>
+              <w:t>8</w:t>
+            </w:r>
+            <w:r>
+              <w:rPr>
+                <w:noProof/>
+                <w:webHidden/>
+              </w:rPr>
+              <w:fldChar w:fldCharType="end"/>
+            </w:r>
+          </w:hyperlink>
+        </w:p>
+        <w:p>
+          <w:pPr>
+            <w:pStyle w:val="TOC2"/>
+            <w:tabs>
+              <w:tab w:val="right" w:leader="dot" w:pos="9016"/>
+            </w:tabs>
+            <w:rPr>
+              <w:rFonts w:eastAsiaTheme="minorEastAsia"/>
+              <w:noProof/>
+              <w:kern w:val="2"/>
+              <w:szCs w:val="24"/>
+              <w:lang w:eastAsia="es-AR"/>
+              <w14:ligatures w14:val="standardContextual"/>
+            </w:rPr>
+          </w:pPr>
+          <w:hyperlink w:anchor="_Toc201229741" w:history="1">
+            <w:r>
+              <w:rPr>
+                <w:rStyle w:val="Hyperlink"/>
+                <w:noProof/>
+              </w:rPr>
+              <w:t>Objetivos</w:t>
+            </w:r>
+            <w:r>
+              <w:rPr>
+                <w:noProof/>
+                <w:webHidden/>
+              </w:rPr>
+              <w:tab/>
+            </w:r>
+            <w:r>
+              <w:rPr>
+                <w:noProof/>
+                <w:webHidden/>
+              </w:rPr>
+              <w:fldChar w:fldCharType="begin"/>
+            </w:r>
+            <w:r>
+              <w:rPr>
+                <w:noProof/>
+                <w:webHidden/>
+              </w:rPr>
+              <w:instrText xml:space="preserve"> PAGEREF _Toc201229741 \h </w:instrText>
+            </w:r>
+            <w:r>
+              <w:rPr>
+                <w:noProof/>
+                <w:webHidden/>
+              </w:rPr>
+            </w:r>
+            <w:r>
+              <w:rPr>
+                <w:noProof/>
+                <w:webHidden/>
+              </w:rPr>
+              <w:fldChar w:fldCharType="separate"/>
+            </w:r>
+            <w:r>
+              <w:rPr>
+                <w:noProof/>
+                <w:webHidden/>
+              </w:rPr>
+              <w:t>8</w:t>
+            </w:r>
+            <w:r>
+              <w:rPr>
+                <w:noProof/>
+                <w:webHidden/>
+              </w:rPr>
+              <w:fldChar w:fldCharType="end"/>
+            </w:r>
+          </w:hyperlink>
+        </w:p>
+        <w:p>
+          <w:pPr>
+            <w:pStyle w:val="TOC2"/>
+            <w:tabs>
+              <w:tab w:val="right" w:leader="dot" w:pos="9016"/>
+            </w:tabs>
+            <w:rPr>
+              <w:rFonts w:eastAsiaTheme="minorEastAsia"/>
+              <w:noProof/>
+              <w:kern w:val="2"/>
+              <w:szCs w:val="24"/>
+              <w:lang w:eastAsia="es-AR"/>
+              <w14:ligatures w14:val="standardContextual"/>
+            </w:rPr>
+          </w:pPr>
+          <w:hyperlink w:anchor="_Toc201229742" w:history="1">
+            <w:r>
+              <w:rPr>
+                <w:rStyle w:val="Hyperlink"/>
+                <w:noProof/>
+              </w:rPr>
+              <w:t>Experiencia de Desarrollo</w:t>
+            </w:r>
+            <w:r>
+              <w:rPr>
+                <w:noProof/>
+                <w:webHidden/>
+              </w:rPr>
+              <w:tab/>
+            </w:r>
+            <w:r>
+              <w:rPr>
+                <w:noProof/>
+                <w:webHidden/>
+              </w:rPr>
+              <w:fldChar w:fldCharType="begin"/>
+            </w:r>
+            <w:r>
+              <w:rPr>
+                <w:noProof/>
+                <w:webHidden/>
+              </w:rPr>
+              <w:instrText xml:space="preserve"> PAGEREF _Toc201229742 \h </w:instrText>
+            </w:r>
+            <w:r>
+              <w:rPr>
+                <w:noProof/>
+                <w:webHidden/>
+              </w:rPr>
+            </w:r>
+            <w:r>
+              <w:rPr>
+                <w:noProof/>
+                <w:webHidden/>
+              </w:rPr>
+              <w:fldChar w:fldCharType="separate"/>
+            </w:r>
+            <w:r>
+              <w:rPr>
+                <w:noProof/>
+                <w:webHidden/>
+              </w:rPr>
+              <w:t>8</w:t>
+            </w:r>
+            <w:r>
+              <w:rPr>
+                <w:noProof/>
+                <w:webHidden/>
+              </w:rPr>
+              <w:fldChar w:fldCharType="end"/>
+            </w:r>
+          </w:hyperlink>
+        </w:p>
+        <w:p>
+          <w:pPr>
+            <w:pStyle w:val="TOC1"/>
+            <w:tabs>
+              <w:tab w:val="right" w:leader="dot" w:pos="9016"/>
+            </w:tabs>
+            <w:rPr>
+              <w:rFonts w:eastAsiaTheme="minorEastAsia"/>
+              <w:noProof/>
+              <w:kern w:val="2"/>
+              <w:szCs w:val="24"/>
+              <w:lang w:eastAsia="es-AR"/>
+              <w14:ligatures w14:val="standardContextual"/>
+            </w:rPr>
+          </w:pPr>
+          <w:hyperlink w:anchor="_Toc201229743" w:history="1">
+            <w:r>
+              <w:rPr>
+                <w:rStyle w:val="Hyperlink"/>
+                <w:noProof/>
+              </w:rPr>
+              <w:t>Bibliografía</w:t>
+            </w:r>
+            <w:r>
+              <w:rPr>
+                <w:noProof/>
+                <w:webHidden/>
+              </w:rPr>
+              <w:tab/>
+            </w:r>
+            <w:r>
+              <w:rPr>
+                <w:noProof/>
+                <w:webHidden/>
+              </w:rPr>
+              <w:fldChar w:fldCharType="begin"/>
+            </w:r>
+            <w:r>
+              <w:rPr>
+                <w:noProof/>
+                <w:webHidden/>
+              </w:rPr>
+              <w:instrText xml:space="preserve"> PAGEREF _Toc201229743 \h </w:instrText>
+            </w:r>
+            <w:r>
+              <w:rPr>
+                <w:noProof/>
+                <w:webHidden/>
+              </w:rPr>
+            </w:r>
+            <w:r>
+              <w:rPr>
+                <w:noProof/>
+                <w:webHidden/>
+              </w:rPr>
+              <w:fldChar w:fldCharType="separate"/>
+            </w:r>
+            <w:r>
+              <w:rPr>
+                <w:noProof/>
+                <w:webHidden/>
+              </w:rPr>
+              <w:t>10</w:t>
+            </w:r>
+            <w:r>
+              <w:rPr>
+                <w:noProof/>
+                <w:webHidden/>
+              </w:rPr>
+              <w:fldChar w:fldCharType="end"/>
+            </w:r>
+          </w:hyperlink>
+        </w:p>
+        <w:p>
+          <w:r>
+            <w:fldChar w:fldCharType="end"/>
+          </w:r>
+        </w:p>
+      </w:sdtContent>
+    </w:sdt>
+    <w:p>
+      <w:pPr>
+        <w:jc w:val="left"/>
+        <w:rPr>
+          <w:rFonts w:asciiTheme="majorHAnsi" w:eastAsiaTheme="majorEastAsia" w:hAnsiTheme="majorHAnsi" w:cstheme="majorBidi"/>
+          <w:b/>
+          <w:color w:val="264356" w:themeColor="text2" w:themeShade="BF"/>
+          <w:spacing w:val="5"/>
+          <w:sz w:val="52"/>
+          <w:szCs w:val="52"/>
+        </w:rPr>
+      </w:pPr>
+      <w:r>
+        <w:br w:type="page"/>
+      </w:r>
+    </w:p>
     <w:p>
       <w:pPr>
         <w:pStyle w:val="Title"/>
       </w:pPr>
+      <w:bookmarkStart w:id="1" w:name="_Toc201229727"/>
       <w:r>
         <w:lastRenderedPageBreak/>
         <w:t>Introducción</w:t>
       </w:r>
+      <w:bookmarkEnd w:id="1"/>
     </w:p>
     <w:p>
       <w:pPr>
         <w:pStyle w:val="Heading1"/>
       </w:pPr>
+      <w:bookmarkStart w:id="2" w:name="_Toc201229728"/>
       <w:r>
         <w:t>Objetivo</w:t>
       </w:r>
-    </w:p>
-    <w:p/>
+      <w:bookmarkEnd w:id="2"/>
+    </w:p>
+    <w:p>
+      <w:r>
+        <w:t>El presente informe tiene como objetivo documentar el proceso de desarrollo, implementación y análisis de un simulador de eventos discretos aplicado al contexto de operaciones aeroportuarias. Este trabajo fue realizado en el marco de la asignatura “Modelos y Simulación” y consistió en el diseño progresivo de un sistema de simulación dividido en tres etapas, abarcando desde la construcción de un modelo simple hasta la ejecución de múltiples replicaciones para análisis estadístico. El objetivo principal fue construir un software capaz de modelar, ejecutar y analizar el comportamiento de sistemas dinámicos bajo incertidumbre, a través de simulaciones que generen datos significativos para su posterior evaluación.</w:t>
+      </w:r>
+    </w:p>
+    <w:p>
+      <w:r>
+        <w:pict w14:anchorId="5C0C2D31">
+          <v:rect id="_x0000_i1031" style="width:0;height:1.5pt" o:hralign="center" o:hrstd="t" o:hr="t" fillcolor="#a0a0a0" stroked="f"/>
+        </w:pict>
+      </w:r>
+    </w:p>
     <w:p>
       <w:pPr>
         <w:pStyle w:val="Heading1"/>
       </w:pPr>
+      <w:bookmarkStart w:id="3" w:name="_Toc201229729"/>
       <w:r>
         <w:t>Temas tratados</w:t>
       </w:r>
-    </w:p>
-    <w:p/>
+      <w:bookmarkEnd w:id="3"/>
+    </w:p>
+    <w:p>
+      <w:r>
+        <w:t>Durante el desarrollo del proyecto se abordaron una serie de temas fundamentales dentro del área de simulación de eventos discretos y diseño de software. Entre ellos se destacan:</w:t>
+      </w:r>
+    </w:p>
+    <w:p>
+      <w:pPr>
+        <w:numPr>
+          <w:ilvl w:val="0"/>
+          <w:numId w:val="10"/>
+        </w:numPr>
+      </w:pPr>
+      <w:r>
+        <w:rPr>
+          <w:b/>
+          <w:bCs/>
+        </w:rPr>
+        <w:t>Simulación orientada a eventos discretos</w:t>
+      </w:r>
+      <w:r>
+        <w:t xml:space="preserve"> y modelado de sistemas dinámicos estocásticos.</w:t>
+      </w:r>
+    </w:p>
+    <w:p>
+      <w:pPr>
+        <w:numPr>
+          <w:ilvl w:val="0"/>
+          <w:numId w:val="10"/>
+        </w:numPr>
+      </w:pPr>
+      <w:r>
+        <w:rPr>
+          <w:b/>
+          <w:bCs/>
+        </w:rPr>
+        <w:t>Técnica de bootstrapping</w:t>
+      </w:r>
+      <w:r>
+        <w:t>, mediante la cual cada evento genera sus próximos eventos, facilitando la automatización del ciclo de simulación.</w:t>
+      </w:r>
+    </w:p>
+    <w:p>
+      <w:pPr>
+        <w:numPr>
+          <w:ilvl w:val="0"/>
+          <w:numId w:val="10"/>
+        </w:numPr>
+      </w:pPr>
+      <w:r>
+        <w:rPr>
+          <w:b/>
+          <w:bCs/>
+        </w:rPr>
+        <w:t>Generación de números y variables aleatorias</w:t>
+      </w:r>
+      <w:r>
+        <w:t>, incluyendo el uso de múltiples distribuciones (exponencial, uniforme, normal, empíricas, etc.).</w:t>
+      </w:r>
+    </w:p>
+    <w:p>
+      <w:pPr>
+        <w:numPr>
+          <w:ilvl w:val="0"/>
+          <w:numId w:val="10"/>
+        </w:numPr>
+      </w:pPr>
+      <w:r>
+        <w:rPr>
+          <w:b/>
+          <w:bCs/>
+        </w:rPr>
+        <w:t>Gestión de la lista de eventos futuros (FEL)</w:t>
+      </w:r>
+      <w:r>
+        <w:t xml:space="preserve"> y lógica de planificación de eventos.</w:t>
+      </w:r>
+    </w:p>
+    <w:p>
+      <w:pPr>
+        <w:numPr>
+          <w:ilvl w:val="0"/>
+          <w:numId w:val="10"/>
+        </w:numPr>
+      </w:pPr>
+      <w:r>
+        <w:rPr>
+          <w:b/>
+          <w:bCs/>
+        </w:rPr>
+        <w:t>Cómputo de estadísticas</w:t>
+      </w:r>
+      <w:r>
+        <w:t xml:space="preserve"> sobre el sistema simulado (tiempos, colas, ocio, etc.).</w:t>
+      </w:r>
+    </w:p>
+    <w:p>
+      <w:pPr>
+        <w:numPr>
+          <w:ilvl w:val="0"/>
+          <w:numId w:val="10"/>
+        </w:numPr>
+      </w:pPr>
+      <w:r>
+        <w:rPr>
+          <w:b/>
+          <w:bCs/>
+        </w:rPr>
+        <w:t>Diseño experimental basado en replicaciones múltiples</w:t>
+      </w:r>
+      <w:r>
+        <w:t>, cálculo de intervalos de confianza e interpretación de resultados.</w:t>
+      </w:r>
+    </w:p>
+    <w:p>
+      <w:pPr>
+        <w:numPr>
+          <w:ilvl w:val="0"/>
+          <w:numId w:val="10"/>
+        </w:numPr>
+      </w:pPr>
+      <w:r>
+        <w:rPr>
+          <w:b/>
+          <w:bCs/>
+        </w:rPr>
+        <w:t>Principios de diseño orientado a objetos y buenas prácticas</w:t>
+      </w:r>
+      <w:r>
+        <w:t>, incluyendo principios S.O.L.I.D. y uso de programación funcional en Java.</w:t>
+      </w:r>
+    </w:p>
+    <w:p>
+      <w:r>
+        <w:pict w14:anchorId="20C1CD8D">
+          <v:rect id="_x0000_i1032" style="width:0;height:1.5pt" o:hralign="center" o:hrstd="t" o:hr="t" fillcolor="#a0a0a0" stroked="f"/>
+        </w:pict>
+      </w:r>
+    </w:p>
     <w:p>
       <w:pPr>
         <w:pStyle w:val="Heading1"/>
       </w:pPr>
-      <w:r>
+      <w:bookmarkStart w:id="4" w:name="_Toc201229730"/>
+      <w:r>
+        <w:lastRenderedPageBreak/>
         <w:t>Metodología</w:t>
       </w:r>
-    </w:p>
-    <w:p/>
+      <w:bookmarkEnd w:id="4"/>
+    </w:p>
+    <w:p>
+      <w:r>
+        <w:t>La metodología consistió en una implementación incremental distribuida en tres etapas:</w:t>
+      </w:r>
+    </w:p>
+    <w:p>
+      <w:pPr>
+        <w:numPr>
+          <w:ilvl w:val="0"/>
+          <w:numId w:val="11"/>
+        </w:numPr>
+      </w:pPr>
+      <w:r>
+        <w:rPr>
+          <w:b/>
+          <w:bCs/>
+        </w:rPr>
+        <w:t>Etapa 1:</w:t>
+      </w:r>
+      <w:r>
+        <w:t xml:space="preserve"> desarrollo del simulador básico con un único servidor (pista de aterrizaje) y una cola. Se construyó el esqueleto del simulador aplicando la técnica de bootstrapping, se implementaron estructuras para la gestión de eventos y se comenzó a recolectar estadísticas básicas.</w:t>
+      </w:r>
+    </w:p>
+    <w:p>
+      <w:pPr>
+        <w:numPr>
+          <w:ilvl w:val="0"/>
+          <w:numId w:val="11"/>
+        </w:numPr>
+      </w:pPr>
+      <w:r>
+        <w:rPr>
+          <w:b/>
+          <w:bCs/>
+        </w:rPr>
+        <w:t>Etapa 2:</w:t>
+      </w:r>
+      <w:r>
+        <w:t xml:space="preserve"> ampliación del modelo para soportar múltiples servidores con colas independientes, incorporación de múltiples distribuciones aleatorias y desgaste de pista. Se introdujo mayor complejidad al modelo de dominio.</w:t>
+      </w:r>
+    </w:p>
+    <w:p>
+      <w:pPr>
+        <w:numPr>
+          <w:ilvl w:val="0"/>
+          <w:numId w:val="11"/>
+        </w:numPr>
+      </w:pPr>
+      <w:r>
+        <w:rPr>
+          <w:b/>
+          <w:bCs/>
+        </w:rPr>
+        <w:t>Etapa 3:</w:t>
+      </w:r>
+      <w:r>
+        <w:t xml:space="preserve"> diseño de un experimento de simulación basado en replicaciones (50 ejecuciones), recolección y análisis estadístico de resultados mediante intervalos de confianza del 95%. Se implementaron mejoras funcionales en la asignación de servidores y se refactorizó el sistema de estadísticas para soportar replicaciones múltiples.</w:t>
+      </w:r>
+    </w:p>
+    <w:p>
+      <w:r>
+        <w:t>Cada etapa implicó un trabajo conjunto de diseño, codificación, validación y evaluación, lo que nos permitió adquirir una comprensión integral del proceso de simulación de sistemas discretos en entornos complejos y realistas.</w:t>
+      </w:r>
+    </w:p>
+    <w:p>
+      <w:r>
+        <w:pict w14:anchorId="10CAD3D7">
+          <v:rect id="_x0000_i1030" style="width:0;height:1.5pt" o:hralign="center" o:hrstd="t" o:hr="t" fillcolor="#a0a0a0" stroked="f"/>
+        </w:pict>
+      </w:r>
+    </w:p>
     <w:p>
       <w:r>
         <w:br w:type="page"/>
@@ -596,10 +2980,12 @@
       <w:pPr>
         <w:pStyle w:val="Title"/>
       </w:pPr>
+      <w:bookmarkStart w:id="5" w:name="_Toc201229731"/>
       <w:r>
         <w:lastRenderedPageBreak/>
         <w:t>Primera Etapa</w:t>
       </w:r>
+      <w:bookmarkEnd w:id="5"/>
     </w:p>
     <w:p>
       <w:pPr>
@@ -608,9 +2994,11 @@
           <w:tab w:val="left" w:pos="3840"/>
         </w:tabs>
       </w:pPr>
+      <w:bookmarkStart w:id="6" w:name="_Toc201229732"/>
       <w:r>
         <w:t>Objetivos</w:t>
       </w:r>
+      <w:bookmarkEnd w:id="6"/>
     </w:p>
     <w:p>
       <w:r>
@@ -645,7 +3033,15 @@
         </w:numPr>
       </w:pPr>
       <w:r>
-        <w:t xml:space="preserve">Emplear la técnica de bootstrapping, en la que cada evento programa el siguiente, optimizando la automatización de la simulación y la gestión de la FEL (Future Event List) </w:t>
+        <w:t xml:space="preserve">Emplear la técnica de bootstrapping, en la que cada evento programa el siguiente, optimizando la automatización de la simulación y la gestión de la FEL (Future </w:t>
+      </w:r>
+      <w:proofErr w:type="spellStart"/>
+      <w:r>
+        <w:t>Event</w:t>
+      </w:r>
+      <w:proofErr w:type="spellEnd"/>
+      <w:r>
+        <w:t xml:space="preserve"> List) </w:t>
       </w:r>
       <w:r>
         <w:rPr>
@@ -748,9 +3144,11 @@
       <w:pPr>
         <w:pStyle w:val="Heading1"/>
       </w:pPr>
+      <w:bookmarkStart w:id="7" w:name="_Toc201229733"/>
       <w:r>
         <w:t>Experiencia de Desarrollo</w:t>
       </w:r>
+      <w:bookmarkEnd w:id="7"/>
     </w:p>
     <w:p>
       <w:pPr>
@@ -886,9 +3284,11 @@
       <w:pPr>
         <w:pStyle w:val="Heading1"/>
       </w:pPr>
+      <w:bookmarkStart w:id="8" w:name="_Toc201229734"/>
       <w:r>
         <w:t>Modelo de Dominio</w:t>
       </w:r>
+      <w:bookmarkEnd w:id="8"/>
     </w:p>
     <w:p>
       <w:r>
@@ -900,7 +3300,6 @@
         <w:rPr>
           <w:noProof/>
         </w:rPr>
-        <w:lastRenderedPageBreak/>
         <w:drawing>
           <wp:inline distT="0" distB="0" distL="0" distR="0" wp14:anchorId="3821C066" wp14:editId="1FE5C8E3">
             <wp:extent cx="5731510" cy="3442335"/>
@@ -917,7 +3316,7 @@
                     <pic:cNvPicPr/>
                   </pic:nvPicPr>
                   <pic:blipFill>
-                    <a:blip r:embed="rId9"/>
+                    <a:blip r:embed="rId13"/>
                     <a:stretch>
                       <a:fillRect/>
                     </a:stretch>
@@ -945,17 +3344,24 @@
       <w:pPr>
         <w:pStyle w:val="Title"/>
       </w:pPr>
+      <w:bookmarkStart w:id="9" w:name="_Toc201229735"/>
       <w:r>
         <w:lastRenderedPageBreak/>
         <w:t>Segunda etapa</w:t>
       </w:r>
+      <w:bookmarkEnd w:id="9"/>
     </w:p>
     <w:p>
       <w:pPr>
         <w:pStyle w:val="Heading1"/>
       </w:pPr>
-      <w:r>
-        <w:t xml:space="preserve">Objetivos </w:t>
+      <w:bookmarkStart w:id="10" w:name="_Toc201229736"/>
+      <w:r>
+        <w:t>Objetivos</w:t>
+      </w:r>
+      <w:bookmarkEnd w:id="10"/>
+      <w:r>
+        <w:t xml:space="preserve"> </w:t>
       </w:r>
     </w:p>
     <w:p>
@@ -1104,9 +3510,11 @@
       <w:pPr>
         <w:pStyle w:val="Heading1"/>
       </w:pPr>
+      <w:bookmarkStart w:id="11" w:name="_Toc201229737"/>
       <w:r>
         <w:t>Experiencia de Desarrollo</w:t>
       </w:r>
+      <w:bookmarkEnd w:id="11"/>
     </w:p>
     <w:p>
       <w:pPr>
@@ -1148,7 +3556,15 @@
         <w:t xml:space="preserve">para que sea </w:t>
       </w:r>
       <w:r>
-        <w:t xml:space="preserve">capaz de manejar múltiples servidores, segregamos responsabilidades moviendo el atributo clock </w:t>
+        <w:t xml:space="preserve">capaz de manejar múltiples servidores, segregamos responsabilidades moviendo el atributo </w:t>
+      </w:r>
+      <w:proofErr w:type="spellStart"/>
+      <w:r>
+        <w:t>clock</w:t>
+      </w:r>
+      <w:proofErr w:type="spellEnd"/>
+      <w:r>
+        <w:t xml:space="preserve"> </w:t>
       </w:r>
       <w:r>
         <w:t xml:space="preserve">de la clase </w:t>
@@ -1165,11 +3581,7 @@
         <w:t xml:space="preserve"> </w:t>
       </w:r>
       <w:r>
-        <w:t xml:space="preserve">a una clase independiente, y diseñamos </w:t>
-      </w:r>
-      <w:r>
-        <w:lastRenderedPageBreak/>
-        <w:t>la arquitectura para que el usuario pueda añadir nuevas distribuciones de forma sencilla, cubriendo todas las especificadas en el informe.</w:t>
+        <w:t>a una clase independiente, y diseñamos la arquitectura para que el usuario pueda añadir nuevas distribuciones de forma sencilla, cubriendo todas las especificadas en el informe.</w:t>
       </w:r>
     </w:p>
     <w:p>
@@ -1180,6 +3592,7 @@
         </w:numPr>
       </w:pPr>
       <w:r>
+        <w:lastRenderedPageBreak/>
         <w:t>La mayor dificultad que enfrentamos en esta segunda etapa fue encontrar la mejor manera de permitir al usuario seleccionar y parametrizar las distintas distribuciones, especialmente la implementación dinámica de la distribución exponencial con medias variables en función de las horas pico.</w:t>
       </w:r>
     </w:p>
@@ -1191,7 +3604,15 @@
         </w:numPr>
       </w:pPr>
       <w:r>
-        <w:t>Mejoramos todos los comparators de nuestras clases, asegurando un ordenamiento consistente y eficiente de los eventos en la FEL para cualquier número de servidores.</w:t>
+        <w:t xml:space="preserve">Mejoramos todos los </w:t>
+      </w:r>
+      <w:proofErr w:type="spellStart"/>
+      <w:r>
+        <w:t>comparators</w:t>
+      </w:r>
+      <w:proofErr w:type="spellEnd"/>
+      <w:r>
+        <w:t xml:space="preserve"> de nuestras clases, asegurando un ordenamiento consistente y eficiente de los eventos en la FEL para cualquier número de servidores.</w:t>
       </w:r>
     </w:p>
     <w:p>
@@ -1205,12 +3626,17 @@
       <w:pPr>
         <w:pStyle w:val="Heading1"/>
       </w:pPr>
+      <w:bookmarkStart w:id="12" w:name="_Toc201229738"/>
       <w:r>
         <w:t>Modelo de Dominio</w:t>
       </w:r>
-    </w:p>
-    <w:p>
-      <w:r>
+      <w:bookmarkEnd w:id="12"/>
+    </w:p>
+    <w:p>
+      <w:r>
+        <w:rPr>
+          <w:noProof/>
+        </w:rPr>
         <w:drawing>
           <wp:inline distT="0" distB="0" distL="0" distR="0" wp14:anchorId="36C1D5F9" wp14:editId="625C1F0B">
             <wp:extent cx="5731510" cy="3761105"/>
@@ -1227,7 +3653,7 @@
                     <pic:cNvPicPr/>
                   </pic:nvPicPr>
                   <pic:blipFill>
-                    <a:blip r:embed="rId10"/>
+                    <a:blip r:embed="rId14"/>
                     <a:stretch>
                       <a:fillRect/>
                     </a:stretch>
@@ -1257,31 +3683,549 @@
       <w:pPr>
         <w:pStyle w:val="Title"/>
       </w:pPr>
+      <w:bookmarkStart w:id="13" w:name="_Toc201229739"/>
       <w:r>
         <w:lastRenderedPageBreak/>
         <w:t>Tercera etapa</w:t>
       </w:r>
+      <w:bookmarkEnd w:id="13"/>
     </w:p>
     <w:p>
       <w:pPr>
         <w:pStyle w:val="Heading1"/>
       </w:pPr>
+      <w:bookmarkStart w:id="14" w:name="_Toc201229740"/>
       <w:r>
         <w:t>Modelo</w:t>
       </w:r>
+      <w:bookmarkEnd w:id="14"/>
     </w:p>
     <w:p/>
     <w:p>
       <w:pPr>
         <w:pStyle w:val="Heading1"/>
       </w:pPr>
+      <w:bookmarkStart w:id="15" w:name="_Toc201229741"/>
       <w:r>
         <w:t>Objetivos</w:t>
       </w:r>
-    </w:p>
+      <w:bookmarkEnd w:id="15"/>
+    </w:p>
+    <w:p>
+      <w:r>
+        <w:t>E</w:t>
+      </w:r>
+      <w:r>
+        <w:t>n esta tercera y última etapa del proyecto, abordamos la experimentación estadística basada en replicaciones múltiples del simulador desarrollado. Los objetivos específicos de esta fase fueron:</w:t>
+      </w:r>
+    </w:p>
+    <w:p>
+      <w:pPr>
+        <w:numPr>
+          <w:ilvl w:val="0"/>
+          <w:numId w:val="8"/>
+        </w:numPr>
+      </w:pPr>
+      <w:r>
+        <w:t>Realizar un experimento de simulación mediante 50 ejecuciones independientes para una configuración mejorada del aeropuerto, con el fin de obtener estimaciones estadísticas más robustas.</w:t>
+      </w:r>
+    </w:p>
+    <w:p>
+      <w:pPr>
+        <w:numPr>
+          <w:ilvl w:val="0"/>
+          <w:numId w:val="8"/>
+        </w:numPr>
+      </w:pPr>
+      <w:r>
+        <w:t>Calcular intervalos de confianza con un 95% de certeza para las métricas clave del sistema: cantidad total de arribos y aterrizajes, tiempos de tránsito y espera, tiempos de ocio, tamaño de la cola y durabilidad final de las pistas.</w:t>
+      </w:r>
+    </w:p>
+    <w:p>
+      <w:pPr>
+        <w:numPr>
+          <w:ilvl w:val="0"/>
+          <w:numId w:val="8"/>
+        </w:numPr>
+      </w:pPr>
+      <w:r>
+        <w:t>Aplicar mejoras al modelo, comparando su rendimiento con la configuración de la etapa anterior, y justificar dichas mejoras mediante análisis cuantitativo de los resultados simulados.</w:t>
+      </w:r>
+    </w:p>
+    <w:p>
+      <w:r>
+        <w:pict w14:anchorId="02C0FFE2">
+          <v:rect id="_x0000_i1029" style="width:0;height:1.5pt" o:hralign="center" o:hrstd="t" o:hr="t" fillcolor="#a0a0a0" stroked="f"/>
+        </w:pict>
+      </w:r>
+    </w:p>
+    <w:p>
+      <w:pPr>
+        <w:pStyle w:val="Heading1"/>
+      </w:pPr>
+      <w:bookmarkStart w:id="16" w:name="_Toc201229742"/>
+      <w:r>
+        <w:t>Experiencia de Desarrollo</w:t>
+      </w:r>
+      <w:bookmarkEnd w:id="16"/>
+    </w:p>
+    <w:p>
+      <w:pPr>
+        <w:numPr>
+          <w:ilvl w:val="0"/>
+          <w:numId w:val="9"/>
+        </w:numPr>
+      </w:pPr>
+      <w:r>
+        <w:t xml:space="preserve">Refactorizamos nuevamente las clases responsables de la recolección de estadísticas, ya que durante las primeras pruebas advertimos que nuestro diseño original no contemplaba correctamente la asociación de estadísticas con múltiples replicaciones. Esta omisión nos llevó a reestructurar las clases relacionadas a </w:t>
+      </w:r>
+      <m:oMath>
+        <m:r>
+          <w:rPr>
+            <w:rFonts w:ascii="Cambria Math" w:hAnsi="Cambria Math"/>
+          </w:rPr>
+          <m:t>Statistics</m:t>
+        </m:r>
+      </m:oMath>
+      <w:r>
+        <w:t>, logrando una correcta separación entre estadísticas individuales y agregadas.</w:t>
+      </w:r>
+    </w:p>
+    <w:p>
+      <w:pPr>
+        <w:numPr>
+          <w:ilvl w:val="0"/>
+          <w:numId w:val="9"/>
+        </w:numPr>
+      </w:pPr>
+      <w:r>
+        <w:t>Inicialmente habíamos asumido que los tiempos de espera y tránsito eran atributos del servidor. Esto resultó incorrecto y nos llevó a mover la subclase Idle, encargada del seguimiento de tiempo ocioso, como un atributo directamente vinculado a la clase Server, mejorando así la coherencia del modelo.</w:t>
+      </w:r>
+    </w:p>
+    <w:p>
+      <w:pPr>
+        <w:numPr>
+          <w:ilvl w:val="0"/>
+          <w:numId w:val="9"/>
+        </w:numPr>
+      </w:pPr>
+      <w:r>
+        <w:t xml:space="preserve">Para aplicar una mejora estructural sobre la asignación de servidores, nos basamos en una hipótesis: si al elegir qué servidor asignar se prioriza aquel que se desocupa primero, en lugar de seleccionar simplemente por ID, podríamos </w:t>
+      </w:r>
+      <w:r>
+        <w:lastRenderedPageBreak/>
+        <w:t xml:space="preserve">equilibrar la carga de trabajo. Para esto, introdujimos el atributo </w:t>
+      </w:r>
+      <m:oMath>
+        <m:r>
+          <w:rPr>
+            <w:rFonts w:ascii="Cambria Math" w:hAnsi="Cambria Math"/>
+          </w:rPr>
+          <m:t>departureClock</m:t>
+        </m:r>
+      </m:oMath>
+      <w:r>
+        <w:t xml:space="preserve"> en cada Server, lo que nos permitió comparar correctamente los tiempos de liberación. Los resultados posteriores confirmaron nuestra hipótesis, ya que se observó una reducción significativa —aproximadamente del 50%— en el tiempo medio de espera, junto con una equiparación notable en el uso (ocio) y desgaste (durabilidad) de todos los servidores.</w:t>
+      </w:r>
+    </w:p>
+    <w:p>
+      <w:pPr>
+        <w:numPr>
+          <w:ilvl w:val="0"/>
+          <w:numId w:val="9"/>
+        </w:numPr>
+      </w:pPr>
+      <w:r>
+        <w:t xml:space="preserve">Para calcular los intervalos de confianza de cada estadística, integramos programación funcional en Java (lambdas y </w:t>
+      </w:r>
+      <w:proofErr w:type="spellStart"/>
+      <w:r>
+        <w:t>streams</w:t>
+      </w:r>
+      <w:proofErr w:type="spellEnd"/>
+      <w:r>
+        <w:t xml:space="preserve">), lo que mejoró considerablemente la legibilidad, eficiencia y concisión del código. Esta mejora se extendió también a clases de etapas previas, como los </w:t>
+      </w:r>
+      <w:proofErr w:type="spellStart"/>
+      <w:r>
+        <w:t>Comparators</w:t>
+      </w:r>
+      <w:proofErr w:type="spellEnd"/>
+      <w:r>
+        <w:t>, donde aplicamos funciones lambda para simplificar la lógica de ordenamiento de eventos y selección de servidores.</w:t>
+      </w:r>
+    </w:p>
+    <w:p>
+      <w:r>
+        <w:pict w14:anchorId="0594FD9A">
+          <v:rect id="_x0000_i1222" style="width:0;height:1.5pt" o:hralign="center" o:hrstd="t" o:hr="t" fillcolor="#a0a0a0" stroked="f"/>
+        </w:pict>
+      </w:r>
+    </w:p>
+    <w:p>
+      <w:pPr>
+        <w:jc w:val="left"/>
+      </w:pPr>
+      <w:r>
+        <w:br w:type="page"/>
+      </w:r>
+    </w:p>
+    <w:bookmarkStart w:id="17" w:name="_Toc201229743" w:displacedByCustomXml="next"/>
+    <w:sdt>
+      <w:sdtPr>
+        <w:id w:val="-1025088066"/>
+        <w:docPartObj>
+          <w:docPartGallery w:val="Bibliographies"/>
+          <w:docPartUnique/>
+        </w:docPartObj>
+      </w:sdtPr>
+      <w:sdtEndPr>
+        <w:rPr>
+          <w:rFonts w:asciiTheme="minorHAnsi" w:eastAsiaTheme="minorHAnsi" w:hAnsiTheme="minorHAnsi" w:cstheme="minorBidi"/>
+          <w:b w:val="0"/>
+          <w:color w:val="auto"/>
+          <w:spacing w:val="0"/>
+          <w:sz w:val="24"/>
+          <w:szCs w:val="22"/>
+        </w:rPr>
+      </w:sdtEndPr>
+      <w:sdtContent>
+        <w:p>
+          <w:pPr>
+            <w:pStyle w:val="Title"/>
+          </w:pPr>
+          <w:r>
+            <w:t>Bibliografía</w:t>
+          </w:r>
+          <w:bookmarkEnd w:id="17"/>
+        </w:p>
+        <w:sdt>
+          <w:sdtPr>
+            <w:id w:val="111145805"/>
+            <w:bibliography/>
+          </w:sdtPr>
+          <w:sdtContent>
+            <w:p>
+              <w:pPr>
+                <w:rPr>
+                  <w:noProof/>
+                  <w:sz w:val="22"/>
+                </w:rPr>
+              </w:pPr>
+              <w:r>
+                <w:fldChar w:fldCharType="begin"/>
+              </w:r>
+              <w:r>
+                <w:instrText xml:space="preserve"> BIBLIOGRAPHY </w:instrText>
+              </w:r>
+              <w:r>
+                <w:fldChar w:fldCharType="separate"/>
+              </w:r>
+            </w:p>
+            <w:tbl>
+              <w:tblPr>
+                <w:tblW w:w="5000" w:type="pct"/>
+                <w:tblCellSpacing w:w="15" w:type="dxa"/>
+                <w:tblCellMar>
+                  <w:top w:w="15" w:type="dxa"/>
+                  <w:left w:w="15" w:type="dxa"/>
+                  <w:bottom w:w="15" w:type="dxa"/>
+                  <w:right w:w="15" w:type="dxa"/>
+                </w:tblCellMar>
+                <w:tblLook w:val="04A0" w:firstRow="1" w:lastRow="0" w:firstColumn="1" w:lastColumn="0" w:noHBand="0" w:noVBand="1"/>
+              </w:tblPr>
+              <w:tblGrid>
+                <w:gridCol w:w="345"/>
+                <w:gridCol w:w="8681"/>
+              </w:tblGrid>
+              <w:tr>
+                <w:trPr>
+                  <w:divId w:val="760612434"/>
+                  <w:tblCellSpacing w:w="15" w:type="dxa"/>
+                </w:trPr>
+                <w:tc>
+                  <w:tcPr>
+                    <w:tcW w:w="50" w:type="pct"/>
+                    <w:hideMark/>
+                  </w:tcPr>
+                  <w:p>
+                    <w:pPr>
+                      <w:pStyle w:val="Bibliography"/>
+                      <w:rPr>
+                        <w:noProof/>
+                        <w:szCs w:val="24"/>
+                      </w:rPr>
+                    </w:pPr>
+                    <w:r>
+                      <w:rPr>
+                        <w:noProof/>
+                      </w:rPr>
+                      <w:t xml:space="preserve">[1] </w:t>
+                    </w:r>
+                  </w:p>
+                </w:tc>
+                <w:tc>
+                  <w:tcPr>
+                    <w:tcW w:w="0" w:type="auto"/>
+                    <w:hideMark/>
+                  </w:tcPr>
+                  <w:p>
+                    <w:pPr>
+                      <w:pStyle w:val="Bibliography"/>
+                      <w:jc w:val="left"/>
+                      <w:rPr>
+                        <w:noProof/>
+                      </w:rPr>
+                    </w:pPr>
+                    <w:r>
+                      <w:rPr>
+                        <w:noProof/>
+                        <w:lang w:val="en-US"/>
+                      </w:rPr>
+                      <w:t xml:space="preserve">A. S. W. a. M. K. Samuel Oloruntoba, «SOLID Design Principles Explained: Building Better Software Architecture,» DigitalOcean, 11 Junio 2025. </w:t>
+                    </w:r>
+                    <w:r>
+                      <w:rPr>
+                        <w:noProof/>
+                      </w:rPr>
+                      <w:t>[En línea]. Available: https://www.digitalocean.com/community/conceptual-articles/s-o-l-i-d-the-first-five-principles-of-object-oriented-design. [Último acceso: Abril 2025].</w:t>
+                    </w:r>
+                  </w:p>
+                </w:tc>
+              </w:tr>
+              <w:tr>
+                <w:trPr>
+                  <w:divId w:val="760612434"/>
+                  <w:tblCellSpacing w:w="15" w:type="dxa"/>
+                </w:trPr>
+                <w:tc>
+                  <w:tcPr>
+                    <w:tcW w:w="50" w:type="pct"/>
+                    <w:hideMark/>
+                  </w:tcPr>
+                  <w:p>
+                    <w:pPr>
+                      <w:pStyle w:val="Bibliography"/>
+                      <w:rPr>
+                        <w:noProof/>
+                      </w:rPr>
+                    </w:pPr>
+                    <w:r>
+                      <w:rPr>
+                        <w:noProof/>
+                      </w:rPr>
+                      <w:t xml:space="preserve">[2] </w:t>
+                    </w:r>
+                  </w:p>
+                </w:tc>
+                <w:tc>
+                  <w:tcPr>
+                    <w:tcW w:w="0" w:type="auto"/>
+                    <w:hideMark/>
+                  </w:tcPr>
+                  <w:p>
+                    <w:pPr>
+                      <w:pStyle w:val="Bibliography"/>
+                      <w:jc w:val="left"/>
+                      <w:rPr>
+                        <w:noProof/>
+                      </w:rPr>
+                    </w:pPr>
+                    <w:r>
+                      <w:rPr>
+                        <w:noProof/>
+                        <w:lang w:val="en-US"/>
+                      </w:rPr>
+                      <w:t xml:space="preserve">GeeksforGeeks, «Software Design Patterns Tutorial,» 2 Junio 2025. </w:t>
+                    </w:r>
+                    <w:r>
+                      <w:rPr>
+                        <w:noProof/>
+                      </w:rPr>
+                      <w:t>[En línea]. Available: https://www.geeksforgeeks.org/system-design/software-design-patterns/. [Último acceso: Abril 2025].</w:t>
+                    </w:r>
+                  </w:p>
+                </w:tc>
+              </w:tr>
+              <w:tr>
+                <w:trPr>
+                  <w:divId w:val="760612434"/>
+                  <w:tblCellSpacing w:w="15" w:type="dxa"/>
+                </w:trPr>
+                <w:tc>
+                  <w:tcPr>
+                    <w:tcW w:w="50" w:type="pct"/>
+                    <w:hideMark/>
+                  </w:tcPr>
+                  <w:p>
+                    <w:pPr>
+                      <w:pStyle w:val="Bibliography"/>
+                      <w:rPr>
+                        <w:noProof/>
+                      </w:rPr>
+                    </w:pPr>
+                    <w:r>
+                      <w:rPr>
+                        <w:noProof/>
+                      </w:rPr>
+                      <w:t xml:space="preserve">[3] </w:t>
+                    </w:r>
+                  </w:p>
+                </w:tc>
+                <w:tc>
+                  <w:tcPr>
+                    <w:tcW w:w="0" w:type="auto"/>
+                    <w:hideMark/>
+                  </w:tcPr>
+                  <w:p>
+                    <w:pPr>
+                      <w:pStyle w:val="Bibliography"/>
+                      <w:jc w:val="left"/>
+                      <w:rPr>
+                        <w:noProof/>
+                      </w:rPr>
+                    </w:pPr>
+                    <w:r>
+                      <w:rPr>
+                        <w:noProof/>
+                        <w:lang w:val="en-US"/>
+                      </w:rPr>
+                      <w:t xml:space="preserve">K. Chandrakant, «Functional Programming in Java,» Baeldung, 26 Marzo 2025. </w:t>
+                    </w:r>
+                    <w:r>
+                      <w:rPr>
+                        <w:noProof/>
+                      </w:rPr>
+                      <w:t>[En línea]. Available: https://www.baeldung.com/java-functional-programming. [Último acceso: Abril 2025].</w:t>
+                    </w:r>
+                  </w:p>
+                </w:tc>
+              </w:tr>
+              <w:tr>
+                <w:trPr>
+                  <w:divId w:val="760612434"/>
+                  <w:tblCellSpacing w:w="15" w:type="dxa"/>
+                </w:trPr>
+                <w:tc>
+                  <w:tcPr>
+                    <w:tcW w:w="50" w:type="pct"/>
+                    <w:hideMark/>
+                  </w:tcPr>
+                  <w:p>
+                    <w:pPr>
+                      <w:pStyle w:val="Bibliography"/>
+                      <w:rPr>
+                        <w:noProof/>
+                      </w:rPr>
+                    </w:pPr>
+                    <w:r>
+                      <w:rPr>
+                        <w:noProof/>
+                      </w:rPr>
+                      <w:t xml:space="preserve">[4] </w:t>
+                    </w:r>
+                  </w:p>
+                </w:tc>
+                <w:tc>
+                  <w:tcPr>
+                    <w:tcW w:w="0" w:type="auto"/>
+                    <w:hideMark/>
+                  </w:tcPr>
+                  <w:p>
+                    <w:pPr>
+                      <w:pStyle w:val="Bibliography"/>
+                      <w:jc w:val="left"/>
+                      <w:rPr>
+                        <w:noProof/>
+                      </w:rPr>
+                    </w:pPr>
+                    <w:r>
+                      <w:rPr>
+                        <w:noProof/>
+                      </w:rPr>
+                      <w:t xml:space="preserve">Modelos y Simulación, Dpto. Informática, UNSL, Apuntes proveídos por la cátedra. </w:t>
+                    </w:r>
+                  </w:p>
+                </w:tc>
+              </w:tr>
+              <w:tr>
+                <w:trPr>
+                  <w:divId w:val="760612434"/>
+                  <w:tblCellSpacing w:w="15" w:type="dxa"/>
+                </w:trPr>
+                <w:tc>
+                  <w:tcPr>
+                    <w:tcW w:w="50" w:type="pct"/>
+                    <w:hideMark/>
+                  </w:tcPr>
+                  <w:p>
+                    <w:pPr>
+                      <w:pStyle w:val="Bibliography"/>
+                      <w:rPr>
+                        <w:noProof/>
+                      </w:rPr>
+                    </w:pPr>
+                    <w:r>
+                      <w:rPr>
+                        <w:noProof/>
+                      </w:rPr>
+                      <w:t xml:space="preserve">[5] </w:t>
+                    </w:r>
+                  </w:p>
+                </w:tc>
+                <w:tc>
+                  <w:tcPr>
+                    <w:tcW w:w="0" w:type="auto"/>
+                    <w:hideMark/>
+                  </w:tcPr>
+                  <w:p>
+                    <w:pPr>
+                      <w:pStyle w:val="Bibliography"/>
+                      <w:jc w:val="left"/>
+                      <w:rPr>
+                        <w:noProof/>
+                        <w:lang w:val="en-US"/>
+                      </w:rPr>
+                    </w:pPr>
+                    <w:r>
+                      <w:rPr>
+                        <w:noProof/>
+                        <w:lang w:val="en-US"/>
+                      </w:rPr>
+                      <w:t xml:space="preserve">J. C. B. L. N. D. N. Jerry Banks, Discrete-Event System Simulation, 1984. </w:t>
+                    </w:r>
+                  </w:p>
+                </w:tc>
+              </w:tr>
+            </w:tbl>
+            <w:p>
+              <w:pPr>
+                <w:divId w:val="760612434"/>
+                <w:rPr>
+                  <w:rFonts w:eastAsia="Times New Roman"/>
+                  <w:noProof/>
+                  <w:lang w:val="en-US"/>
+                </w:rPr>
+              </w:pPr>
+            </w:p>
+            <w:p>
+              <w:r>
+                <w:rPr>
+                  <w:b/>
+                  <w:bCs/>
+                  <w:noProof/>
+                </w:rPr>
+                <w:fldChar w:fldCharType="end"/>
+              </w:r>
+            </w:p>
+          </w:sdtContent>
+        </w:sdt>
+      </w:sdtContent>
+    </w:sdt>
     <w:p/>
     <w:sectPr>
-      <w:footerReference w:type="default" r:id="rId11"/>
+      <w:headerReference w:type="default" r:id="rId15"/>
+      <w:footerReference w:type="default" r:id="rId16"/>
       <w:pgSz w:w="11906" w:h="16838"/>
       <w:pgMar w:top="1440" w:right="1440" w:bottom="1440" w:left="1440" w:header="708" w:footer="708" w:gutter="0"/>
       <w:pgNumType w:start="0"/>
@@ -1322,130 +4266,73 @@
 <w:ftr xmlns:wpc="http://schemas.microsoft.com/office/word/2010/wordprocessingCanvas" xmlns:cx="http://schemas.microsoft.com/office/drawing/2014/chartex" xmlns:cx1="http://schemas.microsoft.com/office/drawing/2015/9/8/chartex" xmlns:cx2="http://schemas.microsoft.com/office/drawing/2015/10/21/chartex" xmlns:cx3="http://schemas.microsoft.com/office/drawing/2016/5/9/chartex" xmlns:cx4="http://schemas.microsoft.com/office/drawing/2016/5/10/chartex" xmlns:cx5="http://schemas.microsoft.com/office/drawing/2016/5/11/chartex" xmlns:cx6="http://schemas.microsoft.com/office/drawing/2016/5/12/chartex" xmlns:cx7="http://schemas.microsoft.com/office/drawing/2016/5/13/chartex" xmlns:cx8="http://schemas.microsoft.com/office/drawing/2016/5/14/chartex" xmlns:mc="http://schemas.openxmlformats.org/markup-compatibility/2006" xmlns:aink="http://schemas.microsoft.com/office/drawing/2016/ink" xmlns:am3d="http://schemas.microsoft.com/office/drawing/2017/model3d" xmlns:o="urn:schemas-microsoft-com:office:office" xmlns:oel="http://schemas.microsoft.com/office/2019/extlst" xmlns:r="http://schemas.openxmlformats.org/officeDocument/2006/relationships" xmlns:m="http://schemas.openxmlformats.org/officeDocument/2006/math" xmlns:v="urn:schemas-microsoft-com:vml" xmlns:wp14="http://schemas.microsoft.com/office/word/2010/wordprocessingDrawing" xmlns:wp="http://schemas.openxmlformats.org/drawingml/2006/wordprocessingDrawing" xmlns:w10="urn:schemas-microsoft-com:office:word" xmlns:w="http://schemas.openxmlformats.org/wordprocessingml/2006/main" xmlns:w14="http://schemas.microsoft.com/office/word/2010/wordml" xmlns:w15="http://schemas.microsoft.com/office/word/2012/wordml" xmlns:w16cex="http://schemas.microsoft.com/office/word/2018/wordml/cex" xmlns:w16cid="http://schemas.microsoft.com/office/word/2016/wordml/cid" xmlns:w16="http://schemas.microsoft.com/office/word/2018/wordml" xmlns:w16du="http://schemas.microsoft.com/office/word/2023/wordml/word16du" xmlns:w16sdtdh="http://schemas.microsoft.com/office/word/2020/wordml/sdtdatahash" xmlns:w16sdtfl="http://schemas.microsoft.com/office/word/2024/wordml/sdtformatlock" xmlns:w16se="http://schemas.microsoft.com/office/word/2015/wordml/symex" xmlns:wpg="http://schemas.microsoft.com/office/word/2010/wordprocessingGroup" xmlns:wpi="http://schemas.microsoft.com/office/word/2010/wordprocessingInk" xmlns:wne="http://schemas.microsoft.com/office/word/2006/wordml" xmlns:wps="http://schemas.microsoft.com/office/word/2010/wordprocessingShape" mc:Ignorable="w14 w15 w16se w16cid w16 w16cex w16sdtdh w16sdtfl w16du wp14">
   <w:p>
     <w:pPr>
-      <w:tabs>
-        <w:tab w:val="center" w:pos="4550"/>
-        <w:tab w:val="left" w:pos="5818"/>
-      </w:tabs>
-      <w:ind w:right="260"/>
-      <w:jc w:val="right"/>
-      <w:rPr>
-        <w:color w:val="192D3A" w:themeColor="text2" w:themeShade="80"/>
-        <w:sz w:val="24"/>
-        <w:szCs w:val="24"/>
+      <w:pStyle w:val="Footer"/>
+      <w:pBdr>
+        <w:top w:val="single" w:sz="4" w:space="8" w:color="1CADE4" w:themeColor="accent1"/>
+      </w:pBdr>
+      <w:spacing w:before="360"/>
+      <w:contextualSpacing/>
+      <w:rPr>
+        <w:noProof/>
+        <w:color w:val="404040" w:themeColor="text1" w:themeTint="BF"/>
       </w:rPr>
     </w:pPr>
     <w:r>
       <w:rPr>
-        <w:color w:val="6FA0C0" w:themeColor="text2" w:themeTint="99"/>
-        <w:spacing w:val="60"/>
-        <w:sz w:val="24"/>
-        <w:szCs w:val="24"/>
-      </w:rPr>
-      <w:t>Page</w:t>
+        <w:noProof/>
+        <w:color w:val="404040" w:themeColor="text1" w:themeTint="BF"/>
+      </w:rPr>
+      <w:t>Facundo N. Farias L. y Juan Cruz Paez</w:t>
     </w:r>
     <w:r>
       <w:rPr>
-        <w:color w:val="6FA0C0" w:themeColor="text2" w:themeTint="99"/>
-        <w:sz w:val="24"/>
-        <w:szCs w:val="24"/>
-      </w:rPr>
-      <w:t xml:space="preserve"> </w:t>
+        <w:noProof/>
+        <w:color w:val="404040" w:themeColor="text1" w:themeTint="BF"/>
+      </w:rPr>
+      <w:tab/>
     </w:r>
     <w:r>
       <w:rPr>
-        <w:color w:val="264356" w:themeColor="text2" w:themeShade="BF"/>
-        <w:sz w:val="24"/>
-        <w:szCs w:val="24"/>
+        <w:noProof/>
+        <w:color w:val="404040" w:themeColor="text1" w:themeTint="BF"/>
+      </w:rPr>
+      <w:tab/>
+    </w:r>
+    <w:r>
+      <w:rPr>
+        <w:noProof/>
+        <w:color w:val="404040" w:themeColor="text1" w:themeTint="BF"/>
       </w:rPr>
       <w:fldChar w:fldCharType="begin"/>
     </w:r>
     <w:r>
       <w:rPr>
-        <w:color w:val="264356" w:themeColor="text2" w:themeShade="BF"/>
-        <w:sz w:val="24"/>
-        <w:szCs w:val="24"/>
+        <w:noProof/>
+        <w:color w:val="404040" w:themeColor="text1" w:themeTint="BF"/>
       </w:rPr>
       <w:instrText xml:space="preserve"> PAGE   \* MERGEFORMAT </w:instrText>
     </w:r>
     <w:r>
       <w:rPr>
-        <w:color w:val="264356" w:themeColor="text2" w:themeShade="BF"/>
-        <w:sz w:val="24"/>
-        <w:szCs w:val="24"/>
+        <w:noProof/>
+        <w:color w:val="404040" w:themeColor="text1" w:themeTint="BF"/>
       </w:rPr>
       <w:fldChar w:fldCharType="separate"/>
     </w:r>
     <w:r>
       <w:rPr>
         <w:noProof/>
-        <w:color w:val="264356" w:themeColor="text2" w:themeShade="BF"/>
-        <w:sz w:val="24"/>
-        <w:szCs w:val="24"/>
-      </w:rPr>
-      <w:t>1</w:t>
+        <w:color w:val="404040" w:themeColor="text1" w:themeTint="BF"/>
+      </w:rPr>
+      <w:t>2</w:t>
     </w:r>
     <w:r>
       <w:rPr>
-        <w:color w:val="264356" w:themeColor="text2" w:themeShade="BF"/>
-        <w:sz w:val="24"/>
-        <w:szCs w:val="24"/>
+        <w:noProof/>
+        <w:color w:val="404040" w:themeColor="text1" w:themeTint="BF"/>
       </w:rPr>
       <w:fldChar w:fldCharType="end"/>
     </w:r>
-    <w:r>
-      <w:rPr>
-        <w:color w:val="264356" w:themeColor="text2" w:themeShade="BF"/>
-        <w:sz w:val="24"/>
-        <w:szCs w:val="24"/>
-      </w:rPr>
-      <w:t xml:space="preserve"> | </w:t>
-    </w:r>
-    <w:r>
-      <w:rPr>
-        <w:color w:val="264356" w:themeColor="text2" w:themeShade="BF"/>
-        <w:sz w:val="24"/>
-        <w:szCs w:val="24"/>
-      </w:rPr>
-      <w:fldChar w:fldCharType="begin"/>
-    </w:r>
-    <w:r>
-      <w:rPr>
-        <w:color w:val="264356" w:themeColor="text2" w:themeShade="BF"/>
-        <w:sz w:val="24"/>
-        <w:szCs w:val="24"/>
-      </w:rPr>
-      <w:instrText xml:space="preserve"> NUMPAGES  \* Arabic  \* MERGEFORMAT </w:instrText>
-    </w:r>
-    <w:r>
-      <w:rPr>
-        <w:color w:val="264356" w:themeColor="text2" w:themeShade="BF"/>
-        <w:sz w:val="24"/>
-        <w:szCs w:val="24"/>
-      </w:rPr>
-      <w:fldChar w:fldCharType="separate"/>
-    </w:r>
-    <w:r>
-      <w:rPr>
-        <w:noProof/>
-        <w:color w:val="264356" w:themeColor="text2" w:themeShade="BF"/>
-        <w:sz w:val="24"/>
-        <w:szCs w:val="24"/>
-      </w:rPr>
-      <w:t>1</w:t>
-    </w:r>
-    <w:r>
-      <w:rPr>
-        <w:color w:val="264356" w:themeColor="text2" w:themeShade="BF"/>
-        <w:sz w:val="24"/>
-        <w:szCs w:val="24"/>
-      </w:rPr>
-      <w:fldChar w:fldCharType="end"/>
-    </w:r>
-  </w:p>
-  <w:p>
-    <w:pPr>
-      <w:pStyle w:val="Footer"/>
-    </w:pPr>
   </w:p>
 </w:ftr>
 </file>
@@ -1473,6 +4360,49 @@
     </w:p>
   </w:footnote>
 </w:footnotes>
+</file>
+
+<file path=word/header1.xml><?xml version="1.0" encoding="utf-8"?>
+<w:hdr xmlns:wpc="http://schemas.microsoft.com/office/word/2010/wordprocessingCanvas" xmlns:cx="http://schemas.microsoft.com/office/drawing/2014/chartex" xmlns:cx1="http://schemas.microsoft.com/office/drawing/2015/9/8/chartex" xmlns:cx2="http://schemas.microsoft.com/office/drawing/2015/10/21/chartex" xmlns:cx3="http://schemas.microsoft.com/office/drawing/2016/5/9/chartex" xmlns:cx4="http://schemas.microsoft.com/office/drawing/2016/5/10/chartex" xmlns:cx5="http://schemas.microsoft.com/office/drawing/2016/5/11/chartex" xmlns:cx6="http://schemas.microsoft.com/office/drawing/2016/5/12/chartex" xmlns:cx7="http://schemas.microsoft.com/office/drawing/2016/5/13/chartex" xmlns:cx8="http://schemas.microsoft.com/office/drawing/2016/5/14/chartex" xmlns:mc="http://schemas.openxmlformats.org/markup-compatibility/2006" xmlns:aink="http://schemas.microsoft.com/office/drawing/2016/ink" xmlns:am3d="http://schemas.microsoft.com/office/drawing/2017/model3d" xmlns:o="urn:schemas-microsoft-com:office:office" xmlns:oel="http://schemas.microsoft.com/office/2019/extlst" xmlns:r="http://schemas.openxmlformats.org/officeDocument/2006/relationships" xmlns:m="http://schemas.openxmlformats.org/officeDocument/2006/math" xmlns:v="urn:schemas-microsoft-com:vml" xmlns:wp14="http://schemas.microsoft.com/office/word/2010/wordprocessingDrawing" xmlns:wp="http://schemas.openxmlformats.org/drawingml/2006/wordprocessingDrawing" xmlns:w10="urn:schemas-microsoft-com:office:word" xmlns:w="http://schemas.openxmlformats.org/wordprocessingml/2006/main" xmlns:w14="http://schemas.microsoft.com/office/word/2010/wordml" xmlns:w15="http://schemas.microsoft.com/office/word/2012/wordml" xmlns:w16cex="http://schemas.microsoft.com/office/word/2018/wordml/cex" xmlns:w16cid="http://schemas.microsoft.com/office/word/2016/wordml/cid" xmlns:w16="http://schemas.microsoft.com/office/word/2018/wordml" xmlns:w16du="http://schemas.microsoft.com/office/word/2023/wordml/word16du" xmlns:w16sdtdh="http://schemas.microsoft.com/office/word/2020/wordml/sdtdatahash" xmlns:w16sdtfl="http://schemas.microsoft.com/office/word/2024/wordml/sdtformatlock" xmlns:w16se="http://schemas.microsoft.com/office/word/2015/wordml/symex" xmlns:wpg="http://schemas.microsoft.com/office/word/2010/wordprocessingGroup" xmlns:wpi="http://schemas.microsoft.com/office/word/2010/wordprocessingInk" xmlns:wne="http://schemas.microsoft.com/office/word/2006/wordml" xmlns:wps="http://schemas.microsoft.com/office/word/2010/wordprocessingShape" mc:Ignorable="w14 w15 w16se w16cid w16 w16cex w16sdtdh w16sdtfl w16du wp14">
+  <w:p>
+    <w:pPr>
+      <w:pStyle w:val="Header"/>
+      <w:pBdr>
+        <w:bottom w:val="single" w:sz="4" w:space="8" w:color="1CADE4" w:themeColor="accent1"/>
+      </w:pBdr>
+      <w:spacing w:after="360"/>
+      <w:contextualSpacing/>
+      <w:rPr>
+        <w:color w:val="404040" w:themeColor="text1" w:themeTint="BF"/>
+      </w:rPr>
+    </w:pPr>
+    <w:r>
+      <w:rPr>
+        <w:color w:val="404040" w:themeColor="text1" w:themeTint="BF"/>
+      </w:rPr>
+      <w:t>Proyecto Laboratorio</w:t>
+    </w:r>
+    <w:r>
+      <w:rPr>
+        <w:color w:val="404040" w:themeColor="text1" w:themeTint="BF"/>
+      </w:rPr>
+      <w:tab/>
+      <w:t>Ing. Informática</w:t>
+    </w:r>
+    <w:r>
+      <w:rPr>
+        <w:color w:val="404040" w:themeColor="text1" w:themeTint="BF"/>
+      </w:rPr>
+      <w:tab/>
+      <w:t>Modelos y Simulación - 2025</w:t>
+    </w:r>
+  </w:p>
+  <w:p>
+    <w:pPr>
+      <w:pStyle w:val="Header"/>
+    </w:pPr>
+  </w:p>
+</w:hdr>
 </file>
 
 <file path=word/numbering.xml><?xml version="1.0" encoding="utf-8"?>
@@ -1869,9 +4799,122 @@
     </w:lvl>
   </w:abstractNum>
   <w:abstractNum w:abstractNumId="3" w15:restartNumberingAfterBreak="0">
+    <w:nsid w:val="311C29DA"/>
+    <w:multiLevelType w:val="multilevel"/>
+    <w:tmpl w:val="B2CCC4FE"/>
+    <w:lvl w:ilvl="0">
+      <w:start w:val="1"/>
+      <w:numFmt w:val="decimal"/>
+      <w:lvlText w:val="%1."/>
+      <w:lvlJc w:val="left"/>
+      <w:pPr>
+        <w:tabs>
+          <w:tab w:val="num" w:pos="720"/>
+        </w:tabs>
+        <w:ind w:left="720" w:hanging="360"/>
+      </w:pPr>
+    </w:lvl>
+    <w:lvl w:ilvl="1" w:tentative="1">
+      <w:start w:val="1"/>
+      <w:numFmt w:val="decimal"/>
+      <w:lvlText w:val="%2."/>
+      <w:lvlJc w:val="left"/>
+      <w:pPr>
+        <w:tabs>
+          <w:tab w:val="num" w:pos="1440"/>
+        </w:tabs>
+        <w:ind w:left="1440" w:hanging="360"/>
+      </w:pPr>
+    </w:lvl>
+    <w:lvl w:ilvl="2" w:tentative="1">
+      <w:start w:val="1"/>
+      <w:numFmt w:val="decimal"/>
+      <w:lvlText w:val="%3."/>
+      <w:lvlJc w:val="left"/>
+      <w:pPr>
+        <w:tabs>
+          <w:tab w:val="num" w:pos="2160"/>
+        </w:tabs>
+        <w:ind w:left="2160" w:hanging="360"/>
+      </w:pPr>
+    </w:lvl>
+    <w:lvl w:ilvl="3" w:tentative="1">
+      <w:start w:val="1"/>
+      <w:numFmt w:val="decimal"/>
+      <w:lvlText w:val="%4."/>
+      <w:lvlJc w:val="left"/>
+      <w:pPr>
+        <w:tabs>
+          <w:tab w:val="num" w:pos="2880"/>
+        </w:tabs>
+        <w:ind w:left="2880" w:hanging="360"/>
+      </w:pPr>
+    </w:lvl>
+    <w:lvl w:ilvl="4" w:tentative="1">
+      <w:start w:val="1"/>
+      <w:numFmt w:val="decimal"/>
+      <w:lvlText w:val="%5."/>
+      <w:lvlJc w:val="left"/>
+      <w:pPr>
+        <w:tabs>
+          <w:tab w:val="num" w:pos="3600"/>
+        </w:tabs>
+        <w:ind w:left="3600" w:hanging="360"/>
+      </w:pPr>
+    </w:lvl>
+    <w:lvl w:ilvl="5" w:tentative="1">
+      <w:start w:val="1"/>
+      <w:numFmt w:val="decimal"/>
+      <w:lvlText w:val="%6."/>
+      <w:lvlJc w:val="left"/>
+      <w:pPr>
+        <w:tabs>
+          <w:tab w:val="num" w:pos="4320"/>
+        </w:tabs>
+        <w:ind w:left="4320" w:hanging="360"/>
+      </w:pPr>
+    </w:lvl>
+    <w:lvl w:ilvl="6" w:tentative="1">
+      <w:start w:val="1"/>
+      <w:numFmt w:val="decimal"/>
+      <w:lvlText w:val="%7."/>
+      <w:lvlJc w:val="left"/>
+      <w:pPr>
+        <w:tabs>
+          <w:tab w:val="num" w:pos="5040"/>
+        </w:tabs>
+        <w:ind w:left="5040" w:hanging="360"/>
+      </w:pPr>
+    </w:lvl>
+    <w:lvl w:ilvl="7" w:tentative="1">
+      <w:start w:val="1"/>
+      <w:numFmt w:val="decimal"/>
+      <w:lvlText w:val="%8."/>
+      <w:lvlJc w:val="left"/>
+      <w:pPr>
+        <w:tabs>
+          <w:tab w:val="num" w:pos="5760"/>
+        </w:tabs>
+        <w:ind w:left="5760" w:hanging="360"/>
+      </w:pPr>
+    </w:lvl>
+    <w:lvl w:ilvl="8" w:tentative="1">
+      <w:start w:val="1"/>
+      <w:numFmt w:val="decimal"/>
+      <w:lvlText w:val="%9."/>
+      <w:lvlJc w:val="left"/>
+      <w:pPr>
+        <w:tabs>
+          <w:tab w:val="num" w:pos="6480"/>
+        </w:tabs>
+        <w:ind w:left="6480" w:hanging="360"/>
+      </w:pPr>
+    </w:lvl>
+  </w:abstractNum>
+  <w:abstractNum w:abstractNumId="4" w15:restartNumberingAfterBreak="0">
     <w:nsid w:val="4B096D18"/>
     <w:multiLevelType w:val="multilevel"/>
-    <w:tmpl w:val="2EF02C52"/>
+    <w:tmpl w:val="BA587BB2"/>
     <w:lvl w:ilvl="0">
       <w:start w:val="1"/>
       <w:numFmt w:val="bullet"/>
@@ -1885,8 +4928,8 @@
       </w:pPr>
       <w:rPr>
         <w:rFonts w:ascii="Symbol" w:hAnsi="Symbol" w:hint="default"/>
-        <w:sz w:val="26"/>
-        <w:szCs w:val="26"/>
+        <w:sz w:val="20"/>
+        <w:szCs w:val="20"/>
       </w:rPr>
     </w:lvl>
     <w:lvl w:ilvl="1" w:tentative="1">
@@ -2018,10 +5061,159 @@
       </w:rPr>
     </w:lvl>
   </w:abstractNum>
-  <w:abstractNum w:abstractNumId="4" w15:restartNumberingAfterBreak="0">
+  <w:abstractNum w:abstractNumId="5" w15:restartNumberingAfterBreak="0">
+    <w:nsid w:val="4D836F64"/>
+    <w:multiLevelType w:val="multilevel"/>
+    <w:tmpl w:val="500C2D48"/>
+    <w:lvl w:ilvl="0">
+      <w:start w:val="1"/>
+      <w:numFmt w:val="bullet"/>
+      <w:lvlText w:val=""/>
+      <w:lvlJc w:val="left"/>
+      <w:pPr>
+        <w:tabs>
+          <w:tab w:val="num" w:pos="720"/>
+        </w:tabs>
+        <w:ind w:left="720" w:hanging="360"/>
+      </w:pPr>
+      <w:rPr>
+        <w:rFonts w:ascii="Symbol" w:hAnsi="Symbol" w:hint="default"/>
+        <w:sz w:val="20"/>
+      </w:rPr>
+    </w:lvl>
+    <w:lvl w:ilvl="1" w:tentative="1">
+      <w:start w:val="1"/>
+      <w:numFmt w:val="bullet"/>
+      <w:lvlText w:val="o"/>
+      <w:lvlJc w:val="left"/>
+      <w:pPr>
+        <w:tabs>
+          <w:tab w:val="num" w:pos="1440"/>
+        </w:tabs>
+        <w:ind w:left="1440" w:hanging="360"/>
+      </w:pPr>
+      <w:rPr>
+        <w:rFonts w:ascii="Courier New" w:hAnsi="Courier New" w:hint="default"/>
+        <w:sz w:val="20"/>
+      </w:rPr>
+    </w:lvl>
+    <w:lvl w:ilvl="2" w:tentative="1">
+      <w:start w:val="1"/>
+      <w:numFmt w:val="bullet"/>
+      <w:lvlText w:val=""/>
+      <w:lvlJc w:val="left"/>
+      <w:pPr>
+        <w:tabs>
+          <w:tab w:val="num" w:pos="2160"/>
+        </w:tabs>
+        <w:ind w:left="2160" w:hanging="360"/>
+      </w:pPr>
+      <w:rPr>
+        <w:rFonts w:ascii="Wingdings" w:hAnsi="Wingdings" w:hint="default"/>
+        <w:sz w:val="20"/>
+      </w:rPr>
+    </w:lvl>
+    <w:lvl w:ilvl="3" w:tentative="1">
+      <w:start w:val="1"/>
+      <w:numFmt w:val="bullet"/>
+      <w:lvlText w:val=""/>
+      <w:lvlJc w:val="left"/>
+      <w:pPr>
+        <w:tabs>
+          <w:tab w:val="num" w:pos="2880"/>
+        </w:tabs>
+        <w:ind w:left="2880" w:hanging="360"/>
+      </w:pPr>
+      <w:rPr>
+        <w:rFonts w:ascii="Wingdings" w:hAnsi="Wingdings" w:hint="default"/>
+        <w:sz w:val="20"/>
+      </w:rPr>
+    </w:lvl>
+    <w:lvl w:ilvl="4" w:tentative="1">
+      <w:start w:val="1"/>
+      <w:numFmt w:val="bullet"/>
+      <w:lvlText w:val=""/>
+      <w:lvlJc w:val="left"/>
+      <w:pPr>
+        <w:tabs>
+          <w:tab w:val="num" w:pos="3600"/>
+        </w:tabs>
+        <w:ind w:left="3600" w:hanging="360"/>
+      </w:pPr>
+      <w:rPr>
+        <w:rFonts w:ascii="Wingdings" w:hAnsi="Wingdings" w:hint="default"/>
+        <w:sz w:val="20"/>
+      </w:rPr>
+    </w:lvl>
+    <w:lvl w:ilvl="5" w:tentative="1">
+      <w:start w:val="1"/>
+      <w:numFmt w:val="bullet"/>
+      <w:lvlText w:val=""/>
+      <w:lvlJc w:val="left"/>
+      <w:pPr>
+        <w:tabs>
+          <w:tab w:val="num" w:pos="4320"/>
+        </w:tabs>
+        <w:ind w:left="4320" w:hanging="360"/>
+      </w:pPr>
+      <w:rPr>
+        <w:rFonts w:ascii="Wingdings" w:hAnsi="Wingdings" w:hint="default"/>
+        <w:sz w:val="20"/>
+      </w:rPr>
+    </w:lvl>
+    <w:lvl w:ilvl="6" w:tentative="1">
+      <w:start w:val="1"/>
+      <w:numFmt w:val="bullet"/>
+      <w:lvlText w:val=""/>
+      <w:lvlJc w:val="left"/>
+      <w:pPr>
+        <w:tabs>
+          <w:tab w:val="num" w:pos="5040"/>
+        </w:tabs>
+        <w:ind w:left="5040" w:hanging="360"/>
+      </w:pPr>
+      <w:rPr>
+        <w:rFonts w:ascii="Wingdings" w:hAnsi="Wingdings" w:hint="default"/>
+        <w:sz w:val="20"/>
+      </w:rPr>
+    </w:lvl>
+    <w:lvl w:ilvl="7" w:tentative="1">
+      <w:start w:val="1"/>
+      <w:numFmt w:val="bullet"/>
+      <w:lvlText w:val=""/>
+      <w:lvlJc w:val="left"/>
+      <w:pPr>
+        <w:tabs>
+          <w:tab w:val="num" w:pos="5760"/>
+        </w:tabs>
+        <w:ind w:left="5760" w:hanging="360"/>
+      </w:pPr>
+      <w:rPr>
+        <w:rFonts w:ascii="Wingdings" w:hAnsi="Wingdings" w:hint="default"/>
+        <w:sz w:val="20"/>
+      </w:rPr>
+    </w:lvl>
+    <w:lvl w:ilvl="8" w:tentative="1">
+      <w:start w:val="1"/>
+      <w:numFmt w:val="bullet"/>
+      <w:lvlText w:val=""/>
+      <w:lvlJc w:val="left"/>
+      <w:pPr>
+        <w:tabs>
+          <w:tab w:val="num" w:pos="6480"/>
+        </w:tabs>
+        <w:ind w:left="6480" w:hanging="360"/>
+      </w:pPr>
+      <w:rPr>
+        <w:rFonts w:ascii="Wingdings" w:hAnsi="Wingdings" w:hint="default"/>
+        <w:sz w:val="20"/>
+      </w:rPr>
+    </w:lvl>
+  </w:abstractNum>
+  <w:abstractNum w:abstractNumId="6" w15:restartNumberingAfterBreak="0">
     <w:nsid w:val="4EEB619D"/>
     <w:multiLevelType w:val="multilevel"/>
-    <w:tmpl w:val="CC567FE6"/>
+    <w:tmpl w:val="1F28BA06"/>
     <w:lvl w:ilvl="0">
       <w:start w:val="1"/>
       <w:numFmt w:val="bullet"/>
@@ -2035,8 +5227,8 @@
       </w:pPr>
       <w:rPr>
         <w:rFonts w:ascii="Symbol" w:hAnsi="Symbol" w:hint="default"/>
-        <w:sz w:val="26"/>
-        <w:szCs w:val="26"/>
+        <w:sz w:val="20"/>
+        <w:szCs w:val="20"/>
       </w:rPr>
     </w:lvl>
     <w:lvl w:ilvl="1" w:tentative="1">
@@ -2168,7 +5360,156 @@
       </w:rPr>
     </w:lvl>
   </w:abstractNum>
-  <w:abstractNum w:abstractNumId="5" w15:restartNumberingAfterBreak="0">
+  <w:abstractNum w:abstractNumId="7" w15:restartNumberingAfterBreak="0">
+    <w:nsid w:val="559911F5"/>
+    <w:multiLevelType w:val="multilevel"/>
+    <w:tmpl w:val="2F229F9E"/>
+    <w:lvl w:ilvl="0">
+      <w:start w:val="1"/>
+      <w:numFmt w:val="bullet"/>
+      <w:lvlText w:val=""/>
+      <w:lvlJc w:val="left"/>
+      <w:pPr>
+        <w:tabs>
+          <w:tab w:val="num" w:pos="720"/>
+        </w:tabs>
+        <w:ind w:left="720" w:hanging="360"/>
+      </w:pPr>
+      <w:rPr>
+        <w:rFonts w:ascii="Symbol" w:hAnsi="Symbol" w:hint="default"/>
+        <w:sz w:val="20"/>
+      </w:rPr>
+    </w:lvl>
+    <w:lvl w:ilvl="1" w:tentative="1">
+      <w:start w:val="1"/>
+      <w:numFmt w:val="bullet"/>
+      <w:lvlText w:val="o"/>
+      <w:lvlJc w:val="left"/>
+      <w:pPr>
+        <w:tabs>
+          <w:tab w:val="num" w:pos="1440"/>
+        </w:tabs>
+        <w:ind w:left="1440" w:hanging="360"/>
+      </w:pPr>
+      <w:rPr>
+        <w:rFonts w:ascii="Courier New" w:hAnsi="Courier New" w:hint="default"/>
+        <w:sz w:val="20"/>
+      </w:rPr>
+    </w:lvl>
+    <w:lvl w:ilvl="2" w:tentative="1">
+      <w:start w:val="1"/>
+      <w:numFmt w:val="bullet"/>
+      <w:lvlText w:val=""/>
+      <w:lvlJc w:val="left"/>
+      <w:pPr>
+        <w:tabs>
+          <w:tab w:val="num" w:pos="2160"/>
+        </w:tabs>
+        <w:ind w:left="2160" w:hanging="360"/>
+      </w:pPr>
+      <w:rPr>
+        <w:rFonts w:ascii="Wingdings" w:hAnsi="Wingdings" w:hint="default"/>
+        <w:sz w:val="20"/>
+      </w:rPr>
+    </w:lvl>
+    <w:lvl w:ilvl="3" w:tentative="1">
+      <w:start w:val="1"/>
+      <w:numFmt w:val="bullet"/>
+      <w:lvlText w:val=""/>
+      <w:lvlJc w:val="left"/>
+      <w:pPr>
+        <w:tabs>
+          <w:tab w:val="num" w:pos="2880"/>
+        </w:tabs>
+        <w:ind w:left="2880" w:hanging="360"/>
+      </w:pPr>
+      <w:rPr>
+        <w:rFonts w:ascii="Wingdings" w:hAnsi="Wingdings" w:hint="default"/>
+        <w:sz w:val="20"/>
+      </w:rPr>
+    </w:lvl>
+    <w:lvl w:ilvl="4" w:tentative="1">
+      <w:start w:val="1"/>
+      <w:numFmt w:val="bullet"/>
+      <w:lvlText w:val=""/>
+      <w:lvlJc w:val="left"/>
+      <w:pPr>
+        <w:tabs>
+          <w:tab w:val="num" w:pos="3600"/>
+        </w:tabs>
+        <w:ind w:left="3600" w:hanging="360"/>
+      </w:pPr>
+      <w:rPr>
+        <w:rFonts w:ascii="Wingdings" w:hAnsi="Wingdings" w:hint="default"/>
+        <w:sz w:val="20"/>
+      </w:rPr>
+    </w:lvl>
+    <w:lvl w:ilvl="5" w:tentative="1">
+      <w:start w:val="1"/>
+      <w:numFmt w:val="bullet"/>
+      <w:lvlText w:val=""/>
+      <w:lvlJc w:val="left"/>
+      <w:pPr>
+        <w:tabs>
+          <w:tab w:val="num" w:pos="4320"/>
+        </w:tabs>
+        <w:ind w:left="4320" w:hanging="360"/>
+      </w:pPr>
+      <w:rPr>
+        <w:rFonts w:ascii="Wingdings" w:hAnsi="Wingdings" w:hint="default"/>
+        <w:sz w:val="20"/>
+      </w:rPr>
+    </w:lvl>
+    <w:lvl w:ilvl="6" w:tentative="1">
+      <w:start w:val="1"/>
+      <w:numFmt w:val="bullet"/>
+      <w:lvlText w:val=""/>
+      <w:lvlJc w:val="left"/>
+      <w:pPr>
+        <w:tabs>
+          <w:tab w:val="num" w:pos="5040"/>
+        </w:tabs>
+        <w:ind w:left="5040" w:hanging="360"/>
+      </w:pPr>
+      <w:rPr>
+        <w:rFonts w:ascii="Wingdings" w:hAnsi="Wingdings" w:hint="default"/>
+        <w:sz w:val="20"/>
+      </w:rPr>
+    </w:lvl>
+    <w:lvl w:ilvl="7" w:tentative="1">
+      <w:start w:val="1"/>
+      <w:numFmt w:val="bullet"/>
+      <w:lvlText w:val=""/>
+      <w:lvlJc w:val="left"/>
+      <w:pPr>
+        <w:tabs>
+          <w:tab w:val="num" w:pos="5760"/>
+        </w:tabs>
+        <w:ind w:left="5760" w:hanging="360"/>
+      </w:pPr>
+      <w:rPr>
+        <w:rFonts w:ascii="Wingdings" w:hAnsi="Wingdings" w:hint="default"/>
+        <w:sz w:val="20"/>
+      </w:rPr>
+    </w:lvl>
+    <w:lvl w:ilvl="8" w:tentative="1">
+      <w:start w:val="1"/>
+      <w:numFmt w:val="bullet"/>
+      <w:lvlText w:val=""/>
+      <w:lvlJc w:val="left"/>
+      <w:pPr>
+        <w:tabs>
+          <w:tab w:val="num" w:pos="6480"/>
+        </w:tabs>
+        <w:ind w:left="6480" w:hanging="360"/>
+      </w:pPr>
+      <w:rPr>
+        <w:rFonts w:ascii="Wingdings" w:hAnsi="Wingdings" w:hint="default"/>
+        <w:sz w:val="20"/>
+      </w:rPr>
+    </w:lvl>
+  </w:abstractNum>
+  <w:abstractNum w:abstractNumId="8" w15:restartNumberingAfterBreak="0">
     <w:nsid w:val="63132EC2"/>
     <w:multiLevelType w:val="multilevel"/>
     <w:tmpl w:val="09183478"/>
@@ -2317,10 +5658,10 @@
       </w:rPr>
     </w:lvl>
   </w:abstractNum>
-  <w:abstractNum w:abstractNumId="6" w15:restartNumberingAfterBreak="0">
+  <w:abstractNum w:abstractNumId="9" w15:restartNumberingAfterBreak="0">
     <w:nsid w:val="70316450"/>
     <w:multiLevelType w:val="multilevel"/>
-    <w:tmpl w:val="4C5E4664"/>
+    <w:tmpl w:val="527E0A22"/>
     <w:lvl w:ilvl="0">
       <w:start w:val="1"/>
       <w:numFmt w:val="bullet"/>
@@ -2334,8 +5675,157 @@
       </w:pPr>
       <w:rPr>
         <w:rFonts w:ascii="Symbol" w:hAnsi="Symbol" w:hint="default"/>
-        <w:sz w:val="26"/>
-        <w:szCs w:val="26"/>
+        <w:sz w:val="20"/>
+        <w:szCs w:val="20"/>
+      </w:rPr>
+    </w:lvl>
+    <w:lvl w:ilvl="1" w:tentative="1">
+      <w:start w:val="1"/>
+      <w:numFmt w:val="bullet"/>
+      <w:lvlText w:val="o"/>
+      <w:lvlJc w:val="left"/>
+      <w:pPr>
+        <w:tabs>
+          <w:tab w:val="num" w:pos="1440"/>
+        </w:tabs>
+        <w:ind w:left="1440" w:hanging="360"/>
+      </w:pPr>
+      <w:rPr>
+        <w:rFonts w:ascii="Courier New" w:hAnsi="Courier New" w:hint="default"/>
+        <w:sz w:val="20"/>
+      </w:rPr>
+    </w:lvl>
+    <w:lvl w:ilvl="2" w:tentative="1">
+      <w:start w:val="1"/>
+      <w:numFmt w:val="bullet"/>
+      <w:lvlText w:val=""/>
+      <w:lvlJc w:val="left"/>
+      <w:pPr>
+        <w:tabs>
+          <w:tab w:val="num" w:pos="2160"/>
+        </w:tabs>
+        <w:ind w:left="2160" w:hanging="360"/>
+      </w:pPr>
+      <w:rPr>
+        <w:rFonts w:ascii="Wingdings" w:hAnsi="Wingdings" w:hint="default"/>
+        <w:sz w:val="20"/>
+      </w:rPr>
+    </w:lvl>
+    <w:lvl w:ilvl="3" w:tentative="1">
+      <w:start w:val="1"/>
+      <w:numFmt w:val="bullet"/>
+      <w:lvlText w:val=""/>
+      <w:lvlJc w:val="left"/>
+      <w:pPr>
+        <w:tabs>
+          <w:tab w:val="num" w:pos="2880"/>
+        </w:tabs>
+        <w:ind w:left="2880" w:hanging="360"/>
+      </w:pPr>
+      <w:rPr>
+        <w:rFonts w:ascii="Wingdings" w:hAnsi="Wingdings" w:hint="default"/>
+        <w:sz w:val="20"/>
+      </w:rPr>
+    </w:lvl>
+    <w:lvl w:ilvl="4" w:tentative="1">
+      <w:start w:val="1"/>
+      <w:numFmt w:val="bullet"/>
+      <w:lvlText w:val=""/>
+      <w:lvlJc w:val="left"/>
+      <w:pPr>
+        <w:tabs>
+          <w:tab w:val="num" w:pos="3600"/>
+        </w:tabs>
+        <w:ind w:left="3600" w:hanging="360"/>
+      </w:pPr>
+      <w:rPr>
+        <w:rFonts w:ascii="Wingdings" w:hAnsi="Wingdings" w:hint="default"/>
+        <w:sz w:val="20"/>
+      </w:rPr>
+    </w:lvl>
+    <w:lvl w:ilvl="5" w:tentative="1">
+      <w:start w:val="1"/>
+      <w:numFmt w:val="bullet"/>
+      <w:lvlText w:val=""/>
+      <w:lvlJc w:val="left"/>
+      <w:pPr>
+        <w:tabs>
+          <w:tab w:val="num" w:pos="4320"/>
+        </w:tabs>
+        <w:ind w:left="4320" w:hanging="360"/>
+      </w:pPr>
+      <w:rPr>
+        <w:rFonts w:ascii="Wingdings" w:hAnsi="Wingdings" w:hint="default"/>
+        <w:sz w:val="20"/>
+      </w:rPr>
+    </w:lvl>
+    <w:lvl w:ilvl="6" w:tentative="1">
+      <w:start w:val="1"/>
+      <w:numFmt w:val="bullet"/>
+      <w:lvlText w:val=""/>
+      <w:lvlJc w:val="left"/>
+      <w:pPr>
+        <w:tabs>
+          <w:tab w:val="num" w:pos="5040"/>
+        </w:tabs>
+        <w:ind w:left="5040" w:hanging="360"/>
+      </w:pPr>
+      <w:rPr>
+        <w:rFonts w:ascii="Wingdings" w:hAnsi="Wingdings" w:hint="default"/>
+        <w:sz w:val="20"/>
+      </w:rPr>
+    </w:lvl>
+    <w:lvl w:ilvl="7" w:tentative="1">
+      <w:start w:val="1"/>
+      <w:numFmt w:val="bullet"/>
+      <w:lvlText w:val=""/>
+      <w:lvlJc w:val="left"/>
+      <w:pPr>
+        <w:tabs>
+          <w:tab w:val="num" w:pos="5760"/>
+        </w:tabs>
+        <w:ind w:left="5760" w:hanging="360"/>
+      </w:pPr>
+      <w:rPr>
+        <w:rFonts w:ascii="Wingdings" w:hAnsi="Wingdings" w:hint="default"/>
+        <w:sz w:val="20"/>
+      </w:rPr>
+    </w:lvl>
+    <w:lvl w:ilvl="8" w:tentative="1">
+      <w:start w:val="1"/>
+      <w:numFmt w:val="bullet"/>
+      <w:lvlText w:val=""/>
+      <w:lvlJc w:val="left"/>
+      <w:pPr>
+        <w:tabs>
+          <w:tab w:val="num" w:pos="6480"/>
+        </w:tabs>
+        <w:ind w:left="6480" w:hanging="360"/>
+      </w:pPr>
+      <w:rPr>
+        <w:rFonts w:ascii="Wingdings" w:hAnsi="Wingdings" w:hint="default"/>
+        <w:sz w:val="20"/>
+      </w:rPr>
+    </w:lvl>
+  </w:abstractNum>
+  <w:abstractNum w:abstractNumId="10" w15:restartNumberingAfterBreak="0">
+    <w:nsid w:val="7E3C0F51"/>
+    <w:multiLevelType w:val="multilevel"/>
+    <w:tmpl w:val="9970E91C"/>
+    <w:lvl w:ilvl="0">
+      <w:start w:val="1"/>
+      <w:numFmt w:val="bullet"/>
+      <w:lvlText w:val=""/>
+      <w:lvlJc w:val="left"/>
+      <w:pPr>
+        <w:tabs>
+          <w:tab w:val="num" w:pos="720"/>
+        </w:tabs>
+        <w:ind w:left="720" w:hanging="360"/>
+      </w:pPr>
+      <w:rPr>
+        <w:rFonts w:ascii="Symbol" w:hAnsi="Symbol" w:hint="default"/>
+        <w:sz w:val="20"/>
       </w:rPr>
     </w:lvl>
     <w:lvl w:ilvl="1" w:tentative="1">
@@ -2471,22 +5961,34 @@
     <w:abstractNumId w:val="1"/>
   </w:num>
   <w:num w:numId="2" w16cid:durableId="368578185">
-    <w:abstractNumId w:val="5"/>
+    <w:abstractNumId w:val="8"/>
   </w:num>
   <w:num w:numId="3" w16cid:durableId="559173962">
     <w:abstractNumId w:val="0"/>
   </w:num>
   <w:num w:numId="4" w16cid:durableId="1027564377">
-    <w:abstractNumId w:val="3"/>
+    <w:abstractNumId w:val="4"/>
   </w:num>
   <w:num w:numId="5" w16cid:durableId="547573144">
     <w:abstractNumId w:val="2"/>
   </w:num>
   <w:num w:numId="6" w16cid:durableId="561989786">
-    <w:abstractNumId w:val="4"/>
+    <w:abstractNumId w:val="6"/>
   </w:num>
   <w:num w:numId="7" w16cid:durableId="940576598">
-    <w:abstractNumId w:val="6"/>
+    <w:abstractNumId w:val="9"/>
+  </w:num>
+  <w:num w:numId="8" w16cid:durableId="2020084199">
+    <w:abstractNumId w:val="7"/>
+  </w:num>
+  <w:num w:numId="9" w16cid:durableId="1142383382">
+    <w:abstractNumId w:val="10"/>
+  </w:num>
+  <w:num w:numId="10" w16cid:durableId="1281377237">
+    <w:abstractNumId w:val="5"/>
+  </w:num>
+  <w:num w:numId="11" w16cid:durableId="1664237672">
+    <w:abstractNumId w:val="3"/>
   </w:num>
 </w:numbering>
 </file>
@@ -2541,7 +6043,7 @@
     <w:lsdException w:name="footnote text" w:semiHidden="1" w:unhideWhenUsed="1"/>
     <w:lsdException w:name="annotation text" w:semiHidden="1" w:unhideWhenUsed="1"/>
     <w:lsdException w:name="header" w:semiHidden="1" w:unhideWhenUsed="1"/>
-    <w:lsdException w:name="footer" w:semiHidden="1" w:unhideWhenUsed="1"/>
+    <w:lsdException w:name="footer" w:semiHidden="1" w:unhideWhenUsed="1" w:qFormat="1"/>
     <w:lsdException w:name="index heading" w:semiHidden="1" w:unhideWhenUsed="1"/>
     <w:lsdException w:name="caption" w:semiHidden="1" w:uiPriority="35" w:unhideWhenUsed="1" w:qFormat="1"/>
     <w:lsdException w:name="table of figures" w:semiHidden="1" w:unhideWhenUsed="1"/>
@@ -2889,9 +6391,12 @@
   <w:style w:type="paragraph" w:default="1" w:styleId="Normal">
     <w:name w:val="Normal"/>
     <w:qFormat/>
-    <w:rsid w:val="00A33C98"/>
+    <w:rsid w:val="00D435CB"/>
+    <w:pPr>
+      <w:jc w:val="both"/>
+    </w:pPr>
     <w:rPr>
-      <w:sz w:val="26"/>
+      <w:sz w:val="24"/>
     </w:rPr>
   </w:style>
   <w:style w:type="paragraph" w:styleId="Heading1">
@@ -3102,7 +6607,6 @@
   <w:style w:type="character" w:default="1" w:styleId="DefaultParagraphFont">
     <w:name w:val="Default Paragraph Font"/>
     <w:uiPriority w:val="1"/>
-    <w:semiHidden/>
     <w:unhideWhenUsed/>
   </w:style>
   <w:style w:type="table" w:default="1" w:styleId="TableNormal">
@@ -3333,7 +6837,6 @@
       <w:iCs/>
       <w:color w:val="1CADE4" w:themeColor="accent1"/>
       <w:spacing w:val="15"/>
-      <w:sz w:val="24"/>
       <w:szCs w:val="24"/>
     </w:rPr>
   </w:style>
@@ -3534,7 +7037,6 @@
     <w:basedOn w:val="Heading1"/>
     <w:next w:val="Normal"/>
     <w:uiPriority w:val="39"/>
-    <w:semiHidden/>
     <w:unhideWhenUsed/>
     <w:qFormat/>
     <w:rsid w:val="00A33C98"/>
@@ -3580,6 +7082,7 @@
     <w:link w:val="FooterChar"/>
     <w:uiPriority w:val="99"/>
     <w:unhideWhenUsed/>
+    <w:qFormat/>
     <w:rsid w:val="00235B1A"/>
     <w:pPr>
       <w:tabs>
@@ -3608,6 +7111,50 @@
     <w:rPr>
       <w:color w:val="666666"/>
     </w:rPr>
+  </w:style>
+  <w:style w:type="paragraph" w:styleId="TOC1">
+    <w:name w:val="toc 1"/>
+    <w:basedOn w:val="Normal"/>
+    <w:next w:val="Normal"/>
+    <w:autoRedefine/>
+    <w:uiPriority w:val="39"/>
+    <w:unhideWhenUsed/>
+    <w:rsid w:val="0052283F"/>
+    <w:pPr>
+      <w:spacing w:after="100"/>
+    </w:pPr>
+  </w:style>
+  <w:style w:type="character" w:styleId="Hyperlink">
+    <w:name w:val="Hyperlink"/>
+    <w:basedOn w:val="DefaultParagraphFont"/>
+    <w:uiPriority w:val="99"/>
+    <w:unhideWhenUsed/>
+    <w:rsid w:val="0052283F"/>
+    <w:rPr>
+      <w:color w:val="6B9F25" w:themeColor="hyperlink"/>
+      <w:u w:val="single"/>
+    </w:rPr>
+  </w:style>
+  <w:style w:type="paragraph" w:styleId="TOC2">
+    <w:name w:val="toc 2"/>
+    <w:basedOn w:val="Normal"/>
+    <w:next w:val="Normal"/>
+    <w:autoRedefine/>
+    <w:uiPriority w:val="39"/>
+    <w:unhideWhenUsed/>
+    <w:rsid w:val="0052283F"/>
+    <w:pPr>
+      <w:spacing w:after="100"/>
+      <w:ind w:left="240"/>
+    </w:pPr>
+  </w:style>
+  <w:style w:type="paragraph" w:styleId="Bibliography">
+    <w:name w:val="Bibliography"/>
+    <w:basedOn w:val="Normal"/>
+    <w:next w:val="Normal"/>
+    <w:uiPriority w:val="37"/>
+    <w:unhideWhenUsed/>
+    <w:rsid w:val="0052283F"/>
   </w:style>
 </w:styles>
 </file>
@@ -3760,10 +7307,13 @@
   </w:compat>
   <w:rsids>
     <w:rsidRoot w:val="00F01BA3"/>
+    <w:rsid w:val="002F77C9"/>
     <w:rsid w:val="00495A74"/>
     <w:rsid w:val="0085071F"/>
     <w:rsid w:val="00914371"/>
     <w:rsid w:val="00AC622D"/>
+    <w:rsid w:val="00AD37F4"/>
+    <w:rsid w:val="00B43B45"/>
     <w:rsid w:val="00C0475E"/>
     <w:rsid w:val="00C800D4"/>
     <w:rsid w:val="00D10A5A"/>
@@ -4239,6 +7789,10 @@
       <w:color w:val="666666"/>
     </w:rPr>
   </w:style>
+  <w:style w:type="paragraph" w:customStyle="1" w:styleId="920F6419788946FEACCAA2E05D6FA243">
+    <w:name w:val="920F6419788946FEACCAA2E05D6FA243"/>
+    <w:rsid w:val="00AD37F4"/>
+  </w:style>
 </w:styles>
 </file>
 
@@ -4545,4 +8099,115 @@
     </a:ext>
   </a:extLst>
 </a:theme>
+</file>
+
+<file path=customXml/item1.xml><?xml version="1.0" encoding="utf-8"?>
+<b:Sources xmlns:b="http://schemas.openxmlformats.org/officeDocument/2006/bibliography" xmlns="http://schemas.openxmlformats.org/officeDocument/2006/bibliography" SelectedStyle="\IEEE2006OfficeOnline.xsl" StyleName="IEEE" Version="2006">
+  <b:Source>
+    <b:Tag>Sam25</b:Tag>
+    <b:SourceType>InternetSite</b:SourceType>
+    <b:Guid>{35F6C87C-E2C1-4131-931E-7DC741F81EDA}</b:Guid>
+    <b:Author>
+      <b:Author>
+        <b:NameList>
+          <b:Person>
+            <b:Last>Samuel Oloruntoba</b:Last>
+            <b:First>Anish</b:First>
+            <b:Middle>Singh Walia and Manikandan Kurup</b:Middle>
+          </b:Person>
+        </b:NameList>
+      </b:Author>
+    </b:Author>
+    <b:Title>SOLID Design Principles Explained: Building Better Software Architecture</b:Title>
+    <b:Year>2025</b:Year>
+    <b:Month>Junio</b:Month>
+    <b:Day>11</b:Day>
+    <b:YearAccessed>2025</b:YearAccessed>
+    <b:MonthAccessed>Abril</b:MonthAccessed>
+    <b:URL>https://www.digitalocean.com/community/conceptual-articles/s-o-l-i-d-the-first-five-principles-of-object-oriented-design</b:URL>
+    <b:ProductionCompany>DigitalOcean</b:ProductionCompany>
+    <b:RefOrder>1</b:RefOrder>
+  </b:Source>
+  <b:Source>
+    <b:Tag>Gee252</b:Tag>
+    <b:SourceType>InternetSite</b:SourceType>
+    <b:Guid>{05E0C688-A12E-4DDC-9093-5E69B1CBB058}</b:Guid>
+    <b:Author>
+      <b:Author>
+        <b:Corporate>GeeksforGeeks</b:Corporate>
+      </b:Author>
+    </b:Author>
+    <b:Title>Software Design Patterns Tutorial</b:Title>
+    <b:Year>2025</b:Year>
+    <b:Month>Junio</b:Month>
+    <b:Day>2</b:Day>
+    <b:YearAccessed>2025</b:YearAccessed>
+    <b:MonthAccessed>Abril</b:MonthAccessed>
+    <b:URL>https://www.geeksforgeeks.org/system-design/software-design-patterns/</b:URL>
+    <b:RefOrder>2</b:RefOrder>
+  </b:Source>
+  <b:Source>
+    <b:Tag>Kum25</b:Tag>
+    <b:SourceType>InternetSite</b:SourceType>
+    <b:Guid>{B4DE2302-C702-4335-9817-A0B99F672C3B}</b:Guid>
+    <b:Author>
+      <b:Author>
+        <b:NameList>
+          <b:Person>
+            <b:Last>Chandrakant</b:Last>
+            <b:First>Kumar</b:First>
+          </b:Person>
+        </b:NameList>
+      </b:Author>
+    </b:Author>
+    <b:Title>Functional Programming in Java</b:Title>
+    <b:ProductionCompany>Baeldung</b:ProductionCompany>
+    <b:Year>2025</b:Year>
+    <b:Month>Marzo</b:Month>
+    <b:Day>26</b:Day>
+    <b:YearAccessed>2025</b:YearAccessed>
+    <b:MonthAccessed>Abril</b:MonthAccessed>
+    <b:URL>https://www.baeldung.com/java-functional-programming</b:URL>
+    <b:RefOrder>3</b:RefOrder>
+  </b:Source>
+  <b:Source>
+    <b:Tag>Mod</b:Tag>
+    <b:SourceType>Book</b:SourceType>
+    <b:Guid>{FFD43B11-8D99-4970-8497-FE47E939A16A}</b:Guid>
+    <b:Author>
+      <b:Author>
+        <b:Corporate>Modelos y Simulación, Dpto. Informática, UNSL</b:Corporate>
+      </b:Author>
+    </b:Author>
+    <b:Title>Apuntes proveídos por la cátedra</b:Title>
+    <b:RefOrder>4</b:RefOrder>
+  </b:Source>
+  <b:Source>
+    <b:Tag>Jer84</b:Tag>
+    <b:SourceType>Book</b:SourceType>
+    <b:Guid>{6E860E07-A854-4484-92F7-4ACE9440FFF1}</b:Guid>
+    <b:Author>
+      <b:Author>
+        <b:NameList>
+          <b:Person>
+            <b:Last>Jerry Banks</b:Last>
+            <b:First>John</b:First>
+            <b:Middle>Carson, Barry L. Nelson, David Nicol</b:Middle>
+          </b:Person>
+        </b:NameList>
+      </b:Author>
+    </b:Author>
+    <b:Title>Discrete-Event System Simulation</b:Title>
+    <b:Year>1984</b:Year>
+    <b:RefOrder>5</b:RefOrder>
+  </b:Source>
+</b:Sources>
+</file>
+
+<file path=customXml/itemProps1.xml><?xml version="1.0" encoding="utf-8"?>
+<ds:datastoreItem xmlns:ds="http://schemas.openxmlformats.org/officeDocument/2006/customXml" ds:itemID="{804DC676-AD7D-4848-B626-954EEF2B6661}">
+  <ds:schemaRefs>
+    <ds:schemaRef ds:uri="http://schemas.openxmlformats.org/officeDocument/2006/bibliography"/>
+  </ds:schemaRefs>
+</ds:datastoreItem>
 </file>
</xml_diff>

<commit_message>
Mejorado informe. Falta agregar texto de testing y conclusión
</commit_message>
<xml_diff>
--- a/Informe Trabajo Integrador MyS.docx
+++ b/Informe Trabajo Integrador MyS.docx
@@ -1,6 +1,6 @@
 
 <file path=word/document.xml><?xml version="1.0" encoding="utf-8"?>
-<w:document xmlns:wpc="http://schemas.microsoft.com/office/word/2010/wordprocessingCanvas" xmlns:cx="http://schemas.microsoft.com/office/drawing/2014/chartex" xmlns:cx1="http://schemas.microsoft.com/office/drawing/2015/9/8/chartex" xmlns:cx2="http://schemas.microsoft.com/office/drawing/2015/10/21/chartex" xmlns:cx3="http://schemas.microsoft.com/office/drawing/2016/5/9/chartex" xmlns:cx4="http://schemas.microsoft.com/office/drawing/2016/5/10/chartex" xmlns:cx5="http://schemas.microsoft.com/office/drawing/2016/5/11/chartex" xmlns:cx6="http://schemas.microsoft.com/office/drawing/2016/5/12/chartex" xmlns:cx7="http://schemas.microsoft.com/office/drawing/2016/5/13/chartex" xmlns:cx8="http://schemas.microsoft.com/office/drawing/2016/5/14/chartex" xmlns:mc="http://schemas.openxmlformats.org/markup-compatibility/2006" xmlns:aink="http://schemas.microsoft.com/office/drawing/2016/ink" xmlns:am3d="http://schemas.microsoft.com/office/drawing/2017/model3d" xmlns:o="urn:schemas-microsoft-com:office:office" xmlns:oel="http://schemas.microsoft.com/office/2019/extlst" xmlns:r="http://schemas.openxmlformats.org/officeDocument/2006/relationships" xmlns:m="http://schemas.openxmlformats.org/officeDocument/2006/math" xmlns:v="urn:schemas-microsoft-com:vml" xmlns:wp14="http://schemas.microsoft.com/office/word/2010/wordprocessingDrawing" xmlns:wp="http://schemas.openxmlformats.org/drawingml/2006/wordprocessingDrawing" xmlns:w10="urn:schemas-microsoft-com:office:word" xmlns:w="http://schemas.openxmlformats.org/wordprocessingml/2006/main" xmlns:w14="http://schemas.microsoft.com/office/word/2010/wordml" xmlns:w15="http://schemas.microsoft.com/office/word/2012/wordml" xmlns:w16cex="http://schemas.microsoft.com/office/word/2018/wordml/cex" xmlns:w16cid="http://schemas.microsoft.com/office/word/2016/wordml/cid" xmlns:w16="http://schemas.microsoft.com/office/word/2018/wordml" xmlns:w16du="http://schemas.microsoft.com/office/word/2023/wordml/word16du" xmlns:w16sdtdh="http://schemas.microsoft.com/office/word/2020/wordml/sdtdatahash" xmlns:w16sdtfl="http://schemas.microsoft.com/office/word/2024/wordml/sdtformatlock" xmlns:w16se="http://schemas.microsoft.com/office/word/2015/wordml/symex" xmlns:wpg="http://schemas.microsoft.com/office/word/2010/wordprocessingGroup" xmlns:wpi="http://schemas.microsoft.com/office/word/2010/wordprocessingInk" xmlns:wne="http://schemas.microsoft.com/office/word/2006/wordml" xmlns:wps="http://schemas.microsoft.com/office/word/2010/wordprocessingShape" mc:Ignorable="w14 w15 w16se w16cid w16 w16cex w16sdtdh w16sdtfl w16du wp14">
+<w:document xmlns:wpc="http://schemas.microsoft.com/office/word/2010/wordprocessingCanvas" xmlns:cx="http://schemas.microsoft.com/office/drawing/2014/chartex" xmlns:cx1="http://schemas.microsoft.com/office/drawing/2015/9/8/chartex" xmlns:cx2="http://schemas.microsoft.com/office/drawing/2015/10/21/chartex" xmlns:cx3="http://schemas.microsoft.com/office/drawing/2016/5/9/chartex" xmlns:cx4="http://schemas.microsoft.com/office/drawing/2016/5/10/chartex" xmlns:cx5="http://schemas.microsoft.com/office/drawing/2016/5/11/chartex" xmlns:cx6="http://schemas.microsoft.com/office/drawing/2016/5/12/chartex" xmlns:cx7="http://schemas.microsoft.com/office/drawing/2016/5/13/chartex" xmlns:cx8="http://schemas.microsoft.com/office/drawing/2016/5/14/chartex" xmlns:mc="http://schemas.openxmlformats.org/markup-compatibility/2006" xmlns:aink="http://schemas.microsoft.com/office/drawing/2016/ink" xmlns:am3d="http://schemas.microsoft.com/office/drawing/2017/model3d" xmlns:o="urn:schemas-microsoft-com:office:office" xmlns:oel="http://schemas.microsoft.com/office/2019/extlst" xmlns:r="http://schemas.openxmlformats.org/officeDocument/2006/relationships" xmlns:m="http://schemas.openxmlformats.org/officeDocument/2006/math" xmlns:v="urn:schemas-microsoft-com:vml" xmlns:wp14="http://schemas.microsoft.com/office/word/2010/wordprocessingDrawing" xmlns:wp="http://schemas.openxmlformats.org/drawingml/2006/wordprocessingDrawing" xmlns:w10="urn:schemas-microsoft-com:office:word" xmlns:w="http://schemas.openxmlformats.org/wordprocessingml/2006/main" xmlns:w14="http://schemas.microsoft.com/office/word/2010/wordml" xmlns:w15="http://schemas.microsoft.com/office/word/2012/wordml" xmlns:w16cex="http://schemas.microsoft.com/office/word/2018/wordml/cex" xmlns:w16cid="http://schemas.microsoft.com/office/word/2016/wordml/cid" xmlns:w16="http://schemas.microsoft.com/office/word/2018/wordml" xmlns:w16sdtdh="http://schemas.microsoft.com/office/word/2020/wordml/sdtdatahash" xmlns:w16se="http://schemas.microsoft.com/office/word/2015/wordml/symex" xmlns:wpg="http://schemas.microsoft.com/office/word/2010/wordprocessingGroup" xmlns:wpi="http://schemas.microsoft.com/office/word/2010/wordprocessingInk" xmlns:wne="http://schemas.microsoft.com/office/word/2006/wordml" xmlns:wps="http://schemas.microsoft.com/office/word/2010/wordprocessingShape" mc:Ignorable="w14 w15 w16se w16cid w16 w16cex w16sdtdh wp14">
   <w:body>
     <w:sdt>
       <w:sdtPr>
@@ -179,52 +179,14 @@
                 </w:rPr>
                 <w:t xml:space="preserve">Modelos y Simulación, </w:t>
               </w:r>
-              <w:proofErr w:type="spellStart"/>
               <w:r>
                 <w:rPr>
                   <w:color w:val="1CADE4" w:themeColor="accent1"/>
                   <w:sz w:val="28"/>
                   <w:szCs w:val="28"/>
                 </w:rPr>
-                <w:t>Profs</w:t>
+                <w:t>Profs. Cristian Tissera, Danilo Labella</w:t>
               </w:r>
-              <w:proofErr w:type="spellEnd"/>
-              <w:r>
-                <w:rPr>
-                  <w:color w:val="1CADE4" w:themeColor="accent1"/>
-                  <w:sz w:val="28"/>
-                  <w:szCs w:val="28"/>
-                </w:rPr>
-                <w:t xml:space="preserve">. Cristian </w:t>
-              </w:r>
-              <w:proofErr w:type="spellStart"/>
-              <w:r>
-                <w:rPr>
-                  <w:color w:val="1CADE4" w:themeColor="accent1"/>
-                  <w:sz w:val="28"/>
-                  <w:szCs w:val="28"/>
-                </w:rPr>
-                <w:t>Tissera</w:t>
-              </w:r>
-              <w:proofErr w:type="spellEnd"/>
-              <w:r>
-                <w:rPr>
-                  <w:color w:val="1CADE4" w:themeColor="accent1"/>
-                  <w:sz w:val="28"/>
-                  <w:szCs w:val="28"/>
-                </w:rPr>
-                <w:t xml:space="preserve">, Danilo </w:t>
-              </w:r>
-              <w:proofErr w:type="spellStart"/>
-              <w:r>
-                <w:rPr>
-                  <w:color w:val="1CADE4" w:themeColor="accent1"/>
-                  <w:sz w:val="28"/>
-                  <w:szCs w:val="28"/>
-                </w:rPr>
-                <w:t>Labella</w:t>
-              </w:r>
-              <w:proofErr w:type="spellEnd"/>
               <w:r>
                 <w:rPr>
                   <w:color w:val="1CADE4" w:themeColor="accent1"/>
@@ -713,28 +675,12 @@
                                     <w:lang w:val="en-US"/>
                                   </w:rPr>
                                 </w:pPr>
-                                <w:proofErr w:type="spellStart"/>
                                 <w:r>
                                   <w:rPr>
                                     <w:lang w:val="en-US"/>
                                   </w:rPr>
-                                  <w:t>Dpto</w:t>
+                                  <w:t>Dpto. de Informática</w:t>
                                 </w:r>
-                                <w:proofErr w:type="spellEnd"/>
-                                <w:r>
-                                  <w:rPr>
-                                    <w:lang w:val="en-US"/>
-                                  </w:rPr>
-                                  <w:t xml:space="preserve">. de </w:t>
-                                </w:r>
-                                <w:proofErr w:type="spellStart"/>
-                                <w:r>
-                                  <w:rPr>
-                                    <w:lang w:val="en-US"/>
-                                  </w:rPr>
-                                  <w:t>Informática</w:t>
-                                </w:r>
-                                <w:proofErr w:type="spellEnd"/>
                               </w:p>
                             </w:txbxContent>
                           </wps:txbx>
@@ -828,28 +774,12 @@
                               <w:lang w:val="en-US"/>
                             </w:rPr>
                           </w:pPr>
-                          <w:proofErr w:type="spellStart"/>
                           <w:r>
                             <w:rPr>
                               <w:lang w:val="en-US"/>
                             </w:rPr>
-                            <w:t>Dpto</w:t>
+                            <w:t>Dpto. de Informática</w:t>
                           </w:r>
-                          <w:proofErr w:type="spellEnd"/>
-                          <w:r>
-                            <w:rPr>
-                              <w:lang w:val="en-US"/>
-                            </w:rPr>
-                            <w:t xml:space="preserve">. de </w:t>
-                          </w:r>
-                          <w:proofErr w:type="spellStart"/>
-                          <w:r>
-                            <w:rPr>
-                              <w:lang w:val="en-US"/>
-                            </w:rPr>
-                            <w:t>Informática</w:t>
-                          </w:r>
-                          <w:proofErr w:type="spellEnd"/>
                         </w:p>
                       </w:txbxContent>
                     </v:textbox>
@@ -1335,6 +1265,14 @@
     <w:bookmarkStart w:id="0" w:name="_Toc201229726" w:displacedByCustomXml="next"/>
     <w:sdt>
       <w:sdtPr>
+        <w:rPr>
+          <w:rFonts w:asciiTheme="minorHAnsi" w:eastAsiaTheme="minorHAnsi" w:hAnsiTheme="minorHAnsi" w:cstheme="minorBidi"/>
+          <w:b w:val="0"/>
+          <w:color w:val="auto"/>
+          <w:spacing w:val="0"/>
+          <w:sz w:val="24"/>
+          <w:szCs w:val="22"/>
+        </w:rPr>
         <w:id w:val="1807504060"/>
         <w:docPartObj>
           <w:docPartGallery w:val="Table of Contents"/>
@@ -1343,13 +1281,8 @@
       </w:sdtPr>
       <w:sdtEndPr>
         <w:rPr>
-          <w:rFonts w:asciiTheme="minorHAnsi" w:eastAsiaTheme="minorHAnsi" w:hAnsiTheme="minorHAnsi" w:cstheme="minorBidi"/>
           <w:bCs/>
           <w:noProof/>
-          <w:color w:val="auto"/>
-          <w:spacing w:val="0"/>
-          <w:sz w:val="24"/>
-          <w:szCs w:val="22"/>
         </w:rPr>
       </w:sdtEndPr>
       <w:sdtContent>
@@ -2737,7 +2670,7 @@
     <w:p>
       <w:r>
         <w:pict w14:anchorId="5C0C2D31">
-          <v:rect id="_x0000_i1031" style="width:0;height:1.5pt" o:hralign="center" o:hrstd="t" o:hr="t" fillcolor="#a0a0a0" stroked="f"/>
+          <v:rect id="_x0000_i1025" style="width:0;height:1.5pt" o:hralign="center" o:hrstd="t" o:hr="t" fillcolor="#a0a0a0" stroked="f"/>
         </w:pict>
       </w:r>
     </w:p>
@@ -2885,7 +2818,7 @@
     <w:p>
       <w:r>
         <w:pict w14:anchorId="20C1CD8D">
-          <v:rect id="_x0000_i1032" style="width:0;height:1.5pt" o:hralign="center" o:hrstd="t" o:hr="t" fillcolor="#a0a0a0" stroked="f"/>
+          <v:rect id="_x0000_i1026" style="width:0;height:1.5pt" o:hralign="center" o:hrstd="t" o:hr="t" fillcolor="#a0a0a0" stroked="f"/>
         </w:pict>
       </w:r>
     </w:p>
@@ -2961,28 +2894,28 @@
     </w:p>
     <w:p>
       <w:r>
-        <w:t>Cada etapa implicó un trabajo conjunto de diseño, codificación, validación y evaluación, lo que nos permitió adquirir una comprensión integral del proceso de simulación de sistemas discretos en entornos complejos y realistas.</w:t>
+        <w:t xml:space="preserve">Cada etapa implicó un trabajo conjunto de diseño, codificación, </w:t>
+      </w:r>
+      <w:r>
+        <w:t>verificación</w:t>
+      </w:r>
+      <w:r>
+        <w:t xml:space="preserve"> y evaluación, lo que nos permitió adquirir una comprensión integral del proceso de simulación de sistemas discretos en entornos complejos y realistas.</w:t>
       </w:r>
     </w:p>
     <w:p>
       <w:r>
         <w:pict w14:anchorId="10CAD3D7">
-          <v:rect id="_x0000_i1030" style="width:0;height:1.5pt" o:hralign="center" o:hrstd="t" o:hr="t" fillcolor="#a0a0a0" stroked="f"/>
+          <v:rect id="_x0000_i1027" style="width:0;height:1.5pt" o:hralign="center" o:hrstd="t" o:hr="t" fillcolor="#a0a0a0" stroked="f"/>
         </w:pict>
       </w:r>
     </w:p>
     <w:p>
-      <w:r>
-        <w:br w:type="page"/>
-      </w:r>
-    </w:p>
-    <w:p>
       <w:pPr>
         <w:pStyle w:val="Title"/>
       </w:pPr>
       <w:bookmarkStart w:id="5" w:name="_Toc201229731"/>
       <w:r>
-        <w:lastRenderedPageBreak/>
         <w:t>Primera Etapa</w:t>
       </w:r>
       <w:bookmarkEnd w:id="5"/>
@@ -3033,15 +2966,7 @@
         </w:numPr>
       </w:pPr>
       <w:r>
-        <w:t xml:space="preserve">Emplear la técnica de bootstrapping, en la que cada evento programa el siguiente, optimizando la automatización de la simulación y la gestión de la FEL (Future </w:t>
-      </w:r>
-      <w:proofErr w:type="spellStart"/>
-      <w:r>
-        <w:t>Event</w:t>
-      </w:r>
-      <w:proofErr w:type="spellEnd"/>
-      <w:r>
-        <w:t xml:space="preserve"> List) </w:t>
+        <w:t xml:space="preserve">Emplear la técnica de bootstrapping, en la que cada evento programa el siguiente, optimizando la automatización de la simulación y la gestión de la FEL (Future Event List) </w:t>
       </w:r>
       <w:r>
         <w:rPr>
@@ -3083,6 +3008,7 @@
         </w:numPr>
       </w:pPr>
       <w:r>
+        <w:lastRenderedPageBreak/>
         <w:t>Tiempos de tránsito (media, máximo y mínimo distinto de cero).</w:t>
       </w:r>
     </w:p>
@@ -3127,7 +3053,16 @@
         </w:numPr>
       </w:pPr>
       <w:r>
-        <w:t>Validar el correcto funcionamiento de la simulación en un horizonte de 4 semanas de tiempo de simulación.</w:t>
+        <w:t>Verificar</w:t>
+      </w:r>
+      <w:r>
+        <w:t xml:space="preserve"> el correcto funcionamiento de la simulación</w:t>
+      </w:r>
+      <w:r>
+        <w:t xml:space="preserve"> durante</w:t>
+      </w:r>
+      <w:r>
+        <w:t xml:space="preserve"> 4 semanas de tiempo de simulación.</w:t>
       </w:r>
       <w:r>
         <w:tab/>
@@ -3136,7 +3071,7 @@
     <w:p>
       <w:r>
         <w:pict w14:anchorId="2B81E80E">
-          <v:rect id="_x0000_i1025" style="width:0;height:1.5pt" o:hralign="center" o:hrstd="t" o:hr="t" fillcolor="#a0a0a0" stroked="f"/>
+          <v:rect id="_x0000_i1028" style="width:0;height:1.5pt" o:hralign="center" o:hrstd="t" o:hr="t" fillcolor="#a0a0a0" stroked="f"/>
         </w:pict>
       </w:r>
     </w:p>
@@ -3145,145 +3080,6 @@
         <w:pStyle w:val="Heading1"/>
       </w:pPr>
       <w:bookmarkStart w:id="7" w:name="_Toc201229733"/>
-      <w:r>
-        <w:t>Experiencia de Desarrollo</w:t>
-      </w:r>
-      <w:bookmarkEnd w:id="7"/>
-    </w:p>
-    <w:p>
-      <w:pPr>
-        <w:numPr>
-          <w:ilvl w:val="0"/>
-          <w:numId w:val="4"/>
-        </w:numPr>
-      </w:pPr>
-      <w:r>
-        <w:t>Al ser nuestra primera simulación, no disponíamos del conocimiento ni de la experiencia para abordar el desarrollo de manera directa, lo que incrementó la complejidad de la etapa inicial.</w:t>
-      </w:r>
-    </w:p>
-    <w:p>
-      <w:pPr>
-        <w:numPr>
-          <w:ilvl w:val="0"/>
-          <w:numId w:val="4"/>
-        </w:numPr>
-      </w:pPr>
-      <w:r>
-        <w:t xml:space="preserve">Debido a nuestra falta de </w:t>
-      </w:r>
-      <w:r>
-        <w:t>experiencia</w:t>
-      </w:r>
-      <w:r>
-        <w:t xml:space="preserve">, debimos </w:t>
-      </w:r>
-      <w:r>
-        <w:rPr>
-          <w:b/>
-          <w:bCs/>
-        </w:rPr>
-        <w:t>readaptar partes del código en múltiples ocasiones</w:t>
-      </w:r>
-      <w:r>
-        <w:t>, refinando la estructura y corregir errores en la gestión de la FEL.</w:t>
-      </w:r>
-    </w:p>
-    <w:p>
-      <w:pPr>
-        <w:numPr>
-          <w:ilvl w:val="0"/>
-          <w:numId w:val="4"/>
-        </w:numPr>
-      </w:pPr>
-      <w:r>
-        <w:lastRenderedPageBreak/>
-        <w:t xml:space="preserve">Incorporamos por primera vez en nuestra forma de codificar los </w:t>
-      </w:r>
-      <w:r>
-        <w:rPr>
-          <w:b/>
-          <w:bCs/>
-        </w:rPr>
-        <w:t>principios S.O.L.I.D.</w:t>
-      </w:r>
-      <w:r>
-        <w:t>, y pudimos apreciar sus beneficios en la mantenibilidad, cohesión y extensibilidad del simulador.</w:t>
-      </w:r>
-    </w:p>
-    <w:p>
-      <w:pPr>
-        <w:numPr>
-          <w:ilvl w:val="0"/>
-          <w:numId w:val="4"/>
-        </w:numPr>
-      </w:pPr>
-      <w:r>
-        <w:t xml:space="preserve">Una de nuestras principales dificultades fue </w:t>
-      </w:r>
-      <w:r>
-        <w:rPr>
-          <w:b/>
-          <w:bCs/>
-        </w:rPr>
-        <w:t>determinar la forma óptima de implementar el cómputo de estadísticas</w:t>
-      </w:r>
-      <w:r>
-        <w:t xml:space="preserve"> (tiempos de espera, tránsito y ocio), lo que nos obligó a diseñar estructuras de datos auxiliares y métodos de agregación flexibles.</w:t>
-      </w:r>
-    </w:p>
-    <w:p>
-      <w:pPr>
-        <w:numPr>
-          <w:ilvl w:val="0"/>
-          <w:numId w:val="4"/>
-        </w:numPr>
-      </w:pPr>
-      <w:r>
-        <w:t xml:space="preserve">Al aplicar SOLID y considerando los requisitos de las siguientes dos etapas del práctico, realizamos el diseño pensando en </w:t>
-      </w:r>
-      <w:r>
-        <w:rPr>
-          <w:b/>
-          <w:bCs/>
-        </w:rPr>
-        <w:t>posibles cambios futuros</w:t>
-      </w:r>
-      <w:r>
-        <w:t>, lo que facilitará la integración de múltiples servidores y nuevos generadores de variables aleatorias en etapas posteriores.</w:t>
-      </w:r>
-    </w:p>
-    <w:p>
-      <w:pPr>
-        <w:numPr>
-          <w:ilvl w:val="0"/>
-          <w:numId w:val="4"/>
-        </w:numPr>
-      </w:pPr>
-      <w:r>
-        <w:t xml:space="preserve">En conjunto, consideramos que esta primera etapa nos proporcionó una </w:t>
-      </w:r>
-      <w:r>
-        <w:rPr>
-          <w:b/>
-          <w:bCs/>
-        </w:rPr>
-        <w:t>experiencia valiosa</w:t>
-      </w:r>
-      <w:r>
-        <w:t xml:space="preserve"> que sin duda enriquecerá nuestro desarrollo profesional en simulación y diseño de software.</w:t>
-      </w:r>
-    </w:p>
-    <w:p>
-      <w:r>
-        <w:pict w14:anchorId="40E16636">
-          <v:rect id="_x0000_i1026" style="width:0;height:1.5pt" o:hralign="center" o:hrstd="t" o:hr="t" fillcolor="#a0a0a0" stroked="f"/>
-        </w:pict>
-      </w:r>
-    </w:p>
-    <w:p>
-      <w:pPr>
-        <w:pStyle w:val="Heading1"/>
-      </w:pPr>
       <w:bookmarkStart w:id="8" w:name="_Toc201229734"/>
       <w:r>
         <w:t>Modelo de Dominio</w:t>
@@ -3301,7 +3097,7 @@
           <w:noProof/>
         </w:rPr>
         <w:drawing>
-          <wp:inline distT="0" distB="0" distL="0" distR="0" wp14:anchorId="3821C066" wp14:editId="1FE5C8E3">
+          <wp:inline distT="0" distB="0" distL="0" distR="0" wp14:anchorId="1E0531A6" wp14:editId="484E6520">
             <wp:extent cx="5731510" cy="3442335"/>
             <wp:effectExtent l="0" t="0" r="2540" b="5715"/>
             <wp:docPr id="1127189294" name="Picture 1"/>
@@ -3336,8 +3132,136 @@
           </wp:inline>
         </w:drawing>
       </w:r>
-      <w:r>
-        <w:br w:type="page"/>
+    </w:p>
+    <w:p>
+      <w:r>
+        <w:pict w14:anchorId="0D17FF38">
+          <v:rect id="_x0000_i1036" style="width:0;height:1.5pt" o:hralign="center" o:hrstd="t" o:hr="t" fillcolor="#a0a0a0" stroked="f"/>
+        </w:pict>
+      </w:r>
+    </w:p>
+    <w:p>
+      <w:pPr>
+        <w:pStyle w:val="Heading1"/>
+      </w:pPr>
+      <w:r>
+        <w:t>Experiencia de Desarrollo</w:t>
+      </w:r>
+      <w:bookmarkEnd w:id="7"/>
+    </w:p>
+    <w:p>
+      <w:pPr>
+        <w:numPr>
+          <w:ilvl w:val="0"/>
+          <w:numId w:val="4"/>
+        </w:numPr>
+      </w:pPr>
+      <w:r>
+        <w:t>Al ser nuestra primera simulación, no disponíamos del conocimiento ni de la experiencia para abordar el desarrollo de manera directa, lo que incrementó la complejidad de la etapa inicial.</w:t>
+      </w:r>
+    </w:p>
+    <w:p>
+      <w:pPr>
+        <w:numPr>
+          <w:ilvl w:val="0"/>
+          <w:numId w:val="4"/>
+        </w:numPr>
+      </w:pPr>
+      <w:r>
+        <w:lastRenderedPageBreak/>
+        <w:t xml:space="preserve">Debido a nuestra falta de </w:t>
+      </w:r>
+      <w:r>
+        <w:t>experiencia</w:t>
+      </w:r>
+      <w:r>
+        <w:t>, debimos readaptar partes del código en múltiples ocasiones, refinando la estructura y corregir errores en la gestión de la FEL.</w:t>
+      </w:r>
+    </w:p>
+    <w:p>
+      <w:pPr>
+        <w:numPr>
+          <w:ilvl w:val="0"/>
+          <w:numId w:val="4"/>
+        </w:numPr>
+      </w:pPr>
+      <w:r>
+        <w:t xml:space="preserve">Incorporamos por primera vez en nuestra forma de codificar los principios S.O.L.I.D., </w:t>
+      </w:r>
+      <w:r>
+        <w:t>permitiéndonos</w:t>
+      </w:r>
+      <w:r>
+        <w:t xml:space="preserve"> apreciar sus beneficios en la mantenibilidad, cohesión y extensibilidad del simulador</w:t>
+      </w:r>
+      <w:r>
+        <w:t>.</w:t>
+      </w:r>
+    </w:p>
+    <w:p>
+      <w:pPr>
+        <w:numPr>
+          <w:ilvl w:val="0"/>
+          <w:numId w:val="4"/>
+        </w:numPr>
+      </w:pPr>
+      <w:r>
+        <w:t xml:space="preserve">Una de nuestras principales dificultades fue determinar la forma </w:t>
+      </w:r>
+      <w:r>
+        <w:t>eficaz</w:t>
+      </w:r>
+      <w:r>
+        <w:t xml:space="preserve"> de implementar el cómputo de estadísticas (tiempos de espera, tránsito y ocio), lo que nos obligó a diseñar </w:t>
+      </w:r>
+      <w:r>
+        <w:t xml:space="preserve">la clase </w:t>
+      </w:r>
+      <m:oMath>
+        <m:r>
+          <w:rPr>
+            <w:rFonts w:ascii="Cambria Math" w:hAnsi="Cambria Math"/>
+          </w:rPr>
+          <m:t>Statistics</m:t>
+        </m:r>
+      </m:oMath>
+      <w:r>
+        <w:rPr>
+          <w:rFonts w:eastAsiaTheme="minorEastAsia"/>
+        </w:rPr>
+        <w:t>, la cual se encarga de ello.</w:t>
+      </w:r>
+    </w:p>
+    <w:p>
+      <w:pPr>
+        <w:numPr>
+          <w:ilvl w:val="0"/>
+          <w:numId w:val="4"/>
+        </w:numPr>
+      </w:pPr>
+      <w:r>
+        <w:t>Al aplicar SOLID y considerando los requisitos de las siguientes dos etapas del práctico, realizamos el diseño pensando en posibles cambios futuros, lo que facilitará la integración de múltiples servidores y nuevos generadores de variables aleatorias en etapas posteriores.</w:t>
+      </w:r>
+    </w:p>
+    <w:p>
+      <w:pPr>
+        <w:numPr>
+          <w:ilvl w:val="0"/>
+          <w:numId w:val="4"/>
+        </w:numPr>
+      </w:pPr>
+      <w:r>
+        <w:t>En conjunto, consideramos que esta primera etapa nos proporcionó una experiencia valiosa que sin duda enriquecerá nuestro desarrollo profesional en simulación y diseño de software</w:t>
+      </w:r>
+      <w:r>
+        <w:t>.</w:t>
+      </w:r>
+    </w:p>
+    <w:p>
+      <w:r>
+        <w:pict w14:anchorId="40E16636">
+          <v:rect id="_x0000_i1029" style="width:0;height:1.5pt" o:hralign="center" o:hrstd="t" o:hr="t" fillcolor="#a0a0a0" stroked="f"/>
+        </w:pict>
       </w:r>
     </w:p>
     <w:p>
@@ -3346,7 +3270,6 @@
       </w:pPr>
       <w:bookmarkStart w:id="9" w:name="_Toc201229735"/>
       <w:r>
-        <w:lastRenderedPageBreak/>
         <w:t>Segunda etapa</w:t>
       </w:r>
       <w:bookmarkEnd w:id="9"/>
@@ -3366,7 +3289,19 @@
     </w:p>
     <w:p>
       <w:r>
-        <w:t>En esta segunda fase, nos propusimos extender y robustecer el simulador inicial con los siguientes objetivos, alineados al enunciado del práctico:</w:t>
+        <w:t xml:space="preserve">En esta segunda fase, nos </w:t>
+      </w:r>
+      <w:r>
+        <w:t>enfocamos en añadir funcionalidad a</w:t>
+      </w:r>
+      <w:r>
+        <w:t xml:space="preserve">l simulador inicial con los siguientes objetivos, alineados al enunciado del </w:t>
+      </w:r>
+      <w:r>
+        <w:t>laboratorio, los cuales son</w:t>
+      </w:r>
+      <w:r>
+        <w:t>:</w:t>
       </w:r>
     </w:p>
     <w:p>
@@ -3430,7 +3365,29 @@
         </m:r>
       </m:oMath>
       <w:r>
-        <w:t xml:space="preserve"> minutos durante los intervalos de fuerte tráfico (9–13 hs y 20–23 hs).</w:t>
+        <w:t xml:space="preserve"> minutos durante los intervalos de fuerte tráfico (</w:t>
+      </w:r>
+      <m:oMath>
+        <m:r>
+          <w:rPr>
+            <w:rFonts w:ascii="Cambria Math" w:hAnsi="Cambria Math"/>
+          </w:rPr>
+          <m:t>9–13</m:t>
+        </m:r>
+      </m:oMath>
+      <w:r>
+        <w:t xml:space="preserve"> hs y </w:t>
+      </w:r>
+      <m:oMath>
+        <m:r>
+          <w:rPr>
+            <w:rFonts w:ascii="Cambria Math" w:hAnsi="Cambria Math"/>
+          </w:rPr>
+          <m:t>20–23</m:t>
+        </m:r>
+      </m:oMath>
+      <w:r>
+        <w:t xml:space="preserve"> hs).</w:t>
       </w:r>
     </w:p>
     <w:p>
@@ -3441,7 +3398,29 @@
         </w:numPr>
       </w:pPr>
       <w:r>
-        <w:t>Modelar el tiempo de descenso de pasajeros mediante una distribución uniforme entre 10 y 25 minutos.</w:t>
+        <w:t xml:space="preserve">Modelar el tiempo de descenso de pasajeros mediante una distribución uniforme entre </w:t>
+      </w:r>
+      <m:oMath>
+        <m:r>
+          <w:rPr>
+            <w:rFonts w:ascii="Cambria Math" w:hAnsi="Cambria Math"/>
+          </w:rPr>
+          <m:t>10</m:t>
+        </m:r>
+      </m:oMath>
+      <w:r>
+        <w:t xml:space="preserve"> y </w:t>
+      </w:r>
+      <m:oMath>
+        <m:r>
+          <w:rPr>
+            <w:rFonts w:ascii="Cambria Math" w:hAnsi="Cambria Math"/>
+          </w:rPr>
+          <m:t>25</m:t>
+        </m:r>
+      </m:oMath>
+      <w:r>
+        <w:t xml:space="preserve"> minutos.</w:t>
       </w:r>
     </w:p>
     <w:p>
@@ -3452,7 +3431,14 @@
         </w:numPr>
       </w:pPr>
       <w:r>
-        <w:t>Diseñar la lógica de asignación de pista de aterrizaje: a cada avión se le asigna la pista con la cola más corta (o la primera en caso de empate).</w:t>
+        <w:lastRenderedPageBreak/>
+        <w:t xml:space="preserve">Diseñar la lógica de asignación de pista de aterrizaje: a cada avión se le asigna la pista con la cola más corta (o la </w:t>
+      </w:r>
+      <w:r>
+        <w:t>de ID menor</w:t>
+      </w:r>
+      <w:r>
+        <w:t xml:space="preserve"> en caso de empate).</w:t>
       </w:r>
     </w:p>
     <w:p>
@@ -3463,7 +3449,18 @@
         </w:numPr>
       </w:pPr>
       <w:r>
-        <w:t>Incorporar el desgaste de las pistas: cada pista inicia con 3000 unidades de durabilidad, y cada aterrizaje consume un desgaste generado según una distribución normal (</w:t>
+        <w:t xml:space="preserve">Incorporar el desgaste de las pistas: cada pista inicia con </w:t>
+      </w:r>
+      <m:oMath>
+        <m:r>
+          <w:rPr>
+            <w:rFonts w:ascii="Cambria Math" w:hAnsi="Cambria Math"/>
+          </w:rPr>
+          <m:t>3000</m:t>
+        </m:r>
+      </m:oMath>
+      <w:r>
+        <w:t xml:space="preserve"> unidades de durabilidad, y cada aterrizaje consume un desgaste generado según una distribución normal (</w:t>
       </w:r>
       <m:oMath>
         <m:r>
@@ -3496,129 +3493,24 @@
         </w:numPr>
       </w:pPr>
       <w:r>
-        <w:t xml:space="preserve">Calcular y reportar, a lo largo de 4 semanas de simulación, los mismos indicadores de la etapa anterior (cantidad de arribos y aterrizajes, tiempos de tránsito y espera —media, máximo y mínimo—, ocio de pista y tamaños de cola) más la durabilidad final de cada pista. </w:t>
-      </w:r>
-    </w:p>
-    <w:p>
-      <w:r>
-        <w:pict w14:anchorId="219E9160">
-          <v:rect id="_x0000_i1027" style="width:0;height:1.5pt" o:hralign="center" o:hrstd="t" o:hr="t" fillcolor="#a0a0a0" stroked="f"/>
-        </w:pict>
-      </w:r>
-    </w:p>
-    <w:p>
-      <w:pPr>
-        <w:pStyle w:val="Heading1"/>
-      </w:pPr>
-      <w:bookmarkStart w:id="11" w:name="_Toc201229737"/>
-      <w:r>
-        <w:t>Experiencia de Desarrollo</w:t>
-      </w:r>
-      <w:bookmarkEnd w:id="11"/>
-    </w:p>
-    <w:p>
-      <w:pPr>
-        <w:numPr>
-          <w:ilvl w:val="0"/>
-          <w:numId w:val="7"/>
-        </w:numPr>
-      </w:pPr>
-      <w:r>
-        <w:t xml:space="preserve">Tuvimos que refactorizar y readaptar nuestro modelo de dominio: </w:t>
-      </w:r>
-      <w:r>
-        <w:t>modificamos</w:t>
-      </w:r>
-      <w:r>
-        <w:t xml:space="preserve"> </w:t>
-      </w:r>
-      <w:r>
-        <w:t>nuestra</w:t>
-      </w:r>
-      <w:r>
-        <w:t xml:space="preserve"> clase</w:t>
-      </w:r>
-      <w:r>
-        <w:t xml:space="preserve"> </w:t>
+        <w:t xml:space="preserve">Calcular y reportar, a lo largo de </w:t>
       </w:r>
       <m:oMath>
         <m:r>
           <w:rPr>
             <w:rFonts w:ascii="Cambria Math" w:hAnsi="Cambria Math"/>
           </w:rPr>
-          <m:t>Statistics</m:t>
+          <m:t>4</m:t>
         </m:r>
       </m:oMath>
       <w:r>
-        <w:t xml:space="preserve"> </w:t>
-      </w:r>
-      <w:r>
-        <w:t xml:space="preserve">para que sea </w:t>
-      </w:r>
-      <w:r>
-        <w:t xml:space="preserve">capaz de manejar múltiples servidores, segregamos responsabilidades moviendo el atributo </w:t>
-      </w:r>
-      <w:proofErr w:type="spellStart"/>
-      <w:r>
-        <w:t>clock</w:t>
-      </w:r>
-      <w:proofErr w:type="spellEnd"/>
-      <w:r>
-        <w:t xml:space="preserve"> </w:t>
-      </w:r>
-      <w:r>
-        <w:t xml:space="preserve">de la clase </w:t>
-      </w:r>
-      <m:oMath>
-        <m:r>
-          <w:rPr>
-            <w:rFonts w:ascii="Cambria Math" w:hAnsi="Cambria Math"/>
-          </w:rPr>
-          <m:t>Bootstrapping</m:t>
-        </m:r>
-      </m:oMath>
-      <w:r>
-        <w:t xml:space="preserve"> </w:t>
-      </w:r>
-      <w:r>
-        <w:t>a una clase independiente, y diseñamos la arquitectura para que el usuario pueda añadir nuevas distribuciones de forma sencilla, cubriendo todas las especificadas en el informe.</w:t>
-      </w:r>
-    </w:p>
-    <w:p>
-      <w:pPr>
-        <w:numPr>
-          <w:ilvl w:val="0"/>
-          <w:numId w:val="7"/>
-        </w:numPr>
-      </w:pPr>
-      <w:r>
-        <w:lastRenderedPageBreak/>
-        <w:t>La mayor dificultad que enfrentamos en esta segunda etapa fue encontrar la mejor manera de permitir al usuario seleccionar y parametrizar las distintas distribuciones, especialmente la implementación dinámica de la distribución exponencial con medias variables en función de las horas pico.</w:t>
-      </w:r>
-    </w:p>
-    <w:p>
-      <w:pPr>
-        <w:numPr>
-          <w:ilvl w:val="0"/>
-          <w:numId w:val="7"/>
-        </w:numPr>
-      </w:pPr>
-      <w:r>
-        <w:t xml:space="preserve">Mejoramos todos los </w:t>
-      </w:r>
-      <w:proofErr w:type="spellStart"/>
-      <w:r>
-        <w:t>comparators</w:t>
-      </w:r>
-      <w:proofErr w:type="spellEnd"/>
-      <w:r>
-        <w:t xml:space="preserve"> de nuestras clases, asegurando un ordenamiento consistente y eficiente de los eventos en la FEL para cualquier número de servidores.</w:t>
-      </w:r>
-    </w:p>
-    <w:p>
-      <w:r>
-        <w:pict w14:anchorId="1CD6117E">
-          <v:rect id="_x0000_i1028" style="width:0;height:1.5pt" o:hralign="center" o:hrstd="t" o:hr="t" fillcolor="#a0a0a0" stroked="f"/>
+        <w:t xml:space="preserve"> semanas de simulación, los mismos indicadores de la etapa anterior (cantidad de arribos y aterrizajes, tiempos de tránsito y espera —media, máximo y mínimo—, ocio de pista y tamaños de cola) más la durabilidad final de cada pista. </w:t>
+      </w:r>
+    </w:p>
+    <w:p>
+      <w:r>
+        <w:pict w14:anchorId="219E9160">
+          <v:rect id="_x0000_i1030" style="width:0;height:1.5pt" o:hralign="center" o:hrstd="t" o:hr="t" fillcolor="#a0a0a0" stroked="f"/>
         </w:pict>
       </w:r>
     </w:p>
@@ -3626,6 +3518,7 @@
       <w:pPr>
         <w:pStyle w:val="Heading1"/>
       </w:pPr>
+      <w:bookmarkStart w:id="11" w:name="_Toc201229737"/>
       <w:bookmarkStart w:id="12" w:name="_Toc201229738"/>
       <w:r>
         <w:t>Modelo de Dominio</w:t>
@@ -3638,7 +3531,7 @@
           <w:noProof/>
         </w:rPr>
         <w:drawing>
-          <wp:inline distT="0" distB="0" distL="0" distR="0" wp14:anchorId="36C1D5F9" wp14:editId="625C1F0B">
+          <wp:inline distT="0" distB="0" distL="0" distR="0" wp14:anchorId="3B651165" wp14:editId="2F5935E5">
             <wp:extent cx="5731510" cy="3761105"/>
             <wp:effectExtent l="0" t="0" r="2540" b="0"/>
             <wp:docPr id="2127166571" name="Picture 1" descr="A diagram of a company&#10;&#10;AI-generated content may be incorrect."/>
@@ -3676,108 +3569,44 @@
     </w:p>
     <w:p>
       <w:r>
-        <w:br w:type="page"/>
-      </w:r>
-    </w:p>
-    <w:p>
-      <w:pPr>
-        <w:pStyle w:val="Title"/>
-      </w:pPr>
-      <w:bookmarkStart w:id="13" w:name="_Toc201229739"/>
-      <w:r>
-        <w:lastRenderedPageBreak/>
-        <w:t>Tercera etapa</w:t>
-      </w:r>
-      <w:bookmarkEnd w:id="13"/>
+        <w:pict w14:anchorId="4D96DA92">
+          <v:rect id="_x0000_i1039" style="width:0;height:1.5pt" o:hralign="center" o:hrstd="t" o:hr="t" fillcolor="#a0a0a0" stroked="f"/>
+        </w:pict>
+      </w:r>
     </w:p>
     <w:p>
       <w:pPr>
         <w:pStyle w:val="Heading1"/>
       </w:pPr>
-      <w:bookmarkStart w:id="14" w:name="_Toc201229740"/>
-      <w:r>
-        <w:t>Modelo</w:t>
-      </w:r>
-      <w:bookmarkEnd w:id="14"/>
-    </w:p>
-    <w:p/>
-    <w:p>
-      <w:pPr>
-        <w:pStyle w:val="Heading1"/>
-      </w:pPr>
-      <w:bookmarkStart w:id="15" w:name="_Toc201229741"/>
-      <w:r>
-        <w:t>Objetivos</w:t>
-      </w:r>
-      <w:bookmarkEnd w:id="15"/>
-    </w:p>
-    <w:p>
-      <w:r>
-        <w:t>E</w:t>
-      </w:r>
-      <w:r>
-        <w:t>n esta tercera y última etapa del proyecto, abordamos la experimentación estadística basada en replicaciones múltiples del simulador desarrollado. Los objetivos específicos de esta fase fueron:</w:t>
-      </w:r>
+      <w:r>
+        <w:t>Experiencia de Desarrollo</w:t>
+      </w:r>
+      <w:bookmarkEnd w:id="11"/>
     </w:p>
     <w:p>
       <w:pPr>
         <w:numPr>
           <w:ilvl w:val="0"/>
-          <w:numId w:val="8"/>
+          <w:numId w:val="7"/>
         </w:numPr>
       </w:pPr>
       <w:r>
-        <w:t>Realizar un experimento de simulación mediante 50 ejecuciones independientes para una configuración mejorada del aeropuerto, con el fin de obtener estimaciones estadísticas más robustas.</w:t>
-      </w:r>
-    </w:p>
-    <w:p>
-      <w:pPr>
-        <w:numPr>
-          <w:ilvl w:val="0"/>
-          <w:numId w:val="8"/>
-        </w:numPr>
-      </w:pPr>
-      <w:r>
-        <w:t>Calcular intervalos de confianza con un 95% de certeza para las métricas clave del sistema: cantidad total de arribos y aterrizajes, tiempos de tránsito y espera, tiempos de ocio, tamaño de la cola y durabilidad final de las pistas.</w:t>
-      </w:r>
-    </w:p>
-    <w:p>
-      <w:pPr>
-        <w:numPr>
-          <w:ilvl w:val="0"/>
-          <w:numId w:val="8"/>
-        </w:numPr>
-      </w:pPr>
-      <w:r>
-        <w:t>Aplicar mejoras al modelo, comparando su rendimiento con la configuración de la etapa anterior, y justificar dichas mejoras mediante análisis cuantitativo de los resultados simulados.</w:t>
-      </w:r>
-    </w:p>
-    <w:p>
-      <w:r>
-        <w:pict w14:anchorId="02C0FFE2">
-          <v:rect id="_x0000_i1029" style="width:0;height:1.5pt" o:hralign="center" o:hrstd="t" o:hr="t" fillcolor="#a0a0a0" stroked="f"/>
-        </w:pict>
-      </w:r>
-    </w:p>
-    <w:p>
-      <w:pPr>
-        <w:pStyle w:val="Heading1"/>
-      </w:pPr>
-      <w:bookmarkStart w:id="16" w:name="_Toc201229742"/>
-      <w:r>
-        <w:t>Experiencia de Desarrollo</w:t>
-      </w:r>
-      <w:bookmarkEnd w:id="16"/>
-    </w:p>
-    <w:p>
-      <w:pPr>
-        <w:numPr>
-          <w:ilvl w:val="0"/>
-          <w:numId w:val="9"/>
-        </w:numPr>
-      </w:pPr>
-      <w:r>
-        <w:t xml:space="preserve">Refactorizamos nuevamente las clases responsables de la recolección de estadísticas, ya que durante las primeras pruebas advertimos que nuestro diseño original no contemplaba correctamente la asociación de estadísticas con múltiples replicaciones. Esta omisión nos llevó a reestructurar las clases relacionadas a </w:t>
+        <w:t xml:space="preserve">Tuvimos que refactorizar y readaptar nuestro modelo de dominio: </w:t>
+      </w:r>
+      <w:r>
+        <w:t>modificamos</w:t>
+      </w:r>
+      <w:r>
+        <w:t xml:space="preserve"> </w:t>
+      </w:r>
+      <w:r>
+        <w:t>nuestra</w:t>
+      </w:r>
+      <w:r>
+        <w:t xml:space="preserve"> clase</w:t>
+      </w:r>
+      <w:r>
+        <w:t xml:space="preserve"> </w:t>
       </w:r>
       <m:oMath>
         <m:r>
@@ -3788,6 +3617,286 @@
         </m:r>
       </m:oMath>
       <w:r>
+        <w:t xml:space="preserve"> </w:t>
+      </w:r>
+      <w:r>
+        <w:t xml:space="preserve">para que sea </w:t>
+      </w:r>
+      <w:r>
+        <w:t xml:space="preserve">capaz de manejar múltiples servidores, </w:t>
+      </w:r>
+      <w:r>
+        <w:lastRenderedPageBreak/>
+        <w:t xml:space="preserve">segregamos responsabilidades moviendo el atributo </w:t>
+      </w:r>
+      <m:oMath>
+        <m:r>
+          <w:rPr>
+            <w:rFonts w:ascii="Cambria Math" w:hAnsi="Cambria Math"/>
+          </w:rPr>
+          <m:t>clock</m:t>
+        </m:r>
+        <m:r>
+          <w:rPr>
+            <w:rStyle w:val="FootnoteReference"/>
+            <w:rFonts w:ascii="Cambria Math" w:hAnsi="Cambria Math"/>
+            <w:i/>
+          </w:rPr>
+          <w:footnoteReference w:id="1"/>
+        </m:r>
+      </m:oMath>
+      <w:r>
+        <w:t xml:space="preserve"> </w:t>
+      </w:r>
+      <w:r>
+        <w:t xml:space="preserve">de la clase </w:t>
+      </w:r>
+      <m:oMath>
+        <m:r>
+          <w:rPr>
+            <w:rFonts w:ascii="Cambria Math" w:hAnsi="Cambria Math"/>
+          </w:rPr>
+          <m:t>Bootstrapping</m:t>
+        </m:r>
+      </m:oMath>
+      <w:r>
+        <w:t xml:space="preserve"> </w:t>
+      </w:r>
+      <w:r>
+        <w:t xml:space="preserve">a una clase </w:t>
+      </w:r>
+      <w:r>
+        <w:t xml:space="preserve">final; esto fue necesario para poder acceder al tiempo de simulación </w:t>
+      </w:r>
+      <w:r>
+        <w:rPr>
+          <w:rFonts w:eastAsiaTheme="minorEastAsia"/>
+        </w:rPr>
+        <w:t>(</w:t>
+      </w:r>
+      <m:oMath>
+        <m:r>
+          <w:rPr>
+            <w:rFonts w:ascii="Cambria Math" w:hAnsi="Cambria Math"/>
+          </w:rPr>
+          <m:t>clock</m:t>
+        </m:r>
+      </m:oMath>
+      <w:r>
+        <w:rPr>
+          <w:rFonts w:eastAsiaTheme="minorEastAsia"/>
+        </w:rPr>
+        <w:t>) desde la clase</w:t>
+      </w:r>
+      <w:r>
+        <w:rPr>
+          <w:rFonts w:eastAsiaTheme="minorEastAsia"/>
+        </w:rPr>
+        <w:t xml:space="preserve"> abstracta </w:t>
+      </w:r>
+      <m:oMath>
+        <m:r>
+          <w:rPr>
+            <w:rFonts w:ascii="Cambria Math" w:eastAsiaTheme="minorEastAsia" w:hAnsi="Cambria Math"/>
+          </w:rPr>
+          <m:t>DinamicEventDistribution</m:t>
+        </m:r>
+        <m:r>
+          <w:rPr>
+            <w:rStyle w:val="FootnoteReference"/>
+            <w:rFonts w:ascii="Cambria Math" w:eastAsiaTheme="minorEastAsia" w:hAnsi="Cambria Math"/>
+            <w:i/>
+          </w:rPr>
+          <w:footnoteReference w:id="2"/>
+        </m:r>
+      </m:oMath>
+      <w:r>
+        <w:t>. Además,</w:t>
+      </w:r>
+      <w:r>
+        <w:t xml:space="preserve"> </w:t>
+      </w:r>
+      <w:r>
+        <w:t xml:space="preserve">creamos la interface </w:t>
+      </w:r>
+      <m:oMath>
+        <m:r>
+          <w:rPr>
+            <w:rFonts w:ascii="Cambria Math" w:hAnsi="Cambria Math"/>
+          </w:rPr>
+          <m:t>Distribution</m:t>
+        </m:r>
+        <m:r>
+          <w:rPr>
+            <w:rStyle w:val="FootnoteReference"/>
+            <w:rFonts w:ascii="Cambria Math" w:hAnsi="Cambria Math"/>
+            <w:i/>
+          </w:rPr>
+          <w:footnoteReference w:id="3"/>
+        </m:r>
+      </m:oMath>
+      <w:r>
+        <w:rPr>
+          <w:rFonts w:eastAsiaTheme="minorEastAsia"/>
+        </w:rPr>
+        <w:t>, la cual permite</w:t>
+      </w:r>
+      <w:r>
+        <w:t xml:space="preserve"> que el</w:t>
+      </w:r>
+      <w:r>
+        <w:rPr>
+          <w:lang w:val="es-ES"/>
+        </w:rPr>
+        <w:t xml:space="preserve"> </w:t>
+      </w:r>
+      <w:r>
+        <w:t>usuario pueda añadir nuevas distribuciones de forma sencilla.</w:t>
+      </w:r>
+    </w:p>
+    <w:p>
+      <w:pPr>
+        <w:numPr>
+          <w:ilvl w:val="0"/>
+          <w:numId w:val="7"/>
+        </w:numPr>
+      </w:pPr>
+      <w:r>
+        <w:t>La mayor dificultad que enfrentamos en esta segunda etapa fue encontrar la mejor manera de permitir al usuario seleccionar y parametrizar las distintas distribuciones, especialmente la implementación dinámica de la distribución exponencial con medias variables en función de las horas pico.</w:t>
+      </w:r>
+    </w:p>
+    <w:p>
+      <w:pPr>
+        <w:numPr>
+          <w:ilvl w:val="0"/>
+          <w:numId w:val="7"/>
+        </w:numPr>
+      </w:pPr>
+      <w:r>
+        <w:t>Mejoramos todos los comparators de nuestras clases, asegurando un ordenamiento consistente y eficiente de los eventos en la FEL para cualquier número de servidores.</w:t>
+      </w:r>
+    </w:p>
+    <w:p>
+      <w:r>
+        <w:pict w14:anchorId="1CD6117E">
+          <v:rect id="_x0000_i1031" style="width:0;height:1.5pt" o:hralign="center" o:hrstd="t" o:hr="t" fillcolor="#a0a0a0" stroked="f"/>
+        </w:pict>
+      </w:r>
+    </w:p>
+    <w:p>
+      <w:r>
+        <w:br w:type="page"/>
+      </w:r>
+    </w:p>
+    <w:p>
+      <w:pPr>
+        <w:pStyle w:val="Title"/>
+      </w:pPr>
+      <w:bookmarkStart w:id="13" w:name="_Toc201229739"/>
+      <w:r>
+        <w:lastRenderedPageBreak/>
+        <w:t>Tercera etapa</w:t>
+      </w:r>
+      <w:bookmarkEnd w:id="13"/>
+    </w:p>
+    <w:p>
+      <w:pPr>
+        <w:pStyle w:val="Heading1"/>
+      </w:pPr>
+      <w:bookmarkStart w:id="14" w:name="_Toc201229740"/>
+      <w:r>
+        <w:t>Modelo</w:t>
+      </w:r>
+      <w:bookmarkEnd w:id="14"/>
+    </w:p>
+    <w:p/>
+    <w:p>
+      <w:pPr>
+        <w:pStyle w:val="Heading1"/>
+      </w:pPr>
+      <w:bookmarkStart w:id="15" w:name="_Toc201229741"/>
+      <w:r>
+        <w:t>Objetivos</w:t>
+      </w:r>
+      <w:bookmarkEnd w:id="15"/>
+    </w:p>
+    <w:p>
+      <w:r>
+        <w:t>E</w:t>
+      </w:r>
+      <w:r>
+        <w:t>n esta tercera y última etapa del proyecto, abordamos la experimentación estadística basada en replicaciones múltiples del simulador desarrollado. Los objetivos específicos de esta fase fueron:</w:t>
+      </w:r>
+    </w:p>
+    <w:p>
+      <w:pPr>
+        <w:numPr>
+          <w:ilvl w:val="0"/>
+          <w:numId w:val="8"/>
+        </w:numPr>
+      </w:pPr>
+      <w:r>
+        <w:t>Realizar un experimento de simulación mediante 50 ejecuciones independientes para una configuración mejorada del aeropuerto, con el fin de obtener estimaciones estadísticas más robustas.</w:t>
+      </w:r>
+    </w:p>
+    <w:p>
+      <w:pPr>
+        <w:numPr>
+          <w:ilvl w:val="0"/>
+          <w:numId w:val="8"/>
+        </w:numPr>
+      </w:pPr>
+      <w:r>
+        <w:t>Calcular intervalos de confianza con un 95% de certeza para las métricas clave del sistema: cantidad total de arribos y aterrizajes, tiempos de tránsito y espera, tiempos de ocio, tamaño de la cola y durabilidad final de las pistas.</w:t>
+      </w:r>
+    </w:p>
+    <w:p>
+      <w:pPr>
+        <w:numPr>
+          <w:ilvl w:val="0"/>
+          <w:numId w:val="8"/>
+        </w:numPr>
+      </w:pPr>
+      <w:r>
+        <w:t>Aplicar mejoras al modelo, comparando su rendimiento con la configuración de la etapa anterior, y justificar dichas mejoras mediante análisis cuantitativo de los resultados simulados.</w:t>
+      </w:r>
+    </w:p>
+    <w:p>
+      <w:r>
+        <w:pict w14:anchorId="02C0FFE2">
+          <v:rect id="_x0000_i1032" style="width:0;height:1.5pt" o:hralign="center" o:hrstd="t" o:hr="t" fillcolor="#a0a0a0" stroked="f"/>
+        </w:pict>
+      </w:r>
+    </w:p>
+    <w:p>
+      <w:pPr>
+        <w:pStyle w:val="Heading1"/>
+      </w:pPr>
+      <w:bookmarkStart w:id="16" w:name="_Toc201229742"/>
+      <w:r>
+        <w:t>Experiencia de Desarrollo</w:t>
+      </w:r>
+      <w:bookmarkEnd w:id="16"/>
+    </w:p>
+    <w:p>
+      <w:pPr>
+        <w:numPr>
+          <w:ilvl w:val="0"/>
+          <w:numId w:val="9"/>
+        </w:numPr>
+      </w:pPr>
+      <w:r>
+        <w:t xml:space="preserve">Refactorizamos nuevamente las clases responsables de la recolección de estadísticas, ya que durante las primeras pruebas advertimos que nuestro diseño original no contemplaba correctamente la asociación de estadísticas con múltiples replicaciones. Esta omisión nos llevó a reestructurar las clases relacionadas a </w:t>
+      </w:r>
+      <m:oMath>
+        <m:r>
+          <w:rPr>
+            <w:rFonts w:ascii="Cambria Math" w:hAnsi="Cambria Math"/>
+          </w:rPr>
+          <m:t>Statistics</m:t>
+        </m:r>
+      </m:oMath>
+      <w:r>
         <w:t>, logrando una correcta separación entre estadísticas individuales y agregadas.</w:t>
       </w:r>
     </w:p>
@@ -3836,29 +3945,13 @@
         </w:numPr>
       </w:pPr>
       <w:r>
-        <w:t xml:space="preserve">Para calcular los intervalos de confianza de cada estadística, integramos programación funcional en Java (lambdas y </w:t>
-      </w:r>
-      <w:proofErr w:type="spellStart"/>
-      <w:r>
-        <w:t>streams</w:t>
-      </w:r>
-      <w:proofErr w:type="spellEnd"/>
-      <w:r>
-        <w:t xml:space="preserve">), lo que mejoró considerablemente la legibilidad, eficiencia y concisión del código. Esta mejora se extendió también a clases de etapas previas, como los </w:t>
-      </w:r>
-      <w:proofErr w:type="spellStart"/>
-      <w:r>
-        <w:t>Comparators</w:t>
-      </w:r>
-      <w:proofErr w:type="spellEnd"/>
-      <w:r>
-        <w:t>, donde aplicamos funciones lambda para simplificar la lógica de ordenamiento de eventos y selección de servidores.</w:t>
+        <w:t>Para calcular los intervalos de confianza de cada estadística, integramos programación funcional en Java (lambdas y streams), lo que mejoró considerablemente la legibilidad, eficiencia y concisión del código. Esta mejora se extendió también a clases de etapas previas, como los Comparators, donde aplicamos funciones lambda para simplificar la lógica de ordenamiento de eventos y selección de servidores.</w:t>
       </w:r>
     </w:p>
     <w:p>
       <w:r>
         <w:pict w14:anchorId="0594FD9A">
-          <v:rect id="_x0000_i1222" style="width:0;height:1.5pt" o:hralign="center" o:hrstd="t" o:hr="t" fillcolor="#a0a0a0" stroked="f"/>
+          <v:rect id="_x0000_i1033" style="width:0;height:1.5pt" o:hralign="center" o:hrstd="t" o:hr="t" fillcolor="#a0a0a0" stroked="f"/>
         </w:pict>
       </w:r>
     </w:p>
@@ -3873,13 +3966,6 @@
     <w:bookmarkStart w:id="17" w:name="_Toc201229743" w:displacedByCustomXml="next"/>
     <w:sdt>
       <w:sdtPr>
-        <w:id w:val="-1025088066"/>
-        <w:docPartObj>
-          <w:docPartGallery w:val="Bibliographies"/>
-          <w:docPartUnique/>
-        </w:docPartObj>
-      </w:sdtPr>
-      <w:sdtEndPr>
         <w:rPr>
           <w:rFonts w:asciiTheme="minorHAnsi" w:eastAsiaTheme="minorHAnsi" w:hAnsiTheme="minorHAnsi" w:cstheme="minorBidi"/>
           <w:b w:val="0"/>
@@ -3888,7 +3974,12 @@
           <w:sz w:val="24"/>
           <w:szCs w:val="22"/>
         </w:rPr>
-      </w:sdtEndPr>
+        <w:id w:val="-1025088066"/>
+        <w:docPartObj>
+          <w:docPartGallery w:val="Bibliographies"/>
+          <w:docPartUnique/>
+        </w:docPartObj>
+      </w:sdtPr>
       <w:sdtContent>
         <w:p>
           <w:pPr>
@@ -4238,7 +4329,7 @@
 </file>
 
 <file path=word/endnotes.xml><?xml version="1.0" encoding="utf-8"?>
-<w:endnotes xmlns:wpc="http://schemas.microsoft.com/office/word/2010/wordprocessingCanvas" xmlns:cx="http://schemas.microsoft.com/office/drawing/2014/chartex" xmlns:cx1="http://schemas.microsoft.com/office/drawing/2015/9/8/chartex" xmlns:cx2="http://schemas.microsoft.com/office/drawing/2015/10/21/chartex" xmlns:cx3="http://schemas.microsoft.com/office/drawing/2016/5/9/chartex" xmlns:cx4="http://schemas.microsoft.com/office/drawing/2016/5/10/chartex" xmlns:cx5="http://schemas.microsoft.com/office/drawing/2016/5/11/chartex" xmlns:cx6="http://schemas.microsoft.com/office/drawing/2016/5/12/chartex" xmlns:cx7="http://schemas.microsoft.com/office/drawing/2016/5/13/chartex" xmlns:cx8="http://schemas.microsoft.com/office/drawing/2016/5/14/chartex" xmlns:mc="http://schemas.openxmlformats.org/markup-compatibility/2006" xmlns:aink="http://schemas.microsoft.com/office/drawing/2016/ink" xmlns:am3d="http://schemas.microsoft.com/office/drawing/2017/model3d" xmlns:o="urn:schemas-microsoft-com:office:office" xmlns:oel="http://schemas.microsoft.com/office/2019/extlst" xmlns:r="http://schemas.openxmlformats.org/officeDocument/2006/relationships" xmlns:m="http://schemas.openxmlformats.org/officeDocument/2006/math" xmlns:v="urn:schemas-microsoft-com:vml" xmlns:wp14="http://schemas.microsoft.com/office/word/2010/wordprocessingDrawing" xmlns:wp="http://schemas.openxmlformats.org/drawingml/2006/wordprocessingDrawing" xmlns:w10="urn:schemas-microsoft-com:office:word" xmlns:w="http://schemas.openxmlformats.org/wordprocessingml/2006/main" xmlns:w14="http://schemas.microsoft.com/office/word/2010/wordml" xmlns:w15="http://schemas.microsoft.com/office/word/2012/wordml" xmlns:w16cex="http://schemas.microsoft.com/office/word/2018/wordml/cex" xmlns:w16cid="http://schemas.microsoft.com/office/word/2016/wordml/cid" xmlns:w16="http://schemas.microsoft.com/office/word/2018/wordml" xmlns:w16du="http://schemas.microsoft.com/office/word/2023/wordml/word16du" xmlns:w16sdtdh="http://schemas.microsoft.com/office/word/2020/wordml/sdtdatahash" xmlns:w16sdtfl="http://schemas.microsoft.com/office/word/2024/wordml/sdtformatlock" xmlns:w16se="http://schemas.microsoft.com/office/word/2015/wordml/symex" xmlns:wpg="http://schemas.microsoft.com/office/word/2010/wordprocessingGroup" xmlns:wpi="http://schemas.microsoft.com/office/word/2010/wordprocessingInk" xmlns:wne="http://schemas.microsoft.com/office/word/2006/wordml" xmlns:wps="http://schemas.microsoft.com/office/word/2010/wordprocessingShape" mc:Ignorable="w14 w15 w16se w16cid w16 w16cex w16sdtdh w16sdtfl w16du wp14">
+<w:endnotes xmlns:wpc="http://schemas.microsoft.com/office/word/2010/wordprocessingCanvas" xmlns:cx="http://schemas.microsoft.com/office/drawing/2014/chartex" xmlns:cx1="http://schemas.microsoft.com/office/drawing/2015/9/8/chartex" xmlns:cx2="http://schemas.microsoft.com/office/drawing/2015/10/21/chartex" xmlns:cx3="http://schemas.microsoft.com/office/drawing/2016/5/9/chartex" xmlns:cx4="http://schemas.microsoft.com/office/drawing/2016/5/10/chartex" xmlns:cx5="http://schemas.microsoft.com/office/drawing/2016/5/11/chartex" xmlns:cx6="http://schemas.microsoft.com/office/drawing/2016/5/12/chartex" xmlns:cx7="http://schemas.microsoft.com/office/drawing/2016/5/13/chartex" xmlns:cx8="http://schemas.microsoft.com/office/drawing/2016/5/14/chartex" xmlns:mc="http://schemas.openxmlformats.org/markup-compatibility/2006" xmlns:aink="http://schemas.microsoft.com/office/drawing/2016/ink" xmlns:am3d="http://schemas.microsoft.com/office/drawing/2017/model3d" xmlns:o="urn:schemas-microsoft-com:office:office" xmlns:oel="http://schemas.microsoft.com/office/2019/extlst" xmlns:r="http://schemas.openxmlformats.org/officeDocument/2006/relationships" xmlns:m="http://schemas.openxmlformats.org/officeDocument/2006/math" xmlns:v="urn:schemas-microsoft-com:vml" xmlns:wp14="http://schemas.microsoft.com/office/word/2010/wordprocessingDrawing" xmlns:wp="http://schemas.openxmlformats.org/drawingml/2006/wordprocessingDrawing" xmlns:w10="urn:schemas-microsoft-com:office:word" xmlns:w="http://schemas.openxmlformats.org/wordprocessingml/2006/main" xmlns:w14="http://schemas.microsoft.com/office/word/2010/wordml" xmlns:w15="http://schemas.microsoft.com/office/word/2012/wordml" xmlns:w16cex="http://schemas.microsoft.com/office/word/2018/wordml/cex" xmlns:w16cid="http://schemas.microsoft.com/office/word/2016/wordml/cid" xmlns:w16="http://schemas.microsoft.com/office/word/2018/wordml" xmlns:w16sdtdh="http://schemas.microsoft.com/office/word/2020/wordml/sdtdatahash" xmlns:w16se="http://schemas.microsoft.com/office/word/2015/wordml/symex" xmlns:wpg="http://schemas.microsoft.com/office/word/2010/wordprocessingGroup" xmlns:wpi="http://schemas.microsoft.com/office/word/2010/wordprocessingInk" xmlns:wne="http://schemas.microsoft.com/office/word/2006/wordml" xmlns:wps="http://schemas.microsoft.com/office/word/2010/wordprocessingShape" mc:Ignorable="w14 w15 w16se w16cid w16 w16cex w16sdtdh wp14">
   <w:endnote w:type="separator" w:id="-1">
     <w:p>
       <w:pPr>
@@ -4263,7 +4354,7 @@
 </file>
 
 <file path=word/footer1.xml><?xml version="1.0" encoding="utf-8"?>
-<w:ftr xmlns:wpc="http://schemas.microsoft.com/office/word/2010/wordprocessingCanvas" xmlns:cx="http://schemas.microsoft.com/office/drawing/2014/chartex" xmlns:cx1="http://schemas.microsoft.com/office/drawing/2015/9/8/chartex" xmlns:cx2="http://schemas.microsoft.com/office/drawing/2015/10/21/chartex" xmlns:cx3="http://schemas.microsoft.com/office/drawing/2016/5/9/chartex" xmlns:cx4="http://schemas.microsoft.com/office/drawing/2016/5/10/chartex" xmlns:cx5="http://schemas.microsoft.com/office/drawing/2016/5/11/chartex" xmlns:cx6="http://schemas.microsoft.com/office/drawing/2016/5/12/chartex" xmlns:cx7="http://schemas.microsoft.com/office/drawing/2016/5/13/chartex" xmlns:cx8="http://schemas.microsoft.com/office/drawing/2016/5/14/chartex" xmlns:mc="http://schemas.openxmlformats.org/markup-compatibility/2006" xmlns:aink="http://schemas.microsoft.com/office/drawing/2016/ink" xmlns:am3d="http://schemas.microsoft.com/office/drawing/2017/model3d" xmlns:o="urn:schemas-microsoft-com:office:office" xmlns:oel="http://schemas.microsoft.com/office/2019/extlst" xmlns:r="http://schemas.openxmlformats.org/officeDocument/2006/relationships" xmlns:m="http://schemas.openxmlformats.org/officeDocument/2006/math" xmlns:v="urn:schemas-microsoft-com:vml" xmlns:wp14="http://schemas.microsoft.com/office/word/2010/wordprocessingDrawing" xmlns:wp="http://schemas.openxmlformats.org/drawingml/2006/wordprocessingDrawing" xmlns:w10="urn:schemas-microsoft-com:office:word" xmlns:w="http://schemas.openxmlformats.org/wordprocessingml/2006/main" xmlns:w14="http://schemas.microsoft.com/office/word/2010/wordml" xmlns:w15="http://schemas.microsoft.com/office/word/2012/wordml" xmlns:w16cex="http://schemas.microsoft.com/office/word/2018/wordml/cex" xmlns:w16cid="http://schemas.microsoft.com/office/word/2016/wordml/cid" xmlns:w16="http://schemas.microsoft.com/office/word/2018/wordml" xmlns:w16du="http://schemas.microsoft.com/office/word/2023/wordml/word16du" xmlns:w16sdtdh="http://schemas.microsoft.com/office/word/2020/wordml/sdtdatahash" xmlns:w16sdtfl="http://schemas.microsoft.com/office/word/2024/wordml/sdtformatlock" xmlns:w16se="http://schemas.microsoft.com/office/word/2015/wordml/symex" xmlns:wpg="http://schemas.microsoft.com/office/word/2010/wordprocessingGroup" xmlns:wpi="http://schemas.microsoft.com/office/word/2010/wordprocessingInk" xmlns:wne="http://schemas.microsoft.com/office/word/2006/wordml" xmlns:wps="http://schemas.microsoft.com/office/word/2010/wordprocessingShape" mc:Ignorable="w14 w15 w16se w16cid w16 w16cex w16sdtdh w16sdtfl w16du wp14">
+<w:ftr xmlns:wpc="http://schemas.microsoft.com/office/word/2010/wordprocessingCanvas" xmlns:cx="http://schemas.microsoft.com/office/drawing/2014/chartex" xmlns:cx1="http://schemas.microsoft.com/office/drawing/2015/9/8/chartex" xmlns:cx2="http://schemas.microsoft.com/office/drawing/2015/10/21/chartex" xmlns:cx3="http://schemas.microsoft.com/office/drawing/2016/5/9/chartex" xmlns:cx4="http://schemas.microsoft.com/office/drawing/2016/5/10/chartex" xmlns:cx5="http://schemas.microsoft.com/office/drawing/2016/5/11/chartex" xmlns:cx6="http://schemas.microsoft.com/office/drawing/2016/5/12/chartex" xmlns:cx7="http://schemas.microsoft.com/office/drawing/2016/5/13/chartex" xmlns:cx8="http://schemas.microsoft.com/office/drawing/2016/5/14/chartex" xmlns:mc="http://schemas.openxmlformats.org/markup-compatibility/2006" xmlns:aink="http://schemas.microsoft.com/office/drawing/2016/ink" xmlns:am3d="http://schemas.microsoft.com/office/drawing/2017/model3d" xmlns:o="urn:schemas-microsoft-com:office:office" xmlns:oel="http://schemas.microsoft.com/office/2019/extlst" xmlns:r="http://schemas.openxmlformats.org/officeDocument/2006/relationships" xmlns:m="http://schemas.openxmlformats.org/officeDocument/2006/math" xmlns:v="urn:schemas-microsoft-com:vml" xmlns:wp14="http://schemas.microsoft.com/office/word/2010/wordprocessingDrawing" xmlns:wp="http://schemas.openxmlformats.org/drawingml/2006/wordprocessingDrawing" xmlns:w10="urn:schemas-microsoft-com:office:word" xmlns:w="http://schemas.openxmlformats.org/wordprocessingml/2006/main" xmlns:w14="http://schemas.microsoft.com/office/word/2010/wordml" xmlns:w15="http://schemas.microsoft.com/office/word/2012/wordml" xmlns:w16cex="http://schemas.microsoft.com/office/word/2018/wordml/cex" xmlns:w16cid="http://schemas.microsoft.com/office/word/2016/wordml/cid" xmlns:w16="http://schemas.microsoft.com/office/word/2018/wordml" xmlns:w16sdtdh="http://schemas.microsoft.com/office/word/2020/wordml/sdtdatahash" xmlns:w16se="http://schemas.microsoft.com/office/word/2015/wordml/symex" xmlns:wpg="http://schemas.microsoft.com/office/word/2010/wordprocessingGroup" xmlns:wpi="http://schemas.microsoft.com/office/word/2010/wordprocessingInk" xmlns:wne="http://schemas.microsoft.com/office/word/2006/wordml" xmlns:wps="http://schemas.microsoft.com/office/word/2010/wordprocessingShape" mc:Ignorable="w14 w15 w16se w16cid w16 w16cex w16sdtdh wp14">
   <w:p>
     <w:pPr>
       <w:pStyle w:val="Footer"/>
@@ -4338,7 +4429,7 @@
 </file>
 
 <file path=word/footnotes.xml><?xml version="1.0" encoding="utf-8"?>
-<w:footnotes xmlns:wpc="http://schemas.microsoft.com/office/word/2010/wordprocessingCanvas" xmlns:cx="http://schemas.microsoft.com/office/drawing/2014/chartex" xmlns:cx1="http://schemas.microsoft.com/office/drawing/2015/9/8/chartex" xmlns:cx2="http://schemas.microsoft.com/office/drawing/2015/10/21/chartex" xmlns:cx3="http://schemas.microsoft.com/office/drawing/2016/5/9/chartex" xmlns:cx4="http://schemas.microsoft.com/office/drawing/2016/5/10/chartex" xmlns:cx5="http://schemas.microsoft.com/office/drawing/2016/5/11/chartex" xmlns:cx6="http://schemas.microsoft.com/office/drawing/2016/5/12/chartex" xmlns:cx7="http://schemas.microsoft.com/office/drawing/2016/5/13/chartex" xmlns:cx8="http://schemas.microsoft.com/office/drawing/2016/5/14/chartex" xmlns:mc="http://schemas.openxmlformats.org/markup-compatibility/2006" xmlns:aink="http://schemas.microsoft.com/office/drawing/2016/ink" xmlns:am3d="http://schemas.microsoft.com/office/drawing/2017/model3d" xmlns:o="urn:schemas-microsoft-com:office:office" xmlns:oel="http://schemas.microsoft.com/office/2019/extlst" xmlns:r="http://schemas.openxmlformats.org/officeDocument/2006/relationships" xmlns:m="http://schemas.openxmlformats.org/officeDocument/2006/math" xmlns:v="urn:schemas-microsoft-com:vml" xmlns:wp14="http://schemas.microsoft.com/office/word/2010/wordprocessingDrawing" xmlns:wp="http://schemas.openxmlformats.org/drawingml/2006/wordprocessingDrawing" xmlns:w10="urn:schemas-microsoft-com:office:word" xmlns:w="http://schemas.openxmlformats.org/wordprocessingml/2006/main" xmlns:w14="http://schemas.microsoft.com/office/word/2010/wordml" xmlns:w15="http://schemas.microsoft.com/office/word/2012/wordml" xmlns:w16cex="http://schemas.microsoft.com/office/word/2018/wordml/cex" xmlns:w16cid="http://schemas.microsoft.com/office/word/2016/wordml/cid" xmlns:w16="http://schemas.microsoft.com/office/word/2018/wordml" xmlns:w16du="http://schemas.microsoft.com/office/word/2023/wordml/word16du" xmlns:w16sdtdh="http://schemas.microsoft.com/office/word/2020/wordml/sdtdatahash" xmlns:w16sdtfl="http://schemas.microsoft.com/office/word/2024/wordml/sdtformatlock" xmlns:w16se="http://schemas.microsoft.com/office/word/2015/wordml/symex" xmlns:wpg="http://schemas.microsoft.com/office/word/2010/wordprocessingGroup" xmlns:wpi="http://schemas.microsoft.com/office/word/2010/wordprocessingInk" xmlns:wne="http://schemas.microsoft.com/office/word/2006/wordml" xmlns:wps="http://schemas.microsoft.com/office/word/2010/wordprocessingShape" mc:Ignorable="w14 w15 w16se w16cid w16 w16cex w16sdtdh w16sdtfl w16du wp14">
+<w:footnotes xmlns:wpc="http://schemas.microsoft.com/office/word/2010/wordprocessingCanvas" xmlns:cx="http://schemas.microsoft.com/office/drawing/2014/chartex" xmlns:cx1="http://schemas.microsoft.com/office/drawing/2015/9/8/chartex" xmlns:cx2="http://schemas.microsoft.com/office/drawing/2015/10/21/chartex" xmlns:cx3="http://schemas.microsoft.com/office/drawing/2016/5/9/chartex" xmlns:cx4="http://schemas.microsoft.com/office/drawing/2016/5/10/chartex" xmlns:cx5="http://schemas.microsoft.com/office/drawing/2016/5/11/chartex" xmlns:cx6="http://schemas.microsoft.com/office/drawing/2016/5/12/chartex" xmlns:cx7="http://schemas.microsoft.com/office/drawing/2016/5/13/chartex" xmlns:cx8="http://schemas.microsoft.com/office/drawing/2016/5/14/chartex" xmlns:mc="http://schemas.openxmlformats.org/markup-compatibility/2006" xmlns:aink="http://schemas.microsoft.com/office/drawing/2016/ink" xmlns:am3d="http://schemas.microsoft.com/office/drawing/2017/model3d" xmlns:o="urn:schemas-microsoft-com:office:office" xmlns:oel="http://schemas.microsoft.com/office/2019/extlst" xmlns:r="http://schemas.openxmlformats.org/officeDocument/2006/relationships" xmlns:m="http://schemas.openxmlformats.org/officeDocument/2006/math" xmlns:v="urn:schemas-microsoft-com:vml" xmlns:wp14="http://schemas.microsoft.com/office/word/2010/wordprocessingDrawing" xmlns:wp="http://schemas.openxmlformats.org/drawingml/2006/wordprocessingDrawing" xmlns:w10="urn:schemas-microsoft-com:office:word" xmlns:w="http://schemas.openxmlformats.org/wordprocessingml/2006/main" xmlns:w14="http://schemas.microsoft.com/office/word/2010/wordml" xmlns:w15="http://schemas.microsoft.com/office/word/2012/wordml" xmlns:w16cex="http://schemas.microsoft.com/office/word/2018/wordml/cex" xmlns:w16cid="http://schemas.microsoft.com/office/word/2016/wordml/cid" xmlns:w16="http://schemas.microsoft.com/office/word/2018/wordml" xmlns:w16sdtdh="http://schemas.microsoft.com/office/word/2020/wordml/sdtdatahash" xmlns:w16se="http://schemas.microsoft.com/office/word/2015/wordml/symex" xmlns:wpg="http://schemas.microsoft.com/office/word/2010/wordprocessingGroup" xmlns:wpi="http://schemas.microsoft.com/office/word/2010/wordprocessingInk" xmlns:wne="http://schemas.microsoft.com/office/word/2006/wordml" xmlns:wps="http://schemas.microsoft.com/office/word/2010/wordprocessingShape" mc:Ignorable="w14 w15 w16se w16cid w16 w16cex w16sdtdh wp14">
   <w:footnote w:type="separator" w:id="-1">
     <w:p>
       <w:pPr>
@@ -4356,6 +4447,111 @@
       </w:pPr>
       <w:r>
         <w:continuationSeparator/>
+      </w:r>
+    </w:p>
+  </w:footnote>
+  <w:footnote w:id="1">
+    <w:p>
+      <w:pPr>
+        <w:pStyle w:val="FootnoteText"/>
+        <w:rPr>
+          <w:lang w:val="es-ES"/>
+        </w:rPr>
+      </w:pPr>
+      <w:r>
+        <w:rPr>
+          <w:rStyle w:val="FootnoteReference"/>
+        </w:rPr>
+        <w:footnoteRef/>
+      </w:r>
+      <w:r>
+        <w:t xml:space="preserve"> </w:t>
+      </w:r>
+      <m:oMath>
+        <m:r>
+          <w:rPr>
+            <w:rFonts w:ascii="Cambria Math" w:hAnsi="Cambria Math"/>
+          </w:rPr>
+          <m:t>clock</m:t>
+        </m:r>
+      </m:oMath>
+      <w:r>
+        <w:rPr>
+          <w:rFonts w:eastAsiaTheme="minorEastAsia"/>
+        </w:rPr>
+        <w:t xml:space="preserve"> es el atributo encargado de almacenar el tiempo actual de la simulación.</w:t>
+      </w:r>
+    </w:p>
+  </w:footnote>
+  <w:footnote w:id="2">
+    <w:p>
+      <w:pPr>
+        <w:pStyle w:val="FootnoteText"/>
+        <w:rPr>
+          <w:lang w:val="es-ES"/>
+        </w:rPr>
+      </w:pPr>
+      <w:r>
+        <w:rPr>
+          <w:rStyle w:val="FootnoteReference"/>
+        </w:rPr>
+        <w:footnoteRef/>
+      </w:r>
+      <w:r>
+        <w:t xml:space="preserve"> </w:t>
+      </w:r>
+      <m:oMath>
+        <m:r>
+          <w:rPr>
+            <w:rFonts w:ascii="Cambria Math" w:eastAsiaTheme="minorEastAsia" w:hAnsi="Cambria Math"/>
+          </w:rPr>
+          <m:t>DinamicEventDistribution</m:t>
+        </m:r>
+      </m:oMath>
+      <w:r>
+        <w:rPr>
+          <w:rFonts w:eastAsiaTheme="minorEastAsia"/>
+        </w:rPr>
+        <w:t xml:space="preserve"> se encarga de permitir la creación de clases que implementan distribuciones dinámicas.</w:t>
+      </w:r>
+    </w:p>
+  </w:footnote>
+  <w:footnote w:id="3">
+    <w:p>
+      <w:pPr>
+        <w:pStyle w:val="FootnoteText"/>
+        <w:rPr>
+          <w:lang w:val="es-ES"/>
+        </w:rPr>
+      </w:pPr>
+      <w:r>
+        <w:rPr>
+          <w:rStyle w:val="FootnoteReference"/>
+        </w:rPr>
+        <w:footnoteRef/>
+      </w:r>
+      <w:r>
+        <w:t xml:space="preserve"> </w:t>
+      </w:r>
+      <m:oMath>
+        <m:r>
+          <w:rPr>
+            <w:rFonts w:ascii="Cambria Math" w:hAnsi="Cambria Math"/>
+          </w:rPr>
+          <m:t>Distribution</m:t>
+        </m:r>
+      </m:oMath>
+      <w:r>
+        <w:rPr>
+          <w:rFonts w:eastAsiaTheme="minorEastAsia"/>
+        </w:rPr>
+        <w:t xml:space="preserve"> es una interfaz que especifica el comportamiento que deberá tener una distribución específica </w:t>
+      </w:r>
+      <w:r>
+        <w:rPr>
+          <w:rFonts w:eastAsiaTheme="minorEastAsia"/>
+        </w:rPr>
+        <w:t>de la clase que la implemente.</w:t>
       </w:r>
     </w:p>
   </w:footnote>
@@ -4363,7 +4559,7 @@
 </file>
 
 <file path=word/header1.xml><?xml version="1.0" encoding="utf-8"?>
-<w:hdr xmlns:wpc="http://schemas.microsoft.com/office/word/2010/wordprocessingCanvas" xmlns:cx="http://schemas.microsoft.com/office/drawing/2014/chartex" xmlns:cx1="http://schemas.microsoft.com/office/drawing/2015/9/8/chartex" xmlns:cx2="http://schemas.microsoft.com/office/drawing/2015/10/21/chartex" xmlns:cx3="http://schemas.microsoft.com/office/drawing/2016/5/9/chartex" xmlns:cx4="http://schemas.microsoft.com/office/drawing/2016/5/10/chartex" xmlns:cx5="http://schemas.microsoft.com/office/drawing/2016/5/11/chartex" xmlns:cx6="http://schemas.microsoft.com/office/drawing/2016/5/12/chartex" xmlns:cx7="http://schemas.microsoft.com/office/drawing/2016/5/13/chartex" xmlns:cx8="http://schemas.microsoft.com/office/drawing/2016/5/14/chartex" xmlns:mc="http://schemas.openxmlformats.org/markup-compatibility/2006" xmlns:aink="http://schemas.microsoft.com/office/drawing/2016/ink" xmlns:am3d="http://schemas.microsoft.com/office/drawing/2017/model3d" xmlns:o="urn:schemas-microsoft-com:office:office" xmlns:oel="http://schemas.microsoft.com/office/2019/extlst" xmlns:r="http://schemas.openxmlformats.org/officeDocument/2006/relationships" xmlns:m="http://schemas.openxmlformats.org/officeDocument/2006/math" xmlns:v="urn:schemas-microsoft-com:vml" xmlns:wp14="http://schemas.microsoft.com/office/word/2010/wordprocessingDrawing" xmlns:wp="http://schemas.openxmlformats.org/drawingml/2006/wordprocessingDrawing" xmlns:w10="urn:schemas-microsoft-com:office:word" xmlns:w="http://schemas.openxmlformats.org/wordprocessingml/2006/main" xmlns:w14="http://schemas.microsoft.com/office/word/2010/wordml" xmlns:w15="http://schemas.microsoft.com/office/word/2012/wordml" xmlns:w16cex="http://schemas.microsoft.com/office/word/2018/wordml/cex" xmlns:w16cid="http://schemas.microsoft.com/office/word/2016/wordml/cid" xmlns:w16="http://schemas.microsoft.com/office/word/2018/wordml" xmlns:w16du="http://schemas.microsoft.com/office/word/2023/wordml/word16du" xmlns:w16sdtdh="http://schemas.microsoft.com/office/word/2020/wordml/sdtdatahash" xmlns:w16sdtfl="http://schemas.microsoft.com/office/word/2024/wordml/sdtformatlock" xmlns:w16se="http://schemas.microsoft.com/office/word/2015/wordml/symex" xmlns:wpg="http://schemas.microsoft.com/office/word/2010/wordprocessingGroup" xmlns:wpi="http://schemas.microsoft.com/office/word/2010/wordprocessingInk" xmlns:wne="http://schemas.microsoft.com/office/word/2006/wordml" xmlns:wps="http://schemas.microsoft.com/office/word/2010/wordprocessingShape" mc:Ignorable="w14 w15 w16se w16cid w16 w16cex w16sdtdh w16sdtfl w16du wp14">
+<w:hdr xmlns:wpc="http://schemas.microsoft.com/office/word/2010/wordprocessingCanvas" xmlns:cx="http://schemas.microsoft.com/office/drawing/2014/chartex" xmlns:cx1="http://schemas.microsoft.com/office/drawing/2015/9/8/chartex" xmlns:cx2="http://schemas.microsoft.com/office/drawing/2015/10/21/chartex" xmlns:cx3="http://schemas.microsoft.com/office/drawing/2016/5/9/chartex" xmlns:cx4="http://schemas.microsoft.com/office/drawing/2016/5/10/chartex" xmlns:cx5="http://schemas.microsoft.com/office/drawing/2016/5/11/chartex" xmlns:cx6="http://schemas.microsoft.com/office/drawing/2016/5/12/chartex" xmlns:cx7="http://schemas.microsoft.com/office/drawing/2016/5/13/chartex" xmlns:cx8="http://schemas.microsoft.com/office/drawing/2016/5/14/chartex" xmlns:mc="http://schemas.openxmlformats.org/markup-compatibility/2006" xmlns:aink="http://schemas.microsoft.com/office/drawing/2016/ink" xmlns:am3d="http://schemas.microsoft.com/office/drawing/2017/model3d" xmlns:o="urn:schemas-microsoft-com:office:office" xmlns:oel="http://schemas.microsoft.com/office/2019/extlst" xmlns:r="http://schemas.openxmlformats.org/officeDocument/2006/relationships" xmlns:m="http://schemas.openxmlformats.org/officeDocument/2006/math" xmlns:v="urn:schemas-microsoft-com:vml" xmlns:wp14="http://schemas.microsoft.com/office/word/2010/wordprocessingDrawing" xmlns:wp="http://schemas.openxmlformats.org/drawingml/2006/wordprocessingDrawing" xmlns:w10="urn:schemas-microsoft-com:office:word" xmlns:w="http://schemas.openxmlformats.org/wordprocessingml/2006/main" xmlns:w14="http://schemas.microsoft.com/office/word/2010/wordml" xmlns:w15="http://schemas.microsoft.com/office/word/2012/wordml" xmlns:w16cex="http://schemas.microsoft.com/office/word/2018/wordml/cex" xmlns:w16cid="http://schemas.microsoft.com/office/word/2016/wordml/cid" xmlns:w16="http://schemas.microsoft.com/office/word/2018/wordml" xmlns:w16sdtdh="http://schemas.microsoft.com/office/word/2020/wordml/sdtdatahash" xmlns:w16se="http://schemas.microsoft.com/office/word/2015/wordml/symex" xmlns:wpg="http://schemas.microsoft.com/office/word/2010/wordprocessingGroup" xmlns:wpi="http://schemas.microsoft.com/office/word/2010/wordprocessingInk" xmlns:wne="http://schemas.microsoft.com/office/word/2006/wordml" xmlns:wps="http://schemas.microsoft.com/office/word/2010/wordprocessingShape" mc:Ignorable="w14 w15 w16se w16cid w16 w16cex w16sdtdh wp14">
   <w:p>
     <w:pPr>
       <w:pStyle w:val="Header"/>
@@ -4406,7 +4602,7 @@
 </file>
 
 <file path=word/numbering.xml><?xml version="1.0" encoding="utf-8"?>
-<w:numbering xmlns:wpc="http://schemas.microsoft.com/office/word/2010/wordprocessingCanvas" xmlns:cx="http://schemas.microsoft.com/office/drawing/2014/chartex" xmlns:cx1="http://schemas.microsoft.com/office/drawing/2015/9/8/chartex" xmlns:cx2="http://schemas.microsoft.com/office/drawing/2015/10/21/chartex" xmlns:cx3="http://schemas.microsoft.com/office/drawing/2016/5/9/chartex" xmlns:cx4="http://schemas.microsoft.com/office/drawing/2016/5/10/chartex" xmlns:cx5="http://schemas.microsoft.com/office/drawing/2016/5/11/chartex" xmlns:cx6="http://schemas.microsoft.com/office/drawing/2016/5/12/chartex" xmlns:cx7="http://schemas.microsoft.com/office/drawing/2016/5/13/chartex" xmlns:cx8="http://schemas.microsoft.com/office/drawing/2016/5/14/chartex" xmlns:mc="http://schemas.openxmlformats.org/markup-compatibility/2006" xmlns:aink="http://schemas.microsoft.com/office/drawing/2016/ink" xmlns:am3d="http://schemas.microsoft.com/office/drawing/2017/model3d" xmlns:o="urn:schemas-microsoft-com:office:office" xmlns:oel="http://schemas.microsoft.com/office/2019/extlst" xmlns:r="http://schemas.openxmlformats.org/officeDocument/2006/relationships" xmlns:m="http://schemas.openxmlformats.org/officeDocument/2006/math" xmlns:v="urn:schemas-microsoft-com:vml" xmlns:wp14="http://schemas.microsoft.com/office/word/2010/wordprocessingDrawing" xmlns:wp="http://schemas.openxmlformats.org/drawingml/2006/wordprocessingDrawing" xmlns:w10="urn:schemas-microsoft-com:office:word" xmlns:w="http://schemas.openxmlformats.org/wordprocessingml/2006/main" xmlns:w14="http://schemas.microsoft.com/office/word/2010/wordml" xmlns:w15="http://schemas.microsoft.com/office/word/2012/wordml" xmlns:w16cex="http://schemas.microsoft.com/office/word/2018/wordml/cex" xmlns:w16cid="http://schemas.microsoft.com/office/word/2016/wordml/cid" xmlns:w16="http://schemas.microsoft.com/office/word/2018/wordml" xmlns:w16du="http://schemas.microsoft.com/office/word/2023/wordml/word16du" xmlns:w16sdtdh="http://schemas.microsoft.com/office/word/2020/wordml/sdtdatahash" xmlns:w16sdtfl="http://schemas.microsoft.com/office/word/2024/wordml/sdtformatlock" xmlns:w16se="http://schemas.microsoft.com/office/word/2015/wordml/symex" xmlns:wpg="http://schemas.microsoft.com/office/word/2010/wordprocessingGroup" xmlns:wpi="http://schemas.microsoft.com/office/word/2010/wordprocessingInk" xmlns:wne="http://schemas.microsoft.com/office/word/2006/wordml" xmlns:wps="http://schemas.microsoft.com/office/word/2010/wordprocessingShape" mc:Ignorable="w14 w15 w16se w16cid w16 w16cex w16sdtdh w16sdtfl w16du wp14">
+<w:numbering xmlns:wpc="http://schemas.microsoft.com/office/word/2010/wordprocessingCanvas" xmlns:cx="http://schemas.microsoft.com/office/drawing/2014/chartex" xmlns:cx1="http://schemas.microsoft.com/office/drawing/2015/9/8/chartex" xmlns:cx2="http://schemas.microsoft.com/office/drawing/2015/10/21/chartex" xmlns:cx3="http://schemas.microsoft.com/office/drawing/2016/5/9/chartex" xmlns:cx4="http://schemas.microsoft.com/office/drawing/2016/5/10/chartex" xmlns:cx5="http://schemas.microsoft.com/office/drawing/2016/5/11/chartex" xmlns:cx6="http://schemas.microsoft.com/office/drawing/2016/5/12/chartex" xmlns:cx7="http://schemas.microsoft.com/office/drawing/2016/5/13/chartex" xmlns:cx8="http://schemas.microsoft.com/office/drawing/2016/5/14/chartex" xmlns:mc="http://schemas.openxmlformats.org/markup-compatibility/2006" xmlns:aink="http://schemas.microsoft.com/office/drawing/2016/ink" xmlns:am3d="http://schemas.microsoft.com/office/drawing/2017/model3d" xmlns:o="urn:schemas-microsoft-com:office:office" xmlns:oel="http://schemas.microsoft.com/office/2019/extlst" xmlns:r="http://schemas.openxmlformats.org/officeDocument/2006/relationships" xmlns:m="http://schemas.openxmlformats.org/officeDocument/2006/math" xmlns:v="urn:schemas-microsoft-com:vml" xmlns:wp14="http://schemas.microsoft.com/office/word/2010/wordprocessingDrawing" xmlns:wp="http://schemas.openxmlformats.org/drawingml/2006/wordprocessingDrawing" xmlns:w10="urn:schemas-microsoft-com:office:word" xmlns:w="http://schemas.openxmlformats.org/wordprocessingml/2006/main" xmlns:w14="http://schemas.microsoft.com/office/word/2010/wordml" xmlns:w15="http://schemas.microsoft.com/office/word/2012/wordml" xmlns:w16cex="http://schemas.microsoft.com/office/word/2018/wordml/cex" xmlns:w16cid="http://schemas.microsoft.com/office/word/2016/wordml/cid" xmlns:w16="http://schemas.microsoft.com/office/word/2018/wordml" xmlns:w16sdtdh="http://schemas.microsoft.com/office/word/2020/wordml/sdtdatahash" xmlns:w16se="http://schemas.microsoft.com/office/word/2015/wordml/symex" xmlns:wpg="http://schemas.microsoft.com/office/word/2010/wordprocessingGroup" xmlns:wpi="http://schemas.microsoft.com/office/word/2010/wordprocessingInk" xmlns:wne="http://schemas.microsoft.com/office/word/2006/wordml" xmlns:wps="http://schemas.microsoft.com/office/word/2010/wordprocessingShape" mc:Ignorable="w14 w15 w16se w16cid w16 w16cex w16sdtdh wp14">
   <w:abstractNum w:abstractNumId="0" w15:restartNumberingAfterBreak="0">
     <w:nsid w:val="0AE9387F"/>
     <w:multiLevelType w:val="multilevel"/>
@@ -5679,7 +5875,7 @@
         <w:szCs w:val="20"/>
       </w:rPr>
     </w:lvl>
-    <w:lvl w:ilvl="1" w:tentative="1">
+    <w:lvl w:ilvl="1">
       <w:start w:val="1"/>
       <w:numFmt w:val="bullet"/>
       <w:lvlText w:val="o"/>
@@ -5994,7 +6190,7 @@
 </file>
 
 <file path=word/styles.xml><?xml version="1.0" encoding="utf-8"?>
-<w:styles xmlns:mc="http://schemas.openxmlformats.org/markup-compatibility/2006" xmlns:r="http://schemas.openxmlformats.org/officeDocument/2006/relationships" xmlns:w="http://schemas.openxmlformats.org/wordprocessingml/2006/main" xmlns:w14="http://schemas.microsoft.com/office/word/2010/wordml" xmlns:w15="http://schemas.microsoft.com/office/word/2012/wordml" xmlns:w16cex="http://schemas.microsoft.com/office/word/2018/wordml/cex" xmlns:w16cid="http://schemas.microsoft.com/office/word/2016/wordml/cid" xmlns:w16="http://schemas.microsoft.com/office/word/2018/wordml" xmlns:w16du="http://schemas.microsoft.com/office/word/2023/wordml/word16du" xmlns:w16sdtdh="http://schemas.microsoft.com/office/word/2020/wordml/sdtdatahash" xmlns:w16sdtfl="http://schemas.microsoft.com/office/word/2024/wordml/sdtformatlock" xmlns:w16se="http://schemas.microsoft.com/office/word/2015/wordml/symex" mc:Ignorable="w14 w15 w16se w16cid w16 w16cex w16sdtdh w16sdtfl w16du">
+<w:styles xmlns:mc="http://schemas.openxmlformats.org/markup-compatibility/2006" xmlns:r="http://schemas.openxmlformats.org/officeDocument/2006/relationships" xmlns:w="http://schemas.openxmlformats.org/wordprocessingml/2006/main" xmlns:w14="http://schemas.microsoft.com/office/word/2010/wordml" xmlns:w15="http://schemas.microsoft.com/office/word/2012/wordml" xmlns:w16cex="http://schemas.microsoft.com/office/word/2018/wordml/cex" xmlns:w16cid="http://schemas.microsoft.com/office/word/2016/wordml/cid" xmlns:w16="http://schemas.microsoft.com/office/word/2018/wordml" xmlns:w16sdtdh="http://schemas.microsoft.com/office/word/2020/wordml/sdtdatahash" xmlns:w16se="http://schemas.microsoft.com/office/word/2015/wordml/symex" mc:Ignorable="w14 w15 w16se w16cid w16 w16cex w16sdtdh">
   <w:docDefaults>
     <w:rPrDefault>
       <w:rPr>
@@ -6607,6 +6803,7 @@
   <w:style w:type="character" w:default="1" w:styleId="DefaultParagraphFont">
     <w:name w:val="Default Paragraph Font"/>
     <w:uiPriority w:val="1"/>
+    <w:semiHidden/>
     <w:unhideWhenUsed/>
   </w:style>
   <w:style w:type="table" w:default="1" w:styleId="TableNormal">
@@ -7156,11 +7353,50 @@
     <w:unhideWhenUsed/>
     <w:rsid w:val="0052283F"/>
   </w:style>
+  <w:style w:type="paragraph" w:styleId="FootnoteText">
+    <w:name w:val="footnote text"/>
+    <w:basedOn w:val="Normal"/>
+    <w:link w:val="FootnoteTextChar"/>
+    <w:uiPriority w:val="99"/>
+    <w:semiHidden/>
+    <w:unhideWhenUsed/>
+    <w:rsid w:val="005D78AD"/>
+    <w:pPr>
+      <w:spacing w:after="0" w:line="240" w:lineRule="auto"/>
+    </w:pPr>
+    <w:rPr>
+      <w:sz w:val="20"/>
+      <w:szCs w:val="20"/>
+    </w:rPr>
+  </w:style>
+  <w:style w:type="character" w:customStyle="1" w:styleId="FootnoteTextChar">
+    <w:name w:val="Footnote Text Char"/>
+    <w:basedOn w:val="DefaultParagraphFont"/>
+    <w:link w:val="FootnoteText"/>
+    <w:uiPriority w:val="99"/>
+    <w:semiHidden/>
+    <w:rsid w:val="005D78AD"/>
+    <w:rPr>
+      <w:sz w:val="20"/>
+      <w:szCs w:val="20"/>
+    </w:rPr>
+  </w:style>
+  <w:style w:type="character" w:styleId="FootnoteReference">
+    <w:name w:val="footnote reference"/>
+    <w:basedOn w:val="DefaultParagraphFont"/>
+    <w:uiPriority w:val="99"/>
+    <w:semiHidden/>
+    <w:unhideWhenUsed/>
+    <w:rsid w:val="005D78AD"/>
+    <w:rPr>
+      <w:vertAlign w:val="superscript"/>
+    </w:rPr>
+  </w:style>
 </w:styles>
 </file>
 
 <file path=word/glossary/document.xml><?xml version="1.0" encoding="utf-8"?>
-<w:glossaryDocument xmlns:wpc="http://schemas.microsoft.com/office/word/2010/wordprocessingCanvas" xmlns:cx="http://schemas.microsoft.com/office/drawing/2014/chartex" xmlns:cx1="http://schemas.microsoft.com/office/drawing/2015/9/8/chartex" xmlns:cx2="http://schemas.microsoft.com/office/drawing/2015/10/21/chartex" xmlns:cx3="http://schemas.microsoft.com/office/drawing/2016/5/9/chartex" xmlns:cx4="http://schemas.microsoft.com/office/drawing/2016/5/10/chartex" xmlns:cx5="http://schemas.microsoft.com/office/drawing/2016/5/11/chartex" xmlns:cx6="http://schemas.microsoft.com/office/drawing/2016/5/12/chartex" xmlns:cx7="http://schemas.microsoft.com/office/drawing/2016/5/13/chartex" xmlns:cx8="http://schemas.microsoft.com/office/drawing/2016/5/14/chartex" xmlns:mc="http://schemas.openxmlformats.org/markup-compatibility/2006" xmlns:aink="http://schemas.microsoft.com/office/drawing/2016/ink" xmlns:am3d="http://schemas.microsoft.com/office/drawing/2017/model3d" xmlns:o="urn:schemas-microsoft-com:office:office" xmlns:oel="http://schemas.microsoft.com/office/2019/extlst" xmlns:r="http://schemas.openxmlformats.org/officeDocument/2006/relationships" xmlns:m="http://schemas.openxmlformats.org/officeDocument/2006/math" xmlns:v="urn:schemas-microsoft-com:vml" xmlns:wp14="http://schemas.microsoft.com/office/word/2010/wordprocessingDrawing" xmlns:wp="http://schemas.openxmlformats.org/drawingml/2006/wordprocessingDrawing" xmlns:w10="urn:schemas-microsoft-com:office:word" xmlns:w="http://schemas.openxmlformats.org/wordprocessingml/2006/main" xmlns:w14="http://schemas.microsoft.com/office/word/2010/wordml" xmlns:w15="http://schemas.microsoft.com/office/word/2012/wordml" xmlns:w16cex="http://schemas.microsoft.com/office/word/2018/wordml/cex" xmlns:w16cid="http://schemas.microsoft.com/office/word/2016/wordml/cid" xmlns:w16="http://schemas.microsoft.com/office/word/2018/wordml" xmlns:w16du="http://schemas.microsoft.com/office/word/2023/wordml/word16du" xmlns:w16sdtdh="http://schemas.microsoft.com/office/word/2020/wordml/sdtdatahash" xmlns:w16sdtfl="http://schemas.microsoft.com/office/word/2024/wordml/sdtformatlock" xmlns:w16se="http://schemas.microsoft.com/office/word/2015/wordml/symex" xmlns:wpg="http://schemas.microsoft.com/office/word/2010/wordprocessingGroup" xmlns:wpi="http://schemas.microsoft.com/office/word/2010/wordprocessingInk" xmlns:wne="http://schemas.microsoft.com/office/word/2006/wordml" xmlns:wps="http://schemas.microsoft.com/office/word/2010/wordprocessingShape" mc:Ignorable="w14 w15 w16se w16cid w16 w16cex w16sdtdh w16sdtfl w16du wp14">
+<w:glossaryDocument xmlns:wpc="http://schemas.microsoft.com/office/word/2010/wordprocessingCanvas" xmlns:cx="http://schemas.microsoft.com/office/drawing/2014/chartex" xmlns:cx1="http://schemas.microsoft.com/office/drawing/2015/9/8/chartex" xmlns:cx2="http://schemas.microsoft.com/office/drawing/2015/10/21/chartex" xmlns:cx3="http://schemas.microsoft.com/office/drawing/2016/5/9/chartex" xmlns:cx4="http://schemas.microsoft.com/office/drawing/2016/5/10/chartex" xmlns:cx5="http://schemas.microsoft.com/office/drawing/2016/5/11/chartex" xmlns:cx6="http://schemas.microsoft.com/office/drawing/2016/5/12/chartex" xmlns:cx7="http://schemas.microsoft.com/office/drawing/2016/5/13/chartex" xmlns:cx8="http://schemas.microsoft.com/office/drawing/2016/5/14/chartex" xmlns:mc="http://schemas.openxmlformats.org/markup-compatibility/2006" xmlns:aink="http://schemas.microsoft.com/office/drawing/2016/ink" xmlns:am3d="http://schemas.microsoft.com/office/drawing/2017/model3d" xmlns:o="urn:schemas-microsoft-com:office:office" xmlns:oel="http://schemas.microsoft.com/office/2019/extlst" xmlns:r="http://schemas.openxmlformats.org/officeDocument/2006/relationships" xmlns:m="http://schemas.openxmlformats.org/officeDocument/2006/math" xmlns:v="urn:schemas-microsoft-com:vml" xmlns:wp14="http://schemas.microsoft.com/office/word/2010/wordprocessingDrawing" xmlns:wp="http://schemas.openxmlformats.org/drawingml/2006/wordprocessingDrawing" xmlns:w10="urn:schemas-microsoft-com:office:word" xmlns:w="http://schemas.openxmlformats.org/wordprocessingml/2006/main" xmlns:w14="http://schemas.microsoft.com/office/word/2010/wordml" xmlns:w15="http://schemas.microsoft.com/office/word/2012/wordml" xmlns:w16cex="http://schemas.microsoft.com/office/word/2018/wordml/cex" xmlns:w16cid="http://schemas.microsoft.com/office/word/2016/wordml/cid" xmlns:w16="http://schemas.microsoft.com/office/word/2018/wordml" xmlns:w16sdtdh="http://schemas.microsoft.com/office/word/2020/wordml/sdtdatahash" xmlns:w16se="http://schemas.microsoft.com/office/word/2015/wordml/symex" xmlns:wpg="http://schemas.microsoft.com/office/word/2010/wordprocessingGroup" xmlns:wpi="http://schemas.microsoft.com/office/word/2010/wordprocessingInk" xmlns:wne="http://schemas.microsoft.com/office/word/2006/wordml" xmlns:wps="http://schemas.microsoft.com/office/word/2010/wordprocessingShape" mc:Ignorable="w14 w15 w16se w16cid w16 w16cex w16sdtdh wp14">
   <w:docParts>
     <w:docPart>
       <w:docPartPr>
@@ -7186,7 +7422,7 @@
             <w:rPr>
               <w:rFonts w:asciiTheme="majorHAnsi" w:eastAsiaTheme="majorEastAsia" w:hAnsiTheme="majorHAnsi" w:cstheme="majorBidi"/>
               <w:caps/>
-              <w:color w:val="156082" w:themeColor="accent1"/>
+              <w:color w:val="4472C4" w:themeColor="accent1"/>
               <w:sz w:val="80"/>
               <w:szCs w:val="80"/>
             </w:rPr>
@@ -7217,7 +7453,7 @@
           </w:pPr>
           <w:r>
             <w:rPr>
-              <w:color w:val="156082" w:themeColor="accent1"/>
+              <w:color w:val="4472C4" w:themeColor="accent1"/>
               <w:sz w:val="28"/>
               <w:szCs w:val="28"/>
             </w:rPr>
@@ -7231,7 +7467,7 @@
 </file>
 
 <file path=word/glossary/fontTable.xml><?xml version="1.0" encoding="utf-8"?>
-<w:fonts xmlns:mc="http://schemas.openxmlformats.org/markup-compatibility/2006" xmlns:r="http://schemas.openxmlformats.org/officeDocument/2006/relationships" xmlns:w="http://schemas.openxmlformats.org/wordprocessingml/2006/main" xmlns:w14="http://schemas.microsoft.com/office/word/2010/wordml" xmlns:w15="http://schemas.microsoft.com/office/word/2012/wordml" xmlns:w16cex="http://schemas.microsoft.com/office/word/2018/wordml/cex" xmlns:w16cid="http://schemas.microsoft.com/office/word/2016/wordml/cid" xmlns:w16="http://schemas.microsoft.com/office/word/2018/wordml" xmlns:w16du="http://schemas.microsoft.com/office/word/2023/wordml/word16du" xmlns:w16sdtdh="http://schemas.microsoft.com/office/word/2020/wordml/sdtdatahash" xmlns:w16sdtfl="http://schemas.microsoft.com/office/word/2024/wordml/sdtformatlock" xmlns:w16se="http://schemas.microsoft.com/office/word/2015/wordml/symex" mc:Ignorable="w14 w15 w16se w16cid w16 w16cex w16sdtdh w16sdtfl w16du">
+<w:fonts xmlns:mc="http://schemas.openxmlformats.org/markup-compatibility/2006" xmlns:r="http://schemas.openxmlformats.org/officeDocument/2006/relationships" xmlns:w="http://schemas.openxmlformats.org/wordprocessingml/2006/main" xmlns:w14="http://schemas.microsoft.com/office/word/2010/wordml" xmlns:w15="http://schemas.microsoft.com/office/word/2012/wordml" xmlns:w16cex="http://schemas.microsoft.com/office/word/2018/wordml/cex" xmlns:w16cid="http://schemas.microsoft.com/office/word/2016/wordml/cid" xmlns:w16="http://schemas.microsoft.com/office/word/2018/wordml" xmlns:w16sdtdh="http://schemas.microsoft.com/office/word/2020/wordml/sdtdatahash" xmlns:w16se="http://schemas.microsoft.com/office/word/2015/wordml/symex" mc:Ignorable="w14 w15 w16se w16cid w16 w16cex w16sdtdh">
   <w:font w:name="Courier New">
     <w:panose1 w:val="02070309020205020404"/>
     <w:charset w:val="00"/>
@@ -7286,11 +7522,25 @@
     <w:pitch w:val="variable"/>
     <w:sig w:usb0="E00006FF" w:usb1="420024FF" w:usb2="02000000" w:usb3="00000000" w:csb0="0000019F" w:csb1="00000000"/>
   </w:font>
+  <w:font w:name="Calibri">
+    <w:panose1 w:val="020F0502020204030204"/>
+    <w:charset w:val="00"/>
+    <w:family w:val="swiss"/>
+    <w:pitch w:val="variable"/>
+    <w:sig w:usb0="E4002EFF" w:usb1="C200247B" w:usb2="00000009" w:usb3="00000000" w:csb0="000001FF" w:csb1="00000000"/>
+  </w:font>
+  <w:font w:name="Calibri Light">
+    <w:panose1 w:val="020F0302020204030204"/>
+    <w:charset w:val="00"/>
+    <w:family w:val="swiss"/>
+    <w:pitch w:val="variable"/>
+    <w:sig w:usb0="E4002EFF" w:usb1="C200247B" w:usb2="00000009" w:usb3="00000000" w:csb0="000001FF" w:csb1="00000000"/>
+  </w:font>
 </w:fonts>
 </file>
 
 <file path=word/glossary/settings.xml><?xml version="1.0" encoding="utf-8"?>
-<w:settings xmlns:mc="http://schemas.openxmlformats.org/markup-compatibility/2006" xmlns:o="urn:schemas-microsoft-com:office:office" xmlns:r="http://schemas.openxmlformats.org/officeDocument/2006/relationships" xmlns:m="http://schemas.openxmlformats.org/officeDocument/2006/math" xmlns:v="urn:schemas-microsoft-com:vml" xmlns:w10="urn:schemas-microsoft-com:office:word" xmlns:w="http://schemas.openxmlformats.org/wordprocessingml/2006/main" xmlns:w14="http://schemas.microsoft.com/office/word/2010/wordml" xmlns:w15="http://schemas.microsoft.com/office/word/2012/wordml" xmlns:w16cex="http://schemas.microsoft.com/office/word/2018/wordml/cex" xmlns:w16cid="http://schemas.microsoft.com/office/word/2016/wordml/cid" xmlns:w16="http://schemas.microsoft.com/office/word/2018/wordml" xmlns:w16du="http://schemas.microsoft.com/office/word/2023/wordml/word16du" xmlns:w16sdtdh="http://schemas.microsoft.com/office/word/2020/wordml/sdtdatahash" xmlns:w16sdtfl="http://schemas.microsoft.com/office/word/2024/wordml/sdtformatlock" xmlns:w16se="http://schemas.microsoft.com/office/word/2015/wordml/symex" xmlns:sl="http://schemas.openxmlformats.org/schemaLibrary/2006/main" mc:Ignorable="w14 w15 w16se w16cid w16 w16cex w16sdtdh w16sdtfl w16du">
+<w:settings xmlns:mc="http://schemas.openxmlformats.org/markup-compatibility/2006" xmlns:o="urn:schemas-microsoft-com:office:office" xmlns:r="http://schemas.openxmlformats.org/officeDocument/2006/relationships" xmlns:m="http://schemas.openxmlformats.org/officeDocument/2006/math" xmlns:v="urn:schemas-microsoft-com:vml" xmlns:w10="urn:schemas-microsoft-com:office:word" xmlns:w="http://schemas.openxmlformats.org/wordprocessingml/2006/main" xmlns:w14="http://schemas.microsoft.com/office/word/2010/wordml" xmlns:w15="http://schemas.microsoft.com/office/word/2012/wordml" xmlns:w16cex="http://schemas.microsoft.com/office/word/2018/wordml/cex" xmlns:w16cid="http://schemas.microsoft.com/office/word/2016/wordml/cid" xmlns:w16="http://schemas.microsoft.com/office/word/2018/wordml" xmlns:w16sdtdh="http://schemas.microsoft.com/office/word/2020/wordml/sdtdatahash" xmlns:w16se="http://schemas.microsoft.com/office/word/2015/wordml/symex" xmlns:sl="http://schemas.openxmlformats.org/schemaLibrary/2006/main" mc:Ignorable="w14 w15 w16se w16cid w16 w16cex w16sdtdh">
   <w:view w:val="normal"/>
   <w:revisionView w:comments="0" w:insDel="0" w:formatting="0"/>
   <w:defaultTabStop w:val="708"/>
@@ -7316,10 +7566,13 @@
     <w:rsid w:val="00B43B45"/>
     <w:rsid w:val="00C0475E"/>
     <w:rsid w:val="00C800D4"/>
+    <w:rsid w:val="00CC5DDD"/>
     <w:rsid w:val="00D10A5A"/>
+    <w:rsid w:val="00D71E35"/>
     <w:rsid w:val="00DC2FA1"/>
     <w:rsid w:val="00E962CC"/>
     <w:rsid w:val="00F01BA3"/>
+    <w:rsid w:val="00F57ECA"/>
     <w:rsid w:val="00F61C67"/>
   </w:rsids>
   <m:mathPr>
@@ -7337,14 +7590,14 @@
   </m:mathPr>
   <w:themeFontLang w:val="es-AR"/>
   <w:clrSchemeMapping w:bg1="light1" w:t1="dark1" w:bg2="light2" w:t2="dark2" w:accent1="accent1" w:accent2="accent2" w:accent3="accent3" w:accent4="accent4" w:accent5="accent5" w:accent6="accent6" w:hyperlink="hyperlink" w:followedHyperlink="followedHyperlink"/>
-  <w:decimalSymbol w:val=","/>
-  <w:listSeparator w:val=";"/>
+  <w:decimalSymbol w:val="."/>
+  <w:listSeparator w:val=","/>
   <w15:chartTrackingRefBased/>
 </w:settings>
 </file>
 
 <file path=word/glossary/styles.xml><?xml version="1.0" encoding="utf-8"?>
-<w:styles xmlns:mc="http://schemas.openxmlformats.org/markup-compatibility/2006" xmlns:r="http://schemas.openxmlformats.org/officeDocument/2006/relationships" xmlns:w="http://schemas.openxmlformats.org/wordprocessingml/2006/main" xmlns:w14="http://schemas.microsoft.com/office/word/2010/wordml" xmlns:w15="http://schemas.microsoft.com/office/word/2012/wordml" xmlns:w16cex="http://schemas.microsoft.com/office/word/2018/wordml/cex" xmlns:w16cid="http://schemas.microsoft.com/office/word/2016/wordml/cid" xmlns:w16="http://schemas.microsoft.com/office/word/2018/wordml" xmlns:w16du="http://schemas.microsoft.com/office/word/2023/wordml/word16du" xmlns:w16sdtdh="http://schemas.microsoft.com/office/word/2020/wordml/sdtdatahash" xmlns:w16sdtfl="http://schemas.microsoft.com/office/word/2024/wordml/sdtformatlock" xmlns:w16se="http://schemas.microsoft.com/office/word/2015/wordml/symex" mc:Ignorable="w14 w15 w16se w16cid w16 w16cex w16sdtdh w16sdtfl w16du">
+<w:styles xmlns:mc="http://schemas.openxmlformats.org/markup-compatibility/2006" xmlns:r="http://schemas.openxmlformats.org/officeDocument/2006/relationships" xmlns:w="http://schemas.openxmlformats.org/wordprocessingml/2006/main" xmlns:w14="http://schemas.microsoft.com/office/word/2010/wordml" xmlns:w15="http://schemas.microsoft.com/office/word/2012/wordml" xmlns:w16cex="http://schemas.microsoft.com/office/word/2018/wordml/cex" xmlns:w16cid="http://schemas.microsoft.com/office/word/2016/wordml/cid" xmlns:w16="http://schemas.microsoft.com/office/word/2018/wordml" xmlns:w16sdtdh="http://schemas.microsoft.com/office/word/2020/wordml/sdtdatahash" xmlns:w16se="http://schemas.microsoft.com/office/word/2015/wordml/symex" mc:Ignorable="w14 w15 w16se w16cid w16 w16cex w16sdtdh">
   <w:docDefaults>
     <w:rPrDefault>
       <w:rPr>
@@ -7784,20 +8037,16 @@
     <w:basedOn w:val="DefaultParagraphFont"/>
     <w:uiPriority w:val="99"/>
     <w:semiHidden/>
-    <w:rsid w:val="0085071F"/>
+    <w:rsid w:val="00F57ECA"/>
     <w:rPr>
       <w:color w:val="666666"/>
     </w:rPr>
-  </w:style>
-  <w:style w:type="paragraph" w:customStyle="1" w:styleId="920F6419788946FEACCAA2E05D6FA243">
-    <w:name w:val="920F6419788946FEACCAA2E05D6FA243"/>
-    <w:rsid w:val="00AD37F4"/>
   </w:style>
 </w:styles>
 </file>
 
 <file path=word/glossary/webSettings.xml><?xml version="1.0" encoding="utf-8"?>
-<w:webSettings xmlns:mc="http://schemas.openxmlformats.org/markup-compatibility/2006" xmlns:r="http://schemas.openxmlformats.org/officeDocument/2006/relationships" xmlns:w="http://schemas.openxmlformats.org/wordprocessingml/2006/main" xmlns:w14="http://schemas.microsoft.com/office/word/2010/wordml" xmlns:w15="http://schemas.microsoft.com/office/word/2012/wordml" xmlns:w16cex="http://schemas.microsoft.com/office/word/2018/wordml/cex" xmlns:w16cid="http://schemas.microsoft.com/office/word/2016/wordml/cid" xmlns:w16="http://schemas.microsoft.com/office/word/2018/wordml" xmlns:w16du="http://schemas.microsoft.com/office/word/2023/wordml/word16du" xmlns:w16sdtdh="http://schemas.microsoft.com/office/word/2020/wordml/sdtdatahash" xmlns:w16sdtfl="http://schemas.microsoft.com/office/word/2024/wordml/sdtformatlock" xmlns:w16se="http://schemas.microsoft.com/office/word/2015/wordml/symex" mc:Ignorable="w14 w15 w16se w16cid w16 w16cex w16sdtdh w16sdtfl w16du">
+<w:webSettings xmlns:mc="http://schemas.openxmlformats.org/markup-compatibility/2006" xmlns:r="http://schemas.openxmlformats.org/officeDocument/2006/relationships" xmlns:w="http://schemas.openxmlformats.org/wordprocessingml/2006/main" xmlns:w14="http://schemas.microsoft.com/office/word/2010/wordml" xmlns:w15="http://schemas.microsoft.com/office/word/2012/wordml" xmlns:w16cex="http://schemas.microsoft.com/office/word/2018/wordml/cex" xmlns:w16cid="http://schemas.microsoft.com/office/word/2016/wordml/cid" xmlns:w16="http://schemas.microsoft.com/office/word/2018/wordml" xmlns:w16sdtdh="http://schemas.microsoft.com/office/word/2020/wordml/sdtdatahash" xmlns:w16se="http://schemas.microsoft.com/office/word/2015/wordml/symex" mc:Ignorable="w14 w15 w16se w16cid w16 w16cex w16sdtdh">
   <w:optimizeForBrowser/>
   <w:allowPNG/>
 </w:webSettings>

</xml_diff>

<commit_message>
informe etapa 2 terminada
</commit_message>
<xml_diff>
--- a/Informe Trabajo Integrador MyS.docx
+++ b/Informe Trabajo Integrador MyS.docx
@@ -2664,7 +2664,31 @@
     </w:p>
     <w:p>
       <w:r>
-        <w:t>El presente informe tiene como objetivo documentar el proceso de desarrollo, implementación y análisis de un simulador de eventos discretos aplicado al contexto de operaciones aeroportuarias. Este trabajo fue realizado en el marco de la asignatura “Modelos y Simulación” y consistió en el diseño progresivo de un sistema de simulación dividido en tres etapas, abarcando desde la construcción de un modelo simple hasta la ejecución de múltiples replicaciones para análisis estadístico. El objetivo principal fue construir un software capaz de modelar, ejecutar y analizar el comportamiento de sistemas dinámicos bajo incertidumbre, a través de simulaciones que generen datos significativos para su posterior evaluación.</w:t>
+        <w:t xml:space="preserve">El presente informe tiene como objetivo documentar el proceso de desarrollo, implementación y análisis de un simulador de eventos discretos aplicado al contexto de operaciones aeroportuarias. Este trabajo </w:t>
+      </w:r>
+      <w:r>
+        <w:t>se</w:t>
+      </w:r>
+      <w:r>
+        <w:t xml:space="preserve"> realiz</w:t>
+      </w:r>
+      <w:r>
+        <w:t>ó</w:t>
+      </w:r>
+      <w:r>
+        <w:t xml:space="preserve"> </w:t>
+      </w:r>
+      <w:r>
+        <w:t>para la materia</w:t>
+      </w:r>
+      <w:r>
+        <w:t xml:space="preserve"> “Modelos y Simulación” y consistió en el diseño progresivo de un sistema de simulación dividido en tres etapas, abarcando desde la construcción de un modelo simple hasta la ejecución de múltiples replicaciones para análisis estadístico. El objetivo principal fue construir un software capaz de modelar, ejecutar y analizar el comportamiento de sistemas dinámico</w:t>
+      </w:r>
+      <w:r>
+        <w:t>s, estocásticos y discretos</w:t>
+      </w:r>
+      <w:r>
+        <w:t>, a través de simulaciones que generen datos significativos para su posterior evaluación.</w:t>
       </w:r>
     </w:p>
     <w:p>
@@ -2686,7 +2710,7 @@
     </w:p>
     <w:p>
       <w:r>
-        <w:t>Durante el desarrollo del proyecto se abordaron una serie de temas fundamentales dentro del área de simulación de eventos discretos y diseño de software. Entre ellos se destacan:</w:t>
+        <w:t>Durante el desarrollo del proyecto se abordaron una serie de temas fundamentales dentro del área de simulación. Entre ellos se destacan:</w:t>
       </w:r>
     </w:p>
     <w:p>
@@ -2722,7 +2746,7 @@
         <w:t>Técnica de bootstrapping</w:t>
       </w:r>
       <w:r>
-        <w:t>, mediante la cual cada evento genera sus próximos eventos, facilitando la automatización del ciclo de simulación.</w:t>
+        <w:t>, mediante la cual cada evento genera sus próximos eventos.</w:t>
       </w:r>
     </w:p>
     <w:p>
@@ -2755,7 +2779,25 @@
           <w:b/>
           <w:bCs/>
         </w:rPr>
-        <w:t>Gestión de la lista de eventos futuros (FEL)</w:t>
+        <w:t>Gestión de la lista de eventos futuros (</w:t>
+      </w:r>
+      <m:oMath>
+        <m:r>
+          <m:rPr>
+            <m:sty m:val="bi"/>
+          </m:rPr>
+          <w:rPr>
+            <w:rFonts w:ascii="Cambria Math" w:hAnsi="Cambria Math"/>
+          </w:rPr>
+          <m:t>FEL</m:t>
+        </m:r>
+      </m:oMath>
+      <w:r>
+        <w:rPr>
+          <w:b/>
+          <w:bCs/>
+        </w:rPr>
+        <w:t>)</w:t>
       </w:r>
       <w:r>
         <w:t xml:space="preserve"> y lógica de planificación de eventos.</w:t>
@@ -2853,7 +2895,33 @@
         <w:t>Etapa 1:</w:t>
       </w:r>
       <w:r>
-        <w:t xml:space="preserve"> desarrollo del simulador básico con un único servidor (pista de aterrizaje) y una cola. Se construyó el esqueleto del simulador aplicando la técnica de bootstrapping, se implementaron estructuras para la gestión de eventos y se comenzó a recolectar estadísticas básicas.</w:t>
+        <w:t xml:space="preserve"> desarrollo del simulador con un único servidor (pista de aterrizaje) y una cola. Se construyó el esqueleto del simulador aplicando la técnica de bootstrapping, se </w:t>
+      </w:r>
+      <w:r>
+        <w:t xml:space="preserve">implementó la estructura </w:t>
+      </w:r>
+      <w:r>
+        <w:t xml:space="preserve">para la gestión de eventos </w:t>
+      </w:r>
+      <w:r>
+        <w:t>(</w:t>
+      </w:r>
+      <m:oMath>
+        <m:r>
+          <w:rPr>
+            <w:rFonts w:ascii="Cambria Math" w:hAnsi="Cambria Math"/>
+          </w:rPr>
+          <m:t>FEL</m:t>
+        </m:r>
+      </m:oMath>
+      <w:r>
+        <w:t>)</w:t>
+      </w:r>
+      <w:r>
+        <w:t xml:space="preserve"> </w:t>
+      </w:r>
+      <w:r>
+        <w:t>y se comenzó a recolectar estadísticas básicas.</w:t>
       </w:r>
     </w:p>
     <w:p>
@@ -2900,7 +2968,13 @@
         <w:t>verificación</w:t>
       </w:r>
       <w:r>
-        <w:t xml:space="preserve"> y evaluación, lo que nos permitió adquirir una comprensión integral del proceso de simulación de sistemas discretos en entornos complejos y realistas.</w:t>
+        <w:t xml:space="preserve"> y evaluación, lo que nos permitió adquirir una comprensión </w:t>
+      </w:r>
+      <w:r>
+        <w:t xml:space="preserve">general del </w:t>
+      </w:r>
+      <w:r>
+        <w:t>proceso de simulación de sistemas discretos en entornos complejos y realistas.</w:t>
       </w:r>
     </w:p>
     <w:p>
@@ -2935,7 +3009,25 @@
     </w:p>
     <w:p>
       <w:r>
-        <w:t>En esta primera etapa, perseguimos los siguientes objetivos, definidos a partir del enunciado del práctico:</w:t>
+        <w:t xml:space="preserve">En esta primera etapa, </w:t>
+      </w:r>
+      <w:r>
+        <w:t>nos enfocamos en</w:t>
+      </w:r>
+      <w:r>
+        <w:t xml:space="preserve"> los siguientes objetivos, definidos </w:t>
+      </w:r>
+      <w:r>
+        <w:t>en el</w:t>
+      </w:r>
+      <w:r>
+        <w:t xml:space="preserve"> enunciado del </w:t>
+      </w:r>
+      <w:r>
+        <w:t>laboratorio</w:t>
+      </w:r>
+      <w:r>
+        <w:t>:</w:t>
       </w:r>
     </w:p>
     <w:p>
@@ -2946,7 +3038,7 @@
         </w:numPr>
       </w:pPr>
       <w:r>
-        <w:t xml:space="preserve">Implementar un simulador orientado a eventos discretos que permita instanciar múltiples realidades y representar el estado y la evolución del sistema físico en un aeropuerto de vuelos de cabotaje </w:t>
+        <w:t>Implementar un simulador orientado a eventos discretos que permita instanciar múltiples realidades y representar el estado y la evolución del sistema físico en un aeropuerto</w:t>
       </w:r>
       <w:r>
         <w:rPr>
@@ -2966,7 +3058,21 @@
         </w:numPr>
       </w:pPr>
       <w:r>
-        <w:t xml:space="preserve">Emplear la técnica de bootstrapping, en la que cada evento programa el siguiente, optimizando la automatización de la simulación y la gestión de la FEL (Future Event List) </w:t>
+        <w:t xml:space="preserve">Emplear la técnica de bootstrapping, en la que cada evento programa el siguiente, </w:t>
+      </w:r>
+      <w:r>
+        <w:t xml:space="preserve">haciendo uso de la </w:t>
+      </w:r>
+      <m:oMath>
+        <m:r>
+          <w:rPr>
+            <w:rFonts w:ascii="Cambria Math" w:hAnsi="Cambria Math"/>
+          </w:rPr>
+          <m:t>FEL</m:t>
+        </m:r>
+      </m:oMath>
+      <w:r>
+        <w:t xml:space="preserve"> (Future Event List) </w:t>
       </w:r>
       <w:r>
         <w:rPr>
@@ -3008,7 +3114,6 @@
         </w:numPr>
       </w:pPr>
       <w:r>
-        <w:lastRenderedPageBreak/>
         <w:t>Tiempos de tránsito (media, máximo y mínimo distinto de cero).</w:t>
       </w:r>
     </w:p>
@@ -3020,6 +3125,7 @@
         </w:numPr>
       </w:pPr>
       <w:r>
+        <w:lastRenderedPageBreak/>
         <w:t>Tiempos de espera (media, máximo y mínimo distinto de cero).</w:t>
       </w:r>
     </w:p>
@@ -3053,7 +3159,7 @@
         </w:numPr>
       </w:pPr>
       <w:r>
-        <w:t>Verificar</w:t>
+        <w:t>Validar</w:t>
       </w:r>
       <w:r>
         <w:t xml:space="preserve"> el correcto funcionamiento de la simulación</w:t>
@@ -3079,16 +3185,121 @@
       <w:pPr>
         <w:pStyle w:val="Heading1"/>
       </w:pPr>
-      <w:bookmarkStart w:id="7" w:name="_Toc201229733"/>
-      <w:bookmarkStart w:id="8" w:name="_Toc201229734"/>
+      <w:bookmarkStart w:id="7" w:name="_Toc201229734"/>
+      <w:bookmarkStart w:id="8" w:name="_Toc201229733"/>
       <w:r>
         <w:t>Modelo de Dominio</w:t>
       </w:r>
-      <w:bookmarkEnd w:id="8"/>
-    </w:p>
-    <w:p>
-      <w:r>
-        <w:t>Para la primera etapa seguimos la metodología S.O.L.I.D., por lo que las clases fueron creadas en base a la escalabilidad, y puede que aún no se vea el sentido de su existencia.</w:t>
+      <w:bookmarkEnd w:id="7"/>
+    </w:p>
+    <w:p>
+      <w:r>
+        <w:t>Para la primera etapa</w:t>
+      </w:r>
+      <w:r>
+        <w:t xml:space="preserve">, como el enunciado del laboratorio indica, </w:t>
+      </w:r>
+      <w:r>
+        <w:t xml:space="preserve">seguimos la metodología S.O.L.I.D., por lo que las clases fueron creadas </w:t>
+      </w:r>
+      <w:r>
+        <w:t>teniendo en cuenta requisitos futuros</w:t>
+      </w:r>
+      <w:r>
+        <w:t xml:space="preserve">, y puede que </w:t>
+      </w:r>
+      <w:r>
+        <w:t xml:space="preserve">para algunas </w:t>
+      </w:r>
+      <w:r>
+        <w:t>aún no se vea el sentido de su existencia</w:t>
+      </w:r>
+      <w:r>
+        <w:t xml:space="preserve"> (</w:t>
+      </w:r>
+      <m:oMath>
+        <m:r>
+          <w:rPr>
+            <w:rFonts w:ascii="Cambria Math" w:hAnsi="Cambria Math"/>
+          </w:rPr>
+          <m:t>ServerPrioritizer</m:t>
+        </m:r>
+      </m:oMath>
+      <w:r>
+        <w:t>)</w:t>
+      </w:r>
+      <w:r>
+        <w:t>.</w:t>
+      </w:r>
+    </w:p>
+    <w:p>
+      <w:r>
+        <w:t>Nuestra implementación de modelo se implemento de la siguiente manera:</w:t>
+      </w:r>
+    </w:p>
+    <w:p>
+      <w:pPr>
+        <w:pStyle w:val="ListParagraph"/>
+        <w:numPr>
+          <w:ilvl w:val="0"/>
+          <w:numId w:val="12"/>
+        </w:numPr>
+      </w:pPr>
+      <w:r>
+        <w:t>Color azul representa una clase común.</w:t>
+      </w:r>
+    </w:p>
+    <w:p>
+      <w:pPr>
+        <w:pStyle w:val="ListParagraph"/>
+        <w:numPr>
+          <w:ilvl w:val="0"/>
+          <w:numId w:val="12"/>
+        </w:numPr>
+      </w:pPr>
+      <w:r>
+        <w:t>Morado representa clases abstractas.</w:t>
+      </w:r>
+    </w:p>
+    <w:p>
+      <w:pPr>
+        <w:pStyle w:val="ListParagraph"/>
+        <w:numPr>
+          <w:ilvl w:val="0"/>
+          <w:numId w:val="12"/>
+        </w:numPr>
+      </w:pPr>
+      <w:r>
+        <w:t>Verde representa las interfaces</w:t>
+      </w:r>
+    </w:p>
+    <w:p>
+      <w:pPr>
+        <w:pStyle w:val="ListParagraph"/>
+        <w:numPr>
+          <w:ilvl w:val="0"/>
+          <w:numId w:val="12"/>
+        </w:numPr>
+      </w:pPr>
+      <w:r>
+        <w:t xml:space="preserve">Naranja implementaciones que no forman parte de la librería </w:t>
+      </w:r>
+      <m:oMath>
+        <m:r>
+          <w:rPr>
+            <w:rFonts w:ascii="Cambria Math" w:hAnsi="Cambria Math"/>
+          </w:rPr>
+          <m:t>Bootstrapping</m:t>
+        </m:r>
+      </m:oMath>
+      <w:r>
+        <w:rPr>
+          <w:rFonts w:eastAsiaTheme="minorEastAsia"/>
+        </w:rPr>
+        <w:t xml:space="preserve">, es decir, son realizaciones del escenario </w:t>
+      </w:r>
+      <w:r>
+        <w:t>(aeropuerto)</w:t>
       </w:r>
     </w:p>
     <w:p>
@@ -3096,11 +3307,12 @@
         <w:rPr>
           <w:noProof/>
         </w:rPr>
+        <w:lastRenderedPageBreak/>
         <w:drawing>
-          <wp:inline distT="0" distB="0" distL="0" distR="0" wp14:anchorId="1E0531A6" wp14:editId="484E6520">
-            <wp:extent cx="5731510" cy="3442335"/>
-            <wp:effectExtent l="0" t="0" r="2540" b="5715"/>
-            <wp:docPr id="1127189294" name="Picture 1"/>
+          <wp:inline distT="0" distB="0" distL="0" distR="0" wp14:anchorId="40D9C7BB" wp14:editId="66A08023">
+            <wp:extent cx="5731510" cy="3477895"/>
+            <wp:effectExtent l="0" t="0" r="2540" b="8255"/>
+            <wp:docPr id="1" name="Picture 1"/>
             <wp:cNvGraphicFramePr>
               <a:graphicFrameLocks xmlns:a="http://schemas.openxmlformats.org/drawingml/2006/main" noChangeAspect="1"/>
             </wp:cNvGraphicFramePr>
@@ -3108,7 +3320,7 @@
               <a:graphicData uri="http://schemas.openxmlformats.org/drawingml/2006/picture">
                 <pic:pic xmlns:pic="http://schemas.openxmlformats.org/drawingml/2006/picture">
                   <pic:nvPicPr>
-                    <pic:cNvPr id="1127189294" name=""/>
+                    <pic:cNvPr id="1" name=""/>
                     <pic:cNvPicPr/>
                   </pic:nvPicPr>
                   <pic:blipFill>
@@ -3120,7 +3332,7 @@
                   <pic:spPr>
                     <a:xfrm>
                       <a:off x="0" y="0"/>
-                      <a:ext cx="5731510" cy="3442335"/>
+                      <a:ext cx="5731510" cy="3477895"/>
                     </a:xfrm>
                     <a:prstGeom prst="rect">
                       <a:avLst/>
@@ -3136,7 +3348,7 @@
     <w:p>
       <w:r>
         <w:pict w14:anchorId="0D17FF38">
-          <v:rect id="_x0000_i1036" style="width:0;height:1.5pt" o:hralign="center" o:hrstd="t" o:hr="t" fillcolor="#a0a0a0" stroked="f"/>
+          <v:rect id="_x0000_i1029" style="width:0;height:1.5pt" o:hralign="center" o:hrstd="t" o:hr="t" fillcolor="#a0a0a0" stroked="f"/>
         </w:pict>
       </w:r>
     </w:p>
@@ -3147,7 +3359,7 @@
       <w:r>
         <w:t>Experiencia de Desarrollo</w:t>
       </w:r>
-      <w:bookmarkEnd w:id="7"/>
+      <w:bookmarkEnd w:id="8"/>
     </w:p>
     <w:p>
       <w:pPr>
@@ -3168,14 +3380,24 @@
         </w:numPr>
       </w:pPr>
       <w:r>
-        <w:lastRenderedPageBreak/>
         <w:t xml:space="preserve">Debido a nuestra falta de </w:t>
       </w:r>
       <w:r>
         <w:t>experiencia</w:t>
       </w:r>
       <w:r>
-        <w:t>, debimos readaptar partes del código en múltiples ocasiones, refinando la estructura y corregir errores en la gestión de la FEL.</w:t>
+        <w:t xml:space="preserve">, debimos readaptar partes del código en múltiples ocasiones, refinando la estructura y corregir errores en la gestión de la </w:t>
+      </w:r>
+      <m:oMath>
+        <m:r>
+          <w:rPr>
+            <w:rFonts w:ascii="Cambria Math" w:hAnsi="Cambria Math"/>
+          </w:rPr>
+          <m:t>FEL</m:t>
+        </m:r>
+      </m:oMath>
+      <w:r>
+        <w:t>.</w:t>
       </w:r>
     </w:p>
     <w:p>
@@ -3186,33 +3408,33 @@
         </w:numPr>
       </w:pPr>
       <w:r>
-        <w:t xml:space="preserve">Incorporamos por primera vez en nuestra forma de codificar los principios S.O.L.I.D., </w:t>
-      </w:r>
-      <w:r>
-        <w:t>permitiéndonos</w:t>
-      </w:r>
-      <w:r>
-        <w:t xml:space="preserve"> apreciar sus beneficios en la mantenibilidad, cohesión y extensibilidad del simulador</w:t>
-      </w:r>
-      <w:r>
-        <w:t>.</w:t>
-      </w:r>
-    </w:p>
-    <w:p>
-      <w:pPr>
-        <w:numPr>
-          <w:ilvl w:val="0"/>
-          <w:numId w:val="4"/>
-        </w:numPr>
-      </w:pPr>
-      <w:r>
         <w:t xml:space="preserve">Una de nuestras principales dificultades fue determinar la forma </w:t>
       </w:r>
       <w:r>
         <w:t>eficaz</w:t>
       </w:r>
       <w:r>
-        <w:t xml:space="preserve"> de implementar el cómputo de estadísticas (tiempos de espera, tránsito y ocio), lo que nos obligó a diseñar </w:t>
+        <w:t xml:space="preserve"> de implementar el cómputo de estadísticas (</w:t>
+      </w:r>
+      <m:oMath>
+        <m:r>
+          <w:rPr>
+            <w:rFonts w:ascii="Cambria Math" w:hAnsi="Cambria Math"/>
+          </w:rPr>
+          <m:t>Wait, Transit, Idle</m:t>
+        </m:r>
+      </m:oMath>
+      <w:r>
+        <w:t>)</w:t>
+      </w:r>
+      <w:r>
+        <w:rPr>
+          <w:rStyle w:val="FootnoteReference"/>
+        </w:rPr>
+        <w:footnoteReference w:id="1"/>
+      </w:r>
+      <w:r>
+        <w:t xml:space="preserve">, lo que nos obligó a diseñar </w:t>
       </w:r>
       <w:r>
         <w:t xml:space="preserve">la clase </w:t>
@@ -3229,7 +3451,39 @@
         <w:rPr>
           <w:rFonts w:eastAsiaTheme="minorEastAsia"/>
         </w:rPr>
-        <w:t>, la cual se encarga de ello.</w:t>
+        <w:t xml:space="preserve">, la cual se encarga </w:t>
+      </w:r>
+      <w:r>
+        <w:rPr>
+          <w:rFonts w:eastAsiaTheme="minorEastAsia"/>
+        </w:rPr>
+        <w:t>almacenar dichas estadísticas</w:t>
+      </w:r>
+      <w:r>
+        <w:rPr>
+          <w:rFonts w:eastAsiaTheme="minorEastAsia"/>
+        </w:rPr>
+        <w:t>.</w:t>
+      </w:r>
+      <w:r>
+        <w:rPr>
+          <w:rFonts w:eastAsiaTheme="minorEastAsia"/>
+        </w:rPr>
+        <w:t xml:space="preserve"> Además, se creó la clase </w:t>
+      </w:r>
+      <m:oMath>
+        <m:r>
+          <w:rPr>
+            <w:rFonts w:ascii="Cambria Math" w:eastAsiaTheme="minorEastAsia" w:hAnsi="Cambria Math"/>
+          </w:rPr>
+          <m:t>EntityHistory</m:t>
+        </m:r>
+      </m:oMath>
+      <w:r>
+        <w:rPr>
+          <w:rFonts w:eastAsiaTheme="minorEastAsia"/>
+        </w:rPr>
+        <w:t xml:space="preserve"> que se encarga de almacenar la historia de eventos de una entidad, la cual nos facilita calcular estadísticas de tránsito y espera de la misma.</w:t>
       </w:r>
     </w:p>
     <w:p>
@@ -3240,27 +3494,116 @@
         </w:numPr>
       </w:pPr>
       <w:r>
-        <w:t>Al aplicar SOLID y considerando los requisitos de las siguientes dos etapas del práctico, realizamos el diseño pensando en posibles cambios futuros, lo que facilitará la integración de múltiples servidores y nuevos generadores de variables aleatorias en etapas posteriores.</w:t>
-      </w:r>
-    </w:p>
-    <w:p>
-      <w:pPr>
-        <w:numPr>
-          <w:ilvl w:val="0"/>
-          <w:numId w:val="4"/>
-        </w:numPr>
-      </w:pPr>
-      <w:r>
-        <w:t>En conjunto, consideramos que esta primera etapa nos proporcionó una experiencia valiosa que sin duda enriquecerá nuestro desarrollo profesional en simulación y diseño de software</w:t>
+        <w:t>Al aplicar S</w:t>
       </w:r>
       <w:r>
         <w:t>.</w:t>
       </w:r>
+      <w:r>
+        <w:t>O</w:t>
+      </w:r>
+      <w:r>
+        <w:t>.</w:t>
+      </w:r>
+      <w:r>
+        <w:t>L</w:t>
+      </w:r>
+      <w:r>
+        <w:t>.</w:t>
+      </w:r>
+      <w:r>
+        <w:t>I</w:t>
+      </w:r>
+      <w:r>
+        <w:t>.</w:t>
+      </w:r>
+      <w:r>
+        <w:t>D</w:t>
+      </w:r>
+      <w:r>
+        <w:t>.</w:t>
+      </w:r>
+      <w:r>
+        <w:t xml:space="preserve"> y considerando los requisitos de las siguientes dos etapas del práctico, realizamos el diseño pensando en posibles cambios futuros, lo que </w:t>
+      </w:r>
+      <w:r>
+        <w:t xml:space="preserve">debería </w:t>
+      </w:r>
+      <w:r>
+        <w:t>facilitar la integración de múltiples servidores</w:t>
+      </w:r>
+      <w:r>
+        <w:t xml:space="preserve"> (</w:t>
+      </w:r>
+      <m:oMath>
+        <m:r>
+          <w:rPr>
+            <w:rFonts w:ascii="Cambria Math" w:hAnsi="Cambria Math"/>
+          </w:rPr>
+          <m:t>Servers</m:t>
+        </m:r>
+      </m:oMath>
+      <w:r>
+        <w:t>)</w:t>
+      </w:r>
+      <w:r>
+        <w:t>.</w:t>
+      </w:r>
+      <w:r>
+        <w:t xml:space="preserve"> </w:t>
+      </w:r>
+      <w:r>
+        <w:t>Además,</w:t>
+      </w:r>
+      <w:r>
+        <w:t xml:space="preserve"> </w:t>
+      </w:r>
+      <w:r>
+        <w:lastRenderedPageBreak/>
+        <w:t xml:space="preserve">creamos la interface </w:t>
+      </w:r>
+      <m:oMath>
+        <m:r>
+          <w:rPr>
+            <w:rFonts w:ascii="Cambria Math" w:hAnsi="Cambria Math"/>
+          </w:rPr>
+          <m:t>Distribution</m:t>
+        </m:r>
+        <m:r>
+          <w:rPr>
+            <w:rStyle w:val="FootnoteReference"/>
+            <w:rFonts w:ascii="Cambria Math" w:hAnsi="Cambria Math"/>
+            <w:i/>
+          </w:rPr>
+          <w:footnoteReference w:id="2"/>
+        </m:r>
+      </m:oMath>
+      <w:r>
+        <w:rPr>
+          <w:rFonts w:eastAsiaTheme="minorEastAsia"/>
+        </w:rPr>
+        <w:t>, la cual permite</w:t>
+      </w:r>
+      <w:r>
+        <w:t xml:space="preserve"> que el</w:t>
+      </w:r>
+      <w:r>
+        <w:rPr>
+          <w:lang w:val="es-ES"/>
+        </w:rPr>
+        <w:t xml:space="preserve"> </w:t>
+      </w:r>
+      <w:r>
+        <w:t>usuario pueda añadir nuevas distribuciones de forma sencilla</w:t>
+      </w:r>
+      <w:r>
+        <w:t>.</w:t>
+      </w:r>
     </w:p>
     <w:p>
       <w:r>
         <w:pict w14:anchorId="40E16636">
-          <v:rect id="_x0000_i1029" style="width:0;height:1.5pt" o:hralign="center" o:hrstd="t" o:hr="t" fillcolor="#a0a0a0" stroked="f"/>
+          <v:rect id="_x0000_i1030" style="width:0;height:1.5pt" o:hralign="center" o:hrstd="t" o:hr="t" fillcolor="#a0a0a0" stroked="f"/>
         </w:pict>
       </w:r>
     </w:p>
@@ -3312,16 +3655,49 @@
         </w:numPr>
       </w:pPr>
       <w:r>
-        <w:t>Incorporar generadores de variables aleatorias para las distribuciones especificadas: empírica discreta, uniforme, exponencial</w:t>
+        <w:t xml:space="preserve">Incorporar generadores de variables aleatorias para las distribuciones especificadas: </w:t>
+      </w:r>
+      <w:r>
+        <w:t>E</w:t>
+      </w:r>
+      <w:r>
+        <w:t xml:space="preserve">mpírica </w:t>
+      </w:r>
+      <w:r>
+        <w:t>D</w:t>
+      </w:r>
+      <w:r>
+        <w:t xml:space="preserve">iscreta, </w:t>
+      </w:r>
+      <w:r>
+        <w:t>U</w:t>
+      </w:r>
+      <w:r>
+        <w:t xml:space="preserve">niforme, </w:t>
+      </w:r>
+      <w:r>
+        <w:t>E</w:t>
+      </w:r>
+      <w:r>
+        <w:t>xponencial</w:t>
       </w:r>
       <w:r>
         <w:t xml:space="preserve"> y</w:t>
       </w:r>
       <w:r>
-        <w:t xml:space="preserve"> normal</w:t>
+        <w:t xml:space="preserve"> </w:t>
+      </w:r>
+      <w:r>
+        <w:t>N</w:t>
+      </w:r>
+      <w:r>
+        <w:t>ormal</w:t>
       </w:r>
       <w:r>
         <w:t>.</w:t>
+      </w:r>
+      <w:r>
+        <w:t xml:space="preserve"> Además, opcionalmente incorporar distribuciones Empírica Continua, Triangular, Poisson.</w:t>
       </w:r>
     </w:p>
     <w:p>
@@ -3431,7 +3807,6 @@
         </w:numPr>
       </w:pPr>
       <w:r>
-        <w:lastRenderedPageBreak/>
         <w:t xml:space="preserve">Diseñar la lógica de asignación de pista de aterrizaje: a cada avión se le asigna la pista con la cola más corta (o la </w:t>
       </w:r>
       <w:r>
@@ -3510,7 +3885,7 @@
     <w:p>
       <w:r>
         <w:pict w14:anchorId="219E9160">
-          <v:rect id="_x0000_i1030" style="width:0;height:1.5pt" o:hralign="center" o:hrstd="t" o:hr="t" fillcolor="#a0a0a0" stroked="f"/>
+          <v:rect id="_x0000_i1031" style="width:0;height:1.5pt" o:hralign="center" o:hrstd="t" o:hr="t" fillcolor="#a0a0a0" stroked="f"/>
         </w:pict>
       </w:r>
     </w:p>
@@ -3518,23 +3893,21 @@
       <w:pPr>
         <w:pStyle w:val="Heading1"/>
       </w:pPr>
-      <w:bookmarkStart w:id="11" w:name="_Toc201229737"/>
-      <w:bookmarkStart w:id="12" w:name="_Toc201229738"/>
-      <w:r>
+      <w:bookmarkStart w:id="11" w:name="_Toc201229738"/>
+      <w:bookmarkStart w:id="12" w:name="_Toc201229737"/>
+      <w:r>
+        <w:lastRenderedPageBreak/>
         <w:t>Modelo de Dominio</w:t>
       </w:r>
-      <w:bookmarkEnd w:id="12"/>
-    </w:p>
-    <w:p>
-      <w:r>
-        <w:rPr>
-          <w:noProof/>
-        </w:rPr>
+      <w:bookmarkEnd w:id="11"/>
+    </w:p>
+    <w:p>
+      <w:r>
         <w:drawing>
-          <wp:inline distT="0" distB="0" distL="0" distR="0" wp14:anchorId="3B651165" wp14:editId="2F5935E5">
-            <wp:extent cx="5731510" cy="3761105"/>
-            <wp:effectExtent l="0" t="0" r="2540" b="0"/>
-            <wp:docPr id="2127166571" name="Picture 1" descr="A diagram of a company&#10;&#10;AI-generated content may be incorrect."/>
+          <wp:inline distT="0" distB="0" distL="0" distR="0" wp14:anchorId="20BE91DE" wp14:editId="6BF9BEF0">
+            <wp:extent cx="5731510" cy="3594735"/>
+            <wp:effectExtent l="0" t="0" r="2540" b="5715"/>
+            <wp:docPr id="7" name="Picture 7"/>
             <wp:cNvGraphicFramePr>
               <a:graphicFrameLocks xmlns:a="http://schemas.openxmlformats.org/drawingml/2006/main" noChangeAspect="1"/>
             </wp:cNvGraphicFramePr>
@@ -3542,7 +3915,7 @@
               <a:graphicData uri="http://schemas.openxmlformats.org/drawingml/2006/picture">
                 <pic:pic xmlns:pic="http://schemas.openxmlformats.org/drawingml/2006/picture">
                   <pic:nvPicPr>
-                    <pic:cNvPr id="2127166571" name="Picture 1" descr="A diagram of a company&#10;&#10;AI-generated content may be incorrect."/>
+                    <pic:cNvPr id="1" name=""/>
                     <pic:cNvPicPr/>
                   </pic:nvPicPr>
                   <pic:blipFill>
@@ -3554,7 +3927,7 @@
                   <pic:spPr>
                     <a:xfrm>
                       <a:off x="0" y="0"/>
-                      <a:ext cx="5731510" cy="3761105"/>
+                      <a:ext cx="5731510" cy="3594735"/>
                     </a:xfrm>
                     <a:prstGeom prst="rect">
                       <a:avLst/>
@@ -3570,7 +3943,7 @@
     <w:p>
       <w:r>
         <w:pict w14:anchorId="4D96DA92">
-          <v:rect id="_x0000_i1039" style="width:0;height:1.5pt" o:hralign="center" o:hrstd="t" o:hr="t" fillcolor="#a0a0a0" stroked="f"/>
+          <v:rect id="_x0000_i1032" style="width:0;height:1.5pt" o:hralign="center" o:hrstd="t" o:hr="t" fillcolor="#a0a0a0" stroked="f"/>
         </w:pict>
       </w:r>
     </w:p>
@@ -3581,7 +3954,7 @@
       <w:r>
         <w:t>Experiencia de Desarrollo</w:t>
       </w:r>
-      <w:bookmarkEnd w:id="11"/>
+      <w:bookmarkEnd w:id="12"/>
     </w:p>
     <w:p>
       <w:pPr>
@@ -3623,10 +3996,29 @@
         <w:t xml:space="preserve">para que sea </w:t>
       </w:r>
       <w:r>
-        <w:t xml:space="preserve">capaz de manejar múltiples servidores, </w:t>
-      </w:r>
-      <w:r>
-        <w:lastRenderedPageBreak/>
+        <w:t>capaz de manejar múltiples servidores,</w:t>
+      </w:r>
+      <w:r>
+        <w:t xml:space="preserve"> siendo ahora un atributo de la clase </w:t>
+      </w:r>
+      <m:oMath>
+        <m:r>
+          <w:rPr>
+            <w:rFonts w:ascii="Cambria Math" w:hAnsi="Cambria Math"/>
+          </w:rPr>
+          <m:t xml:space="preserve">Server. </m:t>
+        </m:r>
+      </m:oMath>
+      <w:r>
+        <w:rPr>
+          <w:rFonts w:eastAsiaTheme="minorEastAsia"/>
+        </w:rPr>
+        <w:t>Luego,</w:t>
+      </w:r>
+      <w:r>
+        <w:t xml:space="preserve"> </w:t>
+      </w:r>
+      <w:r>
         <w:t xml:space="preserve">segregamos responsabilidades moviendo el atributo </w:t>
       </w:r>
       <m:oMath>
@@ -3642,7 +4034,7 @@
             <w:rFonts w:ascii="Cambria Math" w:hAnsi="Cambria Math"/>
             <w:i/>
           </w:rPr>
-          <w:footnoteReference w:id="1"/>
+          <w:footnoteReference w:id="3"/>
         </m:r>
       </m:oMath>
       <w:r>
@@ -3707,51 +4099,148 @@
             <w:rFonts w:ascii="Cambria Math" w:eastAsiaTheme="minorEastAsia" w:hAnsi="Cambria Math"/>
             <w:i/>
           </w:rPr>
-          <w:footnoteReference w:id="2"/>
+          <w:footnoteReference w:id="4"/>
         </m:r>
       </m:oMath>
       <w:r>
-        <w:t>. Además,</w:t>
-      </w:r>
-      <w:r>
-        <w:t xml:space="preserve"> </w:t>
-      </w:r>
-      <w:r>
-        <w:t xml:space="preserve">creamos la interface </w:t>
+        <w:t>.</w:t>
+      </w:r>
+    </w:p>
+    <w:p>
+      <w:pPr>
+        <w:numPr>
+          <w:ilvl w:val="0"/>
+          <w:numId w:val="7"/>
+        </w:numPr>
+      </w:pPr>
+      <w:r>
+        <w:t>La mayor dificultad que enfrentamos en esta segunda etapa fue encontrar la mejor manera de permitir al usuario seleccionar y parametrizar las distintas distribuciones, especialmente la implementación dinámica de la distribución exponencial con medias variables en función de las horas pico.</w:t>
+      </w:r>
+      <w:r>
+        <w:t xml:space="preserve"> Esto implico </w:t>
+      </w:r>
+      <w:r>
+        <w:t xml:space="preserve">el </w:t>
+      </w:r>
+      <w:r>
+        <w:t>unificar</w:t>
+      </w:r>
+      <w:r>
+        <w:t xml:space="preserve"> las clases </w:t>
       </w:r>
       <m:oMath>
         <m:r>
           <w:rPr>
             <w:rFonts w:ascii="Cambria Math" w:hAnsi="Cambria Math"/>
           </w:rPr>
+          <m:t>ServiceDuration</m:t>
+        </m:r>
+      </m:oMath>
+      <w:r>
+        <w:t xml:space="preserve"> y </w:t>
+      </w:r>
+      <m:oMath>
+        <m:r>
+          <w:rPr>
+            <w:rFonts w:ascii="Cambria Math" w:hAnsi="Cambria Math"/>
+          </w:rPr>
+          <m:t>TimeBetweenArrival</m:t>
+        </m:r>
+      </m:oMath>
+      <w:r>
+        <w:rPr>
+          <w:rFonts w:eastAsiaTheme="minorEastAsia"/>
+        </w:rPr>
+        <w:t xml:space="preserve"> por </w:t>
+      </w:r>
+      <m:oMath>
+        <m:r>
+          <w:rPr>
+            <w:rFonts w:ascii="Cambria Math" w:eastAsiaTheme="minorEastAsia" w:hAnsi="Cambria Math"/>
+          </w:rPr>
+          <m:t>StaticDiscreteEmpiricEventDuration</m:t>
+        </m:r>
+      </m:oMath>
+      <w:r>
+        <w:rPr>
+          <w:rFonts w:eastAsiaTheme="minorEastAsia"/>
+        </w:rPr>
+        <w:t>.</w:t>
+      </w:r>
+      <w:r>
+        <w:rPr>
+          <w:rFonts w:eastAsiaTheme="minorEastAsia"/>
+        </w:rPr>
+        <w:t xml:space="preserve"> Además, ahora </w:t>
+      </w:r>
+      <m:oMath>
+        <m:r>
+          <w:rPr>
+            <w:rFonts w:ascii="Cambria Math" w:eastAsiaTheme="minorEastAsia" w:hAnsi="Cambria Math"/>
+          </w:rPr>
           <m:t>Distribution</m:t>
+        </m:r>
+      </m:oMath>
+      <w:r>
+        <w:rPr>
+          <w:rFonts w:eastAsiaTheme="minorEastAsia"/>
+        </w:rPr>
+        <w:t xml:space="preserve"> pasa a ser </w:t>
+      </w:r>
+      <w:r>
+        <w:rPr>
+          <w:rFonts w:eastAsiaTheme="minorEastAsia"/>
+        </w:rPr>
+        <w:lastRenderedPageBreak/>
+        <w:t xml:space="preserve">atributo de la </w:t>
+      </w:r>
+      <m:oMath>
+        <m:r>
+          <w:rPr>
+            <w:rFonts w:ascii="Cambria Math" w:eastAsiaTheme="minorEastAsia" w:hAnsi="Cambria Math"/>
+          </w:rPr>
+          <m:t>Eventos</m:t>
+        </m:r>
+      </m:oMath>
+      <w:r>
+        <w:rPr>
+          <w:rFonts w:eastAsiaTheme="minorEastAsia"/>
+        </w:rPr>
+        <w:t xml:space="preserve">, siendo previamente esta misma atributo de </w:t>
+      </w:r>
+      <m:oMath>
+        <m:r>
+          <w:rPr>
+            <w:rFonts w:ascii="Cambria Math" w:eastAsiaTheme="minorEastAsia" w:hAnsi="Cambria Math"/>
+          </w:rPr>
+          <m:t>A</m:t>
         </m:r>
         <m:r>
           <w:rPr>
-            <w:rStyle w:val="FootnoteReference"/>
-            <w:rFonts w:ascii="Cambria Math" w:hAnsi="Cambria Math"/>
-            <w:i/>
+            <w:rFonts w:ascii="Cambria Math" w:eastAsiaTheme="minorEastAsia" w:hAnsi="Cambria Math"/>
           </w:rPr>
-          <w:footnoteReference w:id="3"/>
+          <m:t>rrival</m:t>
         </m:r>
       </m:oMath>
       <w:r>
         <w:rPr>
           <w:rFonts w:eastAsiaTheme="minorEastAsia"/>
         </w:rPr>
-        <w:t>, la cual permite</w:t>
-      </w:r>
-      <w:r>
-        <w:t xml:space="preserve"> que el</w:t>
-      </w:r>
+        <w:t xml:space="preserve"> y </w:t>
+      </w:r>
+      <m:oMath>
+        <m:r>
+          <w:rPr>
+            <w:rFonts w:ascii="Cambria Math" w:eastAsiaTheme="minorEastAsia" w:hAnsi="Cambria Math"/>
+          </w:rPr>
+          <m:t>Departure</m:t>
+        </m:r>
+      </m:oMath>
       <w:r>
         <w:rPr>
-          <w:lang w:val="es-ES"/>
+          <w:rFonts w:eastAsiaTheme="minorEastAsia"/>
         </w:rPr>
-        <w:t xml:space="preserve"> </w:t>
-      </w:r>
-      <w:r>
-        <w:t>usuario pueda añadir nuevas distribuciones de forma sencilla.</w:t>
+        <w:t>.</w:t>
       </w:r>
     </w:p>
     <w:p>
@@ -3762,7 +4251,38 @@
         </w:numPr>
       </w:pPr>
       <w:r>
-        <w:t>La mayor dificultad que enfrentamos en esta segunda etapa fue encontrar la mejor manera de permitir al usuario seleccionar y parametrizar las distintas distribuciones, especialmente la implementación dinámica de la distribución exponencial con medias variables en función de las horas pico.</w:t>
+        <w:rPr>
+          <w:rFonts w:eastAsiaTheme="minorEastAsia"/>
+        </w:rPr>
+        <w:t>Identificamos una generalización para los atributos estadísticos (</w:t>
+      </w:r>
+      <m:oMath>
+        <m:r>
+          <w:rPr>
+            <w:rFonts w:ascii="Cambria Math" w:eastAsiaTheme="minorEastAsia" w:hAnsi="Cambria Math"/>
+          </w:rPr>
+          <m:t>Idle, Transit, Wait</m:t>
+        </m:r>
+      </m:oMath>
+      <w:r>
+        <w:rPr>
+          <w:rFonts w:eastAsiaTheme="minorEastAsia"/>
+        </w:rPr>
+        <w:t xml:space="preserve">), ya que los mismos comparten la misma estructura. De esta manera se creó la clase abstracta </w:t>
+      </w:r>
+      <m:oMath>
+        <m:r>
+          <w:rPr>
+            <w:rFonts w:ascii="Cambria Math" w:eastAsiaTheme="minorEastAsia" w:hAnsi="Cambria Math"/>
+          </w:rPr>
+          <m:t>DataCollector</m:t>
+        </m:r>
+      </m:oMath>
+      <w:r>
+        <w:rPr>
+          <w:rFonts w:eastAsiaTheme="minorEastAsia"/>
+        </w:rPr>
+        <w:t xml:space="preserve"> de la cual heredaran dichos estadísticos. </w:t>
       </w:r>
     </w:p>
     <w:p>
@@ -3773,13 +4293,565 @@
         </w:numPr>
       </w:pPr>
       <w:r>
-        <w:t>Mejoramos todos los comparators de nuestras clases, asegurando un ordenamiento consistente y eficiente de los eventos en la FEL para cualquier número de servidores.</w:t>
+        <w:rPr>
+          <w:rFonts w:eastAsiaTheme="minorEastAsia"/>
+        </w:rPr>
+        <w:t xml:space="preserve">En la primera etapa debimos hardcodear la creación de la entidad </w:t>
+      </w:r>
+      <m:oMath>
+        <m:r>
+          <w:rPr>
+            <w:rFonts w:ascii="Cambria Math" w:eastAsiaTheme="minorEastAsia" w:hAnsi="Cambria Math"/>
+          </w:rPr>
+          <m:t>Aircraft</m:t>
+        </m:r>
+      </m:oMath>
+      <w:r>
+        <w:rPr>
+          <w:rFonts w:eastAsiaTheme="minorEastAsia"/>
+        </w:rPr>
+        <w:t xml:space="preserve"> al crear un nuevo arribo, dado que, la clase </w:t>
+      </w:r>
+      <m:oMath>
+        <m:r>
+          <w:rPr>
+            <w:rFonts w:ascii="Cambria Math" w:eastAsiaTheme="minorEastAsia" w:hAnsi="Cambria Math"/>
+          </w:rPr>
+          <m:t>Entity</m:t>
+        </m:r>
+      </m:oMath>
+      <w:r>
+        <w:rPr>
+          <w:rFonts w:eastAsiaTheme="minorEastAsia"/>
+        </w:rPr>
+        <w:t xml:space="preserve"> es abstracta y ello implicaba hacer:</w:t>
+      </w:r>
+    </w:p>
+    <w:p>
+      <w:pPr>
+        <w:ind w:left="720"/>
+        <w:rPr>
+          <w:rFonts w:eastAsiaTheme="minorEastAsia"/>
+        </w:rPr>
+      </w:pPr>
+      <m:oMath>
+        <m:r>
+          <w:rPr>
+            <w:rFonts w:ascii="Cambria Math" w:hAnsi="Cambria Math"/>
+            <w:lang w:val="en-US"/>
+          </w:rPr>
+          <m:t>fel</m:t>
+        </m:r>
+        <m:r>
+          <w:rPr>
+            <w:rFonts w:ascii="Cambria Math" w:hAnsi="Cambria Math"/>
+          </w:rPr>
+          <m:t>.</m:t>
+        </m:r>
+        <m:r>
+          <w:rPr>
+            <w:rFonts w:ascii="Cambria Math" w:hAnsi="Cambria Math"/>
+            <w:lang w:val="en-US"/>
+          </w:rPr>
+          <m:t>addEvent</m:t>
+        </m:r>
+        <m:r>
+          <w:rPr>
+            <w:rFonts w:ascii="Cambria Math" w:hAnsi="Cambria Math"/>
+          </w:rPr>
+          <m:t>(</m:t>
+        </m:r>
+        <m:r>
+          <w:rPr>
+            <w:rFonts w:ascii="Cambria Math" w:hAnsi="Cambria Math"/>
+            <w:lang w:val="en-US"/>
+          </w:rPr>
+          <m:t>new</m:t>
+        </m:r>
+        <m:r>
+          <w:rPr>
+            <w:rFonts w:ascii="Cambria Math" w:hAnsi="Cambria Math"/>
+          </w:rPr>
+          <m:t xml:space="preserve"> </m:t>
+        </m:r>
+        <m:r>
+          <w:rPr>
+            <w:rFonts w:ascii="Cambria Math" w:hAnsi="Cambria Math"/>
+            <w:lang w:val="en-US"/>
+          </w:rPr>
+          <m:t>Arrival</m:t>
+        </m:r>
+        <m:r>
+          <w:rPr>
+            <w:rFonts w:ascii="Cambria Math" w:hAnsi="Cambria Math"/>
+          </w:rPr>
+          <m:t>(</m:t>
+        </m:r>
+        <m:r>
+          <w:rPr>
+            <w:rFonts w:ascii="Cambria Math" w:hAnsi="Cambria Math"/>
+            <w:lang w:val="en-US"/>
+          </w:rPr>
+          <m:t>type</m:t>
+        </m:r>
+        <m:r>
+          <w:rPr>
+            <w:rFonts w:ascii="Cambria Math" w:hAnsi="Cambria Math"/>
+          </w:rPr>
+          <m:t xml:space="preserve">, </m:t>
+        </m:r>
+        <m:r>
+          <w:rPr>
+            <w:rFonts w:ascii="Cambria Math" w:hAnsi="Cambria Math"/>
+            <w:lang w:val="en-US"/>
+          </w:rPr>
+          <m:t>clock</m:t>
+        </m:r>
+        <m:r>
+          <w:rPr>
+            <w:rFonts w:ascii="Cambria Math" w:hAnsi="Cambria Math"/>
+          </w:rPr>
+          <m:t>,</m:t>
+        </m:r>
+        <m:r>
+          <m:rPr>
+            <m:sty m:val="bi"/>
+          </m:rPr>
+          <w:rPr>
+            <w:rFonts w:ascii="Cambria Math" w:hAnsi="Cambria Math"/>
+          </w:rPr>
+          <m:t xml:space="preserve"> </m:t>
+        </m:r>
+        <m:r>
+          <m:rPr>
+            <m:sty m:val="bi"/>
+          </m:rPr>
+          <w:rPr>
+            <w:rFonts w:ascii="Cambria Math" w:hAnsi="Cambria Math"/>
+            <w:lang w:val="en-US"/>
+          </w:rPr>
+          <m:t>new</m:t>
+        </m:r>
+        <m:r>
+          <m:rPr>
+            <m:sty m:val="bi"/>
+          </m:rPr>
+          <w:rPr>
+            <w:rFonts w:ascii="Cambria Math" w:hAnsi="Cambria Math"/>
+          </w:rPr>
+          <m:t xml:space="preserve"> </m:t>
+        </m:r>
+        <m:r>
+          <m:rPr>
+            <m:sty m:val="bi"/>
+          </m:rPr>
+          <w:rPr>
+            <w:rFonts w:ascii="Cambria Math" w:hAnsi="Cambria Math"/>
+            <w:lang w:val="en-US"/>
+          </w:rPr>
+          <m:t>Aircraft</m:t>
+        </m:r>
+        <m:r>
+          <m:rPr>
+            <m:sty m:val="bi"/>
+          </m:rPr>
+          <w:rPr>
+            <w:rFonts w:ascii="Cambria Math" w:hAnsi="Cambria Math"/>
+          </w:rPr>
+          <m:t>()</m:t>
+        </m:r>
+        <m:r>
+          <w:rPr>
+            <w:rFonts w:ascii="Cambria Math" w:hAnsi="Cambria Math"/>
+          </w:rPr>
+          <m:t xml:space="preserve">, </m:t>
+        </m:r>
+        <m:r>
+          <w:rPr>
+            <w:rFonts w:ascii="Cambria Math" w:hAnsi="Cambria Math"/>
+            <w:lang w:val="en-US"/>
+          </w:rPr>
+          <m:t>distributionList</m:t>
+        </m:r>
+        <m:r>
+          <w:rPr>
+            <w:rFonts w:ascii="Cambria Math" w:hAnsi="Cambria Math"/>
+          </w:rPr>
+          <m:t>));</m:t>
+        </m:r>
+      </m:oMath>
+      <w:r>
+        <w:rPr>
+          <w:rFonts w:eastAsiaTheme="minorEastAsia"/>
+        </w:rPr>
+        <w:t xml:space="preserve"> </w:t>
+      </w:r>
+    </w:p>
+    <w:p>
+      <w:pPr>
+        <w:ind w:left="720"/>
+        <w:rPr>
+          <w:rFonts w:eastAsiaTheme="minorEastAsia"/>
+        </w:rPr>
+      </w:pPr>
+      <w:r>
+        <w:rPr>
+          <w:rFonts w:eastAsiaTheme="minorEastAsia"/>
+        </w:rPr>
+        <w:t>Para resolver esto mismo hicimos uso del patrón de diseño Factory</w:t>
+      </w:r>
+      <w:sdt>
+        <w:sdtPr>
+          <w:rPr>
+            <w:rFonts w:eastAsiaTheme="minorEastAsia"/>
+          </w:rPr>
+          <w:id w:val="-1354027521"/>
+          <w:citation/>
+        </w:sdtPr>
+        <w:sdtContent>
+          <w:r>
+            <w:rPr>
+              <w:rFonts w:eastAsiaTheme="minorEastAsia"/>
+            </w:rPr>
+            <w:fldChar w:fldCharType="begin"/>
+          </w:r>
+          <w:r>
+            <w:rPr>
+              <w:rFonts w:eastAsiaTheme="minorEastAsia"/>
+              <w:lang w:val="es-ES"/>
+            </w:rPr>
+            <w:instrText xml:space="preserve"> CITATION Ref25 \l 1033 </w:instrText>
+          </w:r>
+          <w:r>
+            <w:rPr>
+              <w:rFonts w:eastAsiaTheme="minorEastAsia"/>
+            </w:rPr>
+            <w:fldChar w:fldCharType="separate"/>
+          </w:r>
+          <w:r>
+            <w:rPr>
+              <w:rFonts w:eastAsiaTheme="minorEastAsia"/>
+              <w:noProof/>
+              <w:lang w:val="es-ES"/>
+            </w:rPr>
+            <w:t xml:space="preserve"> [1]</w:t>
+          </w:r>
+          <w:r>
+            <w:rPr>
+              <w:rFonts w:eastAsiaTheme="minorEastAsia"/>
+            </w:rPr>
+            <w:fldChar w:fldCharType="end"/>
+          </w:r>
+        </w:sdtContent>
+      </w:sdt>
+      <w:r>
+        <w:rPr>
+          <w:rFonts w:eastAsiaTheme="minorEastAsia"/>
+        </w:rPr>
+        <w:t xml:space="preserve">, creando la interface </w:t>
+      </w:r>
+      <m:oMath>
+        <m:r>
+          <w:rPr>
+            <w:rFonts w:ascii="Cambria Math" w:eastAsiaTheme="minorEastAsia" w:hAnsi="Cambria Math"/>
+          </w:rPr>
+          <m:t>EntityFactory</m:t>
+        </m:r>
+      </m:oMath>
+      <w:r>
+        <w:rPr>
+          <w:rFonts w:eastAsiaTheme="minorEastAsia"/>
+        </w:rPr>
+        <w:t xml:space="preserve"> y su implementación </w:t>
+      </w:r>
+      <m:oMath>
+        <m:r>
+          <w:rPr>
+            <w:rFonts w:ascii="Cambria Math" w:eastAsiaTheme="minorEastAsia" w:hAnsi="Cambria Math"/>
+          </w:rPr>
+          <m:t>AircraftFactory</m:t>
+        </m:r>
+      </m:oMath>
+      <w:r>
+        <w:rPr>
+          <w:rFonts w:eastAsiaTheme="minorEastAsia"/>
+        </w:rPr>
+        <w:t xml:space="preserve">. De esta manera logramos una implementación reutilizable de </w:t>
+      </w:r>
+      <m:oMath>
+        <m:r>
+          <w:rPr>
+            <w:rFonts w:ascii="Cambria Math" w:eastAsiaTheme="minorEastAsia" w:hAnsi="Cambria Math"/>
+          </w:rPr>
+          <m:t>Arrival</m:t>
+        </m:r>
+      </m:oMath>
+      <w:r>
+        <w:rPr>
+          <w:rFonts w:eastAsiaTheme="minorEastAsia"/>
+        </w:rPr>
+        <w:t>:</w:t>
+      </w:r>
+    </w:p>
+    <w:p>
+      <w:pPr>
+        <w:ind w:left="720"/>
+        <w:rPr>
+          <w:rFonts w:eastAsiaTheme="minorEastAsia"/>
+        </w:rPr>
+      </w:pPr>
+      <m:oMath>
+        <m:r>
+          <w:rPr>
+            <w:rFonts w:ascii="Cambria Math" w:hAnsi="Cambria Math"/>
+            <w:lang w:val="en-US"/>
+          </w:rPr>
+          <m:t>fel</m:t>
+        </m:r>
+        <m:r>
+          <w:rPr>
+            <w:rFonts w:ascii="Cambria Math" w:hAnsi="Cambria Math"/>
+          </w:rPr>
+          <m:t>.</m:t>
+        </m:r>
+        <m:r>
+          <w:rPr>
+            <w:rFonts w:ascii="Cambria Math" w:hAnsi="Cambria Math"/>
+            <w:lang w:val="en-US"/>
+          </w:rPr>
+          <m:t>addEvent</m:t>
+        </m:r>
+        <m:r>
+          <w:rPr>
+            <w:rFonts w:ascii="Cambria Math" w:hAnsi="Cambria Math"/>
+          </w:rPr>
+          <m:t>(</m:t>
+        </m:r>
+        <m:r>
+          <w:rPr>
+            <w:rFonts w:ascii="Cambria Math" w:hAnsi="Cambria Math"/>
+            <w:lang w:val="en-US"/>
+          </w:rPr>
+          <m:t>new</m:t>
+        </m:r>
+        <m:r>
+          <w:rPr>
+            <w:rFonts w:ascii="Cambria Math" w:hAnsi="Cambria Math"/>
+          </w:rPr>
+          <m:t xml:space="preserve"> </m:t>
+        </m:r>
+        <m:r>
+          <w:rPr>
+            <w:rFonts w:ascii="Cambria Math" w:hAnsi="Cambria Math"/>
+            <w:lang w:val="en-US"/>
+          </w:rPr>
+          <m:t>Arrival</m:t>
+        </m:r>
+        <m:r>
+          <w:rPr>
+            <w:rFonts w:ascii="Cambria Math" w:hAnsi="Cambria Math"/>
+          </w:rPr>
+          <m:t>(</m:t>
+        </m:r>
+        <m:r>
+          <w:rPr>
+            <w:rFonts w:ascii="Cambria Math" w:hAnsi="Cambria Math"/>
+            <w:lang w:val="en-US"/>
+          </w:rPr>
+          <m:t>type</m:t>
+        </m:r>
+        <m:r>
+          <w:rPr>
+            <w:rFonts w:ascii="Cambria Math" w:hAnsi="Cambria Math"/>
+          </w:rPr>
+          <m:t xml:space="preserve">, </m:t>
+        </m:r>
+        <m:r>
+          <w:rPr>
+            <w:rFonts w:ascii="Cambria Math" w:hAnsi="Cambria Math"/>
+            <w:lang w:val="en-US"/>
+          </w:rPr>
+          <m:t>clock</m:t>
+        </m:r>
+        <m:r>
+          <w:rPr>
+            <w:rFonts w:ascii="Cambria Math" w:hAnsi="Cambria Math"/>
+          </w:rPr>
+          <m:t>,</m:t>
+        </m:r>
+        <m:r>
+          <m:rPr>
+            <m:sty m:val="bi"/>
+          </m:rPr>
+          <w:rPr>
+            <w:rFonts w:ascii="Cambria Math" w:hAnsi="Cambria Math"/>
+          </w:rPr>
+          <m:t xml:space="preserve"> </m:t>
+        </m:r>
+        <m:r>
+          <m:rPr>
+            <m:sty m:val="bi"/>
+          </m:rPr>
+          <w:rPr>
+            <w:rFonts w:ascii="Cambria Math" w:hAnsi="Cambria Math"/>
+          </w:rPr>
+          <m:t>entityFactory.create(),</m:t>
+        </m:r>
+        <m:r>
+          <w:rPr>
+            <w:rFonts w:ascii="Cambria Math" w:hAnsi="Cambria Math"/>
+            <w:lang w:val="en-US"/>
+          </w:rPr>
+          <m:t>distributionList</m:t>
+        </m:r>
+        <m:r>
+          <w:rPr>
+            <w:rFonts w:ascii="Cambria Math" w:hAnsi="Cambria Math"/>
+          </w:rPr>
+          <m:t>));</m:t>
+        </m:r>
+      </m:oMath>
+      <w:r>
+        <w:rPr>
+          <w:rFonts w:eastAsiaTheme="minorEastAsia"/>
+        </w:rPr>
+        <w:t xml:space="preserve"> </w:t>
+      </w:r>
+    </w:p>
+    <w:p>
+      <w:pPr>
+        <w:ind w:left="720"/>
+        <w:rPr>
+          <w:rFonts w:eastAsiaTheme="minorEastAsia"/>
+        </w:rPr>
+      </w:pPr>
+      <w:r>
+        <w:rPr>
+          <w:rFonts w:eastAsiaTheme="minorEastAsia"/>
+        </w:rPr>
+        <w:t xml:space="preserve">Esto último se implementó para </w:t>
+      </w:r>
+      <m:oMath>
+        <m:r>
+          <w:rPr>
+            <w:rFonts w:ascii="Cambria Math" w:eastAsiaTheme="minorEastAsia" w:hAnsi="Cambria Math"/>
+          </w:rPr>
+          <m:t>Statistics</m:t>
+        </m:r>
+      </m:oMath>
+      <w:r>
+        <w:rPr>
+          <w:rFonts w:eastAsiaTheme="minorEastAsia"/>
+        </w:rPr>
+        <w:t>, ya que teníamos una situación similar para instanciar la implementación de la misma (</w:t>
+      </w:r>
+      <m:oMath>
+        <m:r>
+          <w:rPr>
+            <w:rFonts w:ascii="Cambria Math" w:eastAsiaTheme="minorEastAsia" w:hAnsi="Cambria Math"/>
+          </w:rPr>
+          <m:t>AirportStatistics</m:t>
+        </m:r>
+      </m:oMath>
+      <w:r>
+        <w:rPr>
+          <w:rFonts w:eastAsiaTheme="minorEastAsia"/>
+        </w:rPr>
+        <w:t xml:space="preserve">) en </w:t>
+      </w:r>
+      <m:oMath>
+        <m:r>
+          <w:rPr>
+            <w:rFonts w:ascii="Cambria Math" w:eastAsiaTheme="minorEastAsia" w:hAnsi="Cambria Math"/>
+          </w:rPr>
+          <m:t>Server</m:t>
+        </m:r>
+      </m:oMath>
+      <w:r>
+        <w:rPr>
+          <w:rFonts w:eastAsiaTheme="minorEastAsia"/>
+        </w:rPr>
+        <w:t xml:space="preserve">. Por ello se crearon las clases </w:t>
+      </w:r>
+      <m:oMath>
+        <m:r>
+          <w:rPr>
+            <w:rFonts w:ascii="Cambria Math" w:eastAsiaTheme="minorEastAsia" w:hAnsi="Cambria Math"/>
+          </w:rPr>
+          <m:t>StatisticsFactory</m:t>
+        </m:r>
+      </m:oMath>
+      <w:r>
+        <w:rPr>
+          <w:rFonts w:eastAsiaTheme="minorEastAsia"/>
+        </w:rPr>
+        <w:t xml:space="preserve"> y </w:t>
+      </w:r>
+      <m:oMath>
+        <m:r>
+          <w:rPr>
+            <w:rFonts w:ascii="Cambria Math" w:eastAsiaTheme="minorEastAsia" w:hAnsi="Cambria Math"/>
+          </w:rPr>
+          <m:t>AirportStatisticsFactory</m:t>
+        </m:r>
+      </m:oMath>
+      <w:r>
+        <w:rPr>
+          <w:rFonts w:eastAsiaTheme="minorEastAsia"/>
+        </w:rPr>
+        <w:t>.</w:t>
+      </w:r>
+    </w:p>
+    <w:p>
+      <w:pPr>
+        <w:numPr>
+          <w:ilvl w:val="0"/>
+          <w:numId w:val="7"/>
+        </w:numPr>
+      </w:pPr>
+      <w:r>
+        <w:t>Mejoramos todos los</w:t>
+      </w:r>
+      <w:r>
+        <w:t xml:space="preserve"> “comparators</w:t>
+      </w:r>
+      <w:r>
+        <w:t>”</w:t>
+      </w:r>
+      <w:r>
+        <w:t xml:space="preserve"> de nuestras clases</w:t>
+      </w:r>
+      <w:r>
+        <w:t xml:space="preserve"> utilizando Java </w:t>
+      </w:r>
+      <w:r>
+        <w:t>Funcional</w:t>
+      </w:r>
+      <w:r>
+        <w:t xml:space="preserve"> específicamente el uso de </w:t>
+      </w:r>
+      <w:r>
+        <w:t>referencia a métodos (</w:t>
+      </w:r>
+      <m:oMath>
+        <m:r>
+          <w:rPr>
+            <w:rFonts w:ascii="Cambria Math" w:hAnsi="Cambria Math"/>
+          </w:rPr>
+          <m:t>::</m:t>
+        </m:r>
+      </m:oMath>
+      <w:r>
+        <w:t>) y expresiones lambda.</w:t>
+      </w:r>
+      <w:r>
+        <w:t xml:space="preserve"> </w:t>
       </w:r>
     </w:p>
     <w:p>
       <w:r>
         <w:pict w14:anchorId="1CD6117E">
-          <v:rect id="_x0000_i1031" style="width:0;height:1.5pt" o:hralign="center" o:hrstd="t" o:hr="t" fillcolor="#a0a0a0" stroked="f"/>
+          <v:rect id="_x0000_i1033" style="width:0;height:1.5pt" o:hralign="center" o:hrstd="t" o:hr="t" fillcolor="#a0a0a0" stroked="f"/>
         </w:pict>
       </w:r>
     </w:p>
@@ -3809,12 +4881,57 @@
       </w:r>
       <w:bookmarkEnd w:id="14"/>
     </w:p>
-    <w:p/>
+    <w:p>
+      <w:r>
+        <w:drawing>
+          <wp:inline distT="0" distB="0" distL="0" distR="0" wp14:anchorId="3CC5BAAC" wp14:editId="5385FD57">
+            <wp:extent cx="5731510" cy="4750435"/>
+            <wp:effectExtent l="0" t="0" r="2540" b="0"/>
+            <wp:docPr id="6" name="Picture 6"/>
+            <wp:cNvGraphicFramePr>
+              <a:graphicFrameLocks xmlns:a="http://schemas.openxmlformats.org/drawingml/2006/main" noChangeAspect="1"/>
+            </wp:cNvGraphicFramePr>
+            <a:graphic xmlns:a="http://schemas.openxmlformats.org/drawingml/2006/main">
+              <a:graphicData uri="http://schemas.openxmlformats.org/drawingml/2006/picture">
+                <pic:pic xmlns:pic="http://schemas.openxmlformats.org/drawingml/2006/picture">
+                  <pic:nvPicPr>
+                    <pic:cNvPr id="1" name=""/>
+                    <pic:cNvPicPr/>
+                  </pic:nvPicPr>
+                  <pic:blipFill>
+                    <a:blip r:embed="rId15"/>
+                    <a:stretch>
+                      <a:fillRect/>
+                    </a:stretch>
+                  </pic:blipFill>
+                  <pic:spPr>
+                    <a:xfrm>
+                      <a:off x="0" y="0"/>
+                      <a:ext cx="5731510" cy="4750435"/>
+                    </a:xfrm>
+                    <a:prstGeom prst="rect">
+                      <a:avLst/>
+                    </a:prstGeom>
+                  </pic:spPr>
+                </pic:pic>
+              </a:graphicData>
+            </a:graphic>
+          </wp:inline>
+        </w:drawing>
+      </w:r>
+    </w:p>
+    <w:p>
+      <w:bookmarkStart w:id="15" w:name="_Toc201229741"/>
+      <w:r>
+        <w:pict w14:anchorId="556B9448">
+          <v:rect id="_x0000_i1036" style="width:0;height:1.5pt" o:hralign="center" o:hrstd="t" o:hr="t" fillcolor="#a0a0a0" stroked="f"/>
+        </w:pict>
+      </w:r>
+    </w:p>
     <w:p>
       <w:pPr>
         <w:pStyle w:val="Heading1"/>
       </w:pPr>
-      <w:bookmarkStart w:id="15" w:name="_Toc201229741"/>
       <w:r>
         <w:t>Objetivos</w:t>
       </w:r>
@@ -3836,7 +4953,13 @@
         </w:numPr>
       </w:pPr>
       <w:r>
-        <w:t>Realizar un experimento de simulación mediante 50 ejecuciones independientes para una configuración mejorada del aeropuerto, con el fin de obtener estimaciones estadísticas más robustas.</w:t>
+        <w:t xml:space="preserve">Realizar un experimento de simulación mediante 50 ejecuciones independientes para una configuración mejorada del aeropuerto, con el fin de obtener estimaciones estadísticas más </w:t>
+      </w:r>
+      <w:r>
+        <w:t>certeras</w:t>
+      </w:r>
+      <w:r>
+        <w:t>.</w:t>
       </w:r>
     </w:p>
     <w:p>
@@ -3847,7 +4970,19 @@
         </w:numPr>
       </w:pPr>
       <w:r>
-        <w:t>Calcular intervalos de confianza con un 95% de certeza para las métricas clave del sistema: cantidad total de arribos y aterrizajes, tiempos de tránsito y espera, tiempos de ocio, tamaño de la cola y durabilidad final de las pistas.</w:t>
+        <w:lastRenderedPageBreak/>
+        <w:t xml:space="preserve">Calcular intervalos de confianza con un </w:t>
+      </w:r>
+      <m:oMath>
+        <m:r>
+          <w:rPr>
+            <w:rFonts w:ascii="Cambria Math" w:hAnsi="Cambria Math"/>
+          </w:rPr>
+          <m:t>95%</m:t>
+        </m:r>
+      </m:oMath>
+      <w:r>
+        <w:t xml:space="preserve"> de certeza para las métricas del sistema: cantidad total de arribos y aterrizajes, tiempos de tránsito y espera, tiempos de ocio, tamaño de la cola y durabilidad final de las pistas.</w:t>
       </w:r>
     </w:p>
     <w:p>
@@ -3864,7 +4999,7 @@
     <w:p>
       <w:r>
         <w:pict w14:anchorId="02C0FFE2">
-          <v:rect id="_x0000_i1032" style="width:0;height:1.5pt" o:hralign="center" o:hrstd="t" o:hr="t" fillcolor="#a0a0a0" stroked="f"/>
+          <v:rect id="_x0000_i1034" style="width:0;height:1.5pt" o:hralign="center" o:hrstd="t" o:hr="t" fillcolor="#a0a0a0" stroked="f"/>
         </w:pict>
       </w:r>
     </w:p>
@@ -3880,13 +5015,20 @@
     </w:p>
     <w:p>
       <w:pPr>
+        <w:pStyle w:val="ListParagraph"/>
         <w:numPr>
           <w:ilvl w:val="0"/>
           <w:numId w:val="9"/>
         </w:numPr>
       </w:pPr>
       <w:r>
-        <w:t xml:space="preserve">Refactorizamos nuevamente las clases responsables de la recolección de estadísticas, ya que durante las primeras pruebas advertimos que nuestro diseño original no contemplaba correctamente la asociación de estadísticas con múltiples replicaciones. Esta omisión nos llevó a reestructurar las clases relacionadas a </w:t>
+        <w:t>A</w:t>
+      </w:r>
+      <w:r>
+        <w:t>l</w:t>
+      </w:r>
+      <w:r>
+        <w:t xml:space="preserve"> momento de intentar implementar la replicación de ejecuciones advertimos, dado nuestro modelado inicial de las clases </w:t>
       </w:r>
       <m:oMath>
         <m:r>
@@ -3897,7 +5039,78 @@
         </m:r>
       </m:oMath>
       <w:r>
-        <w:t>, logrando una correcta separación entre estadísticas individuales y agregadas.</w:t>
+        <w:rPr>
+          <w:rFonts w:eastAsiaTheme="minorEastAsia"/>
+        </w:rPr>
+        <w:t xml:space="preserve"> y las clases asociadas (</w:t>
+      </w:r>
+      <m:oMath>
+        <m:r>
+          <w:rPr>
+            <w:rFonts w:ascii="Cambria Math" w:eastAsiaTheme="minorEastAsia" w:hAnsi="Cambria Math"/>
+          </w:rPr>
+          <m:t>StatisticsFactory, AirportStatisticsFactory</m:t>
+        </m:r>
+      </m:oMath>
+      <w:r>
+        <w:rPr>
+          <w:rFonts w:eastAsiaTheme="minorEastAsia"/>
+        </w:rPr>
+        <w:t xml:space="preserve">), no era posible retornar dichas </w:t>
+      </w:r>
+      <w:r>
+        <w:rPr>
+          <w:rFonts w:eastAsiaTheme="minorEastAsia"/>
+        </w:rPr>
+        <w:t>estadísticas</w:t>
+      </w:r>
+      <w:r>
+        <w:rPr>
+          <w:rFonts w:eastAsiaTheme="minorEastAsia"/>
+        </w:rPr>
+        <w:t xml:space="preserve">. De esta manera se tuvo que hacer una refactorización; </w:t>
+      </w:r>
+      <m:oMath>
+        <m:r>
+          <w:rPr>
+            <w:rFonts w:ascii="Cambria Math" w:eastAsiaTheme="minorEastAsia" w:hAnsi="Cambria Math"/>
+          </w:rPr>
+          <m:t>Statistics</m:t>
+        </m:r>
+      </m:oMath>
+      <w:r>
+        <w:rPr>
+          <w:rFonts w:eastAsiaTheme="minorEastAsia"/>
+        </w:rPr>
+        <w:t xml:space="preserve"> deja de ser atributo de </w:t>
+      </w:r>
+      <m:oMath>
+        <m:r>
+          <w:rPr>
+            <w:rFonts w:ascii="Cambria Math" w:eastAsiaTheme="minorEastAsia" w:hAnsi="Cambria Math"/>
+          </w:rPr>
+          <m:t>Server</m:t>
+        </m:r>
+      </m:oMath>
+      <w:r>
+        <w:rPr>
+          <w:rFonts w:eastAsiaTheme="minorEastAsia"/>
+        </w:rPr>
+        <w:t xml:space="preserve">, por lo que no se requiere el patrón de diseño Factory en su asociación, y pasa ser atributo de </w:t>
+      </w:r>
+      <m:oMath>
+        <m:r>
+          <w:rPr>
+            <w:rFonts w:ascii="Cambria Math" w:eastAsiaTheme="minorEastAsia" w:hAnsi="Cambria Math"/>
+          </w:rPr>
+          <m:t>Bootstrapping</m:t>
+        </m:r>
+      </m:oMath>
+      <w:r>
+        <w:rPr>
+          <w:rFonts w:eastAsiaTheme="minorEastAsia"/>
+        </w:rPr>
+        <w:t>.</w:t>
       </w:r>
     </w:p>
     <w:p>
@@ -3908,7 +5121,45 @@
         </w:numPr>
       </w:pPr>
       <w:r>
-        <w:t>Inicialmente habíamos asumido que los tiempos de espera y tránsito eran atributos del servidor. Esto resultó incorrecto y nos llevó a mover la subclase Idle, encargada del seguimiento de tiempo ocioso, como un atributo directamente vinculado a la clase Server, mejorando así la coherencia del modelo.</w:t>
+        <w:t xml:space="preserve">Inicialmente habíamos asumido que los tiempos de espera y tránsito eran atributos del servidor. </w:t>
+      </w:r>
+      <w:r>
+        <w:t>Dado al análisis anterior, advertimos que e</w:t>
+      </w:r>
+      <w:r>
+        <w:t>sto resultó incorrecto</w:t>
+      </w:r>
+      <w:r>
+        <w:t>,</w:t>
+      </w:r>
+      <w:r>
+        <w:t xml:space="preserve"> </w:t>
+      </w:r>
+      <w:r>
+        <w:t>lo que</w:t>
+      </w:r>
+      <w:r>
+        <w:t xml:space="preserve"> </w:t>
+      </w:r>
+      <w:r>
+        <w:t>implico</w:t>
+      </w:r>
+      <w:r>
+        <w:t xml:space="preserve"> mover la subclase </w:t>
+      </w:r>
+      <m:oMath>
+        <m:r>
+          <w:rPr>
+            <w:rFonts w:ascii="Cambria Math" w:hAnsi="Cambria Math"/>
+          </w:rPr>
+          <m:t>Idle</m:t>
+        </m:r>
+      </m:oMath>
+      <w:r>
+        <w:t xml:space="preserve"> como un atributo directamente vinculado a la clase Server, </w:t>
+      </w:r>
+      <w:r>
+        <w:t>resultando en un modelo más correcto.</w:t>
       </w:r>
     </w:p>
     <w:p>
@@ -3919,11 +5170,7 @@
         </w:numPr>
       </w:pPr>
       <w:r>
-        <w:t xml:space="preserve">Para aplicar una mejora estructural sobre la asignación de servidores, nos basamos en una hipótesis: si al elegir qué servidor asignar se prioriza aquel que se desocupa primero, en lugar de seleccionar simplemente por ID, podríamos </w:t>
-      </w:r>
-      <w:r>
-        <w:lastRenderedPageBreak/>
-        <w:t xml:space="preserve">equilibrar la carga de trabajo. Para esto, introdujimos el atributo </w:t>
+        <w:t xml:space="preserve">Para aplicar una mejora estructural sobre la asignación de servidores, nos basamos en una hipótesis: si al elegir qué servidor asignar se prioriza aquel que se desocupa primero, en lugar de seleccionar simplemente por ID, podríamos equilibrar la carga de trabajo. Para esto, introdujimos el atributo </w:t>
       </w:r>
       <m:oMath>
         <m:r>
@@ -3945,20 +5192,140 @@
         </w:numPr>
       </w:pPr>
       <w:r>
-        <w:t>Para calcular los intervalos de confianza de cada estadística, integramos programación funcional en Java (lambdas y streams), lo que mejoró considerablemente la legibilidad, eficiencia y concisión del código. Esta mejora se extendió también a clases de etapas previas, como los Comparators, donde aplicamos funciones lambda para simplificar la lógica de ordenamiento de eventos y selección de servidores.</w:t>
+        <w:t>Para calcular los intervalos de confianza de cada estadística, integramos programación funcional en Java (lambdas y streams), lo que mejoró considerablemente la legibilidad, eficiencia y concisión del código. Esta mejora se extendió también a clases de etapas previas, como los Comparators, donde aplicamos funciones lambda para simplificar la lógica de ordenamiento de eventos y selección de servidores</w:t>
+      </w:r>
+      <w:r>
+        <w:t>.</w:t>
+      </w:r>
+    </w:p>
+    <w:p>
+      <w:r>
+        <w:t>Agregar :</w:t>
+      </w:r>
+    </w:p>
+    <w:p>
+      <w:pPr>
+        <w:pStyle w:val="ListParagraph"/>
+        <w:numPr>
+          <w:ilvl w:val="0"/>
+          <w:numId w:val="15"/>
+        </w:numPr>
+      </w:pPr>
+      <w:r>
+        <w:t>Distribution List , DistributionAccumulator</w:t>
+      </w:r>
+    </w:p>
+    <w:p>
+      <w:pPr>
+        <w:pStyle w:val="ListParagraph"/>
+        <w:numPr>
+          <w:ilvl w:val="0"/>
+          <w:numId w:val="15"/>
+        </w:numPr>
+      </w:pPr>
+      <w:r>
+        <w:lastRenderedPageBreak/>
+        <w:t>EventFactory (razón)</w:t>
+      </w:r>
+    </w:p>
+    <w:p>
+      <w:pPr>
+        <w:pStyle w:val="ListParagraph"/>
+        <w:numPr>
+          <w:ilvl w:val="0"/>
+          <w:numId w:val="15"/>
+        </w:numPr>
+      </w:pPr>
+      <w:r>
+        <w:t>Parameter, StatisticsAnalysis</w:t>
+      </w:r>
+    </w:p>
+    <w:p>
+      <w:pPr>
+        <w:pStyle w:val="ListParagraph"/>
+        <w:numPr>
+          <w:ilvl w:val="0"/>
+          <w:numId w:val="15"/>
+        </w:numPr>
+      </w:pPr>
+      <w:r>
+        <w:t>Mostrar comparación, y mejora</w:t>
+      </w:r>
+    </w:p>
+    <w:p>
+      <w:pPr>
+        <w:pStyle w:val="ListParagraph"/>
+        <w:numPr>
+          <w:ilvl w:val="0"/>
+          <w:numId w:val="15"/>
+        </w:numPr>
+      </w:pPr>
+      <w:r>
+        <w:t>Etapa 2: configuración para que una entidad no espere mas de dos horas</w:t>
+      </w:r>
+    </w:p>
+    <w:p>
+      <w:pPr>
+        <w:pStyle w:val="ListParagraph"/>
+        <w:numPr>
+          <w:ilvl w:val="0"/>
+          <w:numId w:val="15"/>
+        </w:numPr>
+      </w:pPr>
+      <w:r>
+        <w:t>Etapa 1: tests</w:t>
       </w:r>
     </w:p>
     <w:p>
       <w:r>
         <w:pict w14:anchorId="0594FD9A">
-          <v:rect id="_x0000_i1033" style="width:0;height:1.5pt" o:hralign="center" o:hrstd="t" o:hr="t" fillcolor="#a0a0a0" stroked="f"/>
+          <v:rect id="_x0000_i1035" style="width:0;height:1.5pt" o:hralign="center" o:hrstd="t" o:hr="t" fillcolor="#a0a0a0" stroked="f"/>
         </w:pict>
       </w:r>
     </w:p>
     <w:p>
       <w:pPr>
-        <w:jc w:val="left"/>
-      </w:pPr>
+        <w:pStyle w:val="Title"/>
+      </w:pPr>
+      <w:r>
+        <w:t>Conclusión</w:t>
+      </w:r>
+    </w:p>
+    <w:p>
+      <w:pPr>
+        <w:numPr>
+          <w:ilvl w:val="0"/>
+          <w:numId w:val="4"/>
+        </w:numPr>
+      </w:pPr>
+      <w:r>
+        <w:t>Incorporamos por primera vez en nuestra forma de codificar los principios S.O.L.I.D.,</w:t>
+      </w:r>
+      <w:r>
+        <w:t xml:space="preserve"> permitiéndonos</w:t>
+      </w:r>
+      <w:r>
+        <w:t xml:space="preserve"> apreciar sus beneficios en la mantenibilidad, cohesión y extensibilidad del simulador</w:t>
+      </w:r>
+      <w:r>
+        <w:t>.</w:t>
+      </w:r>
+    </w:p>
+    <w:p>
+      <w:pPr>
+        <w:numPr>
+          <w:ilvl w:val="0"/>
+          <w:numId w:val="4"/>
+        </w:numPr>
+      </w:pPr>
+      <w:r>
+        <w:t>En conjunto, consideramos que esta primera etapa nos proporcionó una experiencia valiosa que sin duda enriquecerá nuestro desarrollo profesional en simulación y diseño de software</w:t>
+      </w:r>
+      <w:r>
+        <w:t>.</w:t>
+      </w:r>
+    </w:p>
+    <w:p>
       <w:r>
         <w:br w:type="page"/>
       </w:r>
@@ -4315,8 +5682,8 @@
     </w:sdt>
     <w:p/>
     <w:sectPr>
-      <w:headerReference w:type="default" r:id="rId15"/>
-      <w:footerReference w:type="default" r:id="rId16"/>
+      <w:headerReference w:type="default" r:id="rId16"/>
+      <w:footerReference w:type="default" r:id="rId17"/>
       <w:pgSz w:w="11906" w:h="16838"/>
       <w:pgMar w:top="1440" w:right="1440" w:bottom="1440" w:left="1440" w:header="708" w:footer="708" w:gutter="0"/>
       <w:pgNumType w:start="0"/>
@@ -4454,6 +5821,99 @@
     <w:p>
       <w:pPr>
         <w:pStyle w:val="FootnoteText"/>
+      </w:pPr>
+      <w:r>
+        <w:rPr>
+          <w:rStyle w:val="FootnoteReference"/>
+        </w:rPr>
+        <w:footnoteRef/>
+      </w:r>
+      <w:r>
+        <w:t xml:space="preserve"> </w:t>
+      </w:r>
+      <m:oMath>
+        <m:r>
+          <w:rPr>
+            <w:rFonts w:ascii="Cambria Math" w:hAnsi="Cambria Math"/>
+          </w:rPr>
+          <m:t>Wait</m:t>
+        </m:r>
+      </m:oMath>
+      <w:r>
+        <w:t xml:space="preserve"> y </w:t>
+      </w:r>
+      <m:oMath>
+        <m:r>
+          <w:rPr>
+            <w:rFonts w:ascii="Cambria Math" w:hAnsi="Cambria Math"/>
+          </w:rPr>
+          <m:t>Transit</m:t>
+        </m:r>
+      </m:oMath>
+      <w:r>
+        <w:t xml:space="preserve"> corresponden al tiempo de espera y tránsito, respectivamente, de la entidad en el sistema. </w:t>
+      </w:r>
+      <m:oMath>
+        <m:r>
+          <w:rPr>
+            <w:rFonts w:ascii="Cambria Math" w:hAnsi="Cambria Math"/>
+          </w:rPr>
+          <m:t>Idle</m:t>
+        </m:r>
+      </m:oMath>
+      <w:r>
+        <w:t xml:space="preserve"> es el tiempo ocioso del recurso (</w:t>
+      </w:r>
+      <m:oMath>
+        <m:r>
+          <w:rPr>
+            <w:rFonts w:ascii="Cambria Math" w:hAnsi="Cambria Math"/>
+          </w:rPr>
+          <m:t>Server</m:t>
+        </m:r>
+      </m:oMath>
+      <w:r>
+        <w:t xml:space="preserve">). </w:t>
+      </w:r>
+    </w:p>
+  </w:footnote>
+  <w:footnote w:id="2">
+    <w:p>
+      <w:pPr>
+        <w:pStyle w:val="FootnoteText"/>
+        <w:rPr>
+          <w:lang w:val="es-ES"/>
+        </w:rPr>
+      </w:pPr>
+      <w:r>
+        <w:rPr>
+          <w:rStyle w:val="FootnoteReference"/>
+        </w:rPr>
+        <w:footnoteRef/>
+      </w:r>
+      <w:r>
+        <w:t xml:space="preserve"> </w:t>
+      </w:r>
+      <m:oMath>
+        <m:r>
+          <w:rPr>
+            <w:rFonts w:ascii="Cambria Math" w:hAnsi="Cambria Math"/>
+          </w:rPr>
+          <m:t>Distribution</m:t>
+        </m:r>
+      </m:oMath>
+      <w:r>
+        <w:rPr>
+          <w:rFonts w:eastAsiaTheme="minorEastAsia"/>
+        </w:rPr>
+        <w:t xml:space="preserve"> es una interfaz que especifica el comportamiento que deberá tener una distribución específica de la clase que la implemente.</w:t>
+      </w:r>
+    </w:p>
+  </w:footnote>
+  <w:footnote w:id="3">
+    <w:p>
+      <w:pPr>
+        <w:pStyle w:val="FootnoteText"/>
         <w:rPr>
           <w:lang w:val="es-ES"/>
         </w:rPr>
@@ -4483,7 +5943,7 @@
       </w:r>
     </w:p>
   </w:footnote>
-  <w:footnote w:id="2">
+  <w:footnote w:id="4">
     <w:p>
       <w:pPr>
         <w:pStyle w:val="FootnoteText"/>
@@ -4496,9 +5956,6 @@
           <w:rStyle w:val="FootnoteReference"/>
         </w:rPr>
         <w:footnoteRef/>
-      </w:r>
-      <w:r>
-        <w:t xml:space="preserve"> </w:t>
       </w:r>
       <m:oMath>
         <m:r>
@@ -4513,45 +5970,6 @@
           <w:rFonts w:eastAsiaTheme="minorEastAsia"/>
         </w:rPr>
         <w:t xml:space="preserve"> se encarga de permitir la creación de clases que implementan distribuciones dinámicas.</w:t>
-      </w:r>
-    </w:p>
-  </w:footnote>
-  <w:footnote w:id="3">
-    <w:p>
-      <w:pPr>
-        <w:pStyle w:val="FootnoteText"/>
-        <w:rPr>
-          <w:lang w:val="es-ES"/>
-        </w:rPr>
-      </w:pPr>
-      <w:r>
-        <w:rPr>
-          <w:rStyle w:val="FootnoteReference"/>
-        </w:rPr>
-        <w:footnoteRef/>
-      </w:r>
-      <w:r>
-        <w:t xml:space="preserve"> </w:t>
-      </w:r>
-      <m:oMath>
-        <m:r>
-          <w:rPr>
-            <w:rFonts w:ascii="Cambria Math" w:hAnsi="Cambria Math"/>
-          </w:rPr>
-          <m:t>Distribution</m:t>
-        </m:r>
-      </m:oMath>
-      <w:r>
-        <w:rPr>
-          <w:rFonts w:eastAsiaTheme="minorEastAsia"/>
-        </w:rPr>
-        <w:t xml:space="preserve"> es una interfaz que especifica el comportamiento que deberá tener una distribución específica </w:t>
-      </w:r>
-      <w:r>
-        <w:rPr>
-          <w:rFonts w:eastAsiaTheme="minorEastAsia"/>
-        </w:rPr>
-        <w:t>de la clase que la implemente.</w:t>
       </w:r>
     </w:p>
   </w:footnote>
@@ -5557,6 +6975,268 @@
     </w:lvl>
   </w:abstractNum>
   <w:abstractNum w:abstractNumId="7" w15:restartNumberingAfterBreak="0">
+    <w:nsid w:val="50EB136C"/>
+    <w:multiLevelType w:val="hybridMultilevel"/>
+    <w:tmpl w:val="89B43F14"/>
+    <w:lvl w:ilvl="0" w:tplc="04090001">
+      <w:start w:val="1"/>
+      <w:numFmt w:val="bullet"/>
+      <w:lvlText w:val=""/>
+      <w:lvlJc w:val="left"/>
+      <w:pPr>
+        <w:ind w:left="720" w:hanging="360"/>
+      </w:pPr>
+      <w:rPr>
+        <w:rFonts w:ascii="Symbol" w:hAnsi="Symbol" w:hint="default"/>
+      </w:rPr>
+    </w:lvl>
+    <w:lvl w:ilvl="1" w:tplc="04090003" w:tentative="1">
+      <w:start w:val="1"/>
+      <w:numFmt w:val="bullet"/>
+      <w:lvlText w:val="o"/>
+      <w:lvlJc w:val="left"/>
+      <w:pPr>
+        <w:ind w:left="1440" w:hanging="360"/>
+      </w:pPr>
+      <w:rPr>
+        <w:rFonts w:ascii="Courier New" w:hAnsi="Courier New" w:cs="Courier New" w:hint="default"/>
+      </w:rPr>
+    </w:lvl>
+    <w:lvl w:ilvl="2" w:tplc="04090005" w:tentative="1">
+      <w:start w:val="1"/>
+      <w:numFmt w:val="bullet"/>
+      <w:lvlText w:val=""/>
+      <w:lvlJc w:val="left"/>
+      <w:pPr>
+        <w:ind w:left="2160" w:hanging="360"/>
+      </w:pPr>
+      <w:rPr>
+        <w:rFonts w:ascii="Wingdings" w:hAnsi="Wingdings" w:hint="default"/>
+      </w:rPr>
+    </w:lvl>
+    <w:lvl w:ilvl="3" w:tplc="04090001" w:tentative="1">
+      <w:start w:val="1"/>
+      <w:numFmt w:val="bullet"/>
+      <w:lvlText w:val=""/>
+      <w:lvlJc w:val="left"/>
+      <w:pPr>
+        <w:ind w:left="2880" w:hanging="360"/>
+      </w:pPr>
+      <w:rPr>
+        <w:rFonts w:ascii="Symbol" w:hAnsi="Symbol" w:hint="default"/>
+      </w:rPr>
+    </w:lvl>
+    <w:lvl w:ilvl="4" w:tplc="04090003" w:tentative="1">
+      <w:start w:val="1"/>
+      <w:numFmt w:val="bullet"/>
+      <w:lvlText w:val="o"/>
+      <w:lvlJc w:val="left"/>
+      <w:pPr>
+        <w:ind w:left="3600" w:hanging="360"/>
+      </w:pPr>
+      <w:rPr>
+        <w:rFonts w:ascii="Courier New" w:hAnsi="Courier New" w:cs="Courier New" w:hint="default"/>
+      </w:rPr>
+    </w:lvl>
+    <w:lvl w:ilvl="5" w:tplc="04090005" w:tentative="1">
+      <w:start w:val="1"/>
+      <w:numFmt w:val="bullet"/>
+      <w:lvlText w:val=""/>
+      <w:lvlJc w:val="left"/>
+      <w:pPr>
+        <w:ind w:left="4320" w:hanging="360"/>
+      </w:pPr>
+      <w:rPr>
+        <w:rFonts w:ascii="Wingdings" w:hAnsi="Wingdings" w:hint="default"/>
+      </w:rPr>
+    </w:lvl>
+    <w:lvl w:ilvl="6" w:tplc="04090001" w:tentative="1">
+      <w:start w:val="1"/>
+      <w:numFmt w:val="bullet"/>
+      <w:lvlText w:val=""/>
+      <w:lvlJc w:val="left"/>
+      <w:pPr>
+        <w:ind w:left="5040" w:hanging="360"/>
+      </w:pPr>
+      <w:rPr>
+        <w:rFonts w:ascii="Symbol" w:hAnsi="Symbol" w:hint="default"/>
+      </w:rPr>
+    </w:lvl>
+    <w:lvl w:ilvl="7" w:tplc="04090003" w:tentative="1">
+      <w:start w:val="1"/>
+      <w:numFmt w:val="bullet"/>
+      <w:lvlText w:val="o"/>
+      <w:lvlJc w:val="left"/>
+      <w:pPr>
+        <w:ind w:left="5760" w:hanging="360"/>
+      </w:pPr>
+      <w:rPr>
+        <w:rFonts w:ascii="Courier New" w:hAnsi="Courier New" w:cs="Courier New" w:hint="default"/>
+      </w:rPr>
+    </w:lvl>
+    <w:lvl w:ilvl="8" w:tplc="04090005" w:tentative="1">
+      <w:start w:val="1"/>
+      <w:numFmt w:val="bullet"/>
+      <w:lvlText w:val=""/>
+      <w:lvlJc w:val="left"/>
+      <w:pPr>
+        <w:ind w:left="6480" w:hanging="360"/>
+      </w:pPr>
+      <w:rPr>
+        <w:rFonts w:ascii="Wingdings" w:hAnsi="Wingdings" w:hint="default"/>
+      </w:rPr>
+    </w:lvl>
+  </w:abstractNum>
+  <w:abstractNum w:abstractNumId="8" w15:restartNumberingAfterBreak="0">
+    <w:nsid w:val="54713B5E"/>
+    <w:multiLevelType w:val="multilevel"/>
+    <w:tmpl w:val="9970E91C"/>
+    <w:lvl w:ilvl="0">
+      <w:start w:val="1"/>
+      <w:numFmt w:val="bullet"/>
+      <w:lvlText w:val=""/>
+      <w:lvlJc w:val="left"/>
+      <w:pPr>
+        <w:tabs>
+          <w:tab w:val="num" w:pos="720"/>
+        </w:tabs>
+        <w:ind w:left="720" w:hanging="360"/>
+      </w:pPr>
+      <w:rPr>
+        <w:rFonts w:ascii="Symbol" w:hAnsi="Symbol" w:hint="default"/>
+        <w:sz w:val="20"/>
+      </w:rPr>
+    </w:lvl>
+    <w:lvl w:ilvl="1" w:tentative="1">
+      <w:start w:val="1"/>
+      <w:numFmt w:val="bullet"/>
+      <w:lvlText w:val="o"/>
+      <w:lvlJc w:val="left"/>
+      <w:pPr>
+        <w:tabs>
+          <w:tab w:val="num" w:pos="1440"/>
+        </w:tabs>
+        <w:ind w:left="1440" w:hanging="360"/>
+      </w:pPr>
+      <w:rPr>
+        <w:rFonts w:ascii="Courier New" w:hAnsi="Courier New" w:hint="default"/>
+        <w:sz w:val="20"/>
+      </w:rPr>
+    </w:lvl>
+    <w:lvl w:ilvl="2" w:tentative="1">
+      <w:start w:val="1"/>
+      <w:numFmt w:val="bullet"/>
+      <w:lvlText w:val=""/>
+      <w:lvlJc w:val="left"/>
+      <w:pPr>
+        <w:tabs>
+          <w:tab w:val="num" w:pos="2160"/>
+        </w:tabs>
+        <w:ind w:left="2160" w:hanging="360"/>
+      </w:pPr>
+      <w:rPr>
+        <w:rFonts w:ascii="Wingdings" w:hAnsi="Wingdings" w:hint="default"/>
+        <w:sz w:val="20"/>
+      </w:rPr>
+    </w:lvl>
+    <w:lvl w:ilvl="3" w:tentative="1">
+      <w:start w:val="1"/>
+      <w:numFmt w:val="bullet"/>
+      <w:lvlText w:val=""/>
+      <w:lvlJc w:val="left"/>
+      <w:pPr>
+        <w:tabs>
+          <w:tab w:val="num" w:pos="2880"/>
+        </w:tabs>
+        <w:ind w:left="2880" w:hanging="360"/>
+      </w:pPr>
+      <w:rPr>
+        <w:rFonts w:ascii="Wingdings" w:hAnsi="Wingdings" w:hint="default"/>
+        <w:sz w:val="20"/>
+      </w:rPr>
+    </w:lvl>
+    <w:lvl w:ilvl="4" w:tentative="1">
+      <w:start w:val="1"/>
+      <w:numFmt w:val="bullet"/>
+      <w:lvlText w:val=""/>
+      <w:lvlJc w:val="left"/>
+      <w:pPr>
+        <w:tabs>
+          <w:tab w:val="num" w:pos="3600"/>
+        </w:tabs>
+        <w:ind w:left="3600" w:hanging="360"/>
+      </w:pPr>
+      <w:rPr>
+        <w:rFonts w:ascii="Wingdings" w:hAnsi="Wingdings" w:hint="default"/>
+        <w:sz w:val="20"/>
+      </w:rPr>
+    </w:lvl>
+    <w:lvl w:ilvl="5" w:tentative="1">
+      <w:start w:val="1"/>
+      <w:numFmt w:val="bullet"/>
+      <w:lvlText w:val=""/>
+      <w:lvlJc w:val="left"/>
+      <w:pPr>
+        <w:tabs>
+          <w:tab w:val="num" w:pos="4320"/>
+        </w:tabs>
+        <w:ind w:left="4320" w:hanging="360"/>
+      </w:pPr>
+      <w:rPr>
+        <w:rFonts w:ascii="Wingdings" w:hAnsi="Wingdings" w:hint="default"/>
+        <w:sz w:val="20"/>
+      </w:rPr>
+    </w:lvl>
+    <w:lvl w:ilvl="6" w:tentative="1">
+      <w:start w:val="1"/>
+      <w:numFmt w:val="bullet"/>
+      <w:lvlText w:val=""/>
+      <w:lvlJc w:val="left"/>
+      <w:pPr>
+        <w:tabs>
+          <w:tab w:val="num" w:pos="5040"/>
+        </w:tabs>
+        <w:ind w:left="5040" w:hanging="360"/>
+      </w:pPr>
+      <w:rPr>
+        <w:rFonts w:ascii="Wingdings" w:hAnsi="Wingdings" w:hint="default"/>
+        <w:sz w:val="20"/>
+      </w:rPr>
+    </w:lvl>
+    <w:lvl w:ilvl="7" w:tentative="1">
+      <w:start w:val="1"/>
+      <w:numFmt w:val="bullet"/>
+      <w:lvlText w:val=""/>
+      <w:lvlJc w:val="left"/>
+      <w:pPr>
+        <w:tabs>
+          <w:tab w:val="num" w:pos="5760"/>
+        </w:tabs>
+        <w:ind w:left="5760" w:hanging="360"/>
+      </w:pPr>
+      <w:rPr>
+        <w:rFonts w:ascii="Wingdings" w:hAnsi="Wingdings" w:hint="default"/>
+        <w:sz w:val="20"/>
+      </w:rPr>
+    </w:lvl>
+    <w:lvl w:ilvl="8" w:tentative="1">
+      <w:start w:val="1"/>
+      <w:numFmt w:val="bullet"/>
+      <w:lvlText w:val=""/>
+      <w:lvlJc w:val="left"/>
+      <w:pPr>
+        <w:tabs>
+          <w:tab w:val="num" w:pos="6480"/>
+        </w:tabs>
+        <w:ind w:left="6480" w:hanging="360"/>
+      </w:pPr>
+      <w:rPr>
+        <w:rFonts w:ascii="Wingdings" w:hAnsi="Wingdings" w:hint="default"/>
+        <w:sz w:val="20"/>
+      </w:rPr>
+    </w:lvl>
+  </w:abstractNum>
+  <w:abstractNum w:abstractNumId="9" w15:restartNumberingAfterBreak="0">
     <w:nsid w:val="559911F5"/>
     <w:multiLevelType w:val="multilevel"/>
     <w:tmpl w:val="2F229F9E"/>
@@ -5705,7 +7385,7 @@
       </w:rPr>
     </w:lvl>
   </w:abstractNum>
-  <w:abstractNum w:abstractNumId="8" w15:restartNumberingAfterBreak="0">
+  <w:abstractNum w:abstractNumId="10" w15:restartNumberingAfterBreak="0">
     <w:nsid w:val="63132EC2"/>
     <w:multiLevelType w:val="multilevel"/>
     <w:tmpl w:val="09183478"/>
@@ -5854,7 +7534,269 @@
       </w:rPr>
     </w:lvl>
   </w:abstractNum>
-  <w:abstractNum w:abstractNumId="9" w15:restartNumberingAfterBreak="0">
+  <w:abstractNum w:abstractNumId="11" w15:restartNumberingAfterBreak="0">
+    <w:nsid w:val="6AAA38BC"/>
+    <w:multiLevelType w:val="hybridMultilevel"/>
+    <w:tmpl w:val="93EC71D6"/>
+    <w:lvl w:ilvl="0" w:tplc="04090001">
+      <w:start w:val="1"/>
+      <w:numFmt w:val="bullet"/>
+      <w:lvlText w:val=""/>
+      <w:lvlJc w:val="left"/>
+      <w:pPr>
+        <w:ind w:left="720" w:hanging="360"/>
+      </w:pPr>
+      <w:rPr>
+        <w:rFonts w:ascii="Symbol" w:hAnsi="Symbol" w:hint="default"/>
+      </w:rPr>
+    </w:lvl>
+    <w:lvl w:ilvl="1" w:tplc="04090003" w:tentative="1">
+      <w:start w:val="1"/>
+      <w:numFmt w:val="bullet"/>
+      <w:lvlText w:val="o"/>
+      <w:lvlJc w:val="left"/>
+      <w:pPr>
+        <w:ind w:left="1440" w:hanging="360"/>
+      </w:pPr>
+      <w:rPr>
+        <w:rFonts w:ascii="Courier New" w:hAnsi="Courier New" w:cs="Courier New" w:hint="default"/>
+      </w:rPr>
+    </w:lvl>
+    <w:lvl w:ilvl="2" w:tplc="04090005" w:tentative="1">
+      <w:start w:val="1"/>
+      <w:numFmt w:val="bullet"/>
+      <w:lvlText w:val=""/>
+      <w:lvlJc w:val="left"/>
+      <w:pPr>
+        <w:ind w:left="2160" w:hanging="360"/>
+      </w:pPr>
+      <w:rPr>
+        <w:rFonts w:ascii="Wingdings" w:hAnsi="Wingdings" w:hint="default"/>
+      </w:rPr>
+    </w:lvl>
+    <w:lvl w:ilvl="3" w:tplc="04090001" w:tentative="1">
+      <w:start w:val="1"/>
+      <w:numFmt w:val="bullet"/>
+      <w:lvlText w:val=""/>
+      <w:lvlJc w:val="left"/>
+      <w:pPr>
+        <w:ind w:left="2880" w:hanging="360"/>
+      </w:pPr>
+      <w:rPr>
+        <w:rFonts w:ascii="Symbol" w:hAnsi="Symbol" w:hint="default"/>
+      </w:rPr>
+    </w:lvl>
+    <w:lvl w:ilvl="4" w:tplc="04090003" w:tentative="1">
+      <w:start w:val="1"/>
+      <w:numFmt w:val="bullet"/>
+      <w:lvlText w:val="o"/>
+      <w:lvlJc w:val="left"/>
+      <w:pPr>
+        <w:ind w:left="3600" w:hanging="360"/>
+      </w:pPr>
+      <w:rPr>
+        <w:rFonts w:ascii="Courier New" w:hAnsi="Courier New" w:cs="Courier New" w:hint="default"/>
+      </w:rPr>
+    </w:lvl>
+    <w:lvl w:ilvl="5" w:tplc="04090005" w:tentative="1">
+      <w:start w:val="1"/>
+      <w:numFmt w:val="bullet"/>
+      <w:lvlText w:val=""/>
+      <w:lvlJc w:val="left"/>
+      <w:pPr>
+        <w:ind w:left="4320" w:hanging="360"/>
+      </w:pPr>
+      <w:rPr>
+        <w:rFonts w:ascii="Wingdings" w:hAnsi="Wingdings" w:hint="default"/>
+      </w:rPr>
+    </w:lvl>
+    <w:lvl w:ilvl="6" w:tplc="04090001" w:tentative="1">
+      <w:start w:val="1"/>
+      <w:numFmt w:val="bullet"/>
+      <w:lvlText w:val=""/>
+      <w:lvlJc w:val="left"/>
+      <w:pPr>
+        <w:ind w:left="5040" w:hanging="360"/>
+      </w:pPr>
+      <w:rPr>
+        <w:rFonts w:ascii="Symbol" w:hAnsi="Symbol" w:hint="default"/>
+      </w:rPr>
+    </w:lvl>
+    <w:lvl w:ilvl="7" w:tplc="04090003" w:tentative="1">
+      <w:start w:val="1"/>
+      <w:numFmt w:val="bullet"/>
+      <w:lvlText w:val="o"/>
+      <w:lvlJc w:val="left"/>
+      <w:pPr>
+        <w:ind w:left="5760" w:hanging="360"/>
+      </w:pPr>
+      <w:rPr>
+        <w:rFonts w:ascii="Courier New" w:hAnsi="Courier New" w:cs="Courier New" w:hint="default"/>
+      </w:rPr>
+    </w:lvl>
+    <w:lvl w:ilvl="8" w:tplc="04090005" w:tentative="1">
+      <w:start w:val="1"/>
+      <w:numFmt w:val="bullet"/>
+      <w:lvlText w:val=""/>
+      <w:lvlJc w:val="left"/>
+      <w:pPr>
+        <w:ind w:left="6480" w:hanging="360"/>
+      </w:pPr>
+      <w:rPr>
+        <w:rFonts w:ascii="Wingdings" w:hAnsi="Wingdings" w:hint="default"/>
+      </w:rPr>
+    </w:lvl>
+  </w:abstractNum>
+  <w:abstractNum w:abstractNumId="12" w15:restartNumberingAfterBreak="0">
+    <w:nsid w:val="6CD0250B"/>
+    <w:multiLevelType w:val="multilevel"/>
+    <w:tmpl w:val="9970E91C"/>
+    <w:lvl w:ilvl="0">
+      <w:start w:val="1"/>
+      <w:numFmt w:val="bullet"/>
+      <w:lvlText w:val=""/>
+      <w:lvlJc w:val="left"/>
+      <w:pPr>
+        <w:tabs>
+          <w:tab w:val="num" w:pos="720"/>
+        </w:tabs>
+        <w:ind w:left="720" w:hanging="360"/>
+      </w:pPr>
+      <w:rPr>
+        <w:rFonts w:ascii="Symbol" w:hAnsi="Symbol" w:hint="default"/>
+        <w:sz w:val="20"/>
+      </w:rPr>
+    </w:lvl>
+    <w:lvl w:ilvl="1" w:tentative="1">
+      <w:start w:val="1"/>
+      <w:numFmt w:val="bullet"/>
+      <w:lvlText w:val="o"/>
+      <w:lvlJc w:val="left"/>
+      <w:pPr>
+        <w:tabs>
+          <w:tab w:val="num" w:pos="1440"/>
+        </w:tabs>
+        <w:ind w:left="1440" w:hanging="360"/>
+      </w:pPr>
+      <w:rPr>
+        <w:rFonts w:ascii="Courier New" w:hAnsi="Courier New" w:hint="default"/>
+        <w:sz w:val="20"/>
+      </w:rPr>
+    </w:lvl>
+    <w:lvl w:ilvl="2" w:tentative="1">
+      <w:start w:val="1"/>
+      <w:numFmt w:val="bullet"/>
+      <w:lvlText w:val=""/>
+      <w:lvlJc w:val="left"/>
+      <w:pPr>
+        <w:tabs>
+          <w:tab w:val="num" w:pos="2160"/>
+        </w:tabs>
+        <w:ind w:left="2160" w:hanging="360"/>
+      </w:pPr>
+      <w:rPr>
+        <w:rFonts w:ascii="Wingdings" w:hAnsi="Wingdings" w:hint="default"/>
+        <w:sz w:val="20"/>
+      </w:rPr>
+    </w:lvl>
+    <w:lvl w:ilvl="3" w:tentative="1">
+      <w:start w:val="1"/>
+      <w:numFmt w:val="bullet"/>
+      <w:lvlText w:val=""/>
+      <w:lvlJc w:val="left"/>
+      <w:pPr>
+        <w:tabs>
+          <w:tab w:val="num" w:pos="2880"/>
+        </w:tabs>
+        <w:ind w:left="2880" w:hanging="360"/>
+      </w:pPr>
+      <w:rPr>
+        <w:rFonts w:ascii="Wingdings" w:hAnsi="Wingdings" w:hint="default"/>
+        <w:sz w:val="20"/>
+      </w:rPr>
+    </w:lvl>
+    <w:lvl w:ilvl="4" w:tentative="1">
+      <w:start w:val="1"/>
+      <w:numFmt w:val="bullet"/>
+      <w:lvlText w:val=""/>
+      <w:lvlJc w:val="left"/>
+      <w:pPr>
+        <w:tabs>
+          <w:tab w:val="num" w:pos="3600"/>
+        </w:tabs>
+        <w:ind w:left="3600" w:hanging="360"/>
+      </w:pPr>
+      <w:rPr>
+        <w:rFonts w:ascii="Wingdings" w:hAnsi="Wingdings" w:hint="default"/>
+        <w:sz w:val="20"/>
+      </w:rPr>
+    </w:lvl>
+    <w:lvl w:ilvl="5" w:tentative="1">
+      <w:start w:val="1"/>
+      <w:numFmt w:val="bullet"/>
+      <w:lvlText w:val=""/>
+      <w:lvlJc w:val="left"/>
+      <w:pPr>
+        <w:tabs>
+          <w:tab w:val="num" w:pos="4320"/>
+        </w:tabs>
+        <w:ind w:left="4320" w:hanging="360"/>
+      </w:pPr>
+      <w:rPr>
+        <w:rFonts w:ascii="Wingdings" w:hAnsi="Wingdings" w:hint="default"/>
+        <w:sz w:val="20"/>
+      </w:rPr>
+    </w:lvl>
+    <w:lvl w:ilvl="6" w:tentative="1">
+      <w:start w:val="1"/>
+      <w:numFmt w:val="bullet"/>
+      <w:lvlText w:val=""/>
+      <w:lvlJc w:val="left"/>
+      <w:pPr>
+        <w:tabs>
+          <w:tab w:val="num" w:pos="5040"/>
+        </w:tabs>
+        <w:ind w:left="5040" w:hanging="360"/>
+      </w:pPr>
+      <w:rPr>
+        <w:rFonts w:ascii="Wingdings" w:hAnsi="Wingdings" w:hint="default"/>
+        <w:sz w:val="20"/>
+      </w:rPr>
+    </w:lvl>
+    <w:lvl w:ilvl="7" w:tentative="1">
+      <w:start w:val="1"/>
+      <w:numFmt w:val="bullet"/>
+      <w:lvlText w:val=""/>
+      <w:lvlJc w:val="left"/>
+      <w:pPr>
+        <w:tabs>
+          <w:tab w:val="num" w:pos="5760"/>
+        </w:tabs>
+        <w:ind w:left="5760" w:hanging="360"/>
+      </w:pPr>
+      <w:rPr>
+        <w:rFonts w:ascii="Wingdings" w:hAnsi="Wingdings" w:hint="default"/>
+        <w:sz w:val="20"/>
+      </w:rPr>
+    </w:lvl>
+    <w:lvl w:ilvl="8" w:tentative="1">
+      <w:start w:val="1"/>
+      <w:numFmt w:val="bullet"/>
+      <w:lvlText w:val=""/>
+      <w:lvlJc w:val="left"/>
+      <w:pPr>
+        <w:tabs>
+          <w:tab w:val="num" w:pos="6480"/>
+        </w:tabs>
+        <w:ind w:left="6480" w:hanging="360"/>
+      </w:pPr>
+      <w:rPr>
+        <w:rFonts w:ascii="Wingdings" w:hAnsi="Wingdings" w:hint="default"/>
+        <w:sz w:val="20"/>
+      </w:rPr>
+    </w:lvl>
+  </w:abstractNum>
+  <w:abstractNum w:abstractNumId="13" w15:restartNumberingAfterBreak="0">
     <w:nsid w:val="70316450"/>
     <w:multiLevelType w:val="multilevel"/>
     <w:tmpl w:val="527E0A22"/>
@@ -6004,7 +7946,7 @@
       </w:rPr>
     </w:lvl>
   </w:abstractNum>
-  <w:abstractNum w:abstractNumId="10" w15:restartNumberingAfterBreak="0">
+  <w:abstractNum w:abstractNumId="14" w15:restartNumberingAfterBreak="0">
     <w:nsid w:val="7E3C0F51"/>
     <w:multiLevelType w:val="multilevel"/>
     <w:tmpl w:val="9970E91C"/>
@@ -6157,7 +8099,7 @@
     <w:abstractNumId w:val="1"/>
   </w:num>
   <w:num w:numId="2" w16cid:durableId="368578185">
-    <w:abstractNumId w:val="8"/>
+    <w:abstractNumId w:val="10"/>
   </w:num>
   <w:num w:numId="3" w16cid:durableId="559173962">
     <w:abstractNumId w:val="0"/>
@@ -6172,19 +8114,31 @@
     <w:abstractNumId w:val="6"/>
   </w:num>
   <w:num w:numId="7" w16cid:durableId="940576598">
+    <w:abstractNumId w:val="13"/>
+  </w:num>
+  <w:num w:numId="8" w16cid:durableId="2020084199">
     <w:abstractNumId w:val="9"/>
   </w:num>
-  <w:num w:numId="8" w16cid:durableId="2020084199">
-    <w:abstractNumId w:val="7"/>
-  </w:num>
   <w:num w:numId="9" w16cid:durableId="1142383382">
-    <w:abstractNumId w:val="10"/>
+    <w:abstractNumId w:val="14"/>
   </w:num>
   <w:num w:numId="10" w16cid:durableId="1281377237">
     <w:abstractNumId w:val="5"/>
   </w:num>
   <w:num w:numId="11" w16cid:durableId="1664237672">
     <w:abstractNumId w:val="3"/>
+  </w:num>
+  <w:num w:numId="12" w16cid:durableId="1041053922">
+    <w:abstractNumId w:val="11"/>
+  </w:num>
+  <w:num w:numId="13" w16cid:durableId="261840660">
+    <w:abstractNumId w:val="7"/>
+  </w:num>
+  <w:num w:numId="14" w16cid:durableId="929434079">
+    <w:abstractNumId w:val="12"/>
+  </w:num>
+  <w:num w:numId="15" w16cid:durableId="280382510">
+    <w:abstractNumId w:val="8"/>
   </w:num>
 </w:numbering>
 </file>
@@ -7392,6 +9346,45 @@
       <w:vertAlign w:val="superscript"/>
     </w:rPr>
   </w:style>
+  <w:style w:type="paragraph" w:styleId="EndnoteText">
+    <w:name w:val="endnote text"/>
+    <w:basedOn w:val="Normal"/>
+    <w:link w:val="EndnoteTextChar"/>
+    <w:uiPriority w:val="99"/>
+    <w:semiHidden/>
+    <w:unhideWhenUsed/>
+    <w:rsid w:val="004E6E54"/>
+    <w:pPr>
+      <w:spacing w:after="0" w:line="240" w:lineRule="auto"/>
+    </w:pPr>
+    <w:rPr>
+      <w:sz w:val="20"/>
+      <w:szCs w:val="20"/>
+    </w:rPr>
+  </w:style>
+  <w:style w:type="character" w:customStyle="1" w:styleId="EndnoteTextChar">
+    <w:name w:val="Endnote Text Char"/>
+    <w:basedOn w:val="DefaultParagraphFont"/>
+    <w:link w:val="EndnoteText"/>
+    <w:uiPriority w:val="99"/>
+    <w:semiHidden/>
+    <w:rsid w:val="004E6E54"/>
+    <w:rPr>
+      <w:sz w:val="20"/>
+      <w:szCs w:val="20"/>
+    </w:rPr>
+  </w:style>
+  <w:style w:type="character" w:styleId="EndnoteReference">
+    <w:name w:val="endnote reference"/>
+    <w:basedOn w:val="DefaultParagraphFont"/>
+    <w:uiPriority w:val="99"/>
+    <w:semiHidden/>
+    <w:unhideWhenUsed/>
+    <w:rsid w:val="004E6E54"/>
+    <w:rPr>
+      <w:vertAlign w:val="superscript"/>
+    </w:rPr>
+  </w:style>
 </w:styles>
 </file>
 
@@ -7557,10 +9550,13 @@
   </w:compat>
   <w:rsids>
     <w:rsidRoot w:val="00F01BA3"/>
+    <w:rsid w:val="00060BB7"/>
     <w:rsid w:val="002F77C9"/>
     <w:rsid w:val="00495A74"/>
     <w:rsid w:val="0085071F"/>
     <w:rsid w:val="00914371"/>
+    <w:rsid w:val="00986A60"/>
+    <w:rsid w:val="00AA60BC"/>
     <w:rsid w:val="00AC622D"/>
     <w:rsid w:val="00AD37F4"/>
     <w:rsid w:val="00B43B45"/>
@@ -8037,7 +10033,7 @@
     <w:basedOn w:val="DefaultParagraphFont"/>
     <w:uiPriority w:val="99"/>
     <w:semiHidden/>
-    <w:rsid w:val="00F57ECA"/>
+    <w:rsid w:val="00060BB7"/>
     <w:rPr>
       <w:color w:val="666666"/>
     </w:rPr>
@@ -8375,7 +10371,7 @@
     <b:MonthAccessed>Abril</b:MonthAccessed>
     <b:URL>https://www.digitalocean.com/community/conceptual-articles/s-o-l-i-d-the-first-five-principles-of-object-oriented-design</b:URL>
     <b:ProductionCompany>DigitalOcean</b:ProductionCompany>
-    <b:RefOrder>1</b:RefOrder>
+    <b:RefOrder>2</b:RefOrder>
   </b:Source>
   <b:Source>
     <b:Tag>Gee252</b:Tag>
@@ -8393,7 +10389,7 @@
     <b:YearAccessed>2025</b:YearAccessed>
     <b:MonthAccessed>Abril</b:MonthAccessed>
     <b:URL>https://www.geeksforgeeks.org/system-design/software-design-patterns/</b:URL>
-    <b:RefOrder>2</b:RefOrder>
+    <b:RefOrder>3</b:RefOrder>
   </b:Source>
   <b:Source>
     <b:Tag>Kum25</b:Tag>
@@ -8417,7 +10413,7 @@
     <b:YearAccessed>2025</b:YearAccessed>
     <b:MonthAccessed>Abril</b:MonthAccessed>
     <b:URL>https://www.baeldung.com/java-functional-programming</b:URL>
-    <b:RefOrder>3</b:RefOrder>
+    <b:RefOrder>4</b:RefOrder>
   </b:Source>
   <b:Source>
     <b:Tag>Mod</b:Tag>
@@ -8429,7 +10425,7 @@
       </b:Author>
     </b:Author>
     <b:Title>Apuntes proveídos por la cátedra</b:Title>
-    <b:RefOrder>4</b:RefOrder>
+    <b:RefOrder>5</b:RefOrder>
   </b:Source>
   <b:Source>
     <b:Tag>Jer84</b:Tag>
@@ -8448,13 +10444,28 @@
     </b:Author>
     <b:Title>Discrete-Event System Simulation</b:Title>
     <b:Year>1984</b:Year>
-    <b:RefOrder>5</b:RefOrder>
+    <b:RefOrder>6</b:RefOrder>
+  </b:Source>
+  <b:Source>
+    <b:Tag>Ref25</b:Tag>
+    <b:SourceType>InternetSite</b:SourceType>
+    <b:Guid>{DD9685A6-AF5D-4940-A668-71876394AB75}</b:Guid>
+    <b:Title>Factory Method</b:Title>
+    <b:Author>
+      <b:Author>
+        <b:Corporate>Refactoring Guru</b:Corporate>
+      </b:Author>
+    </b:Author>
+    <b:YearAccessed>2025</b:YearAccessed>
+    <b:MonthAccessed>Abril</b:MonthAccessed>
+    <b:URL>https://refactoring.guru/design-patterns/factory-method</b:URL>
+    <b:RefOrder>1</b:RefOrder>
   </b:Source>
 </b:Sources>
 </file>
 
 <file path=customXml/itemProps1.xml><?xml version="1.0" encoding="utf-8"?>
-<ds:datastoreItem xmlns:ds="http://schemas.openxmlformats.org/officeDocument/2006/customXml" ds:itemID="{804DC676-AD7D-4848-B626-954EEF2B6661}">
+<ds:datastoreItem xmlns:ds="http://schemas.openxmlformats.org/officeDocument/2006/customXml" ds:itemID="{6D3406AB-2AFD-4E16-9BEF-970A514E4D12}">
   <ds:schemaRefs>
     <ds:schemaRef ds:uri="http://schemas.openxmlformats.org/officeDocument/2006/bibliography"/>
   </ds:schemaRefs>

</xml_diff>

<commit_message>
Terminar conclusión del informe y documentar código
</commit_message>
<xml_diff>
--- a/Informe Trabajo Integrador MyS.docx
+++ b/Informe Trabajo Integrador MyS.docx
@@ -179,14 +179,52 @@
                 </w:rPr>
                 <w:t xml:space="preserve">Modelos y Simulación, </w:t>
               </w:r>
+              <w:proofErr w:type="spellStart"/>
               <w:r>
                 <w:rPr>
                   <w:color w:val="1CADE4" w:themeColor="accent1"/>
                   <w:sz w:val="28"/>
                   <w:szCs w:val="28"/>
                 </w:rPr>
-                <w:t>Profs. Cristian Tissera, Danilo Labella</w:t>
+                <w:t>Profs</w:t>
               </w:r>
+              <w:proofErr w:type="spellEnd"/>
+              <w:r>
+                <w:rPr>
+                  <w:color w:val="1CADE4" w:themeColor="accent1"/>
+                  <w:sz w:val="28"/>
+                  <w:szCs w:val="28"/>
+                </w:rPr>
+                <w:t xml:space="preserve">. Cristian </w:t>
+              </w:r>
+              <w:proofErr w:type="spellStart"/>
+              <w:r>
+                <w:rPr>
+                  <w:color w:val="1CADE4" w:themeColor="accent1"/>
+                  <w:sz w:val="28"/>
+                  <w:szCs w:val="28"/>
+                </w:rPr>
+                <w:t>Tissera</w:t>
+              </w:r>
+              <w:proofErr w:type="spellEnd"/>
+              <w:r>
+                <w:rPr>
+                  <w:color w:val="1CADE4" w:themeColor="accent1"/>
+                  <w:sz w:val="28"/>
+                  <w:szCs w:val="28"/>
+                </w:rPr>
+                <w:t xml:space="preserve">, Danilo </w:t>
+              </w:r>
+              <w:proofErr w:type="spellStart"/>
+              <w:r>
+                <w:rPr>
+                  <w:color w:val="1CADE4" w:themeColor="accent1"/>
+                  <w:sz w:val="28"/>
+                  <w:szCs w:val="28"/>
+                </w:rPr>
+                <w:t>Labella</w:t>
+              </w:r>
+              <w:proofErr w:type="spellEnd"/>
               <w:r>
                 <w:rPr>
                   <w:color w:val="1CADE4" w:themeColor="accent1"/>
@@ -675,12 +713,28 @@
                                     <w:lang w:val="en-US"/>
                                   </w:rPr>
                                 </w:pPr>
+                                <w:proofErr w:type="spellStart"/>
                                 <w:r>
                                   <w:rPr>
                                     <w:lang w:val="en-US"/>
                                   </w:rPr>
-                                  <w:t>Dpto. de Informática</w:t>
+                                  <w:t>Dpto</w:t>
                                 </w:r>
+                                <w:proofErr w:type="spellEnd"/>
+                                <w:r>
+                                  <w:rPr>
+                                    <w:lang w:val="en-US"/>
+                                  </w:rPr>
+                                  <w:t xml:space="preserve">. de </w:t>
+                                </w:r>
+                                <w:proofErr w:type="spellStart"/>
+                                <w:r>
+                                  <w:rPr>
+                                    <w:lang w:val="en-US"/>
+                                  </w:rPr>
+                                  <w:t>Informática</w:t>
+                                </w:r>
+                                <w:proofErr w:type="spellEnd"/>
                               </w:p>
                             </w:txbxContent>
                           </wps:txbx>
@@ -774,12 +828,28 @@
                               <w:lang w:val="en-US"/>
                             </w:rPr>
                           </w:pPr>
+                          <w:proofErr w:type="spellStart"/>
                           <w:r>
                             <w:rPr>
                               <w:lang w:val="en-US"/>
                             </w:rPr>
-                            <w:t>Dpto. de Informática</w:t>
+                            <w:t>Dpto</w:t>
                           </w:r>
+                          <w:proofErr w:type="spellEnd"/>
+                          <w:r>
+                            <w:rPr>
+                              <w:lang w:val="en-US"/>
+                            </w:rPr>
+                            <w:t xml:space="preserve">. de </w:t>
+                          </w:r>
+                          <w:proofErr w:type="spellStart"/>
+                          <w:r>
+                            <w:rPr>
+                              <w:lang w:val="en-US"/>
+                            </w:rPr>
+                            <w:t>Informática</w:t>
+                          </w:r>
+                          <w:proofErr w:type="spellEnd"/>
                         </w:p>
                       </w:txbxContent>
                     </v:textbox>
@@ -911,12 +981,14 @@
                                     <w:lang w:val="en-US"/>
                                   </w:rPr>
                                 </w:pPr>
+                                <w:proofErr w:type="spellStart"/>
                                 <w:r>
                                   <w:rPr>
                                     <w:lang w:val="en-US"/>
                                   </w:rPr>
                                   <w:t>FCFMyN</w:t>
                                 </w:r>
+                                <w:proofErr w:type="spellEnd"/>
                               </w:p>
                             </w:txbxContent>
                           </wps:txbx>
@@ -1008,12 +1080,14 @@
                               <w:lang w:val="en-US"/>
                             </w:rPr>
                           </w:pPr>
+                          <w:proofErr w:type="spellStart"/>
                           <w:r>
                             <w:rPr>
                               <w:lang w:val="en-US"/>
                             </w:rPr>
                             <w:t>FCFMyN</w:t>
                           </w:r>
+                          <w:proofErr w:type="spellEnd"/>
                         </w:p>
                       </w:txbxContent>
                     </v:textbox>
@@ -2915,10 +2989,7 @@
         </m:r>
       </m:oMath>
       <w:r>
-        <w:t>)</w:t>
-      </w:r>
-      <w:r>
-        <w:t xml:space="preserve"> </w:t>
+        <w:t xml:space="preserve">) </w:t>
       </w:r>
       <w:r>
         <w:t>y se comenzó a recolectar estadísticas básicas.</w:t>
@@ -2986,10 +3057,27 @@
     </w:p>
     <w:p>
       <w:pPr>
+        <w:jc w:val="left"/>
+        <w:rPr>
+          <w:rFonts w:asciiTheme="majorHAnsi" w:eastAsiaTheme="majorEastAsia" w:hAnsiTheme="majorHAnsi" w:cstheme="majorBidi"/>
+          <w:b/>
+          <w:color w:val="264356" w:themeColor="text2" w:themeShade="BF"/>
+          <w:spacing w:val="5"/>
+          <w:sz w:val="52"/>
+          <w:szCs w:val="52"/>
+        </w:rPr>
+      </w:pPr>
+      <w:bookmarkStart w:id="5" w:name="_Toc201229731"/>
+      <w:r>
+        <w:br w:type="page"/>
+      </w:r>
+    </w:p>
+    <w:p>
+      <w:pPr>
         <w:pStyle w:val="Title"/>
       </w:pPr>
-      <w:bookmarkStart w:id="5" w:name="_Toc201229731"/>
-      <w:r>
+      <w:r>
+        <w:lastRenderedPageBreak/>
         <w:t>Primera Etapa</w:t>
       </w:r>
       <w:bookmarkEnd w:id="5"/>
@@ -3125,7 +3213,6 @@
         </w:numPr>
       </w:pPr>
       <w:r>
-        <w:lastRenderedPageBreak/>
         <w:t>Tiempos de espera (media, máximo y mínimo distinto de cero).</w:t>
       </w:r>
     </w:p>
@@ -3234,7 +3321,13 @@
     </w:p>
     <w:p>
       <w:r>
-        <w:t>Nuestra implementación de modelo se implemento de la siguiente manera:</w:t>
+        <w:t xml:space="preserve">Nuestra implementación de modelo se </w:t>
+      </w:r>
+      <w:r>
+        <w:t>implementó</w:t>
+      </w:r>
+      <w:r>
+        <w:t xml:space="preserve"> de la siguiente manera:</w:t>
       </w:r>
     </w:p>
     <w:p>
@@ -3270,6 +3363,7 @@
         </w:numPr>
       </w:pPr>
       <w:r>
+        <w:lastRenderedPageBreak/>
         <w:t>Verde representa las interfaces</w:t>
       </w:r>
     </w:p>
@@ -3304,14 +3398,10 @@
     </w:p>
     <w:p>
       <w:r>
-        <w:rPr>
-          <w:noProof/>
-        </w:rPr>
-        <w:lastRenderedPageBreak/>
         <w:drawing>
-          <wp:inline distT="0" distB="0" distL="0" distR="0" wp14:anchorId="40D9C7BB" wp14:editId="66A08023">
-            <wp:extent cx="5731510" cy="3477895"/>
-            <wp:effectExtent l="0" t="0" r="2540" b="8255"/>
+          <wp:inline distT="0" distB="0" distL="0" distR="0" wp14:anchorId="0A7268C7" wp14:editId="0572D6A0">
+            <wp:extent cx="5731510" cy="3392805"/>
+            <wp:effectExtent l="0" t="0" r="2540" b="0"/>
             <wp:docPr id="1" name="Picture 1"/>
             <wp:cNvGraphicFramePr>
               <a:graphicFrameLocks xmlns:a="http://schemas.openxmlformats.org/drawingml/2006/main" noChangeAspect="1"/>
@@ -3332,7 +3422,7 @@
                   <pic:spPr>
                     <a:xfrm>
                       <a:off x="0" y="0"/>
-                      <a:ext cx="5731510" cy="3477895"/>
+                      <a:ext cx="5731510" cy="3392805"/>
                     </a:xfrm>
                     <a:prstGeom prst="rect">
                       <a:avLst/>
@@ -3494,6 +3584,7 @@
         </w:numPr>
       </w:pPr>
       <w:r>
+        <w:lastRenderedPageBreak/>
         <w:t>Al aplicar S</w:t>
       </w:r>
       <w:r>
@@ -3550,16 +3641,12 @@
         <w:t>.</w:t>
       </w:r>
       <w:r>
+        <w:t xml:space="preserve"> Además,</w:t>
+      </w:r>
+      <w:r>
         <w:t xml:space="preserve"> </w:t>
       </w:r>
       <w:r>
-        <w:t>Además,</w:t>
-      </w:r>
-      <w:r>
-        <w:t xml:space="preserve"> </w:t>
-      </w:r>
-      <w:r>
-        <w:lastRenderedPageBreak/>
         <w:t xml:space="preserve">creamos la interface </w:t>
       </w:r>
       <m:oMath>
@@ -3602,6 +3689,192 @@
     </w:p>
     <w:p>
       <w:r>
+        <w:pict w14:anchorId="52861704">
+          <v:rect id="_x0000_i1037" style="width:0;height:1.5pt" o:hralign="center" o:hrstd="t" o:hr="t" fillcolor="#a0a0a0" stroked="f"/>
+        </w:pict>
+      </w:r>
+    </w:p>
+    <w:p>
+      <w:pPr>
+        <w:pStyle w:val="Heading2"/>
+      </w:pPr>
+      <w:r>
+        <w:t>Testing</w:t>
+      </w:r>
+    </w:p>
+    <w:p>
+      <w:pPr>
+        <w:rPr>
+          <w:lang w:val="es-ES"/>
+        </w:rPr>
+      </w:pPr>
+      <w:r>
+        <w:t>Dado que necesitábamos una manera de v</w:t>
+      </w:r>
+      <w:r>
+        <w:t xml:space="preserve">erificar partes específicas de nuestro </w:t>
+      </w:r>
+      <w:r>
+        <w:rPr>
+          <w:lang w:val="es-ES"/>
+        </w:rPr>
+        <w:t xml:space="preserve">código, recurrimos a la herramienta de testeo. </w:t>
+      </w:r>
+      <w:r>
+        <w:rPr>
+          <w:lang w:val="es-ES"/>
+        </w:rPr>
+        <w:t xml:space="preserve">A </w:t>
+      </w:r>
+      <w:r>
+        <w:rPr>
+          <w:lang w:val="es-ES"/>
+        </w:rPr>
+        <w:t>continuación,</w:t>
+      </w:r>
+      <w:r>
+        <w:rPr>
+          <w:lang w:val="es-ES"/>
+        </w:rPr>
+        <w:t xml:space="preserve"> se detalla lo que fue testeado</w:t>
+      </w:r>
+      <w:r>
+        <w:rPr>
+          <w:lang w:val="es-ES"/>
+        </w:rPr>
+        <w:t>:</w:t>
+      </w:r>
+    </w:p>
+    <w:p>
+      <w:pPr>
+        <w:pStyle w:val="ListParagraph"/>
+        <w:numPr>
+          <w:ilvl w:val="0"/>
+          <w:numId w:val="17"/>
+        </w:numPr>
+        <w:rPr>
+          <w:b/>
+          <w:bCs/>
+        </w:rPr>
+      </w:pPr>
+      <m:oMath>
+        <m:r>
+          <m:rPr>
+            <m:sty m:val="bi"/>
+          </m:rPr>
+          <w:rPr>
+            <w:rFonts w:ascii="Cambria Math" w:hAnsi="Cambria Math"/>
+          </w:rPr>
+          <m:t>AircraftCodeGenerator</m:t>
+        </m:r>
+      </m:oMath>
+      <w:r>
+        <w:rPr>
+          <w:rFonts w:eastAsiaTheme="minorEastAsia"/>
+          <w:lang w:val="es-ES"/>
+        </w:rPr>
+        <w:t>: Corroboramos el ge</w:t>
+      </w:r>
+      <w:r>
+        <w:rPr>
+          <w:rFonts w:eastAsiaTheme="minorEastAsia"/>
+          <w:lang w:val="es-ES"/>
+        </w:rPr>
+        <w:t>nerador de códigos para entidades.</w:t>
+      </w:r>
+    </w:p>
+    <w:p>
+      <w:pPr>
+        <w:pStyle w:val="ListParagraph"/>
+        <w:numPr>
+          <w:ilvl w:val="0"/>
+          <w:numId w:val="17"/>
+        </w:numPr>
+        <w:rPr>
+          <w:b/>
+          <w:bCs/>
+        </w:rPr>
+      </w:pPr>
+      <w:r>
+        <w:rPr>
+          <w:rFonts w:eastAsiaTheme="minorEastAsia"/>
+          <w:b/>
+          <w:bCs/>
+        </w:rPr>
+        <w:t xml:space="preserve"> </w:t>
+      </w:r>
+      <m:oMath>
+        <m:r>
+          <m:rPr>
+            <m:sty m:val="bi"/>
+          </m:rPr>
+          <w:rPr>
+            <w:rFonts w:ascii="Cambria Math" w:eastAsiaTheme="minorEastAsia" w:hAnsi="Cambria Math"/>
+          </w:rPr>
+          <m:t>ServerCodeGenerator</m:t>
+        </m:r>
+      </m:oMath>
+      <w:r>
+        <w:rPr>
+          <w:rFonts w:eastAsiaTheme="minorEastAsia"/>
+        </w:rPr>
+        <w:t>: Análogamente al generador de entidades, se corroboró el generador de código para servidores.</w:t>
+      </w:r>
+    </w:p>
+    <w:p>
+      <w:pPr>
+        <w:pStyle w:val="ListParagraph"/>
+        <w:numPr>
+          <w:ilvl w:val="0"/>
+          <w:numId w:val="17"/>
+        </w:numPr>
+        <w:rPr>
+          <w:b/>
+          <w:bCs/>
+        </w:rPr>
+      </w:pPr>
+      <m:oMath>
+        <m:r>
+          <m:rPr>
+            <m:sty m:val="bi"/>
+          </m:rPr>
+          <w:rPr>
+            <w:rFonts w:ascii="Cambria Math" w:hAnsi="Cambria Math"/>
+          </w:rPr>
+          <m:t>EventPrioritizer</m:t>
+        </m:r>
+      </m:oMath>
+      <w:r>
+        <w:rPr>
+          <w:rFonts w:eastAsiaTheme="minorEastAsia"/>
+        </w:rPr>
+        <w:t xml:space="preserve">: Se comprobó que el ordenamiento de eventos para la </w:t>
+      </w:r>
+      <m:oMath>
+        <m:r>
+          <w:rPr>
+            <w:rFonts w:ascii="Cambria Math" w:eastAsiaTheme="minorEastAsia" w:hAnsi="Cambria Math"/>
+          </w:rPr>
+          <m:t>FEL</m:t>
+        </m:r>
+      </m:oMath>
+      <w:r>
+        <w:rPr>
+          <w:rFonts w:eastAsiaTheme="minorEastAsia"/>
+        </w:rPr>
+        <w:t xml:space="preserve"> sea de la manera esperada.</w:t>
+      </w:r>
+    </w:p>
+    <w:p>
+      <w:r>
+        <w:t xml:space="preserve">Luego de verificar el correcto funcionamiento de las clases de interés, podíamos proceder a verificar que los resultados (estadísticas) de la simulación. Esto se realizó mediante una hoja de calculo </w:t>
+      </w:r>
+      <w:r>
+        <w:t>hecha a mano utilizando un generador de números aleatorios estáticos.</w:t>
+      </w:r>
+    </w:p>
+    <w:p>
+      <w:r>
         <w:pict w14:anchorId="40E16636">
           <v:rect id="_x0000_i1030" style="width:0;height:1.5pt" o:hralign="center" o:hrstd="t" o:hr="t" fillcolor="#a0a0a0" stroked="f"/>
         </w:pict>
@@ -3609,10 +3882,27 @@
     </w:p>
     <w:p>
       <w:pPr>
+        <w:jc w:val="left"/>
+        <w:rPr>
+          <w:rFonts w:asciiTheme="majorHAnsi" w:eastAsiaTheme="majorEastAsia" w:hAnsiTheme="majorHAnsi" w:cstheme="majorBidi"/>
+          <w:b/>
+          <w:color w:val="264356" w:themeColor="text2" w:themeShade="BF"/>
+          <w:spacing w:val="5"/>
+          <w:sz w:val="52"/>
+          <w:szCs w:val="52"/>
+        </w:rPr>
+      </w:pPr>
+      <w:bookmarkStart w:id="9" w:name="_Toc201229735"/>
+      <w:r>
+        <w:br w:type="page"/>
+      </w:r>
+    </w:p>
+    <w:p>
+      <w:pPr>
         <w:pStyle w:val="Title"/>
       </w:pPr>
-      <w:bookmarkStart w:id="9" w:name="_Toc201229735"/>
-      <w:r>
+      <w:r>
+        <w:lastRenderedPageBreak/>
         <w:t>Segunda etapa</w:t>
       </w:r>
       <w:bookmarkEnd w:id="9"/>
@@ -3904,9 +4194,9 @@
     <w:p>
       <w:r>
         <w:drawing>
-          <wp:inline distT="0" distB="0" distL="0" distR="0" wp14:anchorId="20BE91DE" wp14:editId="6BF9BEF0">
-            <wp:extent cx="5731510" cy="3594735"/>
-            <wp:effectExtent l="0" t="0" r="2540" b="5715"/>
+          <wp:inline distT="0" distB="0" distL="0" distR="0" wp14:anchorId="77A6CD28" wp14:editId="4D2C7A98">
+            <wp:extent cx="5731510" cy="3432175"/>
+            <wp:effectExtent l="0" t="0" r="0" b="0"/>
             <wp:docPr id="7" name="Picture 7"/>
             <wp:cNvGraphicFramePr>
               <a:graphicFrameLocks xmlns:a="http://schemas.openxmlformats.org/drawingml/2006/main" noChangeAspect="1"/>
@@ -3927,7 +4217,7 @@
                   <pic:spPr>
                     <a:xfrm>
                       <a:off x="0" y="0"/>
-                      <a:ext cx="5731510" cy="3594735"/>
+                      <a:ext cx="5731510" cy="3432175"/>
                     </a:xfrm>
                     <a:prstGeom prst="rect">
                       <a:avLst/>
@@ -4185,14 +4475,7 @@
         <w:rPr>
           <w:rFonts w:eastAsiaTheme="minorEastAsia"/>
         </w:rPr>
-        <w:t xml:space="preserve"> pasa a ser </w:t>
-      </w:r>
-      <w:r>
-        <w:rPr>
-          <w:rFonts w:eastAsiaTheme="minorEastAsia"/>
-        </w:rPr>
-        <w:lastRenderedPageBreak/>
-        <w:t xml:space="preserve">atributo de la </w:t>
+        <w:t xml:space="preserve"> pasa a ser atributo de la </w:t>
       </w:r>
       <m:oMath>
         <m:r>
@@ -4213,13 +4496,7 @@
           <w:rPr>
             <w:rFonts w:ascii="Cambria Math" w:eastAsiaTheme="minorEastAsia" w:hAnsi="Cambria Math"/>
           </w:rPr>
-          <m:t>A</m:t>
-        </m:r>
-        <m:r>
-          <w:rPr>
-            <w:rFonts w:ascii="Cambria Math" w:eastAsiaTheme="minorEastAsia" w:hAnsi="Cambria Math"/>
-          </w:rPr>
-          <m:t>rrival</m:t>
+          <m:t>Arrival</m:t>
         </m:r>
       </m:oMath>
       <w:r>
@@ -4254,6 +4531,7 @@
         <w:rPr>
           <w:rFonts w:eastAsiaTheme="minorEastAsia"/>
         </w:rPr>
+        <w:lastRenderedPageBreak/>
         <w:t>Identificamos una generalización para los atributos estadísticos (</w:t>
       </w:r>
       <m:oMath>
@@ -4498,7 +4776,33 @@
         <w:rPr>
           <w:rFonts w:eastAsiaTheme="minorEastAsia"/>
         </w:rPr>
-        <w:t>Para resolver esto mismo hicimos uso del patrón de diseño Factory</w:t>
+        <w:t>Para resolver esto mismo hicimos uso del patrón de diseño</w:t>
+      </w:r>
+      <w:r>
+        <w:rPr>
+          <w:rFonts w:eastAsiaTheme="minorEastAsia"/>
+        </w:rPr>
+        <w:t xml:space="preserve"> “</w:t>
+      </w:r>
+      <w:proofErr w:type="spellStart"/>
+      <w:r>
+        <w:rPr>
+          <w:rFonts w:eastAsiaTheme="minorEastAsia"/>
+        </w:rPr>
+        <w:t>f</w:t>
+      </w:r>
+      <w:r>
+        <w:rPr>
+          <w:rFonts w:eastAsiaTheme="minorEastAsia"/>
+        </w:rPr>
+        <w:t>actory</w:t>
+      </w:r>
+      <w:proofErr w:type="spellEnd"/>
+      <w:r>
+        <w:rPr>
+          <w:rFonts w:eastAsiaTheme="minorEastAsia"/>
+        </w:rPr>
+        <w:t>”</w:t>
       </w:r>
       <w:sdt>
         <w:sdtPr>
@@ -4686,16 +4990,7 @@
           <w:rPr>
             <w:rFonts w:ascii="Cambria Math" w:hAnsi="Cambria Math"/>
           </w:rPr>
-          <m:t xml:space="preserve"> </m:t>
-        </m:r>
-        <m:r>
-          <m:rPr>
-            <m:sty m:val="bi"/>
-          </m:rPr>
-          <w:rPr>
-            <w:rFonts w:ascii="Cambria Math" w:hAnsi="Cambria Math"/>
-          </w:rPr>
-          <m:t>entityFactory.create(),</m:t>
+          <m:t xml:space="preserve"> entityFactory.create(),</m:t>
         </m:r>
         <m:r>
           <w:rPr>
@@ -4813,22 +5108,13 @@
         <w:t>Mejoramos todos los</w:t>
       </w:r>
       <w:r>
-        <w:t xml:space="preserve"> “comparators</w:t>
-      </w:r>
-      <w:r>
-        <w:t>”</w:t>
+        <w:t xml:space="preserve"> “comparators”</w:t>
       </w:r>
       <w:r>
         <w:t xml:space="preserve"> de nuestras clases</w:t>
       </w:r>
       <w:r>
-        <w:t xml:space="preserve"> utilizando Java </w:t>
-      </w:r>
-      <w:r>
-        <w:t>Funcional</w:t>
-      </w:r>
-      <w:r>
-        <w:t xml:space="preserve"> específicamente el uso de </w:t>
+        <w:t xml:space="preserve"> utilizando Java Funcional específicamente el uso de </w:t>
       </w:r>
       <w:r>
         <w:t>referencia a métodos (</w:t>
@@ -4844,8 +5130,512 @@
       <w:r>
         <w:t>) y expresiones lambda.</w:t>
       </w:r>
-      <w:r>
+    </w:p>
+    <w:p>
+      <w:pPr>
+        <w:numPr>
+          <w:ilvl w:val="0"/>
+          <w:numId w:val="7"/>
+        </w:numPr>
+      </w:pPr>
+      <w:r>
+        <w:t>La implementación del uso de varias</w:t>
+      </w:r>
+      <w:r>
+        <w:t xml:space="preserve"> distribuciones para generar los tiempos de </w:t>
+      </w:r>
+      <w:r>
+        <w:t xml:space="preserve">un </w:t>
+      </w:r>
+      <w:r>
+        <w:t>evento</w:t>
+      </w:r>
+      <w:r>
+        <w:t xml:space="preserve"> particular</w:t>
+      </w:r>
+      <w:r>
+        <w:t xml:space="preserve">, </w:t>
+      </w:r>
+      <w:r>
+        <w:t>se realizó mediante una lista</w:t>
+      </w:r>
+      <w:r>
+        <w:t xml:space="preserve">. De esta manera al momento de generar dichos tiempos para un evento, se itera sobre la lista sumando los resultados dados por cada distribución asociado al evento. </w:t>
+      </w:r>
+      <w:r>
+        <w:t xml:space="preserve">Así se creó </w:t>
+      </w:r>
+      <m:oMath>
+        <m:r>
+          <w:rPr>
+            <w:rFonts w:ascii="Cambria Math" w:hAnsi="Cambria Math"/>
+          </w:rPr>
+          <m:t>DistributionList</m:t>
+        </m:r>
+      </m:oMath>
+      <w:r>
+        <w:rPr>
+          <w:rFonts w:eastAsiaTheme="minorEastAsia"/>
+        </w:rPr>
+        <w:t>, la cual almacena las distribuciones que un evento tendr</w:t>
+      </w:r>
+      <w:r>
+        <w:rPr>
+          <w:rFonts w:eastAsiaTheme="minorEastAsia"/>
+        </w:rPr>
+        <w:t>á.</w:t>
+      </w:r>
+    </w:p>
+    <w:p>
+      <w:r>
+        <w:pict w14:anchorId="50E24AE1">
+          <v:rect id="_x0000_i1038" style="width:0;height:1.5pt" o:hralign="center" o:hrstd="t" o:hr="t" fillcolor="#a0a0a0" stroked="f"/>
+        </w:pict>
+      </w:r>
+    </w:p>
+    <w:p>
+      <w:pPr>
+        <w:pStyle w:val="Heading2"/>
+      </w:pPr>
+      <w:r>
+        <w:t>Testing</w:t>
+      </w:r>
+    </w:p>
+    <w:p>
+      <w:r>
+        <w:t xml:space="preserve">En esta etapa se agregó el testeo únicamente para </w:t>
+      </w:r>
+      <m:oMath>
+        <m:r>
+          <m:rPr>
+            <m:sty m:val="bi"/>
+          </m:rPr>
+          <w:rPr>
+            <w:rFonts w:ascii="Cambria Math" w:hAnsi="Cambria Math"/>
+          </w:rPr>
+          <m:t>RunwayPrioritizer</m:t>
+        </m:r>
+      </m:oMath>
+      <w:r>
+        <w:rPr>
+          <w:rFonts w:eastAsiaTheme="minorEastAsia"/>
+        </w:rPr>
+        <w:t>,</w:t>
+      </w:r>
+      <w:r>
+        <w:t xml:space="preserve"> asegur</w:t>
+      </w:r>
+      <w:r>
+        <w:t>ando</w:t>
+      </w:r>
+      <w:r>
+        <w:t xml:space="preserve"> el correcto ordenamiento de los servidores</w:t>
+      </w:r>
+      <w:r>
+        <w:t>.</w:t>
+      </w:r>
+    </w:p>
+    <w:p>
+      <w:r>
+        <w:pict w14:anchorId="0D8A19DE">
+          <v:rect id="_x0000_i1042" style="width:0;height:1.5pt" o:hralign="center" o:hrstd="t" o:hr="t" fillcolor="#a0a0a0" stroked="f"/>
+        </w:pict>
+      </w:r>
+    </w:p>
+    <w:p>
+      <w:pPr>
+        <w:pStyle w:val="Heading2"/>
+      </w:pPr>
+      <w:r>
+        <w:t>Postulación de la configuración</w:t>
+      </w:r>
+    </w:p>
+    <w:p>
+      <w:r>
+        <w:t>A continuación</w:t>
+      </w:r>
+      <w:r>
+        <w:t>,</w:t>
+      </w:r>
+      <w:r>
+        <w:t xml:space="preserve"> se detalla los resultados de espera máxima según cantidad de servidores:</w:t>
+      </w:r>
+    </w:p>
+    <w:p>
+      <w:pPr>
+        <w:pStyle w:val="ListParagraph"/>
+        <w:numPr>
+          <w:ilvl w:val="0"/>
+          <w:numId w:val="18"/>
+        </w:numPr>
+      </w:pPr>
+      <w:r>
+        <w:rPr>
+          <w:b/>
+          <w:bCs/>
+        </w:rPr>
+        <w:lastRenderedPageBreak/>
+        <w:t>5 servidores</w:t>
+      </w:r>
+      <w:r>
+        <w:t xml:space="preserve">: </w:t>
+      </w:r>
+      <m:oMath>
+        <m:r>
+          <w:rPr>
+            <w:rFonts w:ascii="Cambria Math" w:hAnsi="Cambria Math"/>
+          </w:rPr>
+          <m:t>36.8</m:t>
+        </m:r>
+        <m:func>
+          <m:funcPr>
+            <m:ctrlPr>
+              <w:rPr>
+                <w:rFonts w:ascii="Cambria Math" w:eastAsiaTheme="minorEastAsia" w:hAnsi="Cambria Math"/>
+                <w:i/>
+              </w:rPr>
+            </m:ctrlPr>
+          </m:funcPr>
+          <m:fName>
+            <m:r>
+              <m:rPr>
+                <m:sty m:val="p"/>
+              </m:rPr>
+              <w:rPr>
+                <w:rFonts w:ascii="Cambria Math" w:eastAsiaTheme="minorEastAsia" w:hAnsi="Cambria Math"/>
+              </w:rPr>
+              <m:t>min</m:t>
+            </m:r>
+          </m:fName>
+          <m:e>
+            <m:r>
+              <w:rPr>
+                <w:rFonts w:ascii="Cambria Math" w:eastAsiaTheme="minorEastAsia" w:hAnsi="Cambria Math"/>
+              </w:rPr>
+              <m:t>= 0.58</m:t>
+            </m:r>
+            <m:r>
+              <w:rPr>
+                <w:rFonts w:ascii="Cambria Math" w:eastAsiaTheme="minorEastAsia" w:hAnsi="Cambria Math"/>
+              </w:rPr>
+              <m:t xml:space="preserve"> </m:t>
+            </m:r>
+            <m:r>
+              <w:rPr>
+                <w:rFonts w:ascii="Cambria Math" w:eastAsiaTheme="minorEastAsia" w:hAnsi="Cambria Math"/>
+              </w:rPr>
+              <m:t>h</m:t>
+            </m:r>
+          </m:e>
+        </m:func>
+      </m:oMath>
+      <w:r>
+        <w:rPr>
+          <w:b/>
+          <w:bCs/>
+        </w:rPr>
         <w:t xml:space="preserve"> </w:t>
+      </w:r>
+    </w:p>
+    <w:p>
+      <w:pPr>
+        <w:pStyle w:val="ListParagraph"/>
+        <w:numPr>
+          <w:ilvl w:val="0"/>
+          <w:numId w:val="18"/>
+        </w:numPr>
+      </w:pPr>
+      <w:r>
+        <w:rPr>
+          <w:b/>
+          <w:bCs/>
+        </w:rPr>
+        <w:t>4 servidores</w:t>
+      </w:r>
+      <w:r>
+        <w:t xml:space="preserve">: </w:t>
+      </w:r>
+      <m:oMath>
+        <m:r>
+          <w:rPr>
+            <w:rFonts w:ascii="Cambria Math" w:hAnsi="Cambria Math"/>
+          </w:rPr>
+          <m:t>46.503</m:t>
+        </m:r>
+        <m:func>
+          <m:funcPr>
+            <m:ctrlPr>
+              <w:rPr>
+                <w:rFonts w:ascii="Cambria Math" w:hAnsi="Cambria Math"/>
+                <w:i/>
+              </w:rPr>
+            </m:ctrlPr>
+          </m:funcPr>
+          <m:fName>
+            <m:r>
+              <m:rPr>
+                <m:sty m:val="p"/>
+              </m:rPr>
+              <w:rPr>
+                <w:rFonts w:ascii="Cambria Math" w:hAnsi="Cambria Math"/>
+              </w:rPr>
+              <m:t>min</m:t>
+            </m:r>
+          </m:fName>
+          <m:e>
+            <m:r>
+              <w:rPr>
+                <w:rFonts w:ascii="Cambria Math" w:hAnsi="Cambria Math"/>
+              </w:rPr>
+              <m:t>=0.775</m:t>
+            </m:r>
+            <m:r>
+              <w:rPr>
+                <w:rFonts w:ascii="Cambria Math" w:hAnsi="Cambria Math"/>
+              </w:rPr>
+              <m:t xml:space="preserve"> </m:t>
+            </m:r>
+            <m:r>
+              <w:rPr>
+                <w:rFonts w:ascii="Cambria Math" w:hAnsi="Cambria Math"/>
+              </w:rPr>
+              <m:t>h</m:t>
+            </m:r>
+          </m:e>
+        </m:func>
+      </m:oMath>
+      <w:r>
+        <w:rPr>
+          <w:rFonts w:eastAsiaTheme="minorEastAsia"/>
+        </w:rPr>
+        <w:t xml:space="preserve"> </w:t>
+      </w:r>
+    </w:p>
+    <w:p>
+      <w:pPr>
+        <w:pStyle w:val="ListParagraph"/>
+        <w:numPr>
+          <w:ilvl w:val="0"/>
+          <w:numId w:val="18"/>
+        </w:numPr>
+      </w:pPr>
+      <w:r>
+        <w:rPr>
+          <w:b/>
+          <w:bCs/>
+        </w:rPr>
+        <w:t>3 servidores</w:t>
+      </w:r>
+      <w:r>
+        <w:t xml:space="preserve">: </w:t>
+      </w:r>
+      <m:oMath>
+        <m:r>
+          <w:rPr>
+            <w:rFonts w:ascii="Cambria Math" w:hAnsi="Cambria Math"/>
+          </w:rPr>
+          <m:t>94.1</m:t>
+        </m:r>
+        <m:r>
+          <w:rPr>
+            <w:rFonts w:ascii="Cambria Math" w:eastAsiaTheme="minorEastAsia" w:hAnsi="Cambria Math"/>
+          </w:rPr>
+          <m:t>43</m:t>
+        </m:r>
+        <m:func>
+          <m:funcPr>
+            <m:ctrlPr>
+              <w:rPr>
+                <w:rFonts w:ascii="Cambria Math" w:eastAsiaTheme="minorEastAsia" w:hAnsi="Cambria Math"/>
+                <w:i/>
+              </w:rPr>
+            </m:ctrlPr>
+          </m:funcPr>
+          <m:fName>
+            <m:r>
+              <m:rPr>
+                <m:sty m:val="p"/>
+              </m:rPr>
+              <w:rPr>
+                <w:rFonts w:ascii="Cambria Math" w:eastAsiaTheme="minorEastAsia" w:hAnsi="Cambria Math"/>
+              </w:rPr>
+              <m:t>min</m:t>
+            </m:r>
+          </m:fName>
+          <m:e>
+            <m:r>
+              <w:rPr>
+                <w:rFonts w:ascii="Cambria Math" w:eastAsiaTheme="minorEastAsia" w:hAnsi="Cambria Math"/>
+              </w:rPr>
+              <m:t>= 1.569</m:t>
+            </m:r>
+            <m:r>
+              <w:rPr>
+                <w:rFonts w:ascii="Cambria Math" w:eastAsiaTheme="minorEastAsia" w:hAnsi="Cambria Math"/>
+              </w:rPr>
+              <m:t xml:space="preserve"> </m:t>
+            </m:r>
+            <m:r>
+              <w:rPr>
+                <w:rFonts w:ascii="Cambria Math" w:eastAsiaTheme="minorEastAsia" w:hAnsi="Cambria Math"/>
+              </w:rPr>
+              <m:t>h</m:t>
+            </m:r>
+          </m:e>
+        </m:func>
+      </m:oMath>
+    </w:p>
+    <w:p>
+      <w:pPr>
+        <w:pStyle w:val="ListParagraph"/>
+        <w:numPr>
+          <w:ilvl w:val="0"/>
+          <w:numId w:val="18"/>
+        </w:numPr>
+      </w:pPr>
+      <w:r>
+        <w:rPr>
+          <w:b/>
+          <w:bCs/>
+        </w:rPr>
+        <w:t>2 servidores</w:t>
+      </w:r>
+      <w:r>
+        <w:t xml:space="preserve">: </w:t>
+      </w:r>
+      <m:oMath>
+        <m:r>
+          <w:rPr>
+            <w:rFonts w:ascii="Cambria Math" w:hAnsi="Cambria Math"/>
+          </w:rPr>
+          <m:t>640.238</m:t>
+        </m:r>
+        <m:func>
+          <m:funcPr>
+            <m:ctrlPr>
+              <w:rPr>
+                <w:rFonts w:ascii="Cambria Math" w:hAnsi="Cambria Math"/>
+                <w:i/>
+              </w:rPr>
+            </m:ctrlPr>
+          </m:funcPr>
+          <m:fName>
+            <m:r>
+              <m:rPr>
+                <m:sty m:val="p"/>
+              </m:rPr>
+              <w:rPr>
+                <w:rFonts w:ascii="Cambria Math" w:hAnsi="Cambria Math"/>
+              </w:rPr>
+              <m:t>min</m:t>
+            </m:r>
+          </m:fName>
+          <m:e>
+            <m:r>
+              <w:rPr>
+                <w:rFonts w:ascii="Cambria Math" w:hAnsi="Cambria Math"/>
+              </w:rPr>
+              <m:t>=10.67</m:t>
+            </m:r>
+            <m:r>
+              <w:rPr>
+                <w:rFonts w:ascii="Cambria Math" w:hAnsi="Cambria Math"/>
+              </w:rPr>
+              <m:t xml:space="preserve"> </m:t>
+            </m:r>
+            <m:r>
+              <w:rPr>
+                <w:rFonts w:ascii="Cambria Math" w:hAnsi="Cambria Math"/>
+              </w:rPr>
+              <m:t>h</m:t>
+            </m:r>
+          </m:e>
+        </m:func>
+      </m:oMath>
+    </w:p>
+    <w:p>
+      <w:pPr>
+        <w:pStyle w:val="ListParagraph"/>
+        <w:numPr>
+          <w:ilvl w:val="0"/>
+          <w:numId w:val="18"/>
+        </w:numPr>
+      </w:pPr>
+      <w:r>
+        <w:rPr>
+          <w:b/>
+          <w:bCs/>
+        </w:rPr>
+        <w:t>1 servidores</w:t>
+      </w:r>
+      <w:r>
+        <w:t xml:space="preserve">: </w:t>
+      </w:r>
+      <m:oMath>
+        <m:r>
+          <w:rPr>
+            <w:rFonts w:ascii="Cambria Math" w:hAnsi="Cambria Math"/>
+          </w:rPr>
+          <m:t>187</m:t>
+        </m:r>
+        <m:r>
+          <w:rPr>
+            <w:rFonts w:ascii="Cambria Math" w:hAnsi="Cambria Math"/>
+          </w:rPr>
+          <m:t xml:space="preserve"> </m:t>
+        </m:r>
+        <m:r>
+          <w:rPr>
+            <w:rFonts w:ascii="Cambria Math" w:hAnsi="Cambria Math"/>
+          </w:rPr>
+          <m:t>771</m:t>
+        </m:r>
+        <m:r>
+          <w:rPr>
+            <w:rFonts w:ascii="Cambria Math" w:hAnsi="Cambria Math"/>
+          </w:rPr>
+          <m:t>.002</m:t>
+        </m:r>
+        <m:func>
+          <m:funcPr>
+            <m:ctrlPr>
+              <w:rPr>
+                <w:rFonts w:ascii="Cambria Math" w:hAnsi="Cambria Math"/>
+                <w:i/>
+              </w:rPr>
+            </m:ctrlPr>
+          </m:funcPr>
+          <m:fName>
+            <m:r>
+              <m:rPr>
+                <m:sty m:val="p"/>
+              </m:rPr>
+              <w:rPr>
+                <w:rFonts w:ascii="Cambria Math" w:hAnsi="Cambria Math"/>
+              </w:rPr>
+              <m:t>min</m:t>
+            </m:r>
+          </m:fName>
+          <m:e>
+            <m:r>
+              <w:rPr>
+                <w:rFonts w:ascii="Cambria Math" w:hAnsi="Cambria Math"/>
+              </w:rPr>
+              <m:t>=3 129.5167</m:t>
+            </m:r>
+          </m:e>
+        </m:func>
+        <m:r>
+          <w:rPr>
+            <w:rFonts w:ascii="Cambria Math" w:hAnsi="Cambria Math"/>
+          </w:rPr>
+          <m:t xml:space="preserve"> h</m:t>
+        </m:r>
+      </m:oMath>
+    </w:p>
+    <w:p>
+      <w:r>
+        <w:t>Observando estos resultados podemos determinar que con un mínimo de tres servidores aseguramos una espera de menos de dos horas por entidad.</w:t>
       </w:r>
     </w:p>
     <w:p>
@@ -4884,10 +5674,10 @@
     <w:p>
       <w:r>
         <w:drawing>
-          <wp:inline distT="0" distB="0" distL="0" distR="0" wp14:anchorId="3CC5BAAC" wp14:editId="5385FD57">
-            <wp:extent cx="5731510" cy="4750435"/>
-            <wp:effectExtent l="0" t="0" r="2540" b="0"/>
-            <wp:docPr id="6" name="Picture 6"/>
+          <wp:inline distT="0" distB="0" distL="0" distR="0" wp14:anchorId="50CBDE0B" wp14:editId="22876D8F">
+            <wp:extent cx="5731510" cy="4678045"/>
+            <wp:effectExtent l="0" t="0" r="0" b="0"/>
+            <wp:docPr id="5" name="Picture 5"/>
             <wp:cNvGraphicFramePr>
               <a:graphicFrameLocks xmlns:a="http://schemas.openxmlformats.org/drawingml/2006/main" noChangeAspect="1"/>
             </wp:cNvGraphicFramePr>
@@ -4907,7 +5697,7 @@
                   <pic:spPr>
                     <a:xfrm>
                       <a:off x="0" y="0"/>
-                      <a:ext cx="5731510" cy="4750435"/>
+                      <a:ext cx="5731510" cy="4678045"/>
                     </a:xfrm>
                     <a:prstGeom prst="rect">
                       <a:avLst/>
@@ -4924,7 +5714,7 @@
       <w:bookmarkStart w:id="15" w:name="_Toc201229741"/>
       <w:r>
         <w:pict w14:anchorId="556B9448">
-          <v:rect id="_x0000_i1036" style="width:0;height:1.5pt" o:hralign="center" o:hrstd="t" o:hr="t" fillcolor="#a0a0a0" stroked="f"/>
+          <v:rect id="_x0000_i1034" style="width:0;height:1.5pt" o:hralign="center" o:hrstd="t" o:hr="t" fillcolor="#a0a0a0" stroked="f"/>
         </w:pict>
       </w:r>
     </w:p>
@@ -4999,7 +5789,7 @@
     <w:p>
       <w:r>
         <w:pict w14:anchorId="02C0FFE2">
-          <v:rect id="_x0000_i1034" style="width:0;height:1.5pt" o:hralign="center" o:hrstd="t" o:hr="t" fillcolor="#a0a0a0" stroked="f"/>
+          <v:rect id="_x0000_i1035" style="width:0;height:1.5pt" o:hralign="center" o:hrstd="t" o:hr="t" fillcolor="#a0a0a0" stroked="f"/>
         </w:pict>
       </w:r>
     </w:p>
@@ -5096,7 +5886,39 @@
         <w:rPr>
           <w:rFonts w:eastAsiaTheme="minorEastAsia"/>
         </w:rPr>
-        <w:t xml:space="preserve">, por lo que no se requiere el patrón de diseño Factory en su asociación, y pasa ser atributo de </w:t>
+        <w:t xml:space="preserve">, por lo que no se requiere el patrón de diseño </w:t>
+      </w:r>
+      <w:r>
+        <w:rPr>
+          <w:rFonts w:eastAsiaTheme="minorEastAsia"/>
+        </w:rPr>
+        <w:t>“</w:t>
+      </w:r>
+      <w:proofErr w:type="spellStart"/>
+      <w:r>
+        <w:rPr>
+          <w:rFonts w:eastAsiaTheme="minorEastAsia"/>
+        </w:rPr>
+        <w:t>f</w:t>
+      </w:r>
+      <w:r>
+        <w:rPr>
+          <w:rFonts w:eastAsiaTheme="minorEastAsia"/>
+        </w:rPr>
+        <w:t>actory</w:t>
+      </w:r>
+      <w:proofErr w:type="spellEnd"/>
+      <w:r>
+        <w:rPr>
+          <w:rFonts w:eastAsiaTheme="minorEastAsia"/>
+        </w:rPr>
+        <w:t>”</w:t>
+      </w:r>
+      <w:r>
+        <w:rPr>
+          <w:rFonts w:eastAsiaTheme="minorEastAsia"/>
+        </w:rPr>
+        <w:t xml:space="preserve"> en su asociación, y pasa ser atributo de </w:t>
       </w:r>
       <m:oMath>
         <m:r>
@@ -5170,6 +5992,316 @@
         </w:numPr>
       </w:pPr>
       <w:r>
+        <w:t xml:space="preserve">En esta etapa nos percatamos de un error de codificación, al no seguir el modelo, arrastrado de la segunda etapa. Este error fue especificar las distribuciones de los eventos </w:t>
+      </w:r>
+      <m:oMath>
+        <m:r>
+          <w:rPr>
+            <w:rFonts w:ascii="Cambria Math" w:hAnsi="Cambria Math"/>
+          </w:rPr>
+          <m:t>Arrival</m:t>
+        </m:r>
+      </m:oMath>
+      <w:r>
+        <w:rPr>
+          <w:rFonts w:eastAsiaTheme="minorEastAsia"/>
+        </w:rPr>
+        <w:t xml:space="preserve"> y </w:t>
+      </w:r>
+      <m:oMath>
+        <m:r>
+          <w:rPr>
+            <w:rFonts w:ascii="Cambria Math" w:eastAsiaTheme="minorEastAsia" w:hAnsi="Cambria Math"/>
+          </w:rPr>
+          <m:t>Departure</m:t>
+        </m:r>
+      </m:oMath>
+      <w:r>
+        <w:rPr>
+          <w:rFonts w:eastAsiaTheme="minorEastAsia"/>
+        </w:rPr>
+        <w:t xml:space="preserve"> desde dichas instancias, y no desde su abstracción </w:t>
+      </w:r>
+      <m:oMath>
+        <m:r>
+          <w:rPr>
+            <w:rFonts w:ascii="Cambria Math" w:eastAsiaTheme="minorEastAsia" w:hAnsi="Cambria Math"/>
+          </w:rPr>
+          <m:t>Event</m:t>
+        </m:r>
+      </m:oMath>
+      <w:r>
+        <w:rPr>
+          <w:rFonts w:eastAsiaTheme="minorEastAsia"/>
+        </w:rPr>
+        <w:t>,</w:t>
+      </w:r>
+      <w:r>
+        <w:rPr>
+          <w:rFonts w:eastAsiaTheme="minorEastAsia"/>
+        </w:rPr>
+        <w:t xml:space="preserve"> resultando en que esta última no tenga una distribución. Así, si se quisiera añadir otros tipos de eventos</w:t>
+      </w:r>
+      <w:r>
+        <w:rPr>
+          <w:rFonts w:eastAsiaTheme="minorEastAsia"/>
+        </w:rPr>
+        <w:t>, tampoco contendrán una distribución a no ser que explícitamente se le añada una</w:t>
+      </w:r>
+      <w:r>
+        <w:rPr>
+          <w:rFonts w:eastAsiaTheme="minorEastAsia"/>
+        </w:rPr>
+        <w:t>.</w:t>
+      </w:r>
+    </w:p>
+    <w:p>
+      <w:pPr>
+        <w:ind w:left="720"/>
+        <w:rPr>
+          <w:rFonts w:eastAsiaTheme="minorEastAsia"/>
+        </w:rPr>
+      </w:pPr>
+      <w:r>
+        <w:rPr>
+          <w:rFonts w:eastAsiaTheme="minorEastAsia"/>
+        </w:rPr>
+        <w:t xml:space="preserve">Luego, al momento de solucionar este error, encontramos </w:t>
+      </w:r>
+      <w:r>
+        <w:rPr>
+          <w:rFonts w:eastAsiaTheme="minorEastAsia"/>
+        </w:rPr>
+        <w:t>que,</w:t>
+      </w:r>
+      <w:r>
+        <w:rPr>
+          <w:rFonts w:eastAsiaTheme="minorEastAsia"/>
+        </w:rPr>
+        <w:t xml:space="preserve"> </w:t>
+      </w:r>
+      <w:r>
+        <w:rPr>
+          <w:rFonts w:eastAsiaTheme="minorEastAsia"/>
+        </w:rPr>
+        <w:t>para incorporar la distribución de un evento cualquiera, debemos permitir que dicho evento pueda tener varias distribuciones</w:t>
+      </w:r>
+      <w:r>
+        <w:rPr>
+          <w:rFonts w:eastAsiaTheme="minorEastAsia"/>
+        </w:rPr>
+        <w:t xml:space="preserve">, resultando </w:t>
+      </w:r>
+      <m:oMath>
+        <m:r>
+          <w:rPr>
+            <w:rFonts w:ascii="Cambria Math" w:eastAsiaTheme="minorEastAsia" w:hAnsi="Cambria Math"/>
+          </w:rPr>
+          <m:t>DistributionList</m:t>
+        </m:r>
+        <m:r>
+          <w:rPr>
+            <w:rStyle w:val="FootnoteReference"/>
+            <w:rFonts w:ascii="Cambria Math" w:eastAsiaTheme="minorEastAsia" w:hAnsi="Cambria Math"/>
+            <w:i/>
+          </w:rPr>
+          <w:footnoteReference w:id="5"/>
+        </m:r>
+      </m:oMath>
+      <w:r>
+        <w:rPr>
+          <w:rFonts w:eastAsiaTheme="minorEastAsia"/>
+        </w:rPr>
+        <w:t>.</w:t>
+      </w:r>
+    </w:p>
+    <w:p>
+      <w:pPr>
+        <w:ind w:left="720"/>
+        <w:rPr>
+          <w:rFonts w:eastAsiaTheme="minorEastAsia"/>
+        </w:rPr>
+      </w:pPr>
+      <w:r>
+        <w:rPr>
+          <w:rFonts w:eastAsiaTheme="minorEastAsia"/>
+        </w:rPr>
+        <w:t xml:space="preserve">Por último, como hasta el momento solo avalábamos los tipos de eventos </w:t>
+      </w:r>
+      <m:oMath>
+        <m:r>
+          <w:rPr>
+            <w:rFonts w:ascii="Cambria Math" w:eastAsiaTheme="minorEastAsia" w:hAnsi="Cambria Math"/>
+          </w:rPr>
+          <m:t>Arrival</m:t>
+        </m:r>
+      </m:oMath>
+      <w:r>
+        <w:rPr>
+          <w:rFonts w:eastAsiaTheme="minorEastAsia"/>
+        </w:rPr>
+        <w:t xml:space="preserve"> y </w:t>
+      </w:r>
+      <m:oMath>
+        <m:r>
+          <w:rPr>
+            <w:rFonts w:ascii="Cambria Math" w:eastAsiaTheme="minorEastAsia" w:hAnsi="Cambria Math"/>
+          </w:rPr>
+          <m:t>Departure</m:t>
+        </m:r>
+      </m:oMath>
+      <w:r>
+        <w:rPr>
+          <w:rFonts w:eastAsiaTheme="minorEastAsia"/>
+        </w:rPr>
+        <w:t>, recurr</w:t>
+      </w:r>
+      <w:proofErr w:type="spellStart"/>
+      <w:r>
+        <w:rPr>
+          <w:rFonts w:eastAsiaTheme="minorEastAsia"/>
+        </w:rPr>
+        <w:t>imos</w:t>
+      </w:r>
+      <w:proofErr w:type="spellEnd"/>
+      <w:r>
+        <w:rPr>
+          <w:rFonts w:eastAsiaTheme="minorEastAsia"/>
+        </w:rPr>
+        <w:t xml:space="preserve"> de nuevo al patrón de diseño “</w:t>
+      </w:r>
+      <w:proofErr w:type="spellStart"/>
+      <w:r>
+        <w:rPr>
+          <w:rFonts w:eastAsiaTheme="minorEastAsia"/>
+        </w:rPr>
+        <w:t>factory</w:t>
+      </w:r>
+      <w:proofErr w:type="spellEnd"/>
+      <w:r>
+        <w:rPr>
+          <w:rFonts w:eastAsiaTheme="minorEastAsia"/>
+        </w:rPr>
+        <w:t xml:space="preserve">” surgiendo </w:t>
+      </w:r>
+      <m:oMath>
+        <m:r>
+          <w:rPr>
+            <w:rFonts w:ascii="Cambria Math" w:eastAsiaTheme="minorEastAsia" w:hAnsi="Cambria Math"/>
+          </w:rPr>
+          <m:t>EventFactory</m:t>
+        </m:r>
+      </m:oMath>
+      <w:r>
+        <w:rPr>
+          <w:rFonts w:eastAsiaTheme="minorEastAsia"/>
+        </w:rPr>
+        <w:t xml:space="preserve"> </w:t>
+      </w:r>
+      <w:r>
+        <w:rPr>
+          <w:rFonts w:eastAsiaTheme="minorEastAsia"/>
+        </w:rPr>
+        <w:t>e</w:t>
+      </w:r>
+      <w:r>
+        <w:rPr>
+          <w:rFonts w:eastAsiaTheme="minorEastAsia"/>
+        </w:rPr>
+        <w:t xml:space="preserve"> implementación </w:t>
+      </w:r>
+      <m:oMath>
+        <m:r>
+          <w:rPr>
+            <w:rFonts w:ascii="Cambria Math" w:eastAsiaTheme="minorEastAsia" w:hAnsi="Cambria Math"/>
+          </w:rPr>
+          <m:t>ArrivalFactory</m:t>
+        </m:r>
+      </m:oMath>
+      <w:r>
+        <w:rPr>
+          <w:rFonts w:eastAsiaTheme="minorEastAsia"/>
+        </w:rPr>
+        <w:t>.</w:t>
+      </w:r>
+    </w:p>
+    <w:p>
+      <w:pPr>
+        <w:pStyle w:val="ListParagraph"/>
+        <w:numPr>
+          <w:ilvl w:val="0"/>
+          <w:numId w:val="22"/>
+        </w:numPr>
+      </w:pPr>
+      <w:r>
+        <w:lastRenderedPageBreak/>
+        <w:t xml:space="preserve">Para el muestreo de estadísticas correspondiente a la replicación de ejecuciones, se creó </w:t>
+      </w:r>
+      <m:oMath>
+        <m:r>
+          <w:rPr>
+            <w:rFonts w:ascii="Cambria Math" w:hAnsi="Cambria Math"/>
+          </w:rPr>
+          <m:t>StatisticsAnalysis</m:t>
+        </m:r>
+      </m:oMath>
+      <w:r>
+        <w:rPr>
+          <w:rFonts w:eastAsiaTheme="minorEastAsia"/>
+        </w:rPr>
+        <w:t xml:space="preserve">, la cual almacenara en una lista las estadísticas de cada ejecución de la simulación. Esta misma tiene como atributo </w:t>
+      </w:r>
+      <m:oMath>
+        <m:r>
+          <w:rPr>
+            <w:rFonts w:ascii="Cambria Math" w:eastAsiaTheme="minorEastAsia" w:hAnsi="Cambria Math"/>
+          </w:rPr>
+          <m:t>Paramater</m:t>
+        </m:r>
+      </m:oMath>
+      <w:r>
+        <w:rPr>
+          <w:rFonts w:eastAsiaTheme="minorEastAsia"/>
+        </w:rPr>
+        <w:t>, la cual se le especifica una variable de interés y se le proporciona la lista de estadísticas, y ella calcula su intervalo de confianza.</w:t>
+      </w:r>
+      <w:r>
+        <w:rPr>
+          <w:rFonts w:eastAsiaTheme="minorEastAsia"/>
+        </w:rPr>
+        <w:t>\</w:t>
+      </w:r>
+    </w:p>
+    <w:p>
+      <w:pPr>
+        <w:numPr>
+          <w:ilvl w:val="0"/>
+          <w:numId w:val="22"/>
+        </w:numPr>
+      </w:pPr>
+      <w:r>
+        <w:t xml:space="preserve">Para calcular los intervalos de confianza de cada estadística, integramos programación funcional en Java (lambdas y </w:t>
+      </w:r>
+      <w:proofErr w:type="spellStart"/>
+      <w:r>
+        <w:t>streams</w:t>
+      </w:r>
+      <w:proofErr w:type="spellEnd"/>
+      <w:r>
+        <w:t>), lo que mejoró considerablemente la legibilidad, eficiencia y concisión del código. Esta mejora se extendió también a clases de etapas previas, como los Comparators, donde aplicamos funciones lambda para simplificar la lógica de ordenamiento de eventos y selección de servidores</w:t>
+      </w:r>
+      <w:r>
+        <w:t>.</w:t>
+      </w:r>
+    </w:p>
+    <w:p>
+      <w:pPr>
+        <w:numPr>
+          <w:ilvl w:val="0"/>
+          <w:numId w:val="22"/>
+        </w:numPr>
+      </w:pPr>
+      <w:r>
         <w:t xml:space="preserve">Para aplicar una mejora estructural sobre la asignación de servidores, nos basamos en una hipótesis: si al elegir qué servidor asignar se prioriza aquel que se desocupa primero, en lugar de seleccionar simplemente por ID, podríamos equilibrar la carga de trabajo. Para esto, introdujimos el atributo </w:t>
       </w:r>
       <m:oMath>
@@ -5181,105 +6313,1346 @@
         </m:r>
       </m:oMath>
       <w:r>
-        <w:t xml:space="preserve"> en cada Server, lo que nos permitió comparar correctamente los tiempos de liberación. Los resultados posteriores confirmaron nuestra hipótesis, ya que se observó una reducción significativa —aproximadamente del 50%— en el tiempo medio de espera, junto con una equiparación notable en el uso (ocio) y desgaste (durabilidad) de todos los servidores.</w:t>
+        <w:t xml:space="preserve"> en cada Server, lo que nos permitió comparar correctamente los tiempos de liberación. </w:t>
       </w:r>
     </w:p>
     <w:p>
       <w:pPr>
-        <w:numPr>
-          <w:ilvl w:val="0"/>
-          <w:numId w:val="9"/>
-        </w:numPr>
-      </w:pPr>
-      <w:r>
-        <w:t>Para calcular los intervalos de confianza de cada estadística, integramos programación funcional en Java (lambdas y streams), lo que mejoró considerablemente la legibilidad, eficiencia y concisión del código. Esta mejora se extendió también a clases de etapas previas, como los Comparators, donde aplicamos funciones lambda para simplificar la lógica de ordenamiento de eventos y selección de servidores</w:t>
-      </w:r>
-      <w:r>
-        <w:t>.</w:t>
+        <w:pStyle w:val="Heading2"/>
+      </w:pPr>
+      <w:r>
+        <w:t>Implementación de mejora y comparación</w:t>
+      </w:r>
+    </w:p>
+    <w:tbl>
+      <w:tblPr>
+        <w:tblStyle w:val="GridTable5Dark-Accent2"/>
+        <w:tblW w:w="0" w:type="auto"/>
+        <w:tblLook w:val="04A0" w:firstRow="1" w:lastRow="0" w:firstColumn="1" w:lastColumn="0" w:noHBand="0" w:noVBand="1"/>
+      </w:tblPr>
+      <w:tblGrid>
+        <w:gridCol w:w="1651"/>
+        <w:gridCol w:w="2285"/>
+        <w:gridCol w:w="2920"/>
+        <w:gridCol w:w="2386"/>
+      </w:tblGrid>
+      <w:tr>
+        <w:trPr>
+          <w:cnfStyle w:val="100000000000" w:firstRow="1" w:lastRow="0" w:firstColumn="0" w:lastColumn="0" w:oddVBand="0" w:evenVBand="0" w:oddHBand="0" w:evenHBand="0" w:firstRowFirstColumn="0" w:firstRowLastColumn="0" w:lastRowFirstColumn="0" w:lastRowLastColumn="0"/>
+        </w:trPr>
+        <w:tc>
+          <w:tcPr>
+            <w:cnfStyle w:val="001000000000" w:firstRow="0" w:lastRow="0" w:firstColumn="1" w:lastColumn="0" w:oddVBand="0" w:evenVBand="0" w:oddHBand="0" w:evenHBand="0" w:firstRowFirstColumn="0" w:firstRowLastColumn="0" w:lastRowFirstColumn="0" w:lastRowLastColumn="0"/>
+            <w:tcW w:w="0" w:type="auto"/>
+            <w:hideMark/>
+          </w:tcPr>
+          <w:p>
+            <w:pPr>
+              <w:rPr>
+                <w:lang w:val="en-US"/>
+              </w:rPr>
+            </w:pPr>
+            <w:proofErr w:type="spellStart"/>
+            <w:r>
+              <w:rPr>
+                <w:lang w:val="en-US"/>
+              </w:rPr>
+              <w:t>Métrica</w:t>
+            </w:r>
+            <w:proofErr w:type="spellEnd"/>
+          </w:p>
+        </w:tc>
+        <w:tc>
+          <w:tcPr>
+            <w:tcW w:w="0" w:type="auto"/>
+            <w:hideMark/>
+          </w:tcPr>
+          <w:p>
+            <w:pPr>
+              <w:cnfStyle w:val="100000000000" w:firstRow="1" w:lastRow="0" w:firstColumn="0" w:lastColumn="0" w:oddVBand="0" w:evenVBand="0" w:oddHBand="0" w:evenHBand="0" w:firstRowFirstColumn="0" w:firstRowLastColumn="0" w:lastRowFirstColumn="0" w:lastRowLastColumn="0"/>
+              <w:rPr>
+                <w:lang w:val="en-US"/>
+              </w:rPr>
+            </w:pPr>
+            <w:r>
+              <w:rPr>
+                <w:lang w:val="en-US"/>
+              </w:rPr>
+              <w:t xml:space="preserve">Sin </w:t>
+            </w:r>
+            <w:proofErr w:type="spellStart"/>
+            <w:r>
+              <w:rPr>
+                <w:lang w:val="en-US"/>
+              </w:rPr>
+              <w:t>mejoras</w:t>
+            </w:r>
+            <w:proofErr w:type="spellEnd"/>
+          </w:p>
+        </w:tc>
+        <w:tc>
+          <w:tcPr>
+            <w:tcW w:w="0" w:type="auto"/>
+            <w:hideMark/>
+          </w:tcPr>
+          <w:p>
+            <w:pPr>
+              <w:cnfStyle w:val="100000000000" w:firstRow="1" w:lastRow="0" w:firstColumn="0" w:lastColumn="0" w:oddVBand="0" w:evenVBand="0" w:oddHBand="0" w:evenHBand="0" w:firstRowFirstColumn="0" w:firstRowLastColumn="0" w:lastRowFirstColumn="0" w:lastRowLastColumn="0"/>
+              <w:rPr>
+                <w:lang w:val="en-US"/>
+              </w:rPr>
+            </w:pPr>
+            <w:r>
+              <w:rPr>
+                <w:lang w:val="en-US"/>
+              </w:rPr>
+              <w:t xml:space="preserve">Con </w:t>
+            </w:r>
+            <w:proofErr w:type="spellStart"/>
+            <w:r>
+              <w:rPr>
+                <w:lang w:val="en-US"/>
+              </w:rPr>
+              <w:t>mejoras</w:t>
+            </w:r>
+            <w:proofErr w:type="spellEnd"/>
+          </w:p>
+        </w:tc>
+        <w:tc>
+          <w:tcPr>
+            <w:tcW w:w="0" w:type="auto"/>
+            <w:hideMark/>
+          </w:tcPr>
+          <w:p>
+            <w:pPr>
+              <w:cnfStyle w:val="100000000000" w:firstRow="1" w:lastRow="0" w:firstColumn="0" w:lastColumn="0" w:oddVBand="0" w:evenVBand="0" w:oddHBand="0" w:evenHBand="0" w:firstRowFirstColumn="0" w:firstRowLastColumn="0" w:lastRowFirstColumn="0" w:lastRowLastColumn="0"/>
+              <w:rPr>
+                <w:lang w:val="en-US"/>
+              </w:rPr>
+            </w:pPr>
+            <w:proofErr w:type="spellStart"/>
+            <w:r>
+              <w:rPr>
+                <w:lang w:val="en-US"/>
+              </w:rPr>
+              <w:t>Comparación</w:t>
+            </w:r>
+            <w:proofErr w:type="spellEnd"/>
+          </w:p>
+        </w:tc>
+      </w:tr>
+      <w:tr>
+        <w:trPr>
+          <w:cnfStyle w:val="000000100000" w:firstRow="0" w:lastRow="0" w:firstColumn="0" w:lastColumn="0" w:oddVBand="0" w:evenVBand="0" w:oddHBand="1" w:evenHBand="0" w:firstRowFirstColumn="0" w:firstRowLastColumn="0" w:lastRowFirstColumn="0" w:lastRowLastColumn="0"/>
+        </w:trPr>
+        <w:tc>
+          <w:tcPr>
+            <w:cnfStyle w:val="001000000000" w:firstRow="0" w:lastRow="0" w:firstColumn="1" w:lastColumn="0" w:oddVBand="0" w:evenVBand="0" w:oddHBand="0" w:evenHBand="0" w:firstRowFirstColumn="0" w:firstRowLastColumn="0" w:lastRowFirstColumn="0" w:lastRowLastColumn="0"/>
+            <w:tcW w:w="0" w:type="auto"/>
+            <w:hideMark/>
+          </w:tcPr>
+          <w:p>
+            <w:pPr>
+              <w:rPr>
+                <w:lang w:val="en-US"/>
+              </w:rPr>
+            </w:pPr>
+            <w:proofErr w:type="spellStart"/>
+            <w:r>
+              <w:rPr>
+                <w:lang w:val="en-US"/>
+              </w:rPr>
+              <w:t>Tránsito</w:t>
+            </w:r>
+            <w:proofErr w:type="spellEnd"/>
+            <w:r>
+              <w:rPr>
+                <w:lang w:val="en-US"/>
+              </w:rPr>
+              <w:t xml:space="preserve"> </w:t>
+            </w:r>
+            <w:proofErr w:type="spellStart"/>
+            <w:r>
+              <w:rPr>
+                <w:lang w:val="en-US"/>
+              </w:rPr>
+              <w:t>máx</w:t>
+            </w:r>
+            <w:proofErr w:type="spellEnd"/>
+            <w:r>
+              <w:rPr>
+                <w:lang w:val="en-US"/>
+              </w:rPr>
+              <w:t>.</w:t>
+            </w:r>
+          </w:p>
+        </w:tc>
+        <w:tc>
+          <w:tcPr>
+            <w:tcW w:w="0" w:type="auto"/>
+            <w:hideMark/>
+          </w:tcPr>
+          <w:p>
+            <w:pPr>
+              <w:jc w:val="left"/>
+              <w:cnfStyle w:val="000000100000" w:firstRow="0" w:lastRow="0" w:firstColumn="0" w:lastColumn="0" w:oddVBand="0" w:evenVBand="0" w:oddHBand="1" w:evenHBand="0" w:firstRowFirstColumn="0" w:firstRowLastColumn="0" w:lastRowFirstColumn="0" w:lastRowLastColumn="0"/>
+              <w:rPr>
+                <w:rFonts w:ascii="Cambria Math" w:hAnsi="Cambria Math"/>
+                <w:lang w:val="en-US"/>
+                <w:oMath/>
+              </w:rPr>
+            </w:pPr>
+            <m:oMathPara>
+              <m:oMath>
+                <m:r>
+                  <w:rPr>
+                    <w:rFonts w:ascii="Cambria Math" w:hAnsi="Cambria Math"/>
+                    <w:lang w:val="en-US"/>
+                  </w:rPr>
+                  <m:t>[66.83; 68.81]</m:t>
+                </m:r>
+              </m:oMath>
+            </m:oMathPara>
+          </w:p>
+        </w:tc>
+        <w:tc>
+          <w:tcPr>
+            <w:tcW w:w="0" w:type="auto"/>
+            <w:hideMark/>
+          </w:tcPr>
+          <w:p>
+            <w:pPr>
+              <w:jc w:val="left"/>
+              <w:cnfStyle w:val="000000100000" w:firstRow="0" w:lastRow="0" w:firstColumn="0" w:lastColumn="0" w:oddVBand="0" w:evenVBand="0" w:oddHBand="1" w:evenHBand="0" w:firstRowFirstColumn="0" w:firstRowLastColumn="0" w:lastRowFirstColumn="0" w:lastRowLastColumn="0"/>
+              <w:rPr>
+                <w:rFonts w:ascii="Cambria Math" w:hAnsi="Cambria Math"/>
+                <w:lang w:val="en-US"/>
+                <w:oMath/>
+              </w:rPr>
+            </w:pPr>
+            <m:oMathPara>
+              <m:oMath>
+                <m:r>
+                  <w:rPr>
+                    <w:rFonts w:ascii="Cambria Math" w:hAnsi="Cambria Math"/>
+                    <w:lang w:val="en-US"/>
+                  </w:rPr>
+                  <m:t>[53.33; 55.32]</m:t>
+                </m:r>
+              </m:oMath>
+            </m:oMathPara>
+          </w:p>
+        </w:tc>
+        <w:tc>
+          <w:tcPr>
+            <w:tcW w:w="0" w:type="auto"/>
+            <w:hideMark/>
+          </w:tcPr>
+          <w:p>
+            <w:pPr>
+              <w:cnfStyle w:val="000000100000" w:firstRow="0" w:lastRow="0" w:firstColumn="0" w:lastColumn="0" w:oddVBand="0" w:evenVBand="0" w:oddHBand="1" w:evenHBand="0" w:firstRowFirstColumn="0" w:firstRowLastColumn="0" w:lastRowFirstColumn="0" w:lastRowLastColumn="0"/>
+              <w:rPr>
+                <w:lang w:val="en-US"/>
+              </w:rPr>
+            </w:pPr>
+            <w:r>
+              <w:rPr>
+                <w:lang w:val="en-US"/>
+              </w:rPr>
+              <w:t>M</w:t>
+            </w:r>
+            <w:r>
+              <w:rPr>
+                <w:lang w:val="en-US"/>
+              </w:rPr>
+              <w:t xml:space="preserve">enor </w:t>
+            </w:r>
+            <w:proofErr w:type="spellStart"/>
+            <w:r>
+              <w:rPr>
+                <w:lang w:val="en-US"/>
+              </w:rPr>
+              <w:t>congestión</w:t>
+            </w:r>
+            <w:proofErr w:type="spellEnd"/>
+          </w:p>
+        </w:tc>
+      </w:tr>
+      <w:tr>
+        <w:tc>
+          <w:tcPr>
+            <w:cnfStyle w:val="001000000000" w:firstRow="0" w:lastRow="0" w:firstColumn="1" w:lastColumn="0" w:oddVBand="0" w:evenVBand="0" w:oddHBand="0" w:evenHBand="0" w:firstRowFirstColumn="0" w:firstRowLastColumn="0" w:lastRowFirstColumn="0" w:lastRowLastColumn="0"/>
+            <w:tcW w:w="0" w:type="auto"/>
+            <w:hideMark/>
+          </w:tcPr>
+          <w:p>
+            <w:pPr>
+              <w:rPr>
+                <w:lang w:val="en-US"/>
+              </w:rPr>
+            </w:pPr>
+            <w:proofErr w:type="spellStart"/>
+            <w:r>
+              <w:rPr>
+                <w:lang w:val="en-US"/>
+              </w:rPr>
+              <w:t>Tránsito</w:t>
+            </w:r>
+            <w:proofErr w:type="spellEnd"/>
+            <w:r>
+              <w:rPr>
+                <w:lang w:val="en-US"/>
+              </w:rPr>
+              <w:t xml:space="preserve"> medio</w:t>
+            </w:r>
+          </w:p>
+        </w:tc>
+        <w:tc>
+          <w:tcPr>
+            <w:tcW w:w="0" w:type="auto"/>
+            <w:hideMark/>
+          </w:tcPr>
+          <w:p>
+            <w:pPr>
+              <w:jc w:val="left"/>
+              <w:cnfStyle w:val="000000000000" w:firstRow="0" w:lastRow="0" w:firstColumn="0" w:lastColumn="0" w:oddVBand="0" w:evenVBand="0" w:oddHBand="0" w:evenHBand="0" w:firstRowFirstColumn="0" w:firstRowLastColumn="0" w:lastRowFirstColumn="0" w:lastRowLastColumn="0"/>
+              <w:rPr>
+                <w:rFonts w:ascii="Cambria Math" w:hAnsi="Cambria Math"/>
+                <w:lang w:val="en-US"/>
+                <w:oMath/>
+              </w:rPr>
+            </w:pPr>
+            <m:oMathPara>
+              <m:oMath>
+                <m:r>
+                  <w:rPr>
+                    <w:rFonts w:ascii="Cambria Math" w:hAnsi="Cambria Math"/>
+                    <w:lang w:val="en-US"/>
+                  </w:rPr>
+                  <m:t>[28.54; 28.62]</m:t>
+                </m:r>
+              </m:oMath>
+            </m:oMathPara>
+          </w:p>
+        </w:tc>
+        <w:tc>
+          <w:tcPr>
+            <w:tcW w:w="0" w:type="auto"/>
+            <w:hideMark/>
+          </w:tcPr>
+          <w:p>
+            <w:pPr>
+              <w:jc w:val="left"/>
+              <w:cnfStyle w:val="000000000000" w:firstRow="0" w:lastRow="0" w:firstColumn="0" w:lastColumn="0" w:oddVBand="0" w:evenVBand="0" w:oddHBand="0" w:evenHBand="0" w:firstRowFirstColumn="0" w:firstRowLastColumn="0" w:lastRowFirstColumn="0" w:lastRowLastColumn="0"/>
+              <w:rPr>
+                <w:rFonts w:ascii="Cambria Math" w:hAnsi="Cambria Math"/>
+                <w:lang w:val="en-US"/>
+                <w:oMath/>
+              </w:rPr>
+            </w:pPr>
+            <m:oMathPara>
+              <m:oMath>
+                <m:r>
+                  <w:rPr>
+                    <w:rFonts w:ascii="Cambria Math" w:hAnsi="Cambria Math"/>
+                    <w:lang w:val="en-US"/>
+                  </w:rPr>
+                  <m:t>[28.27; 28.34]</m:t>
+                </m:r>
+              </m:oMath>
+            </m:oMathPara>
+          </w:p>
+        </w:tc>
+        <w:tc>
+          <w:tcPr>
+            <w:tcW w:w="0" w:type="auto"/>
+            <w:hideMark/>
+          </w:tcPr>
+          <w:p>
+            <w:pPr>
+              <w:cnfStyle w:val="000000000000" w:firstRow="0" w:lastRow="0" w:firstColumn="0" w:lastColumn="0" w:oddVBand="0" w:evenVBand="0" w:oddHBand="0" w:evenHBand="0" w:firstRowFirstColumn="0" w:firstRowLastColumn="0" w:lastRowFirstColumn="0" w:lastRowLastColumn="0"/>
+              <w:rPr>
+                <w:lang w:val="en-US"/>
+              </w:rPr>
+            </w:pPr>
+            <w:r>
+              <w:rPr>
+                <w:lang w:val="en-US"/>
+              </w:rPr>
+              <w:t>S</w:t>
+            </w:r>
+            <w:proofErr w:type="spellStart"/>
+            <w:r>
+              <w:rPr>
+                <w:lang w:val="en-US"/>
+              </w:rPr>
+              <w:t>imilar</w:t>
+            </w:r>
+            <w:proofErr w:type="spellEnd"/>
+          </w:p>
+        </w:tc>
+      </w:tr>
+      <w:tr>
+        <w:trPr>
+          <w:cnfStyle w:val="000000100000" w:firstRow="0" w:lastRow="0" w:firstColumn="0" w:lastColumn="0" w:oddVBand="0" w:evenVBand="0" w:oddHBand="1" w:evenHBand="0" w:firstRowFirstColumn="0" w:firstRowLastColumn="0" w:lastRowFirstColumn="0" w:lastRowLastColumn="0"/>
+        </w:trPr>
+        <w:tc>
+          <w:tcPr>
+            <w:cnfStyle w:val="001000000000" w:firstRow="0" w:lastRow="0" w:firstColumn="1" w:lastColumn="0" w:oddVBand="0" w:evenVBand="0" w:oddHBand="0" w:evenHBand="0" w:firstRowFirstColumn="0" w:firstRowLastColumn="0" w:lastRowFirstColumn="0" w:lastRowLastColumn="0"/>
+            <w:tcW w:w="0" w:type="auto"/>
+            <w:hideMark/>
+          </w:tcPr>
+          <w:p>
+            <w:pPr>
+              <w:rPr>
+                <w:lang w:val="en-US"/>
+              </w:rPr>
+            </w:pPr>
+            <w:proofErr w:type="spellStart"/>
+            <w:r>
+              <w:rPr>
+                <w:lang w:val="en-US"/>
+              </w:rPr>
+              <w:t>Tránsito</w:t>
+            </w:r>
+            <w:proofErr w:type="spellEnd"/>
+            <w:r>
+              <w:rPr>
+                <w:lang w:val="en-US"/>
+              </w:rPr>
+              <w:t xml:space="preserve"> </w:t>
+            </w:r>
+            <w:proofErr w:type="spellStart"/>
+            <w:r>
+              <w:rPr>
+                <w:lang w:val="en-US"/>
+              </w:rPr>
+              <w:t>mín</w:t>
+            </w:r>
+            <w:proofErr w:type="spellEnd"/>
+            <w:r>
+              <w:rPr>
+                <w:lang w:val="en-US"/>
+              </w:rPr>
+              <w:t>.</w:t>
+            </w:r>
+          </w:p>
+        </w:tc>
+        <w:tc>
+          <w:tcPr>
+            <w:tcW w:w="0" w:type="auto"/>
+            <w:hideMark/>
+          </w:tcPr>
+          <w:p>
+            <w:pPr>
+              <w:jc w:val="left"/>
+              <w:cnfStyle w:val="000000100000" w:firstRow="0" w:lastRow="0" w:firstColumn="0" w:lastColumn="0" w:oddVBand="0" w:evenVBand="0" w:oddHBand="1" w:evenHBand="0" w:firstRowFirstColumn="0" w:firstRowLastColumn="0" w:lastRowFirstColumn="0" w:lastRowLastColumn="0"/>
+              <w:rPr>
+                <w:rFonts w:ascii="Cambria Math" w:hAnsi="Cambria Math"/>
+                <w:lang w:val="en-US"/>
+                <w:oMath/>
+              </w:rPr>
+            </w:pPr>
+            <m:oMathPara>
+              <m:oMath>
+                <m:r>
+                  <w:rPr>
+                    <w:rFonts w:ascii="Cambria Math" w:hAnsi="Cambria Math"/>
+                    <w:lang w:val="en-US"/>
+                  </w:rPr>
+                  <m:t>[18.01; 18.03]</m:t>
+                </m:r>
+              </m:oMath>
+            </m:oMathPara>
+          </w:p>
+        </w:tc>
+        <w:tc>
+          <w:tcPr>
+            <w:tcW w:w="0" w:type="auto"/>
+            <w:hideMark/>
+          </w:tcPr>
+          <w:p>
+            <w:pPr>
+              <w:jc w:val="left"/>
+              <w:cnfStyle w:val="000000100000" w:firstRow="0" w:lastRow="0" w:firstColumn="0" w:lastColumn="0" w:oddVBand="0" w:evenVBand="0" w:oddHBand="1" w:evenHBand="0" w:firstRowFirstColumn="0" w:firstRowLastColumn="0" w:lastRowFirstColumn="0" w:lastRowLastColumn="0"/>
+              <w:rPr>
+                <w:rFonts w:ascii="Cambria Math" w:hAnsi="Cambria Math"/>
+                <w:lang w:val="en-US"/>
+                <w:oMath/>
+              </w:rPr>
+            </w:pPr>
+            <m:oMathPara>
+              <m:oMath>
+                <m:r>
+                  <w:rPr>
+                    <w:rFonts w:ascii="Cambria Math" w:hAnsi="Cambria Math"/>
+                    <w:lang w:val="en-US"/>
+                  </w:rPr>
+                  <m:t>[18.01; 18.02]</m:t>
+                </m:r>
+              </m:oMath>
+            </m:oMathPara>
+          </w:p>
+        </w:tc>
+        <w:tc>
+          <w:tcPr>
+            <w:tcW w:w="0" w:type="auto"/>
+            <w:hideMark/>
+          </w:tcPr>
+          <w:p>
+            <w:pPr>
+              <w:cnfStyle w:val="000000100000" w:firstRow="0" w:lastRow="0" w:firstColumn="0" w:lastColumn="0" w:oddVBand="0" w:evenVBand="0" w:oddHBand="1" w:evenHBand="0" w:firstRowFirstColumn="0" w:firstRowLastColumn="0" w:lastRowFirstColumn="0" w:lastRowLastColumn="0"/>
+              <w:rPr>
+                <w:lang w:val="en-US"/>
+              </w:rPr>
+            </w:pPr>
+            <w:r>
+              <w:rPr>
+                <w:lang w:val="en-US"/>
+              </w:rPr>
+              <w:t>I</w:t>
+            </w:r>
+            <w:proofErr w:type="spellStart"/>
+            <w:r>
+              <w:rPr>
+                <w:lang w:val="en-US"/>
+              </w:rPr>
+              <w:t>gual</w:t>
+            </w:r>
+            <w:proofErr w:type="spellEnd"/>
+          </w:p>
+        </w:tc>
+      </w:tr>
+      <w:tr>
+        <w:tc>
+          <w:tcPr>
+            <w:cnfStyle w:val="001000000000" w:firstRow="0" w:lastRow="0" w:firstColumn="1" w:lastColumn="0" w:oddVBand="0" w:evenVBand="0" w:oddHBand="0" w:evenHBand="0" w:firstRowFirstColumn="0" w:firstRowLastColumn="0" w:lastRowFirstColumn="0" w:lastRowLastColumn="0"/>
+            <w:tcW w:w="0" w:type="auto"/>
+            <w:hideMark/>
+          </w:tcPr>
+          <w:p>
+            <w:pPr>
+              <w:rPr>
+                <w:lang w:val="en-US"/>
+              </w:rPr>
+            </w:pPr>
+            <w:proofErr w:type="spellStart"/>
+            <w:r>
+              <w:rPr>
+                <w:lang w:val="en-US"/>
+              </w:rPr>
+              <w:t>Espera</w:t>
+            </w:r>
+            <w:proofErr w:type="spellEnd"/>
+            <w:r>
+              <w:rPr>
+                <w:lang w:val="en-US"/>
+              </w:rPr>
+              <w:t xml:space="preserve"> </w:t>
+            </w:r>
+            <w:proofErr w:type="spellStart"/>
+            <w:r>
+              <w:rPr>
+                <w:lang w:val="en-US"/>
+              </w:rPr>
+              <w:t>máx</w:t>
+            </w:r>
+            <w:proofErr w:type="spellEnd"/>
+            <w:r>
+              <w:rPr>
+                <w:lang w:val="en-US"/>
+              </w:rPr>
+              <w:t>.</w:t>
+            </w:r>
+          </w:p>
+        </w:tc>
+        <w:tc>
+          <w:tcPr>
+            <w:tcW w:w="0" w:type="auto"/>
+            <w:hideMark/>
+          </w:tcPr>
+          <w:p>
+            <w:pPr>
+              <w:jc w:val="left"/>
+              <w:cnfStyle w:val="000000000000" w:firstRow="0" w:lastRow="0" w:firstColumn="0" w:lastColumn="0" w:oddVBand="0" w:evenVBand="0" w:oddHBand="0" w:evenHBand="0" w:firstRowFirstColumn="0" w:firstRowLastColumn="0" w:lastRowFirstColumn="0" w:lastRowLastColumn="0"/>
+              <w:rPr>
+                <w:rFonts w:ascii="Cambria Math" w:hAnsi="Cambria Math"/>
+                <w:lang w:val="en-US"/>
+                <w:oMath/>
+              </w:rPr>
+            </w:pPr>
+            <m:oMathPara>
+              <m:oMath>
+                <m:r>
+                  <w:rPr>
+                    <w:rFonts w:ascii="Cambria Math" w:hAnsi="Cambria Math"/>
+                    <w:lang w:val="en-US"/>
+                  </w:rPr>
+                  <m:t>[34.75; 36.74]</m:t>
+                </m:r>
+              </m:oMath>
+            </m:oMathPara>
+          </w:p>
+        </w:tc>
+        <w:tc>
+          <w:tcPr>
+            <w:tcW w:w="0" w:type="auto"/>
+            <w:hideMark/>
+          </w:tcPr>
+          <w:p>
+            <w:pPr>
+              <w:jc w:val="left"/>
+              <w:cnfStyle w:val="000000000000" w:firstRow="0" w:lastRow="0" w:firstColumn="0" w:lastColumn="0" w:oddVBand="0" w:evenVBand="0" w:oddHBand="0" w:evenHBand="0" w:firstRowFirstColumn="0" w:firstRowLastColumn="0" w:lastRowFirstColumn="0" w:lastRowLastColumn="0"/>
+              <w:rPr>
+                <w:rFonts w:ascii="Cambria Math" w:hAnsi="Cambria Math"/>
+                <w:lang w:val="en-US"/>
+                <w:oMath/>
+              </w:rPr>
+            </w:pPr>
+            <m:oMathPara>
+              <m:oMath>
+                <m:r>
+                  <w:rPr>
+                    <w:rFonts w:ascii="Cambria Math" w:hAnsi="Cambria Math"/>
+                    <w:lang w:val="en-US"/>
+                  </w:rPr>
+                  <m:t>[20.71; 23.40]</m:t>
+                </m:r>
+              </m:oMath>
+            </m:oMathPara>
+          </w:p>
+        </w:tc>
+        <w:tc>
+          <w:tcPr>
+            <w:tcW w:w="0" w:type="auto"/>
+            <w:hideMark/>
+          </w:tcPr>
+          <w:p>
+            <w:pPr>
+              <w:cnfStyle w:val="000000000000" w:firstRow="0" w:lastRow="0" w:firstColumn="0" w:lastColumn="0" w:oddVBand="0" w:evenVBand="0" w:oddHBand="0" w:evenHBand="0" w:firstRowFirstColumn="0" w:firstRowLastColumn="0" w:lastRowFirstColumn="0" w:lastRowLastColumn="0"/>
+              <w:rPr>
+                <w:lang w:val="en-US"/>
+              </w:rPr>
+            </w:pPr>
+            <w:r>
+              <w:rPr>
+                <w:lang w:val="en-US"/>
+              </w:rPr>
+              <w:t>S</w:t>
+            </w:r>
+            <w:proofErr w:type="spellStart"/>
+            <w:r>
+              <w:rPr>
+                <w:lang w:val="en-US"/>
+              </w:rPr>
+              <w:t>ignificativamente</w:t>
+            </w:r>
+            <w:proofErr w:type="spellEnd"/>
+          </w:p>
+        </w:tc>
+      </w:tr>
+      <w:tr>
+        <w:trPr>
+          <w:cnfStyle w:val="000000100000" w:firstRow="0" w:lastRow="0" w:firstColumn="0" w:lastColumn="0" w:oddVBand="0" w:evenVBand="0" w:oddHBand="1" w:evenHBand="0" w:firstRowFirstColumn="0" w:firstRowLastColumn="0" w:lastRowFirstColumn="0" w:lastRowLastColumn="0"/>
+        </w:trPr>
+        <w:tc>
+          <w:tcPr>
+            <w:cnfStyle w:val="001000000000" w:firstRow="0" w:lastRow="0" w:firstColumn="1" w:lastColumn="0" w:oddVBand="0" w:evenVBand="0" w:oddHBand="0" w:evenHBand="0" w:firstRowFirstColumn="0" w:firstRowLastColumn="0" w:lastRowFirstColumn="0" w:lastRowLastColumn="0"/>
+            <w:tcW w:w="0" w:type="auto"/>
+            <w:hideMark/>
+          </w:tcPr>
+          <w:p>
+            <w:pPr>
+              <w:rPr>
+                <w:lang w:val="en-US"/>
+              </w:rPr>
+            </w:pPr>
+            <w:proofErr w:type="spellStart"/>
+            <w:r>
+              <w:rPr>
+                <w:lang w:val="en-US"/>
+              </w:rPr>
+              <w:t>Espera</w:t>
+            </w:r>
+            <w:proofErr w:type="spellEnd"/>
+            <w:r>
+              <w:rPr>
+                <w:lang w:val="en-US"/>
+              </w:rPr>
+              <w:t xml:space="preserve"> media</w:t>
+            </w:r>
+          </w:p>
+        </w:tc>
+        <w:tc>
+          <w:tcPr>
+            <w:tcW w:w="0" w:type="auto"/>
+            <w:hideMark/>
+          </w:tcPr>
+          <w:p>
+            <w:pPr>
+              <w:jc w:val="left"/>
+              <w:cnfStyle w:val="000000100000" w:firstRow="0" w:lastRow="0" w:firstColumn="0" w:lastColumn="0" w:oddVBand="0" w:evenVBand="0" w:oddHBand="1" w:evenHBand="0" w:firstRowFirstColumn="0" w:firstRowLastColumn="0" w:lastRowFirstColumn="0" w:lastRowLastColumn="0"/>
+              <w:rPr>
+                <w:rFonts w:ascii="Cambria Math" w:hAnsi="Cambria Math"/>
+                <w:lang w:val="en-US"/>
+                <w:oMath/>
+              </w:rPr>
+            </w:pPr>
+            <m:oMathPara>
+              <m:oMath>
+                <m:r>
+                  <w:rPr>
+                    <w:rFonts w:ascii="Cambria Math" w:hAnsi="Cambria Math"/>
+                    <w:lang w:val="en-US"/>
+                  </w:rPr>
+                  <m:t>[0.49; 0.54]</m:t>
+                </m:r>
+              </m:oMath>
+            </m:oMathPara>
+          </w:p>
+        </w:tc>
+        <w:tc>
+          <w:tcPr>
+            <w:tcW w:w="0" w:type="auto"/>
+            <w:hideMark/>
+          </w:tcPr>
+          <w:p>
+            <w:pPr>
+              <w:jc w:val="left"/>
+              <w:cnfStyle w:val="000000100000" w:firstRow="0" w:lastRow="0" w:firstColumn="0" w:lastColumn="0" w:oddVBand="0" w:evenVBand="0" w:oddHBand="1" w:evenHBand="0" w:firstRowFirstColumn="0" w:firstRowLastColumn="0" w:lastRowFirstColumn="0" w:lastRowLastColumn="0"/>
+              <w:rPr>
+                <w:rFonts w:ascii="Cambria Math" w:hAnsi="Cambria Math"/>
+                <w:lang w:val="en-US"/>
+                <w:oMath/>
+              </w:rPr>
+            </w:pPr>
+            <m:oMathPara>
+              <m:oMath>
+                <m:r>
+                  <w:rPr>
+                    <w:rFonts w:ascii="Cambria Math" w:hAnsi="Cambria Math"/>
+                    <w:lang w:val="en-US"/>
+                  </w:rPr>
+                  <m:t>[0.25; 0.28]</m:t>
+                </m:r>
+              </m:oMath>
+            </m:oMathPara>
+          </w:p>
+        </w:tc>
+        <w:tc>
+          <w:tcPr>
+            <w:tcW w:w="0" w:type="auto"/>
+            <w:hideMark/>
+          </w:tcPr>
+          <w:p>
+            <w:pPr>
+              <w:cnfStyle w:val="000000100000" w:firstRow="0" w:lastRow="0" w:firstColumn="0" w:lastColumn="0" w:oddVBand="0" w:evenVBand="0" w:oddHBand="1" w:evenHBand="0" w:firstRowFirstColumn="0" w:firstRowLastColumn="0" w:lastRowFirstColumn="0" w:lastRowLastColumn="0"/>
+              <w:rPr>
+                <w:lang w:val="en-US"/>
+              </w:rPr>
+            </w:pPr>
+            <w:r>
+              <w:rPr>
+                <w:lang w:val="en-US"/>
+              </w:rPr>
+              <w:t>Menor</w:t>
+            </w:r>
+            <w:r>
+              <w:rPr>
+                <w:lang w:val="en-US"/>
+              </w:rPr>
+              <w:t xml:space="preserve"> 50% </w:t>
+            </w:r>
+            <w:proofErr w:type="spellStart"/>
+            <w:r>
+              <w:rPr>
+                <w:lang w:val="en-US"/>
+              </w:rPr>
+              <w:t>aprox</w:t>
+            </w:r>
+            <w:proofErr w:type="spellEnd"/>
+            <w:r>
+              <w:rPr>
+                <w:lang w:val="en-US"/>
+              </w:rPr>
+              <w:t>.</w:t>
+            </w:r>
+          </w:p>
+        </w:tc>
+      </w:tr>
+      <w:tr>
+        <w:tc>
+          <w:tcPr>
+            <w:cnfStyle w:val="001000000000" w:firstRow="0" w:lastRow="0" w:firstColumn="1" w:lastColumn="0" w:oddVBand="0" w:evenVBand="0" w:oddHBand="0" w:evenHBand="0" w:firstRowFirstColumn="0" w:firstRowLastColumn="0" w:lastRowFirstColumn="0" w:lastRowLastColumn="0"/>
+            <w:tcW w:w="0" w:type="auto"/>
+            <w:hideMark/>
+          </w:tcPr>
+          <w:p>
+            <w:pPr>
+              <w:rPr>
+                <w:lang w:val="en-US"/>
+              </w:rPr>
+            </w:pPr>
+            <w:proofErr w:type="spellStart"/>
+            <w:r>
+              <w:rPr>
+                <w:lang w:val="en-US"/>
+              </w:rPr>
+              <w:t>Espera</w:t>
+            </w:r>
+            <w:proofErr w:type="spellEnd"/>
+            <w:r>
+              <w:rPr>
+                <w:lang w:val="en-US"/>
+              </w:rPr>
+              <w:t xml:space="preserve"> </w:t>
+            </w:r>
+            <w:proofErr w:type="spellStart"/>
+            <w:r>
+              <w:rPr>
+                <w:lang w:val="en-US"/>
+              </w:rPr>
+              <w:t>mín</w:t>
+            </w:r>
+            <w:proofErr w:type="spellEnd"/>
+            <w:r>
+              <w:rPr>
+                <w:lang w:val="en-US"/>
+              </w:rPr>
+              <w:t>.</w:t>
+            </w:r>
+          </w:p>
+        </w:tc>
+        <w:tc>
+          <w:tcPr>
+            <w:tcW w:w="0" w:type="auto"/>
+            <w:hideMark/>
+          </w:tcPr>
+          <w:p>
+            <w:pPr>
+              <w:jc w:val="left"/>
+              <w:cnfStyle w:val="000000000000" w:firstRow="0" w:lastRow="0" w:firstColumn="0" w:lastColumn="0" w:oddVBand="0" w:evenVBand="0" w:oddHBand="0" w:evenHBand="0" w:firstRowFirstColumn="0" w:firstRowLastColumn="0" w:lastRowFirstColumn="0" w:lastRowLastColumn="0"/>
+              <w:rPr>
+                <w:rFonts w:ascii="Cambria Math" w:hAnsi="Cambria Math"/>
+                <w:lang w:val="en-US"/>
+                <w:oMath/>
+              </w:rPr>
+            </w:pPr>
+            <m:oMathPara>
+              <m:oMath>
+                <m:r>
+                  <w:rPr>
+                    <w:rFonts w:ascii="Cambria Math" w:hAnsi="Cambria Math"/>
+                    <w:lang w:val="en-US"/>
+                  </w:rPr>
+                  <m:t>[0.16; 0.28]</m:t>
+                </m:r>
+              </m:oMath>
+            </m:oMathPara>
+          </w:p>
+        </w:tc>
+        <w:tc>
+          <w:tcPr>
+            <w:tcW w:w="0" w:type="auto"/>
+            <w:hideMark/>
+          </w:tcPr>
+          <w:p>
+            <w:pPr>
+              <w:jc w:val="left"/>
+              <w:cnfStyle w:val="000000000000" w:firstRow="0" w:lastRow="0" w:firstColumn="0" w:lastColumn="0" w:oddVBand="0" w:evenVBand="0" w:oddHBand="0" w:evenHBand="0" w:firstRowFirstColumn="0" w:firstRowLastColumn="0" w:lastRowFirstColumn="0" w:lastRowLastColumn="0"/>
+              <w:rPr>
+                <w:rFonts w:ascii="Cambria Math" w:hAnsi="Cambria Math"/>
+                <w:lang w:val="en-US"/>
+                <w:oMath/>
+              </w:rPr>
+            </w:pPr>
+            <m:oMathPara>
+              <m:oMath>
+                <m:r>
+                  <w:rPr>
+                    <w:rFonts w:ascii="Cambria Math" w:hAnsi="Cambria Math"/>
+                    <w:lang w:val="en-US"/>
+                  </w:rPr>
+                  <m:t>[0.04; 0.07]</m:t>
+                </m:r>
+              </m:oMath>
+            </m:oMathPara>
+          </w:p>
+        </w:tc>
+        <w:tc>
+          <w:tcPr>
+            <w:tcW w:w="0" w:type="auto"/>
+            <w:hideMark/>
+          </w:tcPr>
+          <w:p>
+            <w:pPr>
+              <w:cnfStyle w:val="000000000000" w:firstRow="0" w:lastRow="0" w:firstColumn="0" w:lastColumn="0" w:oddVBand="0" w:evenVBand="0" w:oddHBand="0" w:evenHBand="0" w:firstRowFirstColumn="0" w:firstRowLastColumn="0" w:lastRowFirstColumn="0" w:lastRowLastColumn="0"/>
+              <w:rPr>
+                <w:lang w:val="en-US"/>
+              </w:rPr>
+            </w:pPr>
+            <w:r>
+              <w:rPr>
+                <w:lang w:val="en-US"/>
+              </w:rPr>
+              <w:t>M</w:t>
+            </w:r>
+            <w:proofErr w:type="spellStart"/>
+            <w:r>
+              <w:rPr>
+                <w:lang w:val="en-US"/>
+              </w:rPr>
+              <w:t>ás</w:t>
+            </w:r>
+            <w:proofErr w:type="spellEnd"/>
+            <w:r>
+              <w:rPr>
+                <w:lang w:val="en-US"/>
+              </w:rPr>
+              <w:t xml:space="preserve"> </w:t>
+            </w:r>
+            <w:proofErr w:type="spellStart"/>
+            <w:r>
+              <w:rPr>
+                <w:lang w:val="en-US"/>
+              </w:rPr>
+              <w:t>eficiente</w:t>
+            </w:r>
+            <w:proofErr w:type="spellEnd"/>
+          </w:p>
+        </w:tc>
+      </w:tr>
+      <w:tr>
+        <w:trPr>
+          <w:cnfStyle w:val="000000100000" w:firstRow="0" w:lastRow="0" w:firstColumn="0" w:lastColumn="0" w:oddVBand="0" w:evenVBand="0" w:oddHBand="1" w:evenHBand="0" w:firstRowFirstColumn="0" w:firstRowLastColumn="0" w:lastRowFirstColumn="0" w:lastRowLastColumn="0"/>
+        </w:trPr>
+        <w:tc>
+          <w:tcPr>
+            <w:cnfStyle w:val="001000000000" w:firstRow="0" w:lastRow="0" w:firstColumn="1" w:lastColumn="0" w:oddVBand="0" w:evenVBand="0" w:oddHBand="0" w:evenHBand="0" w:firstRowFirstColumn="0" w:firstRowLastColumn="0" w:lastRowFirstColumn="0" w:lastRowLastColumn="0"/>
+            <w:tcW w:w="0" w:type="auto"/>
+            <w:hideMark/>
+          </w:tcPr>
+          <w:p>
+            <w:pPr>
+              <w:rPr>
+                <w:lang w:val="en-US"/>
+              </w:rPr>
+            </w:pPr>
+            <w:proofErr w:type="spellStart"/>
+            <w:r>
+              <w:rPr>
+                <w:lang w:val="en-US"/>
+              </w:rPr>
+              <w:t>Durabilidad</w:t>
+            </w:r>
+            <w:proofErr w:type="spellEnd"/>
+            <w:r>
+              <w:rPr>
+                <w:lang w:val="en-US"/>
+              </w:rPr>
+              <w:t xml:space="preserve"> total</w:t>
+            </w:r>
+          </w:p>
+        </w:tc>
+        <w:tc>
+          <w:tcPr>
+            <w:tcW w:w="0" w:type="auto"/>
+            <w:hideMark/>
+          </w:tcPr>
+          <w:p>
+            <w:pPr>
+              <w:jc w:val="left"/>
+              <w:cnfStyle w:val="000000100000" w:firstRow="0" w:lastRow="0" w:firstColumn="0" w:lastColumn="0" w:oddVBand="0" w:evenVBand="0" w:oddHBand="1" w:evenHBand="0" w:firstRowFirstColumn="0" w:firstRowLastColumn="0" w:lastRowFirstColumn="0" w:lastRowLastColumn="0"/>
+              <w:rPr>
+                <w:lang w:val="es-ES"/>
+              </w:rPr>
+            </w:pPr>
+            <w:r>
+              <w:rPr>
+                <w:lang w:val="es-ES"/>
+              </w:rPr>
+              <w:t>N</w:t>
+            </w:r>
+            <w:r>
+              <w:rPr>
+                <w:lang w:val="es-ES"/>
+              </w:rPr>
+              <w:t xml:space="preserve">egativa y excesiva en </w:t>
+            </w:r>
+            <m:oMath>
+              <m:sSub>
+                <m:sSubPr>
+                  <m:ctrlPr>
+                    <w:rPr>
+                      <w:rFonts w:ascii="Cambria Math" w:hAnsi="Cambria Math"/>
+                      <w:i/>
+                      <w:lang w:val="es-ES"/>
+                    </w:rPr>
+                  </m:ctrlPr>
+                </m:sSubPr>
+                <m:e>
+                  <m:r>
+                    <w:rPr>
+                      <w:rFonts w:ascii="Cambria Math" w:hAnsi="Cambria Math"/>
+                      <w:lang w:val="es-ES"/>
+                    </w:rPr>
+                    <m:t>S</m:t>
+                  </m:r>
+                </m:e>
+                <m:sub>
+                  <m:r>
+                    <w:rPr>
+                      <w:rFonts w:ascii="Cambria Math" w:hAnsi="Cambria Math"/>
+                      <w:lang w:val="es-ES"/>
+                    </w:rPr>
+                    <m:t>1</m:t>
+                  </m:r>
+                </m:sub>
+              </m:sSub>
+            </m:oMath>
+            <w:r>
+              <w:rPr>
+                <w:lang w:val="es-ES"/>
+              </w:rPr>
+              <w:t xml:space="preserve"> y </w:t>
+            </w:r>
+            <m:oMath>
+              <m:sSub>
+                <m:sSubPr>
+                  <m:ctrlPr>
+                    <w:rPr>
+                      <w:rFonts w:ascii="Cambria Math" w:hAnsi="Cambria Math"/>
+                      <w:i/>
+                      <w:lang w:val="es-ES"/>
+                    </w:rPr>
+                  </m:ctrlPr>
+                </m:sSubPr>
+                <m:e>
+                  <m:r>
+                    <w:rPr>
+                      <w:rFonts w:ascii="Cambria Math" w:hAnsi="Cambria Math"/>
+                      <w:lang w:val="es-ES"/>
+                    </w:rPr>
+                    <m:t>S</m:t>
+                  </m:r>
+                </m:e>
+                <m:sub>
+                  <m:r>
+                    <w:rPr>
+                      <w:rFonts w:ascii="Cambria Math" w:hAnsi="Cambria Math"/>
+                      <w:lang w:val="es-ES"/>
+                    </w:rPr>
+                    <m:t>2</m:t>
+                  </m:r>
+                </m:sub>
+              </m:sSub>
+            </m:oMath>
+          </w:p>
+        </w:tc>
+        <w:tc>
+          <w:tcPr>
+            <w:tcW w:w="0" w:type="auto"/>
+            <w:hideMark/>
+          </w:tcPr>
+          <w:p>
+            <w:pPr>
+              <w:jc w:val="left"/>
+              <w:cnfStyle w:val="000000100000" w:firstRow="0" w:lastRow="0" w:firstColumn="0" w:lastColumn="0" w:oddVBand="0" w:evenVBand="0" w:oddHBand="1" w:evenHBand="0" w:firstRowFirstColumn="0" w:firstRowLastColumn="0" w:lastRowFirstColumn="0" w:lastRowLastColumn="0"/>
+              <w:rPr>
+                <w:lang w:val="es-ES"/>
+              </w:rPr>
+            </w:pPr>
+            <w:r>
+              <w:rPr>
+                <w:lang w:val="es-ES"/>
+              </w:rPr>
+              <w:t xml:space="preserve">Uniforme </w:t>
+            </w:r>
+            <m:oMath>
+              <m:r>
+                <w:rPr>
+                  <w:rFonts w:ascii="Cambria Math" w:hAnsi="Cambria Math"/>
+                  <w:lang w:val="es-ES"/>
+                </w:rPr>
+                <m:t>(~300</m:t>
+              </m:r>
+            </m:oMath>
+            <w:r>
+              <w:rPr>
+                <w:lang w:val="es-ES"/>
+              </w:rPr>
+              <w:t xml:space="preserve"> para todos los servidores)</w:t>
+            </w:r>
+          </w:p>
+        </w:tc>
+        <w:tc>
+          <w:tcPr>
+            <w:tcW w:w="0" w:type="auto"/>
+            <w:hideMark/>
+          </w:tcPr>
+          <w:p>
+            <w:pPr>
+              <w:cnfStyle w:val="000000100000" w:firstRow="0" w:lastRow="0" w:firstColumn="0" w:lastColumn="0" w:oddVBand="0" w:evenVBand="0" w:oddHBand="1" w:evenHBand="0" w:firstRowFirstColumn="0" w:firstRowLastColumn="0" w:lastRowFirstColumn="0" w:lastRowLastColumn="0"/>
+              <w:rPr>
+                <w:lang w:val="en-US"/>
+              </w:rPr>
+            </w:pPr>
+            <w:proofErr w:type="spellStart"/>
+            <w:r>
+              <w:rPr>
+                <w:lang w:val="en-US"/>
+              </w:rPr>
+              <w:t>D</w:t>
+            </w:r>
+            <w:r>
+              <w:rPr>
+                <w:lang w:val="en-US"/>
+              </w:rPr>
+              <w:t>istribución</w:t>
+            </w:r>
+            <w:proofErr w:type="spellEnd"/>
+            <w:r>
+              <w:rPr>
+                <w:lang w:val="en-US"/>
+              </w:rPr>
+              <w:t xml:space="preserve"> </w:t>
+            </w:r>
+            <w:proofErr w:type="spellStart"/>
+            <w:r>
+              <w:rPr>
+                <w:lang w:val="en-US"/>
+              </w:rPr>
+              <w:t>equilibrada</w:t>
+            </w:r>
+            <w:proofErr w:type="spellEnd"/>
+          </w:p>
+        </w:tc>
+      </w:tr>
+      <w:tr>
+        <w:tc>
+          <w:tcPr>
+            <w:cnfStyle w:val="001000000000" w:firstRow="0" w:lastRow="0" w:firstColumn="1" w:lastColumn="0" w:oddVBand="0" w:evenVBand="0" w:oddHBand="0" w:evenHBand="0" w:firstRowFirstColumn="0" w:firstRowLastColumn="0" w:lastRowFirstColumn="0" w:lastRowLastColumn="0"/>
+            <w:tcW w:w="0" w:type="auto"/>
+            <w:hideMark/>
+          </w:tcPr>
+          <w:p>
+            <w:pPr>
+              <w:rPr>
+                <w:lang w:val="en-US"/>
+              </w:rPr>
+            </w:pPr>
+            <w:proofErr w:type="spellStart"/>
+            <w:r>
+              <w:rPr>
+                <w:lang w:val="en-US"/>
+              </w:rPr>
+              <w:t>Ocio</w:t>
+            </w:r>
+            <w:proofErr w:type="spellEnd"/>
+            <w:r>
+              <w:rPr>
+                <w:lang w:val="en-US"/>
+              </w:rPr>
+              <w:t xml:space="preserve"> total</w:t>
+            </w:r>
+          </w:p>
+        </w:tc>
+        <w:tc>
+          <w:tcPr>
+            <w:tcW w:w="0" w:type="auto"/>
+            <w:hideMark/>
+          </w:tcPr>
+          <w:p>
+            <w:pPr>
+              <w:jc w:val="left"/>
+              <w:cnfStyle w:val="000000000000" w:firstRow="0" w:lastRow="0" w:firstColumn="0" w:lastColumn="0" w:oddVBand="0" w:evenVBand="0" w:oddHBand="0" w:evenHBand="0" w:firstRowFirstColumn="0" w:firstRowLastColumn="0" w:lastRowFirstColumn="0" w:lastRowLastColumn="0"/>
+              <w:rPr>
+                <w:lang w:val="en-US"/>
+              </w:rPr>
+            </w:pPr>
+            <w:r>
+              <w:rPr>
+                <w:lang w:val="en-US"/>
+              </w:rPr>
+              <w:t xml:space="preserve">Variable (de </w:t>
+            </w:r>
+            <m:oMath>
+              <m:r>
+                <w:rPr>
+                  <w:rFonts w:ascii="Cambria Math" w:hAnsi="Cambria Math"/>
+                  <w:lang w:val="en-US"/>
+                </w:rPr>
+                <m:t>~0.26</m:t>
+              </m:r>
+            </m:oMath>
+            <w:r>
+              <w:rPr>
+                <w:lang w:val="en-US"/>
+              </w:rPr>
+              <w:t xml:space="preserve"> a </w:t>
+            </w:r>
+            <m:oMath>
+              <m:r>
+                <w:rPr>
+                  <w:rFonts w:ascii="Cambria Math" w:hAnsi="Cambria Math"/>
+                  <w:lang w:val="en-US"/>
+                </w:rPr>
+                <m:t>~3.6</m:t>
+              </m:r>
+            </m:oMath>
+            <w:r>
+              <w:rPr>
+                <w:lang w:val="en-US"/>
+              </w:rPr>
+              <w:t>)</w:t>
+            </w:r>
+          </w:p>
+        </w:tc>
+        <w:tc>
+          <w:tcPr>
+            <w:tcW w:w="0" w:type="auto"/>
+            <w:hideMark/>
+          </w:tcPr>
+          <w:p>
+            <w:pPr>
+              <w:jc w:val="left"/>
+              <w:cnfStyle w:val="000000000000" w:firstRow="0" w:lastRow="0" w:firstColumn="0" w:lastColumn="0" w:oddVBand="0" w:evenVBand="0" w:oddHBand="0" w:evenHBand="0" w:firstRowFirstColumn="0" w:firstRowLastColumn="0" w:lastRowFirstColumn="0" w:lastRowLastColumn="0"/>
+              <w:rPr>
+                <w:lang w:val="en-US"/>
+              </w:rPr>
+            </w:pPr>
+            <w:proofErr w:type="spellStart"/>
+            <w:r>
+              <w:rPr>
+                <w:lang w:val="en-US"/>
+              </w:rPr>
+              <w:t>Homogéneo</w:t>
+            </w:r>
+            <w:proofErr w:type="spellEnd"/>
+            <w:r>
+              <w:rPr>
+                <w:lang w:val="en-US"/>
+              </w:rPr>
+              <w:t xml:space="preserve"> (</w:t>
+            </w:r>
+            <m:oMath>
+              <m:r>
+                <w:rPr>
+                  <w:rFonts w:ascii="Cambria Math" w:hAnsi="Cambria Math"/>
+                  <w:lang w:val="en-US"/>
+                </w:rPr>
+                <m:t>~0.45</m:t>
+              </m:r>
+            </m:oMath>
+            <w:r>
+              <w:rPr>
+                <w:lang w:val="en-US"/>
+              </w:rPr>
+              <w:t xml:space="preserve"> a </w:t>
+            </w:r>
+            <m:oMath>
+              <m:r>
+                <w:rPr>
+                  <w:rFonts w:ascii="Cambria Math" w:hAnsi="Cambria Math"/>
+                  <w:lang w:val="en-US"/>
+                </w:rPr>
+                <m:t>~0.50</m:t>
+              </m:r>
+            </m:oMath>
+            <w:r>
+              <w:rPr>
+                <w:lang w:val="en-US"/>
+              </w:rPr>
+              <w:t>)</w:t>
+            </w:r>
+          </w:p>
+        </w:tc>
+        <w:tc>
+          <w:tcPr>
+            <w:tcW w:w="0" w:type="auto"/>
+            <w:hideMark/>
+          </w:tcPr>
+          <w:p>
+            <w:pPr>
+              <w:cnfStyle w:val="000000000000" w:firstRow="0" w:lastRow="0" w:firstColumn="0" w:lastColumn="0" w:oddVBand="0" w:evenVBand="0" w:oddHBand="0" w:evenHBand="0" w:firstRowFirstColumn="0" w:firstRowLastColumn="0" w:lastRowFirstColumn="0" w:lastRowLastColumn="0"/>
+              <w:rPr>
+                <w:lang w:val="en-US"/>
+              </w:rPr>
+            </w:pPr>
+            <w:proofErr w:type="spellStart"/>
+            <w:r>
+              <w:rPr>
+                <w:lang w:val="en-US"/>
+              </w:rPr>
+              <w:t>M</w:t>
+            </w:r>
+            <w:r>
+              <w:rPr>
+                <w:lang w:val="en-US"/>
+              </w:rPr>
+              <w:t>ejor</w:t>
+            </w:r>
+            <w:proofErr w:type="spellEnd"/>
+            <w:r>
+              <w:rPr>
+                <w:lang w:val="en-US"/>
+              </w:rPr>
+              <w:t xml:space="preserve"> </w:t>
+            </w:r>
+            <w:proofErr w:type="spellStart"/>
+            <w:r>
+              <w:rPr>
+                <w:lang w:val="en-US"/>
+              </w:rPr>
+              <w:t>distribución</w:t>
+            </w:r>
+            <w:proofErr w:type="spellEnd"/>
+            <w:r>
+              <w:rPr>
+                <w:lang w:val="en-US"/>
+              </w:rPr>
+              <w:t xml:space="preserve"> de carga</w:t>
+            </w:r>
+          </w:p>
+        </w:tc>
+      </w:tr>
+    </w:tbl>
+    <w:p>
+      <w:pPr>
+        <w:spacing w:before="240"/>
+      </w:pPr>
+      <w:r>
+        <w:t>Los resultados posteriores confirmaron nuestra hipótesis, ya que se observó una reducción significativa —aproximadamente del 50%— en el tiempo medio de espera, junto con una equiparación notable en el uso (ocio) y desgaste (durabilidad) de todos los servidores.</w:t>
       </w:r>
     </w:p>
     <w:p>
       <w:r>
-        <w:t>Agregar :</w:t>
+        <w:pict w14:anchorId="129B3349">
+          <v:rect id="_x0000_i1043" style="width:0;height:1.5pt" o:hralign="center" o:hrstd="t" o:hr="t" fillcolor="#a0a0a0" stroked="f"/>
+        </w:pict>
       </w:r>
     </w:p>
     <w:p>
       <w:pPr>
-        <w:pStyle w:val="ListParagraph"/>
-        <w:numPr>
-          <w:ilvl w:val="0"/>
-          <w:numId w:val="15"/>
-        </w:numPr>
-      </w:pPr>
-      <w:r>
-        <w:t>Distribution List , DistributionAccumulator</w:t>
+        <w:pStyle w:val="Heading2"/>
+      </w:pPr>
+      <w:r>
+        <w:lastRenderedPageBreak/>
+        <w:t>Testing</w:t>
       </w:r>
     </w:p>
     <w:p>
-      <w:pPr>
-        <w:pStyle w:val="ListParagraph"/>
-        <w:numPr>
-          <w:ilvl w:val="0"/>
-          <w:numId w:val="15"/>
-        </w:numPr>
-      </w:pPr>
-      <w:r>
-        <w:lastRenderedPageBreak/>
-        <w:t>EventFactory (razón)</w:t>
+      <w:r>
+        <w:t xml:space="preserve">Dados que los resultados (estadísticas) en esta instancia de la simulación dependen completamente de las etapas anteriores, </w:t>
+      </w:r>
+      <w:r>
+        <w:t>y no consideramos necesario verificar otras clases, no se han añadido nuevos test.</w:t>
       </w:r>
     </w:p>
     <w:p>
-      <w:pPr>
-        <w:pStyle w:val="ListParagraph"/>
-        <w:numPr>
-          <w:ilvl w:val="0"/>
-          <w:numId w:val="15"/>
-        </w:numPr>
-      </w:pPr>
-      <w:r>
-        <w:t>Parameter, StatisticsAnalysis</w:t>
-      </w:r>
-    </w:p>
-    <w:p>
-      <w:pPr>
-        <w:pStyle w:val="ListParagraph"/>
-        <w:numPr>
-          <w:ilvl w:val="0"/>
-          <w:numId w:val="15"/>
-        </w:numPr>
-      </w:pPr>
-      <w:r>
-        <w:t>Mostrar comparación, y mejora</w:t>
-      </w:r>
-    </w:p>
-    <w:p>
-      <w:pPr>
-        <w:pStyle w:val="ListParagraph"/>
-        <w:numPr>
-          <w:ilvl w:val="0"/>
-          <w:numId w:val="15"/>
-        </w:numPr>
-      </w:pPr>
-      <w:r>
-        <w:t>Etapa 2: configuración para que una entidad no espere mas de dos horas</w:t>
-      </w:r>
-    </w:p>
-    <w:p>
-      <w:pPr>
-        <w:pStyle w:val="ListParagraph"/>
-        <w:numPr>
-          <w:ilvl w:val="0"/>
-          <w:numId w:val="15"/>
-        </w:numPr>
-      </w:pPr>
-      <w:r>
-        <w:t>Etapa 1: tests</w:t>
-      </w:r>
-    </w:p>
-    <w:p>
       <w:r>
         <w:pict w14:anchorId="0594FD9A">
-          <v:rect id="_x0000_i1035" style="width:0;height:1.5pt" o:hralign="center" o:hrstd="t" o:hr="t" fillcolor="#a0a0a0" stroked="f"/>
+          <v:rect id="_x0000_i1036" style="width:0;height:1.5pt" o:hralign="center" o:hrstd="t" o:hr="t" fillcolor="#a0a0a0" stroked="f"/>
         </w:pict>
       </w:r>
     </w:p>
@@ -5394,7 +7767,7 @@
               </w:tblPr>
               <w:tblGrid>
                 <w:gridCol w:w="345"/>
-                <w:gridCol w:w="8681"/>
+                <w:gridCol w:w="8771"/>
               </w:tblGrid>
               <w:tr>
                 <w:trPr>
@@ -5891,9 +8264,6 @@
         </w:rPr>
         <w:footnoteRef/>
       </w:r>
-      <w:r>
-        <w:t xml:space="preserve"> </w:t>
-      </w:r>
       <m:oMath>
         <m:r>
           <w:rPr>
@@ -5970,6 +8340,70 @@
           <w:rFonts w:eastAsiaTheme="minorEastAsia"/>
         </w:rPr>
         <w:t xml:space="preserve"> se encarga de permitir la creación de clases que implementan distribuciones dinámicas.</w:t>
+      </w:r>
+    </w:p>
+  </w:footnote>
+  <w:footnote w:id="5">
+    <w:p>
+      <w:pPr>
+        <w:pStyle w:val="FootnoteText"/>
+        <w:rPr>
+          <w:lang w:val="es-ES"/>
+        </w:rPr>
+      </w:pPr>
+      <w:r>
+        <w:rPr>
+          <w:rStyle w:val="FootnoteReference"/>
+        </w:rPr>
+        <w:footnoteRef/>
+      </w:r>
+      <w:r>
+        <w:t xml:space="preserve"> </w:t>
+      </w:r>
+      <w:r>
+        <w:rPr>
+          <w:lang w:val="es-ES"/>
+        </w:rPr>
+        <w:t xml:space="preserve">Se renombró </w:t>
+      </w:r>
+      <m:oMath>
+        <m:r>
+          <w:rPr>
+            <w:rFonts w:ascii="Cambria Math" w:hAnsi="Cambria Math"/>
+            <w:lang w:val="es-ES"/>
+          </w:rPr>
+          <m:t>DistributionList</m:t>
+        </m:r>
+      </m:oMath>
+      <w:r>
+        <w:rPr>
+          <w:rFonts w:eastAsiaTheme="minorEastAsia"/>
+          <w:lang w:val="es-ES"/>
+        </w:rPr>
+        <w:t xml:space="preserve"> de la etapa anterior a </w:t>
+      </w:r>
+      <m:oMath>
+        <m:r>
+          <w:rPr>
+            <w:rFonts w:ascii="Cambria Math" w:eastAsiaTheme="minorEastAsia" w:hAnsi="Cambria Math"/>
+            <w:lang w:val="es-ES"/>
+          </w:rPr>
+          <m:t>DistributionAccumulator</m:t>
+        </m:r>
+      </m:oMath>
+      <w:r>
+        <w:rPr>
+          <w:rFonts w:eastAsiaTheme="minorEastAsia"/>
+          <w:lang w:val="es-ES"/>
+        </w:rPr>
+        <w:t>, ya que consideramos mejor esa correspondencia de nombres</w:t>
+      </w:r>
+      <w:r>
+        <w:rPr>
+          <w:rFonts w:eastAsiaTheme="minorEastAsia"/>
+          <w:lang w:val="es-ES"/>
+        </w:rPr>
+        <w:t>.</w:t>
       </w:r>
     </w:p>
   </w:footnote>
@@ -6143,6 +8577,345 @@
     </w:lvl>
   </w:abstractNum>
   <w:abstractNum w:abstractNumId="1" w15:restartNumberingAfterBreak="0">
+    <w:nsid w:val="17054100"/>
+    <w:multiLevelType w:val="hybridMultilevel"/>
+    <w:tmpl w:val="C024D5F8"/>
+    <w:lvl w:ilvl="0" w:tplc="04090001">
+      <w:start w:val="1"/>
+      <w:numFmt w:val="bullet"/>
+      <w:lvlText w:val=""/>
+      <w:lvlJc w:val="left"/>
+      <w:pPr>
+        <w:ind w:left="720" w:hanging="360"/>
+      </w:pPr>
+      <w:rPr>
+        <w:rFonts w:ascii="Symbol" w:hAnsi="Symbol" w:hint="default"/>
+      </w:rPr>
+    </w:lvl>
+    <w:lvl w:ilvl="1" w:tplc="04090003" w:tentative="1">
+      <w:start w:val="1"/>
+      <w:numFmt w:val="bullet"/>
+      <w:lvlText w:val="o"/>
+      <w:lvlJc w:val="left"/>
+      <w:pPr>
+        <w:ind w:left="1440" w:hanging="360"/>
+      </w:pPr>
+      <w:rPr>
+        <w:rFonts w:ascii="Courier New" w:hAnsi="Courier New" w:cs="Courier New" w:hint="default"/>
+      </w:rPr>
+    </w:lvl>
+    <w:lvl w:ilvl="2" w:tplc="04090005" w:tentative="1">
+      <w:start w:val="1"/>
+      <w:numFmt w:val="bullet"/>
+      <w:lvlText w:val=""/>
+      <w:lvlJc w:val="left"/>
+      <w:pPr>
+        <w:ind w:left="2160" w:hanging="360"/>
+      </w:pPr>
+      <w:rPr>
+        <w:rFonts w:ascii="Wingdings" w:hAnsi="Wingdings" w:hint="default"/>
+      </w:rPr>
+    </w:lvl>
+    <w:lvl w:ilvl="3" w:tplc="04090001" w:tentative="1">
+      <w:start w:val="1"/>
+      <w:numFmt w:val="bullet"/>
+      <w:lvlText w:val=""/>
+      <w:lvlJc w:val="left"/>
+      <w:pPr>
+        <w:ind w:left="2880" w:hanging="360"/>
+      </w:pPr>
+      <w:rPr>
+        <w:rFonts w:ascii="Symbol" w:hAnsi="Symbol" w:hint="default"/>
+      </w:rPr>
+    </w:lvl>
+    <w:lvl w:ilvl="4" w:tplc="04090003" w:tentative="1">
+      <w:start w:val="1"/>
+      <w:numFmt w:val="bullet"/>
+      <w:lvlText w:val="o"/>
+      <w:lvlJc w:val="left"/>
+      <w:pPr>
+        <w:ind w:left="3600" w:hanging="360"/>
+      </w:pPr>
+      <w:rPr>
+        <w:rFonts w:ascii="Courier New" w:hAnsi="Courier New" w:cs="Courier New" w:hint="default"/>
+      </w:rPr>
+    </w:lvl>
+    <w:lvl w:ilvl="5" w:tplc="04090005" w:tentative="1">
+      <w:start w:val="1"/>
+      <w:numFmt w:val="bullet"/>
+      <w:lvlText w:val=""/>
+      <w:lvlJc w:val="left"/>
+      <w:pPr>
+        <w:ind w:left="4320" w:hanging="360"/>
+      </w:pPr>
+      <w:rPr>
+        <w:rFonts w:ascii="Wingdings" w:hAnsi="Wingdings" w:hint="default"/>
+      </w:rPr>
+    </w:lvl>
+    <w:lvl w:ilvl="6" w:tplc="04090001" w:tentative="1">
+      <w:start w:val="1"/>
+      <w:numFmt w:val="bullet"/>
+      <w:lvlText w:val=""/>
+      <w:lvlJc w:val="left"/>
+      <w:pPr>
+        <w:ind w:left="5040" w:hanging="360"/>
+      </w:pPr>
+      <w:rPr>
+        <w:rFonts w:ascii="Symbol" w:hAnsi="Symbol" w:hint="default"/>
+      </w:rPr>
+    </w:lvl>
+    <w:lvl w:ilvl="7" w:tplc="04090003" w:tentative="1">
+      <w:start w:val="1"/>
+      <w:numFmt w:val="bullet"/>
+      <w:lvlText w:val="o"/>
+      <w:lvlJc w:val="left"/>
+      <w:pPr>
+        <w:ind w:left="5760" w:hanging="360"/>
+      </w:pPr>
+      <w:rPr>
+        <w:rFonts w:ascii="Courier New" w:hAnsi="Courier New" w:cs="Courier New" w:hint="default"/>
+      </w:rPr>
+    </w:lvl>
+    <w:lvl w:ilvl="8" w:tplc="04090005" w:tentative="1">
+      <w:start w:val="1"/>
+      <w:numFmt w:val="bullet"/>
+      <w:lvlText w:val=""/>
+      <w:lvlJc w:val="left"/>
+      <w:pPr>
+        <w:ind w:left="6480" w:hanging="360"/>
+      </w:pPr>
+      <w:rPr>
+        <w:rFonts w:ascii="Wingdings" w:hAnsi="Wingdings" w:hint="default"/>
+      </w:rPr>
+    </w:lvl>
+  </w:abstractNum>
+  <w:abstractNum w:abstractNumId="2" w15:restartNumberingAfterBreak="0">
+    <w:nsid w:val="1FB923FE"/>
+    <w:multiLevelType w:val="hybridMultilevel"/>
+    <w:tmpl w:val="0994C4AA"/>
+    <w:lvl w:ilvl="0" w:tplc="04090001">
+      <w:start w:val="1"/>
+      <w:numFmt w:val="bullet"/>
+      <w:lvlText w:val=""/>
+      <w:lvlJc w:val="left"/>
+      <w:pPr>
+        <w:ind w:left="720" w:hanging="360"/>
+      </w:pPr>
+      <w:rPr>
+        <w:rFonts w:ascii="Symbol" w:hAnsi="Symbol" w:hint="default"/>
+      </w:rPr>
+    </w:lvl>
+    <w:lvl w:ilvl="1" w:tplc="04090003" w:tentative="1">
+      <w:start w:val="1"/>
+      <w:numFmt w:val="bullet"/>
+      <w:lvlText w:val="o"/>
+      <w:lvlJc w:val="left"/>
+      <w:pPr>
+        <w:ind w:left="1440" w:hanging="360"/>
+      </w:pPr>
+      <w:rPr>
+        <w:rFonts w:ascii="Courier New" w:hAnsi="Courier New" w:cs="Courier New" w:hint="default"/>
+      </w:rPr>
+    </w:lvl>
+    <w:lvl w:ilvl="2" w:tplc="04090005" w:tentative="1">
+      <w:start w:val="1"/>
+      <w:numFmt w:val="bullet"/>
+      <w:lvlText w:val=""/>
+      <w:lvlJc w:val="left"/>
+      <w:pPr>
+        <w:ind w:left="2160" w:hanging="360"/>
+      </w:pPr>
+      <w:rPr>
+        <w:rFonts w:ascii="Wingdings" w:hAnsi="Wingdings" w:hint="default"/>
+      </w:rPr>
+    </w:lvl>
+    <w:lvl w:ilvl="3" w:tplc="04090001" w:tentative="1">
+      <w:start w:val="1"/>
+      <w:numFmt w:val="bullet"/>
+      <w:lvlText w:val=""/>
+      <w:lvlJc w:val="left"/>
+      <w:pPr>
+        <w:ind w:left="2880" w:hanging="360"/>
+      </w:pPr>
+      <w:rPr>
+        <w:rFonts w:ascii="Symbol" w:hAnsi="Symbol" w:hint="default"/>
+      </w:rPr>
+    </w:lvl>
+    <w:lvl w:ilvl="4" w:tplc="04090003" w:tentative="1">
+      <w:start w:val="1"/>
+      <w:numFmt w:val="bullet"/>
+      <w:lvlText w:val="o"/>
+      <w:lvlJc w:val="left"/>
+      <w:pPr>
+        <w:ind w:left="3600" w:hanging="360"/>
+      </w:pPr>
+      <w:rPr>
+        <w:rFonts w:ascii="Courier New" w:hAnsi="Courier New" w:cs="Courier New" w:hint="default"/>
+      </w:rPr>
+    </w:lvl>
+    <w:lvl w:ilvl="5" w:tplc="04090005" w:tentative="1">
+      <w:start w:val="1"/>
+      <w:numFmt w:val="bullet"/>
+      <w:lvlText w:val=""/>
+      <w:lvlJc w:val="left"/>
+      <w:pPr>
+        <w:ind w:left="4320" w:hanging="360"/>
+      </w:pPr>
+      <w:rPr>
+        <w:rFonts w:ascii="Wingdings" w:hAnsi="Wingdings" w:hint="default"/>
+      </w:rPr>
+    </w:lvl>
+    <w:lvl w:ilvl="6" w:tplc="04090001" w:tentative="1">
+      <w:start w:val="1"/>
+      <w:numFmt w:val="bullet"/>
+      <w:lvlText w:val=""/>
+      <w:lvlJc w:val="left"/>
+      <w:pPr>
+        <w:ind w:left="5040" w:hanging="360"/>
+      </w:pPr>
+      <w:rPr>
+        <w:rFonts w:ascii="Symbol" w:hAnsi="Symbol" w:hint="default"/>
+      </w:rPr>
+    </w:lvl>
+    <w:lvl w:ilvl="7" w:tplc="04090003" w:tentative="1">
+      <w:start w:val="1"/>
+      <w:numFmt w:val="bullet"/>
+      <w:lvlText w:val="o"/>
+      <w:lvlJc w:val="left"/>
+      <w:pPr>
+        <w:ind w:left="5760" w:hanging="360"/>
+      </w:pPr>
+      <w:rPr>
+        <w:rFonts w:ascii="Courier New" w:hAnsi="Courier New" w:cs="Courier New" w:hint="default"/>
+      </w:rPr>
+    </w:lvl>
+    <w:lvl w:ilvl="8" w:tplc="04090005" w:tentative="1">
+      <w:start w:val="1"/>
+      <w:numFmt w:val="bullet"/>
+      <w:lvlText w:val=""/>
+      <w:lvlJc w:val="left"/>
+      <w:pPr>
+        <w:ind w:left="6480" w:hanging="360"/>
+      </w:pPr>
+      <w:rPr>
+        <w:rFonts w:ascii="Wingdings" w:hAnsi="Wingdings" w:hint="default"/>
+      </w:rPr>
+    </w:lvl>
+  </w:abstractNum>
+  <w:abstractNum w:abstractNumId="3" w15:restartNumberingAfterBreak="0">
+    <w:nsid w:val="239A161E"/>
+    <w:multiLevelType w:val="hybridMultilevel"/>
+    <w:tmpl w:val="22927FCA"/>
+    <w:lvl w:ilvl="0" w:tplc="04090001">
+      <w:start w:val="1"/>
+      <w:numFmt w:val="bullet"/>
+      <w:lvlText w:val=""/>
+      <w:lvlJc w:val="left"/>
+      <w:pPr>
+        <w:ind w:left="720" w:hanging="360"/>
+      </w:pPr>
+      <w:rPr>
+        <w:rFonts w:ascii="Symbol" w:hAnsi="Symbol" w:hint="default"/>
+      </w:rPr>
+    </w:lvl>
+    <w:lvl w:ilvl="1" w:tplc="04090003" w:tentative="1">
+      <w:start w:val="1"/>
+      <w:numFmt w:val="bullet"/>
+      <w:lvlText w:val="o"/>
+      <w:lvlJc w:val="left"/>
+      <w:pPr>
+        <w:ind w:left="1440" w:hanging="360"/>
+      </w:pPr>
+      <w:rPr>
+        <w:rFonts w:ascii="Courier New" w:hAnsi="Courier New" w:cs="Courier New" w:hint="default"/>
+      </w:rPr>
+    </w:lvl>
+    <w:lvl w:ilvl="2" w:tplc="04090005" w:tentative="1">
+      <w:start w:val="1"/>
+      <w:numFmt w:val="bullet"/>
+      <w:lvlText w:val=""/>
+      <w:lvlJc w:val="left"/>
+      <w:pPr>
+        <w:ind w:left="2160" w:hanging="360"/>
+      </w:pPr>
+      <w:rPr>
+        <w:rFonts w:ascii="Wingdings" w:hAnsi="Wingdings" w:hint="default"/>
+      </w:rPr>
+    </w:lvl>
+    <w:lvl w:ilvl="3" w:tplc="04090001" w:tentative="1">
+      <w:start w:val="1"/>
+      <w:numFmt w:val="bullet"/>
+      <w:lvlText w:val=""/>
+      <w:lvlJc w:val="left"/>
+      <w:pPr>
+        <w:ind w:left="2880" w:hanging="360"/>
+      </w:pPr>
+      <w:rPr>
+        <w:rFonts w:ascii="Symbol" w:hAnsi="Symbol" w:hint="default"/>
+      </w:rPr>
+    </w:lvl>
+    <w:lvl w:ilvl="4" w:tplc="04090003" w:tentative="1">
+      <w:start w:val="1"/>
+      <w:numFmt w:val="bullet"/>
+      <w:lvlText w:val="o"/>
+      <w:lvlJc w:val="left"/>
+      <w:pPr>
+        <w:ind w:left="3600" w:hanging="360"/>
+      </w:pPr>
+      <w:rPr>
+        <w:rFonts w:ascii="Courier New" w:hAnsi="Courier New" w:cs="Courier New" w:hint="default"/>
+      </w:rPr>
+    </w:lvl>
+    <w:lvl w:ilvl="5" w:tplc="04090005" w:tentative="1">
+      <w:start w:val="1"/>
+      <w:numFmt w:val="bullet"/>
+      <w:lvlText w:val=""/>
+      <w:lvlJc w:val="left"/>
+      <w:pPr>
+        <w:ind w:left="4320" w:hanging="360"/>
+      </w:pPr>
+      <w:rPr>
+        <w:rFonts w:ascii="Wingdings" w:hAnsi="Wingdings" w:hint="default"/>
+      </w:rPr>
+    </w:lvl>
+    <w:lvl w:ilvl="6" w:tplc="04090001" w:tentative="1">
+      <w:start w:val="1"/>
+      <w:numFmt w:val="bullet"/>
+      <w:lvlText w:val=""/>
+      <w:lvlJc w:val="left"/>
+      <w:pPr>
+        <w:ind w:left="5040" w:hanging="360"/>
+      </w:pPr>
+      <w:rPr>
+        <w:rFonts w:ascii="Symbol" w:hAnsi="Symbol" w:hint="default"/>
+      </w:rPr>
+    </w:lvl>
+    <w:lvl w:ilvl="7" w:tplc="04090003" w:tentative="1">
+      <w:start w:val="1"/>
+      <w:numFmt w:val="bullet"/>
+      <w:lvlText w:val="o"/>
+      <w:lvlJc w:val="left"/>
+      <w:pPr>
+        <w:ind w:left="5760" w:hanging="360"/>
+      </w:pPr>
+      <w:rPr>
+        <w:rFonts w:ascii="Courier New" w:hAnsi="Courier New" w:cs="Courier New" w:hint="default"/>
+      </w:rPr>
+    </w:lvl>
+    <w:lvl w:ilvl="8" w:tplc="04090005" w:tentative="1">
+      <w:start w:val="1"/>
+      <w:numFmt w:val="bullet"/>
+      <w:lvlText w:val=""/>
+      <w:lvlJc w:val="left"/>
+      <w:pPr>
+        <w:ind w:left="6480" w:hanging="360"/>
+      </w:pPr>
+      <w:rPr>
+        <w:rFonts w:ascii="Wingdings" w:hAnsi="Wingdings" w:hint="default"/>
+      </w:rPr>
+    </w:lvl>
+  </w:abstractNum>
+  <w:abstractNum w:abstractNumId="4" w15:restartNumberingAfterBreak="0">
     <w:nsid w:val="2DED2162"/>
     <w:multiLevelType w:val="multilevel"/>
     <w:tmpl w:val="A8AEB5D6"/>
@@ -6263,7 +9036,7 @@
       </w:pPr>
     </w:lvl>
   </w:abstractNum>
-  <w:abstractNum w:abstractNumId="2" w15:restartNumberingAfterBreak="0">
+  <w:abstractNum w:abstractNumId="5" w15:restartNumberingAfterBreak="0">
     <w:nsid w:val="2E0662F3"/>
     <w:multiLevelType w:val="multilevel"/>
     <w:tmpl w:val="C532CB42"/>
@@ -6412,7 +9185,7 @@
       </w:rPr>
     </w:lvl>
   </w:abstractNum>
-  <w:abstractNum w:abstractNumId="3" w15:restartNumberingAfterBreak="0">
+  <w:abstractNum w:abstractNumId="6" w15:restartNumberingAfterBreak="0">
     <w:nsid w:val="311C29DA"/>
     <w:multiLevelType w:val="multilevel"/>
     <w:tmpl w:val="B2CCC4FE"/>
@@ -6525,7 +9298,7 @@
       </w:pPr>
     </w:lvl>
   </w:abstractNum>
-  <w:abstractNum w:abstractNumId="4" w15:restartNumberingAfterBreak="0">
+  <w:abstractNum w:abstractNumId="7" w15:restartNumberingAfterBreak="0">
     <w:nsid w:val="4B096D18"/>
     <w:multiLevelType w:val="multilevel"/>
     <w:tmpl w:val="BA587BB2"/>
@@ -6675,7 +9448,7 @@
       </w:rPr>
     </w:lvl>
   </w:abstractNum>
-  <w:abstractNum w:abstractNumId="5" w15:restartNumberingAfterBreak="0">
+  <w:abstractNum w:abstractNumId="8" w15:restartNumberingAfterBreak="0">
     <w:nsid w:val="4D836F64"/>
     <w:multiLevelType w:val="multilevel"/>
     <w:tmpl w:val="500C2D48"/>
@@ -6824,7 +9597,7 @@
       </w:rPr>
     </w:lvl>
   </w:abstractNum>
-  <w:abstractNum w:abstractNumId="6" w15:restartNumberingAfterBreak="0">
+  <w:abstractNum w:abstractNumId="9" w15:restartNumberingAfterBreak="0">
     <w:nsid w:val="4EEB619D"/>
     <w:multiLevelType w:val="multilevel"/>
     <w:tmpl w:val="1F28BA06"/>
@@ -6974,7 +9747,7 @@
       </w:rPr>
     </w:lvl>
   </w:abstractNum>
-  <w:abstractNum w:abstractNumId="7" w15:restartNumberingAfterBreak="0">
+  <w:abstractNum w:abstractNumId="10" w15:restartNumberingAfterBreak="0">
     <w:nsid w:val="50EB136C"/>
     <w:multiLevelType w:val="hybridMultilevel"/>
     <w:tmpl w:val="89B43F14"/>
@@ -7087,7 +9860,120 @@
       </w:rPr>
     </w:lvl>
   </w:abstractNum>
-  <w:abstractNum w:abstractNumId="8" w15:restartNumberingAfterBreak="0">
+  <w:abstractNum w:abstractNumId="11" w15:restartNumberingAfterBreak="0">
+    <w:nsid w:val="53B6302B"/>
+    <w:multiLevelType w:val="hybridMultilevel"/>
+    <w:tmpl w:val="20047D0A"/>
+    <w:lvl w:ilvl="0" w:tplc="04090001">
+      <w:start w:val="1"/>
+      <w:numFmt w:val="bullet"/>
+      <w:lvlText w:val=""/>
+      <w:lvlJc w:val="left"/>
+      <w:pPr>
+        <w:ind w:left="720" w:hanging="360"/>
+      </w:pPr>
+      <w:rPr>
+        <w:rFonts w:ascii="Symbol" w:hAnsi="Symbol" w:hint="default"/>
+      </w:rPr>
+    </w:lvl>
+    <w:lvl w:ilvl="1" w:tplc="04090003" w:tentative="1">
+      <w:start w:val="1"/>
+      <w:numFmt w:val="bullet"/>
+      <w:lvlText w:val="o"/>
+      <w:lvlJc w:val="left"/>
+      <w:pPr>
+        <w:ind w:left="1440" w:hanging="360"/>
+      </w:pPr>
+      <w:rPr>
+        <w:rFonts w:ascii="Courier New" w:hAnsi="Courier New" w:cs="Courier New" w:hint="default"/>
+      </w:rPr>
+    </w:lvl>
+    <w:lvl w:ilvl="2" w:tplc="04090005" w:tentative="1">
+      <w:start w:val="1"/>
+      <w:numFmt w:val="bullet"/>
+      <w:lvlText w:val=""/>
+      <w:lvlJc w:val="left"/>
+      <w:pPr>
+        <w:ind w:left="2160" w:hanging="360"/>
+      </w:pPr>
+      <w:rPr>
+        <w:rFonts w:ascii="Wingdings" w:hAnsi="Wingdings" w:hint="default"/>
+      </w:rPr>
+    </w:lvl>
+    <w:lvl w:ilvl="3" w:tplc="04090001" w:tentative="1">
+      <w:start w:val="1"/>
+      <w:numFmt w:val="bullet"/>
+      <w:lvlText w:val=""/>
+      <w:lvlJc w:val="left"/>
+      <w:pPr>
+        <w:ind w:left="2880" w:hanging="360"/>
+      </w:pPr>
+      <w:rPr>
+        <w:rFonts w:ascii="Symbol" w:hAnsi="Symbol" w:hint="default"/>
+      </w:rPr>
+    </w:lvl>
+    <w:lvl w:ilvl="4" w:tplc="04090003" w:tentative="1">
+      <w:start w:val="1"/>
+      <w:numFmt w:val="bullet"/>
+      <w:lvlText w:val="o"/>
+      <w:lvlJc w:val="left"/>
+      <w:pPr>
+        <w:ind w:left="3600" w:hanging="360"/>
+      </w:pPr>
+      <w:rPr>
+        <w:rFonts w:ascii="Courier New" w:hAnsi="Courier New" w:cs="Courier New" w:hint="default"/>
+      </w:rPr>
+    </w:lvl>
+    <w:lvl w:ilvl="5" w:tplc="04090005" w:tentative="1">
+      <w:start w:val="1"/>
+      <w:numFmt w:val="bullet"/>
+      <w:lvlText w:val=""/>
+      <w:lvlJc w:val="left"/>
+      <w:pPr>
+        <w:ind w:left="4320" w:hanging="360"/>
+      </w:pPr>
+      <w:rPr>
+        <w:rFonts w:ascii="Wingdings" w:hAnsi="Wingdings" w:hint="default"/>
+      </w:rPr>
+    </w:lvl>
+    <w:lvl w:ilvl="6" w:tplc="04090001" w:tentative="1">
+      <w:start w:val="1"/>
+      <w:numFmt w:val="bullet"/>
+      <w:lvlText w:val=""/>
+      <w:lvlJc w:val="left"/>
+      <w:pPr>
+        <w:ind w:left="5040" w:hanging="360"/>
+      </w:pPr>
+      <w:rPr>
+        <w:rFonts w:ascii="Symbol" w:hAnsi="Symbol" w:hint="default"/>
+      </w:rPr>
+    </w:lvl>
+    <w:lvl w:ilvl="7" w:tplc="04090003" w:tentative="1">
+      <w:start w:val="1"/>
+      <w:numFmt w:val="bullet"/>
+      <w:lvlText w:val="o"/>
+      <w:lvlJc w:val="left"/>
+      <w:pPr>
+        <w:ind w:left="5760" w:hanging="360"/>
+      </w:pPr>
+      <w:rPr>
+        <w:rFonts w:ascii="Courier New" w:hAnsi="Courier New" w:cs="Courier New" w:hint="default"/>
+      </w:rPr>
+    </w:lvl>
+    <w:lvl w:ilvl="8" w:tplc="04090005" w:tentative="1">
+      <w:start w:val="1"/>
+      <w:numFmt w:val="bullet"/>
+      <w:lvlText w:val=""/>
+      <w:lvlJc w:val="left"/>
+      <w:pPr>
+        <w:ind w:left="6480" w:hanging="360"/>
+      </w:pPr>
+      <w:rPr>
+        <w:rFonts w:ascii="Wingdings" w:hAnsi="Wingdings" w:hint="default"/>
+      </w:rPr>
+    </w:lvl>
+  </w:abstractNum>
+  <w:abstractNum w:abstractNumId="12" w15:restartNumberingAfterBreak="0">
     <w:nsid w:val="54713B5E"/>
     <w:multiLevelType w:val="multilevel"/>
     <w:tmpl w:val="9970E91C"/>
@@ -7236,7 +10122,7 @@
       </w:rPr>
     </w:lvl>
   </w:abstractNum>
-  <w:abstractNum w:abstractNumId="9" w15:restartNumberingAfterBreak="0">
+  <w:abstractNum w:abstractNumId="13" w15:restartNumberingAfterBreak="0">
     <w:nsid w:val="559911F5"/>
     <w:multiLevelType w:val="multilevel"/>
     <w:tmpl w:val="2F229F9E"/>
@@ -7385,7 +10271,233 @@
       </w:rPr>
     </w:lvl>
   </w:abstractNum>
-  <w:abstractNum w:abstractNumId="10" w15:restartNumberingAfterBreak="0">
+  <w:abstractNum w:abstractNumId="14" w15:restartNumberingAfterBreak="0">
+    <w:nsid w:val="5665196E"/>
+    <w:multiLevelType w:val="hybridMultilevel"/>
+    <w:tmpl w:val="86FA8A44"/>
+    <w:lvl w:ilvl="0" w:tplc="04090001">
+      <w:start w:val="1"/>
+      <w:numFmt w:val="bullet"/>
+      <w:lvlText w:val=""/>
+      <w:lvlJc w:val="left"/>
+      <w:pPr>
+        <w:ind w:left="720" w:hanging="360"/>
+      </w:pPr>
+      <w:rPr>
+        <w:rFonts w:ascii="Symbol" w:hAnsi="Symbol" w:hint="default"/>
+      </w:rPr>
+    </w:lvl>
+    <w:lvl w:ilvl="1" w:tplc="04090003" w:tentative="1">
+      <w:start w:val="1"/>
+      <w:numFmt w:val="bullet"/>
+      <w:lvlText w:val="o"/>
+      <w:lvlJc w:val="left"/>
+      <w:pPr>
+        <w:ind w:left="1440" w:hanging="360"/>
+      </w:pPr>
+      <w:rPr>
+        <w:rFonts w:ascii="Courier New" w:hAnsi="Courier New" w:cs="Courier New" w:hint="default"/>
+      </w:rPr>
+    </w:lvl>
+    <w:lvl w:ilvl="2" w:tplc="04090005" w:tentative="1">
+      <w:start w:val="1"/>
+      <w:numFmt w:val="bullet"/>
+      <w:lvlText w:val=""/>
+      <w:lvlJc w:val="left"/>
+      <w:pPr>
+        <w:ind w:left="2160" w:hanging="360"/>
+      </w:pPr>
+      <w:rPr>
+        <w:rFonts w:ascii="Wingdings" w:hAnsi="Wingdings" w:hint="default"/>
+      </w:rPr>
+    </w:lvl>
+    <w:lvl w:ilvl="3" w:tplc="04090001" w:tentative="1">
+      <w:start w:val="1"/>
+      <w:numFmt w:val="bullet"/>
+      <w:lvlText w:val=""/>
+      <w:lvlJc w:val="left"/>
+      <w:pPr>
+        <w:ind w:left="2880" w:hanging="360"/>
+      </w:pPr>
+      <w:rPr>
+        <w:rFonts w:ascii="Symbol" w:hAnsi="Symbol" w:hint="default"/>
+      </w:rPr>
+    </w:lvl>
+    <w:lvl w:ilvl="4" w:tplc="04090003" w:tentative="1">
+      <w:start w:val="1"/>
+      <w:numFmt w:val="bullet"/>
+      <w:lvlText w:val="o"/>
+      <w:lvlJc w:val="left"/>
+      <w:pPr>
+        <w:ind w:left="3600" w:hanging="360"/>
+      </w:pPr>
+      <w:rPr>
+        <w:rFonts w:ascii="Courier New" w:hAnsi="Courier New" w:cs="Courier New" w:hint="default"/>
+      </w:rPr>
+    </w:lvl>
+    <w:lvl w:ilvl="5" w:tplc="04090005" w:tentative="1">
+      <w:start w:val="1"/>
+      <w:numFmt w:val="bullet"/>
+      <w:lvlText w:val=""/>
+      <w:lvlJc w:val="left"/>
+      <w:pPr>
+        <w:ind w:left="4320" w:hanging="360"/>
+      </w:pPr>
+      <w:rPr>
+        <w:rFonts w:ascii="Wingdings" w:hAnsi="Wingdings" w:hint="default"/>
+      </w:rPr>
+    </w:lvl>
+    <w:lvl w:ilvl="6" w:tplc="04090001" w:tentative="1">
+      <w:start w:val="1"/>
+      <w:numFmt w:val="bullet"/>
+      <w:lvlText w:val=""/>
+      <w:lvlJc w:val="left"/>
+      <w:pPr>
+        <w:ind w:left="5040" w:hanging="360"/>
+      </w:pPr>
+      <w:rPr>
+        <w:rFonts w:ascii="Symbol" w:hAnsi="Symbol" w:hint="default"/>
+      </w:rPr>
+    </w:lvl>
+    <w:lvl w:ilvl="7" w:tplc="04090003" w:tentative="1">
+      <w:start w:val="1"/>
+      <w:numFmt w:val="bullet"/>
+      <w:lvlText w:val="o"/>
+      <w:lvlJc w:val="left"/>
+      <w:pPr>
+        <w:ind w:left="5760" w:hanging="360"/>
+      </w:pPr>
+      <w:rPr>
+        <w:rFonts w:ascii="Courier New" w:hAnsi="Courier New" w:cs="Courier New" w:hint="default"/>
+      </w:rPr>
+    </w:lvl>
+    <w:lvl w:ilvl="8" w:tplc="04090005" w:tentative="1">
+      <w:start w:val="1"/>
+      <w:numFmt w:val="bullet"/>
+      <w:lvlText w:val=""/>
+      <w:lvlJc w:val="left"/>
+      <w:pPr>
+        <w:ind w:left="6480" w:hanging="360"/>
+      </w:pPr>
+      <w:rPr>
+        <w:rFonts w:ascii="Wingdings" w:hAnsi="Wingdings" w:hint="default"/>
+      </w:rPr>
+    </w:lvl>
+  </w:abstractNum>
+  <w:abstractNum w:abstractNumId="15" w15:restartNumberingAfterBreak="0">
+    <w:nsid w:val="5D320215"/>
+    <w:multiLevelType w:val="hybridMultilevel"/>
+    <w:tmpl w:val="FE22E0D4"/>
+    <w:lvl w:ilvl="0" w:tplc="04090001">
+      <w:start w:val="1"/>
+      <w:numFmt w:val="bullet"/>
+      <w:lvlText w:val=""/>
+      <w:lvlJc w:val="left"/>
+      <w:pPr>
+        <w:ind w:left="720" w:hanging="360"/>
+      </w:pPr>
+      <w:rPr>
+        <w:rFonts w:ascii="Symbol" w:hAnsi="Symbol" w:hint="default"/>
+      </w:rPr>
+    </w:lvl>
+    <w:lvl w:ilvl="1" w:tplc="04090003" w:tentative="1">
+      <w:start w:val="1"/>
+      <w:numFmt w:val="bullet"/>
+      <w:lvlText w:val="o"/>
+      <w:lvlJc w:val="left"/>
+      <w:pPr>
+        <w:ind w:left="1440" w:hanging="360"/>
+      </w:pPr>
+      <w:rPr>
+        <w:rFonts w:ascii="Courier New" w:hAnsi="Courier New" w:cs="Courier New" w:hint="default"/>
+      </w:rPr>
+    </w:lvl>
+    <w:lvl w:ilvl="2" w:tplc="04090005" w:tentative="1">
+      <w:start w:val="1"/>
+      <w:numFmt w:val="bullet"/>
+      <w:lvlText w:val=""/>
+      <w:lvlJc w:val="left"/>
+      <w:pPr>
+        <w:ind w:left="2160" w:hanging="360"/>
+      </w:pPr>
+      <w:rPr>
+        <w:rFonts w:ascii="Wingdings" w:hAnsi="Wingdings" w:hint="default"/>
+      </w:rPr>
+    </w:lvl>
+    <w:lvl w:ilvl="3" w:tplc="04090001" w:tentative="1">
+      <w:start w:val="1"/>
+      <w:numFmt w:val="bullet"/>
+      <w:lvlText w:val=""/>
+      <w:lvlJc w:val="left"/>
+      <w:pPr>
+        <w:ind w:left="2880" w:hanging="360"/>
+      </w:pPr>
+      <w:rPr>
+        <w:rFonts w:ascii="Symbol" w:hAnsi="Symbol" w:hint="default"/>
+      </w:rPr>
+    </w:lvl>
+    <w:lvl w:ilvl="4" w:tplc="04090003" w:tentative="1">
+      <w:start w:val="1"/>
+      <w:numFmt w:val="bullet"/>
+      <w:lvlText w:val="o"/>
+      <w:lvlJc w:val="left"/>
+      <w:pPr>
+        <w:ind w:left="3600" w:hanging="360"/>
+      </w:pPr>
+      <w:rPr>
+        <w:rFonts w:ascii="Courier New" w:hAnsi="Courier New" w:cs="Courier New" w:hint="default"/>
+      </w:rPr>
+    </w:lvl>
+    <w:lvl w:ilvl="5" w:tplc="04090005" w:tentative="1">
+      <w:start w:val="1"/>
+      <w:numFmt w:val="bullet"/>
+      <w:lvlText w:val=""/>
+      <w:lvlJc w:val="left"/>
+      <w:pPr>
+        <w:ind w:left="4320" w:hanging="360"/>
+      </w:pPr>
+      <w:rPr>
+        <w:rFonts w:ascii="Wingdings" w:hAnsi="Wingdings" w:hint="default"/>
+      </w:rPr>
+    </w:lvl>
+    <w:lvl w:ilvl="6" w:tplc="04090001" w:tentative="1">
+      <w:start w:val="1"/>
+      <w:numFmt w:val="bullet"/>
+      <w:lvlText w:val=""/>
+      <w:lvlJc w:val="left"/>
+      <w:pPr>
+        <w:ind w:left="5040" w:hanging="360"/>
+      </w:pPr>
+      <w:rPr>
+        <w:rFonts w:ascii="Symbol" w:hAnsi="Symbol" w:hint="default"/>
+      </w:rPr>
+    </w:lvl>
+    <w:lvl w:ilvl="7" w:tplc="04090003" w:tentative="1">
+      <w:start w:val="1"/>
+      <w:numFmt w:val="bullet"/>
+      <w:lvlText w:val="o"/>
+      <w:lvlJc w:val="left"/>
+      <w:pPr>
+        <w:ind w:left="5760" w:hanging="360"/>
+      </w:pPr>
+      <w:rPr>
+        <w:rFonts w:ascii="Courier New" w:hAnsi="Courier New" w:cs="Courier New" w:hint="default"/>
+      </w:rPr>
+    </w:lvl>
+    <w:lvl w:ilvl="8" w:tplc="04090005" w:tentative="1">
+      <w:start w:val="1"/>
+      <w:numFmt w:val="bullet"/>
+      <w:lvlText w:val=""/>
+      <w:lvlJc w:val="left"/>
+      <w:pPr>
+        <w:ind w:left="6480" w:hanging="360"/>
+      </w:pPr>
+      <w:rPr>
+        <w:rFonts w:ascii="Wingdings" w:hAnsi="Wingdings" w:hint="default"/>
+      </w:rPr>
+    </w:lvl>
+  </w:abstractNum>
+  <w:abstractNum w:abstractNumId="16" w15:restartNumberingAfterBreak="0">
     <w:nsid w:val="63132EC2"/>
     <w:multiLevelType w:val="multilevel"/>
     <w:tmpl w:val="09183478"/>
@@ -7534,7 +10646,120 @@
       </w:rPr>
     </w:lvl>
   </w:abstractNum>
-  <w:abstractNum w:abstractNumId="11" w15:restartNumberingAfterBreak="0">
+  <w:abstractNum w:abstractNumId="17" w15:restartNumberingAfterBreak="0">
+    <w:nsid w:val="678F2AC2"/>
+    <w:multiLevelType w:val="hybridMultilevel"/>
+    <w:tmpl w:val="165C46E2"/>
+    <w:lvl w:ilvl="0" w:tplc="04090001">
+      <w:start w:val="1"/>
+      <w:numFmt w:val="bullet"/>
+      <w:lvlText w:val=""/>
+      <w:lvlJc w:val="left"/>
+      <w:pPr>
+        <w:ind w:left="360" w:hanging="360"/>
+      </w:pPr>
+      <w:rPr>
+        <w:rFonts w:ascii="Symbol" w:hAnsi="Symbol" w:hint="default"/>
+      </w:rPr>
+    </w:lvl>
+    <w:lvl w:ilvl="1" w:tplc="04090003" w:tentative="1">
+      <w:start w:val="1"/>
+      <w:numFmt w:val="bullet"/>
+      <w:lvlText w:val="o"/>
+      <w:lvlJc w:val="left"/>
+      <w:pPr>
+        <w:ind w:left="1080" w:hanging="360"/>
+      </w:pPr>
+      <w:rPr>
+        <w:rFonts w:ascii="Courier New" w:hAnsi="Courier New" w:cs="Courier New" w:hint="default"/>
+      </w:rPr>
+    </w:lvl>
+    <w:lvl w:ilvl="2" w:tplc="04090005" w:tentative="1">
+      <w:start w:val="1"/>
+      <w:numFmt w:val="bullet"/>
+      <w:lvlText w:val=""/>
+      <w:lvlJc w:val="left"/>
+      <w:pPr>
+        <w:ind w:left="1800" w:hanging="360"/>
+      </w:pPr>
+      <w:rPr>
+        <w:rFonts w:ascii="Wingdings" w:hAnsi="Wingdings" w:hint="default"/>
+      </w:rPr>
+    </w:lvl>
+    <w:lvl w:ilvl="3" w:tplc="04090001" w:tentative="1">
+      <w:start w:val="1"/>
+      <w:numFmt w:val="bullet"/>
+      <w:lvlText w:val=""/>
+      <w:lvlJc w:val="left"/>
+      <w:pPr>
+        <w:ind w:left="2520" w:hanging="360"/>
+      </w:pPr>
+      <w:rPr>
+        <w:rFonts w:ascii="Symbol" w:hAnsi="Symbol" w:hint="default"/>
+      </w:rPr>
+    </w:lvl>
+    <w:lvl w:ilvl="4" w:tplc="04090003" w:tentative="1">
+      <w:start w:val="1"/>
+      <w:numFmt w:val="bullet"/>
+      <w:lvlText w:val="o"/>
+      <w:lvlJc w:val="left"/>
+      <w:pPr>
+        <w:ind w:left="3240" w:hanging="360"/>
+      </w:pPr>
+      <w:rPr>
+        <w:rFonts w:ascii="Courier New" w:hAnsi="Courier New" w:cs="Courier New" w:hint="default"/>
+      </w:rPr>
+    </w:lvl>
+    <w:lvl w:ilvl="5" w:tplc="04090005" w:tentative="1">
+      <w:start w:val="1"/>
+      <w:numFmt w:val="bullet"/>
+      <w:lvlText w:val=""/>
+      <w:lvlJc w:val="left"/>
+      <w:pPr>
+        <w:ind w:left="3960" w:hanging="360"/>
+      </w:pPr>
+      <w:rPr>
+        <w:rFonts w:ascii="Wingdings" w:hAnsi="Wingdings" w:hint="default"/>
+      </w:rPr>
+    </w:lvl>
+    <w:lvl w:ilvl="6" w:tplc="04090001" w:tentative="1">
+      <w:start w:val="1"/>
+      <w:numFmt w:val="bullet"/>
+      <w:lvlText w:val=""/>
+      <w:lvlJc w:val="left"/>
+      <w:pPr>
+        <w:ind w:left="4680" w:hanging="360"/>
+      </w:pPr>
+      <w:rPr>
+        <w:rFonts w:ascii="Symbol" w:hAnsi="Symbol" w:hint="default"/>
+      </w:rPr>
+    </w:lvl>
+    <w:lvl w:ilvl="7" w:tplc="04090003" w:tentative="1">
+      <w:start w:val="1"/>
+      <w:numFmt w:val="bullet"/>
+      <w:lvlText w:val="o"/>
+      <w:lvlJc w:val="left"/>
+      <w:pPr>
+        <w:ind w:left="5400" w:hanging="360"/>
+      </w:pPr>
+      <w:rPr>
+        <w:rFonts w:ascii="Courier New" w:hAnsi="Courier New" w:cs="Courier New" w:hint="default"/>
+      </w:rPr>
+    </w:lvl>
+    <w:lvl w:ilvl="8" w:tplc="04090005" w:tentative="1">
+      <w:start w:val="1"/>
+      <w:numFmt w:val="bullet"/>
+      <w:lvlText w:val=""/>
+      <w:lvlJc w:val="left"/>
+      <w:pPr>
+        <w:ind w:left="6120" w:hanging="360"/>
+      </w:pPr>
+      <w:rPr>
+        <w:rFonts w:ascii="Wingdings" w:hAnsi="Wingdings" w:hint="default"/>
+      </w:rPr>
+    </w:lvl>
+  </w:abstractNum>
+  <w:abstractNum w:abstractNumId="18" w15:restartNumberingAfterBreak="0">
     <w:nsid w:val="6AAA38BC"/>
     <w:multiLevelType w:val="hybridMultilevel"/>
     <w:tmpl w:val="93EC71D6"/>
@@ -7647,7 +10872,7 @@
       </w:rPr>
     </w:lvl>
   </w:abstractNum>
-  <w:abstractNum w:abstractNumId="12" w15:restartNumberingAfterBreak="0">
+  <w:abstractNum w:abstractNumId="19" w15:restartNumberingAfterBreak="0">
     <w:nsid w:val="6CD0250B"/>
     <w:multiLevelType w:val="multilevel"/>
     <w:tmpl w:val="9970E91C"/>
@@ -7796,7 +11021,7 @@
       </w:rPr>
     </w:lvl>
   </w:abstractNum>
-  <w:abstractNum w:abstractNumId="13" w15:restartNumberingAfterBreak="0">
+  <w:abstractNum w:abstractNumId="20" w15:restartNumberingAfterBreak="0">
     <w:nsid w:val="70316450"/>
     <w:multiLevelType w:val="multilevel"/>
     <w:tmpl w:val="527E0A22"/>
@@ -7946,7 +11171,7 @@
       </w:rPr>
     </w:lvl>
   </w:abstractNum>
-  <w:abstractNum w:abstractNumId="14" w15:restartNumberingAfterBreak="0">
+  <w:abstractNum w:abstractNumId="21" w15:restartNumberingAfterBreak="0">
     <w:nsid w:val="7E3C0F51"/>
     <w:multiLevelType w:val="multilevel"/>
     <w:tmpl w:val="9970E91C"/>
@@ -8096,49 +11321,70 @@
     </w:lvl>
   </w:abstractNum>
   <w:num w:numId="1" w16cid:durableId="922833580">
-    <w:abstractNumId w:val="1"/>
+    <w:abstractNumId w:val="4"/>
   </w:num>
   <w:num w:numId="2" w16cid:durableId="368578185">
-    <w:abstractNumId w:val="10"/>
+    <w:abstractNumId w:val="16"/>
   </w:num>
   <w:num w:numId="3" w16cid:durableId="559173962">
     <w:abstractNumId w:val="0"/>
   </w:num>
   <w:num w:numId="4" w16cid:durableId="1027564377">
-    <w:abstractNumId w:val="4"/>
+    <w:abstractNumId w:val="7"/>
   </w:num>
   <w:num w:numId="5" w16cid:durableId="547573144">
+    <w:abstractNumId w:val="5"/>
+  </w:num>
+  <w:num w:numId="6" w16cid:durableId="561989786">
+    <w:abstractNumId w:val="9"/>
+  </w:num>
+  <w:num w:numId="7" w16cid:durableId="940576598">
+    <w:abstractNumId w:val="20"/>
+  </w:num>
+  <w:num w:numId="8" w16cid:durableId="2020084199">
+    <w:abstractNumId w:val="13"/>
+  </w:num>
+  <w:num w:numId="9" w16cid:durableId="1142383382">
+    <w:abstractNumId w:val="21"/>
+  </w:num>
+  <w:num w:numId="10" w16cid:durableId="1281377237">
+    <w:abstractNumId w:val="8"/>
+  </w:num>
+  <w:num w:numId="11" w16cid:durableId="1664237672">
+    <w:abstractNumId w:val="6"/>
+  </w:num>
+  <w:num w:numId="12" w16cid:durableId="1041053922">
+    <w:abstractNumId w:val="18"/>
+  </w:num>
+  <w:num w:numId="13" w16cid:durableId="261840660">
+    <w:abstractNumId w:val="10"/>
+  </w:num>
+  <w:num w:numId="14" w16cid:durableId="929434079">
+    <w:abstractNumId w:val="19"/>
+  </w:num>
+  <w:num w:numId="15" w16cid:durableId="280382510">
+    <w:abstractNumId w:val="12"/>
+  </w:num>
+  <w:num w:numId="16" w16cid:durableId="934896530">
+    <w:abstractNumId w:val="3"/>
+  </w:num>
+  <w:num w:numId="17" w16cid:durableId="1391155913">
+    <w:abstractNumId w:val="1"/>
+  </w:num>
+  <w:num w:numId="18" w16cid:durableId="757334182">
     <w:abstractNumId w:val="2"/>
   </w:num>
-  <w:num w:numId="6" w16cid:durableId="561989786">
-    <w:abstractNumId w:val="6"/>
-  </w:num>
-  <w:num w:numId="7" w16cid:durableId="940576598">
-    <w:abstractNumId w:val="13"/>
-  </w:num>
-  <w:num w:numId="8" w16cid:durableId="2020084199">
-    <w:abstractNumId w:val="9"/>
-  </w:num>
-  <w:num w:numId="9" w16cid:durableId="1142383382">
-    <w:abstractNumId w:val="14"/>
-  </w:num>
-  <w:num w:numId="10" w16cid:durableId="1281377237">
-    <w:abstractNumId w:val="5"/>
-  </w:num>
-  <w:num w:numId="11" w16cid:durableId="1664237672">
-    <w:abstractNumId w:val="3"/>
-  </w:num>
-  <w:num w:numId="12" w16cid:durableId="1041053922">
+  <w:num w:numId="19" w16cid:durableId="2075660731">
     <w:abstractNumId w:val="11"/>
   </w:num>
-  <w:num w:numId="13" w16cid:durableId="261840660">
-    <w:abstractNumId w:val="7"/>
+  <w:num w:numId="20" w16cid:durableId="1543245753">
+    <w:abstractNumId w:val="15"/>
   </w:num>
-  <w:num w:numId="14" w16cid:durableId="929434079">
-    <w:abstractNumId w:val="12"/>
+  <w:num w:numId="21" w16cid:durableId="267780938">
+    <w:abstractNumId w:val="17"/>
   </w:num>
-  <w:num w:numId="15" w16cid:durableId="280382510">
-    <w:abstractNumId w:val="8"/>
+  <w:num w:numId="22" w16cid:durableId="1806779711">
+    <w:abstractNumId w:val="14"/>
   </w:num>
 </w:numbering>
 </file>
@@ -9385,6 +12631,112 @@
       <w:vertAlign w:val="superscript"/>
     </w:rPr>
   </w:style>
+  <w:style w:type="table" w:styleId="GridTable5Dark-Accent2">
+    <w:name w:val="Grid Table 5 Dark Accent 2"/>
+    <w:basedOn w:val="TableNormal"/>
+    <w:uiPriority w:val="50"/>
+    <w:rsid w:val="00640D9A"/>
+    <w:pPr>
+      <w:spacing w:after="0" w:line="240" w:lineRule="auto"/>
+    </w:pPr>
+    <w:tblPr>
+      <w:tblStyleRowBandSize w:val="1"/>
+      <w:tblStyleColBandSize w:val="1"/>
+      <w:tblBorders>
+        <w:top w:val="single" w:sz="4" w:space="0" w:color="FFFFFF" w:themeColor="background1"/>
+        <w:left w:val="single" w:sz="4" w:space="0" w:color="FFFFFF" w:themeColor="background1"/>
+        <w:bottom w:val="single" w:sz="4" w:space="0" w:color="FFFFFF" w:themeColor="background1"/>
+        <w:right w:val="single" w:sz="4" w:space="0" w:color="FFFFFF" w:themeColor="background1"/>
+        <w:insideH w:val="single" w:sz="4" w:space="0" w:color="FFFFFF" w:themeColor="background1"/>
+        <w:insideV w:val="single" w:sz="4" w:space="0" w:color="FFFFFF" w:themeColor="background1"/>
+      </w:tblBorders>
+    </w:tblPr>
+    <w:tcPr>
+      <w:shd w:val="clear" w:color="auto" w:fill="D0E6F6" w:themeFill="accent2" w:themeFillTint="33"/>
+    </w:tcPr>
+    <w:tblStylePr w:type="firstRow">
+      <w:rPr>
+        <w:b/>
+        <w:bCs/>
+        <w:color w:val="FFFFFF" w:themeColor="background1"/>
+      </w:rPr>
+      <w:tblPr/>
+      <w:tcPr>
+        <w:tcBorders>
+          <w:top w:val="single" w:sz="4" w:space="0" w:color="FFFFFF" w:themeColor="background1"/>
+          <w:left w:val="single" w:sz="4" w:space="0" w:color="FFFFFF" w:themeColor="background1"/>
+          <w:right w:val="single" w:sz="4" w:space="0" w:color="FFFFFF" w:themeColor="background1"/>
+          <w:insideH w:val="nil"/>
+          <w:insideV w:val="nil"/>
+        </w:tcBorders>
+        <w:shd w:val="clear" w:color="auto" w:fill="2683C6" w:themeFill="accent2"/>
+      </w:tcPr>
+    </w:tblStylePr>
+    <w:tblStylePr w:type="lastRow">
+      <w:rPr>
+        <w:b/>
+        <w:bCs/>
+        <w:color w:val="FFFFFF" w:themeColor="background1"/>
+      </w:rPr>
+      <w:tblPr/>
+      <w:tcPr>
+        <w:tcBorders>
+          <w:left w:val="single" w:sz="4" w:space="0" w:color="FFFFFF" w:themeColor="background1"/>
+          <w:bottom w:val="single" w:sz="4" w:space="0" w:color="FFFFFF" w:themeColor="background1"/>
+          <w:right w:val="single" w:sz="4" w:space="0" w:color="FFFFFF" w:themeColor="background1"/>
+          <w:insideH w:val="nil"/>
+          <w:insideV w:val="nil"/>
+        </w:tcBorders>
+        <w:shd w:val="clear" w:color="auto" w:fill="2683C6" w:themeFill="accent2"/>
+      </w:tcPr>
+    </w:tblStylePr>
+    <w:tblStylePr w:type="firstCol">
+      <w:rPr>
+        <w:b/>
+        <w:bCs/>
+        <w:color w:val="FFFFFF" w:themeColor="background1"/>
+      </w:rPr>
+      <w:tblPr/>
+      <w:tcPr>
+        <w:tcBorders>
+          <w:top w:val="single" w:sz="4" w:space="0" w:color="FFFFFF" w:themeColor="background1"/>
+          <w:left w:val="single" w:sz="4" w:space="0" w:color="FFFFFF" w:themeColor="background1"/>
+          <w:bottom w:val="single" w:sz="4" w:space="0" w:color="FFFFFF" w:themeColor="background1"/>
+          <w:insideV w:val="nil"/>
+        </w:tcBorders>
+        <w:shd w:val="clear" w:color="auto" w:fill="2683C6" w:themeFill="accent2"/>
+      </w:tcPr>
+    </w:tblStylePr>
+    <w:tblStylePr w:type="lastCol">
+      <w:rPr>
+        <w:b/>
+        <w:bCs/>
+        <w:color w:val="FFFFFF" w:themeColor="background1"/>
+      </w:rPr>
+      <w:tblPr/>
+      <w:tcPr>
+        <w:tcBorders>
+          <w:top w:val="single" w:sz="4" w:space="0" w:color="FFFFFF" w:themeColor="background1"/>
+          <w:bottom w:val="single" w:sz="4" w:space="0" w:color="FFFFFF" w:themeColor="background1"/>
+          <w:right w:val="single" w:sz="4" w:space="0" w:color="FFFFFF" w:themeColor="background1"/>
+          <w:insideV w:val="nil"/>
+        </w:tcBorders>
+        <w:shd w:val="clear" w:color="auto" w:fill="2683C6" w:themeFill="accent2"/>
+      </w:tcPr>
+    </w:tblStylePr>
+    <w:tblStylePr w:type="band1Vert">
+      <w:tblPr/>
+      <w:tcPr>
+        <w:shd w:val="clear" w:color="auto" w:fill="A3CEED" w:themeFill="accent2" w:themeFillTint="66"/>
+      </w:tcPr>
+    </w:tblStylePr>
+    <w:tblStylePr w:type="band1Horz">
+      <w:tblPr/>
+      <w:tcPr>
+        <w:shd w:val="clear" w:color="auto" w:fill="A3CEED" w:themeFill="accent2" w:themeFillTint="66"/>
+      </w:tcPr>
+    </w:tblStylePr>
+  </w:style>
 </w:styles>
 </file>
 
@@ -9535,7 +12887,6 @@
 <file path=word/glossary/settings.xml><?xml version="1.0" encoding="utf-8"?>
 <w:settings xmlns:mc="http://schemas.openxmlformats.org/markup-compatibility/2006" xmlns:o="urn:schemas-microsoft-com:office:office" xmlns:r="http://schemas.openxmlformats.org/officeDocument/2006/relationships" xmlns:m="http://schemas.openxmlformats.org/officeDocument/2006/math" xmlns:v="urn:schemas-microsoft-com:vml" xmlns:w10="urn:schemas-microsoft-com:office:word" xmlns:w="http://schemas.openxmlformats.org/wordprocessingml/2006/main" xmlns:w14="http://schemas.microsoft.com/office/word/2010/wordml" xmlns:w15="http://schemas.microsoft.com/office/word/2012/wordml" xmlns:w16cex="http://schemas.microsoft.com/office/word/2018/wordml/cex" xmlns:w16cid="http://schemas.microsoft.com/office/word/2016/wordml/cid" xmlns:w16="http://schemas.microsoft.com/office/word/2018/wordml" xmlns:w16sdtdh="http://schemas.microsoft.com/office/word/2020/wordml/sdtdatahash" xmlns:w16se="http://schemas.microsoft.com/office/word/2015/wordml/symex" xmlns:sl="http://schemas.openxmlformats.org/schemaLibrary/2006/main" mc:Ignorable="w14 w15 w16se w16cid w16 w16cex w16sdtdh">
   <w:view w:val="normal"/>
-  <w:revisionView w:comments="0" w:insDel="0" w:formatting="0"/>
   <w:defaultTabStop w:val="708"/>
   <w:hyphenationZone w:val="425"/>
   <w:characterSpacingControl w:val="doNotCompress"/>
@@ -9550,15 +12901,18 @@
   </w:compat>
   <w:rsids>
     <w:rsidRoot w:val="00F01BA3"/>
+    <w:rsid w:val="00036689"/>
     <w:rsid w:val="00060BB7"/>
     <w:rsid w:val="002F77C9"/>
     <w:rsid w:val="00495A74"/>
+    <w:rsid w:val="006111CB"/>
     <w:rsid w:val="0085071F"/>
     <w:rsid w:val="00914371"/>
     <w:rsid w:val="00986A60"/>
     <w:rsid w:val="00AA60BC"/>
     <w:rsid w:val="00AC622D"/>
     <w:rsid w:val="00AD37F4"/>
+    <w:rsid w:val="00AF381D"/>
     <w:rsid w:val="00B43B45"/>
     <w:rsid w:val="00C0475E"/>
     <w:rsid w:val="00C800D4"/>
@@ -10033,7 +13387,7 @@
     <w:basedOn w:val="DefaultParagraphFont"/>
     <w:uiPriority w:val="99"/>
     <w:semiHidden/>
-    <w:rsid w:val="00060BB7"/>
+    <w:rsid w:val="006111CB"/>
     <w:rPr>
       <w:color w:val="666666"/>
     </w:rPr>

</xml_diff>

<commit_message>
Terminada presentación. Falta documentar código
</commit_message>
<xml_diff>
--- a/Informe Trabajo Integrador MyS.docx
+++ b/Informe Trabajo Integrador MyS.docx
@@ -171,34 +171,14 @@
                   <w:szCs w:val="28"/>
                 </w:rPr>
               </w:pPr>
-              <w:proofErr w:type="spellStart"/>
               <w:r>
                 <w:rPr>
                   <w:color w:val="1CADE4" w:themeColor="accent1"/>
                   <w:sz w:val="28"/>
                   <w:szCs w:val="28"/>
                 </w:rPr>
-                <w:t>Profs</w:t>
+                <w:t>Profs. Cristian Tissera</w:t>
               </w:r>
-              <w:proofErr w:type="spellEnd"/>
-              <w:r>
-                <w:rPr>
-                  <w:color w:val="1CADE4" w:themeColor="accent1"/>
-                  <w:sz w:val="28"/>
-                  <w:szCs w:val="28"/>
-                </w:rPr>
-                <w:t xml:space="preserve">. Cristian </w:t>
-              </w:r>
-              <w:proofErr w:type="spellStart"/>
-              <w:r>
-                <w:rPr>
-                  <w:color w:val="1CADE4" w:themeColor="accent1"/>
-                  <w:sz w:val="28"/>
-                  <w:szCs w:val="28"/>
-                </w:rPr>
-                <w:t>Tissera</w:t>
-              </w:r>
-              <w:proofErr w:type="spellEnd"/>
               <w:r>
                 <w:rPr>
                   <w:color w:val="1CADE4" w:themeColor="accent1"/>
@@ -213,18 +193,8 @@
                   <w:sz w:val="28"/>
                   <w:szCs w:val="28"/>
                 </w:rPr>
-                <w:t xml:space="preserve"> Danilo </w:t>
+                <w:t xml:space="preserve"> Danilo Labella</w:t>
               </w:r>
-              <w:proofErr w:type="spellStart"/>
-              <w:r>
-                <w:rPr>
-                  <w:color w:val="1CADE4" w:themeColor="accent1"/>
-                  <w:sz w:val="28"/>
-                  <w:szCs w:val="28"/>
-                </w:rPr>
-                <w:t>Labella</w:t>
-              </w:r>
-              <w:proofErr w:type="spellEnd"/>
               <w:r>
                 <w:rPr>
                   <w:color w:val="1CADE4" w:themeColor="accent1"/>
@@ -463,28 +433,12 @@
                           <w:lang w:val="en-US"/>
                         </w:rPr>
                       </w:pPr>
-                      <w:proofErr w:type="spellStart"/>
                       <w:r>
                         <w:rPr>
                           <w:lang w:val="en-US"/>
                         </w:rPr>
-                        <w:t>Dpto</w:t>
+                        <w:t>Dpto. de Informática</w:t>
                       </w:r>
-                      <w:proofErr w:type="spellEnd"/>
-                      <w:r>
-                        <w:rPr>
-                          <w:lang w:val="en-US"/>
-                        </w:rPr>
-                        <w:t xml:space="preserve">. de </w:t>
-                      </w:r>
-                      <w:proofErr w:type="spellStart"/>
-                      <w:r>
-                        <w:rPr>
-                          <w:lang w:val="en-US"/>
-                        </w:rPr>
-                        <w:t>Informática</w:t>
-                      </w:r>
-                      <w:proofErr w:type="spellEnd"/>
                     </w:p>
                   </w:txbxContent>
                 </v:textbox>
@@ -3089,15 +3043,24 @@
       </w:r>
     </w:p>
     <w:p>
-      <w:r>
-        <w:rPr>
-          <w:noProof/>
-        </w:rPr>
+      <w:pPr>
+        <w:pStyle w:val="ListParagraph"/>
+        <w:numPr>
+          <w:ilvl w:val="0"/>
+          <w:numId w:val="12"/>
+        </w:numPr>
+      </w:pPr>
+      <w:r>
+        <w:t>No se modelan multiplicidades, atributos ni métodos.</w:t>
+      </w:r>
+    </w:p>
+    <w:p>
+      <w:r>
         <w:drawing>
-          <wp:inline distT="0" distB="0" distL="0" distR="0" wp14:anchorId="0A7268C7" wp14:editId="0572D6A0">
-            <wp:extent cx="5731510" cy="3392805"/>
-            <wp:effectExtent l="0" t="0" r="2540" b="0"/>
-            <wp:docPr id="1" name="Picture 1"/>
+          <wp:inline distT="0" distB="0" distL="0" distR="0" wp14:anchorId="6EF8CA5A" wp14:editId="66E77AAA">
+            <wp:extent cx="5731510" cy="3423920"/>
+            <wp:effectExtent l="0" t="0" r="0" b="0"/>
+            <wp:docPr id="310782968" name="Picture 1" descr="A diagram of a network&#10;&#10;AI-generated content may be incorrect."/>
             <wp:cNvGraphicFramePr>
               <a:graphicFrameLocks xmlns:a="http://schemas.openxmlformats.org/drawingml/2006/main" noChangeAspect="1"/>
             </wp:cNvGraphicFramePr>
@@ -3105,7 +3068,7 @@
               <a:graphicData uri="http://schemas.openxmlformats.org/drawingml/2006/picture">
                 <pic:pic xmlns:pic="http://schemas.openxmlformats.org/drawingml/2006/picture">
                   <pic:nvPicPr>
-                    <pic:cNvPr id="1" name=""/>
+                    <pic:cNvPr id="310782968" name="Picture 1" descr="A diagram of a network&#10;&#10;AI-generated content may be incorrect."/>
                     <pic:cNvPicPr/>
                   </pic:nvPicPr>
                   <pic:blipFill>
@@ -3117,7 +3080,7 @@
                   <pic:spPr>
                     <a:xfrm>
                       <a:off x="0" y="0"/>
-                      <a:ext cx="5731510" cy="3392805"/>
+                      <a:ext cx="5731510" cy="3423920"/>
                     </a:xfrm>
                     <a:prstGeom prst="rect">
                       <a:avLst/>
@@ -3173,10 +3136,7 @@
         <w:t>readaptando el modelo</w:t>
       </w:r>
       <w:r>
-        <w:t xml:space="preserve"> y </w:t>
-      </w:r>
-      <w:r>
-        <w:t>corrigi</w:t>
+        <w:t xml:space="preserve"> y corrigi</w:t>
       </w:r>
       <w:r>
         <w:t>endo</w:t>
@@ -3290,6 +3250,7 @@
         </w:numPr>
       </w:pPr>
       <w:r>
+        <w:lastRenderedPageBreak/>
         <w:t>Al aplicar S</w:t>
       </w:r>
       <w:r>
@@ -3323,7 +3284,6 @@
         <w:t xml:space="preserve"> y considerando los requisitos de las siguientes dos etapas del práctico, realizamos el diseño pensando en posibles cambios futuros, lo que </w:t>
       </w:r>
       <w:r>
-        <w:lastRenderedPageBreak/>
         <w:t xml:space="preserve">debería </w:t>
       </w:r>
       <w:r>
@@ -3900,14 +3860,11 @@
     </w:p>
     <w:p>
       <w:r>
-        <w:rPr>
-          <w:noProof/>
-        </w:rPr>
         <w:drawing>
-          <wp:inline distT="0" distB="0" distL="0" distR="0" wp14:anchorId="77A6CD28" wp14:editId="4D2C7A98">
-            <wp:extent cx="5731510" cy="3432175"/>
+          <wp:inline distT="0" distB="0" distL="0" distR="0" wp14:anchorId="1953F088" wp14:editId="6479C80E">
+            <wp:extent cx="5731510" cy="3453130"/>
             <wp:effectExtent l="0" t="0" r="0" b="0"/>
-            <wp:docPr id="7" name="Picture 7"/>
+            <wp:docPr id="616835737" name="Picture 1" descr="A diagram of a company&#10;&#10;AI-generated content may be incorrect."/>
             <wp:cNvGraphicFramePr>
               <a:graphicFrameLocks xmlns:a="http://schemas.openxmlformats.org/drawingml/2006/main" noChangeAspect="1"/>
             </wp:cNvGraphicFramePr>
@@ -3915,7 +3872,7 @@
               <a:graphicData uri="http://schemas.openxmlformats.org/drawingml/2006/picture">
                 <pic:pic xmlns:pic="http://schemas.openxmlformats.org/drawingml/2006/picture">
                   <pic:nvPicPr>
-                    <pic:cNvPr id="1" name=""/>
+                    <pic:cNvPr id="616835737" name="Picture 1" descr="A diagram of a company&#10;&#10;AI-generated content may be incorrect."/>
                     <pic:cNvPicPr/>
                   </pic:nvPicPr>
                   <pic:blipFill>
@@ -3927,7 +3884,7 @@
                   <pic:spPr>
                     <a:xfrm>
                       <a:off x="0" y="0"/>
-                      <a:ext cx="5731510" cy="3432175"/>
+                      <a:ext cx="5731510" cy="3453130"/>
                     </a:xfrm>
                     <a:prstGeom prst="rect">
                       <a:avLst/>
@@ -4186,14 +4143,14 @@
         <w:rPr>
           <w:rFonts w:eastAsiaTheme="minorEastAsia"/>
         </w:rPr>
-        <w:t xml:space="preserve"> pasa a ser atributo de la </w:t>
+        <w:t xml:space="preserve"> pasa a ser atributo de </w:t>
       </w:r>
       <m:oMath>
         <m:r>
           <w:rPr>
             <w:rFonts w:ascii="Cambria Math" w:eastAsiaTheme="minorEastAsia" w:hAnsi="Cambria Math"/>
           </w:rPr>
-          <m:t>Eventos</m:t>
+          <m:t>Event</m:t>
         </m:r>
       </m:oMath>
       <w:r>
@@ -4271,7 +4228,7 @@
         <w:rPr>
           <w:rFonts w:eastAsiaTheme="minorEastAsia"/>
         </w:rPr>
-        <w:t xml:space="preserve"> de la cual heredaran dichos estadísticos. </w:t>
+        <w:t xml:space="preserve"> de la cual heredaran dichos estadísticos.</w:t>
       </w:r>
     </w:p>
     <w:p>
@@ -4285,7 +4242,31 @@
         <w:rPr>
           <w:rFonts w:eastAsiaTheme="minorEastAsia"/>
         </w:rPr>
-        <w:t xml:space="preserve">En la primera etapa debimos hardcodear la creación de la entidad </w:t>
+        <w:t xml:space="preserve">En la primera etapa debimos </w:t>
+      </w:r>
+      <w:r>
+        <w:rPr>
+          <w:rFonts w:eastAsiaTheme="minorEastAsia"/>
+        </w:rPr>
+        <w:t>“</w:t>
+      </w:r>
+      <w:r>
+        <w:rPr>
+          <w:rFonts w:eastAsiaTheme="minorEastAsia"/>
+        </w:rPr>
+        <w:t>hardcodear</w:t>
+      </w:r>
+      <w:r>
+        <w:rPr>
+          <w:rFonts w:eastAsiaTheme="minorEastAsia"/>
+        </w:rPr>
+        <w:t>”</w:t>
+      </w:r>
+      <w:r>
+        <w:rPr>
+          <w:rFonts w:eastAsiaTheme="minorEastAsia"/>
+        </w:rPr>
+        <w:t xml:space="preserve"> la creación de la entidad </w:t>
       </w:r>
       <m:oMath>
         <m:r>
@@ -4319,9 +4300,6 @@
     <w:p>
       <w:pPr>
         <w:ind w:left="720"/>
-        <w:rPr>
-          <w:rFonts w:eastAsiaTheme="minorEastAsia"/>
-        </w:rPr>
       </w:pPr>
       <m:oMath>
         <m:r>
@@ -4332,6 +4310,9 @@
           <m:t>fel</m:t>
         </m:r>
         <m:r>
+          <m:rPr>
+            <m:sty m:val="p"/>
+          </m:rPr>
           <w:rPr>
             <w:rFonts w:ascii="Cambria Math" w:hAnsi="Cambria Math"/>
           </w:rPr>
@@ -4345,6 +4326,9 @@
           <m:t>addEvent</m:t>
         </m:r>
         <m:r>
+          <m:rPr>
+            <m:sty m:val="p"/>
+          </m:rPr>
           <w:rPr>
             <w:rFonts w:ascii="Cambria Math" w:hAnsi="Cambria Math"/>
           </w:rPr>
@@ -4358,6 +4342,9 @@
           <m:t>new</m:t>
         </m:r>
         <m:r>
+          <m:rPr>
+            <m:sty m:val="p"/>
+          </m:rPr>
           <w:rPr>
             <w:rFonts w:ascii="Cambria Math" w:hAnsi="Cambria Math"/>
           </w:rPr>
@@ -4371,6 +4358,9 @@
           <m:t>Arrival</m:t>
         </m:r>
         <m:r>
+          <m:rPr>
+            <m:sty m:val="p"/>
+          </m:rPr>
           <w:rPr>
             <w:rFonts w:ascii="Cambria Math" w:hAnsi="Cambria Math"/>
           </w:rPr>
@@ -4384,6 +4374,9 @@
           <m:t>type</m:t>
         </m:r>
         <m:r>
+          <m:rPr>
+            <m:sty m:val="p"/>
+          </m:rPr>
           <w:rPr>
             <w:rFonts w:ascii="Cambria Math" w:hAnsi="Cambria Math"/>
           </w:rPr>
@@ -4397,6 +4390,9 @@
           <m:t>clock</m:t>
         </m:r>
         <m:r>
+          <m:rPr>
+            <m:sty m:val="p"/>
+          </m:rPr>
           <w:rPr>
             <w:rFonts w:ascii="Cambria Math" w:hAnsi="Cambria Math"/>
           </w:rPr>
@@ -4404,7 +4400,7 @@
         </m:r>
         <m:r>
           <m:rPr>
-            <m:sty m:val="bi"/>
+            <m:sty m:val="b"/>
           </m:rPr>
           <w:rPr>
             <w:rFonts w:ascii="Cambria Math" w:hAnsi="Cambria Math"/>
@@ -4423,7 +4419,7 @@
         </m:r>
         <m:r>
           <m:rPr>
-            <m:sty m:val="bi"/>
+            <m:sty m:val="b"/>
           </m:rPr>
           <w:rPr>
             <w:rFonts w:ascii="Cambria Math" w:hAnsi="Cambria Math"/>
@@ -4442,7 +4438,7 @@
         </m:r>
         <m:r>
           <m:rPr>
-            <m:sty m:val="bi"/>
+            <m:sty m:val="b"/>
           </m:rPr>
           <w:rPr>
             <w:rFonts w:ascii="Cambria Math" w:hAnsi="Cambria Math"/>
@@ -4450,6 +4446,9 @@
           <m:t>()</m:t>
         </m:r>
         <m:r>
+          <m:rPr>
+            <m:sty m:val="p"/>
+          </m:rPr>
           <w:rPr>
             <w:rFonts w:ascii="Cambria Math" w:hAnsi="Cambria Math"/>
           </w:rPr>
@@ -4463,6 +4462,9 @@
           <m:t>distributionList</m:t>
         </m:r>
         <m:r>
+          <m:rPr>
+            <m:sty m:val="p"/>
+          </m:rPr>
           <w:rPr>
             <w:rFonts w:ascii="Cambria Math" w:hAnsi="Cambria Math"/>
           </w:rPr>
@@ -4493,22 +4495,14 @@
         <w:rPr>
           <w:rFonts w:eastAsiaTheme="minorEastAsia"/>
         </w:rPr>
-        <w:t xml:space="preserve"> “</w:t>
-      </w:r>
-      <w:proofErr w:type="spellStart"/>
+        <w:t xml:space="preserve"> “f</w:t>
+      </w:r>
       <w:r>
         <w:rPr>
           <w:rFonts w:eastAsiaTheme="minorEastAsia"/>
         </w:rPr>
-        <w:t>f</w:t>
-      </w:r>
-      <w:r>
-        <w:rPr>
-          <w:rFonts w:eastAsiaTheme="minorEastAsia"/>
-        </w:rPr>
         <w:t>actory</w:t>
       </w:r>
-      <w:proofErr w:type="spellEnd"/>
       <w:r>
         <w:rPr>
           <w:rFonts w:eastAsiaTheme="minorEastAsia"/>
@@ -4632,6 +4626,9 @@
           <m:t>fel</m:t>
         </m:r>
         <m:r>
+          <m:rPr>
+            <m:sty m:val="p"/>
+          </m:rPr>
           <w:rPr>
             <w:rFonts w:ascii="Cambria Math" w:hAnsi="Cambria Math"/>
           </w:rPr>
@@ -4645,6 +4642,9 @@
           <m:t>addEvent</m:t>
         </m:r>
         <m:r>
+          <m:rPr>
+            <m:sty m:val="p"/>
+          </m:rPr>
           <w:rPr>
             <w:rFonts w:ascii="Cambria Math" w:hAnsi="Cambria Math"/>
           </w:rPr>
@@ -4658,6 +4658,9 @@
           <m:t>new</m:t>
         </m:r>
         <m:r>
+          <m:rPr>
+            <m:sty m:val="p"/>
+          </m:rPr>
           <w:rPr>
             <w:rFonts w:ascii="Cambria Math" w:hAnsi="Cambria Math"/>
           </w:rPr>
@@ -4671,6 +4674,9 @@
           <m:t>Arrival</m:t>
         </m:r>
         <m:r>
+          <m:rPr>
+            <m:sty m:val="p"/>
+          </m:rPr>
           <w:rPr>
             <w:rFonts w:ascii="Cambria Math" w:hAnsi="Cambria Math"/>
           </w:rPr>
@@ -4684,6 +4690,9 @@
           <m:t>type</m:t>
         </m:r>
         <m:r>
+          <m:rPr>
+            <m:sty m:val="p"/>
+          </m:rPr>
           <w:rPr>
             <w:rFonts w:ascii="Cambria Math" w:hAnsi="Cambria Math"/>
           </w:rPr>
@@ -4697,10 +4706,22 @@
           <m:t>clock</m:t>
         </m:r>
         <m:r>
+          <m:rPr>
+            <m:sty m:val="p"/>
+          </m:rPr>
           <w:rPr>
             <w:rFonts w:ascii="Cambria Math" w:hAnsi="Cambria Math"/>
           </w:rPr>
           <m:t>,</m:t>
+        </m:r>
+        <m:r>
+          <m:rPr>
+            <m:sty m:val="b"/>
+          </m:rPr>
+          <w:rPr>
+            <w:rFonts w:ascii="Cambria Math" w:hAnsi="Cambria Math"/>
+          </w:rPr>
+          <m:t xml:space="preserve"> </m:t>
         </m:r>
         <m:r>
           <m:rPr>
@@ -4709,7 +4730,34 @@
           <w:rPr>
             <w:rFonts w:ascii="Cambria Math" w:hAnsi="Cambria Math"/>
           </w:rPr>
-          <m:t xml:space="preserve"> entityFactory.create(),</m:t>
+          <m:t>entityFactory</m:t>
+        </m:r>
+        <m:r>
+          <m:rPr>
+            <m:sty m:val="b"/>
+          </m:rPr>
+          <w:rPr>
+            <w:rFonts w:ascii="Cambria Math" w:hAnsi="Cambria Math"/>
+          </w:rPr>
+          <m:t>.</m:t>
+        </m:r>
+        <m:r>
+          <m:rPr>
+            <m:sty m:val="bi"/>
+          </m:rPr>
+          <w:rPr>
+            <w:rFonts w:ascii="Cambria Math" w:hAnsi="Cambria Math"/>
+          </w:rPr>
+          <m:t>create</m:t>
+        </m:r>
+        <m:r>
+          <m:rPr>
+            <m:sty m:val="b"/>
+          </m:rPr>
+          <w:rPr>
+            <w:rFonts w:ascii="Cambria Math" w:hAnsi="Cambria Math"/>
+          </w:rPr>
+          <m:t>(),</m:t>
         </m:r>
         <m:r>
           <w:rPr>
@@ -4719,6 +4767,9 @@
           <m:t>distributionList</m:t>
         </m:r>
         <m:r>
+          <m:rPr>
+            <m:sty m:val="p"/>
+          </m:rPr>
           <w:rPr>
             <w:rFonts w:ascii="Cambria Math" w:hAnsi="Cambria Math"/>
           </w:rPr>
@@ -4743,7 +4794,19 @@
         <w:rPr>
           <w:rFonts w:eastAsiaTheme="minorEastAsia"/>
         </w:rPr>
-        <w:t xml:space="preserve">Esto último se implementó para </w:t>
+        <w:t>Esto último</w:t>
+      </w:r>
+      <w:r>
+        <w:rPr>
+          <w:rFonts w:eastAsiaTheme="minorEastAsia"/>
+        </w:rPr>
+        <w:t xml:space="preserve"> también</w:t>
+      </w:r>
+      <w:r>
+        <w:rPr>
+          <w:rFonts w:eastAsiaTheme="minorEastAsia"/>
+        </w:rPr>
+        <w:t xml:space="preserve"> se implementó para </w:t>
       </w:r>
       <m:oMath>
         <m:r>
@@ -5354,14 +5417,11 @@
     </w:p>
     <w:p>
       <w:r>
-        <w:rPr>
-          <w:noProof/>
-        </w:rPr>
         <w:drawing>
-          <wp:inline distT="0" distB="0" distL="0" distR="0" wp14:anchorId="50CBDE0B" wp14:editId="22876D8F">
-            <wp:extent cx="5731510" cy="4678045"/>
+          <wp:inline distT="0" distB="0" distL="0" distR="0" wp14:anchorId="3255D12E" wp14:editId="177A3ABF">
+            <wp:extent cx="5731510" cy="4589145"/>
             <wp:effectExtent l="0" t="0" r="0" b="0"/>
-            <wp:docPr id="5" name="Picture 5"/>
+            <wp:docPr id="505699572" name="Picture 1" descr="A diagram of a company&#10;&#10;AI-generated content may be incorrect."/>
             <wp:cNvGraphicFramePr>
               <a:graphicFrameLocks xmlns:a="http://schemas.openxmlformats.org/drawingml/2006/main" noChangeAspect="1"/>
             </wp:cNvGraphicFramePr>
@@ -5369,7 +5429,7 @@
               <a:graphicData uri="http://schemas.openxmlformats.org/drawingml/2006/picture">
                 <pic:pic xmlns:pic="http://schemas.openxmlformats.org/drawingml/2006/picture">
                   <pic:nvPicPr>
-                    <pic:cNvPr id="1" name=""/>
+                    <pic:cNvPr id="505699572" name="Picture 1" descr="A diagram of a company&#10;&#10;AI-generated content may be incorrect."/>
                     <pic:cNvPicPr/>
                   </pic:nvPicPr>
                   <pic:blipFill>
@@ -5381,7 +5441,7 @@
                   <pic:spPr>
                     <a:xfrm>
                       <a:off x="0" y="0"/>
-                      <a:ext cx="5731510" cy="4678045"/>
+                      <a:ext cx="5731510" cy="4589145"/>
                     </a:xfrm>
                     <a:prstGeom prst="rect">
                       <a:avLst/>
@@ -5444,7 +5504,6 @@
         </w:numPr>
       </w:pPr>
       <w:r>
-        <w:lastRenderedPageBreak/>
         <w:t xml:space="preserve">Calcular intervalos de confianza con un </w:t>
       </w:r>
       <m:oMath>
@@ -5467,6 +5526,7 @@
         </w:numPr>
       </w:pPr>
       <w:r>
+        <w:lastRenderedPageBreak/>
         <w:t>Aplicar mejoras al modelo, comparando su rendimiento con la configuración de la etapa anterior, y justificar dichas mejoras mediante análisis cuantitativo de los resultados simulados.</w:t>
       </w:r>
     </w:p>
@@ -5576,22 +5636,14 @@
         <w:rPr>
           <w:rFonts w:eastAsiaTheme="minorEastAsia"/>
         </w:rPr>
-        <w:t>“</w:t>
-      </w:r>
-      <w:proofErr w:type="spellStart"/>
+        <w:t>“f</w:t>
+      </w:r>
       <w:r>
         <w:rPr>
           <w:rFonts w:eastAsiaTheme="minorEastAsia"/>
         </w:rPr>
-        <w:t>f</w:t>
-      </w:r>
-      <w:r>
-        <w:rPr>
-          <w:rFonts w:eastAsiaTheme="minorEastAsia"/>
-        </w:rPr>
         <w:t>actory</w:t>
       </w:r>
-      <w:proofErr w:type="spellEnd"/>
       <w:r>
         <w:rPr>
           <w:rFonts w:eastAsiaTheme="minorEastAsia"/>
@@ -5617,6 +5669,40 @@
           <w:rFonts w:eastAsiaTheme="minorEastAsia"/>
         </w:rPr>
         <w:t>.</w:t>
+      </w:r>
+      <w:r>
+        <w:rPr>
+          <w:rFonts w:eastAsiaTheme="minorEastAsia"/>
+        </w:rPr>
+        <w:t xml:space="preserve"> Además, </w:t>
+      </w:r>
+      <m:oMath>
+        <m:r>
+          <w:rPr>
+            <w:rFonts w:ascii="Cambria Math" w:eastAsiaTheme="minorEastAsia" w:hAnsi="Cambria Math"/>
+          </w:rPr>
+          <m:t>Statistics</m:t>
+        </m:r>
+      </m:oMath>
+      <w:r>
+        <w:rPr>
+          <w:rFonts w:eastAsiaTheme="minorEastAsia"/>
+        </w:rPr>
+        <w:t xml:space="preserve"> se le agrega como atributo  </w:t>
+      </w:r>
+      <m:oMath>
+        <m:r>
+          <w:rPr>
+            <w:rFonts w:ascii="Cambria Math" w:eastAsiaTheme="minorEastAsia" w:hAnsi="Cambria Math"/>
+          </w:rPr>
+          <m:t>Servers</m:t>
+        </m:r>
+      </m:oMath>
+      <w:r>
+        <w:rPr>
+          <w:rFonts w:eastAsiaTheme="minorEastAsia"/>
+        </w:rPr>
+        <w:t>, ya que se requiere para computar las estadísticas relacionadas al ocio y durabilidad de cada servidor.</w:t>
       </w:r>
     </w:p>
     <w:p>
@@ -5890,7 +5976,6 @@
         </w:numPr>
       </w:pPr>
       <w:r>
-        <w:lastRenderedPageBreak/>
         <w:t xml:space="preserve">Para el muestreo de estadísticas correspondiente a la replicación de ejecuciones, se creó </w:t>
       </w:r>
       <m:oMath>
@@ -5905,7 +5990,14 @@
         <w:rPr>
           <w:rFonts w:eastAsiaTheme="minorEastAsia"/>
         </w:rPr>
-        <w:t xml:space="preserve">, la cual almacenara en una lista las estadísticas de cada ejecución de la simulación. Esta misma tiene como atributo </w:t>
+        <w:t xml:space="preserve">, la cual almacenara en una lista las estadísticas de cada ejecución de la simulación. Esta misma tiene como </w:t>
+      </w:r>
+      <w:r>
+        <w:rPr>
+          <w:rFonts w:eastAsiaTheme="minorEastAsia"/>
+        </w:rPr>
+        <w:lastRenderedPageBreak/>
+        <w:t xml:space="preserve">atributo </w:t>
       </w:r>
       <m:oMath>
         <m:r>
@@ -5936,15 +6028,7 @@
         </w:numPr>
       </w:pPr>
       <w:r>
-        <w:t xml:space="preserve">Para calcular los intervalos de confianza de cada estadística, integramos programación funcional en Java (lambdas y </w:t>
-      </w:r>
-      <w:proofErr w:type="spellStart"/>
-      <w:r>
-        <w:t>streams</w:t>
-      </w:r>
-      <w:proofErr w:type="spellEnd"/>
-      <w:r>
-        <w:t>), lo que mejoró considerablemente la legibilidad, eficiencia y concisión del código. Esta mejora se extendió también a clases de etapas previas, como los Comparators, donde aplicamos funciones lambda para simplificar la lógica de ordenamiento de eventos y selección de servidores</w:t>
+        <w:t>Para calcular los intervalos de confianza de cada estadística, integramos programación funcional en Java (lambdas y streams), lo que mejoró considerablemente la legibilidad, eficiencia y concisión del código. Esta mejora se extendió también a clases de etapas previas, como los Comparators, donde aplicamos funciones lambda para simplificar la lógica de ordenamiento de eventos y selección de servidores</w:t>
       </w:r>
       <w:r>
         <w:t>.</w:t>
@@ -6013,7 +6097,6 @@
                 <w:lang w:val="en-US"/>
               </w:rPr>
             </w:pPr>
-            <w:proofErr w:type="spellStart"/>
             <w:r>
               <w:rPr>
                 <w:sz w:val="24"/>
@@ -6022,7 +6105,6 @@
               </w:rPr>
               <w:t>Métrica</w:t>
             </w:r>
-            <w:proofErr w:type="spellEnd"/>
           </w:p>
         </w:tc>
         <w:tc>
@@ -6045,18 +6127,8 @@
                 <w:szCs w:val="24"/>
                 <w:lang w:val="en-US"/>
               </w:rPr>
-              <w:t xml:space="preserve">Sin </w:t>
-            </w:r>
-            <w:proofErr w:type="spellStart"/>
-            <w:r>
-              <w:rPr>
-                <w:sz w:val="24"/>
-                <w:szCs w:val="24"/>
-                <w:lang w:val="en-US"/>
-              </w:rPr>
-              <w:t>mejoras</w:t>
-            </w:r>
-            <w:proofErr w:type="spellEnd"/>
+              <w:t>Sin mejoras</w:t>
+            </w:r>
           </w:p>
         </w:tc>
         <w:tc>
@@ -6079,18 +6151,8 @@
                 <w:szCs w:val="24"/>
                 <w:lang w:val="en-US"/>
               </w:rPr>
-              <w:t xml:space="preserve">Con </w:t>
-            </w:r>
-            <w:proofErr w:type="spellStart"/>
-            <w:r>
-              <w:rPr>
-                <w:sz w:val="24"/>
-                <w:szCs w:val="24"/>
-                <w:lang w:val="en-US"/>
-              </w:rPr>
-              <w:t>mejoras</w:t>
-            </w:r>
-            <w:proofErr w:type="spellEnd"/>
+              <w:t>Con mejoras</w:t>
+            </w:r>
           </w:p>
         </w:tc>
         <w:tc>
@@ -6107,7 +6169,6 @@
                 <w:lang w:val="en-US"/>
               </w:rPr>
             </w:pPr>
-            <w:proofErr w:type="spellStart"/>
             <w:r>
               <w:rPr>
                 <w:sz w:val="24"/>
@@ -6116,7 +6177,6 @@
               </w:rPr>
               <w:t>Comparación</w:t>
             </w:r>
-            <w:proofErr w:type="spellEnd"/>
           </w:p>
         </w:tc>
       </w:tr>
@@ -6139,41 +6199,13 @@
                 <w:lang w:val="en-US"/>
               </w:rPr>
             </w:pPr>
-            <w:proofErr w:type="spellStart"/>
             <w:r>
               <w:rPr>
                 <w:sz w:val="24"/>
                 <w:szCs w:val="24"/>
                 <w:lang w:val="en-US"/>
               </w:rPr>
-              <w:t>Tránsito</w:t>
-            </w:r>
-            <w:proofErr w:type="spellEnd"/>
-            <w:r>
-              <w:rPr>
-                <w:sz w:val="24"/>
-                <w:szCs w:val="24"/>
-                <w:lang w:val="en-US"/>
-              </w:rPr>
-              <w:t xml:space="preserve"> </w:t>
-            </w:r>
-            <w:proofErr w:type="spellStart"/>
-            <w:r>
-              <w:rPr>
-                <w:sz w:val="24"/>
-                <w:szCs w:val="24"/>
-                <w:lang w:val="en-US"/>
-              </w:rPr>
-              <w:t>máx</w:t>
-            </w:r>
-            <w:proofErr w:type="spellEnd"/>
-            <w:r>
-              <w:rPr>
-                <w:sz w:val="24"/>
-                <w:szCs w:val="24"/>
-                <w:lang w:val="en-US"/>
-              </w:rPr>
-              <w:t>.</w:t>
+              <w:t>Tránsito máx.</w:t>
             </w:r>
           </w:p>
         </w:tc>
@@ -6261,36 +6293,8 @@
                 <w:szCs w:val="24"/>
                 <w:lang w:val="en-US"/>
               </w:rPr>
-              <w:t>M</w:t>
-            </w:r>
-            <w:proofErr w:type="spellStart"/>
-            <w:r>
-              <w:rPr>
-                <w:sz w:val="24"/>
-                <w:szCs w:val="24"/>
-                <w:lang w:val="en-US"/>
-              </w:rPr>
-              <w:t>enor</w:t>
-            </w:r>
-            <w:proofErr w:type="spellEnd"/>
-            <w:r>
-              <w:rPr>
-                <w:sz w:val="24"/>
-                <w:szCs w:val="24"/>
-                <w:lang w:val="en-US"/>
-              </w:rPr>
-              <w:t xml:space="preserve"> </w:t>
-            </w:r>
-            <w:proofErr w:type="spellStart"/>
-            <w:r>
-              <w:rPr>
-                <w:sz w:val="24"/>
-                <w:szCs w:val="24"/>
-                <w:lang w:val="en-US"/>
-              </w:rPr>
-              <w:t>congestión</w:t>
-            </w:r>
-            <w:proofErr w:type="spellEnd"/>
+              <w:t>Menor congestión</w:t>
+            </w:r>
           </w:p>
         </w:tc>
       </w:tr>
@@ -6312,23 +6316,13 @@
                 <w:lang w:val="en-US"/>
               </w:rPr>
             </w:pPr>
-            <w:proofErr w:type="spellStart"/>
             <w:r>
               <w:rPr>
                 <w:sz w:val="24"/>
                 <w:szCs w:val="24"/>
                 <w:lang w:val="en-US"/>
               </w:rPr>
-              <w:t>Tránsito</w:t>
-            </w:r>
-            <w:proofErr w:type="spellEnd"/>
-            <w:r>
-              <w:rPr>
-                <w:sz w:val="24"/>
-                <w:szCs w:val="24"/>
-                <w:lang w:val="en-US"/>
-              </w:rPr>
-              <w:t xml:space="preserve"> medio</w:t>
+              <w:t>Tránsito medio</w:t>
             </w:r>
           </w:p>
         </w:tc>
@@ -6416,18 +6410,8 @@
                 <w:szCs w:val="24"/>
                 <w:lang w:val="en-US"/>
               </w:rPr>
-              <w:t>S</w:t>
-            </w:r>
-            <w:proofErr w:type="spellStart"/>
-            <w:r>
-              <w:rPr>
-                <w:sz w:val="24"/>
-                <w:szCs w:val="24"/>
-                <w:lang w:val="en-US"/>
-              </w:rPr>
-              <w:t>imilar</w:t>
-            </w:r>
-            <w:proofErr w:type="spellEnd"/>
+              <w:t>Similar</w:t>
+            </w:r>
           </w:p>
         </w:tc>
       </w:tr>
@@ -6450,41 +6434,13 @@
                 <w:lang w:val="en-US"/>
               </w:rPr>
             </w:pPr>
-            <w:proofErr w:type="spellStart"/>
             <w:r>
               <w:rPr>
                 <w:sz w:val="24"/>
                 <w:szCs w:val="24"/>
                 <w:lang w:val="en-US"/>
               </w:rPr>
-              <w:t>Tránsito</w:t>
-            </w:r>
-            <w:proofErr w:type="spellEnd"/>
-            <w:r>
-              <w:rPr>
-                <w:sz w:val="24"/>
-                <w:szCs w:val="24"/>
-                <w:lang w:val="en-US"/>
-              </w:rPr>
-              <w:t xml:space="preserve"> </w:t>
-            </w:r>
-            <w:proofErr w:type="spellStart"/>
-            <w:r>
-              <w:rPr>
-                <w:sz w:val="24"/>
-                <w:szCs w:val="24"/>
-                <w:lang w:val="en-US"/>
-              </w:rPr>
-              <w:t>mín</w:t>
-            </w:r>
-            <w:proofErr w:type="spellEnd"/>
-            <w:r>
-              <w:rPr>
-                <w:sz w:val="24"/>
-                <w:szCs w:val="24"/>
-                <w:lang w:val="en-US"/>
-              </w:rPr>
-              <w:t>.</w:t>
+              <w:t>Tránsito mín.</w:t>
             </w:r>
           </w:p>
         </w:tc>
@@ -6572,18 +6528,8 @@
                 <w:szCs w:val="24"/>
                 <w:lang w:val="en-US"/>
               </w:rPr>
-              <w:t>I</w:t>
-            </w:r>
-            <w:proofErr w:type="spellStart"/>
-            <w:r>
-              <w:rPr>
-                <w:sz w:val="24"/>
-                <w:szCs w:val="24"/>
-                <w:lang w:val="en-US"/>
-              </w:rPr>
-              <w:t>gual</w:t>
-            </w:r>
-            <w:proofErr w:type="spellEnd"/>
+              <w:t>Igual</w:t>
+            </w:r>
           </w:p>
         </w:tc>
       </w:tr>
@@ -6605,41 +6551,13 @@
                 <w:lang w:val="en-US"/>
               </w:rPr>
             </w:pPr>
-            <w:proofErr w:type="spellStart"/>
             <w:r>
               <w:rPr>
                 <w:sz w:val="24"/>
                 <w:szCs w:val="24"/>
                 <w:lang w:val="en-US"/>
               </w:rPr>
-              <w:t>Espera</w:t>
-            </w:r>
-            <w:proofErr w:type="spellEnd"/>
-            <w:r>
-              <w:rPr>
-                <w:sz w:val="24"/>
-                <w:szCs w:val="24"/>
-                <w:lang w:val="en-US"/>
-              </w:rPr>
-              <w:t xml:space="preserve"> </w:t>
-            </w:r>
-            <w:proofErr w:type="spellStart"/>
-            <w:r>
-              <w:rPr>
-                <w:sz w:val="24"/>
-                <w:szCs w:val="24"/>
-                <w:lang w:val="en-US"/>
-              </w:rPr>
-              <w:t>máx</w:t>
-            </w:r>
-            <w:proofErr w:type="spellEnd"/>
-            <w:r>
-              <w:rPr>
-                <w:sz w:val="24"/>
-                <w:szCs w:val="24"/>
-                <w:lang w:val="en-US"/>
-              </w:rPr>
-              <w:t>.</w:t>
+              <w:t>Espera máx.</w:t>
             </w:r>
           </w:p>
         </w:tc>
@@ -6727,18 +6645,8 @@
                 <w:szCs w:val="24"/>
                 <w:lang w:val="en-US"/>
               </w:rPr>
-              <w:t>S</w:t>
-            </w:r>
-            <w:proofErr w:type="spellStart"/>
-            <w:r>
-              <w:rPr>
-                <w:sz w:val="24"/>
-                <w:szCs w:val="24"/>
-                <w:lang w:val="en-US"/>
-              </w:rPr>
-              <w:t>ignificativamente</w:t>
-            </w:r>
-            <w:proofErr w:type="spellEnd"/>
+              <w:t>Significativamente</w:t>
+            </w:r>
           </w:p>
         </w:tc>
       </w:tr>
@@ -6761,23 +6669,13 @@
                 <w:lang w:val="en-US"/>
               </w:rPr>
             </w:pPr>
-            <w:proofErr w:type="spellStart"/>
             <w:r>
               <w:rPr>
                 <w:sz w:val="24"/>
                 <w:szCs w:val="24"/>
                 <w:lang w:val="en-US"/>
               </w:rPr>
-              <w:t>Espera</w:t>
-            </w:r>
-            <w:proofErr w:type="spellEnd"/>
-            <w:r>
-              <w:rPr>
-                <w:sz w:val="24"/>
-                <w:szCs w:val="24"/>
-                <w:lang w:val="en-US"/>
-              </w:rPr>
-              <w:t xml:space="preserve"> media</w:t>
+              <w:t>Espera media</w:t>
             </w:r>
           </w:p>
         </w:tc>
@@ -6865,25 +6763,7 @@
                 <w:szCs w:val="24"/>
                 <w:lang w:val="en-US"/>
               </w:rPr>
-              <w:t xml:space="preserve">Menor 50% </w:t>
-            </w:r>
-            <w:proofErr w:type="spellStart"/>
-            <w:r>
-              <w:rPr>
-                <w:sz w:val="24"/>
-                <w:szCs w:val="24"/>
-                <w:lang w:val="en-US"/>
-              </w:rPr>
-              <w:t>aprox</w:t>
-            </w:r>
-            <w:proofErr w:type="spellEnd"/>
-            <w:r>
-              <w:rPr>
-                <w:sz w:val="24"/>
-                <w:szCs w:val="24"/>
-                <w:lang w:val="en-US"/>
-              </w:rPr>
-              <w:t>.</w:t>
+              <w:t>Menor 50% aprox.</w:t>
             </w:r>
           </w:p>
         </w:tc>
@@ -6906,41 +6786,13 @@
                 <w:lang w:val="en-US"/>
               </w:rPr>
             </w:pPr>
-            <w:proofErr w:type="spellStart"/>
             <w:r>
               <w:rPr>
                 <w:sz w:val="24"/>
                 <w:szCs w:val="24"/>
                 <w:lang w:val="en-US"/>
               </w:rPr>
-              <w:t>Espera</w:t>
-            </w:r>
-            <w:proofErr w:type="spellEnd"/>
-            <w:r>
-              <w:rPr>
-                <w:sz w:val="24"/>
-                <w:szCs w:val="24"/>
-                <w:lang w:val="en-US"/>
-              </w:rPr>
-              <w:t xml:space="preserve"> </w:t>
-            </w:r>
-            <w:proofErr w:type="spellStart"/>
-            <w:r>
-              <w:rPr>
-                <w:sz w:val="24"/>
-                <w:szCs w:val="24"/>
-                <w:lang w:val="en-US"/>
-              </w:rPr>
-              <w:t>mín</w:t>
-            </w:r>
-            <w:proofErr w:type="spellEnd"/>
-            <w:r>
-              <w:rPr>
-                <w:sz w:val="24"/>
-                <w:szCs w:val="24"/>
-                <w:lang w:val="en-US"/>
-              </w:rPr>
-              <w:t>.</w:t>
+              <w:t>Espera mín.</w:t>
             </w:r>
           </w:p>
         </w:tc>
@@ -7028,36 +6880,8 @@
                 <w:szCs w:val="24"/>
                 <w:lang w:val="en-US"/>
               </w:rPr>
-              <w:t>M</w:t>
-            </w:r>
-            <w:proofErr w:type="spellStart"/>
-            <w:r>
-              <w:rPr>
-                <w:sz w:val="24"/>
-                <w:szCs w:val="24"/>
-                <w:lang w:val="en-US"/>
-              </w:rPr>
-              <w:t>ás</w:t>
-            </w:r>
-            <w:proofErr w:type="spellEnd"/>
-            <w:r>
-              <w:rPr>
-                <w:sz w:val="24"/>
-                <w:szCs w:val="24"/>
-                <w:lang w:val="en-US"/>
-              </w:rPr>
-              <w:t xml:space="preserve"> </w:t>
-            </w:r>
-            <w:proofErr w:type="spellStart"/>
-            <w:r>
-              <w:rPr>
-                <w:sz w:val="24"/>
-                <w:szCs w:val="24"/>
-                <w:lang w:val="en-US"/>
-              </w:rPr>
-              <w:t>eficiente</w:t>
-            </w:r>
-            <w:proofErr w:type="spellEnd"/>
+              <w:t>Más eficiente</w:t>
+            </w:r>
           </w:p>
         </w:tc>
       </w:tr>
@@ -7080,23 +6904,13 @@
                 <w:lang w:val="en-US"/>
               </w:rPr>
             </w:pPr>
-            <w:proofErr w:type="spellStart"/>
             <w:r>
               <w:rPr>
                 <w:sz w:val="24"/>
                 <w:szCs w:val="24"/>
                 <w:lang w:val="en-US"/>
               </w:rPr>
-              <w:t>Durabilidad</w:t>
-            </w:r>
-            <w:proofErr w:type="spellEnd"/>
-            <w:r>
-              <w:rPr>
-                <w:sz w:val="24"/>
-                <w:szCs w:val="24"/>
-                <w:lang w:val="en-US"/>
-              </w:rPr>
-              <w:t xml:space="preserve"> total</w:t>
+              <w:t>Durabilidad total</w:t>
             </w:r>
           </w:p>
         </w:tc>
@@ -7265,34 +7079,14 @@
                 <w:lang w:val="en-US"/>
               </w:rPr>
             </w:pPr>
-            <w:proofErr w:type="spellStart"/>
             <w:r>
               <w:rPr>
                 <w:sz w:val="24"/>
                 <w:szCs w:val="24"/>
                 <w:lang w:val="en-US"/>
               </w:rPr>
-              <w:t>Distribución</w:t>
-            </w:r>
-            <w:proofErr w:type="spellEnd"/>
-            <w:r>
-              <w:rPr>
-                <w:sz w:val="24"/>
-                <w:szCs w:val="24"/>
-                <w:lang w:val="en-US"/>
-              </w:rPr>
-              <w:t xml:space="preserve"> </w:t>
-            </w:r>
-            <w:proofErr w:type="spellStart"/>
-            <w:r>
-              <w:rPr>
-                <w:sz w:val="24"/>
-                <w:szCs w:val="24"/>
-                <w:lang w:val="en-US"/>
-              </w:rPr>
-              <w:t>equilibrada</w:t>
-            </w:r>
-            <w:proofErr w:type="spellEnd"/>
+              <w:t>Distribución equilibrada</w:t>
+            </w:r>
           </w:p>
         </w:tc>
       </w:tr>
@@ -7314,23 +7108,13 @@
                 <w:lang w:val="en-US"/>
               </w:rPr>
             </w:pPr>
-            <w:proofErr w:type="spellStart"/>
             <w:r>
               <w:rPr>
                 <w:sz w:val="24"/>
                 <w:szCs w:val="24"/>
                 <w:lang w:val="en-US"/>
               </w:rPr>
-              <w:t>Ocio</w:t>
-            </w:r>
-            <w:proofErr w:type="spellEnd"/>
-            <w:r>
-              <w:rPr>
-                <w:sz w:val="24"/>
-                <w:szCs w:val="24"/>
-                <w:lang w:val="en-US"/>
-              </w:rPr>
-              <w:t xml:space="preserve"> total</w:t>
+              <w:t>Ocio total</w:t>
             </w:r>
           </w:p>
         </w:tc>
@@ -7412,23 +7196,13 @@
                 <w:lang w:val="en-US"/>
               </w:rPr>
             </w:pPr>
-            <w:proofErr w:type="spellStart"/>
             <w:r>
               <w:rPr>
                 <w:sz w:val="24"/>
                 <w:szCs w:val="24"/>
                 <w:lang w:val="en-US"/>
               </w:rPr>
-              <w:t>Homogéneo</w:t>
-            </w:r>
-            <w:proofErr w:type="spellEnd"/>
-            <w:r>
-              <w:rPr>
-                <w:sz w:val="24"/>
-                <w:szCs w:val="24"/>
-                <w:lang w:val="en-US"/>
-              </w:rPr>
-              <w:t xml:space="preserve"> (</w:t>
+              <w:t>Homogéneo (</w:t>
             </w:r>
             <m:oMath>
               <m:r>
@@ -7490,25 +7264,7 @@
                 <w:szCs w:val="24"/>
                 <w:lang w:val="en-US"/>
               </w:rPr>
-              <w:t xml:space="preserve">Mejor </w:t>
-            </w:r>
-            <w:proofErr w:type="spellStart"/>
-            <w:r>
-              <w:rPr>
-                <w:sz w:val="24"/>
-                <w:szCs w:val="24"/>
-                <w:lang w:val="en-US"/>
-              </w:rPr>
-              <w:t>distribución</w:t>
-            </w:r>
-            <w:proofErr w:type="spellEnd"/>
-            <w:r>
-              <w:rPr>
-                <w:sz w:val="24"/>
-                <w:szCs w:val="24"/>
-                <w:lang w:val="en-US"/>
-              </w:rPr>
-              <w:t xml:space="preserve"> de carga</w:t>
+              <w:t>Mejor distribución de carga</w:t>
             </w:r>
           </w:p>
         </w:tc>
@@ -8256,9 +8012,6 @@
           <w:rStyle w:val="FootnoteReference"/>
         </w:rPr>
         <w:footnoteRef/>
-      </w:r>
-      <w:r>
-        <w:t xml:space="preserve"> </w:t>
       </w:r>
       <m:oMath>
         <m:r>
@@ -11966,6 +11719,7 @@
   <w:style w:type="character" w:default="1" w:styleId="DefaultParagraphFont">
     <w:name w:val="Default Paragraph Font"/>
     <w:uiPriority w:val="1"/>
+    <w:semiHidden/>
     <w:unhideWhenUsed/>
   </w:style>
   <w:style w:type="table" w:default="1" w:styleId="TableNormal">
@@ -12865,11 +12619,16 @@
     <w:rsid w:val="00036689"/>
     <w:rsid w:val="00060BB7"/>
     <w:rsid w:val="002F77C9"/>
+    <w:rsid w:val="003833C5"/>
+    <w:rsid w:val="0039094A"/>
     <w:rsid w:val="00495A74"/>
     <w:rsid w:val="00605491"/>
     <w:rsid w:val="006111CB"/>
+    <w:rsid w:val="006B33DD"/>
+    <w:rsid w:val="007548C4"/>
     <w:rsid w:val="0085071F"/>
     <w:rsid w:val="00914371"/>
+    <w:rsid w:val="00964118"/>
     <w:rsid w:val="00986A60"/>
     <w:rsid w:val="00AA60BC"/>
     <w:rsid w:val="00AC622D"/>
@@ -13351,7 +13110,7 @@
     <w:basedOn w:val="DefaultParagraphFont"/>
     <w:uiPriority w:val="99"/>
     <w:semiHidden/>
-    <w:rsid w:val="006111CB"/>
+    <w:rsid w:val="0039094A"/>
     <w:rPr>
       <w:color w:val="666666"/>
     </w:rPr>

</xml_diff>

<commit_message>
Listo para entregar. Sujeto a modificaciones
</commit_message>
<xml_diff>
--- a/Informe Trabajo Integrador MyS.docx
+++ b/Informe Trabajo Integrador MyS.docx
@@ -1,6 +1,6 @@
 
 <file path=word/document.xml><?xml version="1.0" encoding="utf-8"?>
-<w:document xmlns:wpc="http://schemas.microsoft.com/office/word/2010/wordprocessingCanvas" xmlns:cx="http://schemas.microsoft.com/office/drawing/2014/chartex" xmlns:cx1="http://schemas.microsoft.com/office/drawing/2015/9/8/chartex" xmlns:cx2="http://schemas.microsoft.com/office/drawing/2015/10/21/chartex" xmlns:cx3="http://schemas.microsoft.com/office/drawing/2016/5/9/chartex" xmlns:cx4="http://schemas.microsoft.com/office/drawing/2016/5/10/chartex" xmlns:cx5="http://schemas.microsoft.com/office/drawing/2016/5/11/chartex" xmlns:cx6="http://schemas.microsoft.com/office/drawing/2016/5/12/chartex" xmlns:cx7="http://schemas.microsoft.com/office/drawing/2016/5/13/chartex" xmlns:cx8="http://schemas.microsoft.com/office/drawing/2016/5/14/chartex" xmlns:mc="http://schemas.openxmlformats.org/markup-compatibility/2006" xmlns:aink="http://schemas.microsoft.com/office/drawing/2016/ink" xmlns:am3d="http://schemas.microsoft.com/office/drawing/2017/model3d" xmlns:o="urn:schemas-microsoft-com:office:office" xmlns:oel="http://schemas.microsoft.com/office/2019/extlst" xmlns:r="http://schemas.openxmlformats.org/officeDocument/2006/relationships" xmlns:m="http://schemas.openxmlformats.org/officeDocument/2006/math" xmlns:v="urn:schemas-microsoft-com:vml" xmlns:wp14="http://schemas.microsoft.com/office/word/2010/wordprocessingDrawing" xmlns:wp="http://schemas.openxmlformats.org/drawingml/2006/wordprocessingDrawing" xmlns:w10="urn:schemas-microsoft-com:office:word" xmlns:w="http://schemas.openxmlformats.org/wordprocessingml/2006/main" xmlns:w14="http://schemas.microsoft.com/office/word/2010/wordml" xmlns:w15="http://schemas.microsoft.com/office/word/2012/wordml" xmlns:w16cex="http://schemas.microsoft.com/office/word/2018/wordml/cex" xmlns:w16cid="http://schemas.microsoft.com/office/word/2016/wordml/cid" xmlns:w16="http://schemas.microsoft.com/office/word/2018/wordml" xmlns:w16du="http://schemas.microsoft.com/office/word/2023/wordml/word16du" xmlns:w16sdtdh="http://schemas.microsoft.com/office/word/2020/wordml/sdtdatahash" xmlns:w16sdtfl="http://schemas.microsoft.com/office/word/2024/wordml/sdtformatlock" xmlns:w16se="http://schemas.microsoft.com/office/word/2015/wordml/symex" xmlns:wpg="http://schemas.microsoft.com/office/word/2010/wordprocessingGroup" xmlns:wpi="http://schemas.microsoft.com/office/word/2010/wordprocessingInk" xmlns:wne="http://schemas.microsoft.com/office/word/2006/wordml" xmlns:wps="http://schemas.microsoft.com/office/word/2010/wordprocessingShape" mc:Ignorable="w14 w15 w16se w16cid w16 w16cex w16sdtdh w16sdtfl w16du wp14">
+<w:document xmlns:wpc="http://schemas.microsoft.com/office/word/2010/wordprocessingCanvas" xmlns:cx="http://schemas.microsoft.com/office/drawing/2014/chartex" xmlns:cx1="http://schemas.microsoft.com/office/drawing/2015/9/8/chartex" xmlns:cx2="http://schemas.microsoft.com/office/drawing/2015/10/21/chartex" xmlns:cx3="http://schemas.microsoft.com/office/drawing/2016/5/9/chartex" xmlns:cx4="http://schemas.microsoft.com/office/drawing/2016/5/10/chartex" xmlns:cx5="http://schemas.microsoft.com/office/drawing/2016/5/11/chartex" xmlns:cx6="http://schemas.microsoft.com/office/drawing/2016/5/12/chartex" xmlns:cx7="http://schemas.microsoft.com/office/drawing/2016/5/13/chartex" xmlns:cx8="http://schemas.microsoft.com/office/drawing/2016/5/14/chartex" xmlns:mc="http://schemas.openxmlformats.org/markup-compatibility/2006" xmlns:aink="http://schemas.microsoft.com/office/drawing/2016/ink" xmlns:am3d="http://schemas.microsoft.com/office/drawing/2017/model3d" xmlns:o="urn:schemas-microsoft-com:office:office" xmlns:oel="http://schemas.microsoft.com/office/2019/extlst" xmlns:r="http://schemas.openxmlformats.org/officeDocument/2006/relationships" xmlns:m="http://schemas.openxmlformats.org/officeDocument/2006/math" xmlns:v="urn:schemas-microsoft-com:vml" xmlns:wp14="http://schemas.microsoft.com/office/word/2010/wordprocessingDrawing" xmlns:wp="http://schemas.openxmlformats.org/drawingml/2006/wordprocessingDrawing" xmlns:w10="urn:schemas-microsoft-com:office:word" xmlns:w="http://schemas.openxmlformats.org/wordprocessingml/2006/main" xmlns:w14="http://schemas.microsoft.com/office/word/2010/wordml" xmlns:w15="http://schemas.microsoft.com/office/word/2012/wordml" xmlns:w16cex="http://schemas.microsoft.com/office/word/2018/wordml/cex" xmlns:w16cid="http://schemas.microsoft.com/office/word/2016/wordml/cid" xmlns:w16="http://schemas.microsoft.com/office/word/2018/wordml" xmlns:w16sdtdh="http://schemas.microsoft.com/office/word/2020/wordml/sdtdatahash" xmlns:w16se="http://schemas.microsoft.com/office/word/2015/wordml/symex" xmlns:wpg="http://schemas.microsoft.com/office/word/2010/wordprocessingGroup" xmlns:wpi="http://schemas.microsoft.com/office/word/2010/wordprocessingInk" xmlns:wne="http://schemas.microsoft.com/office/word/2006/wordml" xmlns:wps="http://schemas.microsoft.com/office/word/2010/wordprocessingShape" mc:Ignorable="w14 w15 w16se w16cid w16 w16cex w16sdtdh wp14">
   <w:body>
     <w:sdt>
       <w:sdtPr>
@@ -171,14 +171,34 @@
                   <w:szCs w:val="28"/>
                 </w:rPr>
               </w:pPr>
+              <w:proofErr w:type="spellStart"/>
               <w:r>
                 <w:rPr>
                   <w:color w:val="1CADE4" w:themeColor="accent1"/>
                   <w:sz w:val="28"/>
                   <w:szCs w:val="28"/>
                 </w:rPr>
-                <w:t>Profs. Cristian Tissera</w:t>
+                <w:t>Profs</w:t>
               </w:r>
+              <w:proofErr w:type="spellEnd"/>
+              <w:r>
+                <w:rPr>
+                  <w:color w:val="1CADE4" w:themeColor="accent1"/>
+                  <w:sz w:val="28"/>
+                  <w:szCs w:val="28"/>
+                </w:rPr>
+                <w:t xml:space="preserve">. Cristian </w:t>
+              </w:r>
+              <w:proofErr w:type="spellStart"/>
+              <w:r>
+                <w:rPr>
+                  <w:color w:val="1CADE4" w:themeColor="accent1"/>
+                  <w:sz w:val="28"/>
+                  <w:szCs w:val="28"/>
+                </w:rPr>
+                <w:t>Tissera</w:t>
+              </w:r>
+              <w:proofErr w:type="spellEnd"/>
               <w:r>
                 <w:rPr>
                   <w:color w:val="1CADE4" w:themeColor="accent1"/>
@@ -193,8 +213,18 @@
                   <w:sz w:val="28"/>
                   <w:szCs w:val="28"/>
                 </w:rPr>
-                <w:t xml:space="preserve"> Danilo Labella</w:t>
+                <w:t xml:space="preserve"> Danilo </w:t>
               </w:r>
+              <w:proofErr w:type="spellStart"/>
+              <w:r>
+                <w:rPr>
+                  <w:color w:val="1CADE4" w:themeColor="accent1"/>
+                  <w:sz w:val="28"/>
+                  <w:szCs w:val="28"/>
+                </w:rPr>
+                <w:t>Labella</w:t>
+              </w:r>
+              <w:proofErr w:type="spellEnd"/>
               <w:r>
                 <w:rPr>
                   <w:color w:val="1CADE4" w:themeColor="accent1"/>
@@ -3056,6 +3086,9 @@
     </w:p>
     <w:p>
       <w:r>
+        <w:rPr>
+          <w:noProof/>
+        </w:rPr>
         <w:drawing>
           <wp:inline distT="0" distB="0" distL="0" distR="0" wp14:anchorId="6EF8CA5A" wp14:editId="66E77AAA">
             <wp:extent cx="5731510" cy="3423920"/>
@@ -3443,12 +3476,21 @@
         </w:rPr>
         <w:t>: Corroboramos el ge</w:t>
       </w:r>
+      <w:proofErr w:type="spellStart"/>
       <w:r>
         <w:rPr>
           <w:rFonts w:eastAsiaTheme="minorEastAsia"/>
           <w:lang w:val="es-ES"/>
         </w:rPr>
-        <w:t>nerador de códigos para entidades.</w:t>
+        <w:t>nerador</w:t>
+      </w:r>
+      <w:proofErr w:type="spellEnd"/>
+      <w:r>
+        <w:rPr>
+          <w:rFonts w:eastAsiaTheme="minorEastAsia"/>
+          <w:lang w:val="es-ES"/>
+        </w:rPr>
+        <w:t xml:space="preserve"> de códigos para entidades.</w:t>
       </w:r>
     </w:p>
     <w:p>
@@ -3535,7 +3577,15 @@
     </w:p>
     <w:p>
       <w:r>
-        <w:t xml:space="preserve">Luego de verificar el correcto funcionamiento de las clases de interés, podíamos proceder a verificar que los resultados (estadísticas) de la simulación. Esto se realizó mediante una hoja de calculo </w:t>
+        <w:t xml:space="preserve">Luego de verificar el correcto funcionamiento de las clases de interés, podíamos proceder a verificar que los resultados (estadísticas) de la simulación. Esto se realizó mediante una hoja de </w:t>
+      </w:r>
+      <w:proofErr w:type="spellStart"/>
+      <w:r>
+        <w:t>calculo</w:t>
+      </w:r>
+      <w:proofErr w:type="spellEnd"/>
+      <w:r>
+        <w:t xml:space="preserve"> </w:t>
       </w:r>
       <w:r>
         <w:t>hecha a mano utilizando un generador de números aleatorios estáticos.</w:t>
@@ -3653,9 +3703,6 @@
       </w:r>
       <w:r>
         <w:t>.</w:t>
-      </w:r>
-      <w:r>
-        <w:t xml:space="preserve"> Además, opcionalmente incorporar distribuciones Empírica Continua, Triangular, Poisson.</w:t>
       </w:r>
     </w:p>
     <w:p>
@@ -3861,10 +3908,10 @@
     <w:p>
       <w:r>
         <w:drawing>
-          <wp:inline distT="0" distB="0" distL="0" distR="0" wp14:anchorId="1953F088" wp14:editId="6479C80E">
-            <wp:extent cx="5731510" cy="3453130"/>
+          <wp:inline distT="0" distB="0" distL="0" distR="0" wp14:anchorId="24A32A07" wp14:editId="285C92D2">
+            <wp:extent cx="5731510" cy="3009900"/>
             <wp:effectExtent l="0" t="0" r="0" b="0"/>
-            <wp:docPr id="616835737" name="Picture 1" descr="A diagram of a company&#10;&#10;AI-generated content may be incorrect."/>
+            <wp:docPr id="1" name="Picture 1"/>
             <wp:cNvGraphicFramePr>
               <a:graphicFrameLocks xmlns:a="http://schemas.openxmlformats.org/drawingml/2006/main" noChangeAspect="1"/>
             </wp:cNvGraphicFramePr>
@@ -3872,7 +3919,7 @@
               <a:graphicData uri="http://schemas.openxmlformats.org/drawingml/2006/picture">
                 <pic:pic xmlns:pic="http://schemas.openxmlformats.org/drawingml/2006/picture">
                   <pic:nvPicPr>
-                    <pic:cNvPr id="616835737" name="Picture 1" descr="A diagram of a company&#10;&#10;AI-generated content may be incorrect."/>
+                    <pic:cNvPr id="1" name=""/>
                     <pic:cNvPicPr/>
                   </pic:nvPicPr>
                   <pic:blipFill>
@@ -3884,7 +3931,7 @@
                   <pic:spPr>
                     <a:xfrm>
                       <a:off x="0" y="0"/>
-                      <a:ext cx="5731510" cy="3453130"/>
+                      <a:ext cx="5731510" cy="3009900"/>
                     </a:xfrm>
                     <a:prstGeom prst="rect">
                       <a:avLst/>
@@ -4199,7 +4246,6 @@
         <w:rPr>
           <w:rFonts w:eastAsiaTheme="minorEastAsia"/>
         </w:rPr>
-        <w:lastRenderedPageBreak/>
         <w:t>Identificamos una generalización para los atributos estadísticos (</w:t>
       </w:r>
       <m:oMath>
@@ -4214,7 +4260,14 @@
         <w:rPr>
           <w:rFonts w:eastAsiaTheme="minorEastAsia"/>
         </w:rPr>
-        <w:t xml:space="preserve">), ya que los mismos comparten la misma estructura. De esta manera se creó la clase abstracta </w:t>
+        <w:t xml:space="preserve">), ya que los mismos comparten la misma estructura. De </w:t>
+      </w:r>
+      <w:r>
+        <w:rPr>
+          <w:rFonts w:eastAsiaTheme="minorEastAsia"/>
+        </w:rPr>
+        <w:lastRenderedPageBreak/>
+        <w:t xml:space="preserve">esta manera se creó la clase abstracta </w:t>
       </w:r>
       <m:oMath>
         <m:r>
@@ -4495,14 +4548,22 @@
         <w:rPr>
           <w:rFonts w:eastAsiaTheme="minorEastAsia"/>
         </w:rPr>
-        <w:t xml:space="preserve"> “f</w:t>
-      </w:r>
+        <w:t xml:space="preserve"> “</w:t>
+      </w:r>
+      <w:proofErr w:type="spellStart"/>
       <w:r>
         <w:rPr>
           <w:rFonts w:eastAsiaTheme="minorEastAsia"/>
         </w:rPr>
+        <w:t>f</w:t>
+      </w:r>
+      <w:r>
+        <w:rPr>
+          <w:rFonts w:eastAsiaTheme="minorEastAsia"/>
+        </w:rPr>
         <w:t>actory</w:t>
       </w:r>
+      <w:proofErr w:type="spellEnd"/>
       <w:r>
         <w:rPr>
           <w:rFonts w:eastAsiaTheme="minorEastAsia"/>
@@ -5060,7 +5121,6 @@
           <w:b/>
           <w:bCs/>
         </w:rPr>
-        <w:lastRenderedPageBreak/>
         <w:t>5 servidores</w:t>
       </w:r>
       <w:r>
@@ -5198,6 +5258,7 @@
           <w:b/>
           <w:bCs/>
         </w:rPr>
+        <w:lastRenderedPageBreak/>
         <w:t>3 servidores</w:t>
       </w:r>
       <w:r>
@@ -5418,10 +5479,10 @@
     <w:p>
       <w:r>
         <w:drawing>
-          <wp:inline distT="0" distB="0" distL="0" distR="0" wp14:anchorId="3255D12E" wp14:editId="177A3ABF">
-            <wp:extent cx="5731510" cy="4589145"/>
+          <wp:inline distT="0" distB="0" distL="0" distR="0" wp14:anchorId="0BD3E647" wp14:editId="23C5D11B">
+            <wp:extent cx="5731510" cy="4236720"/>
             <wp:effectExtent l="0" t="0" r="0" b="0"/>
-            <wp:docPr id="505699572" name="Picture 1" descr="A diagram of a company&#10;&#10;AI-generated content may be incorrect."/>
+            <wp:docPr id="2" name="Picture 2"/>
             <wp:cNvGraphicFramePr>
               <a:graphicFrameLocks xmlns:a="http://schemas.openxmlformats.org/drawingml/2006/main" noChangeAspect="1"/>
             </wp:cNvGraphicFramePr>
@@ -5429,7 +5490,7 @@
               <a:graphicData uri="http://schemas.openxmlformats.org/drawingml/2006/picture">
                 <pic:pic xmlns:pic="http://schemas.openxmlformats.org/drawingml/2006/picture">
                   <pic:nvPicPr>
-                    <pic:cNvPr id="505699572" name="Picture 1" descr="A diagram of a company&#10;&#10;AI-generated content may be incorrect."/>
+                    <pic:cNvPr id="1" name=""/>
                     <pic:cNvPicPr/>
                   </pic:nvPicPr>
                   <pic:blipFill>
@@ -5441,7 +5502,7 @@
                   <pic:spPr>
                     <a:xfrm>
                       <a:off x="0" y="0"/>
-                      <a:ext cx="5731510" cy="4589145"/>
+                      <a:ext cx="5731510" cy="4236720"/>
                     </a:xfrm>
                     <a:prstGeom prst="rect">
                       <a:avLst/>
@@ -5636,14 +5697,22 @@
         <w:rPr>
           <w:rFonts w:eastAsiaTheme="minorEastAsia"/>
         </w:rPr>
-        <w:t>“f</w:t>
-      </w:r>
+        <w:t>“</w:t>
+      </w:r>
+      <w:proofErr w:type="spellStart"/>
       <w:r>
         <w:rPr>
           <w:rFonts w:eastAsiaTheme="minorEastAsia"/>
         </w:rPr>
+        <w:t>f</w:t>
+      </w:r>
+      <w:r>
+        <w:rPr>
+          <w:rFonts w:eastAsiaTheme="minorEastAsia"/>
+        </w:rPr>
         <w:t>actory</w:t>
       </w:r>
+      <w:proofErr w:type="spellEnd"/>
       <w:r>
         <w:rPr>
           <w:rFonts w:eastAsiaTheme="minorEastAsia"/>
@@ -6028,7 +6097,15 @@
         </w:numPr>
       </w:pPr>
       <w:r>
-        <w:t>Para calcular los intervalos de confianza de cada estadística, integramos programación funcional en Java (lambdas y streams), lo que mejoró considerablemente la legibilidad, eficiencia y concisión del código. Esta mejora se extendió también a clases de etapas previas, como los Comparators, donde aplicamos funciones lambda para simplificar la lógica de ordenamiento de eventos y selección de servidores</w:t>
+        <w:t xml:space="preserve">Para calcular los intervalos de confianza de cada estadística, integramos programación funcional en Java (lambdas y </w:t>
+      </w:r>
+      <w:proofErr w:type="spellStart"/>
+      <w:r>
+        <w:t>streams</w:t>
+      </w:r>
+      <w:proofErr w:type="spellEnd"/>
+      <w:r>
+        <w:t>), lo que mejoró considerablemente la legibilidad, eficiencia y concisión del código. Esta mejora se extendió también a clases de etapas previas, como los Comparators, donde aplicamos funciones lambda para simplificar la lógica de ordenamiento de eventos y selección de servidores</w:t>
       </w:r>
       <w:r>
         <w:t>.</w:t>
@@ -6097,6 +6174,7 @@
                 <w:lang w:val="en-US"/>
               </w:rPr>
             </w:pPr>
+            <w:proofErr w:type="spellStart"/>
             <w:r>
               <w:rPr>
                 <w:sz w:val="24"/>
@@ -6105,6 +6183,7 @@
               </w:rPr>
               <w:t>Métrica</w:t>
             </w:r>
+            <w:proofErr w:type="spellEnd"/>
           </w:p>
         </w:tc>
         <w:tc>
@@ -6127,8 +6206,18 @@
                 <w:szCs w:val="24"/>
                 <w:lang w:val="en-US"/>
               </w:rPr>
-              <w:t>Sin mejoras</w:t>
-            </w:r>
+              <w:t xml:space="preserve">Sin </w:t>
+            </w:r>
+            <w:proofErr w:type="spellStart"/>
+            <w:r>
+              <w:rPr>
+                <w:sz w:val="24"/>
+                <w:szCs w:val="24"/>
+                <w:lang w:val="en-US"/>
+              </w:rPr>
+              <w:t>mejoras</w:t>
+            </w:r>
+            <w:proofErr w:type="spellEnd"/>
           </w:p>
         </w:tc>
         <w:tc>
@@ -6151,8 +6240,18 @@
                 <w:szCs w:val="24"/>
                 <w:lang w:val="en-US"/>
               </w:rPr>
-              <w:t>Con mejoras</w:t>
-            </w:r>
+              <w:t xml:space="preserve">Con </w:t>
+            </w:r>
+            <w:proofErr w:type="spellStart"/>
+            <w:r>
+              <w:rPr>
+                <w:sz w:val="24"/>
+                <w:szCs w:val="24"/>
+                <w:lang w:val="en-US"/>
+              </w:rPr>
+              <w:t>mejoras</w:t>
+            </w:r>
+            <w:proofErr w:type="spellEnd"/>
           </w:p>
         </w:tc>
         <w:tc>
@@ -6169,6 +6268,7 @@
                 <w:lang w:val="en-US"/>
               </w:rPr>
             </w:pPr>
+            <w:proofErr w:type="spellStart"/>
             <w:r>
               <w:rPr>
                 <w:sz w:val="24"/>
@@ -6177,6 +6277,7 @@
               </w:rPr>
               <w:t>Comparación</w:t>
             </w:r>
+            <w:proofErr w:type="spellEnd"/>
           </w:p>
         </w:tc>
       </w:tr>
@@ -6199,13 +6300,41 @@
                 <w:lang w:val="en-US"/>
               </w:rPr>
             </w:pPr>
+            <w:proofErr w:type="spellStart"/>
             <w:r>
               <w:rPr>
                 <w:sz w:val="24"/>
                 <w:szCs w:val="24"/>
                 <w:lang w:val="en-US"/>
               </w:rPr>
-              <w:t>Tránsito máx.</w:t>
+              <w:t>Tránsito</w:t>
+            </w:r>
+            <w:proofErr w:type="spellEnd"/>
+            <w:r>
+              <w:rPr>
+                <w:sz w:val="24"/>
+                <w:szCs w:val="24"/>
+                <w:lang w:val="en-US"/>
+              </w:rPr>
+              <w:t xml:space="preserve"> </w:t>
+            </w:r>
+            <w:proofErr w:type="spellStart"/>
+            <w:r>
+              <w:rPr>
+                <w:sz w:val="24"/>
+                <w:szCs w:val="24"/>
+                <w:lang w:val="en-US"/>
+              </w:rPr>
+              <w:t>máx</w:t>
+            </w:r>
+            <w:proofErr w:type="spellEnd"/>
+            <w:r>
+              <w:rPr>
+                <w:sz w:val="24"/>
+                <w:szCs w:val="24"/>
+                <w:lang w:val="en-US"/>
+              </w:rPr>
+              <w:t>.</w:t>
             </w:r>
           </w:p>
         </w:tc>
@@ -6316,13 +6445,23 @@
                 <w:lang w:val="en-US"/>
               </w:rPr>
             </w:pPr>
+            <w:proofErr w:type="spellStart"/>
             <w:r>
               <w:rPr>
                 <w:sz w:val="24"/>
                 <w:szCs w:val="24"/>
                 <w:lang w:val="en-US"/>
               </w:rPr>
-              <w:t>Tránsito medio</w:t>
+              <w:t>Tránsito</w:t>
+            </w:r>
+            <w:proofErr w:type="spellEnd"/>
+            <w:r>
+              <w:rPr>
+                <w:sz w:val="24"/>
+                <w:szCs w:val="24"/>
+                <w:lang w:val="en-US"/>
+              </w:rPr>
+              <w:t xml:space="preserve"> medio</w:t>
             </w:r>
           </w:p>
         </w:tc>
@@ -6434,13 +6573,41 @@
                 <w:lang w:val="en-US"/>
               </w:rPr>
             </w:pPr>
+            <w:proofErr w:type="spellStart"/>
             <w:r>
               <w:rPr>
                 <w:sz w:val="24"/>
                 <w:szCs w:val="24"/>
                 <w:lang w:val="en-US"/>
               </w:rPr>
-              <w:t>Tránsito mín.</w:t>
+              <w:t>Tránsito</w:t>
+            </w:r>
+            <w:proofErr w:type="spellEnd"/>
+            <w:r>
+              <w:rPr>
+                <w:sz w:val="24"/>
+                <w:szCs w:val="24"/>
+                <w:lang w:val="en-US"/>
+              </w:rPr>
+              <w:t xml:space="preserve"> </w:t>
+            </w:r>
+            <w:proofErr w:type="spellStart"/>
+            <w:r>
+              <w:rPr>
+                <w:sz w:val="24"/>
+                <w:szCs w:val="24"/>
+                <w:lang w:val="en-US"/>
+              </w:rPr>
+              <w:t>mín</w:t>
+            </w:r>
+            <w:proofErr w:type="spellEnd"/>
+            <w:r>
+              <w:rPr>
+                <w:sz w:val="24"/>
+                <w:szCs w:val="24"/>
+                <w:lang w:val="en-US"/>
+              </w:rPr>
+              <w:t>.</w:t>
             </w:r>
           </w:p>
         </w:tc>
@@ -6551,13 +6718,41 @@
                 <w:lang w:val="en-US"/>
               </w:rPr>
             </w:pPr>
+            <w:proofErr w:type="spellStart"/>
             <w:r>
               <w:rPr>
                 <w:sz w:val="24"/>
                 <w:szCs w:val="24"/>
                 <w:lang w:val="en-US"/>
               </w:rPr>
-              <w:t>Espera máx.</w:t>
+              <w:t>Espera</w:t>
+            </w:r>
+            <w:proofErr w:type="spellEnd"/>
+            <w:r>
+              <w:rPr>
+                <w:sz w:val="24"/>
+                <w:szCs w:val="24"/>
+                <w:lang w:val="en-US"/>
+              </w:rPr>
+              <w:t xml:space="preserve"> </w:t>
+            </w:r>
+            <w:proofErr w:type="spellStart"/>
+            <w:r>
+              <w:rPr>
+                <w:sz w:val="24"/>
+                <w:szCs w:val="24"/>
+                <w:lang w:val="en-US"/>
+              </w:rPr>
+              <w:t>máx</w:t>
+            </w:r>
+            <w:proofErr w:type="spellEnd"/>
+            <w:r>
+              <w:rPr>
+                <w:sz w:val="24"/>
+                <w:szCs w:val="24"/>
+                <w:lang w:val="en-US"/>
+              </w:rPr>
+              <w:t>.</w:t>
             </w:r>
           </w:p>
         </w:tc>
@@ -6669,13 +6864,23 @@
                 <w:lang w:val="en-US"/>
               </w:rPr>
             </w:pPr>
+            <w:proofErr w:type="spellStart"/>
             <w:r>
               <w:rPr>
                 <w:sz w:val="24"/>
                 <w:szCs w:val="24"/>
                 <w:lang w:val="en-US"/>
               </w:rPr>
-              <w:t>Espera media</w:t>
+              <w:t>Espera</w:t>
+            </w:r>
+            <w:proofErr w:type="spellEnd"/>
+            <w:r>
+              <w:rPr>
+                <w:sz w:val="24"/>
+                <w:szCs w:val="24"/>
+                <w:lang w:val="en-US"/>
+              </w:rPr>
+              <w:t xml:space="preserve"> media</w:t>
             </w:r>
           </w:p>
         </w:tc>
@@ -6786,13 +6991,41 @@
                 <w:lang w:val="en-US"/>
               </w:rPr>
             </w:pPr>
+            <w:proofErr w:type="spellStart"/>
             <w:r>
               <w:rPr>
                 <w:sz w:val="24"/>
                 <w:szCs w:val="24"/>
                 <w:lang w:val="en-US"/>
               </w:rPr>
-              <w:t>Espera mín.</w:t>
+              <w:t>Espera</w:t>
+            </w:r>
+            <w:proofErr w:type="spellEnd"/>
+            <w:r>
+              <w:rPr>
+                <w:sz w:val="24"/>
+                <w:szCs w:val="24"/>
+                <w:lang w:val="en-US"/>
+              </w:rPr>
+              <w:t xml:space="preserve"> </w:t>
+            </w:r>
+            <w:proofErr w:type="spellStart"/>
+            <w:r>
+              <w:rPr>
+                <w:sz w:val="24"/>
+                <w:szCs w:val="24"/>
+                <w:lang w:val="en-US"/>
+              </w:rPr>
+              <w:t>mín</w:t>
+            </w:r>
+            <w:proofErr w:type="spellEnd"/>
+            <w:r>
+              <w:rPr>
+                <w:sz w:val="24"/>
+                <w:szCs w:val="24"/>
+                <w:lang w:val="en-US"/>
+              </w:rPr>
+              <w:t>.</w:t>
             </w:r>
           </w:p>
         </w:tc>
@@ -6904,13 +7137,23 @@
                 <w:lang w:val="en-US"/>
               </w:rPr>
             </w:pPr>
+            <w:proofErr w:type="spellStart"/>
             <w:r>
               <w:rPr>
                 <w:sz w:val="24"/>
                 <w:szCs w:val="24"/>
                 <w:lang w:val="en-US"/>
               </w:rPr>
-              <w:t>Durabilidad total</w:t>
+              <w:t>Durabilidad</w:t>
+            </w:r>
+            <w:proofErr w:type="spellEnd"/>
+            <w:r>
+              <w:rPr>
+                <w:sz w:val="24"/>
+                <w:szCs w:val="24"/>
+                <w:lang w:val="en-US"/>
+              </w:rPr>
+              <w:t xml:space="preserve"> total</w:t>
             </w:r>
           </w:p>
         </w:tc>
@@ -7079,14 +7322,34 @@
                 <w:lang w:val="en-US"/>
               </w:rPr>
             </w:pPr>
+            <w:proofErr w:type="spellStart"/>
             <w:r>
               <w:rPr>
                 <w:sz w:val="24"/>
                 <w:szCs w:val="24"/>
                 <w:lang w:val="en-US"/>
               </w:rPr>
-              <w:t>Distribución equilibrada</w:t>
-            </w:r>
+              <w:t>Distribución</w:t>
+            </w:r>
+            <w:proofErr w:type="spellEnd"/>
+            <w:r>
+              <w:rPr>
+                <w:sz w:val="24"/>
+                <w:szCs w:val="24"/>
+                <w:lang w:val="en-US"/>
+              </w:rPr>
+              <w:t xml:space="preserve"> </w:t>
+            </w:r>
+            <w:proofErr w:type="spellStart"/>
+            <w:r>
+              <w:rPr>
+                <w:sz w:val="24"/>
+                <w:szCs w:val="24"/>
+                <w:lang w:val="en-US"/>
+              </w:rPr>
+              <w:t>equilibrada</w:t>
+            </w:r>
+            <w:proofErr w:type="spellEnd"/>
           </w:p>
         </w:tc>
       </w:tr>
@@ -7108,13 +7371,23 @@
                 <w:lang w:val="en-US"/>
               </w:rPr>
             </w:pPr>
+            <w:proofErr w:type="spellStart"/>
             <w:r>
               <w:rPr>
                 <w:sz w:val="24"/>
                 <w:szCs w:val="24"/>
                 <w:lang w:val="en-US"/>
               </w:rPr>
-              <w:t>Ocio total</w:t>
+              <w:t>Ocio</w:t>
+            </w:r>
+            <w:proofErr w:type="spellEnd"/>
+            <w:r>
+              <w:rPr>
+                <w:sz w:val="24"/>
+                <w:szCs w:val="24"/>
+                <w:lang w:val="en-US"/>
+              </w:rPr>
+              <w:t xml:space="preserve"> total</w:t>
             </w:r>
           </w:p>
         </w:tc>
@@ -7196,13 +7469,23 @@
                 <w:lang w:val="en-US"/>
               </w:rPr>
             </w:pPr>
+            <w:proofErr w:type="spellStart"/>
             <w:r>
               <w:rPr>
                 <w:sz w:val="24"/>
                 <w:szCs w:val="24"/>
                 <w:lang w:val="en-US"/>
               </w:rPr>
-              <w:t>Homogéneo (</w:t>
+              <w:t>Homogéneo</w:t>
+            </w:r>
+            <w:proofErr w:type="spellEnd"/>
+            <w:r>
+              <w:rPr>
+                <w:sz w:val="24"/>
+                <w:szCs w:val="24"/>
+                <w:lang w:val="en-US"/>
+              </w:rPr>
+              <w:t xml:space="preserve"> (</w:t>
             </w:r>
             <m:oMath>
               <m:r>
@@ -7258,13 +7541,41 @@
                 <w:lang w:val="en-US"/>
               </w:rPr>
             </w:pPr>
+            <w:proofErr w:type="spellStart"/>
             <w:r>
               <w:rPr>
                 <w:sz w:val="24"/>
                 <w:szCs w:val="24"/>
                 <w:lang w:val="en-US"/>
               </w:rPr>
-              <w:t>Mejor distribución de carga</w:t>
+              <w:t>Mejor</w:t>
+            </w:r>
+            <w:proofErr w:type="spellEnd"/>
+            <w:r>
+              <w:rPr>
+                <w:sz w:val="24"/>
+                <w:szCs w:val="24"/>
+                <w:lang w:val="en-US"/>
+              </w:rPr>
+              <w:t xml:space="preserve"> </w:t>
+            </w:r>
+            <w:proofErr w:type="spellStart"/>
+            <w:r>
+              <w:rPr>
+                <w:sz w:val="24"/>
+                <w:szCs w:val="24"/>
+                <w:lang w:val="en-US"/>
+              </w:rPr>
+              <w:t>distribución</w:t>
+            </w:r>
+            <w:proofErr w:type="spellEnd"/>
+            <w:r>
+              <w:rPr>
+                <w:sz w:val="24"/>
+                <w:szCs w:val="24"/>
+                <w:lang w:val="en-US"/>
+              </w:rPr>
+              <w:t xml:space="preserve"> de carga</w:t>
             </w:r>
           </w:p>
         </w:tc>
@@ -7788,7 +8099,7 @@
 </file>
 
 <file path=word/endnotes.xml><?xml version="1.0" encoding="utf-8"?>
-<w:endnotes xmlns:wpc="http://schemas.microsoft.com/office/word/2010/wordprocessingCanvas" xmlns:cx="http://schemas.microsoft.com/office/drawing/2014/chartex" xmlns:cx1="http://schemas.microsoft.com/office/drawing/2015/9/8/chartex" xmlns:cx2="http://schemas.microsoft.com/office/drawing/2015/10/21/chartex" xmlns:cx3="http://schemas.microsoft.com/office/drawing/2016/5/9/chartex" xmlns:cx4="http://schemas.microsoft.com/office/drawing/2016/5/10/chartex" xmlns:cx5="http://schemas.microsoft.com/office/drawing/2016/5/11/chartex" xmlns:cx6="http://schemas.microsoft.com/office/drawing/2016/5/12/chartex" xmlns:cx7="http://schemas.microsoft.com/office/drawing/2016/5/13/chartex" xmlns:cx8="http://schemas.microsoft.com/office/drawing/2016/5/14/chartex" xmlns:mc="http://schemas.openxmlformats.org/markup-compatibility/2006" xmlns:aink="http://schemas.microsoft.com/office/drawing/2016/ink" xmlns:am3d="http://schemas.microsoft.com/office/drawing/2017/model3d" xmlns:o="urn:schemas-microsoft-com:office:office" xmlns:oel="http://schemas.microsoft.com/office/2019/extlst" xmlns:r="http://schemas.openxmlformats.org/officeDocument/2006/relationships" xmlns:m="http://schemas.openxmlformats.org/officeDocument/2006/math" xmlns:v="urn:schemas-microsoft-com:vml" xmlns:wp14="http://schemas.microsoft.com/office/word/2010/wordprocessingDrawing" xmlns:wp="http://schemas.openxmlformats.org/drawingml/2006/wordprocessingDrawing" xmlns:w10="urn:schemas-microsoft-com:office:word" xmlns:w="http://schemas.openxmlformats.org/wordprocessingml/2006/main" xmlns:w14="http://schemas.microsoft.com/office/word/2010/wordml" xmlns:w15="http://schemas.microsoft.com/office/word/2012/wordml" xmlns:w16cex="http://schemas.microsoft.com/office/word/2018/wordml/cex" xmlns:w16cid="http://schemas.microsoft.com/office/word/2016/wordml/cid" xmlns:w16="http://schemas.microsoft.com/office/word/2018/wordml" xmlns:w16du="http://schemas.microsoft.com/office/word/2023/wordml/word16du" xmlns:w16sdtdh="http://schemas.microsoft.com/office/word/2020/wordml/sdtdatahash" xmlns:w16sdtfl="http://schemas.microsoft.com/office/word/2024/wordml/sdtformatlock" xmlns:w16se="http://schemas.microsoft.com/office/word/2015/wordml/symex" xmlns:wpg="http://schemas.microsoft.com/office/word/2010/wordprocessingGroup" xmlns:wpi="http://schemas.microsoft.com/office/word/2010/wordprocessingInk" xmlns:wne="http://schemas.microsoft.com/office/word/2006/wordml" xmlns:wps="http://schemas.microsoft.com/office/word/2010/wordprocessingShape" mc:Ignorable="w14 w15 w16se w16cid w16 w16cex w16sdtdh w16sdtfl w16du wp14">
+<w:endnotes xmlns:wpc="http://schemas.microsoft.com/office/word/2010/wordprocessingCanvas" xmlns:cx="http://schemas.microsoft.com/office/drawing/2014/chartex" xmlns:cx1="http://schemas.microsoft.com/office/drawing/2015/9/8/chartex" xmlns:cx2="http://schemas.microsoft.com/office/drawing/2015/10/21/chartex" xmlns:cx3="http://schemas.microsoft.com/office/drawing/2016/5/9/chartex" xmlns:cx4="http://schemas.microsoft.com/office/drawing/2016/5/10/chartex" xmlns:cx5="http://schemas.microsoft.com/office/drawing/2016/5/11/chartex" xmlns:cx6="http://schemas.microsoft.com/office/drawing/2016/5/12/chartex" xmlns:cx7="http://schemas.microsoft.com/office/drawing/2016/5/13/chartex" xmlns:cx8="http://schemas.microsoft.com/office/drawing/2016/5/14/chartex" xmlns:mc="http://schemas.openxmlformats.org/markup-compatibility/2006" xmlns:aink="http://schemas.microsoft.com/office/drawing/2016/ink" xmlns:am3d="http://schemas.microsoft.com/office/drawing/2017/model3d" xmlns:o="urn:schemas-microsoft-com:office:office" xmlns:oel="http://schemas.microsoft.com/office/2019/extlst" xmlns:r="http://schemas.openxmlformats.org/officeDocument/2006/relationships" xmlns:m="http://schemas.openxmlformats.org/officeDocument/2006/math" xmlns:v="urn:schemas-microsoft-com:vml" xmlns:wp14="http://schemas.microsoft.com/office/word/2010/wordprocessingDrawing" xmlns:wp="http://schemas.openxmlformats.org/drawingml/2006/wordprocessingDrawing" xmlns:w10="urn:schemas-microsoft-com:office:word" xmlns:w="http://schemas.openxmlformats.org/wordprocessingml/2006/main" xmlns:w14="http://schemas.microsoft.com/office/word/2010/wordml" xmlns:w15="http://schemas.microsoft.com/office/word/2012/wordml" xmlns:w16cex="http://schemas.microsoft.com/office/word/2018/wordml/cex" xmlns:w16cid="http://schemas.microsoft.com/office/word/2016/wordml/cid" xmlns:w16="http://schemas.microsoft.com/office/word/2018/wordml" xmlns:w16sdtdh="http://schemas.microsoft.com/office/word/2020/wordml/sdtdatahash" xmlns:w16se="http://schemas.microsoft.com/office/word/2015/wordml/symex" xmlns:wpg="http://schemas.microsoft.com/office/word/2010/wordprocessingGroup" xmlns:wpi="http://schemas.microsoft.com/office/word/2010/wordprocessingInk" xmlns:wne="http://schemas.microsoft.com/office/word/2006/wordml" xmlns:wps="http://schemas.microsoft.com/office/word/2010/wordprocessingShape" mc:Ignorable="w14 w15 w16se w16cid w16 w16cex w16sdtdh wp14">
   <w:endnote w:type="separator" w:id="-1">
     <w:p>
       <w:pPr>
@@ -7813,7 +8124,7 @@
 </file>
 
 <file path=word/footer1.xml><?xml version="1.0" encoding="utf-8"?>
-<w:ftr xmlns:wpc="http://schemas.microsoft.com/office/word/2010/wordprocessingCanvas" xmlns:cx="http://schemas.microsoft.com/office/drawing/2014/chartex" xmlns:cx1="http://schemas.microsoft.com/office/drawing/2015/9/8/chartex" xmlns:cx2="http://schemas.microsoft.com/office/drawing/2015/10/21/chartex" xmlns:cx3="http://schemas.microsoft.com/office/drawing/2016/5/9/chartex" xmlns:cx4="http://schemas.microsoft.com/office/drawing/2016/5/10/chartex" xmlns:cx5="http://schemas.microsoft.com/office/drawing/2016/5/11/chartex" xmlns:cx6="http://schemas.microsoft.com/office/drawing/2016/5/12/chartex" xmlns:cx7="http://schemas.microsoft.com/office/drawing/2016/5/13/chartex" xmlns:cx8="http://schemas.microsoft.com/office/drawing/2016/5/14/chartex" xmlns:mc="http://schemas.openxmlformats.org/markup-compatibility/2006" xmlns:aink="http://schemas.microsoft.com/office/drawing/2016/ink" xmlns:am3d="http://schemas.microsoft.com/office/drawing/2017/model3d" xmlns:o="urn:schemas-microsoft-com:office:office" xmlns:oel="http://schemas.microsoft.com/office/2019/extlst" xmlns:r="http://schemas.openxmlformats.org/officeDocument/2006/relationships" xmlns:m="http://schemas.openxmlformats.org/officeDocument/2006/math" xmlns:v="urn:schemas-microsoft-com:vml" xmlns:wp14="http://schemas.microsoft.com/office/word/2010/wordprocessingDrawing" xmlns:wp="http://schemas.openxmlformats.org/drawingml/2006/wordprocessingDrawing" xmlns:w10="urn:schemas-microsoft-com:office:word" xmlns:w="http://schemas.openxmlformats.org/wordprocessingml/2006/main" xmlns:w14="http://schemas.microsoft.com/office/word/2010/wordml" xmlns:w15="http://schemas.microsoft.com/office/word/2012/wordml" xmlns:w16cex="http://schemas.microsoft.com/office/word/2018/wordml/cex" xmlns:w16cid="http://schemas.microsoft.com/office/word/2016/wordml/cid" xmlns:w16="http://schemas.microsoft.com/office/word/2018/wordml" xmlns:w16du="http://schemas.microsoft.com/office/word/2023/wordml/word16du" xmlns:w16sdtdh="http://schemas.microsoft.com/office/word/2020/wordml/sdtdatahash" xmlns:w16sdtfl="http://schemas.microsoft.com/office/word/2024/wordml/sdtformatlock" xmlns:w16se="http://schemas.microsoft.com/office/word/2015/wordml/symex" xmlns:wpg="http://schemas.microsoft.com/office/word/2010/wordprocessingGroup" xmlns:wpi="http://schemas.microsoft.com/office/word/2010/wordprocessingInk" xmlns:wne="http://schemas.microsoft.com/office/word/2006/wordml" xmlns:wps="http://schemas.microsoft.com/office/word/2010/wordprocessingShape" mc:Ignorable="w14 w15 w16se w16cid w16 w16cex w16sdtdh w16sdtfl w16du wp14">
+<w:ftr xmlns:wpc="http://schemas.microsoft.com/office/word/2010/wordprocessingCanvas" xmlns:cx="http://schemas.microsoft.com/office/drawing/2014/chartex" xmlns:cx1="http://schemas.microsoft.com/office/drawing/2015/9/8/chartex" xmlns:cx2="http://schemas.microsoft.com/office/drawing/2015/10/21/chartex" xmlns:cx3="http://schemas.microsoft.com/office/drawing/2016/5/9/chartex" xmlns:cx4="http://schemas.microsoft.com/office/drawing/2016/5/10/chartex" xmlns:cx5="http://schemas.microsoft.com/office/drawing/2016/5/11/chartex" xmlns:cx6="http://schemas.microsoft.com/office/drawing/2016/5/12/chartex" xmlns:cx7="http://schemas.microsoft.com/office/drawing/2016/5/13/chartex" xmlns:cx8="http://schemas.microsoft.com/office/drawing/2016/5/14/chartex" xmlns:mc="http://schemas.openxmlformats.org/markup-compatibility/2006" xmlns:aink="http://schemas.microsoft.com/office/drawing/2016/ink" xmlns:am3d="http://schemas.microsoft.com/office/drawing/2017/model3d" xmlns:o="urn:schemas-microsoft-com:office:office" xmlns:oel="http://schemas.microsoft.com/office/2019/extlst" xmlns:r="http://schemas.openxmlformats.org/officeDocument/2006/relationships" xmlns:m="http://schemas.openxmlformats.org/officeDocument/2006/math" xmlns:v="urn:schemas-microsoft-com:vml" xmlns:wp14="http://schemas.microsoft.com/office/word/2010/wordprocessingDrawing" xmlns:wp="http://schemas.openxmlformats.org/drawingml/2006/wordprocessingDrawing" xmlns:w10="urn:schemas-microsoft-com:office:word" xmlns:w="http://schemas.openxmlformats.org/wordprocessingml/2006/main" xmlns:w14="http://schemas.microsoft.com/office/word/2010/wordml" xmlns:w15="http://schemas.microsoft.com/office/word/2012/wordml" xmlns:w16cex="http://schemas.microsoft.com/office/word/2018/wordml/cex" xmlns:w16cid="http://schemas.microsoft.com/office/word/2016/wordml/cid" xmlns:w16="http://schemas.microsoft.com/office/word/2018/wordml" xmlns:w16sdtdh="http://schemas.microsoft.com/office/word/2020/wordml/sdtdatahash" xmlns:w16se="http://schemas.microsoft.com/office/word/2015/wordml/symex" xmlns:wpg="http://schemas.microsoft.com/office/word/2010/wordprocessingGroup" xmlns:wpi="http://schemas.microsoft.com/office/word/2010/wordprocessingInk" xmlns:wne="http://schemas.microsoft.com/office/word/2006/wordml" xmlns:wps="http://schemas.microsoft.com/office/word/2010/wordprocessingShape" mc:Ignorable="w14 w15 w16se w16cid w16 w16cex w16sdtdh wp14">
   <w:p>
     <w:pPr>
       <w:pStyle w:val="Footer"/>
@@ -7888,7 +8199,7 @@
 </file>
 
 <file path=word/footnotes.xml><?xml version="1.0" encoding="utf-8"?>
-<w:footnotes xmlns:wpc="http://schemas.microsoft.com/office/word/2010/wordprocessingCanvas" xmlns:cx="http://schemas.microsoft.com/office/drawing/2014/chartex" xmlns:cx1="http://schemas.microsoft.com/office/drawing/2015/9/8/chartex" xmlns:cx2="http://schemas.microsoft.com/office/drawing/2015/10/21/chartex" xmlns:cx3="http://schemas.microsoft.com/office/drawing/2016/5/9/chartex" xmlns:cx4="http://schemas.microsoft.com/office/drawing/2016/5/10/chartex" xmlns:cx5="http://schemas.microsoft.com/office/drawing/2016/5/11/chartex" xmlns:cx6="http://schemas.microsoft.com/office/drawing/2016/5/12/chartex" xmlns:cx7="http://schemas.microsoft.com/office/drawing/2016/5/13/chartex" xmlns:cx8="http://schemas.microsoft.com/office/drawing/2016/5/14/chartex" xmlns:mc="http://schemas.openxmlformats.org/markup-compatibility/2006" xmlns:aink="http://schemas.microsoft.com/office/drawing/2016/ink" xmlns:am3d="http://schemas.microsoft.com/office/drawing/2017/model3d" xmlns:o="urn:schemas-microsoft-com:office:office" xmlns:oel="http://schemas.microsoft.com/office/2019/extlst" xmlns:r="http://schemas.openxmlformats.org/officeDocument/2006/relationships" xmlns:m="http://schemas.openxmlformats.org/officeDocument/2006/math" xmlns:v="urn:schemas-microsoft-com:vml" xmlns:wp14="http://schemas.microsoft.com/office/word/2010/wordprocessingDrawing" xmlns:wp="http://schemas.openxmlformats.org/drawingml/2006/wordprocessingDrawing" xmlns:w10="urn:schemas-microsoft-com:office:word" xmlns:w="http://schemas.openxmlformats.org/wordprocessingml/2006/main" xmlns:w14="http://schemas.microsoft.com/office/word/2010/wordml" xmlns:w15="http://schemas.microsoft.com/office/word/2012/wordml" xmlns:w16cex="http://schemas.microsoft.com/office/word/2018/wordml/cex" xmlns:w16cid="http://schemas.microsoft.com/office/word/2016/wordml/cid" xmlns:w16="http://schemas.microsoft.com/office/word/2018/wordml" xmlns:w16du="http://schemas.microsoft.com/office/word/2023/wordml/word16du" xmlns:w16sdtdh="http://schemas.microsoft.com/office/word/2020/wordml/sdtdatahash" xmlns:w16sdtfl="http://schemas.microsoft.com/office/word/2024/wordml/sdtformatlock" xmlns:w16se="http://schemas.microsoft.com/office/word/2015/wordml/symex" xmlns:wpg="http://schemas.microsoft.com/office/word/2010/wordprocessingGroup" xmlns:wpi="http://schemas.microsoft.com/office/word/2010/wordprocessingInk" xmlns:wne="http://schemas.microsoft.com/office/word/2006/wordml" xmlns:wps="http://schemas.microsoft.com/office/word/2010/wordprocessingShape" mc:Ignorable="w14 w15 w16se w16cid w16 w16cex w16sdtdh w16sdtfl w16du wp14">
+<w:footnotes xmlns:wpc="http://schemas.microsoft.com/office/word/2010/wordprocessingCanvas" xmlns:cx="http://schemas.microsoft.com/office/drawing/2014/chartex" xmlns:cx1="http://schemas.microsoft.com/office/drawing/2015/9/8/chartex" xmlns:cx2="http://schemas.microsoft.com/office/drawing/2015/10/21/chartex" xmlns:cx3="http://schemas.microsoft.com/office/drawing/2016/5/9/chartex" xmlns:cx4="http://schemas.microsoft.com/office/drawing/2016/5/10/chartex" xmlns:cx5="http://schemas.microsoft.com/office/drawing/2016/5/11/chartex" xmlns:cx6="http://schemas.microsoft.com/office/drawing/2016/5/12/chartex" xmlns:cx7="http://schemas.microsoft.com/office/drawing/2016/5/13/chartex" xmlns:cx8="http://schemas.microsoft.com/office/drawing/2016/5/14/chartex" xmlns:mc="http://schemas.openxmlformats.org/markup-compatibility/2006" xmlns:aink="http://schemas.microsoft.com/office/drawing/2016/ink" xmlns:am3d="http://schemas.microsoft.com/office/drawing/2017/model3d" xmlns:o="urn:schemas-microsoft-com:office:office" xmlns:oel="http://schemas.microsoft.com/office/2019/extlst" xmlns:r="http://schemas.openxmlformats.org/officeDocument/2006/relationships" xmlns:m="http://schemas.openxmlformats.org/officeDocument/2006/math" xmlns:v="urn:schemas-microsoft-com:vml" xmlns:wp14="http://schemas.microsoft.com/office/word/2010/wordprocessingDrawing" xmlns:wp="http://schemas.openxmlformats.org/drawingml/2006/wordprocessingDrawing" xmlns:w10="urn:schemas-microsoft-com:office:word" xmlns:w="http://schemas.openxmlformats.org/wordprocessingml/2006/main" xmlns:w14="http://schemas.microsoft.com/office/word/2010/wordml" xmlns:w15="http://schemas.microsoft.com/office/word/2012/wordml" xmlns:w16cex="http://schemas.microsoft.com/office/word/2018/wordml/cex" xmlns:w16cid="http://schemas.microsoft.com/office/word/2016/wordml/cid" xmlns:w16="http://schemas.microsoft.com/office/word/2018/wordml" xmlns:w16sdtdh="http://schemas.microsoft.com/office/word/2020/wordml/sdtdatahash" xmlns:w16se="http://schemas.microsoft.com/office/word/2015/wordml/symex" xmlns:wpg="http://schemas.microsoft.com/office/word/2010/wordprocessingGroup" xmlns:wpi="http://schemas.microsoft.com/office/word/2010/wordprocessingInk" xmlns:wne="http://schemas.microsoft.com/office/word/2006/wordml" xmlns:wps="http://schemas.microsoft.com/office/word/2010/wordprocessingShape" mc:Ignorable="w14 w15 w16se w16cid w16 w16cex w16sdtdh wp14">
   <w:footnote w:type="separator" w:id="-1">
     <w:p>
       <w:pPr>
@@ -8127,7 +8438,7 @@
 </file>
 
 <file path=word/header1.xml><?xml version="1.0" encoding="utf-8"?>
-<w:hdr xmlns:wpc="http://schemas.microsoft.com/office/word/2010/wordprocessingCanvas" xmlns:cx="http://schemas.microsoft.com/office/drawing/2014/chartex" xmlns:cx1="http://schemas.microsoft.com/office/drawing/2015/9/8/chartex" xmlns:cx2="http://schemas.microsoft.com/office/drawing/2015/10/21/chartex" xmlns:cx3="http://schemas.microsoft.com/office/drawing/2016/5/9/chartex" xmlns:cx4="http://schemas.microsoft.com/office/drawing/2016/5/10/chartex" xmlns:cx5="http://schemas.microsoft.com/office/drawing/2016/5/11/chartex" xmlns:cx6="http://schemas.microsoft.com/office/drawing/2016/5/12/chartex" xmlns:cx7="http://schemas.microsoft.com/office/drawing/2016/5/13/chartex" xmlns:cx8="http://schemas.microsoft.com/office/drawing/2016/5/14/chartex" xmlns:mc="http://schemas.openxmlformats.org/markup-compatibility/2006" xmlns:aink="http://schemas.microsoft.com/office/drawing/2016/ink" xmlns:am3d="http://schemas.microsoft.com/office/drawing/2017/model3d" xmlns:o="urn:schemas-microsoft-com:office:office" xmlns:oel="http://schemas.microsoft.com/office/2019/extlst" xmlns:r="http://schemas.openxmlformats.org/officeDocument/2006/relationships" xmlns:m="http://schemas.openxmlformats.org/officeDocument/2006/math" xmlns:v="urn:schemas-microsoft-com:vml" xmlns:wp14="http://schemas.microsoft.com/office/word/2010/wordprocessingDrawing" xmlns:wp="http://schemas.openxmlformats.org/drawingml/2006/wordprocessingDrawing" xmlns:w10="urn:schemas-microsoft-com:office:word" xmlns:w="http://schemas.openxmlformats.org/wordprocessingml/2006/main" xmlns:w14="http://schemas.microsoft.com/office/word/2010/wordml" xmlns:w15="http://schemas.microsoft.com/office/word/2012/wordml" xmlns:w16cex="http://schemas.microsoft.com/office/word/2018/wordml/cex" xmlns:w16cid="http://schemas.microsoft.com/office/word/2016/wordml/cid" xmlns:w16="http://schemas.microsoft.com/office/word/2018/wordml" xmlns:w16du="http://schemas.microsoft.com/office/word/2023/wordml/word16du" xmlns:w16sdtdh="http://schemas.microsoft.com/office/word/2020/wordml/sdtdatahash" xmlns:w16sdtfl="http://schemas.microsoft.com/office/word/2024/wordml/sdtformatlock" xmlns:w16se="http://schemas.microsoft.com/office/word/2015/wordml/symex" xmlns:wpg="http://schemas.microsoft.com/office/word/2010/wordprocessingGroup" xmlns:wpi="http://schemas.microsoft.com/office/word/2010/wordprocessingInk" xmlns:wne="http://schemas.microsoft.com/office/word/2006/wordml" xmlns:wps="http://schemas.microsoft.com/office/word/2010/wordprocessingShape" mc:Ignorable="w14 w15 w16se w16cid w16 w16cex w16sdtdh w16sdtfl w16du wp14">
+<w:hdr xmlns:wpc="http://schemas.microsoft.com/office/word/2010/wordprocessingCanvas" xmlns:cx="http://schemas.microsoft.com/office/drawing/2014/chartex" xmlns:cx1="http://schemas.microsoft.com/office/drawing/2015/9/8/chartex" xmlns:cx2="http://schemas.microsoft.com/office/drawing/2015/10/21/chartex" xmlns:cx3="http://schemas.microsoft.com/office/drawing/2016/5/9/chartex" xmlns:cx4="http://schemas.microsoft.com/office/drawing/2016/5/10/chartex" xmlns:cx5="http://schemas.microsoft.com/office/drawing/2016/5/11/chartex" xmlns:cx6="http://schemas.microsoft.com/office/drawing/2016/5/12/chartex" xmlns:cx7="http://schemas.microsoft.com/office/drawing/2016/5/13/chartex" xmlns:cx8="http://schemas.microsoft.com/office/drawing/2016/5/14/chartex" xmlns:mc="http://schemas.openxmlformats.org/markup-compatibility/2006" xmlns:aink="http://schemas.microsoft.com/office/drawing/2016/ink" xmlns:am3d="http://schemas.microsoft.com/office/drawing/2017/model3d" xmlns:o="urn:schemas-microsoft-com:office:office" xmlns:oel="http://schemas.microsoft.com/office/2019/extlst" xmlns:r="http://schemas.openxmlformats.org/officeDocument/2006/relationships" xmlns:m="http://schemas.openxmlformats.org/officeDocument/2006/math" xmlns:v="urn:schemas-microsoft-com:vml" xmlns:wp14="http://schemas.microsoft.com/office/word/2010/wordprocessingDrawing" xmlns:wp="http://schemas.openxmlformats.org/drawingml/2006/wordprocessingDrawing" xmlns:w10="urn:schemas-microsoft-com:office:word" xmlns:w="http://schemas.openxmlformats.org/wordprocessingml/2006/main" xmlns:w14="http://schemas.microsoft.com/office/word/2010/wordml" xmlns:w15="http://schemas.microsoft.com/office/word/2012/wordml" xmlns:w16cex="http://schemas.microsoft.com/office/word/2018/wordml/cex" xmlns:w16cid="http://schemas.microsoft.com/office/word/2016/wordml/cid" xmlns:w16="http://schemas.microsoft.com/office/word/2018/wordml" xmlns:w16sdtdh="http://schemas.microsoft.com/office/word/2020/wordml/sdtdatahash" xmlns:w16se="http://schemas.microsoft.com/office/word/2015/wordml/symex" xmlns:wpg="http://schemas.microsoft.com/office/word/2010/wordprocessingGroup" xmlns:wpi="http://schemas.microsoft.com/office/word/2010/wordprocessingInk" xmlns:wne="http://schemas.microsoft.com/office/word/2006/wordml" xmlns:wps="http://schemas.microsoft.com/office/word/2010/wordprocessingShape" mc:Ignorable="w14 w15 w16se w16cid w16 w16cex w16sdtdh wp14">
   <w:p>
     <w:pPr>
       <w:pStyle w:val="Header"/>
@@ -8170,7 +8481,7 @@
 </file>
 
 <file path=word/numbering.xml><?xml version="1.0" encoding="utf-8"?>
-<w:numbering xmlns:wpc="http://schemas.microsoft.com/office/word/2010/wordprocessingCanvas" xmlns:cx="http://schemas.microsoft.com/office/drawing/2014/chartex" xmlns:cx1="http://schemas.microsoft.com/office/drawing/2015/9/8/chartex" xmlns:cx2="http://schemas.microsoft.com/office/drawing/2015/10/21/chartex" xmlns:cx3="http://schemas.microsoft.com/office/drawing/2016/5/9/chartex" xmlns:cx4="http://schemas.microsoft.com/office/drawing/2016/5/10/chartex" xmlns:cx5="http://schemas.microsoft.com/office/drawing/2016/5/11/chartex" xmlns:cx6="http://schemas.microsoft.com/office/drawing/2016/5/12/chartex" xmlns:cx7="http://schemas.microsoft.com/office/drawing/2016/5/13/chartex" xmlns:cx8="http://schemas.microsoft.com/office/drawing/2016/5/14/chartex" xmlns:mc="http://schemas.openxmlformats.org/markup-compatibility/2006" xmlns:aink="http://schemas.microsoft.com/office/drawing/2016/ink" xmlns:am3d="http://schemas.microsoft.com/office/drawing/2017/model3d" xmlns:o="urn:schemas-microsoft-com:office:office" xmlns:oel="http://schemas.microsoft.com/office/2019/extlst" xmlns:r="http://schemas.openxmlformats.org/officeDocument/2006/relationships" xmlns:m="http://schemas.openxmlformats.org/officeDocument/2006/math" xmlns:v="urn:schemas-microsoft-com:vml" xmlns:wp14="http://schemas.microsoft.com/office/word/2010/wordprocessingDrawing" xmlns:wp="http://schemas.openxmlformats.org/drawingml/2006/wordprocessingDrawing" xmlns:w10="urn:schemas-microsoft-com:office:word" xmlns:w="http://schemas.openxmlformats.org/wordprocessingml/2006/main" xmlns:w14="http://schemas.microsoft.com/office/word/2010/wordml" xmlns:w15="http://schemas.microsoft.com/office/word/2012/wordml" xmlns:w16cex="http://schemas.microsoft.com/office/word/2018/wordml/cex" xmlns:w16cid="http://schemas.microsoft.com/office/word/2016/wordml/cid" xmlns:w16="http://schemas.microsoft.com/office/word/2018/wordml" xmlns:w16du="http://schemas.microsoft.com/office/word/2023/wordml/word16du" xmlns:w16sdtdh="http://schemas.microsoft.com/office/word/2020/wordml/sdtdatahash" xmlns:w16sdtfl="http://schemas.microsoft.com/office/word/2024/wordml/sdtformatlock" xmlns:w16se="http://schemas.microsoft.com/office/word/2015/wordml/symex" xmlns:wpg="http://schemas.microsoft.com/office/word/2010/wordprocessingGroup" xmlns:wpi="http://schemas.microsoft.com/office/word/2010/wordprocessingInk" xmlns:wne="http://schemas.microsoft.com/office/word/2006/wordml" xmlns:wps="http://schemas.microsoft.com/office/word/2010/wordprocessingShape" mc:Ignorable="w14 w15 w16se w16cid w16 w16cex w16sdtdh w16sdtfl w16du wp14">
+<w:numbering xmlns:wpc="http://schemas.microsoft.com/office/word/2010/wordprocessingCanvas" xmlns:cx="http://schemas.microsoft.com/office/drawing/2014/chartex" xmlns:cx1="http://schemas.microsoft.com/office/drawing/2015/9/8/chartex" xmlns:cx2="http://schemas.microsoft.com/office/drawing/2015/10/21/chartex" xmlns:cx3="http://schemas.microsoft.com/office/drawing/2016/5/9/chartex" xmlns:cx4="http://schemas.microsoft.com/office/drawing/2016/5/10/chartex" xmlns:cx5="http://schemas.microsoft.com/office/drawing/2016/5/11/chartex" xmlns:cx6="http://schemas.microsoft.com/office/drawing/2016/5/12/chartex" xmlns:cx7="http://schemas.microsoft.com/office/drawing/2016/5/13/chartex" xmlns:cx8="http://schemas.microsoft.com/office/drawing/2016/5/14/chartex" xmlns:mc="http://schemas.openxmlformats.org/markup-compatibility/2006" xmlns:aink="http://schemas.microsoft.com/office/drawing/2016/ink" xmlns:am3d="http://schemas.microsoft.com/office/drawing/2017/model3d" xmlns:o="urn:schemas-microsoft-com:office:office" xmlns:oel="http://schemas.microsoft.com/office/2019/extlst" xmlns:r="http://schemas.openxmlformats.org/officeDocument/2006/relationships" xmlns:m="http://schemas.openxmlformats.org/officeDocument/2006/math" xmlns:v="urn:schemas-microsoft-com:vml" xmlns:wp14="http://schemas.microsoft.com/office/word/2010/wordprocessingDrawing" xmlns:wp="http://schemas.openxmlformats.org/drawingml/2006/wordprocessingDrawing" xmlns:w10="urn:schemas-microsoft-com:office:word" xmlns:w="http://schemas.openxmlformats.org/wordprocessingml/2006/main" xmlns:w14="http://schemas.microsoft.com/office/word/2010/wordml" xmlns:w15="http://schemas.microsoft.com/office/word/2012/wordml" xmlns:w16cex="http://schemas.microsoft.com/office/word/2018/wordml/cex" xmlns:w16cid="http://schemas.microsoft.com/office/word/2016/wordml/cid" xmlns:w16="http://schemas.microsoft.com/office/word/2018/wordml" xmlns:w16sdtdh="http://schemas.microsoft.com/office/word/2020/wordml/sdtdatahash" xmlns:w16se="http://schemas.microsoft.com/office/word/2015/wordml/symex" xmlns:wpg="http://schemas.microsoft.com/office/word/2010/wordprocessingGroup" xmlns:wpi="http://schemas.microsoft.com/office/word/2010/wordprocessingInk" xmlns:wne="http://schemas.microsoft.com/office/word/2006/wordml" xmlns:wps="http://schemas.microsoft.com/office/word/2010/wordprocessingShape" mc:Ignorable="w14 w15 w16se w16cid w16 w16cex w16sdtdh wp14">
   <w:abstractNum w:abstractNumId="0" w15:restartNumberingAfterBreak="0">
     <w:nsid w:val="0AE9387F"/>
     <w:multiLevelType w:val="multilevel"/>
@@ -11106,7 +11417,7 @@
 </file>
 
 <file path=word/styles.xml><?xml version="1.0" encoding="utf-8"?>
-<w:styles xmlns:mc="http://schemas.openxmlformats.org/markup-compatibility/2006" xmlns:r="http://schemas.openxmlformats.org/officeDocument/2006/relationships" xmlns:w="http://schemas.openxmlformats.org/wordprocessingml/2006/main" xmlns:w14="http://schemas.microsoft.com/office/word/2010/wordml" xmlns:w15="http://schemas.microsoft.com/office/word/2012/wordml" xmlns:w16cex="http://schemas.microsoft.com/office/word/2018/wordml/cex" xmlns:w16cid="http://schemas.microsoft.com/office/word/2016/wordml/cid" xmlns:w16="http://schemas.microsoft.com/office/word/2018/wordml" xmlns:w16du="http://schemas.microsoft.com/office/word/2023/wordml/word16du" xmlns:w16sdtdh="http://schemas.microsoft.com/office/word/2020/wordml/sdtdatahash" xmlns:w16sdtfl="http://schemas.microsoft.com/office/word/2024/wordml/sdtformatlock" xmlns:w16se="http://schemas.microsoft.com/office/word/2015/wordml/symex" mc:Ignorable="w14 w15 w16se w16cid w16 w16cex w16sdtdh w16sdtfl w16du">
+<w:styles xmlns:mc="http://schemas.openxmlformats.org/markup-compatibility/2006" xmlns:r="http://schemas.openxmlformats.org/officeDocument/2006/relationships" xmlns:w="http://schemas.openxmlformats.org/wordprocessingml/2006/main" xmlns:w14="http://schemas.microsoft.com/office/word/2010/wordml" xmlns:w15="http://schemas.microsoft.com/office/word/2012/wordml" xmlns:w16cex="http://schemas.microsoft.com/office/word/2018/wordml/cex" xmlns:w16cid="http://schemas.microsoft.com/office/word/2016/wordml/cid" xmlns:w16="http://schemas.microsoft.com/office/word/2018/wordml" xmlns:w16sdtdh="http://schemas.microsoft.com/office/word/2020/wordml/sdtdatahash" xmlns:w16se="http://schemas.microsoft.com/office/word/2015/wordml/symex" mc:Ignorable="w14 w15 w16se w16cid w16 w16cex w16sdtdh">
   <w:docDefaults>
     <w:rPrDefault>
       <w:rPr>
@@ -12470,7 +12781,7 @@
 </file>
 
 <file path=word/glossary/document.xml><?xml version="1.0" encoding="utf-8"?>
-<w:glossaryDocument xmlns:wpc="http://schemas.microsoft.com/office/word/2010/wordprocessingCanvas" xmlns:cx="http://schemas.microsoft.com/office/drawing/2014/chartex" xmlns:cx1="http://schemas.microsoft.com/office/drawing/2015/9/8/chartex" xmlns:cx2="http://schemas.microsoft.com/office/drawing/2015/10/21/chartex" xmlns:cx3="http://schemas.microsoft.com/office/drawing/2016/5/9/chartex" xmlns:cx4="http://schemas.microsoft.com/office/drawing/2016/5/10/chartex" xmlns:cx5="http://schemas.microsoft.com/office/drawing/2016/5/11/chartex" xmlns:cx6="http://schemas.microsoft.com/office/drawing/2016/5/12/chartex" xmlns:cx7="http://schemas.microsoft.com/office/drawing/2016/5/13/chartex" xmlns:cx8="http://schemas.microsoft.com/office/drawing/2016/5/14/chartex" xmlns:mc="http://schemas.openxmlformats.org/markup-compatibility/2006" xmlns:aink="http://schemas.microsoft.com/office/drawing/2016/ink" xmlns:am3d="http://schemas.microsoft.com/office/drawing/2017/model3d" xmlns:o="urn:schemas-microsoft-com:office:office" xmlns:oel="http://schemas.microsoft.com/office/2019/extlst" xmlns:r="http://schemas.openxmlformats.org/officeDocument/2006/relationships" xmlns:m="http://schemas.openxmlformats.org/officeDocument/2006/math" xmlns:v="urn:schemas-microsoft-com:vml" xmlns:wp14="http://schemas.microsoft.com/office/word/2010/wordprocessingDrawing" xmlns:wp="http://schemas.openxmlformats.org/drawingml/2006/wordprocessingDrawing" xmlns:w10="urn:schemas-microsoft-com:office:word" xmlns:w="http://schemas.openxmlformats.org/wordprocessingml/2006/main" xmlns:w14="http://schemas.microsoft.com/office/word/2010/wordml" xmlns:w15="http://schemas.microsoft.com/office/word/2012/wordml" xmlns:w16cex="http://schemas.microsoft.com/office/word/2018/wordml/cex" xmlns:w16cid="http://schemas.microsoft.com/office/word/2016/wordml/cid" xmlns:w16="http://schemas.microsoft.com/office/word/2018/wordml" xmlns:w16du="http://schemas.microsoft.com/office/word/2023/wordml/word16du" xmlns:w16sdtdh="http://schemas.microsoft.com/office/word/2020/wordml/sdtdatahash" xmlns:w16sdtfl="http://schemas.microsoft.com/office/word/2024/wordml/sdtformatlock" xmlns:w16se="http://schemas.microsoft.com/office/word/2015/wordml/symex" xmlns:wpg="http://schemas.microsoft.com/office/word/2010/wordprocessingGroup" xmlns:wpi="http://schemas.microsoft.com/office/word/2010/wordprocessingInk" xmlns:wne="http://schemas.microsoft.com/office/word/2006/wordml" xmlns:wps="http://schemas.microsoft.com/office/word/2010/wordprocessingShape" mc:Ignorable="w14 w15 w16se w16cid w16 w16cex w16sdtdh w16sdtfl w16du wp14">
+<w:glossaryDocument xmlns:wpc="http://schemas.microsoft.com/office/word/2010/wordprocessingCanvas" xmlns:cx="http://schemas.microsoft.com/office/drawing/2014/chartex" xmlns:cx1="http://schemas.microsoft.com/office/drawing/2015/9/8/chartex" xmlns:cx2="http://schemas.microsoft.com/office/drawing/2015/10/21/chartex" xmlns:cx3="http://schemas.microsoft.com/office/drawing/2016/5/9/chartex" xmlns:cx4="http://schemas.microsoft.com/office/drawing/2016/5/10/chartex" xmlns:cx5="http://schemas.microsoft.com/office/drawing/2016/5/11/chartex" xmlns:cx6="http://schemas.microsoft.com/office/drawing/2016/5/12/chartex" xmlns:cx7="http://schemas.microsoft.com/office/drawing/2016/5/13/chartex" xmlns:cx8="http://schemas.microsoft.com/office/drawing/2016/5/14/chartex" xmlns:mc="http://schemas.openxmlformats.org/markup-compatibility/2006" xmlns:aink="http://schemas.microsoft.com/office/drawing/2016/ink" xmlns:am3d="http://schemas.microsoft.com/office/drawing/2017/model3d" xmlns:o="urn:schemas-microsoft-com:office:office" xmlns:oel="http://schemas.microsoft.com/office/2019/extlst" xmlns:r="http://schemas.openxmlformats.org/officeDocument/2006/relationships" xmlns:m="http://schemas.openxmlformats.org/officeDocument/2006/math" xmlns:v="urn:schemas-microsoft-com:vml" xmlns:wp14="http://schemas.microsoft.com/office/word/2010/wordprocessingDrawing" xmlns:wp="http://schemas.openxmlformats.org/drawingml/2006/wordprocessingDrawing" xmlns:w10="urn:schemas-microsoft-com:office:word" xmlns:w="http://schemas.openxmlformats.org/wordprocessingml/2006/main" xmlns:w14="http://schemas.microsoft.com/office/word/2010/wordml" xmlns:w15="http://schemas.microsoft.com/office/word/2012/wordml" xmlns:w16cex="http://schemas.microsoft.com/office/word/2018/wordml/cex" xmlns:w16cid="http://schemas.microsoft.com/office/word/2016/wordml/cid" xmlns:w16="http://schemas.microsoft.com/office/word/2018/wordml" xmlns:w16sdtdh="http://schemas.microsoft.com/office/word/2020/wordml/sdtdatahash" xmlns:w16se="http://schemas.microsoft.com/office/word/2015/wordml/symex" xmlns:wpg="http://schemas.microsoft.com/office/word/2010/wordprocessingGroup" xmlns:wpi="http://schemas.microsoft.com/office/word/2010/wordprocessingInk" xmlns:wne="http://schemas.microsoft.com/office/word/2006/wordml" xmlns:wps="http://schemas.microsoft.com/office/word/2010/wordprocessingShape" mc:Ignorable="w14 w15 w16se w16cid w16 w16cex w16sdtdh wp14">
   <w:docParts>
     <w:docPart>
       <w:docPartPr>
@@ -12496,7 +12807,7 @@
             <w:rPr>
               <w:rFonts w:asciiTheme="majorHAnsi" w:eastAsiaTheme="majorEastAsia" w:hAnsiTheme="majorHAnsi" w:cstheme="majorBidi"/>
               <w:caps/>
-              <w:color w:val="156082" w:themeColor="accent1"/>
+              <w:color w:val="4472C4" w:themeColor="accent1"/>
               <w:sz w:val="80"/>
               <w:szCs w:val="80"/>
             </w:rPr>
@@ -12527,7 +12838,7 @@
           </w:pPr>
           <w:r>
             <w:rPr>
-              <w:color w:val="156082" w:themeColor="accent1"/>
+              <w:color w:val="4472C4" w:themeColor="accent1"/>
               <w:sz w:val="28"/>
               <w:szCs w:val="28"/>
             </w:rPr>
@@ -12541,7 +12852,7 @@
 </file>
 
 <file path=word/glossary/fontTable.xml><?xml version="1.0" encoding="utf-8"?>
-<w:fonts xmlns:mc="http://schemas.openxmlformats.org/markup-compatibility/2006" xmlns:r="http://schemas.openxmlformats.org/officeDocument/2006/relationships" xmlns:w="http://schemas.openxmlformats.org/wordprocessingml/2006/main" xmlns:w14="http://schemas.microsoft.com/office/word/2010/wordml" xmlns:w15="http://schemas.microsoft.com/office/word/2012/wordml" xmlns:w16cex="http://schemas.microsoft.com/office/word/2018/wordml/cex" xmlns:w16cid="http://schemas.microsoft.com/office/word/2016/wordml/cid" xmlns:w16="http://schemas.microsoft.com/office/word/2018/wordml" xmlns:w16du="http://schemas.microsoft.com/office/word/2023/wordml/word16du" xmlns:w16sdtdh="http://schemas.microsoft.com/office/word/2020/wordml/sdtdatahash" xmlns:w16sdtfl="http://schemas.microsoft.com/office/word/2024/wordml/sdtformatlock" xmlns:w16se="http://schemas.microsoft.com/office/word/2015/wordml/symex" mc:Ignorable="w14 w15 w16se w16cid w16 w16cex w16sdtdh w16sdtfl w16du">
+<w:fonts xmlns:mc="http://schemas.openxmlformats.org/markup-compatibility/2006" xmlns:r="http://schemas.openxmlformats.org/officeDocument/2006/relationships" xmlns:w="http://schemas.openxmlformats.org/wordprocessingml/2006/main" xmlns:w14="http://schemas.microsoft.com/office/word/2010/wordml" xmlns:w15="http://schemas.microsoft.com/office/word/2012/wordml" xmlns:w16cex="http://schemas.microsoft.com/office/word/2018/wordml/cex" xmlns:w16cid="http://schemas.microsoft.com/office/word/2016/wordml/cid" xmlns:w16="http://schemas.microsoft.com/office/word/2018/wordml" xmlns:w16sdtdh="http://schemas.microsoft.com/office/word/2020/wordml/sdtdatahash" xmlns:w16se="http://schemas.microsoft.com/office/word/2015/wordml/symex" mc:Ignorable="w14 w15 w16se w16cid w16 w16cex w16sdtdh">
   <w:font w:name="Courier New">
     <w:panose1 w:val="02070309020205020404"/>
     <w:charset w:val="00"/>
@@ -12596,11 +12907,25 @@
     <w:pitch w:val="variable"/>
     <w:sig w:usb0="E00006FF" w:usb1="420024FF" w:usb2="02000000" w:usb3="00000000" w:csb0="0000019F" w:csb1="00000000"/>
   </w:font>
+  <w:font w:name="Calibri">
+    <w:panose1 w:val="020F0502020204030204"/>
+    <w:charset w:val="00"/>
+    <w:family w:val="swiss"/>
+    <w:pitch w:val="variable"/>
+    <w:sig w:usb0="E4002EFF" w:usb1="C200247B" w:usb2="00000009" w:usb3="00000000" w:csb0="000001FF" w:csb1="00000000"/>
+  </w:font>
+  <w:font w:name="Calibri Light">
+    <w:panose1 w:val="020F0302020204030204"/>
+    <w:charset w:val="00"/>
+    <w:family w:val="swiss"/>
+    <w:pitch w:val="variable"/>
+    <w:sig w:usb0="E4002EFF" w:usb1="C200247B" w:usb2="00000009" w:usb3="00000000" w:csb0="000001FF" w:csb1="00000000"/>
+  </w:font>
 </w:fonts>
 </file>
 
 <file path=word/glossary/settings.xml><?xml version="1.0" encoding="utf-8"?>
-<w:settings xmlns:mc="http://schemas.openxmlformats.org/markup-compatibility/2006" xmlns:o="urn:schemas-microsoft-com:office:office" xmlns:r="http://schemas.openxmlformats.org/officeDocument/2006/relationships" xmlns:m="http://schemas.openxmlformats.org/officeDocument/2006/math" xmlns:v="urn:schemas-microsoft-com:vml" xmlns:w10="urn:schemas-microsoft-com:office:word" xmlns:w="http://schemas.openxmlformats.org/wordprocessingml/2006/main" xmlns:w14="http://schemas.microsoft.com/office/word/2010/wordml" xmlns:w15="http://schemas.microsoft.com/office/word/2012/wordml" xmlns:w16cex="http://schemas.microsoft.com/office/word/2018/wordml/cex" xmlns:w16cid="http://schemas.microsoft.com/office/word/2016/wordml/cid" xmlns:w16="http://schemas.microsoft.com/office/word/2018/wordml" xmlns:w16du="http://schemas.microsoft.com/office/word/2023/wordml/word16du" xmlns:w16sdtdh="http://schemas.microsoft.com/office/word/2020/wordml/sdtdatahash" xmlns:w16sdtfl="http://schemas.microsoft.com/office/word/2024/wordml/sdtformatlock" xmlns:w16se="http://schemas.microsoft.com/office/word/2015/wordml/symex" xmlns:sl="http://schemas.openxmlformats.org/schemaLibrary/2006/main" mc:Ignorable="w14 w15 w16se w16cid w16 w16cex w16sdtdh w16sdtfl w16du">
+<w:settings xmlns:mc="http://schemas.openxmlformats.org/markup-compatibility/2006" xmlns:o="urn:schemas-microsoft-com:office:office" xmlns:r="http://schemas.openxmlformats.org/officeDocument/2006/relationships" xmlns:m="http://schemas.openxmlformats.org/officeDocument/2006/math" xmlns:v="urn:schemas-microsoft-com:vml" xmlns:w10="urn:schemas-microsoft-com:office:word" xmlns:w="http://schemas.openxmlformats.org/wordprocessingml/2006/main" xmlns:w14="http://schemas.microsoft.com/office/word/2010/wordml" xmlns:w15="http://schemas.microsoft.com/office/word/2012/wordml" xmlns:w16cex="http://schemas.microsoft.com/office/word/2018/wordml/cex" xmlns:w16cid="http://schemas.microsoft.com/office/word/2016/wordml/cid" xmlns:w16="http://schemas.microsoft.com/office/word/2018/wordml" xmlns:w16sdtdh="http://schemas.microsoft.com/office/word/2020/wordml/sdtdatahash" xmlns:w16se="http://schemas.microsoft.com/office/word/2015/wordml/symex" xmlns:sl="http://schemas.openxmlformats.org/schemaLibrary/2006/main" mc:Ignorable="w14 w15 w16se w16cid w16 w16cex w16sdtdh">
   <w:view w:val="normal"/>
   <w:defaultTabStop w:val="708"/>
   <w:hyphenationZone w:val="425"/>
@@ -12618,6 +12943,7 @@
     <w:rsidRoot w:val="00F01BA3"/>
     <w:rsid w:val="00036689"/>
     <w:rsid w:val="00060BB7"/>
+    <w:rsid w:val="000E63E8"/>
     <w:rsid w:val="002F77C9"/>
     <w:rsid w:val="003833C5"/>
     <w:rsid w:val="0039094A"/>
@@ -12632,6 +12958,7 @@
     <w:rsid w:val="00986A60"/>
     <w:rsid w:val="00AA60BC"/>
     <w:rsid w:val="00AC622D"/>
+    <w:rsid w:val="00AC7A11"/>
     <w:rsid w:val="00AD37F4"/>
     <w:rsid w:val="00AF381D"/>
     <w:rsid w:val="00B43B45"/>
@@ -12663,14 +12990,14 @@
   </m:mathPr>
   <w:themeFontLang w:val="es-AR"/>
   <w:clrSchemeMapping w:bg1="light1" w:t1="dark1" w:bg2="light2" w:t2="dark2" w:accent1="accent1" w:accent2="accent2" w:accent3="accent3" w:accent4="accent4" w:accent5="accent5" w:accent6="accent6" w:hyperlink="hyperlink" w:followedHyperlink="followedHyperlink"/>
-  <w:decimalSymbol w:val=","/>
-  <w:listSeparator w:val=";"/>
+  <w:decimalSymbol w:val="."/>
+  <w:listSeparator w:val=","/>
   <w15:chartTrackingRefBased/>
 </w:settings>
 </file>
 
 <file path=word/glossary/styles.xml><?xml version="1.0" encoding="utf-8"?>
-<w:styles xmlns:mc="http://schemas.openxmlformats.org/markup-compatibility/2006" xmlns:r="http://schemas.openxmlformats.org/officeDocument/2006/relationships" xmlns:w="http://schemas.openxmlformats.org/wordprocessingml/2006/main" xmlns:w14="http://schemas.microsoft.com/office/word/2010/wordml" xmlns:w15="http://schemas.microsoft.com/office/word/2012/wordml" xmlns:w16cex="http://schemas.microsoft.com/office/word/2018/wordml/cex" xmlns:w16cid="http://schemas.microsoft.com/office/word/2016/wordml/cid" xmlns:w16="http://schemas.microsoft.com/office/word/2018/wordml" xmlns:w16du="http://schemas.microsoft.com/office/word/2023/wordml/word16du" xmlns:w16sdtdh="http://schemas.microsoft.com/office/word/2020/wordml/sdtdatahash" xmlns:w16sdtfl="http://schemas.microsoft.com/office/word/2024/wordml/sdtformatlock" xmlns:w16se="http://schemas.microsoft.com/office/word/2015/wordml/symex" mc:Ignorable="w14 w15 w16se w16cid w16 w16cex w16sdtdh w16sdtfl w16du">
+<w:styles xmlns:mc="http://schemas.openxmlformats.org/markup-compatibility/2006" xmlns:r="http://schemas.openxmlformats.org/officeDocument/2006/relationships" xmlns:w="http://schemas.openxmlformats.org/wordprocessingml/2006/main" xmlns:w14="http://schemas.microsoft.com/office/word/2010/wordml" xmlns:w15="http://schemas.microsoft.com/office/word/2012/wordml" xmlns:w16cex="http://schemas.microsoft.com/office/word/2018/wordml/cex" xmlns:w16cid="http://schemas.microsoft.com/office/word/2016/wordml/cid" xmlns:w16="http://schemas.microsoft.com/office/word/2018/wordml" xmlns:w16sdtdh="http://schemas.microsoft.com/office/word/2020/wordml/sdtdatahash" xmlns:w16se="http://schemas.microsoft.com/office/word/2015/wordml/symex" mc:Ignorable="w14 w15 w16se w16cid w16 w16cex w16sdtdh">
   <w:docDefaults>
     <w:rPrDefault>
       <w:rPr>
@@ -13119,7 +13446,7 @@
 </file>
 
 <file path=word/glossary/webSettings.xml><?xml version="1.0" encoding="utf-8"?>
-<w:webSettings xmlns:mc="http://schemas.openxmlformats.org/markup-compatibility/2006" xmlns:r="http://schemas.openxmlformats.org/officeDocument/2006/relationships" xmlns:w="http://schemas.openxmlformats.org/wordprocessingml/2006/main" xmlns:w14="http://schemas.microsoft.com/office/word/2010/wordml" xmlns:w15="http://schemas.microsoft.com/office/word/2012/wordml" xmlns:w16cex="http://schemas.microsoft.com/office/word/2018/wordml/cex" xmlns:w16cid="http://schemas.microsoft.com/office/word/2016/wordml/cid" xmlns:w16="http://schemas.microsoft.com/office/word/2018/wordml" xmlns:w16du="http://schemas.microsoft.com/office/word/2023/wordml/word16du" xmlns:w16sdtdh="http://schemas.microsoft.com/office/word/2020/wordml/sdtdatahash" xmlns:w16sdtfl="http://schemas.microsoft.com/office/word/2024/wordml/sdtformatlock" xmlns:w16se="http://schemas.microsoft.com/office/word/2015/wordml/symex" mc:Ignorable="w14 w15 w16se w16cid w16 w16cex w16sdtdh w16sdtfl w16du">
+<w:webSettings xmlns:mc="http://schemas.openxmlformats.org/markup-compatibility/2006" xmlns:r="http://schemas.openxmlformats.org/officeDocument/2006/relationships" xmlns:w="http://schemas.openxmlformats.org/wordprocessingml/2006/main" xmlns:w14="http://schemas.microsoft.com/office/word/2010/wordml" xmlns:w15="http://schemas.microsoft.com/office/word/2012/wordml" xmlns:w16cex="http://schemas.microsoft.com/office/word/2018/wordml/cex" xmlns:w16cid="http://schemas.microsoft.com/office/word/2016/wordml/cid" xmlns:w16="http://schemas.microsoft.com/office/word/2018/wordml" xmlns:w16sdtdh="http://schemas.microsoft.com/office/word/2020/wordml/sdtdatahash" xmlns:w16se="http://schemas.microsoft.com/office/word/2015/wordml/symex" mc:Ignorable="w14 w15 w16se w16cid w16 w16cex w16sdtdh">
   <w:optimizeForBrowser/>
   <w:allowPNG/>
 </w:webSettings>

</xml_diff>